<commit_message>
Aprimora subpaginas Ema e Plano com atualização DCOM
</commit_message>
<xml_diff>
--- a/Documentação/estrutura_completa_pagina_onasp_para_dicom.docx
+++ b/Documentação/estrutura_completa_pagina_onasp_para_dicom.docx
@@ -1465,7 +1465,7 @@
         <w:pStyle w:val="BodyText"/>
       </w:pPr>
       <w:r>
-        <w:t xml:space="preserve">No âmbito da Ouvidoria Nacional de Serviços Penais, a iniciativa reforça a leitura integrada entre direitos humanos, gestão pública e execução penal, apoiando a circulação de informações e o acompanhamento qualificado das determinações incidentes sobre a matéria.</w:t>
+        <w:t xml:space="preserve">Considerando que o SIDH é estruturado, entre outros instrumentos e órgãos, pela Comissão Interamericana de Direitos Humanos (CIDH) e pela Corte Interamericana de Direitos Humanos (Corte IDH), esta subpágina organiza referências públicas úteis para a leitura qualificada dessa agenda no âmbito da Ouvidoria Nacional de Serviços Penais.</w:t>
       </w:r>
     </w:p>
     <w:p>
@@ -1501,7 +1501,7 @@
         </w:numPr>
       </w:pPr>
       <w:r>
-        <w:t xml:space="preserve">Monitoramento de decisões e deliberações do SIDH relacionadas ao sistema penal brasileiro.</w:t>
+        <w:t xml:space="preserve">Monitoramento de decisões, recomendações e deliberações do SIDH relacionadas ao sistema penal brasileiro.</w:t>
       </w:r>
     </w:p>
     <w:p>
@@ -1513,7 +1513,7 @@
         </w:numPr>
       </w:pPr>
       <w:r>
-        <w:t xml:space="preserve">Articulação de referências institucionais voltadas ao cumprimento das determinações aplicáveis.</w:t>
+        <w:t xml:space="preserve">Organização de referências públicas sobre os órgãos, normas e mecanismos do sistema interamericano.</w:t>
       </w:r>
     </w:p>
     <w:p>
@@ -1525,7 +1525,7 @@
         </w:numPr>
       </w:pPr>
       <w:r>
-        <w:t xml:space="preserve">Organização de informações relevantes para o acompanhamento qualificado da pauta.</w:t>
+        <w:t xml:space="preserve">Apoio à circulação de informações relevantes para o acompanhamento institucional da pauta.</w:t>
       </w:r>
     </w:p>
     <w:p>
@@ -1553,7 +1553,7 @@
         <w:pStyle w:val="BodyText"/>
       </w:pPr>
       <w:r>
-        <w:t xml:space="preserve">Finalidade desta subpágina</w:t>
+        <w:t xml:space="preserve">Referências públicas do SIDH</w:t>
       </w:r>
     </w:p>
     <w:p>
@@ -1569,169 +1569,15 @@
         <w:pStyle w:val="BodyText"/>
       </w:pPr>
       <w:r>
-        <w:t xml:space="preserve">Esta página temática reúne a apresentação institucional da Ema - SIDH e pode consolidar, à medida que forem oficialmente disponibilizados, conteúdos, referências e instrumentos voltados ao acompanhamento dessa agenda no âmbito da ONASP.</w:t>
-      </w:r>
-    </w:p>
-    <w:bookmarkEnd w:id="21"/>
-    <w:bookmarkStart w:id="22" w:name="subpágina-3---plano-pena-justa"/>
-    <w:p>
-      <w:pPr>
-        <w:pStyle w:val="Heading2"/>
-      </w:pPr>
-      <w:r>
-        <w:t xml:space="preserve">Subpágina 3 - Plano Pena Justa</w:t>
-      </w:r>
-    </w:p>
-    <w:p>
-      <w:pPr>
-        <w:pStyle w:val="FirstParagraph"/>
-      </w:pPr>
-      <w:r>
-        <w:t xml:space="preserve">Título da página:</w:t>
-      </w:r>
-    </w:p>
-    <w:p>
-      <w:pPr>
-        <w:pStyle w:val="BodyText"/>
-      </w:pPr>
-      <w:r>
-        <w:t xml:space="preserve">Plano Pena Justa</w:t>
-      </w:r>
-    </w:p>
-    <w:p>
-      <w:pPr>
-        <w:pStyle w:val="BodyText"/>
-      </w:pPr>
-      <w:r>
-        <w:t xml:space="preserve">Imagem de destaque:</w:t>
-      </w:r>
-    </w:p>
-    <w:p>
-      <w:pPr>
-        <w:pStyle w:val="BodyText"/>
-      </w:pPr>
-      <w:r>
-        <w:t xml:space="preserve">Documentação/Botao_PenaJusta.png</w:t>
-      </w:r>
-    </w:p>
-    <w:p>
-      <w:pPr>
-        <w:pStyle w:val="BodyText"/>
-      </w:pPr>
-      <w:r>
-        <w:t xml:space="preserve">Texto alternativo sugerido:</w:t>
-      </w:r>
-    </w:p>
-    <w:p>
-      <w:pPr>
-        <w:pStyle w:val="BodyText"/>
-      </w:pPr>
-      <w:r>
-        <w:t xml:space="preserve">Marca do Plano Pena Justa.</w:t>
-      </w:r>
-    </w:p>
-    <w:p>
-      <w:pPr>
-        <w:pStyle w:val="BodyText"/>
-      </w:pPr>
-      <w:r>
-        <w:t xml:space="preserve">Identificador editorial:</w:t>
-      </w:r>
-    </w:p>
-    <w:p>
-      <w:pPr>
-        <w:pStyle w:val="BodyText"/>
-      </w:pPr>
-      <w:r>
-        <w:t xml:space="preserve">Conteúdo Técnico e Projetos Estruturantes</w:t>
-      </w:r>
-    </w:p>
-    <w:p>
-      <w:pPr>
-        <w:pStyle w:val="BodyText"/>
-      </w:pPr>
-      <w:r>
-        <w:t xml:space="preserve">Texto de destaque:</w:t>
-      </w:r>
-    </w:p>
-    <w:p>
-      <w:pPr>
-        <w:pStyle w:val="BodyText"/>
-      </w:pPr>
-      <w:r>
-        <w:t xml:space="preserve">Ambiente dedicado ao Plano Pena Justa, com informações gerais, documentos públicos e marcos relacionados ao fortalecimento das ouvidorias no sistema penal.</w:t>
-      </w:r>
-    </w:p>
-    <w:p>
-      <w:pPr>
-        <w:pStyle w:val="BodyText"/>
-      </w:pPr>
-      <w:r>
-        <w:t xml:space="preserve">Seção:</w:t>
-      </w:r>
-    </w:p>
-    <w:p>
-      <w:pPr>
-        <w:pStyle w:val="BodyText"/>
-      </w:pPr>
-      <w:r>
-        <w:t xml:space="preserve">Escopo desta subpágina</w:t>
-      </w:r>
-    </w:p>
-    <w:p>
-      <w:pPr>
-        <w:pStyle w:val="BodyText"/>
-      </w:pPr>
-      <w:r>
-        <w:t xml:space="preserve">Texto para colar:</w:t>
-      </w:r>
-    </w:p>
-    <w:p>
-      <w:pPr>
-        <w:pStyle w:val="BodyText"/>
-      </w:pPr>
-      <w:r>
-        <w:t xml:space="preserve">O Plano Pena Justa é o Plano Nacional para o Enfrentamento do Estado de Coisas Inconstitucional nas Prisões Brasileiras, no âmbito da ADPF 347. Sua proposta articula ações de qualificação das políticas penais, fortalecimento da segurança pública, valorização dos servidores penais, transparência, participação social e monitoramento das metas pactuadas.</w:t>
-      </w:r>
-    </w:p>
-    <w:p>
-      <w:pPr>
-        <w:pStyle w:val="BodyText"/>
-      </w:pPr>
-      <w:r>
-        <w:t xml:space="preserve">Na perspectiva da Ouvidoria Nacional de Serviços Penais, esta subpágina reúne referências públicas do Plano voltadas ao fortalecimento da participação social, da escuta qualificada e da articulação entre as ouvidorias dos serviços penais nos Estados e no Distrito Federal.</w:t>
-      </w:r>
-    </w:p>
-    <w:p>
-      <w:pPr>
-        <w:pStyle w:val="BodyText"/>
-      </w:pPr>
-      <w:r>
-        <w:t xml:space="preserve">Seção:</w:t>
-      </w:r>
-    </w:p>
-    <w:p>
-      <w:pPr>
-        <w:pStyle w:val="BodyText"/>
-      </w:pPr>
-      <w:r>
-        <w:t xml:space="preserve">Eixos de atuação</w:t>
-      </w:r>
-    </w:p>
-    <w:p>
-      <w:pPr>
-        <w:pStyle w:val="BodyText"/>
-      </w:pPr>
-      <w:r>
-        <w:t xml:space="preserve">Texto para colar:</w:t>
-      </w:r>
-    </w:p>
-    <w:p>
-      <w:pPr>
-        <w:pStyle w:val="BodyText"/>
-      </w:pPr>
-      <w:r>
-        <w:t xml:space="preserve">O Plano Nacional organiza sua atuação em quatro eixos estruturantes:</w:t>
+        <w:t xml:space="preserve">Para contextualização institucional da pauta, a ONASP pode utilizar como pontos de partida as referências públicas abaixo, produzidas pelos próprios órgãos do sistema interamericano:</w:t>
+      </w:r>
+    </w:p>
+    <w:p>
+      <w:pPr>
+        <w:pStyle w:val="BodyText"/>
+      </w:pPr>
+      <w:r>
+        <w:t xml:space="preserve">Links:</w:t>
       </w:r>
     </w:p>
     <w:p>
@@ -1743,7 +1589,7 @@
         </w:numPr>
       </w:pPr>
       <w:r>
-        <w:t xml:space="preserve">Controle da entrada e das vagas do sistema prisional.</w:t>
+        <w:t xml:space="preserve">O que é a CIDH?: https://www.oas.org/pt/cidh/mandato/que.asp</w:t>
       </w:r>
     </w:p>
     <w:p>
@@ -1755,7 +1601,7 @@
         </w:numPr>
       </w:pPr>
       <w:r>
-        <w:t xml:space="preserve">Qualidade da ambiência, dos serviços prestados e da estrutura prisional.</w:t>
+        <w:t xml:space="preserve">O que é a Corte IDH?: https://www.corteidh.or.cr/que_es_la_corte.cfm?lang=pt</w:t>
       </w:r>
     </w:p>
     <w:p>
@@ -1767,7 +1613,7 @@
         </w:numPr>
       </w:pPr>
       <w:r>
-        <w:t xml:space="preserve">Processos de saída da prisão e de reintegração social.</w:t>
+        <w:t xml:space="preserve">Estatuto da Comissão Interamericana de Direitos Humanos: https://www.oas.org/pt/cidh/mandato/Basicos/estatutoCIDH.asp</w:t>
       </w:r>
     </w:p>
     <w:p>
@@ -1779,7 +1625,7 @@
         </w:numPr>
       </w:pPr>
       <w:r>
-        <w:t xml:space="preserve">Políticas de não repetição do Estado de Coisas Inconstitucional no sistema prisional.</w:t>
+        <w:t xml:space="preserve">Declaração Americana de Direitos e Deveres do Homem: https://www.oas.org/pt/cidh/mandato/Basicos/declaracion.asp</w:t>
       </w:r>
     </w:p>
     <w:p>
@@ -1795,7 +1641,7 @@
         <w:pStyle w:val="BodyText"/>
       </w:pPr>
       <w:r>
-        <w:t xml:space="preserve">Entregas já formalizadas</w:t>
+        <w:t xml:space="preserve">Finalidade institucional</w:t>
       </w:r>
     </w:p>
     <w:p>
@@ -1811,39 +1657,113 @@
         <w:pStyle w:val="BodyText"/>
       </w:pPr>
       <w:r>
-        <w:t xml:space="preserve">No campo das ouvidorias e da participação social, o Pena Justa já reúne marcos normativos que podem ser destacados nesta página:</w:t>
-      </w:r>
-    </w:p>
-    <w:p>
-      <w:pPr>
-        <w:pStyle w:val="BodyText"/>
-      </w:pPr>
-      <w:r>
-        <w:t xml:space="preserve">Subtítulo:</w:t>
-      </w:r>
-    </w:p>
-    <w:p>
-      <w:pPr>
-        <w:pStyle w:val="BodyText"/>
-      </w:pPr>
-      <w:r>
-        <w:t xml:space="preserve">Normativo publicado</w:t>
-      </w:r>
-    </w:p>
-    <w:p>
-      <w:pPr>
-        <w:pStyle w:val="BodyText"/>
-      </w:pPr>
-      <w:r>
-        <w:t xml:space="preserve">Título:</w:t>
-      </w:r>
-    </w:p>
-    <w:p>
-      <w:pPr>
-        <w:pStyle w:val="BodyText"/>
-      </w:pPr>
-      <w:r>
-        <w:t xml:space="preserve">Instrução Normativa nº 75/2026</w:t>
+        <w:t xml:space="preserve">Esta página temática reúne a apresentação institucional da Ema - SIDH e oferece um ponto de consulta inicial para acompanhamento qualificado de temas do sistema interamericano com incidência sobre os serviços penais, favorecendo transparência, memória institucional e articulação técnica.</w:t>
+      </w:r>
+    </w:p>
+    <w:bookmarkEnd w:id="21"/>
+    <w:bookmarkStart w:id="22" w:name="subpágina-3---plano-pena-justa"/>
+    <w:p>
+      <w:pPr>
+        <w:pStyle w:val="Heading2"/>
+      </w:pPr>
+      <w:r>
+        <w:t xml:space="preserve">Subpágina 3 - Plano Pena Justa</w:t>
+      </w:r>
+    </w:p>
+    <w:p>
+      <w:pPr>
+        <w:pStyle w:val="FirstParagraph"/>
+      </w:pPr>
+      <w:r>
+        <w:t xml:space="preserve">Título da página:</w:t>
+      </w:r>
+    </w:p>
+    <w:p>
+      <w:pPr>
+        <w:pStyle w:val="BodyText"/>
+      </w:pPr>
+      <w:r>
+        <w:t xml:space="preserve">Plano Pena Justa</w:t>
+      </w:r>
+    </w:p>
+    <w:p>
+      <w:pPr>
+        <w:pStyle w:val="BodyText"/>
+      </w:pPr>
+      <w:r>
+        <w:t xml:space="preserve">Imagem de destaque:</w:t>
+      </w:r>
+    </w:p>
+    <w:p>
+      <w:pPr>
+        <w:pStyle w:val="BodyText"/>
+      </w:pPr>
+      <w:r>
+        <w:t xml:space="preserve">Documentação/Botao_PenaJusta.png</w:t>
+      </w:r>
+    </w:p>
+    <w:p>
+      <w:pPr>
+        <w:pStyle w:val="BodyText"/>
+      </w:pPr>
+      <w:r>
+        <w:t xml:space="preserve">Texto alternativo sugerido:</w:t>
+      </w:r>
+    </w:p>
+    <w:p>
+      <w:pPr>
+        <w:pStyle w:val="BodyText"/>
+      </w:pPr>
+      <w:r>
+        <w:t xml:space="preserve">Marca do Plano Pena Justa.</w:t>
+      </w:r>
+    </w:p>
+    <w:p>
+      <w:pPr>
+        <w:pStyle w:val="BodyText"/>
+      </w:pPr>
+      <w:r>
+        <w:t xml:space="preserve">Identificador editorial:</w:t>
+      </w:r>
+    </w:p>
+    <w:p>
+      <w:pPr>
+        <w:pStyle w:val="BodyText"/>
+      </w:pPr>
+      <w:r>
+        <w:t xml:space="preserve">Conteúdo Técnico e Projetos Estruturantes</w:t>
+      </w:r>
+    </w:p>
+    <w:p>
+      <w:pPr>
+        <w:pStyle w:val="BodyText"/>
+      </w:pPr>
+      <w:r>
+        <w:t xml:space="preserve">Texto de destaque:</w:t>
+      </w:r>
+    </w:p>
+    <w:p>
+      <w:pPr>
+        <w:pStyle w:val="BodyText"/>
+      </w:pPr>
+      <w:r>
+        <w:t xml:space="preserve">Ambiente dedicado ao Plano Pena Justa, com informações gerais, documentos públicos e marcos relacionados ao fortalecimento das ouvidorias no sistema penal.</w:t>
+      </w:r>
+    </w:p>
+    <w:p>
+      <w:pPr>
+        <w:pStyle w:val="BodyText"/>
+      </w:pPr>
+      <w:r>
+        <w:t xml:space="preserve">Seção:</w:t>
+      </w:r>
+    </w:p>
+    <w:p>
+      <w:pPr>
+        <w:pStyle w:val="BodyText"/>
+      </w:pPr>
+      <w:r>
+        <w:t xml:space="preserve">Escopo desta subpágina</w:t>
       </w:r>
     </w:p>
     <w:p>
@@ -1859,71 +1779,31 @@
         <w:pStyle w:val="BodyText"/>
       </w:pPr>
       <w:r>
-        <w:t xml:space="preserve">Estabelece parâmetros mínimos para a criação e a estruturação de Ouvidorias de Serviços Penais nos Estados e no Distrito Federal, com diretrizes de autonomia, transparência, acessibilidade e integração preferencial ao Fala.BR.</w:t>
-      </w:r>
-    </w:p>
-    <w:p>
-      <w:pPr>
-        <w:pStyle w:val="BodyText"/>
-      </w:pPr>
-      <w:r>
-        <w:t xml:space="preserve">Link:</w:t>
-      </w:r>
-    </w:p>
-    <w:p>
-      <w:pPr>
-        <w:pStyle w:val="BodyText"/>
-      </w:pPr>
-      <w:r>
-        <w:t xml:space="preserve">Acessar a Instrução Normativa (PDF)</w:t>
-      </w:r>
-    </w:p>
-    <w:p>
-      <w:pPr>
-        <w:pStyle w:val="BodyText"/>
-      </w:pPr>
-      <w:r>
-        <w:t xml:space="preserve">Arquivo:</w:t>
-      </w:r>
-    </w:p>
-    <w:p>
-      <w:pPr>
-        <w:pStyle w:val="BodyText"/>
-      </w:pPr>
-      <w:r>
-        <w:t xml:space="preserve">Subpages/Pena_justa/SEI_35153985_Instrucao_Normativa_75.pdf</w:t>
-      </w:r>
-    </w:p>
-    <w:p>
-      <w:pPr>
-        <w:pStyle w:val="BodyText"/>
-      </w:pPr>
-      <w:r>
-        <w:t xml:space="preserve">Subtítulo:</w:t>
-      </w:r>
-    </w:p>
-    <w:p>
-      <w:pPr>
-        <w:pStyle w:val="BodyText"/>
-      </w:pPr>
-      <w:r>
-        <w:t xml:space="preserve">Rede instituída</w:t>
-      </w:r>
-    </w:p>
-    <w:p>
-      <w:pPr>
-        <w:pStyle w:val="BodyText"/>
-      </w:pPr>
-      <w:r>
-        <w:t xml:space="preserve">Título:</w:t>
-      </w:r>
-    </w:p>
-    <w:p>
-      <w:pPr>
-        <w:pStyle w:val="BodyText"/>
-      </w:pPr>
-      <w:r>
-        <w:t xml:space="preserve">Portaria nº 549/2026</w:t>
+        <w:t xml:space="preserve">O Plano Pena Justa é o Plano Nacional para o Enfrentamento do Estado de Coisas Inconstitucional nas Prisões Brasileiras, no âmbito da ADPF 347. Sua proposta articula ações de qualificação das políticas penais, fortalecimento da segurança pública, valorização dos servidores penais, transparência, participação social e monitoramento das metas pactuadas.</w:t>
+      </w:r>
+    </w:p>
+    <w:p>
+      <w:pPr>
+        <w:pStyle w:val="BodyText"/>
+      </w:pPr>
+      <w:r>
+        <w:t xml:space="preserve">Na perspectiva da Ouvidoria Nacional de Serviços Penais, esta subpágina reúne referências públicas do Plano voltadas ao fortalecimento da participação social, da escuta qualificada e da articulação entre as ouvidorias dos serviços penais nos Estados e no Distrito Federal.</w:t>
+      </w:r>
+    </w:p>
+    <w:p>
+      <w:pPr>
+        <w:pStyle w:val="BodyText"/>
+      </w:pPr>
+      <w:r>
+        <w:t xml:space="preserve">Seção:</w:t>
+      </w:r>
+    </w:p>
+    <w:p>
+      <w:pPr>
+        <w:pStyle w:val="BodyText"/>
+      </w:pPr>
+      <w:r>
+        <w:t xml:space="preserve">Eixos de atuação</w:t>
       </w:r>
     </w:p>
     <w:p>
@@ -1939,63 +1819,7 @@
         <w:pStyle w:val="BodyText"/>
       </w:pPr>
       <w:r>
-        <w:t xml:space="preserve">Institui a Rede Nacional de Ouvidorias de Serviços Penais - Renospen, como instância permanente de cooperação técnica, intercâmbio de informações e fortalecimento institucional das ouvidorias no sistema penal.</w:t>
-      </w:r>
-    </w:p>
-    <w:p>
-      <w:pPr>
-        <w:pStyle w:val="BodyText"/>
-      </w:pPr>
-      <w:r>
-        <w:t xml:space="preserve">Link:</w:t>
-      </w:r>
-    </w:p>
-    <w:p>
-      <w:pPr>
-        <w:pStyle w:val="BodyText"/>
-      </w:pPr>
-      <w:r>
-        <w:t xml:space="preserve">Acessar a Portaria (PDF)</w:t>
-      </w:r>
-    </w:p>
-    <w:p>
-      <w:pPr>
-        <w:pStyle w:val="BodyText"/>
-      </w:pPr>
-      <w:r>
-        <w:t xml:space="preserve">Arquivo:</w:t>
-      </w:r>
-    </w:p>
-    <w:p>
-      <w:pPr>
-        <w:pStyle w:val="BodyText"/>
-      </w:pPr>
-      <w:r>
-        <w:t xml:space="preserve">Subpages/Pena_justa/SEI_35032761_Portaria_549.pdf</w:t>
-      </w:r>
-    </w:p>
-    <w:p>
-      <w:pPr>
-        <w:pStyle w:val="BodyText"/>
-      </w:pPr>
-      <w:r>
-        <w:t xml:space="preserve">Seção:</w:t>
-      </w:r>
-    </w:p>
-    <w:p>
-      <w:pPr>
-        <w:pStyle w:val="BodyText"/>
-      </w:pPr>
-      <w:r>
-        <w:t xml:space="preserve">Documentos públicos de referência</w:t>
-      </w:r>
-    </w:p>
-    <w:p>
-      <w:pPr>
-        <w:pStyle w:val="BodyText"/>
-      </w:pPr>
-      <w:r>
-        <w:t xml:space="preserve">Links:</w:t>
+        <w:t xml:space="preserve">O Plano Nacional organiza sua atuação em quatro eixos estruturantes:</w:t>
       </w:r>
     </w:p>
     <w:p>
@@ -2007,7 +1831,7 @@
         </w:numPr>
       </w:pPr>
       <w:r>
-        <w:t xml:space="preserve">Plano Nacional Pena Justa (PDF): Subpages/Pena_justa/Plano_Nacional_Pena_Justa.pdf</w:t>
+        <w:t xml:space="preserve">Controle da entrada e das vagas do sistema prisional.</w:t>
       </w:r>
     </w:p>
     <w:p>
@@ -2019,17 +1843,31 @@
         </w:numPr>
       </w:pPr>
       <w:r>
-        <w:t xml:space="preserve">10 coisas que você precisa saber sobre o Pena Justa (PDF): Subpages/Pena_justa/10_Coisas_que_você_precisa_saber_sobre_o_Pena_Justa.pdf</w:t>
-      </w:r>
-    </w:p>
-    <w:bookmarkEnd w:id="22"/>
-    <w:bookmarkStart w:id="23" w:name="X9010218d04cc9bed3b5085cf6721dd78b5ea4ec"/>
-    <w:p>
-      <w:pPr>
-        <w:pStyle w:val="Heading2"/>
-      </w:pPr>
-      <w:r>
-        <w:t xml:space="preserve">Subpágina 4 - Revista Brasileira de Execução Penal</w:t>
+        <w:t xml:space="preserve">Qualidade da ambiência, dos serviços prestados e da estrutura prisional.</w:t>
+      </w:r>
+    </w:p>
+    <w:p>
+      <w:pPr>
+        <w:pStyle w:val="Compact"/>
+        <w:numPr>
+          <w:ilvl w:val="0"/>
+          <w:numId w:val="1007"/>
+        </w:numPr>
+      </w:pPr>
+      <w:r>
+        <w:t xml:space="preserve">Processos de saída da prisão e de reintegração social.</w:t>
+      </w:r>
+    </w:p>
+    <w:p>
+      <w:pPr>
+        <w:pStyle w:val="Compact"/>
+        <w:numPr>
+          <w:ilvl w:val="0"/>
+          <w:numId w:val="1007"/>
+        </w:numPr>
+      </w:pPr>
+      <w:r>
+        <w:t xml:space="preserve">Políticas de não repetição do Estado de Coisas Inconstitucional no sistema prisional.</w:t>
       </w:r>
     </w:p>
     <w:p>
@@ -2037,86 +1875,6 @@
         <w:pStyle w:val="FirstParagraph"/>
       </w:pPr>
       <w:r>
-        <w:t xml:space="preserve">Título da página:</w:t>
-      </w:r>
-    </w:p>
-    <w:p>
-      <w:pPr>
-        <w:pStyle w:val="BodyText"/>
-      </w:pPr>
-      <w:r>
-        <w:t xml:space="preserve">Revista Brasileira de Execução Penal</w:t>
-      </w:r>
-    </w:p>
-    <w:p>
-      <w:pPr>
-        <w:pStyle w:val="BodyText"/>
-      </w:pPr>
-      <w:r>
-        <w:t xml:space="preserve">Imagem de destaque:</w:t>
-      </w:r>
-    </w:p>
-    <w:p>
-      <w:pPr>
-        <w:pStyle w:val="BodyText"/>
-      </w:pPr>
-      <w:r>
-        <w:t xml:space="preserve">Documentação/Botao_RevistaBrasileira.png</w:t>
-      </w:r>
-    </w:p>
-    <w:p>
-      <w:pPr>
-        <w:pStyle w:val="BodyText"/>
-      </w:pPr>
-      <w:r>
-        <w:t xml:space="preserve">Texto alternativo sugerido:</w:t>
-      </w:r>
-    </w:p>
-    <w:p>
-      <w:pPr>
-        <w:pStyle w:val="BodyText"/>
-      </w:pPr>
-      <w:r>
-        <w:t xml:space="preserve">Botão institucional da Revista Brasileira de Execução Penal.</w:t>
-      </w:r>
-    </w:p>
-    <w:p>
-      <w:pPr>
-        <w:pStyle w:val="BodyText"/>
-      </w:pPr>
-      <w:r>
-        <w:t xml:space="preserve">Identificador editorial:</w:t>
-      </w:r>
-    </w:p>
-    <w:p>
-      <w:pPr>
-        <w:pStyle w:val="BodyText"/>
-      </w:pPr>
-      <w:r>
-        <w:t xml:space="preserve">Conteúdo Técnico e Projetos Estruturantes</w:t>
-      </w:r>
-    </w:p>
-    <w:p>
-      <w:pPr>
-        <w:pStyle w:val="BodyText"/>
-      </w:pPr>
-      <w:r>
-        <w:t xml:space="preserve">Texto de destaque:</w:t>
-      </w:r>
-    </w:p>
-    <w:p>
-      <w:pPr>
-        <w:pStyle w:val="BodyText"/>
-      </w:pPr>
-      <w:r>
-        <w:t xml:space="preserve">Em parceria com a Espen e a DCOM, a Onasp lança edição da Revista Brasileira de Execução Penal. Com o tema voltado à participação e transparência, a publicação reúne artigos e estudos que fortalecem o controle social e consolidam a Ouvidoria como ponte entre o Estado e a sociedade.</w:t>
-      </w:r>
-    </w:p>
-    <w:p>
-      <w:pPr>
-        <w:pStyle w:val="BodyText"/>
-      </w:pPr>
-      <w:r>
         <w:t xml:space="preserve">Seção:</w:t>
       </w:r>
     </w:p>
@@ -2125,7 +1883,7 @@
         <w:pStyle w:val="BodyText"/>
       </w:pPr>
       <w:r>
-        <w:t xml:space="preserve">Escopo desta subpágina</w:t>
+        <w:t xml:space="preserve">Governança e acompanhamento</w:t>
       </w:r>
     </w:p>
     <w:p>
@@ -2141,23 +1899,15 @@
         <w:pStyle w:val="BodyText"/>
       </w:pPr>
       <w:r>
-        <w:t xml:space="preserve">A Revista Brasileira de Execução Penal é o periódico técnico-científico da Secretaria Nacional de Políticas Penais (Senappen/MJSP) e constitui espaço de circulação de artigos, documentos inéditos, entrevistas, relatos de experiência e boas práticas relacionados à execução penal.</w:t>
-      </w:r>
-    </w:p>
-    <w:p>
-      <w:pPr>
-        <w:pStyle w:val="BodyText"/>
-      </w:pPr>
-      <w:r>
-        <w:t xml:space="preserve">A segunda linha do escopo:</w:t>
-      </w:r>
-    </w:p>
-    <w:p>
-      <w:pPr>
-        <w:pStyle w:val="BodyText"/>
-      </w:pPr>
-      <w:r>
-        <w:t xml:space="preserve">No contexto da Ouvidoria, a publicação contribui para aproximar produção técnica, debate qualificado e controle social, reforçando o papel da Ouvidoria como ponte entre Estado e sociedade.</w:t>
+        <w:t xml:space="preserve">No recorte da Ouvidoria Nacional de Serviços Penais, o acompanhamento do Pena Justa prioriza instrumentos que fortaleçam a escuta qualificada, a transparência ativa e a coordenação entre as ouvidorias dos serviços penais.</w:t>
+      </w:r>
+    </w:p>
+    <w:p>
+      <w:pPr>
+        <w:pStyle w:val="BodyText"/>
+      </w:pPr>
+      <w:r>
+        <w:t xml:space="preserve">Esse recorte se materializa por meio de marcos normativos e de cooperação técnica que estruturam parâmetros mínimos de atuação, incentivam integração preferencial ao Fala.BR e consolidam uma rede permanente de intercâmbio entre União, Estados e Distrito Federal.</w:t>
       </w:r>
     </w:p>
     <w:p>
@@ -2173,7 +1923,7 @@
         <w:pStyle w:val="BodyText"/>
       </w:pPr>
       <w:r>
-        <w:t xml:space="preserve">Sobre a revista</w:t>
+        <w:t xml:space="preserve">Entregas já formalizadas</w:t>
       </w:r>
     </w:p>
     <w:p>
@@ -2189,23 +1939,167 @@
         <w:pStyle w:val="BodyText"/>
       </w:pPr>
       <w:r>
-        <w:t xml:space="preserve">A RBEP publica artigos, documentos inéditos, entrevistas, relatos de experiência e descrição de boas práticas que relacionam a experiência profissional, o conhecimento produzido sobre a matéria e o cumprimento da legislação nacional.</w:t>
-      </w:r>
-    </w:p>
-    <w:p>
-      <w:pPr>
-        <w:pStyle w:val="BodyText"/>
-      </w:pPr>
-      <w:r>
-        <w:t xml:space="preserve">A segunda linha da seção:</w:t>
-      </w:r>
-    </w:p>
-    <w:p>
-      <w:pPr>
-        <w:pStyle w:val="BodyText"/>
-      </w:pPr>
-      <w:r>
-        <w:t xml:space="preserve">Os conteúdos são organizados em dossiês temáticos semestrais, e a revista recebeu qualificação A4 na classificação de periódicos Qualis Capes na avaliação do quadriênio 2021-2024.</w:t>
+        <w:t xml:space="preserve">No campo das ouvidorias e da participação social, o Pena Justa já reúne marcos normativos que podem ser destacados nesta página:</w:t>
+      </w:r>
+    </w:p>
+    <w:p>
+      <w:pPr>
+        <w:pStyle w:val="BodyText"/>
+      </w:pPr>
+      <w:r>
+        <w:t xml:space="preserve">Subtítulo:</w:t>
+      </w:r>
+    </w:p>
+    <w:p>
+      <w:pPr>
+        <w:pStyle w:val="BodyText"/>
+      </w:pPr>
+      <w:r>
+        <w:t xml:space="preserve">Normativo publicado</w:t>
+      </w:r>
+    </w:p>
+    <w:p>
+      <w:pPr>
+        <w:pStyle w:val="BodyText"/>
+      </w:pPr>
+      <w:r>
+        <w:t xml:space="preserve">Título:</w:t>
+      </w:r>
+    </w:p>
+    <w:p>
+      <w:pPr>
+        <w:pStyle w:val="BodyText"/>
+      </w:pPr>
+      <w:r>
+        <w:t xml:space="preserve">Instrução Normativa nº 75/2026</w:t>
+      </w:r>
+    </w:p>
+    <w:p>
+      <w:pPr>
+        <w:pStyle w:val="BodyText"/>
+      </w:pPr>
+      <w:r>
+        <w:t xml:space="preserve">Texto para colar:</w:t>
+      </w:r>
+    </w:p>
+    <w:p>
+      <w:pPr>
+        <w:pStyle w:val="BodyText"/>
+      </w:pPr>
+      <w:r>
+        <w:t xml:space="preserve">Estabelece parâmetros mínimos para a criação e a estruturação de Ouvidorias de Serviços Penais nos Estados e no Distrito Federal, com diretrizes de autonomia, transparência, acessibilidade e integração preferencial ao Fala.BR.</w:t>
+      </w:r>
+    </w:p>
+    <w:p>
+      <w:pPr>
+        <w:pStyle w:val="BodyText"/>
+      </w:pPr>
+      <w:r>
+        <w:t xml:space="preserve">Link:</w:t>
+      </w:r>
+    </w:p>
+    <w:p>
+      <w:pPr>
+        <w:pStyle w:val="BodyText"/>
+      </w:pPr>
+      <w:r>
+        <w:t xml:space="preserve">Acessar a Instrução Normativa (PDF)</w:t>
+      </w:r>
+    </w:p>
+    <w:p>
+      <w:pPr>
+        <w:pStyle w:val="BodyText"/>
+      </w:pPr>
+      <w:r>
+        <w:t xml:space="preserve">Arquivo:</w:t>
+      </w:r>
+    </w:p>
+    <w:p>
+      <w:pPr>
+        <w:pStyle w:val="BodyText"/>
+      </w:pPr>
+      <w:r>
+        <w:t xml:space="preserve">Subpages/Pena_justa/SEI_35153985_Instrucao_Normativa_75.pdf</w:t>
+      </w:r>
+    </w:p>
+    <w:p>
+      <w:pPr>
+        <w:pStyle w:val="BodyText"/>
+      </w:pPr>
+      <w:r>
+        <w:t xml:space="preserve">Subtítulo:</w:t>
+      </w:r>
+    </w:p>
+    <w:p>
+      <w:pPr>
+        <w:pStyle w:val="BodyText"/>
+      </w:pPr>
+      <w:r>
+        <w:t xml:space="preserve">Rede instituída</w:t>
+      </w:r>
+    </w:p>
+    <w:p>
+      <w:pPr>
+        <w:pStyle w:val="BodyText"/>
+      </w:pPr>
+      <w:r>
+        <w:t xml:space="preserve">Título:</w:t>
+      </w:r>
+    </w:p>
+    <w:p>
+      <w:pPr>
+        <w:pStyle w:val="BodyText"/>
+      </w:pPr>
+      <w:r>
+        <w:t xml:space="preserve">Portaria nº 549/2026</w:t>
+      </w:r>
+    </w:p>
+    <w:p>
+      <w:pPr>
+        <w:pStyle w:val="BodyText"/>
+      </w:pPr>
+      <w:r>
+        <w:t xml:space="preserve">Texto para colar:</w:t>
+      </w:r>
+    </w:p>
+    <w:p>
+      <w:pPr>
+        <w:pStyle w:val="BodyText"/>
+      </w:pPr>
+      <w:r>
+        <w:t xml:space="preserve">Institui a Rede Nacional de Ouvidorias de Serviços Penais - Renospen, como instância permanente de cooperação técnica, intercâmbio de informações e fortalecimento institucional das ouvidorias no sistema penal.</w:t>
+      </w:r>
+    </w:p>
+    <w:p>
+      <w:pPr>
+        <w:pStyle w:val="BodyText"/>
+      </w:pPr>
+      <w:r>
+        <w:t xml:space="preserve">Link:</w:t>
+      </w:r>
+    </w:p>
+    <w:p>
+      <w:pPr>
+        <w:pStyle w:val="BodyText"/>
+      </w:pPr>
+      <w:r>
+        <w:t xml:space="preserve">Acessar a Portaria (PDF)</w:t>
+      </w:r>
+    </w:p>
+    <w:p>
+      <w:pPr>
+        <w:pStyle w:val="BodyText"/>
+      </w:pPr>
+      <w:r>
+        <w:t xml:space="preserve">Arquivo:</w:t>
+      </w:r>
+    </w:p>
+    <w:p>
+      <w:pPr>
+        <w:pStyle w:val="BodyText"/>
+      </w:pPr>
+      <w:r>
+        <w:t xml:space="preserve">Subpages/Pena_justa/SEI_35032761_Portaria_549.pdf</w:t>
       </w:r>
     </w:p>
     <w:p>
@@ -2221,23 +2115,7 @@
         <w:pStyle w:val="BodyText"/>
       </w:pPr>
       <w:r>
-        <w:t xml:space="preserve">Acesso oficial à RBEP</w:t>
-      </w:r>
-    </w:p>
-    <w:p>
-      <w:pPr>
-        <w:pStyle w:val="BodyText"/>
-      </w:pPr>
-      <w:r>
-        <w:t xml:space="preserve">Texto para colar:</w:t>
-      </w:r>
-    </w:p>
-    <w:p>
-      <w:pPr>
-        <w:pStyle w:val="BodyText"/>
-      </w:pPr>
-      <w:r>
-        <w:t xml:space="preserve">O portal oficial da revista reúne notícias, edição atual, arquivo de edições e informações para submissão de textos.</w:t>
+        <w:t xml:space="preserve">Documentos públicos de referência</w:t>
       </w:r>
     </w:p>
     <w:p>
@@ -2257,7 +2135,7 @@
         </w:numPr>
       </w:pPr>
       <w:r>
-        <w:t xml:space="preserve">Portal oficial da Revista Brasileira de Execução Penal: https://rbepsenappen.mj.gov.br/index.php/RBEP/pt_BR</w:t>
+        <w:t xml:space="preserve">Plano Nacional Pena Justa (PDF): Subpages/Pena_justa/Plano_Nacional_Pena_Justa.pdf</w:t>
       </w:r>
     </w:p>
     <w:p>
@@ -2269,31 +2147,17 @@
         </w:numPr>
       </w:pPr>
       <w:r>
-        <w:t xml:space="preserve">Edição atual - edição completa: https://rbepsenappen.mj.gov.br/index.php/RBEP/pt_BR/issue/view/22/58</w:t>
-      </w:r>
-    </w:p>
-    <w:p>
-      <w:pPr>
-        <w:pStyle w:val="Compact"/>
-        <w:numPr>
-          <w:ilvl w:val="0"/>
-          <w:numId w:val="1008"/>
-        </w:numPr>
-      </w:pPr>
-      <w:r>
-        <w:t xml:space="preserve">Ver todas as edições: https://rbepsenappen.mj.gov.br/index.php/RBEP/pt_BR/issue/archive</w:t>
-      </w:r>
-    </w:p>
-    <w:p>
-      <w:pPr>
-        <w:pStyle w:val="Compact"/>
-        <w:numPr>
-          <w:ilvl w:val="0"/>
-          <w:numId w:val="1008"/>
-        </w:numPr>
-      </w:pPr>
-      <w:r>
-        <w:t xml:space="preserve">Enviar submissão: https://rbepsenappen.mj.gov.br/index.php/RBEP/pt_BR/about/submissions</w:t>
+        <w:t xml:space="preserve">10 coisas que você precisa saber sobre o Pena Justa (PDF): Subpages/Pena_justa/10_Coisas_que_você_precisa_saber_sobre_o_Pena_Justa.pdf</w:t>
+      </w:r>
+    </w:p>
+    <w:bookmarkEnd w:id="22"/>
+    <w:bookmarkStart w:id="23" w:name="X9010218d04cc9bed3b5085cf6721dd78b5ea4ec"/>
+    <w:p>
+      <w:pPr>
+        <w:pStyle w:val="Heading2"/>
+      </w:pPr>
+      <w:r>
+        <w:t xml:space="preserve">Subpágina 4 - Revista Brasileira de Execução Penal</w:t>
       </w:r>
     </w:p>
     <w:p>
@@ -2301,6 +2165,86 @@
         <w:pStyle w:val="FirstParagraph"/>
       </w:pPr>
       <w:r>
+        <w:t xml:space="preserve">Título da página:</w:t>
+      </w:r>
+    </w:p>
+    <w:p>
+      <w:pPr>
+        <w:pStyle w:val="BodyText"/>
+      </w:pPr>
+      <w:r>
+        <w:t xml:space="preserve">Revista Brasileira de Execução Penal</w:t>
+      </w:r>
+    </w:p>
+    <w:p>
+      <w:pPr>
+        <w:pStyle w:val="BodyText"/>
+      </w:pPr>
+      <w:r>
+        <w:t xml:space="preserve">Imagem de destaque:</w:t>
+      </w:r>
+    </w:p>
+    <w:p>
+      <w:pPr>
+        <w:pStyle w:val="BodyText"/>
+      </w:pPr>
+      <w:r>
+        <w:t xml:space="preserve">Documentação/Botao_RevistaBrasileira.png</w:t>
+      </w:r>
+    </w:p>
+    <w:p>
+      <w:pPr>
+        <w:pStyle w:val="BodyText"/>
+      </w:pPr>
+      <w:r>
+        <w:t xml:space="preserve">Texto alternativo sugerido:</w:t>
+      </w:r>
+    </w:p>
+    <w:p>
+      <w:pPr>
+        <w:pStyle w:val="BodyText"/>
+      </w:pPr>
+      <w:r>
+        <w:t xml:space="preserve">Botão institucional da Revista Brasileira de Execução Penal.</w:t>
+      </w:r>
+    </w:p>
+    <w:p>
+      <w:pPr>
+        <w:pStyle w:val="BodyText"/>
+      </w:pPr>
+      <w:r>
+        <w:t xml:space="preserve">Identificador editorial:</w:t>
+      </w:r>
+    </w:p>
+    <w:p>
+      <w:pPr>
+        <w:pStyle w:val="BodyText"/>
+      </w:pPr>
+      <w:r>
+        <w:t xml:space="preserve">Conteúdo Técnico e Projetos Estruturantes</w:t>
+      </w:r>
+    </w:p>
+    <w:p>
+      <w:pPr>
+        <w:pStyle w:val="BodyText"/>
+      </w:pPr>
+      <w:r>
+        <w:t xml:space="preserve">Texto de destaque:</w:t>
+      </w:r>
+    </w:p>
+    <w:p>
+      <w:pPr>
+        <w:pStyle w:val="BodyText"/>
+      </w:pPr>
+      <w:r>
+        <w:t xml:space="preserve">Em parceria com a Espen e a DCOM, a Onasp lança edição da Revista Brasileira de Execução Penal. Com o tema voltado à participação e transparência, a publicação reúne artigos e estudos que fortalecem o controle social e consolidam a Ouvidoria como ponte entre o Estado e a sociedade.</w:t>
+      </w:r>
+    </w:p>
+    <w:p>
+      <w:pPr>
+        <w:pStyle w:val="BodyText"/>
+      </w:pPr>
+      <w:r>
         <w:t xml:space="preserve">Seção:</w:t>
       </w:r>
     </w:p>
@@ -2309,15 +2253,127 @@
         <w:pStyle w:val="BodyText"/>
       </w:pPr>
       <w:r>
-        <w:t xml:space="preserve">Referências institucionais</w:t>
-      </w:r>
-    </w:p>
-    <w:p>
-      <w:pPr>
-        <w:pStyle w:val="BodyText"/>
-      </w:pPr>
-      <w:r>
-        <w:t xml:space="preserve">Itens para colar:</w:t>
+        <w:t xml:space="preserve">Escopo desta subpágina</w:t>
+      </w:r>
+    </w:p>
+    <w:p>
+      <w:pPr>
+        <w:pStyle w:val="BodyText"/>
+      </w:pPr>
+      <w:r>
+        <w:t xml:space="preserve">Texto para colar:</w:t>
+      </w:r>
+    </w:p>
+    <w:p>
+      <w:pPr>
+        <w:pStyle w:val="BodyText"/>
+      </w:pPr>
+      <w:r>
+        <w:t xml:space="preserve">A Revista Brasileira de Execução Penal é o periódico técnico-científico da Secretaria Nacional de Políticas Penais (Senappen/MJSP) e constitui espaço de circulação de artigos, documentos inéditos, entrevistas, relatos de experiência e boas práticas relacionados à execução penal.</w:t>
+      </w:r>
+    </w:p>
+    <w:p>
+      <w:pPr>
+        <w:pStyle w:val="BodyText"/>
+      </w:pPr>
+      <w:r>
+        <w:t xml:space="preserve">A segunda linha do escopo:</w:t>
+      </w:r>
+    </w:p>
+    <w:p>
+      <w:pPr>
+        <w:pStyle w:val="BodyText"/>
+      </w:pPr>
+      <w:r>
+        <w:t xml:space="preserve">No contexto da Ouvidoria, a publicação contribui para aproximar produção técnica, debate qualificado e controle social, reforçando o papel da Ouvidoria como ponte entre Estado e sociedade.</w:t>
+      </w:r>
+    </w:p>
+    <w:p>
+      <w:pPr>
+        <w:pStyle w:val="BodyText"/>
+      </w:pPr>
+      <w:r>
+        <w:t xml:space="preserve">Seção:</w:t>
+      </w:r>
+    </w:p>
+    <w:p>
+      <w:pPr>
+        <w:pStyle w:val="BodyText"/>
+      </w:pPr>
+      <w:r>
+        <w:t xml:space="preserve">Sobre a revista</w:t>
+      </w:r>
+    </w:p>
+    <w:p>
+      <w:pPr>
+        <w:pStyle w:val="BodyText"/>
+      </w:pPr>
+      <w:r>
+        <w:t xml:space="preserve">Texto para colar:</w:t>
+      </w:r>
+    </w:p>
+    <w:p>
+      <w:pPr>
+        <w:pStyle w:val="BodyText"/>
+      </w:pPr>
+      <w:r>
+        <w:t xml:space="preserve">A RBEP publica artigos, documentos inéditos, entrevistas, relatos de experiência e descrição de boas práticas que relacionam a experiência profissional, o conhecimento produzido sobre a matéria e o cumprimento da legislação nacional.</w:t>
+      </w:r>
+    </w:p>
+    <w:p>
+      <w:pPr>
+        <w:pStyle w:val="BodyText"/>
+      </w:pPr>
+      <w:r>
+        <w:t xml:space="preserve">A segunda linha da seção:</w:t>
+      </w:r>
+    </w:p>
+    <w:p>
+      <w:pPr>
+        <w:pStyle w:val="BodyText"/>
+      </w:pPr>
+      <w:r>
+        <w:t xml:space="preserve">Os conteúdos são organizados em dossiês temáticos semestrais, e a revista recebeu qualificação A4 na classificação de periódicos Qualis Capes na avaliação do quadriênio 2021-2024.</w:t>
+      </w:r>
+    </w:p>
+    <w:p>
+      <w:pPr>
+        <w:pStyle w:val="BodyText"/>
+      </w:pPr>
+      <w:r>
+        <w:t xml:space="preserve">Seção:</w:t>
+      </w:r>
+    </w:p>
+    <w:p>
+      <w:pPr>
+        <w:pStyle w:val="BodyText"/>
+      </w:pPr>
+      <w:r>
+        <w:t xml:space="preserve">Acesso oficial à RBEP</w:t>
+      </w:r>
+    </w:p>
+    <w:p>
+      <w:pPr>
+        <w:pStyle w:val="BodyText"/>
+      </w:pPr>
+      <w:r>
+        <w:t xml:space="preserve">Texto para colar:</w:t>
+      </w:r>
+    </w:p>
+    <w:p>
+      <w:pPr>
+        <w:pStyle w:val="BodyText"/>
+      </w:pPr>
+      <w:r>
+        <w:t xml:space="preserve">O portal oficial da revista reúne notícias, edição atual, arquivo de edições e informações para submissão de textos.</w:t>
+      </w:r>
+    </w:p>
+    <w:p>
+      <w:pPr>
+        <w:pStyle w:val="BodyText"/>
+      </w:pPr>
+      <w:r>
+        <w:t xml:space="preserve">Links:</w:t>
       </w:r>
     </w:p>
     <w:p>
@@ -2329,7 +2385,7 @@
         </w:numPr>
       </w:pPr>
       <w:r>
-        <w:t xml:space="preserve">Qualis Capes 2021-2024: A4.</w:t>
+        <w:t xml:space="preserve">Portal oficial da Revista Brasileira de Execução Penal: https://rbepsenappen.mj.gov.br/index.php/RBEP/pt_BR</w:t>
       </w:r>
     </w:p>
     <w:p>
@@ -2341,7 +2397,7 @@
         </w:numPr>
       </w:pPr>
       <w:r>
-        <w:t xml:space="preserve">ISSN: 2675-1895.</w:t>
+        <w:t xml:space="preserve">Edição atual - edição completa: https://rbepsenappen.mj.gov.br/index.php/RBEP/pt_BR/issue/view/22/58</w:t>
       </w:r>
     </w:p>
     <w:p>
@@ -2353,7 +2409,7 @@
         </w:numPr>
       </w:pPr>
       <w:r>
-        <w:t xml:space="preserve">e-ISSN: 2675-1860.</w:t>
+        <w:t xml:space="preserve">Ver todas as edições: https://rbepsenappen.mj.gov.br/index.php/RBEP/pt_BR/issue/archive</w:t>
       </w:r>
     </w:p>
     <w:p>
@@ -2362,6 +2418,78 @@
         <w:numPr>
           <w:ilvl w:val="0"/>
           <w:numId w:val="1009"/>
+        </w:numPr>
+      </w:pPr>
+      <w:r>
+        <w:t xml:space="preserve">Enviar submissão: https://rbepsenappen.mj.gov.br/index.php/RBEP/pt_BR/about/submissions</w:t>
+      </w:r>
+    </w:p>
+    <w:p>
+      <w:pPr>
+        <w:pStyle w:val="FirstParagraph"/>
+      </w:pPr>
+      <w:r>
+        <w:t xml:space="preserve">Seção:</w:t>
+      </w:r>
+    </w:p>
+    <w:p>
+      <w:pPr>
+        <w:pStyle w:val="BodyText"/>
+      </w:pPr>
+      <w:r>
+        <w:t xml:space="preserve">Referências institucionais</w:t>
+      </w:r>
+    </w:p>
+    <w:p>
+      <w:pPr>
+        <w:pStyle w:val="BodyText"/>
+      </w:pPr>
+      <w:r>
+        <w:t xml:space="preserve">Itens para colar:</w:t>
+      </w:r>
+    </w:p>
+    <w:p>
+      <w:pPr>
+        <w:pStyle w:val="Compact"/>
+        <w:numPr>
+          <w:ilvl w:val="0"/>
+          <w:numId w:val="1010"/>
+        </w:numPr>
+      </w:pPr>
+      <w:r>
+        <w:t xml:space="preserve">Qualis Capes 2021-2024: A4.</w:t>
+      </w:r>
+    </w:p>
+    <w:p>
+      <w:pPr>
+        <w:pStyle w:val="Compact"/>
+        <w:numPr>
+          <w:ilvl w:val="0"/>
+          <w:numId w:val="1010"/>
+        </w:numPr>
+      </w:pPr>
+      <w:r>
+        <w:t xml:space="preserve">ISSN: 2675-1895.</w:t>
+      </w:r>
+    </w:p>
+    <w:p>
+      <w:pPr>
+        <w:pStyle w:val="Compact"/>
+        <w:numPr>
+          <w:ilvl w:val="0"/>
+          <w:numId w:val="1010"/>
+        </w:numPr>
+      </w:pPr>
+      <w:r>
+        <w:t xml:space="preserve">e-ISSN: 2675-1860.</w:t>
+      </w:r>
+    </w:p>
+    <w:p>
+      <w:pPr>
+        <w:pStyle w:val="Compact"/>
+        <w:numPr>
+          <w:ilvl w:val="0"/>
+          <w:numId w:val="1010"/>
         </w:numPr>
       </w:pPr>
       <w:r>
@@ -2663,6 +2791,9 @@
     <w:abstractNumId w:val="991"/>
   </w:num>
   <w:num w:numId="1009">
+    <w:abstractNumId w:val="991"/>
+  </w:num>
+  <w:num w:numId="1010">
     <w:abstractNumId w:val="991"/>
   </w:num>
 </w:numbering>

</xml_diff>

<commit_message>
Ajusta quadro do ES com duas ouvidorias
</commit_message>
<xml_diff>
--- a/Documentação/estrutura_completa_pagina_onasp_para_dicom.docx
+++ b/Documentação/estrutura_completa_pagina_onasp_para_dicom.docx
@@ -16,6 +16,14 @@
         <w:pStyle w:val="FirstParagraph"/>
       </w:pPr>
       <w:r>
+        <w:t xml:space="preserve">Data de atualização: 2026-05-12</w:t>
+      </w:r>
+    </w:p>
+    <w:p>
+      <w:pPr>
+        <w:pStyle w:val="BodyText"/>
+      </w:pPr>
+      <w:r>
         <w:t xml:space="preserve">Documento de apoio para a DCOM reproduzir, no ambiente oficial gov.br/SENAPPEN, a estrutura da prévia criada para a página da Ouvidoria Nacional de Serviços Penais e suas subpáginas temáticas.</w:t>
       </w:r>
     </w:p>
@@ -386,7 +394,7 @@
         <w:pStyle w:val="BodyText"/>
       </w:pPr>
       <w:r>
-        <w:t xml:space="preserve">Se a DCOM for inserir o QR Code do chatbot em bloco separado, utilizar o arquivo Documentação/QRcode_Whatsapp.png junto à seção de canais de atendimento.</w:t>
+        <w:t xml:space="preserve">Inserir o QR Code oficial do chatbot na própria seção de canais de atendimento, em bloco compacto com legenda curta, utilizando o arquivo Documentação/QRcode_Whatsapp.png.</w:t>
       </w:r>
     </w:p>
     <w:bookmarkEnd w:id="13"/>
@@ -598,7 +606,7 @@
         <w:pStyle w:val="BodyText"/>
       </w:pPr>
       <w:r>
-        <w:t xml:space="preserve">Ema - SIDH</w:t>
+        <w:t xml:space="preserve">EMA - SENAPPEN</w:t>
       </w:r>
     </w:p>
     <w:p>
@@ -614,7 +622,7 @@
         <w:pStyle w:val="BodyText"/>
       </w:pPr>
       <w:r>
-        <w:t xml:space="preserve">Espaço da Equipe de Monitoramento e Acompanhamento das decisões e deliberações do SIDH, dedicado a fortalecer o cumprimento das determinações do Sistema Interamericano de Direitos Humanos em face do sistema penal brasileiro.</w:t>
+        <w:t xml:space="preserve">Espaço da Equipe de Monitoramento e Acompanhamento das decisões e deliberações do Sistema Interamericano de Direitos Humanos em face do sistema penal nacional, dedicado a fortalecer o cumprimento das determinações do SIDH em parceria com as Unidades Federativas.</w:t>
       </w:r>
     </w:p>
     <w:p>
@@ -646,7 +654,7 @@
         <w:pStyle w:val="BodyText"/>
       </w:pPr>
       <w:r>
-        <w:t xml:space="preserve">Subpágina Ema - SIDH</w:t>
+        <w:t xml:space="preserve">Subpágina EMA - SENAPPEN</w:t>
       </w:r>
     </w:p>
     <w:p>
@@ -758,7 +766,7 @@
         <w:pStyle w:val="BodyText"/>
       </w:pPr>
       <w:r>
-        <w:t xml:space="preserve">Em parceria com a Espen e a DCOM, a Onasp lança edição da Revista Brasileira de Execução Penal. Com o tema voltado à participação e transparência, a publicação reúne artigos e estudos que fortalecem o controle social e consolidam a Ouvidoria como ponte entre o Estado e a sociedade.</w:t>
+        <w:t xml:space="preserve">Em articulação com a Espen e a DCOM, a Onasp reúne referências da Revista Brasileira de Execução Penal, com acesso a dossiês, notícias editoriais e conteúdos relacionados à participação social, transparência e direitos no sistema penal.</w:t>
       </w:r>
     </w:p>
     <w:p>
@@ -992,7 +1000,7 @@
         <w:pStyle w:val="BodyText"/>
       </w:pPr>
       <w:r>
-        <w:t xml:space="preserve">Painel de Tratamento de Demandas da Ouvidoria Nacional dos Serviços Penais</w:t>
+        <w:t xml:space="preserve">Painel de Tratamento de Demandas da Ouvidoria Nacional de Serviços Penais</w:t>
       </w:r>
     </w:p>
     <w:p>
@@ -1267,6 +1275,2149 @@
         <w:pStyle w:val="BodyText"/>
       </w:pPr>
       <w:r>
+        <w:t xml:space="preserve">Governança e cooperação técnica</w:t>
+      </w:r>
+    </w:p>
+    <w:p>
+      <w:pPr>
+        <w:pStyle w:val="BodyText"/>
+      </w:pPr>
+      <w:r>
+        <w:t xml:space="preserve">Texto para colar:</w:t>
+      </w:r>
+    </w:p>
+    <w:p>
+      <w:pPr>
+        <w:pStyle w:val="BodyText"/>
+      </w:pPr>
+      <w:r>
+        <w:t xml:space="preserve">No recorte da ONASP, a Rede de Ouvidorias pode ser apresentada como espaço permanente de articulação entre unidades responsáveis pela escuta institucional, com foco em difusão de referências técnicas, intercâmbio de práticas e aperfeiçoamento contínuo da atuação no sistema penal.</w:t>
+      </w:r>
+    </w:p>
+    <w:p>
+      <w:pPr>
+        <w:pStyle w:val="BodyText"/>
+      </w:pPr>
+      <w:r>
+        <w:t xml:space="preserve">Esse arranjo é reforçado por instrumentos que definem parâmetros mínimos para a estruturação das ouvidorias e institucionalizam a Renospen como instância de cooperação técnica, integração federativa e fortalecimento institucional.</w:t>
+      </w:r>
+    </w:p>
+    <w:p>
+      <w:pPr>
+        <w:pStyle w:val="BodyText"/>
+      </w:pPr>
+      <w:r>
+        <w:t xml:space="preserve">Seção:</w:t>
+      </w:r>
+    </w:p>
+    <w:p>
+      <w:pPr>
+        <w:pStyle w:val="BodyText"/>
+      </w:pPr>
+      <w:r>
+        <w:t xml:space="preserve">Mapa interativo e destaque por UF</w:t>
+      </w:r>
+    </w:p>
+    <w:p>
+      <w:pPr>
+        <w:pStyle w:val="BodyText"/>
+      </w:pPr>
+      <w:r>
+        <w:t xml:space="preserve">Texto para colar:</w:t>
+      </w:r>
+    </w:p>
+    <w:p>
+      <w:pPr>
+        <w:pStyle w:val="BodyText"/>
+      </w:pPr>
+      <w:r>
+        <w:t xml:space="preserve">Esta prévia passou a reunir, em um único ponto, os contatos informados pelas unidades da federação no Diagnóstico de Ouvidorias Estaduais. No ambiente de validação local, a consulta foi organizada por meio de um mapa visual com seleção por UF e painel lateral com dados resumidos da ouvidoria correspondente ou, quando cabível, das referências institucionais associadas à mesma unidade da federação.</w:t>
+      </w:r>
+    </w:p>
+    <w:p>
+      <w:pPr>
+        <w:pStyle w:val="BodyText"/>
+      </w:pPr>
+      <w:r>
+        <w:t xml:space="preserve">Orientação para publicação oficial:</w:t>
+      </w:r>
+    </w:p>
+    <w:p>
+      <w:pPr>
+        <w:pStyle w:val="BodyText"/>
+      </w:pPr>
+      <w:r>
+        <w:t xml:space="preserve">No ambiente gov.br, recomenda-se tratar o mapa interativo apenas como referência visual da prévia. A solução mais segura para publicação é manter um seletor simples por UF, um bloco expansível por estado ou, preferencialmente, o quadro textual de contatos apresentado abaixo, sem depender de JavaScript customizado.</w:t>
+      </w:r>
+    </w:p>
+    <w:p>
+      <w:pPr>
+        <w:pStyle w:val="BodyText"/>
+      </w:pPr>
+      <w:r>
+        <w:t xml:space="preserve">Quando a mesma UF tiver mais de uma referência institucional relevante, como ocorre no Espírito Santo, recomenda-se separar as informações em blocos independentes dentro do quadro lateral ou em linhas distintas no quadro textual, evitando misturar órgãos, responsáveis, telefones e endereços em uma única ficha.</w:t>
+      </w:r>
+    </w:p>
+    <w:p>
+      <w:pPr>
+        <w:pStyle w:val="BodyText"/>
+      </w:pPr>
+      <w:r>
+        <w:t xml:space="preserve">Fonte sugerida:</w:t>
+      </w:r>
+    </w:p>
+    <w:p>
+      <w:pPr>
+        <w:pStyle w:val="BodyText"/>
+      </w:pPr>
+      <w:r>
+        <w:t xml:space="preserve">Diagnóstico de Ouvidorias Estaduais, consolidado pela ONASP a partir das respostas recebidas em 2026.</w:t>
+      </w:r>
+    </w:p>
+    <w:p>
+      <w:pPr>
+        <w:pStyle w:val="BodyText"/>
+      </w:pPr>
+      <w:r>
+        <w:t xml:space="preserve">Seção:</w:t>
+      </w:r>
+    </w:p>
+    <w:p>
+      <w:pPr>
+        <w:pStyle w:val="BodyText"/>
+      </w:pPr>
+      <w:r>
+        <w:t xml:space="preserve">Quadro textual de contatos das ouvidorias</w:t>
+      </w:r>
+    </w:p>
+    <w:p>
+      <w:pPr>
+        <w:pStyle w:val="BodyText"/>
+      </w:pPr>
+      <w:r>
+        <w:t xml:space="preserve">Texto para colar:</w:t>
+      </w:r>
+    </w:p>
+    <w:p>
+      <w:pPr>
+        <w:pStyle w:val="BodyText"/>
+      </w:pPr>
+      <w:r>
+        <w:t xml:space="preserve">Para facilitar reaproveitamento em formatos mais simples, o mesmo conteúdo do painel interativo foi organizado em tabela, com consulta rápida por unidade da federação.</w:t>
+      </w:r>
+    </w:p>
+    <w:p>
+      <w:pPr>
+        <w:pStyle w:val="BodyText"/>
+      </w:pPr>
+      <w:r>
+        <w:t xml:space="preserve">Tabela sugerida:</w:t>
+      </w:r>
+    </w:p>
+    <w:tbl>
+      <w:tblPr>
+        <w:tblStyle w:val="Table"/>
+        <w:tblW w:type="pct" w:w="5000"/>
+        <w:tblLayout w:type="fixed"/>
+        <w:tblLook w:firstRow="1" w:lastRow="0" w:firstColumn="0" w:lastColumn="0" w:noHBand="0" w:noVBand="0" w:val="0020"/>
+      </w:tblPr>
+      <w:tblGrid>
+        <w:gridCol w:w="1320"/>
+        <w:gridCol w:w="1320"/>
+        <w:gridCol w:w="1320"/>
+        <w:gridCol w:w="1320"/>
+        <w:gridCol w:w="1320"/>
+        <w:gridCol w:w="1320"/>
+      </w:tblGrid>
+      <w:tr>
+        <w:trPr>
+          <w:tblHeader w:val="on"/>
+        </w:trPr>
+        <w:tc>
+          <w:tcPr/>
+          <w:p>
+            <w:pPr>
+              <w:pStyle w:val="Compact"/>
+            </w:pPr>
+            <w:r>
+              <w:t xml:space="preserve">UF</w:t>
+            </w:r>
+          </w:p>
+        </w:tc>
+        <w:tc>
+          <w:tcPr/>
+          <w:p>
+            <w:pPr>
+              <w:pStyle w:val="Compact"/>
+            </w:pPr>
+            <w:r>
+              <w:t xml:space="preserve">Estado</w:t>
+            </w:r>
+          </w:p>
+        </w:tc>
+        <w:tc>
+          <w:tcPr/>
+          <w:p>
+            <w:pPr>
+              <w:pStyle w:val="Compact"/>
+            </w:pPr>
+            <w:r>
+              <w:t xml:space="preserve">E-mail</w:t>
+            </w:r>
+          </w:p>
+        </w:tc>
+        <w:tc>
+          <w:tcPr/>
+          <w:p>
+            <w:pPr>
+              <w:pStyle w:val="Compact"/>
+            </w:pPr>
+            <w:r>
+              <w:t xml:space="preserve">Telefone</w:t>
+            </w:r>
+          </w:p>
+        </w:tc>
+        <w:tc>
+          <w:tcPr/>
+          <w:p>
+            <w:pPr>
+              <w:pStyle w:val="Compact"/>
+            </w:pPr>
+            <w:r>
+              <w:t xml:space="preserve">WhatsApp / app</w:t>
+            </w:r>
+          </w:p>
+        </w:tc>
+        <w:tc>
+          <w:tcPr/>
+          <w:p>
+            <w:pPr>
+              <w:pStyle w:val="Compact"/>
+            </w:pPr>
+            <w:r>
+              <w:t xml:space="preserve">Observações</w:t>
+            </w:r>
+          </w:p>
+        </w:tc>
+      </w:tr>
+      <w:tr>
+        <w:tc>
+          <w:tcPr/>
+          <w:p>
+            <w:pPr>
+              <w:pStyle w:val="Compact"/>
+            </w:pPr>
+            <w:r>
+              <w:t xml:space="preserve">AC</w:t>
+            </w:r>
+          </w:p>
+        </w:tc>
+        <w:tc>
+          <w:tcPr/>
+          <w:p>
+            <w:pPr>
+              <w:pStyle w:val="Compact"/>
+            </w:pPr>
+            <w:r>
+              <w:t xml:space="preserve">Acre</w:t>
+            </w:r>
+          </w:p>
+        </w:tc>
+        <w:tc>
+          <w:tcPr/>
+          <w:p>
+            <w:pPr>
+              <w:pStyle w:val="Compact"/>
+            </w:pPr>
+            <w:r>
+              <w:t xml:space="preserve">ouvidoria.iapen@ac.gov.br</w:t>
+            </w:r>
+          </w:p>
+        </w:tc>
+        <w:tc>
+          <w:tcPr/>
+          <w:p>
+            <w:pPr>
+              <w:pStyle w:val="Compact"/>
+            </w:pPr>
+            <w:r>
+              <w:t xml:space="preserve">68 98112-4517</w:t>
+            </w:r>
+          </w:p>
+        </w:tc>
+        <w:tc>
+          <w:tcPr/>
+          <w:p>
+            <w:pPr>
+              <w:pStyle w:val="Compact"/>
+            </w:pPr>
+            <w:r>
+              <w:t xml:space="preserve">68 98112-4517</w:t>
+            </w:r>
+          </w:p>
+        </w:tc>
+        <w:tc>
+          <w:tcPr/>
+          <w:p>
+            <w:pPr>
+              <w:pStyle w:val="Compact"/>
+            </w:pPr>
+            <w:r>
+              <w:t xml:space="preserve">Fala.BR parcial.</w:t>
+            </w:r>
+          </w:p>
+        </w:tc>
+      </w:tr>
+      <w:tr>
+        <w:tc>
+          <w:tcPr/>
+          <w:p>
+            <w:pPr>
+              <w:pStyle w:val="Compact"/>
+            </w:pPr>
+            <w:r>
+              <w:t xml:space="preserve">AL</w:t>
+            </w:r>
+          </w:p>
+        </w:tc>
+        <w:tc>
+          <w:tcPr/>
+          <w:p>
+            <w:pPr>
+              <w:pStyle w:val="Compact"/>
+            </w:pPr>
+            <w:r>
+              <w:t xml:space="preserve">Alagoas</w:t>
+            </w:r>
+          </w:p>
+        </w:tc>
+        <w:tc>
+          <w:tcPr/>
+          <w:p>
+            <w:pPr>
+              <w:pStyle w:val="Compact"/>
+            </w:pPr>
+            <w:r>
+              <w:t xml:space="preserve">ouvidoria@seris.al.gov.br</w:t>
+            </w:r>
+          </w:p>
+        </w:tc>
+        <w:tc>
+          <w:tcPr/>
+          <w:p>
+            <w:pPr>
+              <w:pStyle w:val="Compact"/>
+            </w:pPr>
+            <w:r>
+              <w:t xml:space="preserve">82-3315-1756</w:t>
+            </w:r>
+          </w:p>
+        </w:tc>
+        <w:tc>
+          <w:tcPr/>
+          <w:p>
+            <w:pPr>
+              <w:pStyle w:val="Compact"/>
+            </w:pPr>
+            <w:r>
+              <w:t xml:space="preserve">82-98802-5049</w:t>
+            </w:r>
+          </w:p>
+        </w:tc>
+        <w:tc>
+          <w:tcPr/>
+          <w:p>
+            <w:pPr>
+              <w:pStyle w:val="Compact"/>
+            </w:pPr>
+            <w:r>
+              <w:t xml:space="preserve">Sem uso do Fala.BR.</w:t>
+            </w:r>
+          </w:p>
+        </w:tc>
+      </w:tr>
+      <w:tr>
+        <w:tc>
+          <w:tcPr/>
+          <w:p>
+            <w:pPr>
+              <w:pStyle w:val="Compact"/>
+            </w:pPr>
+            <w:r>
+              <w:t xml:space="preserve">AM</w:t>
+            </w:r>
+          </w:p>
+        </w:tc>
+        <w:tc>
+          <w:tcPr/>
+          <w:p>
+            <w:pPr>
+              <w:pStyle w:val="Compact"/>
+            </w:pPr>
+            <w:r>
+              <w:t xml:space="preserve">Amazonas</w:t>
+            </w:r>
+          </w:p>
+        </w:tc>
+        <w:tc>
+          <w:tcPr/>
+          <w:p>
+            <w:pPr>
+              <w:pStyle w:val="Compact"/>
+            </w:pPr>
+            <w:r>
+              <w:t xml:space="preserve">ouvidoria@seap.am.gov.br</w:t>
+            </w:r>
+          </w:p>
+        </w:tc>
+        <w:tc>
+          <w:tcPr/>
+          <w:p>
+            <w:pPr>
+              <w:pStyle w:val="Compact"/>
+            </w:pPr>
+            <w:r>
+              <w:t xml:space="preserve">Não informado</w:t>
+            </w:r>
+          </w:p>
+        </w:tc>
+        <w:tc>
+          <w:tcPr/>
+          <w:p>
+            <w:pPr>
+              <w:pStyle w:val="Compact"/>
+            </w:pPr>
+            <w:r>
+              <w:t xml:space="preserve">92 9981033886 / 92 99389-0160</w:t>
+            </w:r>
+          </w:p>
+        </w:tc>
+        <w:tc>
+          <w:tcPr/>
+          <w:p>
+            <w:pPr>
+              <w:pStyle w:val="Compact"/>
+            </w:pPr>
+            <w:r>
+              <w:t xml:space="preserve">Fala.BR parcial.</w:t>
+            </w:r>
+          </w:p>
+        </w:tc>
+      </w:tr>
+      <w:tr>
+        <w:tc>
+          <w:tcPr/>
+          <w:p>
+            <w:pPr>
+              <w:pStyle w:val="Compact"/>
+            </w:pPr>
+            <w:r>
+              <w:t xml:space="preserve">AP</w:t>
+            </w:r>
+          </w:p>
+        </w:tc>
+        <w:tc>
+          <w:tcPr/>
+          <w:p>
+            <w:pPr>
+              <w:pStyle w:val="Compact"/>
+            </w:pPr>
+            <w:r>
+              <w:t xml:space="preserve">Amapá</w:t>
+            </w:r>
+          </w:p>
+        </w:tc>
+        <w:tc>
+          <w:tcPr/>
+          <w:p>
+            <w:pPr>
+              <w:pStyle w:val="Compact"/>
+            </w:pPr>
+            <w:r>
+              <w:t xml:space="preserve">ouvidoria@iapen.ap.gov.br</w:t>
+            </w:r>
+          </w:p>
+        </w:tc>
+        <w:tc>
+          <w:tcPr/>
+          <w:p>
+            <w:pPr>
+              <w:pStyle w:val="Compact"/>
+            </w:pPr>
+            <w:r>
+              <w:t xml:space="preserve">96 98414-9015</w:t>
+            </w:r>
+          </w:p>
+        </w:tc>
+        <w:tc>
+          <w:tcPr/>
+          <w:p>
+            <w:pPr>
+              <w:pStyle w:val="Compact"/>
+            </w:pPr>
+            <w:r>
+              <w:t xml:space="preserve">96 98414-9015</w:t>
+            </w:r>
+          </w:p>
+        </w:tc>
+        <w:tc>
+          <w:tcPr/>
+          <w:p>
+            <w:pPr>
+              <w:pStyle w:val="Compact"/>
+            </w:pPr>
+            <w:r>
+              <w:t xml:space="preserve">Sem uso do Fala.BR.</w:t>
+            </w:r>
+          </w:p>
+        </w:tc>
+      </w:tr>
+      <w:tr>
+        <w:tc>
+          <w:tcPr/>
+          <w:p>
+            <w:pPr>
+              <w:pStyle w:val="Compact"/>
+            </w:pPr>
+            <w:r>
+              <w:t xml:space="preserve">BA</w:t>
+            </w:r>
+          </w:p>
+        </w:tc>
+        <w:tc>
+          <w:tcPr/>
+          <w:p>
+            <w:pPr>
+              <w:pStyle w:val="Compact"/>
+            </w:pPr>
+            <w:r>
+              <w:t xml:space="preserve">Bahia</w:t>
+            </w:r>
+          </w:p>
+        </w:tc>
+        <w:tc>
+          <w:tcPr/>
+          <w:p>
+            <w:pPr>
+              <w:pStyle w:val="Compact"/>
+            </w:pPr>
+            <w:r>
+              <w:t xml:space="preserve">ouvidoria@seap.ba.gov.br</w:t>
+            </w:r>
+          </w:p>
+        </w:tc>
+        <w:tc>
+          <w:tcPr/>
+          <w:p>
+            <w:pPr>
+              <w:pStyle w:val="Compact"/>
+            </w:pPr>
+            <w:r>
+              <w:t xml:space="preserve">7131187405</w:t>
+            </w:r>
+          </w:p>
+        </w:tc>
+        <w:tc>
+          <w:tcPr/>
+          <w:p>
+            <w:pPr>
+              <w:pStyle w:val="Compact"/>
+            </w:pPr>
+            <w:r>
+              <w:t xml:space="preserve">Não informado</w:t>
+            </w:r>
+          </w:p>
+        </w:tc>
+        <w:tc>
+          <w:tcPr/>
+          <w:p>
+            <w:pPr>
+              <w:pStyle w:val="Compact"/>
+            </w:pPr>
+            <w:r>
+              <w:t xml:space="preserve">Sem uso do Fala.BR.</w:t>
+            </w:r>
+          </w:p>
+        </w:tc>
+      </w:tr>
+      <w:tr>
+        <w:tc>
+          <w:tcPr/>
+          <w:p>
+            <w:pPr>
+              <w:pStyle w:val="Compact"/>
+            </w:pPr>
+            <w:r>
+              <w:t xml:space="preserve">CE</w:t>
+            </w:r>
+          </w:p>
+        </w:tc>
+        <w:tc>
+          <w:tcPr/>
+          <w:p>
+            <w:pPr>
+              <w:pStyle w:val="Compact"/>
+            </w:pPr>
+            <w:r>
+              <w:t xml:space="preserve">Ceará</w:t>
+            </w:r>
+          </w:p>
+        </w:tc>
+        <w:tc>
+          <w:tcPr/>
+          <w:p>
+            <w:pPr>
+              <w:pStyle w:val="Compact"/>
+            </w:pPr>
+            <w:r>
+              <w:t xml:space="preserve">ouvidoria@sap.ce.gov.br</w:t>
+            </w:r>
+          </w:p>
+        </w:tc>
+        <w:tc>
+          <w:tcPr/>
+          <w:p>
+            <w:pPr>
+              <w:pStyle w:val="Compact"/>
+            </w:pPr>
+            <w:r>
+              <w:t xml:space="preserve">85 2018.2965</w:t>
+            </w:r>
+          </w:p>
+        </w:tc>
+        <w:tc>
+          <w:tcPr/>
+          <w:p>
+            <w:pPr>
+              <w:pStyle w:val="Compact"/>
+            </w:pPr>
+            <w:r>
+              <w:t xml:space="preserve">155</w:t>
+            </w:r>
+          </w:p>
+        </w:tc>
+        <w:tc>
+          <w:tcPr/>
+          <w:p>
+            <w:pPr>
+              <w:pStyle w:val="Compact"/>
+            </w:pPr>
+            <w:r>
+              <w:t xml:space="preserve">Sem uso do Fala.BR.</w:t>
+            </w:r>
+          </w:p>
+        </w:tc>
+      </w:tr>
+      <w:tr>
+        <w:tc>
+          <w:tcPr/>
+          <w:p>
+            <w:pPr>
+              <w:pStyle w:val="Compact"/>
+            </w:pPr>
+            <w:r>
+              <w:t xml:space="preserve">DF</w:t>
+            </w:r>
+          </w:p>
+        </w:tc>
+        <w:tc>
+          <w:tcPr/>
+          <w:p>
+            <w:pPr>
+              <w:pStyle w:val="Compact"/>
+            </w:pPr>
+            <w:r>
+              <w:t xml:space="preserve">Distrito Federal</w:t>
+            </w:r>
+          </w:p>
+        </w:tc>
+        <w:tc>
+          <w:tcPr/>
+          <w:p>
+            <w:pPr>
+              <w:pStyle w:val="Compact"/>
+            </w:pPr>
+            <w:r>
+              <w:t xml:space="preserve">ouvidoria@seape.df.gov.br</w:t>
+            </w:r>
+          </w:p>
+        </w:tc>
+        <w:tc>
+          <w:tcPr/>
+          <w:p>
+            <w:pPr>
+              <w:pStyle w:val="Compact"/>
+            </w:pPr>
+            <w:r>
+              <w:t xml:space="preserve">61333359538</w:t>
+            </w:r>
+          </w:p>
+        </w:tc>
+        <w:tc>
+          <w:tcPr/>
+          <w:p>
+            <w:pPr>
+              <w:pStyle w:val="Compact"/>
+            </w:pPr>
+            <w:r>
+              <w:t xml:space="preserve">Não informado</w:t>
+            </w:r>
+          </w:p>
+        </w:tc>
+        <w:tc>
+          <w:tcPr/>
+          <w:p>
+            <w:pPr>
+              <w:pStyle w:val="Compact"/>
+            </w:pPr>
+            <w:r>
+              <w:t xml:space="preserve">Sem uso do Fala.BR.</w:t>
+            </w:r>
+          </w:p>
+        </w:tc>
+      </w:tr>
+      <w:tr>
+        <w:tc>
+          <w:tcPr/>
+          <w:p>
+            <w:pPr>
+              <w:pStyle w:val="Compact"/>
+            </w:pPr>
+            <w:r>
+              <w:t xml:space="preserve">ES</w:t>
+            </w:r>
+          </w:p>
+        </w:tc>
+        <w:tc>
+          <w:tcPr/>
+          <w:p>
+            <w:pPr>
+              <w:pStyle w:val="Compact"/>
+            </w:pPr>
+            <w:r>
+              <w:t xml:space="preserve">Espírito Santo - Polícia Penal/ES</w:t>
+            </w:r>
+          </w:p>
+        </w:tc>
+        <w:tc>
+          <w:tcPr/>
+          <w:p>
+            <w:pPr>
+              <w:pStyle w:val="Compact"/>
+            </w:pPr>
+            <w:r>
+              <w:t xml:space="preserve">opp@pp.es.gov.br</w:t>
+            </w:r>
+          </w:p>
+        </w:tc>
+        <w:tc>
+          <w:tcPr/>
+          <w:p>
+            <w:pPr>
+              <w:pStyle w:val="Compact"/>
+            </w:pPr>
+            <w:r>
+              <w:t xml:space="preserve">(27) 99316-7687</w:t>
+            </w:r>
+          </w:p>
+        </w:tc>
+        <w:tc>
+          <w:tcPr/>
+          <w:p>
+            <w:pPr>
+              <w:pStyle w:val="Compact"/>
+            </w:pPr>
+            <w:r>
+              <w:t xml:space="preserve">(27) 99316-7687</w:t>
+            </w:r>
+          </w:p>
+        </w:tc>
+        <w:tc>
+          <w:tcPr/>
+          <w:p>
+            <w:pPr>
+              <w:pStyle w:val="Compact"/>
+            </w:pPr>
+            <w:r>
+              <w:t xml:space="preserve">Ouvidoria da Polícia Penal do Espírito Santo.</w:t>
+            </w:r>
+          </w:p>
+        </w:tc>
+      </w:tr>
+      <w:tr>
+        <w:tc>
+          <w:tcPr/>
+          <w:p>
+            <w:pPr>
+              <w:pStyle w:val="Compact"/>
+            </w:pPr>
+            <w:r>
+              <w:t xml:space="preserve">ES</w:t>
+            </w:r>
+          </w:p>
+        </w:tc>
+        <w:tc>
+          <w:tcPr/>
+          <w:p>
+            <w:pPr>
+              <w:pStyle w:val="Compact"/>
+            </w:pPr>
+            <w:r>
+              <w:t xml:space="preserve">Espírito Santo - SEJUS/ES</w:t>
+            </w:r>
+          </w:p>
+        </w:tc>
+        <w:tc>
+          <w:tcPr/>
+          <w:p>
+            <w:pPr>
+              <w:pStyle w:val="Compact"/>
+            </w:pPr>
+            <w:r>
+              <w:t xml:space="preserve">ouvidoria@sejus.es.gov.br</w:t>
+            </w:r>
+          </w:p>
+        </w:tc>
+        <w:tc>
+          <w:tcPr/>
+          <w:p>
+            <w:pPr>
+              <w:pStyle w:val="Compact"/>
+            </w:pPr>
+            <w:r>
+              <w:t xml:space="preserve">0800 022 1117</w:t>
+            </w:r>
+          </w:p>
+        </w:tc>
+        <w:tc>
+          <w:tcPr/>
+          <w:p>
+            <w:pPr>
+              <w:pStyle w:val="Compact"/>
+            </w:pPr>
+            <w:r>
+              <w:t xml:space="preserve">Não informado</w:t>
+            </w:r>
+          </w:p>
+        </w:tc>
+        <w:tc>
+          <w:tcPr/>
+          <w:p>
+            <w:pPr>
+              <w:pStyle w:val="Compact"/>
+            </w:pPr>
+            <w:r>
+              <w:t xml:space="preserve">Referência vinculada ao Sistema Integrado de Ouvidoria e à Ouvidoria-Geral do Estado.</w:t>
+            </w:r>
+          </w:p>
+        </w:tc>
+      </w:tr>
+      <w:tr>
+        <w:tc>
+          <w:tcPr/>
+          <w:p>
+            <w:pPr>
+              <w:pStyle w:val="Compact"/>
+            </w:pPr>
+            <w:r>
+              <w:t xml:space="preserve">GO</w:t>
+            </w:r>
+          </w:p>
+        </w:tc>
+        <w:tc>
+          <w:tcPr/>
+          <w:p>
+            <w:pPr>
+              <w:pStyle w:val="Compact"/>
+            </w:pPr>
+            <w:r>
+              <w:t xml:space="preserve">Goiás</w:t>
+            </w:r>
+          </w:p>
+        </w:tc>
+        <w:tc>
+          <w:tcPr/>
+          <w:p>
+            <w:pPr>
+              <w:pStyle w:val="Compact"/>
+            </w:pPr>
+            <w:r>
+              <w:t xml:space="preserve">ouvidoria.policiapenal@goias.gov.br</w:t>
+            </w:r>
+          </w:p>
+        </w:tc>
+        <w:tc>
+          <w:tcPr/>
+          <w:p>
+            <w:pPr>
+              <w:pStyle w:val="Compact"/>
+            </w:pPr>
+            <w:r>
+              <w:t xml:space="preserve">(62) 3270-8733</w:t>
+            </w:r>
+          </w:p>
+        </w:tc>
+        <w:tc>
+          <w:tcPr/>
+          <w:p>
+            <w:pPr>
+              <w:pStyle w:val="Compact"/>
+            </w:pPr>
+            <w:r>
+              <w:t xml:space="preserve">Não informado</w:t>
+            </w:r>
+          </w:p>
+        </w:tc>
+        <w:tc>
+          <w:tcPr/>
+          <w:p>
+            <w:pPr>
+              <w:pStyle w:val="Compact"/>
+            </w:pPr>
+            <w:r>
+              <w:t xml:space="preserve">Sem uso do Fala.BR.</w:t>
+            </w:r>
+          </w:p>
+        </w:tc>
+      </w:tr>
+      <w:tr>
+        <w:tc>
+          <w:tcPr/>
+          <w:p>
+            <w:pPr>
+              <w:pStyle w:val="Compact"/>
+            </w:pPr>
+            <w:r>
+              <w:t xml:space="preserve">MA</w:t>
+            </w:r>
+          </w:p>
+        </w:tc>
+        <w:tc>
+          <w:tcPr/>
+          <w:p>
+            <w:pPr>
+              <w:pStyle w:val="Compact"/>
+            </w:pPr>
+            <w:r>
+              <w:t xml:space="preserve">Maranhão</w:t>
+            </w:r>
+          </w:p>
+        </w:tc>
+        <w:tc>
+          <w:tcPr/>
+          <w:p>
+            <w:pPr>
+              <w:pStyle w:val="Compact"/>
+            </w:pPr>
+            <w:r>
+              <w:t xml:space="preserve">ouvpen@seap.ma.gov.br</w:t>
+            </w:r>
+          </w:p>
+        </w:tc>
+        <w:tc>
+          <w:tcPr/>
+          <w:p>
+            <w:pPr>
+              <w:pStyle w:val="Compact"/>
+            </w:pPr>
+            <w:r>
+              <w:t xml:space="preserve">(98) 99181-7012</w:t>
+            </w:r>
+          </w:p>
+        </w:tc>
+        <w:tc>
+          <w:tcPr/>
+          <w:p>
+            <w:pPr>
+              <w:pStyle w:val="Compact"/>
+            </w:pPr>
+            <w:r>
+              <w:t xml:space="preserve">(98) 99181-7012</w:t>
+            </w:r>
+          </w:p>
+        </w:tc>
+        <w:tc>
+          <w:tcPr/>
+          <w:p>
+            <w:pPr>
+              <w:pStyle w:val="Compact"/>
+            </w:pPr>
+            <w:r>
+              <w:t xml:space="preserve">Sem uso do Fala.BR.</w:t>
+            </w:r>
+          </w:p>
+        </w:tc>
+      </w:tr>
+      <w:tr>
+        <w:tc>
+          <w:tcPr/>
+          <w:p>
+            <w:pPr>
+              <w:pStyle w:val="Compact"/>
+            </w:pPr>
+            <w:r>
+              <w:t xml:space="preserve">MG</w:t>
+            </w:r>
+          </w:p>
+        </w:tc>
+        <w:tc>
+          <w:tcPr/>
+          <w:p>
+            <w:pPr>
+              <w:pStyle w:val="Compact"/>
+            </w:pPr>
+            <w:r>
+              <w:t xml:space="preserve">Minas Gerais</w:t>
+            </w:r>
+          </w:p>
+        </w:tc>
+        <w:tc>
+          <w:tcPr/>
+          <w:p>
+            <w:pPr>
+              <w:pStyle w:val="Compact"/>
+            </w:pPr>
+            <w:r>
+              <w:t xml:space="preserve">penitenciario@ouvidoriageral.mg.gov.br</w:t>
+            </w:r>
+          </w:p>
+        </w:tc>
+        <w:tc>
+          <w:tcPr/>
+          <w:p>
+            <w:pPr>
+              <w:pStyle w:val="Compact"/>
+            </w:pPr>
+            <w:r>
+              <w:t xml:space="preserve">(31) 3915-2048</w:t>
+            </w:r>
+          </w:p>
+        </w:tc>
+        <w:tc>
+          <w:tcPr/>
+          <w:p>
+            <w:pPr>
+              <w:pStyle w:val="Compact"/>
+            </w:pPr>
+            <w:r>
+              <w:t xml:space="preserve">(31) 3915-2022</w:t>
+            </w:r>
+          </w:p>
+        </w:tc>
+        <w:tc>
+          <w:tcPr/>
+          <w:p>
+            <w:pPr>
+              <w:pStyle w:val="Compact"/>
+            </w:pPr>
+            <w:r>
+              <w:t xml:space="preserve">Sem uso do Fala.BR.</w:t>
+            </w:r>
+          </w:p>
+        </w:tc>
+      </w:tr>
+      <w:tr>
+        <w:tc>
+          <w:tcPr/>
+          <w:p>
+            <w:pPr>
+              <w:pStyle w:val="Compact"/>
+            </w:pPr>
+            <w:r>
+              <w:t xml:space="preserve">MS</w:t>
+            </w:r>
+          </w:p>
+        </w:tc>
+        <w:tc>
+          <w:tcPr/>
+          <w:p>
+            <w:pPr>
+              <w:pStyle w:val="Compact"/>
+            </w:pPr>
+            <w:r>
+              <w:t xml:space="preserve">Mato Grosso do Sul</w:t>
+            </w:r>
+          </w:p>
+        </w:tc>
+        <w:tc>
+          <w:tcPr/>
+          <w:p>
+            <w:pPr>
+              <w:pStyle w:val="Compact"/>
+            </w:pPr>
+            <w:r>
+              <w:t xml:space="preserve">ouvidoria@agepen.ms.gov.br</w:t>
+            </w:r>
+          </w:p>
+        </w:tc>
+        <w:tc>
+          <w:tcPr/>
+          <w:p>
+            <w:pPr>
+              <w:pStyle w:val="Compact"/>
+            </w:pPr>
+            <w:r>
+              <w:t xml:space="preserve">(67) 3901-3523</w:t>
+            </w:r>
+          </w:p>
+        </w:tc>
+        <w:tc>
+          <w:tcPr/>
+          <w:p>
+            <w:pPr>
+              <w:pStyle w:val="Compact"/>
+            </w:pPr>
+            <w:r>
+              <w:t xml:space="preserve">(67) 99971-4323</w:t>
+            </w:r>
+          </w:p>
+        </w:tc>
+        <w:tc>
+          <w:tcPr/>
+          <w:p>
+            <w:pPr>
+              <w:pStyle w:val="Compact"/>
+            </w:pPr>
+            <w:r>
+              <w:t xml:space="preserve">Fala.BR como canal principal.</w:t>
+            </w:r>
+          </w:p>
+        </w:tc>
+      </w:tr>
+      <w:tr>
+        <w:tc>
+          <w:tcPr/>
+          <w:p>
+            <w:pPr>
+              <w:pStyle w:val="Compact"/>
+            </w:pPr>
+            <w:r>
+              <w:t xml:space="preserve">MT</w:t>
+            </w:r>
+          </w:p>
+        </w:tc>
+        <w:tc>
+          <w:tcPr/>
+          <w:p>
+            <w:pPr>
+              <w:pStyle w:val="Compact"/>
+            </w:pPr>
+            <w:r>
+              <w:t xml:space="preserve">Mato Grosso</w:t>
+            </w:r>
+          </w:p>
+        </w:tc>
+        <w:tc>
+          <w:tcPr/>
+          <w:p>
+            <w:pPr>
+              <w:pStyle w:val="Compact"/>
+            </w:pPr>
+            <w:r>
+              <w:t xml:space="preserve">ouvidoriaoesp@sejus.mt.gov.br</w:t>
+            </w:r>
+          </w:p>
+        </w:tc>
+        <w:tc>
+          <w:tcPr/>
+          <w:p>
+            <w:pPr>
+              <w:pStyle w:val="Compact"/>
+            </w:pPr>
+            <w:r>
+              <w:t xml:space="preserve">6581300380</w:t>
+            </w:r>
+          </w:p>
+        </w:tc>
+        <w:tc>
+          <w:tcPr/>
+          <w:p>
+            <w:pPr>
+              <w:pStyle w:val="Compact"/>
+            </w:pPr>
+            <w:r>
+              <w:t xml:space="preserve">+556581300380</w:t>
+            </w:r>
+          </w:p>
+        </w:tc>
+        <w:tc>
+          <w:tcPr/>
+          <w:p>
+            <w:pPr>
+              <w:pStyle w:val="Compact"/>
+            </w:pPr>
+            <w:r>
+              <w:t xml:space="preserve">Fala.BR como canal principal.</w:t>
+            </w:r>
+          </w:p>
+        </w:tc>
+      </w:tr>
+      <w:tr>
+        <w:tc>
+          <w:tcPr/>
+          <w:p>
+            <w:pPr>
+              <w:pStyle w:val="Compact"/>
+            </w:pPr>
+            <w:r>
+              <w:t xml:space="preserve">PA</w:t>
+            </w:r>
+          </w:p>
+        </w:tc>
+        <w:tc>
+          <w:tcPr/>
+          <w:p>
+            <w:pPr>
+              <w:pStyle w:val="Compact"/>
+            </w:pPr>
+            <w:r>
+              <w:t xml:space="preserve">Pará</w:t>
+            </w:r>
+          </w:p>
+        </w:tc>
+        <w:tc>
+          <w:tcPr/>
+          <w:p>
+            <w:pPr>
+              <w:pStyle w:val="Compact"/>
+            </w:pPr>
+            <w:r>
+              <w:t xml:space="preserve">ouvidoriapasieds@gmail.com</w:t>
+            </w:r>
+          </w:p>
+        </w:tc>
+        <w:tc>
+          <w:tcPr/>
+          <w:p>
+            <w:pPr>
+              <w:pStyle w:val="Compact"/>
+            </w:pPr>
+            <w:r>
+              <w:t xml:space="preserve">91 988835867</w:t>
+            </w:r>
+          </w:p>
+        </w:tc>
+        <w:tc>
+          <w:tcPr/>
+          <w:p>
+            <w:pPr>
+              <w:pStyle w:val="Compact"/>
+            </w:pPr>
+            <w:r>
+              <w:t xml:space="preserve">91 988835867</w:t>
+            </w:r>
+          </w:p>
+        </w:tc>
+        <w:tc>
+          <w:tcPr/>
+          <w:p>
+            <w:pPr>
+              <w:pStyle w:val="Compact"/>
+            </w:pPr>
+            <w:r>
+              <w:t xml:space="preserve">Destaque para o contato informado pela SIEDS; outra resposta do diagnóstico apontou ausência de ouvidoria constituída na SEAP/PA.</w:t>
+            </w:r>
+          </w:p>
+        </w:tc>
+      </w:tr>
+      <w:tr>
+        <w:tc>
+          <w:tcPr/>
+          <w:p>
+            <w:pPr>
+              <w:pStyle w:val="Compact"/>
+            </w:pPr>
+            <w:r>
+              <w:t xml:space="preserve">PB</w:t>
+            </w:r>
+          </w:p>
+        </w:tc>
+        <w:tc>
+          <w:tcPr/>
+          <w:p>
+            <w:pPr>
+              <w:pStyle w:val="Compact"/>
+            </w:pPr>
+            <w:r>
+              <w:t xml:space="preserve">Paraíba</w:t>
+            </w:r>
+          </w:p>
+        </w:tc>
+        <w:tc>
+          <w:tcPr/>
+          <w:p>
+            <w:pPr>
+              <w:pStyle w:val="Compact"/>
+            </w:pPr>
+            <w:r>
+              <w:t xml:space="preserve">ouvidoria@seap.pb.gov.br</w:t>
+            </w:r>
+          </w:p>
+        </w:tc>
+        <w:tc>
+          <w:tcPr/>
+          <w:p>
+            <w:pPr>
+              <w:pStyle w:val="Compact"/>
+            </w:pPr>
+            <w:r>
+              <w:t xml:space="preserve">83 99121-7665</w:t>
+            </w:r>
+          </w:p>
+        </w:tc>
+        <w:tc>
+          <w:tcPr/>
+          <w:p>
+            <w:pPr>
+              <w:pStyle w:val="Compact"/>
+            </w:pPr>
+            <w:r>
+              <w:t xml:space="preserve">83 99121-7665</w:t>
+            </w:r>
+          </w:p>
+        </w:tc>
+        <w:tc>
+          <w:tcPr/>
+          <w:p>
+            <w:pPr>
+              <w:pStyle w:val="Compact"/>
+            </w:pPr>
+            <w:r>
+              <w:t xml:space="preserve">Sem uso do Fala.BR.</w:t>
+            </w:r>
+          </w:p>
+        </w:tc>
+      </w:tr>
+      <w:tr>
+        <w:tc>
+          <w:tcPr/>
+          <w:p>
+            <w:pPr>
+              <w:pStyle w:val="Compact"/>
+            </w:pPr>
+            <w:r>
+              <w:t xml:space="preserve">PE</w:t>
+            </w:r>
+          </w:p>
+        </w:tc>
+        <w:tc>
+          <w:tcPr/>
+          <w:p>
+            <w:pPr>
+              <w:pStyle w:val="Compact"/>
+            </w:pPr>
+            <w:r>
+              <w:t xml:space="preserve">Pernambuco</w:t>
+            </w:r>
+          </w:p>
+        </w:tc>
+        <w:tc>
+          <w:tcPr/>
+          <w:p>
+            <w:pPr>
+              <w:pStyle w:val="Compact"/>
+            </w:pPr>
+            <w:r>
+              <w:t xml:space="preserve">ouvidoria@seap.pe.gov.br</w:t>
+            </w:r>
+          </w:p>
+        </w:tc>
+        <w:tc>
+          <w:tcPr/>
+          <w:p>
+            <w:pPr>
+              <w:pStyle w:val="Compact"/>
+            </w:pPr>
+            <w:r>
+              <w:t xml:space="preserve">81- 3184 2219</w:t>
+            </w:r>
+          </w:p>
+        </w:tc>
+        <w:tc>
+          <w:tcPr/>
+          <w:p>
+            <w:pPr>
+              <w:pStyle w:val="Compact"/>
+            </w:pPr>
+            <w:r>
+              <w:t xml:space="preserve">81 - 9 8491 6545</w:t>
+            </w:r>
+          </w:p>
+        </w:tc>
+        <w:tc>
+          <w:tcPr/>
+          <w:p>
+            <w:pPr>
+              <w:pStyle w:val="Compact"/>
+            </w:pPr>
+            <w:r>
+              <w:t xml:space="preserve">Sem uso do Fala.BR.</w:t>
+            </w:r>
+          </w:p>
+        </w:tc>
+      </w:tr>
+      <w:tr>
+        <w:tc>
+          <w:tcPr/>
+          <w:p>
+            <w:pPr>
+              <w:pStyle w:val="Compact"/>
+            </w:pPr>
+            <w:r>
+              <w:t xml:space="preserve">PI</w:t>
+            </w:r>
+          </w:p>
+        </w:tc>
+        <w:tc>
+          <w:tcPr/>
+          <w:p>
+            <w:pPr>
+              <w:pStyle w:val="Compact"/>
+            </w:pPr>
+            <w:r>
+              <w:t xml:space="preserve">Piauí</w:t>
+            </w:r>
+          </w:p>
+        </w:tc>
+        <w:tc>
+          <w:tcPr/>
+          <w:p>
+            <w:pPr>
+              <w:pStyle w:val="Compact"/>
+            </w:pPr>
+            <w:r>
+              <w:t xml:space="preserve">ouvidoria@sejus.pi.gov.br</w:t>
+            </w:r>
+          </w:p>
+        </w:tc>
+        <w:tc>
+          <w:tcPr/>
+          <w:p>
+            <w:pPr>
+              <w:pStyle w:val="Compact"/>
+            </w:pPr>
+            <w:r>
+              <w:t xml:space="preserve">86 99488-8133</w:t>
+            </w:r>
+          </w:p>
+        </w:tc>
+        <w:tc>
+          <w:tcPr/>
+          <w:p>
+            <w:pPr>
+              <w:pStyle w:val="Compact"/>
+            </w:pPr>
+            <w:r>
+              <w:t xml:space="preserve">Não informado</w:t>
+            </w:r>
+          </w:p>
+        </w:tc>
+        <w:tc>
+          <w:tcPr/>
+          <w:p>
+            <w:pPr>
+              <w:pStyle w:val="Compact"/>
+            </w:pPr>
+            <w:r>
+              <w:t xml:space="preserve">Fala.BR como canal principal.</w:t>
+            </w:r>
+          </w:p>
+        </w:tc>
+      </w:tr>
+      <w:tr>
+        <w:tc>
+          <w:tcPr/>
+          <w:p>
+            <w:pPr>
+              <w:pStyle w:val="Compact"/>
+            </w:pPr>
+            <w:r>
+              <w:t xml:space="preserve">PR</w:t>
+            </w:r>
+          </w:p>
+        </w:tc>
+        <w:tc>
+          <w:tcPr/>
+          <w:p>
+            <w:pPr>
+              <w:pStyle w:val="Compact"/>
+            </w:pPr>
+            <w:r>
+              <w:t xml:space="preserve">Paraná</w:t>
+            </w:r>
+          </w:p>
+        </w:tc>
+        <w:tc>
+          <w:tcPr/>
+          <w:p>
+            <w:pPr>
+              <w:pStyle w:val="Compact"/>
+            </w:pPr>
+            <w:r>
+              <w:t xml:space="preserve">ouvidoriadeppen@policiapenal.pr.gov.br</w:t>
+            </w:r>
+          </w:p>
+        </w:tc>
+        <w:tc>
+          <w:tcPr/>
+          <w:p>
+            <w:pPr>
+              <w:pStyle w:val="Compact"/>
+            </w:pPr>
+            <w:r>
+              <w:t xml:space="preserve">41 3294-2958</w:t>
+            </w:r>
+          </w:p>
+        </w:tc>
+        <w:tc>
+          <w:tcPr/>
+          <w:p>
+            <w:pPr>
+              <w:pStyle w:val="Compact"/>
+            </w:pPr>
+            <w:r>
+              <w:t xml:space="preserve">41 3294-2958</w:t>
+            </w:r>
+          </w:p>
+        </w:tc>
+        <w:tc>
+          <w:tcPr/>
+          <w:p>
+            <w:pPr>
+              <w:pStyle w:val="Compact"/>
+            </w:pPr>
+            <w:r>
+              <w:t xml:space="preserve">Sem uso do Fala.BR.</w:t>
+            </w:r>
+          </w:p>
+        </w:tc>
+      </w:tr>
+      <w:tr>
+        <w:tc>
+          <w:tcPr/>
+          <w:p>
+            <w:pPr>
+              <w:pStyle w:val="Compact"/>
+            </w:pPr>
+            <w:r>
+              <w:t xml:space="preserve">RJ</w:t>
+            </w:r>
+          </w:p>
+        </w:tc>
+        <w:tc>
+          <w:tcPr/>
+          <w:p>
+            <w:pPr>
+              <w:pStyle w:val="Compact"/>
+            </w:pPr>
+            <w:r>
+              <w:t xml:space="preserve">Rio de Janeiro</w:t>
+            </w:r>
+          </w:p>
+        </w:tc>
+        <w:tc>
+          <w:tcPr/>
+          <w:p>
+            <w:pPr>
+              <w:pStyle w:val="Compact"/>
+            </w:pPr>
+            <w:r>
+              <w:t xml:space="preserve">seapou@seap.rj.gov.br</w:t>
+            </w:r>
+          </w:p>
+        </w:tc>
+        <w:tc>
+          <w:tcPr/>
+          <w:p>
+            <w:pPr>
+              <w:pStyle w:val="Compact"/>
+            </w:pPr>
+            <w:r>
+              <w:t xml:space="preserve">(21) 970680105</w:t>
+            </w:r>
+          </w:p>
+        </w:tc>
+        <w:tc>
+          <w:tcPr/>
+          <w:p>
+            <w:pPr>
+              <w:pStyle w:val="Compact"/>
+            </w:pPr>
+            <w:r>
+              <w:t xml:space="preserve">(21) 97067-0584</w:t>
+            </w:r>
+          </w:p>
+        </w:tc>
+        <w:tc>
+          <w:tcPr/>
+          <w:p>
+            <w:pPr>
+              <w:pStyle w:val="Compact"/>
+            </w:pPr>
+            <w:r>
+              <w:t xml:space="preserve">Sem uso do Fala.BR.</w:t>
+            </w:r>
+          </w:p>
+        </w:tc>
+      </w:tr>
+      <w:tr>
+        <w:tc>
+          <w:tcPr/>
+          <w:p>
+            <w:pPr>
+              <w:pStyle w:val="Compact"/>
+            </w:pPr>
+            <w:r>
+              <w:t xml:space="preserve">RN</w:t>
+            </w:r>
+          </w:p>
+        </w:tc>
+        <w:tc>
+          <w:tcPr/>
+          <w:p>
+            <w:pPr>
+              <w:pStyle w:val="Compact"/>
+            </w:pPr>
+            <w:r>
+              <w:t xml:space="preserve">Rio Grande do Norte</w:t>
+            </w:r>
+          </w:p>
+        </w:tc>
+        <w:tc>
+          <w:tcPr/>
+          <w:p>
+            <w:pPr>
+              <w:pStyle w:val="Compact"/>
+            </w:pPr>
+            <w:r>
+              <w:t xml:space="preserve">ouvidoria@seap.rn.gov.br</w:t>
+            </w:r>
+          </w:p>
+        </w:tc>
+        <w:tc>
+          <w:tcPr/>
+          <w:p>
+            <w:pPr>
+              <w:pStyle w:val="Compact"/>
+            </w:pPr>
+            <w:r>
+              <w:t xml:space="preserve">84981305243</w:t>
+            </w:r>
+          </w:p>
+        </w:tc>
+        <w:tc>
+          <w:tcPr/>
+          <w:p>
+            <w:pPr>
+              <w:pStyle w:val="Compact"/>
+            </w:pPr>
+            <w:r>
+              <w:t xml:space="preserve">84981305243</w:t>
+            </w:r>
+          </w:p>
+        </w:tc>
+        <w:tc>
+          <w:tcPr/>
+          <w:p>
+            <w:pPr>
+              <w:pStyle w:val="Compact"/>
+            </w:pPr>
+            <w:r>
+              <w:t xml:space="preserve">Fala.BR como canal principal.</w:t>
+            </w:r>
+          </w:p>
+        </w:tc>
+      </w:tr>
+      <w:tr>
+        <w:tc>
+          <w:tcPr/>
+          <w:p>
+            <w:pPr>
+              <w:pStyle w:val="Compact"/>
+            </w:pPr>
+            <w:r>
+              <w:t xml:space="preserve">RO</w:t>
+            </w:r>
+          </w:p>
+        </w:tc>
+        <w:tc>
+          <w:tcPr/>
+          <w:p>
+            <w:pPr>
+              <w:pStyle w:val="Compact"/>
+            </w:pPr>
+            <w:r>
+              <w:t xml:space="preserve">Rondônia</w:t>
+            </w:r>
+          </w:p>
+        </w:tc>
+        <w:tc>
+          <w:tcPr/>
+          <w:p>
+            <w:pPr>
+              <w:pStyle w:val="Compact"/>
+            </w:pPr>
+            <w:r>
+              <w:t xml:space="preserve">ouvidoriasejusro@gmail.com</w:t>
+            </w:r>
+          </w:p>
+        </w:tc>
+        <w:tc>
+          <w:tcPr/>
+          <w:p>
+            <w:pPr>
+              <w:pStyle w:val="Compact"/>
+            </w:pPr>
+            <w:r>
+              <w:t xml:space="preserve">(69) 99978-7931</w:t>
+            </w:r>
+          </w:p>
+        </w:tc>
+        <w:tc>
+          <w:tcPr/>
+          <w:p>
+            <w:pPr>
+              <w:pStyle w:val="Compact"/>
+            </w:pPr>
+            <w:r>
+              <w:t xml:space="preserve">Não informado</w:t>
+            </w:r>
+          </w:p>
+        </w:tc>
+        <w:tc>
+          <w:tcPr/>
+          <w:p>
+            <w:pPr>
+              <w:pStyle w:val="Compact"/>
+            </w:pPr>
+            <w:r>
+              <w:t xml:space="preserve">Fala.BR parcial.</w:t>
+            </w:r>
+          </w:p>
+        </w:tc>
+      </w:tr>
+      <w:tr>
+        <w:tc>
+          <w:tcPr/>
+          <w:p>
+            <w:pPr>
+              <w:pStyle w:val="Compact"/>
+            </w:pPr>
+            <w:r>
+              <w:t xml:space="preserve">RR</w:t>
+            </w:r>
+          </w:p>
+        </w:tc>
+        <w:tc>
+          <w:tcPr/>
+          <w:p>
+            <w:pPr>
+              <w:pStyle w:val="Compact"/>
+            </w:pPr>
+            <w:r>
+              <w:t xml:space="preserve">Roraima</w:t>
+            </w:r>
+          </w:p>
+        </w:tc>
+        <w:tc>
+          <w:tcPr/>
+          <w:p>
+            <w:pPr>
+              <w:pStyle w:val="Compact"/>
+            </w:pPr>
+            <w:r>
+              <w:t xml:space="preserve">ouvidoria.sejuc.rr@gmail.com</w:t>
+            </w:r>
+          </w:p>
+        </w:tc>
+        <w:tc>
+          <w:tcPr/>
+          <w:p>
+            <w:pPr>
+              <w:pStyle w:val="Compact"/>
+            </w:pPr>
+            <w:r>
+              <w:t xml:space="preserve">Não informado</w:t>
+            </w:r>
+          </w:p>
+        </w:tc>
+        <w:tc>
+          <w:tcPr/>
+          <w:p>
+            <w:pPr>
+              <w:pStyle w:val="Compact"/>
+            </w:pPr>
+            <w:r>
+              <w:t xml:space="preserve">Não informado</w:t>
+            </w:r>
+          </w:p>
+        </w:tc>
+        <w:tc>
+          <w:tcPr/>
+          <w:p>
+            <w:pPr>
+              <w:pStyle w:val="Compact"/>
+            </w:pPr>
+            <w:r>
+              <w:t xml:space="preserve">Fala.BR como canal principal.</w:t>
+            </w:r>
+          </w:p>
+        </w:tc>
+      </w:tr>
+      <w:tr>
+        <w:tc>
+          <w:tcPr/>
+          <w:p>
+            <w:pPr>
+              <w:pStyle w:val="Compact"/>
+            </w:pPr>
+            <w:r>
+              <w:t xml:space="preserve">RS</w:t>
+            </w:r>
+          </w:p>
+        </w:tc>
+        <w:tc>
+          <w:tcPr/>
+          <w:p>
+            <w:pPr>
+              <w:pStyle w:val="Compact"/>
+            </w:pPr>
+            <w:r>
+              <w:t xml:space="preserve">Rio Grande do Sul</w:t>
+            </w:r>
+          </w:p>
+        </w:tc>
+        <w:tc>
+          <w:tcPr/>
+          <w:p>
+            <w:pPr>
+              <w:pStyle w:val="Compact"/>
+            </w:pPr>
+            <w:r>
+              <w:t xml:space="preserve">ouvidoriageral@casacivil.rs.gov.br</w:t>
+            </w:r>
+          </w:p>
+        </w:tc>
+        <w:tc>
+          <w:tcPr/>
+          <w:p>
+            <w:pPr>
+              <w:pStyle w:val="Compact"/>
+            </w:pPr>
+            <w:r>
+              <w:t xml:space="preserve">0800 541 6136</w:t>
+            </w:r>
+          </w:p>
+        </w:tc>
+        <w:tc>
+          <w:tcPr/>
+          <w:p>
+            <w:pPr>
+              <w:pStyle w:val="Compact"/>
+            </w:pPr>
+            <w:r>
+              <w:t xml:space="preserve">Não informado</w:t>
+            </w:r>
+          </w:p>
+        </w:tc>
+        <w:tc>
+          <w:tcPr/>
+          <w:p>
+            <w:pPr>
+              <w:pStyle w:val="Compact"/>
+            </w:pPr>
+            <w:r>
+              <w:t xml:space="preserve">Sem uso do Fala.BR.</w:t>
+            </w:r>
+          </w:p>
+        </w:tc>
+      </w:tr>
+      <w:tr>
+        <w:tc>
+          <w:tcPr/>
+          <w:p>
+            <w:pPr>
+              <w:pStyle w:val="Compact"/>
+            </w:pPr>
+            <w:r>
+              <w:t xml:space="preserve">SC</w:t>
+            </w:r>
+          </w:p>
+        </w:tc>
+        <w:tc>
+          <w:tcPr/>
+          <w:p>
+            <w:pPr>
+              <w:pStyle w:val="Compact"/>
+            </w:pPr>
+            <w:r>
+              <w:t xml:space="preserve">Santa Catarina</w:t>
+            </w:r>
+          </w:p>
+        </w:tc>
+        <w:tc>
+          <w:tcPr/>
+          <w:p>
+            <w:pPr>
+              <w:pStyle w:val="Compact"/>
+            </w:pPr>
+            <w:r>
+              <w:t xml:space="preserve">ouvidoria@sejuri.sc.gov.br</w:t>
+            </w:r>
+          </w:p>
+        </w:tc>
+        <w:tc>
+          <w:tcPr/>
+          <w:p>
+            <w:pPr>
+              <w:pStyle w:val="Compact"/>
+            </w:pPr>
+            <w:r>
+              <w:t xml:space="preserve">(48) 3664-5811</w:t>
+            </w:r>
+          </w:p>
+        </w:tc>
+        <w:tc>
+          <w:tcPr/>
+          <w:p>
+            <w:pPr>
+              <w:pStyle w:val="Compact"/>
+            </w:pPr>
+            <w:r>
+              <w:t xml:space="preserve">Não informado</w:t>
+            </w:r>
+          </w:p>
+        </w:tc>
+        <w:tc>
+          <w:tcPr/>
+          <w:p>
+            <w:pPr>
+              <w:pStyle w:val="Compact"/>
+            </w:pPr>
+            <w:r>
+              <w:t xml:space="preserve">Sem uso do Fala.BR.</w:t>
+            </w:r>
+          </w:p>
+        </w:tc>
+      </w:tr>
+      <w:tr>
+        <w:tc>
+          <w:tcPr/>
+          <w:p>
+            <w:pPr>
+              <w:pStyle w:val="Compact"/>
+            </w:pPr>
+            <w:r>
+              <w:t xml:space="preserve">SE</w:t>
+            </w:r>
+          </w:p>
+        </w:tc>
+        <w:tc>
+          <w:tcPr/>
+          <w:p>
+            <w:pPr>
+              <w:pStyle w:val="Compact"/>
+            </w:pPr>
+            <w:r>
+              <w:t xml:space="preserve">Sergipe</w:t>
+            </w:r>
+          </w:p>
+        </w:tc>
+        <w:tc>
+          <w:tcPr/>
+          <w:p>
+            <w:pPr>
+              <w:pStyle w:val="Compact"/>
+            </w:pPr>
+            <w:r>
+              <w:t xml:space="preserve">ouvidoria.sejuc@sejuc.se.gov.br</w:t>
+            </w:r>
+          </w:p>
+        </w:tc>
+        <w:tc>
+          <w:tcPr/>
+          <w:p>
+            <w:pPr>
+              <w:pStyle w:val="Compact"/>
+            </w:pPr>
+            <w:r>
+              <w:t xml:space="preserve">(79)3225-6049</w:t>
+            </w:r>
+          </w:p>
+        </w:tc>
+        <w:tc>
+          <w:tcPr/>
+          <w:p>
+            <w:pPr>
+              <w:pStyle w:val="Compact"/>
+            </w:pPr>
+            <w:r>
+              <w:t xml:space="preserve">Não informado</w:t>
+            </w:r>
+          </w:p>
+        </w:tc>
+        <w:tc>
+          <w:tcPr/>
+          <w:p>
+            <w:pPr>
+              <w:pStyle w:val="Compact"/>
+            </w:pPr>
+            <w:r>
+              <w:t xml:space="preserve">Sem uso do Fala.BR.</w:t>
+            </w:r>
+          </w:p>
+        </w:tc>
+      </w:tr>
+      <w:tr>
+        <w:tc>
+          <w:tcPr/>
+          <w:p>
+            <w:pPr>
+              <w:pStyle w:val="Compact"/>
+            </w:pPr>
+            <w:r>
+              <w:t xml:space="preserve">SP</w:t>
+            </w:r>
+          </w:p>
+        </w:tc>
+        <w:tc>
+          <w:tcPr/>
+          <w:p>
+            <w:pPr>
+              <w:pStyle w:val="Compact"/>
+            </w:pPr>
+            <w:r>
+              <w:t xml:space="preserve">São Paulo</w:t>
+            </w:r>
+          </w:p>
+        </w:tc>
+        <w:tc>
+          <w:tcPr/>
+          <w:p>
+            <w:pPr>
+              <w:pStyle w:val="Compact"/>
+            </w:pPr>
+            <w:r>
+              <w:t xml:space="preserve">ouvidoriasap@sp.gov.br</w:t>
+            </w:r>
+          </w:p>
+        </w:tc>
+        <w:tc>
+          <w:tcPr/>
+          <w:p>
+            <w:pPr>
+              <w:pStyle w:val="Compact"/>
+            </w:pPr>
+            <w:r>
+              <w:t xml:space="preserve">011 3206-4759/4836/4853</w:t>
+            </w:r>
+          </w:p>
+        </w:tc>
+        <w:tc>
+          <w:tcPr/>
+          <w:p>
+            <w:pPr>
+              <w:pStyle w:val="Compact"/>
+            </w:pPr>
+            <w:r>
+              <w:t xml:space="preserve">011 3206-4759</w:t>
+            </w:r>
+          </w:p>
+        </w:tc>
+        <w:tc>
+          <w:tcPr/>
+          <w:p>
+            <w:pPr>
+              <w:pStyle w:val="Compact"/>
+            </w:pPr>
+            <w:r>
+              <w:t xml:space="preserve">Sem uso do Fala.BR.</w:t>
+            </w:r>
+          </w:p>
+        </w:tc>
+      </w:tr>
+      <w:tr>
+        <w:tc>
+          <w:tcPr/>
+          <w:p>
+            <w:pPr>
+              <w:pStyle w:val="Compact"/>
+            </w:pPr>
+            <w:r>
+              <w:t xml:space="preserve">TO</w:t>
+            </w:r>
+          </w:p>
+        </w:tc>
+        <w:tc>
+          <w:tcPr/>
+          <w:p>
+            <w:pPr>
+              <w:pStyle w:val="Compact"/>
+            </w:pPr>
+            <w:r>
+              <w:t xml:space="preserve">Tocantins</w:t>
+            </w:r>
+          </w:p>
+        </w:tc>
+        <w:tc>
+          <w:tcPr/>
+          <w:p>
+            <w:pPr>
+              <w:pStyle w:val="Compact"/>
+            </w:pPr>
+            <w:r>
+              <w:t xml:space="preserve">ouvidoriaseciju@gmail.com</w:t>
+            </w:r>
+          </w:p>
+        </w:tc>
+        <w:tc>
+          <w:tcPr/>
+          <w:p>
+            <w:pPr>
+              <w:pStyle w:val="Compact"/>
+            </w:pPr>
+            <w:r>
+              <w:t xml:space="preserve">6399240-5237</w:t>
+            </w:r>
+          </w:p>
+        </w:tc>
+        <w:tc>
+          <w:tcPr/>
+          <w:p>
+            <w:pPr>
+              <w:pStyle w:val="Compact"/>
+            </w:pPr>
+            <w:r>
+              <w:t xml:space="preserve">Não informado</w:t>
+            </w:r>
+          </w:p>
+        </w:tc>
+        <w:tc>
+          <w:tcPr/>
+          <w:p>
+            <w:pPr>
+              <w:pStyle w:val="Compact"/>
+            </w:pPr>
+            <w:r>
+              <w:t xml:space="preserve">Fala.BR como canal principal.</w:t>
+            </w:r>
+          </w:p>
+        </w:tc>
+      </w:tr>
+    </w:tbl>
+    <w:p>
+      <w:pPr>
+        <w:pStyle w:val="BodyText"/>
+      </w:pPr>
+      <w:r>
+        <w:t xml:space="preserve">Seção:</w:t>
+      </w:r>
+    </w:p>
+    <w:p>
+      <w:pPr>
+        <w:pStyle w:val="BodyText"/>
+      </w:pPr>
+      <w:r>
         <w:t xml:space="preserve">Quer saber mais sobre a Rede de Ouvidorias?</w:t>
       </w:r>
     </w:p>
@@ -1331,13 +3482,13 @@
       </w:r>
     </w:p>
     <w:bookmarkEnd w:id="20"/>
-    <w:bookmarkStart w:id="21" w:name="subpágina-2---ema---sidh"/>
+    <w:bookmarkStart w:id="21" w:name="subpágina-2---ema---senappen"/>
     <w:p>
       <w:pPr>
         <w:pStyle w:val="Heading2"/>
       </w:pPr>
       <w:r>
-        <w:t xml:space="preserve">Subpágina 2 - Ema - SIDH</w:t>
+        <w:t xml:space="preserve">Subpágina 2 - EMA - SENAPPEN</w:t>
       </w:r>
     </w:p>
     <w:p>
@@ -1353,7 +3504,7 @@
         <w:pStyle w:val="BodyText"/>
       </w:pPr>
       <w:r>
-        <w:t xml:space="preserve">Ema - SIDH</w:t>
+        <w:t xml:space="preserve">EMA - SENAPPEN</w:t>
       </w:r>
     </w:p>
     <w:p>
@@ -1385,7 +3536,7 @@
         <w:pStyle w:val="BodyText"/>
       </w:pPr>
       <w:r>
-        <w:t xml:space="preserve">Botão institucional da Ema - SIDH.</w:t>
+        <w:t xml:space="preserve">Botão institucional da EMA - SENAPPEN.</w:t>
       </w:r>
     </w:p>
     <w:p>
@@ -1417,7 +3568,7 @@
         <w:pStyle w:val="BodyText"/>
       </w:pPr>
       <w:r>
-        <w:t xml:space="preserve">Espaço da Equipe de Monitoramento e Acompanhamento das decisões e deliberações do SIDH, dedicado a fortalecer o cumprimento das determinações do Sistema Interamericano de Direitos Humanos em face do sistema penal brasileiro.</w:t>
+        <w:t xml:space="preserve">Espaço da Equipe de Monitoramento e Acompanhamento das decisões e deliberações do Sistema Interamericano de Direitos Humanos em face do sistema penal nacional, dedicado a fortalecer o cumprimento das determinações do SIDH em parceria com as Unidades Federativas.</w:t>
       </w:r>
     </w:p>
     <w:p>
@@ -1433,7 +3584,39 @@
         <w:pStyle w:val="BodyText"/>
       </w:pPr>
       <w:r>
-        <w:t xml:space="preserve">Escopo desta subpágina</w:t>
+        <w:t xml:space="preserve">Institucional</w:t>
+      </w:r>
+    </w:p>
+    <w:p>
+      <w:pPr>
+        <w:pStyle w:val="BodyText"/>
+      </w:pPr>
+      <w:r>
+        <w:t xml:space="preserve">Imagem complementar opcional:</w:t>
+      </w:r>
+    </w:p>
+    <w:p>
+      <w:pPr>
+        <w:pStyle w:val="BodyText"/>
+      </w:pPr>
+      <w:r>
+        <w:t xml:space="preserve">Documentação/Banner_Ema_Organograma.png</w:t>
+      </w:r>
+    </w:p>
+    <w:p>
+      <w:pPr>
+        <w:pStyle w:val="BodyText"/>
+      </w:pPr>
+      <w:r>
+        <w:t xml:space="preserve">Texto alternativo sugerido:</w:t>
+      </w:r>
+    </w:p>
+    <w:p>
+      <w:pPr>
+        <w:pStyle w:val="BodyText"/>
+      </w:pPr>
+      <w:r>
+        <w:t xml:space="preserve">Organograma da EMA - SENAPPEN.</w:t>
       </w:r>
     </w:p>
     <w:p>
@@ -1449,23 +3632,23 @@
         <w:pStyle w:val="BodyText"/>
       </w:pPr>
       <w:r>
-        <w:t xml:space="preserve">A Ema - SIDH corresponde ao espaço institucional dedicado ao monitoramento e ao acompanhamento das decisões e deliberações do Sistema Interamericano de Direitos Humanos com repercussão sobre o sistema penal brasileiro.</w:t>
-      </w:r>
-    </w:p>
-    <w:p>
-      <w:pPr>
-        <w:pStyle w:val="BodyText"/>
-      </w:pPr>
-      <w:r>
-        <w:t xml:space="preserve">A segunda linha do escopo:</w:t>
-      </w:r>
-    </w:p>
-    <w:p>
-      <w:pPr>
-        <w:pStyle w:val="BodyText"/>
-      </w:pPr>
-      <w:r>
-        <w:t xml:space="preserve">Considerando que o SIDH é estruturado, entre outros instrumentos e órgãos, pela Comissão Interamericana de Direitos Humanos (CIDH) e pela Corte Interamericana de Direitos Humanos (Corte IDH), esta subpágina organiza referências públicas úteis para a leitura qualificada dessa agenda no âmbito da Ouvidoria Nacional de Serviços Penais.</w:t>
+        <w:t xml:space="preserve">A EMA-SENAPPEN foi instituída, inicialmente, pela Portaria GABSEC/SENAPPEN/MJSP Nº 350, de 13 de junho de 2024, em um esforço de integrar a Secretaria Nacional de Políticas Penais ao processo de cumprimento das decisões do SIDH, dado seu rol de competências, em especial, a previsão de prestar apoio técnico aos entes federativos quanto à implementação dos princípios e das regras da execução penal.</w:t>
+      </w:r>
+    </w:p>
+    <w:p>
+      <w:pPr>
+        <w:pStyle w:val="BodyText"/>
+      </w:pPr>
+      <w:r>
+        <w:t xml:space="preserve">A segunda linha da seção:</w:t>
+      </w:r>
+    </w:p>
+    <w:p>
+      <w:pPr>
+        <w:pStyle w:val="BodyText"/>
+      </w:pPr>
+      <w:r>
+        <w:t xml:space="preserve">A estrutura da EMA foi alterada em 2025, mediante as Portarias GABSEC/SENAPPEN/MJSP Nº 511, de 13 de outubro de 2025, e Portaria de Pessoal GABSEC/SENAPPEN/MJSP Nº 93, de 10 de março de 2026, as quais possuíam por objetivo o aprimoramento da sua composição institucional, conforme o organograma a seguir:</w:t>
       </w:r>
     </w:p>
     <w:p>
@@ -1481,7 +3664,7 @@
         <w:pStyle w:val="BodyText"/>
       </w:pPr>
       <w:r>
-        <w:t xml:space="preserve">Frentes de acompanhamento</w:t>
+        <w:t xml:space="preserve">Frentes de Atuação</w:t>
       </w:r>
     </w:p>
     <w:p>
@@ -1501,7 +3684,7 @@
         </w:numPr>
       </w:pPr>
       <w:r>
-        <w:t xml:space="preserve">Monitoramento de decisões, recomendações e deliberações do SIDH relacionadas ao sistema penal brasileiro.</w:t>
+        <w:t xml:space="preserve">Monitorar e acompanhar as estratégias adotadas pelo Estado Brasileiro para o cumprimento das decisões do SIDH em relação ao sistema penal.</w:t>
       </w:r>
     </w:p>
     <w:p>
@@ -1513,7 +3696,7 @@
         </w:numPr>
       </w:pPr>
       <w:r>
-        <w:t xml:space="preserve">Organização de referências públicas sobre os órgãos, normas e mecanismos do sistema interamericano.</w:t>
+        <w:t xml:space="preserve">Prevenir e evitar possíveis condenações.</w:t>
       </w:r>
     </w:p>
     <w:p>
@@ -1525,7 +3708,7 @@
         </w:numPr>
       </w:pPr>
       <w:r>
-        <w:t xml:space="preserve">Apoio à circulação de informações relevantes para o acompanhamento institucional da pauta.</w:t>
+        <w:t xml:space="preserve">Propagar a cultura de Direitos Humanos, fomentando a aplicação dos Tratados Internacionais sobre a matéria de Direito Penal pelos gestores do sistema penal nacional.</w:t>
       </w:r>
     </w:p>
     <w:p>
@@ -1537,7 +3720,7 @@
         </w:numPr>
       </w:pPr>
       <w:r>
-        <w:t xml:space="preserve">Fortalecimento do diálogo entre proteção de direitos, transparência e governança no sistema penal.</w:t>
+        <w:t xml:space="preserve">Fortalecer o diálogo entre a proteção de direitos e a governança no sistema penal.</w:t>
       </w:r>
     </w:p>
     <w:p>
@@ -1545,6 +3728,22 @@
         <w:pStyle w:val="FirstParagraph"/>
       </w:pPr>
       <w:r>
+        <w:t xml:space="preserve">Texto complementar da seção:</w:t>
+      </w:r>
+    </w:p>
+    <w:p>
+      <w:pPr>
+        <w:pStyle w:val="BodyText"/>
+      </w:pPr>
+      <w:r>
+        <w:t xml:space="preserve">Cabe citar a aproximação institucional e a construção de diálogo com órgãos-chave desse processo de monitoramento, como o Ministério das Relações Exteriores, o Ministério dos Direitos Humanos e da Cidadania e o Conselho Nacional de Justiça.</w:t>
+      </w:r>
+    </w:p>
+    <w:p>
+      <w:pPr>
+        <w:pStyle w:val="BodyText"/>
+      </w:pPr>
+      <w:r>
         <w:t xml:space="preserve">Seção:</w:t>
       </w:r>
     </w:p>
@@ -1553,7 +3752,7 @@
         <w:pStyle w:val="BodyText"/>
       </w:pPr>
       <w:r>
-        <w:t xml:space="preserve">Referências públicas do SIDH</w:t>
+        <w:t xml:space="preserve">Atuação institucional em 2025</w:t>
       </w:r>
     </w:p>
     <w:p>
@@ -1569,15 +3768,31 @@
         <w:pStyle w:val="BodyText"/>
       </w:pPr>
       <w:r>
-        <w:t xml:space="preserve">Para contextualização institucional da pauta, a ONASP pode utilizar como pontos de partida as referências públicas abaixo, produzidas pelos próprios órgãos do sistema interamericano:</w:t>
-      </w:r>
-    </w:p>
-    <w:p>
-      <w:pPr>
-        <w:pStyle w:val="BodyText"/>
-      </w:pPr>
-      <w:r>
-        <w:t xml:space="preserve">Links:</w:t>
+        <w:t xml:space="preserve">Em 2025, a EMA/Senappen intensificou o acompanhamento do Sistema Interamericano de Direitos Humanos com foco em decisões, deliberações e medidas com repercussão sobre o sistema penal brasileiro. A atuação combinou articulação interinstitucional, monitoramento técnico e apoio à consolidação de respostas coordenadas do Estado.</w:t>
+      </w:r>
+    </w:p>
+    <w:p>
+      <w:pPr>
+        <w:pStyle w:val="BodyText"/>
+      </w:pPr>
+      <w:r>
+        <w:t xml:space="preserve">A segunda linha da seção:</w:t>
+      </w:r>
+    </w:p>
+    <w:p>
+      <w:pPr>
+        <w:pStyle w:val="BodyText"/>
+      </w:pPr>
+      <w:r>
+        <w:t xml:space="preserve">Nesse período, a equipe ampliou sua participação em agendas voltadas ao acompanhamento de casos perante a Corte Interamericana de Direitos Humanos e ao fortalecimento de mecanismos permanentes de monitoramento no âmbito da política penal.</w:t>
+      </w:r>
+    </w:p>
+    <w:p>
+      <w:pPr>
+        <w:pStyle w:val="BodyText"/>
+      </w:pPr>
+      <w:r>
+        <w:t xml:space="preserve">Imagens complementares opcionais:</w:t>
       </w:r>
     </w:p>
     <w:p>
@@ -1589,7 +3804,7 @@
         </w:numPr>
       </w:pPr>
       <w:r>
-        <w:t xml:space="preserve">O que é a CIDH?: https://www.oas.org/pt/cidh/mandato/que.asp</w:t>
+        <w:t xml:space="preserve">Documentação/Banner_Ema.jpg</w:t>
       </w:r>
     </w:p>
     <w:p>
@@ -1601,31 +3816,7 @@
         </w:numPr>
       </w:pPr>
       <w:r>
-        <w:t xml:space="preserve">O que é a Corte IDH?: https://www.corteidh.or.cr/que_es_la_corte.cfm?lang=pt</w:t>
-      </w:r>
-    </w:p>
-    <w:p>
-      <w:pPr>
-        <w:pStyle w:val="Compact"/>
-        <w:numPr>
-          <w:ilvl w:val="0"/>
-          <w:numId w:val="1006"/>
-        </w:numPr>
-      </w:pPr>
-      <w:r>
-        <w:t xml:space="preserve">Estatuto da Comissão Interamericana de Direitos Humanos: https://www.oas.org/pt/cidh/mandato/Basicos/estatutoCIDH.asp</w:t>
-      </w:r>
-    </w:p>
-    <w:p>
-      <w:pPr>
-        <w:pStyle w:val="Compact"/>
-        <w:numPr>
-          <w:ilvl w:val="0"/>
-          <w:numId w:val="1006"/>
-        </w:numPr>
-      </w:pPr>
-      <w:r>
-        <w:t xml:space="preserve">Declaração Americana de Direitos e Deveres do Homem: https://www.oas.org/pt/cidh/mandato/Basicos/declaracion.asp</w:t>
+        <w:t xml:space="preserve">Documentação/Banner_Ema_2.jpg</w:t>
       </w:r>
     </w:p>
     <w:p>
@@ -1633,193 +3824,7 @@
         <w:pStyle w:val="FirstParagraph"/>
       </w:pPr>
       <w:r>
-        <w:t xml:space="preserve">Seção:</w:t>
-      </w:r>
-    </w:p>
-    <w:p>
-      <w:pPr>
-        <w:pStyle w:val="BodyText"/>
-      </w:pPr>
-      <w:r>
-        <w:t xml:space="preserve">Finalidade institucional</w:t>
-      </w:r>
-    </w:p>
-    <w:p>
-      <w:pPr>
-        <w:pStyle w:val="BodyText"/>
-      </w:pPr>
-      <w:r>
-        <w:t xml:space="preserve">Texto para colar:</w:t>
-      </w:r>
-    </w:p>
-    <w:p>
-      <w:pPr>
-        <w:pStyle w:val="BodyText"/>
-      </w:pPr>
-      <w:r>
-        <w:t xml:space="preserve">Esta página temática reúne a apresentação institucional da Ema - SIDH e oferece um ponto de consulta inicial para acompanhamento qualificado de temas do sistema interamericano com incidência sobre os serviços penais, favorecendo transparência, memória institucional e articulação técnica.</w:t>
-      </w:r>
-    </w:p>
-    <w:bookmarkEnd w:id="21"/>
-    <w:bookmarkStart w:id="22" w:name="subpágina-3---plano-pena-justa"/>
-    <w:p>
-      <w:pPr>
-        <w:pStyle w:val="Heading2"/>
-      </w:pPr>
-      <w:r>
-        <w:t xml:space="preserve">Subpágina 3 - Plano Pena Justa</w:t>
-      </w:r>
-    </w:p>
-    <w:p>
-      <w:pPr>
-        <w:pStyle w:val="FirstParagraph"/>
-      </w:pPr>
-      <w:r>
-        <w:t xml:space="preserve">Título da página:</w:t>
-      </w:r>
-    </w:p>
-    <w:p>
-      <w:pPr>
-        <w:pStyle w:val="BodyText"/>
-      </w:pPr>
-      <w:r>
-        <w:t xml:space="preserve">Plano Pena Justa</w:t>
-      </w:r>
-    </w:p>
-    <w:p>
-      <w:pPr>
-        <w:pStyle w:val="BodyText"/>
-      </w:pPr>
-      <w:r>
-        <w:t xml:space="preserve">Imagem de destaque:</w:t>
-      </w:r>
-    </w:p>
-    <w:p>
-      <w:pPr>
-        <w:pStyle w:val="BodyText"/>
-      </w:pPr>
-      <w:r>
-        <w:t xml:space="preserve">Documentação/Botao_PenaJusta.png</w:t>
-      </w:r>
-    </w:p>
-    <w:p>
-      <w:pPr>
-        <w:pStyle w:val="BodyText"/>
-      </w:pPr>
-      <w:r>
-        <w:t xml:space="preserve">Texto alternativo sugerido:</w:t>
-      </w:r>
-    </w:p>
-    <w:p>
-      <w:pPr>
-        <w:pStyle w:val="BodyText"/>
-      </w:pPr>
-      <w:r>
-        <w:t xml:space="preserve">Marca do Plano Pena Justa.</w:t>
-      </w:r>
-    </w:p>
-    <w:p>
-      <w:pPr>
-        <w:pStyle w:val="BodyText"/>
-      </w:pPr>
-      <w:r>
-        <w:t xml:space="preserve">Identificador editorial:</w:t>
-      </w:r>
-    </w:p>
-    <w:p>
-      <w:pPr>
-        <w:pStyle w:val="BodyText"/>
-      </w:pPr>
-      <w:r>
-        <w:t xml:space="preserve">Conteúdo Técnico e Projetos Estruturantes</w:t>
-      </w:r>
-    </w:p>
-    <w:p>
-      <w:pPr>
-        <w:pStyle w:val="BodyText"/>
-      </w:pPr>
-      <w:r>
-        <w:t xml:space="preserve">Texto de destaque:</w:t>
-      </w:r>
-    </w:p>
-    <w:p>
-      <w:pPr>
-        <w:pStyle w:val="BodyText"/>
-      </w:pPr>
-      <w:r>
-        <w:t xml:space="preserve">Ambiente dedicado ao Plano Pena Justa, com informações gerais, documentos públicos e marcos relacionados ao fortalecimento das ouvidorias no sistema penal.</w:t>
-      </w:r>
-    </w:p>
-    <w:p>
-      <w:pPr>
-        <w:pStyle w:val="BodyText"/>
-      </w:pPr>
-      <w:r>
-        <w:t xml:space="preserve">Seção:</w:t>
-      </w:r>
-    </w:p>
-    <w:p>
-      <w:pPr>
-        <w:pStyle w:val="BodyText"/>
-      </w:pPr>
-      <w:r>
-        <w:t xml:space="preserve">Escopo desta subpágina</w:t>
-      </w:r>
-    </w:p>
-    <w:p>
-      <w:pPr>
-        <w:pStyle w:val="BodyText"/>
-      </w:pPr>
-      <w:r>
-        <w:t xml:space="preserve">Texto para colar:</w:t>
-      </w:r>
-    </w:p>
-    <w:p>
-      <w:pPr>
-        <w:pStyle w:val="BodyText"/>
-      </w:pPr>
-      <w:r>
-        <w:t xml:space="preserve">O Plano Pena Justa é o Plano Nacional para o Enfrentamento do Estado de Coisas Inconstitucional nas Prisões Brasileiras, no âmbito da ADPF 347. Sua proposta articula ações de qualificação das políticas penais, fortalecimento da segurança pública, valorização dos servidores penais, transparência, participação social e monitoramento das metas pactuadas.</w:t>
-      </w:r>
-    </w:p>
-    <w:p>
-      <w:pPr>
-        <w:pStyle w:val="BodyText"/>
-      </w:pPr>
-      <w:r>
-        <w:t xml:space="preserve">Na perspectiva da Ouvidoria Nacional de Serviços Penais, esta subpágina reúne referências públicas do Plano voltadas ao fortalecimento da participação social, da escuta qualificada e da articulação entre as ouvidorias dos serviços penais nos Estados e no Distrito Federal.</w:t>
-      </w:r>
-    </w:p>
-    <w:p>
-      <w:pPr>
-        <w:pStyle w:val="BodyText"/>
-      </w:pPr>
-      <w:r>
-        <w:t xml:space="preserve">Seção:</w:t>
-      </w:r>
-    </w:p>
-    <w:p>
-      <w:pPr>
-        <w:pStyle w:val="BodyText"/>
-      </w:pPr>
-      <w:r>
-        <w:t xml:space="preserve">Eixos de atuação</w:t>
-      </w:r>
-    </w:p>
-    <w:p>
-      <w:pPr>
-        <w:pStyle w:val="BodyText"/>
-      </w:pPr>
-      <w:r>
-        <w:t xml:space="preserve">Texto para colar:</w:t>
-      </w:r>
-    </w:p>
-    <w:p>
-      <w:pPr>
-        <w:pStyle w:val="BodyText"/>
-      </w:pPr>
-      <w:r>
-        <w:t xml:space="preserve">O Plano Nacional organiza sua atuação em quatro eixos estruturantes:</w:t>
+        <w:t xml:space="preserve">Textos alternativos sugeridos:</w:t>
       </w:r>
     </w:p>
     <w:p>
@@ -1831,7 +3836,7 @@
         </w:numPr>
       </w:pPr>
       <w:r>
-        <w:t xml:space="preserve">Controle da entrada e das vagas do sistema prisional.</w:t>
+        <w:t xml:space="preserve">Participantes reunidos em mesa de trabalho institucional acompanhada pela EMA - SENAPPEN.</w:t>
       </w:r>
     </w:p>
     <w:p>
@@ -1843,31 +3848,7 @@
         </w:numPr>
       </w:pPr>
       <w:r>
-        <w:t xml:space="preserve">Qualidade da ambiência, dos serviços prestados e da estrutura prisional.</w:t>
-      </w:r>
-    </w:p>
-    <w:p>
-      <w:pPr>
-        <w:pStyle w:val="Compact"/>
-        <w:numPr>
-          <w:ilvl w:val="0"/>
-          <w:numId w:val="1007"/>
-        </w:numPr>
-      </w:pPr>
-      <w:r>
-        <w:t xml:space="preserve">Processos de saída da prisão e de reintegração social.</w:t>
-      </w:r>
-    </w:p>
-    <w:p>
-      <w:pPr>
-        <w:pStyle w:val="Compact"/>
-        <w:numPr>
-          <w:ilvl w:val="0"/>
-          <w:numId w:val="1007"/>
-        </w:numPr>
-      </w:pPr>
-      <w:r>
-        <w:t xml:space="preserve">Políticas de não repetição do Estado de Coisas Inconstitucional no sistema prisional.</w:t>
+        <w:t xml:space="preserve">Participantes posicionados em registro oficial de agenda institucional acompanhada pela EMA - SENAPPEN.</w:t>
       </w:r>
     </w:p>
     <w:p>
@@ -1875,255 +3856,7 @@
         <w:pStyle w:val="FirstParagraph"/>
       </w:pPr>
       <w:r>
-        <w:t xml:space="preserve">Seção:</w:t>
-      </w:r>
-    </w:p>
-    <w:p>
-      <w:pPr>
-        <w:pStyle w:val="BodyText"/>
-      </w:pPr>
-      <w:r>
-        <w:t xml:space="preserve">Governança e acompanhamento</w:t>
-      </w:r>
-    </w:p>
-    <w:p>
-      <w:pPr>
-        <w:pStyle w:val="BodyText"/>
-      </w:pPr>
-      <w:r>
-        <w:t xml:space="preserve">Texto para colar:</w:t>
-      </w:r>
-    </w:p>
-    <w:p>
-      <w:pPr>
-        <w:pStyle w:val="BodyText"/>
-      </w:pPr>
-      <w:r>
-        <w:t xml:space="preserve">No recorte da Ouvidoria Nacional de Serviços Penais, o acompanhamento do Pena Justa prioriza instrumentos que fortaleçam a escuta qualificada, a transparência ativa e a coordenação entre as ouvidorias dos serviços penais.</w:t>
-      </w:r>
-    </w:p>
-    <w:p>
-      <w:pPr>
-        <w:pStyle w:val="BodyText"/>
-      </w:pPr>
-      <w:r>
-        <w:t xml:space="preserve">Esse recorte se materializa por meio de marcos normativos e de cooperação técnica que estruturam parâmetros mínimos de atuação, incentivam integração preferencial ao Fala.BR e consolidam uma rede permanente de intercâmbio entre União, Estados e Distrito Federal.</w:t>
-      </w:r>
-    </w:p>
-    <w:p>
-      <w:pPr>
-        <w:pStyle w:val="BodyText"/>
-      </w:pPr>
-      <w:r>
-        <w:t xml:space="preserve">Seção:</w:t>
-      </w:r>
-    </w:p>
-    <w:p>
-      <w:pPr>
-        <w:pStyle w:val="BodyText"/>
-      </w:pPr>
-      <w:r>
-        <w:t xml:space="preserve">Entregas já formalizadas</w:t>
-      </w:r>
-    </w:p>
-    <w:p>
-      <w:pPr>
-        <w:pStyle w:val="BodyText"/>
-      </w:pPr>
-      <w:r>
-        <w:t xml:space="preserve">Texto para colar:</w:t>
-      </w:r>
-    </w:p>
-    <w:p>
-      <w:pPr>
-        <w:pStyle w:val="BodyText"/>
-      </w:pPr>
-      <w:r>
-        <w:t xml:space="preserve">No campo das ouvidorias e da participação social, o Pena Justa já reúne marcos normativos que podem ser destacados nesta página:</w:t>
-      </w:r>
-    </w:p>
-    <w:p>
-      <w:pPr>
-        <w:pStyle w:val="BodyText"/>
-      </w:pPr>
-      <w:r>
-        <w:t xml:space="preserve">Subtítulo:</w:t>
-      </w:r>
-    </w:p>
-    <w:p>
-      <w:pPr>
-        <w:pStyle w:val="BodyText"/>
-      </w:pPr>
-      <w:r>
-        <w:t xml:space="preserve">Normativo publicado</w:t>
-      </w:r>
-    </w:p>
-    <w:p>
-      <w:pPr>
-        <w:pStyle w:val="BodyText"/>
-      </w:pPr>
-      <w:r>
-        <w:t xml:space="preserve">Título:</w:t>
-      </w:r>
-    </w:p>
-    <w:p>
-      <w:pPr>
-        <w:pStyle w:val="BodyText"/>
-      </w:pPr>
-      <w:r>
-        <w:t xml:space="preserve">Instrução Normativa nº 75/2026</w:t>
-      </w:r>
-    </w:p>
-    <w:p>
-      <w:pPr>
-        <w:pStyle w:val="BodyText"/>
-      </w:pPr>
-      <w:r>
-        <w:t xml:space="preserve">Texto para colar:</w:t>
-      </w:r>
-    </w:p>
-    <w:p>
-      <w:pPr>
-        <w:pStyle w:val="BodyText"/>
-      </w:pPr>
-      <w:r>
-        <w:t xml:space="preserve">Estabelece parâmetros mínimos para a criação e a estruturação de Ouvidorias de Serviços Penais nos Estados e no Distrito Federal, com diretrizes de autonomia, transparência, acessibilidade e integração preferencial ao Fala.BR.</w:t>
-      </w:r>
-    </w:p>
-    <w:p>
-      <w:pPr>
-        <w:pStyle w:val="BodyText"/>
-      </w:pPr>
-      <w:r>
-        <w:t xml:space="preserve">Link:</w:t>
-      </w:r>
-    </w:p>
-    <w:p>
-      <w:pPr>
-        <w:pStyle w:val="BodyText"/>
-      </w:pPr>
-      <w:r>
-        <w:t xml:space="preserve">Acessar a Instrução Normativa (PDF)</w:t>
-      </w:r>
-    </w:p>
-    <w:p>
-      <w:pPr>
-        <w:pStyle w:val="BodyText"/>
-      </w:pPr>
-      <w:r>
-        <w:t xml:space="preserve">Arquivo:</w:t>
-      </w:r>
-    </w:p>
-    <w:p>
-      <w:pPr>
-        <w:pStyle w:val="BodyText"/>
-      </w:pPr>
-      <w:r>
-        <w:t xml:space="preserve">Subpages/Pena_justa/SEI_35153985_Instrucao_Normativa_75.pdf</w:t>
-      </w:r>
-    </w:p>
-    <w:p>
-      <w:pPr>
-        <w:pStyle w:val="BodyText"/>
-      </w:pPr>
-      <w:r>
-        <w:t xml:space="preserve">Subtítulo:</w:t>
-      </w:r>
-    </w:p>
-    <w:p>
-      <w:pPr>
-        <w:pStyle w:val="BodyText"/>
-      </w:pPr>
-      <w:r>
-        <w:t xml:space="preserve">Rede instituída</w:t>
-      </w:r>
-    </w:p>
-    <w:p>
-      <w:pPr>
-        <w:pStyle w:val="BodyText"/>
-      </w:pPr>
-      <w:r>
-        <w:t xml:space="preserve">Título:</w:t>
-      </w:r>
-    </w:p>
-    <w:p>
-      <w:pPr>
-        <w:pStyle w:val="BodyText"/>
-      </w:pPr>
-      <w:r>
-        <w:t xml:space="preserve">Portaria nº 549/2026</w:t>
-      </w:r>
-    </w:p>
-    <w:p>
-      <w:pPr>
-        <w:pStyle w:val="BodyText"/>
-      </w:pPr>
-      <w:r>
-        <w:t xml:space="preserve">Texto para colar:</w:t>
-      </w:r>
-    </w:p>
-    <w:p>
-      <w:pPr>
-        <w:pStyle w:val="BodyText"/>
-      </w:pPr>
-      <w:r>
-        <w:t xml:space="preserve">Institui a Rede Nacional de Ouvidorias de Serviços Penais - Renospen, como instância permanente de cooperação técnica, intercâmbio de informações e fortalecimento institucional das ouvidorias no sistema penal.</w:t>
-      </w:r>
-    </w:p>
-    <w:p>
-      <w:pPr>
-        <w:pStyle w:val="BodyText"/>
-      </w:pPr>
-      <w:r>
-        <w:t xml:space="preserve">Link:</w:t>
-      </w:r>
-    </w:p>
-    <w:p>
-      <w:pPr>
-        <w:pStyle w:val="BodyText"/>
-      </w:pPr>
-      <w:r>
-        <w:t xml:space="preserve">Acessar a Portaria (PDF)</w:t>
-      </w:r>
-    </w:p>
-    <w:p>
-      <w:pPr>
-        <w:pStyle w:val="BodyText"/>
-      </w:pPr>
-      <w:r>
-        <w:t xml:space="preserve">Arquivo:</w:t>
-      </w:r>
-    </w:p>
-    <w:p>
-      <w:pPr>
-        <w:pStyle w:val="BodyText"/>
-      </w:pPr>
-      <w:r>
-        <w:t xml:space="preserve">Subpages/Pena_justa/SEI_35032761_Portaria_549.pdf</w:t>
-      </w:r>
-    </w:p>
-    <w:p>
-      <w:pPr>
-        <w:pStyle w:val="BodyText"/>
-      </w:pPr>
-      <w:r>
-        <w:t xml:space="preserve">Seção:</w:t>
-      </w:r>
-    </w:p>
-    <w:p>
-      <w:pPr>
-        <w:pStyle w:val="BodyText"/>
-      </w:pPr>
-      <w:r>
-        <w:t xml:space="preserve">Documentos públicos de referência</w:t>
-      </w:r>
-    </w:p>
-    <w:p>
-      <w:pPr>
-        <w:pStyle w:val="BodyText"/>
-      </w:pPr>
-      <w:r>
-        <w:t xml:space="preserve">Links:</w:t>
+        <w:t xml:space="preserve">Legendas sugeridas:</w:t>
       </w:r>
     </w:p>
     <w:p>
@@ -2135,7 +3868,7 @@
         </w:numPr>
       </w:pPr>
       <w:r>
-        <w:t xml:space="preserve">Plano Nacional Pena Justa (PDF): Subpages/Pena_justa/Plano_Nacional_Pena_Justa.pdf</w:t>
+        <w:t xml:space="preserve">Reunião institucional acompanhada pela EMA - SENAPPEN.</w:t>
       </w:r>
     </w:p>
     <w:p>
@@ -2147,17 +3880,7 @@
         </w:numPr>
       </w:pPr>
       <w:r>
-        <w:t xml:space="preserve">10 coisas que você precisa saber sobre o Pena Justa (PDF): Subpages/Pena_justa/10_Coisas_que_você_precisa_saber_sobre_o_Pena_Justa.pdf</w:t>
-      </w:r>
-    </w:p>
-    <w:bookmarkEnd w:id="22"/>
-    <w:bookmarkStart w:id="23" w:name="X9010218d04cc9bed3b5085cf6721dd78b5ea4ec"/>
-    <w:p>
-      <w:pPr>
-        <w:pStyle w:val="Heading2"/>
-      </w:pPr>
-      <w:r>
-        <w:t xml:space="preserve">Subpágina 4 - Revista Brasileira de Execução Penal</w:t>
+        <w:t xml:space="preserve">Registro oficial de agenda institucional da EMA - SENAPPEN.</w:t>
       </w:r>
     </w:p>
     <w:p>
@@ -2165,86 +3888,6 @@
         <w:pStyle w:val="FirstParagraph"/>
       </w:pPr>
       <w:r>
-        <w:t xml:space="preserve">Título da página:</w:t>
-      </w:r>
-    </w:p>
-    <w:p>
-      <w:pPr>
-        <w:pStyle w:val="BodyText"/>
-      </w:pPr>
-      <w:r>
-        <w:t xml:space="preserve">Revista Brasileira de Execução Penal</w:t>
-      </w:r>
-    </w:p>
-    <w:p>
-      <w:pPr>
-        <w:pStyle w:val="BodyText"/>
-      </w:pPr>
-      <w:r>
-        <w:t xml:space="preserve">Imagem de destaque:</w:t>
-      </w:r>
-    </w:p>
-    <w:p>
-      <w:pPr>
-        <w:pStyle w:val="BodyText"/>
-      </w:pPr>
-      <w:r>
-        <w:t xml:space="preserve">Documentação/Botao_RevistaBrasileira.png</w:t>
-      </w:r>
-    </w:p>
-    <w:p>
-      <w:pPr>
-        <w:pStyle w:val="BodyText"/>
-      </w:pPr>
-      <w:r>
-        <w:t xml:space="preserve">Texto alternativo sugerido:</w:t>
-      </w:r>
-    </w:p>
-    <w:p>
-      <w:pPr>
-        <w:pStyle w:val="BodyText"/>
-      </w:pPr>
-      <w:r>
-        <w:t xml:space="preserve">Botão institucional da Revista Brasileira de Execução Penal.</w:t>
-      </w:r>
-    </w:p>
-    <w:p>
-      <w:pPr>
-        <w:pStyle w:val="BodyText"/>
-      </w:pPr>
-      <w:r>
-        <w:t xml:space="preserve">Identificador editorial:</w:t>
-      </w:r>
-    </w:p>
-    <w:p>
-      <w:pPr>
-        <w:pStyle w:val="BodyText"/>
-      </w:pPr>
-      <w:r>
-        <w:t xml:space="preserve">Conteúdo Técnico e Projetos Estruturantes</w:t>
-      </w:r>
-    </w:p>
-    <w:p>
-      <w:pPr>
-        <w:pStyle w:val="BodyText"/>
-      </w:pPr>
-      <w:r>
-        <w:t xml:space="preserve">Texto de destaque:</w:t>
-      </w:r>
-    </w:p>
-    <w:p>
-      <w:pPr>
-        <w:pStyle w:val="BodyText"/>
-      </w:pPr>
-      <w:r>
-        <w:t xml:space="preserve">Em parceria com a Espen e a DCOM, a Onasp lança edição da Revista Brasileira de Execução Penal. Com o tema voltado à participação e transparência, a publicação reúne artigos e estudos que fortalecem o controle social e consolidam a Ouvidoria como ponte entre o Estado e a sociedade.</w:t>
-      </w:r>
-    </w:p>
-    <w:p>
-      <w:pPr>
-        <w:pStyle w:val="BodyText"/>
-      </w:pPr>
-      <w:r>
         <w:t xml:space="preserve">Seção:</w:t>
       </w:r>
     </w:p>
@@ -2253,7 +3896,7 @@
         <w:pStyle w:val="BodyText"/>
       </w:pPr>
       <w:r>
-        <w:t xml:space="preserve">Escopo desta subpágina</w:t>
+        <w:t xml:space="preserve">Caso Pedrinhas</w:t>
       </w:r>
     </w:p>
     <w:p>
@@ -2269,55 +3912,7 @@
         <w:pStyle w:val="BodyText"/>
       </w:pPr>
       <w:r>
-        <w:t xml:space="preserve">A Revista Brasileira de Execução Penal é o periódico técnico-científico da Secretaria Nacional de Políticas Penais (Senappen/MJSP) e constitui espaço de circulação de artigos, documentos inéditos, entrevistas, relatos de experiência e boas práticas relacionados à execução penal.</w:t>
-      </w:r>
-    </w:p>
-    <w:p>
-      <w:pPr>
-        <w:pStyle w:val="BodyText"/>
-      </w:pPr>
-      <w:r>
-        <w:t xml:space="preserve">A segunda linha do escopo:</w:t>
-      </w:r>
-    </w:p>
-    <w:p>
-      <w:pPr>
-        <w:pStyle w:val="BodyText"/>
-      </w:pPr>
-      <w:r>
-        <w:t xml:space="preserve">No contexto da Ouvidoria, a publicação contribui para aproximar produção técnica, debate qualificado e controle social, reforçando o papel da Ouvidoria como ponte entre Estado e sociedade.</w:t>
-      </w:r>
-    </w:p>
-    <w:p>
-      <w:pPr>
-        <w:pStyle w:val="BodyText"/>
-      </w:pPr>
-      <w:r>
-        <w:t xml:space="preserve">Seção:</w:t>
-      </w:r>
-    </w:p>
-    <w:p>
-      <w:pPr>
-        <w:pStyle w:val="BodyText"/>
-      </w:pPr>
-      <w:r>
-        <w:t xml:space="preserve">Sobre a revista</w:t>
-      </w:r>
-    </w:p>
-    <w:p>
-      <w:pPr>
-        <w:pStyle w:val="BodyText"/>
-      </w:pPr>
-      <w:r>
-        <w:t xml:space="preserve">Texto para colar:</w:t>
-      </w:r>
-    </w:p>
-    <w:p>
-      <w:pPr>
-        <w:pStyle w:val="BodyText"/>
-      </w:pPr>
-      <w:r>
-        <w:t xml:space="preserve">A RBEP publica artigos, documentos inéditos, entrevistas, relatos de experiência e descrição de boas práticas que relacionam a experiência profissional, o conhecimento produzido sobre a matéria e o cumprimento da legislação nacional.</w:t>
+        <w:t xml:space="preserve">Em 21 de outubro de 2025, a EMA-SENAPPEN foi convocada a participar, juntamente a outros órgãos representantes do Estado Brasileiro, da audiência privada solicitada pela Corte Interamericana de Direitos Humanos sobre as Medidas Provisórias outorgadas no Caso do Complexo Penitenciário de São Luís, Maranhão (Caso Pedrinhas).</w:t>
       </w:r>
     </w:p>
     <w:p>
@@ -2333,47 +3928,31 @@
         <w:pStyle w:val="BodyText"/>
       </w:pPr>
       <w:r>
-        <w:t xml:space="preserve">Os conteúdos são organizados em dossiês temáticos semestrais, e a revista recebeu qualificação A4 na classificação de periódicos Qualis Capes na avaliação do quadriênio 2021-2024.</w:t>
-      </w:r>
-    </w:p>
-    <w:p>
-      <w:pPr>
-        <w:pStyle w:val="BodyText"/>
-      </w:pPr>
-      <w:r>
-        <w:t xml:space="preserve">Seção:</w:t>
-      </w:r>
-    </w:p>
-    <w:p>
-      <w:pPr>
-        <w:pStyle w:val="BodyText"/>
-      </w:pPr>
-      <w:r>
-        <w:t xml:space="preserve">Acesso oficial à RBEP</w:t>
-      </w:r>
-    </w:p>
-    <w:p>
-      <w:pPr>
-        <w:pStyle w:val="BodyText"/>
-      </w:pPr>
-      <w:r>
-        <w:t xml:space="preserve">Texto para colar:</w:t>
-      </w:r>
-    </w:p>
-    <w:p>
-      <w:pPr>
-        <w:pStyle w:val="BodyText"/>
-      </w:pPr>
-      <w:r>
-        <w:t xml:space="preserve">O portal oficial da revista reúne notícias, edição atual, arquivo de edições e informações para submissão de textos.</w:t>
-      </w:r>
-    </w:p>
-    <w:p>
-      <w:pPr>
-        <w:pStyle w:val="BodyText"/>
-      </w:pPr>
-      <w:r>
-        <w:t xml:space="preserve">Links:</w:t>
+        <w:t xml:space="preserve">Como desdobramento da audiência, a Equipe ficou responsável por coordenar uma mesa de trabalho voltada à elaboração de um plano de cumprimento conjunto, com foco no enfrentamento das fragilidades ainda identificadas no Caso.</w:t>
+      </w:r>
+    </w:p>
+    <w:p>
+      <w:pPr>
+        <w:pStyle w:val="BodyText"/>
+      </w:pPr>
+      <w:r>
+        <w:t xml:space="preserve">Subseção:</w:t>
+      </w:r>
+    </w:p>
+    <w:p>
+      <w:pPr>
+        <w:pStyle w:val="BodyText"/>
+      </w:pPr>
+      <w:r>
+        <w:t xml:space="preserve">Eixos priorizados</w:t>
+      </w:r>
+    </w:p>
+    <w:p>
+      <w:pPr>
+        <w:pStyle w:val="BodyText"/>
+      </w:pPr>
+      <w:r>
+        <w:t xml:space="preserve">Itens para colar:</w:t>
       </w:r>
     </w:p>
     <w:p>
@@ -2385,7 +3964,7 @@
         </w:numPr>
       </w:pPr>
       <w:r>
-        <w:t xml:space="preserve">Portal oficial da Revista Brasileira de Execução Penal: https://rbepsenappen.mj.gov.br/index.php/RBEP/pt_BR</w:t>
+        <w:t xml:space="preserve">Superlotação e ambiência no sistema prisional.</w:t>
       </w:r>
     </w:p>
     <w:p>
@@ -2397,7 +3976,7 @@
         </w:numPr>
       </w:pPr>
       <w:r>
-        <w:t xml:space="preserve">Edição atual - edição completa: https://rbepsenappen.mj.gov.br/index.php/RBEP/pt_BR/issue/view/22/58</w:t>
+        <w:t xml:space="preserve">Dignidade e condições de custódia.</w:t>
       </w:r>
     </w:p>
     <w:p>
@@ -2409,7 +3988,7 @@
         </w:numPr>
       </w:pPr>
       <w:r>
-        <w:t xml:space="preserve">Ver todas as edições: https://rbepsenappen.mj.gov.br/index.php/RBEP/pt_BR/issue/archive</w:t>
+        <w:t xml:space="preserve">Acesso à justiça e prevenção à tortura.</w:t>
       </w:r>
     </w:p>
     <w:p>
@@ -2421,7 +4000,7 @@
         </w:numPr>
       </w:pPr>
       <w:r>
-        <w:t xml:space="preserve">Enviar submissão: https://rbepsenappen.mj.gov.br/index.php/RBEP/pt_BR/about/submissions</w:t>
+        <w:t xml:space="preserve">Monitoramento, participação social e coordenação institucional.</w:t>
       </w:r>
     </w:p>
     <w:p>
@@ -2429,6 +4008,54 @@
         <w:pStyle w:val="FirstParagraph"/>
       </w:pPr>
       <w:r>
+        <w:t xml:space="preserve">Subseção:</w:t>
+      </w:r>
+    </w:p>
+    <w:p>
+      <w:pPr>
+        <w:pStyle w:val="BodyText"/>
+      </w:pPr>
+      <w:r>
+        <w:t xml:space="preserve">Desdobramentos e articulação técnica</w:t>
+      </w:r>
+    </w:p>
+    <w:p>
+      <w:pPr>
+        <w:pStyle w:val="BodyText"/>
+      </w:pPr>
+      <w:r>
+        <w:t xml:space="preserve">Texto para colar:</w:t>
+      </w:r>
+    </w:p>
+    <w:p>
+      <w:pPr>
+        <w:pStyle w:val="BodyText"/>
+      </w:pPr>
+      <w:r>
+        <w:t xml:space="preserve">Entre novembro e dezembro de 2025, a EMA/Senappen contribuiu para a formalização da mesa de trabalho, participou de reuniões técnicas dedicadas aos eixos temáticos do caso e apoiou a preparação de visita técnica destinada a consolidar diagnósticos e orientar as próximas medidas.</w:t>
+      </w:r>
+    </w:p>
+    <w:p>
+      <w:pPr>
+        <w:pStyle w:val="BodyText"/>
+      </w:pPr>
+      <w:r>
+        <w:t xml:space="preserve">A segunda linha da subseção:</w:t>
+      </w:r>
+    </w:p>
+    <w:p>
+      <w:pPr>
+        <w:pStyle w:val="BodyText"/>
+      </w:pPr>
+      <w:r>
+        <w:t xml:space="preserve">No mesmo contexto, a equipe atuou de forma articulada com o Plano Pena Justa e acompanhou iniciativas voltadas à criação de instâncias permanentes de monitoramento e à padronização de fluxos para acompanhamento de casos internacionais com incidência sobre o sistema penal brasileiro.</w:t>
+      </w:r>
+    </w:p>
+    <w:p>
+      <w:pPr>
+        <w:pStyle w:val="BodyText"/>
+      </w:pPr>
+      <w:r>
         <w:t xml:space="preserve">Seção:</w:t>
       </w:r>
     </w:p>
@@ -2437,15 +4064,31 @@
         <w:pStyle w:val="BodyText"/>
       </w:pPr>
       <w:r>
-        <w:t xml:space="preserve">Referências institucionais</w:t>
-      </w:r>
-    </w:p>
-    <w:p>
-      <w:pPr>
-        <w:pStyle w:val="BodyText"/>
-      </w:pPr>
-      <w:r>
-        <w:t xml:space="preserve">Itens para colar:</w:t>
+        <w:t xml:space="preserve">Referências públicas do SIDH</w:t>
+      </w:r>
+    </w:p>
+    <w:p>
+      <w:pPr>
+        <w:pStyle w:val="BodyText"/>
+      </w:pPr>
+      <w:r>
+        <w:t xml:space="preserve">Texto para colar:</w:t>
+      </w:r>
+    </w:p>
+    <w:p>
+      <w:pPr>
+        <w:pStyle w:val="BodyText"/>
+      </w:pPr>
+      <w:r>
+        <w:t xml:space="preserve">Para contextualização institucional da pauta, a ONASP pode utilizar como pontos de partida as referências públicas abaixo, produzidas pelos próprios órgãos do sistema interamericano:</w:t>
+      </w:r>
+    </w:p>
+    <w:p>
+      <w:pPr>
+        <w:pStyle w:val="BodyText"/>
+      </w:pPr>
+      <w:r>
+        <w:t xml:space="preserve">Links:</w:t>
       </w:r>
     </w:p>
     <w:p>
@@ -2457,7 +4100,7 @@
         </w:numPr>
       </w:pPr>
       <w:r>
-        <w:t xml:space="preserve">Qualis Capes 2021-2024: A4.</w:t>
+        <w:t xml:space="preserve">O que é a CIDH?: https://www.oas.org/pt/cidh/mandato/que.asp</w:t>
       </w:r>
     </w:p>
     <w:p>
@@ -2469,7 +4112,7 @@
         </w:numPr>
       </w:pPr>
       <w:r>
-        <w:t xml:space="preserve">ISSN: 2675-1895.</w:t>
+        <w:t xml:space="preserve">O que é a Corte IDH?: https://www.corteidh.or.cr/que_es_la_corte.cfm?lang=pt</w:t>
       </w:r>
     </w:p>
     <w:p>
@@ -2481,7 +4124,7 @@
         </w:numPr>
       </w:pPr>
       <w:r>
-        <w:t xml:space="preserve">e-ISSN: 2675-1860.</w:t>
+        <w:t xml:space="preserve">Estatuto da Comissão Interamericana de Direitos Humanos: https://www.oas.org/pt/cidh/mandato/Basicos/estatutoCIDH.asp</w:t>
       </w:r>
     </w:p>
     <w:p>
@@ -2490,6 +4133,850 @@
         <w:numPr>
           <w:ilvl w:val="0"/>
           <w:numId w:val="1010"/>
+        </w:numPr>
+      </w:pPr>
+      <w:r>
+        <w:t xml:space="preserve">Declaração Americana de Direitos e Deveres do Homem: https://www.oas.org/pt/cidh/mandato/Basicos/declaracion.asp</w:t>
+      </w:r>
+    </w:p>
+    <w:p>
+      <w:pPr>
+        <w:pStyle w:val="FirstParagraph"/>
+      </w:pPr>
+      <w:r>
+        <w:t xml:space="preserve">Seção:</w:t>
+      </w:r>
+    </w:p>
+    <w:bookmarkEnd w:id="21"/>
+    <w:bookmarkStart w:id="22" w:name="subpágina-3---plano-pena-justa"/>
+    <w:p>
+      <w:pPr>
+        <w:pStyle w:val="Heading2"/>
+      </w:pPr>
+      <w:r>
+        <w:t xml:space="preserve">Subpágina 3 - Plano Pena Justa</w:t>
+      </w:r>
+    </w:p>
+    <w:p>
+      <w:pPr>
+        <w:pStyle w:val="FirstParagraph"/>
+      </w:pPr>
+      <w:r>
+        <w:t xml:space="preserve">Título da página:</w:t>
+      </w:r>
+    </w:p>
+    <w:p>
+      <w:pPr>
+        <w:pStyle w:val="BodyText"/>
+      </w:pPr>
+      <w:r>
+        <w:t xml:space="preserve">Plano Pena Justa</w:t>
+      </w:r>
+    </w:p>
+    <w:p>
+      <w:pPr>
+        <w:pStyle w:val="BodyText"/>
+      </w:pPr>
+      <w:r>
+        <w:t xml:space="preserve">Imagem de destaque:</w:t>
+      </w:r>
+    </w:p>
+    <w:p>
+      <w:pPr>
+        <w:pStyle w:val="BodyText"/>
+      </w:pPr>
+      <w:r>
+        <w:t xml:space="preserve">Documentação/Botao_PenaJusta.png</w:t>
+      </w:r>
+    </w:p>
+    <w:p>
+      <w:pPr>
+        <w:pStyle w:val="BodyText"/>
+      </w:pPr>
+      <w:r>
+        <w:t xml:space="preserve">Texto alternativo sugerido:</w:t>
+      </w:r>
+    </w:p>
+    <w:p>
+      <w:pPr>
+        <w:pStyle w:val="BodyText"/>
+      </w:pPr>
+      <w:r>
+        <w:t xml:space="preserve">Marca do Plano Pena Justa.</w:t>
+      </w:r>
+    </w:p>
+    <w:p>
+      <w:pPr>
+        <w:pStyle w:val="BodyText"/>
+      </w:pPr>
+      <w:r>
+        <w:t xml:space="preserve">Identificador editorial:</w:t>
+      </w:r>
+    </w:p>
+    <w:p>
+      <w:pPr>
+        <w:pStyle w:val="BodyText"/>
+      </w:pPr>
+      <w:r>
+        <w:t xml:space="preserve">Conteúdo Técnico e Projetos Estruturantes</w:t>
+      </w:r>
+    </w:p>
+    <w:p>
+      <w:pPr>
+        <w:pStyle w:val="BodyText"/>
+      </w:pPr>
+      <w:r>
+        <w:t xml:space="preserve">Texto de destaque:</w:t>
+      </w:r>
+    </w:p>
+    <w:p>
+      <w:pPr>
+        <w:pStyle w:val="BodyText"/>
+      </w:pPr>
+      <w:r>
+        <w:t xml:space="preserve">Ambiente dedicado ao Plano Pena Justa, com informações gerais, documentos públicos e marcos relacionados ao fortalecimento das ouvidorias no sistema penal.</w:t>
+      </w:r>
+    </w:p>
+    <w:p>
+      <w:pPr>
+        <w:pStyle w:val="BodyText"/>
+      </w:pPr>
+      <w:r>
+        <w:t xml:space="preserve">Seção:</w:t>
+      </w:r>
+    </w:p>
+    <w:p>
+      <w:pPr>
+        <w:pStyle w:val="BodyText"/>
+      </w:pPr>
+      <w:r>
+        <w:t xml:space="preserve">Escopo desta subpágina</w:t>
+      </w:r>
+    </w:p>
+    <w:p>
+      <w:pPr>
+        <w:pStyle w:val="BodyText"/>
+      </w:pPr>
+      <w:r>
+        <w:t xml:space="preserve">Texto para colar:</w:t>
+      </w:r>
+    </w:p>
+    <w:p>
+      <w:pPr>
+        <w:pStyle w:val="BodyText"/>
+      </w:pPr>
+      <w:r>
+        <w:t xml:space="preserve">O Plano Pena Justa é o Plano Nacional para o Enfrentamento do Estado de Coisas Inconstitucional nas Prisões Brasileiras, no âmbito da ADPF 347. Sua proposta articula ações de qualificação das políticas penais, fortalecimento da segurança pública, valorização dos servidores penais, transparência, participação social e monitoramento das metas pactuadas.</w:t>
+      </w:r>
+    </w:p>
+    <w:p>
+      <w:pPr>
+        <w:pStyle w:val="BodyText"/>
+      </w:pPr>
+      <w:r>
+        <w:t xml:space="preserve">Na perspectiva da Ouvidoria Nacional de Serviços Penais, esta subpágina reúne referências públicas do Plano voltadas ao fortalecimento da participação social, da escuta qualificada e da articulação entre as ouvidorias dos serviços penais nos Estados e no Distrito Federal.</w:t>
+      </w:r>
+    </w:p>
+    <w:p>
+      <w:pPr>
+        <w:pStyle w:val="BodyText"/>
+      </w:pPr>
+      <w:r>
+        <w:t xml:space="preserve">Seção:</w:t>
+      </w:r>
+    </w:p>
+    <w:p>
+      <w:pPr>
+        <w:pStyle w:val="BodyText"/>
+      </w:pPr>
+      <w:r>
+        <w:t xml:space="preserve">Eixos de atuação</w:t>
+      </w:r>
+    </w:p>
+    <w:p>
+      <w:pPr>
+        <w:pStyle w:val="BodyText"/>
+      </w:pPr>
+      <w:r>
+        <w:t xml:space="preserve">Texto para colar:</w:t>
+      </w:r>
+    </w:p>
+    <w:p>
+      <w:pPr>
+        <w:pStyle w:val="BodyText"/>
+      </w:pPr>
+      <w:r>
+        <w:t xml:space="preserve">O Plano Nacional organiza sua atuação em quatro eixos estruturantes:</w:t>
+      </w:r>
+    </w:p>
+    <w:p>
+      <w:pPr>
+        <w:pStyle w:val="Compact"/>
+        <w:numPr>
+          <w:ilvl w:val="0"/>
+          <w:numId w:val="1011"/>
+        </w:numPr>
+      </w:pPr>
+      <w:r>
+        <w:t xml:space="preserve">Controle da entrada e das vagas do sistema prisional.</w:t>
+      </w:r>
+    </w:p>
+    <w:p>
+      <w:pPr>
+        <w:pStyle w:val="Compact"/>
+        <w:numPr>
+          <w:ilvl w:val="0"/>
+          <w:numId w:val="1011"/>
+        </w:numPr>
+      </w:pPr>
+      <w:r>
+        <w:t xml:space="preserve">Qualidade da ambiência, dos serviços prestados e da estrutura prisional.</w:t>
+      </w:r>
+    </w:p>
+    <w:p>
+      <w:pPr>
+        <w:pStyle w:val="Compact"/>
+        <w:numPr>
+          <w:ilvl w:val="0"/>
+          <w:numId w:val="1011"/>
+        </w:numPr>
+      </w:pPr>
+      <w:r>
+        <w:t xml:space="preserve">Processos de saída da prisão e de reintegração social.</w:t>
+      </w:r>
+    </w:p>
+    <w:p>
+      <w:pPr>
+        <w:pStyle w:val="Compact"/>
+        <w:numPr>
+          <w:ilvl w:val="0"/>
+          <w:numId w:val="1011"/>
+        </w:numPr>
+      </w:pPr>
+      <w:r>
+        <w:t xml:space="preserve">Políticas de não repetição do Estado de Coisas Inconstitucional no sistema prisional.</w:t>
+      </w:r>
+    </w:p>
+    <w:p>
+      <w:pPr>
+        <w:pStyle w:val="FirstParagraph"/>
+      </w:pPr>
+      <w:r>
+        <w:t xml:space="preserve">Seção:</w:t>
+      </w:r>
+    </w:p>
+    <w:p>
+      <w:pPr>
+        <w:pStyle w:val="BodyText"/>
+      </w:pPr>
+      <w:r>
+        <w:t xml:space="preserve">Governança e acompanhamento</w:t>
+      </w:r>
+    </w:p>
+    <w:p>
+      <w:pPr>
+        <w:pStyle w:val="BodyText"/>
+      </w:pPr>
+      <w:r>
+        <w:t xml:space="preserve">Texto para colar:</w:t>
+      </w:r>
+    </w:p>
+    <w:p>
+      <w:pPr>
+        <w:pStyle w:val="BodyText"/>
+      </w:pPr>
+      <w:r>
+        <w:t xml:space="preserve">No recorte da Ouvidoria Nacional de Serviços Penais, o acompanhamento do Pena Justa prioriza instrumentos que fortaleçam a escuta qualificada, a transparência ativa e a coordenação entre as ouvidorias dos serviços penais.</w:t>
+      </w:r>
+    </w:p>
+    <w:p>
+      <w:pPr>
+        <w:pStyle w:val="BodyText"/>
+      </w:pPr>
+      <w:r>
+        <w:t xml:space="preserve">Esse recorte se materializa por meio de marcos normativos e de cooperação técnica que estruturam parâmetros mínimos de atuação, incentivam integração preferencial ao Fala.BR e consolidam uma rede permanente de intercâmbio entre União, Estados e Distrito Federal.</w:t>
+      </w:r>
+    </w:p>
+    <w:p>
+      <w:pPr>
+        <w:pStyle w:val="BodyText"/>
+      </w:pPr>
+      <w:r>
+        <w:t xml:space="preserve">Seção:</w:t>
+      </w:r>
+    </w:p>
+    <w:p>
+      <w:pPr>
+        <w:pStyle w:val="BodyText"/>
+      </w:pPr>
+      <w:r>
+        <w:t xml:space="preserve">Entregas já formalizadas</w:t>
+      </w:r>
+    </w:p>
+    <w:p>
+      <w:pPr>
+        <w:pStyle w:val="BodyText"/>
+      </w:pPr>
+      <w:r>
+        <w:t xml:space="preserve">Texto para colar:</w:t>
+      </w:r>
+    </w:p>
+    <w:p>
+      <w:pPr>
+        <w:pStyle w:val="BodyText"/>
+      </w:pPr>
+      <w:r>
+        <w:t xml:space="preserve">No campo das ouvidorias e da participação social, o Pena Justa já reúne marcos normativos que podem ser destacados nesta página:</w:t>
+      </w:r>
+    </w:p>
+    <w:p>
+      <w:pPr>
+        <w:pStyle w:val="BodyText"/>
+      </w:pPr>
+      <w:r>
+        <w:t xml:space="preserve">Subtítulo:</w:t>
+      </w:r>
+    </w:p>
+    <w:p>
+      <w:pPr>
+        <w:pStyle w:val="BodyText"/>
+      </w:pPr>
+      <w:r>
+        <w:t xml:space="preserve">Normativo publicado</w:t>
+      </w:r>
+    </w:p>
+    <w:p>
+      <w:pPr>
+        <w:pStyle w:val="BodyText"/>
+      </w:pPr>
+      <w:r>
+        <w:t xml:space="preserve">Título:</w:t>
+      </w:r>
+    </w:p>
+    <w:p>
+      <w:pPr>
+        <w:pStyle w:val="BodyText"/>
+      </w:pPr>
+      <w:r>
+        <w:t xml:space="preserve">Instrução Normativa nº 75/2026</w:t>
+      </w:r>
+    </w:p>
+    <w:p>
+      <w:pPr>
+        <w:pStyle w:val="BodyText"/>
+      </w:pPr>
+      <w:r>
+        <w:t xml:space="preserve">Texto para colar:</w:t>
+      </w:r>
+    </w:p>
+    <w:p>
+      <w:pPr>
+        <w:pStyle w:val="BodyText"/>
+      </w:pPr>
+      <w:r>
+        <w:t xml:space="preserve">Estabelece parâmetros mínimos para a criação e a estruturação de Ouvidorias de Serviços Penais nos Estados e no Distrito Federal, com diretrizes de autonomia, transparência, acessibilidade e integração preferencial ao Fala.BR.</w:t>
+      </w:r>
+    </w:p>
+    <w:p>
+      <w:pPr>
+        <w:pStyle w:val="BodyText"/>
+      </w:pPr>
+      <w:r>
+        <w:t xml:space="preserve">Link:</w:t>
+      </w:r>
+    </w:p>
+    <w:p>
+      <w:pPr>
+        <w:pStyle w:val="BodyText"/>
+      </w:pPr>
+      <w:r>
+        <w:t xml:space="preserve">Acessar a Instrução Normativa (PDF)</w:t>
+      </w:r>
+    </w:p>
+    <w:p>
+      <w:pPr>
+        <w:pStyle w:val="BodyText"/>
+      </w:pPr>
+      <w:r>
+        <w:t xml:space="preserve">Arquivo:</w:t>
+      </w:r>
+    </w:p>
+    <w:p>
+      <w:pPr>
+        <w:pStyle w:val="BodyText"/>
+      </w:pPr>
+      <w:r>
+        <w:t xml:space="preserve">Subpages/Pena_justa/SEI_35153985_Instrucao_Normativa_75.pdf</w:t>
+      </w:r>
+    </w:p>
+    <w:p>
+      <w:pPr>
+        <w:pStyle w:val="BodyText"/>
+      </w:pPr>
+      <w:r>
+        <w:t xml:space="preserve">Subtítulo:</w:t>
+      </w:r>
+    </w:p>
+    <w:p>
+      <w:pPr>
+        <w:pStyle w:val="BodyText"/>
+      </w:pPr>
+      <w:r>
+        <w:t xml:space="preserve">Rede instituída</w:t>
+      </w:r>
+    </w:p>
+    <w:p>
+      <w:pPr>
+        <w:pStyle w:val="BodyText"/>
+      </w:pPr>
+      <w:r>
+        <w:t xml:space="preserve">Título:</w:t>
+      </w:r>
+    </w:p>
+    <w:p>
+      <w:pPr>
+        <w:pStyle w:val="BodyText"/>
+      </w:pPr>
+      <w:r>
+        <w:t xml:space="preserve">Portaria nº 549/2026</w:t>
+      </w:r>
+    </w:p>
+    <w:p>
+      <w:pPr>
+        <w:pStyle w:val="BodyText"/>
+      </w:pPr>
+      <w:r>
+        <w:t xml:space="preserve">Texto para colar:</w:t>
+      </w:r>
+    </w:p>
+    <w:p>
+      <w:pPr>
+        <w:pStyle w:val="BodyText"/>
+      </w:pPr>
+      <w:r>
+        <w:t xml:space="preserve">Institui a Rede Nacional de Ouvidorias de Serviços Penais - Renospen, como instância permanente de cooperação técnica, intercâmbio de informações e fortalecimento institucional das ouvidorias no sistema penal.</w:t>
+      </w:r>
+    </w:p>
+    <w:p>
+      <w:pPr>
+        <w:pStyle w:val="BodyText"/>
+      </w:pPr>
+      <w:r>
+        <w:t xml:space="preserve">Link:</w:t>
+      </w:r>
+    </w:p>
+    <w:p>
+      <w:pPr>
+        <w:pStyle w:val="BodyText"/>
+      </w:pPr>
+      <w:r>
+        <w:t xml:space="preserve">Acessar a Portaria (PDF)</w:t>
+      </w:r>
+    </w:p>
+    <w:p>
+      <w:pPr>
+        <w:pStyle w:val="BodyText"/>
+      </w:pPr>
+      <w:r>
+        <w:t xml:space="preserve">Arquivo:</w:t>
+      </w:r>
+    </w:p>
+    <w:p>
+      <w:pPr>
+        <w:pStyle w:val="BodyText"/>
+      </w:pPr>
+      <w:r>
+        <w:t xml:space="preserve">Subpages/Pena_justa/SEI_35032761_Portaria_549.pdf</w:t>
+      </w:r>
+    </w:p>
+    <w:p>
+      <w:pPr>
+        <w:pStyle w:val="BodyText"/>
+      </w:pPr>
+      <w:r>
+        <w:t xml:space="preserve">Seção:</w:t>
+      </w:r>
+    </w:p>
+    <w:p>
+      <w:pPr>
+        <w:pStyle w:val="BodyText"/>
+      </w:pPr>
+      <w:r>
+        <w:t xml:space="preserve">Documentos públicos de referência</w:t>
+      </w:r>
+    </w:p>
+    <w:p>
+      <w:pPr>
+        <w:pStyle w:val="BodyText"/>
+      </w:pPr>
+      <w:r>
+        <w:t xml:space="preserve">Links:</w:t>
+      </w:r>
+    </w:p>
+    <w:p>
+      <w:pPr>
+        <w:pStyle w:val="Compact"/>
+        <w:numPr>
+          <w:ilvl w:val="0"/>
+          <w:numId w:val="1012"/>
+        </w:numPr>
+      </w:pPr>
+      <w:r>
+        <w:t xml:space="preserve">Plano Nacional Pena Justa (PDF): Subpages/Pena_justa/Plano_Nacional_Pena_Justa.pdf</w:t>
+      </w:r>
+    </w:p>
+    <w:p>
+      <w:pPr>
+        <w:pStyle w:val="Compact"/>
+        <w:numPr>
+          <w:ilvl w:val="0"/>
+          <w:numId w:val="1012"/>
+        </w:numPr>
+      </w:pPr>
+      <w:r>
+        <w:t xml:space="preserve">10 coisas que você precisa saber sobre o Pena Justa (PDF): Subpages/Pena_justa/10_Coisas_que_você_precisa_saber_sobre_o_Pena_Justa.pdf</w:t>
+      </w:r>
+    </w:p>
+    <w:bookmarkEnd w:id="22"/>
+    <w:bookmarkStart w:id="23" w:name="X9010218d04cc9bed3b5085cf6721dd78b5ea4ec"/>
+    <w:p>
+      <w:pPr>
+        <w:pStyle w:val="Heading2"/>
+      </w:pPr>
+      <w:r>
+        <w:t xml:space="preserve">Subpágina 4 - Revista Brasileira de Execução Penal</w:t>
+      </w:r>
+    </w:p>
+    <w:p>
+      <w:pPr>
+        <w:pStyle w:val="FirstParagraph"/>
+      </w:pPr>
+      <w:r>
+        <w:t xml:space="preserve">Título da página:</w:t>
+      </w:r>
+    </w:p>
+    <w:p>
+      <w:pPr>
+        <w:pStyle w:val="BodyText"/>
+      </w:pPr>
+      <w:r>
+        <w:t xml:space="preserve">Revista Brasileira de Execução Penal</w:t>
+      </w:r>
+    </w:p>
+    <w:p>
+      <w:pPr>
+        <w:pStyle w:val="BodyText"/>
+      </w:pPr>
+      <w:r>
+        <w:t xml:space="preserve">Imagem de destaque:</w:t>
+      </w:r>
+    </w:p>
+    <w:p>
+      <w:pPr>
+        <w:pStyle w:val="BodyText"/>
+      </w:pPr>
+      <w:r>
+        <w:t xml:space="preserve">Documentação/Botao_RevistaBrasileira.png</w:t>
+      </w:r>
+    </w:p>
+    <w:p>
+      <w:pPr>
+        <w:pStyle w:val="BodyText"/>
+      </w:pPr>
+      <w:r>
+        <w:t xml:space="preserve">Texto alternativo sugerido:</w:t>
+      </w:r>
+    </w:p>
+    <w:p>
+      <w:pPr>
+        <w:pStyle w:val="BodyText"/>
+      </w:pPr>
+      <w:r>
+        <w:t xml:space="preserve">Botão institucional da Revista Brasileira de Execução Penal.</w:t>
+      </w:r>
+    </w:p>
+    <w:p>
+      <w:pPr>
+        <w:pStyle w:val="BodyText"/>
+      </w:pPr>
+      <w:r>
+        <w:t xml:space="preserve">Identificador editorial:</w:t>
+      </w:r>
+    </w:p>
+    <w:p>
+      <w:pPr>
+        <w:pStyle w:val="BodyText"/>
+      </w:pPr>
+      <w:r>
+        <w:t xml:space="preserve">Conteúdo Técnico e Projetos Estruturantes</w:t>
+      </w:r>
+    </w:p>
+    <w:p>
+      <w:pPr>
+        <w:pStyle w:val="BodyText"/>
+      </w:pPr>
+      <w:r>
+        <w:t xml:space="preserve">Texto de destaque:</w:t>
+      </w:r>
+    </w:p>
+    <w:p>
+      <w:pPr>
+        <w:pStyle w:val="BodyText"/>
+      </w:pPr>
+      <w:r>
+        <w:t xml:space="preserve">Em articulação com a Espen e a DCOM, esta subpágina reúne referências da Revista Brasileira de Execução Penal e destaca dossiês, notícias editoriais e conteúdos com interface com participação social, transparência e direitos no sistema penal.</w:t>
+      </w:r>
+    </w:p>
+    <w:p>
+      <w:pPr>
+        <w:pStyle w:val="BodyText"/>
+      </w:pPr>
+      <w:r>
+        <w:t xml:space="preserve">Seção:</w:t>
+      </w:r>
+    </w:p>
+    <w:p>
+      <w:pPr>
+        <w:pStyle w:val="BodyText"/>
+      </w:pPr>
+      <w:r>
+        <w:t xml:space="preserve">Escopo desta subpágina</w:t>
+      </w:r>
+    </w:p>
+    <w:p>
+      <w:pPr>
+        <w:pStyle w:val="BodyText"/>
+      </w:pPr>
+      <w:r>
+        <w:t xml:space="preserve">Texto para colar:</w:t>
+      </w:r>
+    </w:p>
+    <w:p>
+      <w:pPr>
+        <w:pStyle w:val="BodyText"/>
+      </w:pPr>
+      <w:r>
+        <w:t xml:space="preserve">A Revista Brasileira de Execução Penal é o periódico técnico-científico da Secretaria Nacional de Políticas Penais (Senappen/MJSP) e constitui espaço de circulação de artigos, documentos inéditos, entrevistas, relatos de experiência e boas práticas relacionados à execução penal.</w:t>
+      </w:r>
+    </w:p>
+    <w:p>
+      <w:pPr>
+        <w:pStyle w:val="BodyText"/>
+      </w:pPr>
+      <w:r>
+        <w:t xml:space="preserve">A segunda linha do escopo:</w:t>
+      </w:r>
+    </w:p>
+    <w:p>
+      <w:pPr>
+        <w:pStyle w:val="BodyText"/>
+      </w:pPr>
+      <w:r>
+        <w:t xml:space="preserve">No contexto da Ouvidoria, a publicação contribui para aproximar produção técnica, debate qualificado e controle social, reforçando o papel da Ouvidoria como ponte entre Estado e sociedade.</w:t>
+      </w:r>
+    </w:p>
+    <w:p>
+      <w:pPr>
+        <w:pStyle w:val="BodyText"/>
+      </w:pPr>
+      <w:r>
+        <w:t xml:space="preserve">Seção:</w:t>
+      </w:r>
+    </w:p>
+    <w:p>
+      <w:pPr>
+        <w:pStyle w:val="BodyText"/>
+      </w:pPr>
+      <w:r>
+        <w:t xml:space="preserve">Sobre a revista</w:t>
+      </w:r>
+    </w:p>
+    <w:p>
+      <w:pPr>
+        <w:pStyle w:val="BodyText"/>
+      </w:pPr>
+      <w:r>
+        <w:t xml:space="preserve">Texto para colar:</w:t>
+      </w:r>
+    </w:p>
+    <w:p>
+      <w:pPr>
+        <w:pStyle w:val="BodyText"/>
+      </w:pPr>
+      <w:r>
+        <w:t xml:space="preserve">A RBEP publica artigos, documentos inéditos, entrevistas, relatos de experiência e descrição de boas práticas que relacionam a experiência profissional, o conhecimento produzido sobre a matéria e o cumprimento da legislação nacional.</w:t>
+      </w:r>
+    </w:p>
+    <w:p>
+      <w:pPr>
+        <w:pStyle w:val="BodyText"/>
+      </w:pPr>
+      <w:r>
+        <w:t xml:space="preserve">A segunda linha da seção:</w:t>
+      </w:r>
+    </w:p>
+    <w:p>
+      <w:pPr>
+        <w:pStyle w:val="BodyText"/>
+      </w:pPr>
+      <w:r>
+        <w:t xml:space="preserve">Os conteúdos são organizados em dossiês temáticos semestrais, e a revista recebeu qualificação A4 na classificação de periódicos Qualis Capes na avaliação do quadriênio 2021-2024.</w:t>
+      </w:r>
+    </w:p>
+    <w:p>
+      <w:pPr>
+        <w:pStyle w:val="BodyText"/>
+      </w:pPr>
+      <w:r>
+        <w:t xml:space="preserve">Seção:</w:t>
+      </w:r>
+    </w:p>
+    <w:p>
+      <w:pPr>
+        <w:pStyle w:val="BodyText"/>
+      </w:pPr>
+      <w:r>
+        <w:t xml:space="preserve">Acesso oficial à RBEP</w:t>
+      </w:r>
+    </w:p>
+    <w:p>
+      <w:pPr>
+        <w:pStyle w:val="BodyText"/>
+      </w:pPr>
+      <w:r>
+        <w:t xml:space="preserve">Texto para colar:</w:t>
+      </w:r>
+    </w:p>
+    <w:p>
+      <w:pPr>
+        <w:pStyle w:val="BodyText"/>
+      </w:pPr>
+      <w:r>
+        <w:t xml:space="preserve">O portal oficial da revista reúne notícias, edição atual, arquivo de edições e informações para submissão de textos.</w:t>
+      </w:r>
+    </w:p>
+    <w:p>
+      <w:pPr>
+        <w:pStyle w:val="BodyText"/>
+      </w:pPr>
+      <w:r>
+        <w:t xml:space="preserve">Links:</w:t>
+      </w:r>
+    </w:p>
+    <w:p>
+      <w:pPr>
+        <w:pStyle w:val="Compact"/>
+        <w:numPr>
+          <w:ilvl w:val="0"/>
+          <w:numId w:val="1013"/>
+        </w:numPr>
+      </w:pPr>
+      <w:r>
+        <w:t xml:space="preserve">Portal oficial da Revista Brasileira de Execução Penal: https://rbepsenappen.mj.gov.br/index.php/RBEP/pt_BR</w:t>
+      </w:r>
+    </w:p>
+    <w:p>
+      <w:pPr>
+        <w:pStyle w:val="Compact"/>
+        <w:numPr>
+          <w:ilvl w:val="0"/>
+          <w:numId w:val="1013"/>
+        </w:numPr>
+      </w:pPr>
+      <w:r>
+        <w:t xml:space="preserve">Edição atual - edição completa: https://rbepsenappen.mj.gov.br/index.php/RBEP/pt_BR/issue/view/22/58</w:t>
+      </w:r>
+    </w:p>
+    <w:p>
+      <w:pPr>
+        <w:pStyle w:val="Compact"/>
+        <w:numPr>
+          <w:ilvl w:val="0"/>
+          <w:numId w:val="1013"/>
+        </w:numPr>
+      </w:pPr>
+      <w:r>
+        <w:t xml:space="preserve">Ver todas as edições: https://rbepsenappen.mj.gov.br/index.php/RBEP/pt_BR/issue/archive</w:t>
+      </w:r>
+    </w:p>
+    <w:p>
+      <w:pPr>
+        <w:pStyle w:val="Compact"/>
+        <w:numPr>
+          <w:ilvl w:val="0"/>
+          <w:numId w:val="1013"/>
+        </w:numPr>
+      </w:pPr>
+      <w:r>
+        <w:t xml:space="preserve">Enviar submissão: https://rbepsenappen.mj.gov.br/index.php/RBEP/pt_BR/about/submissions</w:t>
+      </w:r>
+    </w:p>
+    <w:p>
+      <w:pPr>
+        <w:pStyle w:val="FirstParagraph"/>
+      </w:pPr>
+      <w:r>
+        <w:t xml:space="preserve">Seção:</w:t>
+      </w:r>
+    </w:p>
+    <w:p>
+      <w:pPr>
+        <w:pStyle w:val="BodyText"/>
+      </w:pPr>
+      <w:r>
+        <w:t xml:space="preserve">Referências institucionais</w:t>
+      </w:r>
+    </w:p>
+    <w:p>
+      <w:pPr>
+        <w:pStyle w:val="BodyText"/>
+      </w:pPr>
+      <w:r>
+        <w:t xml:space="preserve">Itens para colar:</w:t>
+      </w:r>
+    </w:p>
+    <w:p>
+      <w:pPr>
+        <w:pStyle w:val="Compact"/>
+        <w:numPr>
+          <w:ilvl w:val="0"/>
+          <w:numId w:val="1014"/>
+        </w:numPr>
+      </w:pPr>
+      <w:r>
+        <w:t xml:space="preserve">Qualis Capes 2021-2024: A4.</w:t>
+      </w:r>
+    </w:p>
+    <w:p>
+      <w:pPr>
+        <w:pStyle w:val="Compact"/>
+        <w:numPr>
+          <w:ilvl w:val="0"/>
+          <w:numId w:val="1014"/>
+        </w:numPr>
+      </w:pPr>
+      <w:r>
+        <w:t xml:space="preserve">ISSN: 2675-1895.</w:t>
+      </w:r>
+    </w:p>
+    <w:p>
+      <w:pPr>
+        <w:pStyle w:val="Compact"/>
+        <w:numPr>
+          <w:ilvl w:val="0"/>
+          <w:numId w:val="1014"/>
+        </w:numPr>
+      </w:pPr>
+      <w:r>
+        <w:t xml:space="preserve">e-ISSN: 2675-1860.</w:t>
+      </w:r>
+    </w:p>
+    <w:p>
+      <w:pPr>
+        <w:pStyle w:val="Compact"/>
+        <w:numPr>
+          <w:ilvl w:val="0"/>
+          <w:numId w:val="1014"/>
         </w:numPr>
       </w:pPr>
       <w:r>
@@ -2794,6 +5281,18 @@
     <w:abstractNumId w:val="991"/>
   </w:num>
   <w:num w:numId="1010">
+    <w:abstractNumId w:val="991"/>
+  </w:num>
+  <w:num w:numId="1011">
+    <w:abstractNumId w:val="991"/>
+  </w:num>
+  <w:num w:numId="1012">
+    <w:abstractNumId w:val="991"/>
+  </w:num>
+  <w:num w:numId="1013">
+    <w:abstractNumId w:val="991"/>
+  </w:num>
+  <w:num w:numId="1014">
     <w:abstractNumId w:val="991"/>
   </w:num>
 </w:numbering>

</xml_diff>

<commit_message>
Remove notas internas da rede de ouvidorias
</commit_message>
<xml_diff>
--- a/Documentação/estrutura_completa_pagina_onasp_para_dicom.docx
+++ b/Documentação/estrutura_completa_pagina_onasp_para_dicom.docx
@@ -1331,7 +1331,7 @@
         <w:pStyle w:val="BodyText"/>
       </w:pPr>
       <w:r>
-        <w:t xml:space="preserve">Esta prévia passou a reunir, em um único ponto, os contatos informados pelas unidades da federação no Diagnóstico de Ouvidorias Estaduais. No ambiente de validação local, a consulta foi organizada por meio de um mapa visual com seleção por UF e painel lateral com dados resumidos da ouvidoria correspondente ou, quando cabível, das referências institucionais associadas à mesma unidade da federação.</w:t>
+        <w:t xml:space="preserve">Esta prévia reúne, em um único ponto, os contatos institucionais consolidados das unidades da federação. No ambiente de validação local, a consulta foi organizada por meio de um mapa visual com seleção por UF e painel lateral com dados resumidos da ouvidoria correspondente ou, quando cabível, das referências institucionais associadas à mesma unidade da federação.</w:t>
       </w:r>
     </w:p>
     <w:p>
@@ -1363,7 +1363,41 @@
         <w:pStyle w:val="BodyText"/>
       </w:pPr>
       <w:r>
-        <w:t xml:space="preserve">Fonte sugerida:</w:t>
+        <w:t xml:space="preserve">Regra editorial obrigatória:</w:t>
+      </w:r>
+    </w:p>
+    <w:p>
+      <w:pPr>
+        <w:pStyle w:val="BodyText"/>
+      </w:pPr>
+      <w:r>
+        <w:t xml:space="preserve">Detalhes de curadoria usados para consolidar os contatos devem permanecer apenas na documentação interna de trabalho. Não publicar na página expressões como</w:t>
+      </w:r>
+      <w:r>
+        <w:t xml:space="preserve"> </w:t>
+      </w:r>
+      <w:r>
+        <w:t xml:space="preserve">“o diagnóstico registrou”</w:t>
+      </w:r>
+      <w:r>
+        <w:t xml:space="preserve">,</w:t>
+      </w:r>
+      <w:r>
+        <w:t xml:space="preserve"> </w:t>
+      </w:r>
+      <w:r>
+        <w:t xml:space="preserve">“a resposta do diagnóstico informa”</w:t>
+      </w:r>
+      <w:r>
+        <w:t xml:space="preserve">, menções a respostas recebidas, observações internas de validação ou listas nominais de servidores designados.</w:t>
+      </w:r>
+    </w:p>
+    <w:p>
+      <w:pPr>
+        <w:pStyle w:val="BodyText"/>
+      </w:pPr>
+      <w:r>
+        <w:t xml:space="preserve">Base interna de consolidação (não publicar na página):</w:t>
       </w:r>
     </w:p>
     <w:p>
@@ -2515,7 +2549,7 @@
               <w:pStyle w:val="Compact"/>
             </w:pPr>
             <w:r>
-              <w:t xml:space="preserve">Destaque para o contato informado pela SIEDS; outra resposta do diagnóstico apontou ausência de ouvidoria constituída na SEAP/PA.</w:t>
+              <w:t xml:space="preserve">Contato institucional consolidado para consulta pública.</w:t>
             </w:r>
           </w:p>
         </w:tc>

</xml_diff>

<commit_message>
Renomeia secoes e atualiza documentacao
</commit_message>
<xml_diff>
--- a/Documentação/estrutura_completa_pagina_onasp_para_dicom.docx
+++ b/Documentação/estrutura_completa_pagina_onasp_para_dicom.docx
@@ -1155,7 +1155,7 @@
         <w:pStyle w:val="BodyText"/>
       </w:pPr>
       <w:r>
-        <w:t xml:space="preserve">Escopo desta subpágina</w:t>
+        <w:t xml:space="preserve">Renospen</w:t>
       </w:r>
     </w:p>
     <w:p>
@@ -4284,7 +4284,7 @@
         <w:pStyle w:val="BodyText"/>
       </w:pPr>
       <w:r>
-        <w:t xml:space="preserve">Escopo desta subpágina</w:t>
+        <w:t xml:space="preserve">O Plano</w:t>
       </w:r>
     </w:p>
     <w:p>
@@ -4774,7 +4774,7 @@
         <w:pStyle w:val="BodyText"/>
       </w:pPr>
       <w:r>
-        <w:t xml:space="preserve">Escopo desta subpágina</w:t>
+        <w:t xml:space="preserve">A Revista</w:t>
       </w:r>
     </w:p>
     <w:p>

</xml_diff>

<commit_message>
Adiciona encontro nacional na pagina Renospen
</commit_message>
<xml_diff>
--- a/Documentação/estrutura_completa_pagina_onasp_para_dicom.docx
+++ b/Documentação/estrutura_completa_pagina_onasp_para_dicom.docx
@@ -1305,6 +1305,159 @@
     <w:p>
       <w:pPr>
         <w:pStyle w:val="BodyText"/>
+      </w:pPr>
+      <w:r>
+        <w:t xml:space="preserve">Seção:</w:t>
+      </w:r>
+    </w:p>
+    <w:p>
+      <w:pPr>
+        <w:pStyle w:val="BodyText"/>
+      </w:pPr>
+      <w:r>
+        <w:t xml:space="preserve">VI Encontro Nacional das Ouvidorias do Sistema Penal</w:t>
+      </w:r>
+    </w:p>
+    <w:p>
+      <w:pPr>
+        <w:pStyle w:val="BodyText"/>
+      </w:pPr>
+      <w:r>
+        <w:t xml:space="preserve">Texto para colar:</w:t>
+      </w:r>
+    </w:p>
+    <w:p>
+      <w:pPr>
+        <w:pStyle w:val="BodyText"/>
+      </w:pPr>
+      <w:r>
+        <w:t xml:space="preserve">O VI Encontro Nacional das Ouvidorias do Sistema Penal, promovido pela Senappen entre 8 e 10 de abril, consolidou um novo marco para a gestão penitenciária com o lançamento da Rede Nacional de Ouvidorias de Serviços Penais (Renospen) e a publicação de uma Instrução Normativa para padronizar essas instâncias nos estados. Alinhado ao Plano Nacional Pena Justa, o evento focou no fortalecimento da transparência, do controle social e da promoção de direitos humanos, unificando diretrizes nacionais enquanto respeita as autonomias locais. Além dos painéis sobre gestão estratégica e escuta ética, a iniciativa contemplou a doação de equipamentos tecnológicos para todas as unidades federativas, visando modernizar o atendimento e estreitar a comunicação entre o sistema penal e a sociedade brasileira.</w:t>
+      </w:r>
+    </w:p>
+    <w:p>
+      <w:pPr>
+        <w:pStyle w:val="BodyText"/>
+      </w:pPr>
+      <w:r>
+        <w:t xml:space="preserve">Imagens a inserir:</w:t>
+      </w:r>
+    </w:p>
+    <w:p>
+      <w:pPr>
+        <w:pStyle w:val="Compact"/>
+        <w:numPr>
+          <w:ilvl w:val="0"/>
+          <w:numId w:val="1004"/>
+        </w:numPr>
+      </w:pPr>
+      <w:r>
+        <w:t xml:space="preserve">Documentação/Banner_Renospen_1.jpeg</w:t>
+      </w:r>
+    </w:p>
+    <w:p>
+      <w:pPr>
+        <w:pStyle w:val="Compact"/>
+        <w:numPr>
+          <w:ilvl w:val="0"/>
+          <w:numId w:val="1004"/>
+        </w:numPr>
+      </w:pPr>
+      <w:r>
+        <w:t xml:space="preserve">Documentação/Banner_Renospen_2.jpeg</w:t>
+      </w:r>
+    </w:p>
+    <w:p>
+      <w:pPr>
+        <w:pStyle w:val="Compact"/>
+        <w:numPr>
+          <w:ilvl w:val="0"/>
+          <w:numId w:val="1004"/>
+        </w:numPr>
+      </w:pPr>
+      <w:r>
+        <w:t xml:space="preserve">Documentação/Banner_Renospen_3.jpeg</w:t>
+      </w:r>
+    </w:p>
+    <w:p>
+      <w:pPr>
+        <w:pStyle w:val="FirstParagraph"/>
+      </w:pPr>
+      <w:r>
+        <w:t xml:space="preserve">Ordem e destaque sugeridos:</w:t>
+      </w:r>
+    </w:p>
+    <w:p>
+      <w:pPr>
+        <w:pStyle w:val="Compact"/>
+        <w:numPr>
+          <w:ilvl w:val="0"/>
+          <w:numId w:val="1005"/>
+        </w:numPr>
+      </w:pPr>
+      <w:r>
+        <w:t xml:space="preserve">usar</w:t>
+      </w:r>
+      <w:r>
+        <w:t xml:space="preserve"> </w:t>
+      </w:r>
+      <w:r>
+        <w:rPr>
+          <w:rStyle w:val="VerbatimChar"/>
+        </w:rPr>
+        <w:t xml:space="preserve">Banner_Renospen_1.jpeg</w:t>
+      </w:r>
+      <w:r>
+        <w:t xml:space="preserve"> </w:t>
+      </w:r>
+      <w:r>
+        <w:t xml:space="preserve">em destaque, na largura principal do bloco;</w:t>
+      </w:r>
+    </w:p>
+    <w:p>
+      <w:pPr>
+        <w:pStyle w:val="Compact"/>
+        <w:numPr>
+          <w:ilvl w:val="0"/>
+          <w:numId w:val="1005"/>
+        </w:numPr>
+      </w:pPr>
+      <w:r>
+        <w:t xml:space="preserve">posicionar</w:t>
+      </w:r>
+      <w:r>
+        <w:t xml:space="preserve"> </w:t>
+      </w:r>
+      <w:r>
+        <w:rPr>
+          <w:rStyle w:val="VerbatimChar"/>
+        </w:rPr>
+        <w:t xml:space="preserve">Banner_Renospen_2.jpeg</w:t>
+      </w:r>
+      <w:r>
+        <w:t xml:space="preserve"> </w:t>
+      </w:r>
+      <w:r>
+        <w:t xml:space="preserve">e</w:t>
+      </w:r>
+      <w:r>
+        <w:t xml:space="preserve"> </w:t>
+      </w:r>
+      <w:r>
+        <w:rPr>
+          <w:rStyle w:val="VerbatimChar"/>
+        </w:rPr>
+        <w:t xml:space="preserve">Banner_Renospen_3.jpeg</w:t>
+      </w:r>
+      <w:r>
+        <w:t xml:space="preserve"> </w:t>
+      </w:r>
+      <w:r>
+        <w:t xml:space="preserve">logo abaixo, lado a lado, mantendo a sequência numérica.</w:t>
+      </w:r>
+    </w:p>
+    <w:p>
+      <w:pPr>
+        <w:pStyle w:val="FirstParagraph"/>
       </w:pPr>
       <w:r>
         <w:t xml:space="preserve">Seção:</w:t>
@@ -3484,349 +3637,11 @@
         <w:pStyle w:val="Compact"/>
         <w:numPr>
           <w:ilvl w:val="0"/>
-          <w:numId w:val="1004"/>
+          <w:numId w:val="1006"/>
         </w:numPr>
       </w:pPr>
       <w:r>
         <w:t xml:space="preserve">Clique e acesse a Instrução Normativa nº 75/2026: Subpages/Pena_justa/SEI_35153985_Instrucao_Normativa_75.pdf</w:t>
-      </w:r>
-    </w:p>
-    <w:p>
-      <w:pPr>
-        <w:pStyle w:val="Compact"/>
-        <w:numPr>
-          <w:ilvl w:val="0"/>
-          <w:numId w:val="1004"/>
-        </w:numPr>
-      </w:pPr>
-      <w:r>
-        <w:t xml:space="preserve">Clique e acesse a Portaria nº 549/2026 - Renospen: Subpages/Pena_justa/SEI_35032761_Portaria_549.pdf</w:t>
-      </w:r>
-    </w:p>
-    <w:p>
-      <w:pPr>
-        <w:pStyle w:val="Compact"/>
-        <w:numPr>
-          <w:ilvl w:val="0"/>
-          <w:numId w:val="1004"/>
-        </w:numPr>
-      </w:pPr>
-      <w:r>
-        <w:t xml:space="preserve">Clique e acesse o Plano Nacional Pena Justa: Subpages/Pena_justa/Plano_Nacional_Pena_Justa.pdf</w:t>
-      </w:r>
-    </w:p>
-    <w:bookmarkEnd w:id="20"/>
-    <w:bookmarkStart w:id="21" w:name="subpágina-2---ema---senappen"/>
-    <w:p>
-      <w:pPr>
-        <w:pStyle w:val="Heading2"/>
-      </w:pPr>
-      <w:r>
-        <w:t xml:space="preserve">Subpágina 2 - EMA - SENAPPEN</w:t>
-      </w:r>
-    </w:p>
-    <w:p>
-      <w:pPr>
-        <w:pStyle w:val="FirstParagraph"/>
-      </w:pPr>
-      <w:r>
-        <w:t xml:space="preserve">Título da página:</w:t>
-      </w:r>
-    </w:p>
-    <w:p>
-      <w:pPr>
-        <w:pStyle w:val="BodyText"/>
-      </w:pPr>
-      <w:r>
-        <w:t xml:space="preserve">EMA - SENAPPEN</w:t>
-      </w:r>
-    </w:p>
-    <w:p>
-      <w:pPr>
-        <w:pStyle w:val="BodyText"/>
-      </w:pPr>
-      <w:r>
-        <w:t xml:space="preserve">Imagem de destaque:</w:t>
-      </w:r>
-    </w:p>
-    <w:p>
-      <w:pPr>
-        <w:pStyle w:val="BodyText"/>
-      </w:pPr>
-      <w:r>
-        <w:t xml:space="preserve">Documentação/Botao_EMA.png</w:t>
-      </w:r>
-    </w:p>
-    <w:p>
-      <w:pPr>
-        <w:pStyle w:val="BodyText"/>
-      </w:pPr>
-      <w:r>
-        <w:t xml:space="preserve">Texto alternativo sugerido:</w:t>
-      </w:r>
-    </w:p>
-    <w:p>
-      <w:pPr>
-        <w:pStyle w:val="BodyText"/>
-      </w:pPr>
-      <w:r>
-        <w:t xml:space="preserve">Botão institucional da EMA - SENAPPEN.</w:t>
-      </w:r>
-    </w:p>
-    <w:p>
-      <w:pPr>
-        <w:pStyle w:val="BodyText"/>
-      </w:pPr>
-      <w:r>
-        <w:t xml:space="preserve">Identificador editorial:</w:t>
-      </w:r>
-    </w:p>
-    <w:p>
-      <w:pPr>
-        <w:pStyle w:val="BodyText"/>
-      </w:pPr>
-      <w:r>
-        <w:t xml:space="preserve">Conteúdo Técnico e Projetos Estruturantes</w:t>
-      </w:r>
-    </w:p>
-    <w:p>
-      <w:pPr>
-        <w:pStyle w:val="BodyText"/>
-      </w:pPr>
-      <w:r>
-        <w:t xml:space="preserve">Texto de destaque:</w:t>
-      </w:r>
-    </w:p>
-    <w:p>
-      <w:pPr>
-        <w:pStyle w:val="BodyText"/>
-      </w:pPr>
-      <w:r>
-        <w:t xml:space="preserve">Espaço da Equipe de Monitoramento e Acompanhamento das decisões e deliberações do Sistema Interamericano de Direitos Humanos em face do sistema penal nacional, dedicado a fortalecer o cumprimento das determinações do SIDH em parceria com as Unidades Federativas.</w:t>
-      </w:r>
-    </w:p>
-    <w:p>
-      <w:pPr>
-        <w:pStyle w:val="BodyText"/>
-      </w:pPr>
-      <w:r>
-        <w:t xml:space="preserve">Seção:</w:t>
-      </w:r>
-    </w:p>
-    <w:p>
-      <w:pPr>
-        <w:pStyle w:val="BodyText"/>
-      </w:pPr>
-      <w:r>
-        <w:t xml:space="preserve">Institucional</w:t>
-      </w:r>
-    </w:p>
-    <w:p>
-      <w:pPr>
-        <w:pStyle w:val="BodyText"/>
-      </w:pPr>
-      <w:r>
-        <w:t xml:space="preserve">Imagem complementar opcional:</w:t>
-      </w:r>
-    </w:p>
-    <w:p>
-      <w:pPr>
-        <w:pStyle w:val="BodyText"/>
-      </w:pPr>
-      <w:r>
-        <w:t xml:space="preserve">Documentação/Banner_Ema_Organograma.png</w:t>
-      </w:r>
-    </w:p>
-    <w:p>
-      <w:pPr>
-        <w:pStyle w:val="BodyText"/>
-      </w:pPr>
-      <w:r>
-        <w:t xml:space="preserve">Texto alternativo sugerido:</w:t>
-      </w:r>
-    </w:p>
-    <w:p>
-      <w:pPr>
-        <w:pStyle w:val="BodyText"/>
-      </w:pPr>
-      <w:r>
-        <w:t xml:space="preserve">Organograma da EMA - SENAPPEN.</w:t>
-      </w:r>
-    </w:p>
-    <w:p>
-      <w:pPr>
-        <w:pStyle w:val="BodyText"/>
-      </w:pPr>
-      <w:r>
-        <w:t xml:space="preserve">Texto para colar:</w:t>
-      </w:r>
-    </w:p>
-    <w:p>
-      <w:pPr>
-        <w:pStyle w:val="BodyText"/>
-      </w:pPr>
-      <w:r>
-        <w:t xml:space="preserve">A EMA-SENAPPEN foi instituída, inicialmente, pela Portaria GABSEC/SENAPPEN/MJSP Nº 350, de 13 de junho de 2024, em um esforço de integrar a Secretaria Nacional de Políticas Penais ao processo de cumprimento das decisões do SIDH, dado seu rol de competências, em especial, a previsão de prestar apoio técnico aos entes federativos quanto à implementação dos princípios e das regras da execução penal.</w:t>
-      </w:r>
-    </w:p>
-    <w:p>
-      <w:pPr>
-        <w:pStyle w:val="BodyText"/>
-      </w:pPr>
-      <w:r>
-        <w:t xml:space="preserve">A segunda linha da seção:</w:t>
-      </w:r>
-    </w:p>
-    <w:p>
-      <w:pPr>
-        <w:pStyle w:val="BodyText"/>
-      </w:pPr>
-      <w:r>
-        <w:t xml:space="preserve">A estrutura da EMA foi alterada em 2025, mediante as Portarias GABSEC/SENAPPEN/MJSP Nº 511, de 13 de outubro de 2025, e Portaria de Pessoal GABSEC/SENAPPEN/MJSP Nº 93, de 10 de março de 2026, as quais possuíam por objetivo o aprimoramento da sua composição institucional, conforme o organograma a seguir:</w:t>
-      </w:r>
-    </w:p>
-    <w:p>
-      <w:pPr>
-        <w:pStyle w:val="BodyText"/>
-      </w:pPr>
-      <w:r>
-        <w:t xml:space="preserve">Seção:</w:t>
-      </w:r>
-    </w:p>
-    <w:p>
-      <w:pPr>
-        <w:pStyle w:val="BodyText"/>
-      </w:pPr>
-      <w:r>
-        <w:t xml:space="preserve">Frentes de Atuação</w:t>
-      </w:r>
-    </w:p>
-    <w:p>
-      <w:pPr>
-        <w:pStyle w:val="BodyText"/>
-      </w:pPr>
-      <w:r>
-        <w:t xml:space="preserve">Itens para colar:</w:t>
-      </w:r>
-    </w:p>
-    <w:p>
-      <w:pPr>
-        <w:pStyle w:val="Compact"/>
-        <w:numPr>
-          <w:ilvl w:val="0"/>
-          <w:numId w:val="1005"/>
-        </w:numPr>
-      </w:pPr>
-      <w:r>
-        <w:t xml:space="preserve">Monitorar e acompanhar as estratégias adotadas pelo Estado Brasileiro para o cumprimento das decisões do SIDH em relação ao sistema penal.</w:t>
-      </w:r>
-    </w:p>
-    <w:p>
-      <w:pPr>
-        <w:pStyle w:val="Compact"/>
-        <w:numPr>
-          <w:ilvl w:val="0"/>
-          <w:numId w:val="1005"/>
-        </w:numPr>
-      </w:pPr>
-      <w:r>
-        <w:t xml:space="preserve">Prevenir e evitar possíveis condenações.</w:t>
-      </w:r>
-    </w:p>
-    <w:p>
-      <w:pPr>
-        <w:pStyle w:val="Compact"/>
-        <w:numPr>
-          <w:ilvl w:val="0"/>
-          <w:numId w:val="1005"/>
-        </w:numPr>
-      </w:pPr>
-      <w:r>
-        <w:t xml:space="preserve">Propagar a cultura de Direitos Humanos, fomentando a aplicação dos Tratados Internacionais sobre a matéria de Direito Penal pelos gestores do sistema penal nacional.</w:t>
-      </w:r>
-    </w:p>
-    <w:p>
-      <w:pPr>
-        <w:pStyle w:val="Compact"/>
-        <w:numPr>
-          <w:ilvl w:val="0"/>
-          <w:numId w:val="1005"/>
-        </w:numPr>
-      </w:pPr>
-      <w:r>
-        <w:t xml:space="preserve">Fortalecer o diálogo entre a proteção de direitos e a governança no sistema penal.</w:t>
-      </w:r>
-    </w:p>
-    <w:p>
-      <w:pPr>
-        <w:pStyle w:val="FirstParagraph"/>
-      </w:pPr>
-      <w:r>
-        <w:t xml:space="preserve">Texto complementar da seção:</w:t>
-      </w:r>
-    </w:p>
-    <w:p>
-      <w:pPr>
-        <w:pStyle w:val="BodyText"/>
-      </w:pPr>
-      <w:r>
-        <w:t xml:space="preserve">Cabe citar a aproximação institucional e a construção de diálogo com órgãos-chave desse processo de monitoramento, como o Ministério das Relações Exteriores, o Ministério dos Direitos Humanos e da Cidadania e o Conselho Nacional de Justiça.</w:t>
-      </w:r>
-    </w:p>
-    <w:p>
-      <w:pPr>
-        <w:pStyle w:val="BodyText"/>
-      </w:pPr>
-      <w:r>
-        <w:t xml:space="preserve">Seção:</w:t>
-      </w:r>
-    </w:p>
-    <w:p>
-      <w:pPr>
-        <w:pStyle w:val="BodyText"/>
-      </w:pPr>
-      <w:r>
-        <w:t xml:space="preserve">Atuação institucional em 2025</w:t>
-      </w:r>
-    </w:p>
-    <w:p>
-      <w:pPr>
-        <w:pStyle w:val="BodyText"/>
-      </w:pPr>
-      <w:r>
-        <w:t xml:space="preserve">Texto para colar:</w:t>
-      </w:r>
-    </w:p>
-    <w:p>
-      <w:pPr>
-        <w:pStyle w:val="BodyText"/>
-      </w:pPr>
-      <w:r>
-        <w:t xml:space="preserve">Em 2025, a EMA/Senappen intensificou o acompanhamento do Sistema Interamericano de Direitos Humanos com foco em decisões, deliberações e medidas com repercussão sobre o sistema penal brasileiro. A atuação combinou articulação interinstitucional, monitoramento técnico e apoio à consolidação de respostas coordenadas do Estado.</w:t>
-      </w:r>
-    </w:p>
-    <w:p>
-      <w:pPr>
-        <w:pStyle w:val="BodyText"/>
-      </w:pPr>
-      <w:r>
-        <w:t xml:space="preserve">A segunda linha da seção:</w:t>
-      </w:r>
-    </w:p>
-    <w:p>
-      <w:pPr>
-        <w:pStyle w:val="BodyText"/>
-      </w:pPr>
-      <w:r>
-        <w:t xml:space="preserve">Nesse período, a equipe ampliou sua participação em agendas voltadas ao acompanhamento de casos perante a Corte Interamericana de Direitos Humanos e ao fortalecimento de mecanismos permanentes de monitoramento no âmbito da política penal.</w:t>
-      </w:r>
-    </w:p>
-    <w:p>
-      <w:pPr>
-        <w:pStyle w:val="BodyText"/>
-      </w:pPr>
-      <w:r>
-        <w:t xml:space="preserve">Imagens complementares opcionais:</w:t>
       </w:r>
     </w:p>
     <w:p>
@@ -3838,7 +3653,7 @@
         </w:numPr>
       </w:pPr>
       <w:r>
-        <w:t xml:space="preserve">Documentação/Banner_Ema.jpg</w:t>
+        <w:t xml:space="preserve">Clique e acesse a Portaria nº 549/2026 - Renospen: Subpages/Pena_justa/SEI_35032761_Portaria_549.pdf</w:t>
       </w:r>
     </w:p>
     <w:p>
@@ -3850,7 +3665,17 @@
         </w:numPr>
       </w:pPr>
       <w:r>
-        <w:t xml:space="preserve">Documentação/Banner_Ema_2.jpg</w:t>
+        <w:t xml:space="preserve">Clique e acesse o Plano Nacional Pena Justa: Subpages/Pena_justa/Plano_Nacional_Pena_Justa.pdf</w:t>
+      </w:r>
+    </w:p>
+    <w:bookmarkEnd w:id="20"/>
+    <w:bookmarkStart w:id="21" w:name="subpágina-2---ema---senappen"/>
+    <w:p>
+      <w:pPr>
+        <w:pStyle w:val="Heading2"/>
+      </w:pPr>
+      <w:r>
+        <w:t xml:space="preserve">Subpágina 2 - EMA - SENAPPEN</w:t>
       </w:r>
     </w:p>
     <w:p>
@@ -3858,7 +3683,183 @@
         <w:pStyle w:val="FirstParagraph"/>
       </w:pPr>
       <w:r>
-        <w:t xml:space="preserve">Textos alternativos sugeridos:</w:t>
+        <w:t xml:space="preserve">Título da página:</w:t>
+      </w:r>
+    </w:p>
+    <w:p>
+      <w:pPr>
+        <w:pStyle w:val="BodyText"/>
+      </w:pPr>
+      <w:r>
+        <w:t xml:space="preserve">EMA - SENAPPEN</w:t>
+      </w:r>
+    </w:p>
+    <w:p>
+      <w:pPr>
+        <w:pStyle w:val="BodyText"/>
+      </w:pPr>
+      <w:r>
+        <w:t xml:space="preserve">Imagem de destaque:</w:t>
+      </w:r>
+    </w:p>
+    <w:p>
+      <w:pPr>
+        <w:pStyle w:val="BodyText"/>
+      </w:pPr>
+      <w:r>
+        <w:t xml:space="preserve">Documentação/Botao_EMA.png</w:t>
+      </w:r>
+    </w:p>
+    <w:p>
+      <w:pPr>
+        <w:pStyle w:val="BodyText"/>
+      </w:pPr>
+      <w:r>
+        <w:t xml:space="preserve">Texto alternativo sugerido:</w:t>
+      </w:r>
+    </w:p>
+    <w:p>
+      <w:pPr>
+        <w:pStyle w:val="BodyText"/>
+      </w:pPr>
+      <w:r>
+        <w:t xml:space="preserve">Botão institucional da EMA - SENAPPEN.</w:t>
+      </w:r>
+    </w:p>
+    <w:p>
+      <w:pPr>
+        <w:pStyle w:val="BodyText"/>
+      </w:pPr>
+      <w:r>
+        <w:t xml:space="preserve">Identificador editorial:</w:t>
+      </w:r>
+    </w:p>
+    <w:p>
+      <w:pPr>
+        <w:pStyle w:val="BodyText"/>
+      </w:pPr>
+      <w:r>
+        <w:t xml:space="preserve">Conteúdo Técnico e Projetos Estruturantes</w:t>
+      </w:r>
+    </w:p>
+    <w:p>
+      <w:pPr>
+        <w:pStyle w:val="BodyText"/>
+      </w:pPr>
+      <w:r>
+        <w:t xml:space="preserve">Texto de destaque:</w:t>
+      </w:r>
+    </w:p>
+    <w:p>
+      <w:pPr>
+        <w:pStyle w:val="BodyText"/>
+      </w:pPr>
+      <w:r>
+        <w:t xml:space="preserve">Espaço da Equipe de Monitoramento e Acompanhamento das decisões e deliberações do Sistema Interamericano de Direitos Humanos em face do sistema penal nacional, dedicado a fortalecer o cumprimento das determinações do SIDH em parceria com as Unidades Federativas.</w:t>
+      </w:r>
+    </w:p>
+    <w:p>
+      <w:pPr>
+        <w:pStyle w:val="BodyText"/>
+      </w:pPr>
+      <w:r>
+        <w:t xml:space="preserve">Seção:</w:t>
+      </w:r>
+    </w:p>
+    <w:p>
+      <w:pPr>
+        <w:pStyle w:val="BodyText"/>
+      </w:pPr>
+      <w:r>
+        <w:t xml:space="preserve">Institucional</w:t>
+      </w:r>
+    </w:p>
+    <w:p>
+      <w:pPr>
+        <w:pStyle w:val="BodyText"/>
+      </w:pPr>
+      <w:r>
+        <w:t xml:space="preserve">Imagem complementar opcional:</w:t>
+      </w:r>
+    </w:p>
+    <w:p>
+      <w:pPr>
+        <w:pStyle w:val="BodyText"/>
+      </w:pPr>
+      <w:r>
+        <w:t xml:space="preserve">Documentação/Banner_Ema_Organograma.png</w:t>
+      </w:r>
+    </w:p>
+    <w:p>
+      <w:pPr>
+        <w:pStyle w:val="BodyText"/>
+      </w:pPr>
+      <w:r>
+        <w:t xml:space="preserve">Texto alternativo sugerido:</w:t>
+      </w:r>
+    </w:p>
+    <w:p>
+      <w:pPr>
+        <w:pStyle w:val="BodyText"/>
+      </w:pPr>
+      <w:r>
+        <w:t xml:space="preserve">Organograma da EMA - SENAPPEN.</w:t>
+      </w:r>
+    </w:p>
+    <w:p>
+      <w:pPr>
+        <w:pStyle w:val="BodyText"/>
+      </w:pPr>
+      <w:r>
+        <w:t xml:space="preserve">Texto para colar:</w:t>
+      </w:r>
+    </w:p>
+    <w:p>
+      <w:pPr>
+        <w:pStyle w:val="BodyText"/>
+      </w:pPr>
+      <w:r>
+        <w:t xml:space="preserve">A EMA-SENAPPEN foi instituída, inicialmente, pela Portaria GABSEC/SENAPPEN/MJSP Nº 350, de 13 de junho de 2024, em um esforço de integrar a Secretaria Nacional de Políticas Penais ao processo de cumprimento das decisões do SIDH, dado seu rol de competências, em especial, a previsão de prestar apoio técnico aos entes federativos quanto à implementação dos princípios e das regras da execução penal.</w:t>
+      </w:r>
+    </w:p>
+    <w:p>
+      <w:pPr>
+        <w:pStyle w:val="BodyText"/>
+      </w:pPr>
+      <w:r>
+        <w:t xml:space="preserve">A segunda linha da seção:</w:t>
+      </w:r>
+    </w:p>
+    <w:p>
+      <w:pPr>
+        <w:pStyle w:val="BodyText"/>
+      </w:pPr>
+      <w:r>
+        <w:t xml:space="preserve">A estrutura da EMA foi alterada em 2025, mediante as Portarias GABSEC/SENAPPEN/MJSP Nº 511, de 13 de outubro de 2025, e Portaria de Pessoal GABSEC/SENAPPEN/MJSP Nº 93, de 10 de março de 2026, as quais possuíam por objetivo o aprimoramento da sua composição institucional, conforme o organograma a seguir:</w:t>
+      </w:r>
+    </w:p>
+    <w:p>
+      <w:pPr>
+        <w:pStyle w:val="BodyText"/>
+      </w:pPr>
+      <w:r>
+        <w:t xml:space="preserve">Seção:</w:t>
+      </w:r>
+    </w:p>
+    <w:p>
+      <w:pPr>
+        <w:pStyle w:val="BodyText"/>
+      </w:pPr>
+      <w:r>
+        <w:t xml:space="preserve">Frentes de Atuação</w:t>
+      </w:r>
+    </w:p>
+    <w:p>
+      <w:pPr>
+        <w:pStyle w:val="BodyText"/>
+      </w:pPr>
+      <w:r>
+        <w:t xml:space="preserve">Itens para colar:</w:t>
       </w:r>
     </w:p>
     <w:p>
@@ -3870,7 +3871,7 @@
         </w:numPr>
       </w:pPr>
       <w:r>
-        <w:t xml:space="preserve">Participantes reunidos em mesa de trabalho institucional acompanhada pela EMA - SENAPPEN.</w:t>
+        <w:t xml:space="preserve">Monitorar e acompanhar as estratégias adotadas pelo Estado Brasileiro para o cumprimento das decisões do SIDH em relação ao sistema penal.</w:t>
       </w:r>
     </w:p>
     <w:p>
@@ -3882,7 +3883,31 @@
         </w:numPr>
       </w:pPr>
       <w:r>
-        <w:t xml:space="preserve">Participantes posicionados em registro oficial de agenda institucional acompanhada pela EMA - SENAPPEN.</w:t>
+        <w:t xml:space="preserve">Prevenir e evitar possíveis condenações.</w:t>
+      </w:r>
+    </w:p>
+    <w:p>
+      <w:pPr>
+        <w:pStyle w:val="Compact"/>
+        <w:numPr>
+          <w:ilvl w:val="0"/>
+          <w:numId w:val="1007"/>
+        </w:numPr>
+      </w:pPr>
+      <w:r>
+        <w:t xml:space="preserve">Propagar a cultura de Direitos Humanos, fomentando a aplicação dos Tratados Internacionais sobre a matéria de Direito Penal pelos gestores do sistema penal nacional.</w:t>
+      </w:r>
+    </w:p>
+    <w:p>
+      <w:pPr>
+        <w:pStyle w:val="Compact"/>
+        <w:numPr>
+          <w:ilvl w:val="0"/>
+          <w:numId w:val="1007"/>
+        </w:numPr>
+      </w:pPr>
+      <w:r>
+        <w:t xml:space="preserve">Fortalecer o diálogo entre a proteção de direitos e a governança no sistema penal.</w:t>
       </w:r>
     </w:p>
     <w:p>
@@ -3890,7 +3915,71 @@
         <w:pStyle w:val="FirstParagraph"/>
       </w:pPr>
       <w:r>
-        <w:t xml:space="preserve">Legendas sugeridas:</w:t>
+        <w:t xml:space="preserve">Texto complementar da seção:</w:t>
+      </w:r>
+    </w:p>
+    <w:p>
+      <w:pPr>
+        <w:pStyle w:val="BodyText"/>
+      </w:pPr>
+      <w:r>
+        <w:t xml:space="preserve">Cabe citar a aproximação institucional e a construção de diálogo com órgãos-chave desse processo de monitoramento, como o Ministério das Relações Exteriores, o Ministério dos Direitos Humanos e da Cidadania e o Conselho Nacional de Justiça.</w:t>
+      </w:r>
+    </w:p>
+    <w:p>
+      <w:pPr>
+        <w:pStyle w:val="BodyText"/>
+      </w:pPr>
+      <w:r>
+        <w:t xml:space="preserve">Seção:</w:t>
+      </w:r>
+    </w:p>
+    <w:p>
+      <w:pPr>
+        <w:pStyle w:val="BodyText"/>
+      </w:pPr>
+      <w:r>
+        <w:t xml:space="preserve">Atuação institucional em 2025</w:t>
+      </w:r>
+    </w:p>
+    <w:p>
+      <w:pPr>
+        <w:pStyle w:val="BodyText"/>
+      </w:pPr>
+      <w:r>
+        <w:t xml:space="preserve">Texto para colar:</w:t>
+      </w:r>
+    </w:p>
+    <w:p>
+      <w:pPr>
+        <w:pStyle w:val="BodyText"/>
+      </w:pPr>
+      <w:r>
+        <w:t xml:space="preserve">Em 2025, a EMA/Senappen intensificou o acompanhamento do Sistema Interamericano de Direitos Humanos com foco em decisões, deliberações e medidas com repercussão sobre o sistema penal brasileiro. A atuação combinou articulação interinstitucional, monitoramento técnico e apoio à consolidação de respostas coordenadas do Estado.</w:t>
+      </w:r>
+    </w:p>
+    <w:p>
+      <w:pPr>
+        <w:pStyle w:val="BodyText"/>
+      </w:pPr>
+      <w:r>
+        <w:t xml:space="preserve">A segunda linha da seção:</w:t>
+      </w:r>
+    </w:p>
+    <w:p>
+      <w:pPr>
+        <w:pStyle w:val="BodyText"/>
+      </w:pPr>
+      <w:r>
+        <w:t xml:space="preserve">Nesse período, a equipe ampliou sua participação em agendas voltadas ao acompanhamento de casos perante a Corte Interamericana de Direitos Humanos e ao fortalecimento de mecanismos permanentes de monitoramento no âmbito da política penal.</w:t>
+      </w:r>
+    </w:p>
+    <w:p>
+      <w:pPr>
+        <w:pStyle w:val="BodyText"/>
+      </w:pPr>
+      <w:r>
+        <w:t xml:space="preserve">Imagens complementares opcionais:</w:t>
       </w:r>
     </w:p>
     <w:p>
@@ -3902,7 +3991,7 @@
         </w:numPr>
       </w:pPr>
       <w:r>
-        <w:t xml:space="preserve">Reunião institucional acompanhada pela EMA - SENAPPEN.</w:t>
+        <w:t xml:space="preserve">Documentação/Banner_Ema.jpg</w:t>
       </w:r>
     </w:p>
     <w:p>
@@ -3914,7 +4003,7 @@
         </w:numPr>
       </w:pPr>
       <w:r>
-        <w:t xml:space="preserve">Registro oficial de agenda institucional da EMA - SENAPPEN.</w:t>
+        <w:t xml:space="preserve">Documentação/Banner_Ema_2.jpg</w:t>
       </w:r>
     </w:p>
     <w:p>
@@ -3922,71 +4011,7 @@
         <w:pStyle w:val="FirstParagraph"/>
       </w:pPr>
       <w:r>
-        <w:t xml:space="preserve">Seção:</w:t>
-      </w:r>
-    </w:p>
-    <w:p>
-      <w:pPr>
-        <w:pStyle w:val="BodyText"/>
-      </w:pPr>
-      <w:r>
-        <w:t xml:space="preserve">Caso Pedrinhas</w:t>
-      </w:r>
-    </w:p>
-    <w:p>
-      <w:pPr>
-        <w:pStyle w:val="BodyText"/>
-      </w:pPr>
-      <w:r>
-        <w:t xml:space="preserve">Texto para colar:</w:t>
-      </w:r>
-    </w:p>
-    <w:p>
-      <w:pPr>
-        <w:pStyle w:val="BodyText"/>
-      </w:pPr>
-      <w:r>
-        <w:t xml:space="preserve">Em 21 de outubro de 2025, a EMA-SENAPPEN foi convocada a participar, juntamente a outros órgãos representantes do Estado Brasileiro, da audiência privada solicitada pela Corte Interamericana de Direitos Humanos sobre as Medidas Provisórias outorgadas no Caso do Complexo Penitenciário de São Luís, Maranhão (Caso Pedrinhas).</w:t>
-      </w:r>
-    </w:p>
-    <w:p>
-      <w:pPr>
-        <w:pStyle w:val="BodyText"/>
-      </w:pPr>
-      <w:r>
-        <w:t xml:space="preserve">A segunda linha da seção:</w:t>
-      </w:r>
-    </w:p>
-    <w:p>
-      <w:pPr>
-        <w:pStyle w:val="BodyText"/>
-      </w:pPr>
-      <w:r>
-        <w:t xml:space="preserve">Como desdobramento da audiência, a Equipe ficou responsável por coordenar uma mesa de trabalho voltada à elaboração de um plano de cumprimento conjunto, com foco no enfrentamento das fragilidades ainda identificadas no Caso.</w:t>
-      </w:r>
-    </w:p>
-    <w:p>
-      <w:pPr>
-        <w:pStyle w:val="BodyText"/>
-      </w:pPr>
-      <w:r>
-        <w:t xml:space="preserve">Subseção:</w:t>
-      </w:r>
-    </w:p>
-    <w:p>
-      <w:pPr>
-        <w:pStyle w:val="BodyText"/>
-      </w:pPr>
-      <w:r>
-        <w:t xml:space="preserve">Eixos priorizados</w:t>
-      </w:r>
-    </w:p>
-    <w:p>
-      <w:pPr>
-        <w:pStyle w:val="BodyText"/>
-      </w:pPr>
-      <w:r>
-        <w:t xml:space="preserve">Itens para colar:</w:t>
+        <w:t xml:space="preserve">Textos alternativos sugeridos:</w:t>
       </w:r>
     </w:p>
     <w:p>
@@ -3998,7 +4023,7 @@
         </w:numPr>
       </w:pPr>
       <w:r>
-        <w:t xml:space="preserve">Superlotação e ambiência no sistema prisional.</w:t>
+        <w:t xml:space="preserve">Participantes reunidos em mesa de trabalho institucional acompanhada pela EMA - SENAPPEN.</w:t>
       </w:r>
     </w:p>
     <w:p>
@@ -4010,31 +4035,7 @@
         </w:numPr>
       </w:pPr>
       <w:r>
-        <w:t xml:space="preserve">Dignidade e condições de custódia.</w:t>
-      </w:r>
-    </w:p>
-    <w:p>
-      <w:pPr>
-        <w:pStyle w:val="Compact"/>
-        <w:numPr>
-          <w:ilvl w:val="0"/>
-          <w:numId w:val="1009"/>
-        </w:numPr>
-      </w:pPr>
-      <w:r>
-        <w:t xml:space="preserve">Acesso à justiça e prevenção à tortura.</w:t>
-      </w:r>
-    </w:p>
-    <w:p>
-      <w:pPr>
-        <w:pStyle w:val="Compact"/>
-        <w:numPr>
-          <w:ilvl w:val="0"/>
-          <w:numId w:val="1009"/>
-        </w:numPr>
-      </w:pPr>
-      <w:r>
-        <w:t xml:space="preserve">Monitoramento, participação social e coordenação institucional.</w:t>
+        <w:t xml:space="preserve">Participantes posicionados em registro oficial de agenda institucional acompanhada pela EMA - SENAPPEN.</w:t>
       </w:r>
     </w:p>
     <w:p>
@@ -4042,87 +4043,7 @@
         <w:pStyle w:val="FirstParagraph"/>
       </w:pPr>
       <w:r>
-        <w:t xml:space="preserve">Subseção:</w:t>
-      </w:r>
-    </w:p>
-    <w:p>
-      <w:pPr>
-        <w:pStyle w:val="BodyText"/>
-      </w:pPr>
-      <w:r>
-        <w:t xml:space="preserve">Desdobramentos e articulação técnica</w:t>
-      </w:r>
-    </w:p>
-    <w:p>
-      <w:pPr>
-        <w:pStyle w:val="BodyText"/>
-      </w:pPr>
-      <w:r>
-        <w:t xml:space="preserve">Texto para colar:</w:t>
-      </w:r>
-    </w:p>
-    <w:p>
-      <w:pPr>
-        <w:pStyle w:val="BodyText"/>
-      </w:pPr>
-      <w:r>
-        <w:t xml:space="preserve">Entre novembro e dezembro de 2025, a EMA/Senappen contribuiu para a formalização da mesa de trabalho, participou de reuniões técnicas dedicadas aos eixos temáticos do caso e apoiou a preparação de visita técnica destinada a consolidar diagnósticos e orientar as próximas medidas.</w:t>
-      </w:r>
-    </w:p>
-    <w:p>
-      <w:pPr>
-        <w:pStyle w:val="BodyText"/>
-      </w:pPr>
-      <w:r>
-        <w:t xml:space="preserve">A segunda linha da subseção:</w:t>
-      </w:r>
-    </w:p>
-    <w:p>
-      <w:pPr>
-        <w:pStyle w:val="BodyText"/>
-      </w:pPr>
-      <w:r>
-        <w:t xml:space="preserve">No mesmo contexto, a equipe atuou de forma articulada com o Plano Pena Justa e acompanhou iniciativas voltadas à criação de instâncias permanentes de monitoramento e à padronização de fluxos para acompanhamento de casos internacionais com incidência sobre o sistema penal brasileiro.</w:t>
-      </w:r>
-    </w:p>
-    <w:p>
-      <w:pPr>
-        <w:pStyle w:val="BodyText"/>
-      </w:pPr>
-      <w:r>
-        <w:t xml:space="preserve">Seção:</w:t>
-      </w:r>
-    </w:p>
-    <w:p>
-      <w:pPr>
-        <w:pStyle w:val="BodyText"/>
-      </w:pPr>
-      <w:r>
-        <w:t xml:space="preserve">Referências públicas do SIDH</w:t>
-      </w:r>
-    </w:p>
-    <w:p>
-      <w:pPr>
-        <w:pStyle w:val="BodyText"/>
-      </w:pPr>
-      <w:r>
-        <w:t xml:space="preserve">Texto para colar:</w:t>
-      </w:r>
-    </w:p>
-    <w:p>
-      <w:pPr>
-        <w:pStyle w:val="BodyText"/>
-      </w:pPr>
-      <w:r>
-        <w:t xml:space="preserve">Para contextualização institucional da pauta, a ONASP pode utilizar como pontos de partida as referências públicas abaixo, produzidas pelos próprios órgãos do sistema interamericano:</w:t>
-      </w:r>
-    </w:p>
-    <w:p>
-      <w:pPr>
-        <w:pStyle w:val="BodyText"/>
-      </w:pPr>
-      <w:r>
-        <w:t xml:space="preserve">Links:</w:t>
+        <w:t xml:space="preserve">Legendas sugeridas:</w:t>
       </w:r>
     </w:p>
     <w:p>
@@ -4134,7 +4055,7 @@
         </w:numPr>
       </w:pPr>
       <w:r>
-        <w:t xml:space="preserve">O que é a CIDH?: https://www.oas.org/pt/cidh/mandato/que.asp</w:t>
+        <w:t xml:space="preserve">Reunião institucional acompanhada pela EMA - SENAPPEN.</w:t>
       </w:r>
     </w:p>
     <w:p>
@@ -4146,31 +4067,7 @@
         </w:numPr>
       </w:pPr>
       <w:r>
-        <w:t xml:space="preserve">O que é a Corte IDH?: https://www.corteidh.or.cr/que_es_la_corte.cfm?lang=pt</w:t>
-      </w:r>
-    </w:p>
-    <w:p>
-      <w:pPr>
-        <w:pStyle w:val="Compact"/>
-        <w:numPr>
-          <w:ilvl w:val="0"/>
-          <w:numId w:val="1010"/>
-        </w:numPr>
-      </w:pPr>
-      <w:r>
-        <w:t xml:space="preserve">Estatuto da Comissão Interamericana de Direitos Humanos: https://www.oas.org/pt/cidh/mandato/Basicos/estatutoCIDH.asp</w:t>
-      </w:r>
-    </w:p>
-    <w:p>
-      <w:pPr>
-        <w:pStyle w:val="Compact"/>
-        <w:numPr>
-          <w:ilvl w:val="0"/>
-          <w:numId w:val="1010"/>
-        </w:numPr>
-      </w:pPr>
-      <w:r>
-        <w:t xml:space="preserve">Declaração Americana de Direitos e Deveres do Homem: https://www.oas.org/pt/cidh/mandato/Basicos/declaracion.asp</w:t>
+        <w:t xml:space="preserve">Registro oficial de agenda institucional da EMA - SENAPPEN.</w:t>
       </w:r>
     </w:p>
     <w:p>
@@ -4181,110 +4078,12 @@
         <w:t xml:space="preserve">Seção:</w:t>
       </w:r>
     </w:p>
-    <w:bookmarkEnd w:id="21"/>
-    <w:bookmarkStart w:id="22" w:name="subpágina-3---plano-pena-justa"/>
-    <w:p>
-      <w:pPr>
-        <w:pStyle w:val="Heading2"/>
-      </w:pPr>
-      <w:r>
-        <w:t xml:space="preserve">Subpágina 3 - Plano Pena Justa</w:t>
-      </w:r>
-    </w:p>
-    <w:p>
-      <w:pPr>
-        <w:pStyle w:val="FirstParagraph"/>
-      </w:pPr>
-      <w:r>
-        <w:t xml:space="preserve">Título da página:</w:t>
-      </w:r>
-    </w:p>
-    <w:p>
-      <w:pPr>
-        <w:pStyle w:val="BodyText"/>
-      </w:pPr>
-      <w:r>
-        <w:t xml:space="preserve">Plano Pena Justa</w:t>
-      </w:r>
-    </w:p>
-    <w:p>
-      <w:pPr>
-        <w:pStyle w:val="BodyText"/>
-      </w:pPr>
-      <w:r>
-        <w:t xml:space="preserve">Imagem de destaque:</w:t>
-      </w:r>
-    </w:p>
-    <w:p>
-      <w:pPr>
-        <w:pStyle w:val="BodyText"/>
-      </w:pPr>
-      <w:r>
-        <w:t xml:space="preserve">Documentação/Botao_PenaJusta.png</w:t>
-      </w:r>
-    </w:p>
-    <w:p>
-      <w:pPr>
-        <w:pStyle w:val="BodyText"/>
-      </w:pPr>
-      <w:r>
-        <w:t xml:space="preserve">Texto alternativo sugerido:</w:t>
-      </w:r>
-    </w:p>
-    <w:p>
-      <w:pPr>
-        <w:pStyle w:val="BodyText"/>
-      </w:pPr>
-      <w:r>
-        <w:t xml:space="preserve">Marca do Plano Pena Justa.</w:t>
-      </w:r>
-    </w:p>
-    <w:p>
-      <w:pPr>
-        <w:pStyle w:val="BodyText"/>
-      </w:pPr>
-      <w:r>
-        <w:t xml:space="preserve">Identificador editorial:</w:t>
-      </w:r>
-    </w:p>
-    <w:p>
-      <w:pPr>
-        <w:pStyle w:val="BodyText"/>
-      </w:pPr>
-      <w:r>
-        <w:t xml:space="preserve">Conteúdo Técnico e Projetos Estruturantes</w:t>
-      </w:r>
-    </w:p>
-    <w:p>
-      <w:pPr>
-        <w:pStyle w:val="BodyText"/>
-      </w:pPr>
-      <w:r>
-        <w:t xml:space="preserve">Texto de destaque:</w:t>
-      </w:r>
-    </w:p>
-    <w:p>
-      <w:pPr>
-        <w:pStyle w:val="BodyText"/>
-      </w:pPr>
-      <w:r>
-        <w:t xml:space="preserve">Ambiente dedicado ao Plano Pena Justa, com informações gerais, documentos públicos e marcos relacionados ao fortalecimento das ouvidorias no sistema penal.</w:t>
-      </w:r>
-    </w:p>
-    <w:p>
-      <w:pPr>
-        <w:pStyle w:val="BodyText"/>
-      </w:pPr>
-      <w:r>
-        <w:t xml:space="preserve">Seção:</w:t>
-      </w:r>
-    </w:p>
-    <w:p>
-      <w:pPr>
-        <w:pStyle w:val="BodyText"/>
-      </w:pPr>
-      <w:r>
-        <w:t xml:space="preserve">O Plano</w:t>
+    <w:p>
+      <w:pPr>
+        <w:pStyle w:val="BodyText"/>
+      </w:pPr>
+      <w:r>
+        <w:t xml:space="preserve">Caso Pedrinhas</w:t>
       </w:r>
     </w:p>
     <w:p>
@@ -4300,47 +4099,47 @@
         <w:pStyle w:val="BodyText"/>
       </w:pPr>
       <w:r>
-        <w:t xml:space="preserve">O Plano Pena Justa é o Plano Nacional para o Enfrentamento do Estado de Coisas Inconstitucional nas Prisões Brasileiras, no âmbito da ADPF 347. Sua proposta articula ações de qualificação das políticas penais, fortalecimento da segurança pública, valorização dos servidores penais, transparência, participação social e monitoramento das metas pactuadas.</w:t>
-      </w:r>
-    </w:p>
-    <w:p>
-      <w:pPr>
-        <w:pStyle w:val="BodyText"/>
-      </w:pPr>
-      <w:r>
-        <w:t xml:space="preserve">Na perspectiva da Ouvidoria Nacional de Serviços Penais, esta subpágina reúne referências públicas do Plano voltadas ao fortalecimento da participação social, da escuta qualificada e da articulação entre as ouvidorias dos serviços penais nos Estados e no Distrito Federal.</w:t>
-      </w:r>
-    </w:p>
-    <w:p>
-      <w:pPr>
-        <w:pStyle w:val="BodyText"/>
-      </w:pPr>
-      <w:r>
-        <w:t xml:space="preserve">Seção:</w:t>
-      </w:r>
-    </w:p>
-    <w:p>
-      <w:pPr>
-        <w:pStyle w:val="BodyText"/>
-      </w:pPr>
-      <w:r>
-        <w:t xml:space="preserve">Eixos de atuação</w:t>
-      </w:r>
-    </w:p>
-    <w:p>
-      <w:pPr>
-        <w:pStyle w:val="BodyText"/>
-      </w:pPr>
-      <w:r>
-        <w:t xml:space="preserve">Texto para colar:</w:t>
-      </w:r>
-    </w:p>
-    <w:p>
-      <w:pPr>
-        <w:pStyle w:val="BodyText"/>
-      </w:pPr>
-      <w:r>
-        <w:t xml:space="preserve">O Plano Nacional organiza sua atuação em quatro eixos estruturantes:</w:t>
+        <w:t xml:space="preserve">Em 21 de outubro de 2025, a EMA-SENAPPEN foi convocada a participar, juntamente a outros órgãos representantes do Estado Brasileiro, da audiência privada solicitada pela Corte Interamericana de Direitos Humanos sobre as Medidas Provisórias outorgadas no Caso do Complexo Penitenciário de São Luís, Maranhão (Caso Pedrinhas).</w:t>
+      </w:r>
+    </w:p>
+    <w:p>
+      <w:pPr>
+        <w:pStyle w:val="BodyText"/>
+      </w:pPr>
+      <w:r>
+        <w:t xml:space="preserve">A segunda linha da seção:</w:t>
+      </w:r>
+    </w:p>
+    <w:p>
+      <w:pPr>
+        <w:pStyle w:val="BodyText"/>
+      </w:pPr>
+      <w:r>
+        <w:t xml:space="preserve">Como desdobramento da audiência, a Equipe ficou responsável por coordenar uma mesa de trabalho voltada à elaboração de um plano de cumprimento conjunto, com foco no enfrentamento das fragilidades ainda identificadas no Caso.</w:t>
+      </w:r>
+    </w:p>
+    <w:p>
+      <w:pPr>
+        <w:pStyle w:val="BodyText"/>
+      </w:pPr>
+      <w:r>
+        <w:t xml:space="preserve">Subseção:</w:t>
+      </w:r>
+    </w:p>
+    <w:p>
+      <w:pPr>
+        <w:pStyle w:val="BodyText"/>
+      </w:pPr>
+      <w:r>
+        <w:t xml:space="preserve">Eixos priorizados</w:t>
+      </w:r>
+    </w:p>
+    <w:p>
+      <w:pPr>
+        <w:pStyle w:val="BodyText"/>
+      </w:pPr>
+      <w:r>
+        <w:t xml:space="preserve">Itens para colar:</w:t>
       </w:r>
     </w:p>
     <w:p>
@@ -4352,7 +4151,7 @@
         </w:numPr>
       </w:pPr>
       <w:r>
-        <w:t xml:space="preserve">Controle da entrada e das vagas do sistema prisional.</w:t>
+        <w:t xml:space="preserve">Superlotação e ambiência no sistema prisional.</w:t>
       </w:r>
     </w:p>
     <w:p>
@@ -4364,7 +4163,7 @@
         </w:numPr>
       </w:pPr>
       <w:r>
-        <w:t xml:space="preserve">Qualidade da ambiência, dos serviços prestados e da estrutura prisional.</w:t>
+        <w:t xml:space="preserve">Dignidade e condições de custódia.</w:t>
       </w:r>
     </w:p>
     <w:p>
@@ -4376,7 +4175,7 @@
         </w:numPr>
       </w:pPr>
       <w:r>
-        <w:t xml:space="preserve">Processos de saída da prisão e de reintegração social.</w:t>
+        <w:t xml:space="preserve">Acesso à justiça e prevenção à tortura.</w:t>
       </w:r>
     </w:p>
     <w:p>
@@ -4388,7 +4187,7 @@
         </w:numPr>
       </w:pPr>
       <w:r>
-        <w:t xml:space="preserve">Políticas de não repetição do Estado de Coisas Inconstitucional no sistema prisional.</w:t>
+        <w:t xml:space="preserve">Monitoramento, participação social e coordenação institucional.</w:t>
       </w:r>
     </w:p>
     <w:p>
@@ -4396,6 +4195,54 @@
         <w:pStyle w:val="FirstParagraph"/>
       </w:pPr>
       <w:r>
+        <w:t xml:space="preserve">Subseção:</w:t>
+      </w:r>
+    </w:p>
+    <w:p>
+      <w:pPr>
+        <w:pStyle w:val="BodyText"/>
+      </w:pPr>
+      <w:r>
+        <w:t xml:space="preserve">Desdobramentos e articulação técnica</w:t>
+      </w:r>
+    </w:p>
+    <w:p>
+      <w:pPr>
+        <w:pStyle w:val="BodyText"/>
+      </w:pPr>
+      <w:r>
+        <w:t xml:space="preserve">Texto para colar:</w:t>
+      </w:r>
+    </w:p>
+    <w:p>
+      <w:pPr>
+        <w:pStyle w:val="BodyText"/>
+      </w:pPr>
+      <w:r>
+        <w:t xml:space="preserve">Entre novembro e dezembro de 2025, a EMA/Senappen contribuiu para a formalização da mesa de trabalho, participou de reuniões técnicas dedicadas aos eixos temáticos do caso e apoiou a preparação de visita técnica destinada a consolidar diagnósticos e orientar as próximas medidas.</w:t>
+      </w:r>
+    </w:p>
+    <w:p>
+      <w:pPr>
+        <w:pStyle w:val="BodyText"/>
+      </w:pPr>
+      <w:r>
+        <w:t xml:space="preserve">A segunda linha da subseção:</w:t>
+      </w:r>
+    </w:p>
+    <w:p>
+      <w:pPr>
+        <w:pStyle w:val="BodyText"/>
+      </w:pPr>
+      <w:r>
+        <w:t xml:space="preserve">No mesmo contexto, a equipe atuou de forma articulada com o Plano Pena Justa e acompanhou iniciativas voltadas à criação de instâncias permanentes de monitoramento e à padronização de fluxos para acompanhamento de casos internacionais com incidência sobre o sistema penal brasileiro.</w:t>
+      </w:r>
+    </w:p>
+    <w:p>
+      <w:pPr>
+        <w:pStyle w:val="BodyText"/>
+      </w:pPr>
+      <w:r>
         <w:t xml:space="preserve">Seção:</w:t>
       </w:r>
     </w:p>
@@ -4404,7 +4251,7 @@
         <w:pStyle w:val="BodyText"/>
       </w:pPr>
       <w:r>
-        <w:t xml:space="preserve">Governança e acompanhamento</w:t>
+        <w:t xml:space="preserve">Referências públicas do SIDH</w:t>
       </w:r>
     </w:p>
     <w:p>
@@ -4420,223 +4267,7 @@
         <w:pStyle w:val="BodyText"/>
       </w:pPr>
       <w:r>
-        <w:t xml:space="preserve">No recorte da Ouvidoria Nacional de Serviços Penais, o acompanhamento do Pena Justa prioriza instrumentos que fortaleçam a escuta qualificada, a transparência ativa e a coordenação entre as ouvidorias dos serviços penais.</w:t>
-      </w:r>
-    </w:p>
-    <w:p>
-      <w:pPr>
-        <w:pStyle w:val="BodyText"/>
-      </w:pPr>
-      <w:r>
-        <w:t xml:space="preserve">Esse recorte se materializa por meio de marcos normativos e de cooperação técnica que estruturam parâmetros mínimos de atuação, incentivam integração preferencial ao Fala.BR e consolidam uma rede permanente de intercâmbio entre União, Estados e Distrito Federal.</w:t>
-      </w:r>
-    </w:p>
-    <w:p>
-      <w:pPr>
-        <w:pStyle w:val="BodyText"/>
-      </w:pPr>
-      <w:r>
-        <w:t xml:space="preserve">Seção:</w:t>
-      </w:r>
-    </w:p>
-    <w:p>
-      <w:pPr>
-        <w:pStyle w:val="BodyText"/>
-      </w:pPr>
-      <w:r>
-        <w:t xml:space="preserve">Entregas já formalizadas</w:t>
-      </w:r>
-    </w:p>
-    <w:p>
-      <w:pPr>
-        <w:pStyle w:val="BodyText"/>
-      </w:pPr>
-      <w:r>
-        <w:t xml:space="preserve">Texto para colar:</w:t>
-      </w:r>
-    </w:p>
-    <w:p>
-      <w:pPr>
-        <w:pStyle w:val="BodyText"/>
-      </w:pPr>
-      <w:r>
-        <w:t xml:space="preserve">No campo das ouvidorias e da participação social, o Pena Justa já reúne marcos normativos que podem ser destacados nesta página:</w:t>
-      </w:r>
-    </w:p>
-    <w:p>
-      <w:pPr>
-        <w:pStyle w:val="BodyText"/>
-      </w:pPr>
-      <w:r>
-        <w:t xml:space="preserve">Subtítulo:</w:t>
-      </w:r>
-    </w:p>
-    <w:p>
-      <w:pPr>
-        <w:pStyle w:val="BodyText"/>
-      </w:pPr>
-      <w:r>
-        <w:t xml:space="preserve">Normativo publicado</w:t>
-      </w:r>
-    </w:p>
-    <w:p>
-      <w:pPr>
-        <w:pStyle w:val="BodyText"/>
-      </w:pPr>
-      <w:r>
-        <w:t xml:space="preserve">Título:</w:t>
-      </w:r>
-    </w:p>
-    <w:p>
-      <w:pPr>
-        <w:pStyle w:val="BodyText"/>
-      </w:pPr>
-      <w:r>
-        <w:t xml:space="preserve">Instrução Normativa nº 75/2026</w:t>
-      </w:r>
-    </w:p>
-    <w:p>
-      <w:pPr>
-        <w:pStyle w:val="BodyText"/>
-      </w:pPr>
-      <w:r>
-        <w:t xml:space="preserve">Texto para colar:</w:t>
-      </w:r>
-    </w:p>
-    <w:p>
-      <w:pPr>
-        <w:pStyle w:val="BodyText"/>
-      </w:pPr>
-      <w:r>
-        <w:t xml:space="preserve">Estabelece parâmetros mínimos para a criação e a estruturação de Ouvidorias de Serviços Penais nos Estados e no Distrito Federal, com diretrizes de autonomia, transparência, acessibilidade e integração preferencial ao Fala.BR.</w:t>
-      </w:r>
-    </w:p>
-    <w:p>
-      <w:pPr>
-        <w:pStyle w:val="BodyText"/>
-      </w:pPr>
-      <w:r>
-        <w:t xml:space="preserve">Link:</w:t>
-      </w:r>
-    </w:p>
-    <w:p>
-      <w:pPr>
-        <w:pStyle w:val="BodyText"/>
-      </w:pPr>
-      <w:r>
-        <w:t xml:space="preserve">Acessar a Instrução Normativa (PDF)</w:t>
-      </w:r>
-    </w:p>
-    <w:p>
-      <w:pPr>
-        <w:pStyle w:val="BodyText"/>
-      </w:pPr>
-      <w:r>
-        <w:t xml:space="preserve">Arquivo:</w:t>
-      </w:r>
-    </w:p>
-    <w:p>
-      <w:pPr>
-        <w:pStyle w:val="BodyText"/>
-      </w:pPr>
-      <w:r>
-        <w:t xml:space="preserve">Subpages/Pena_justa/SEI_35153985_Instrucao_Normativa_75.pdf</w:t>
-      </w:r>
-    </w:p>
-    <w:p>
-      <w:pPr>
-        <w:pStyle w:val="BodyText"/>
-      </w:pPr>
-      <w:r>
-        <w:t xml:space="preserve">Subtítulo:</w:t>
-      </w:r>
-    </w:p>
-    <w:p>
-      <w:pPr>
-        <w:pStyle w:val="BodyText"/>
-      </w:pPr>
-      <w:r>
-        <w:t xml:space="preserve">Rede instituída</w:t>
-      </w:r>
-    </w:p>
-    <w:p>
-      <w:pPr>
-        <w:pStyle w:val="BodyText"/>
-      </w:pPr>
-      <w:r>
-        <w:t xml:space="preserve">Título:</w:t>
-      </w:r>
-    </w:p>
-    <w:p>
-      <w:pPr>
-        <w:pStyle w:val="BodyText"/>
-      </w:pPr>
-      <w:r>
-        <w:t xml:space="preserve">Portaria nº 549/2026</w:t>
-      </w:r>
-    </w:p>
-    <w:p>
-      <w:pPr>
-        <w:pStyle w:val="BodyText"/>
-      </w:pPr>
-      <w:r>
-        <w:t xml:space="preserve">Texto para colar:</w:t>
-      </w:r>
-    </w:p>
-    <w:p>
-      <w:pPr>
-        <w:pStyle w:val="BodyText"/>
-      </w:pPr>
-      <w:r>
-        <w:t xml:space="preserve">Institui a Rede Nacional de Ouvidorias de Serviços Penais - Renospen, como instância permanente de cooperação técnica, intercâmbio de informações e fortalecimento institucional das ouvidorias no sistema penal.</w:t>
-      </w:r>
-    </w:p>
-    <w:p>
-      <w:pPr>
-        <w:pStyle w:val="BodyText"/>
-      </w:pPr>
-      <w:r>
-        <w:t xml:space="preserve">Link:</w:t>
-      </w:r>
-    </w:p>
-    <w:p>
-      <w:pPr>
-        <w:pStyle w:val="BodyText"/>
-      </w:pPr>
-      <w:r>
-        <w:t xml:space="preserve">Acessar a Portaria (PDF)</w:t>
-      </w:r>
-    </w:p>
-    <w:p>
-      <w:pPr>
-        <w:pStyle w:val="BodyText"/>
-      </w:pPr>
-      <w:r>
-        <w:t xml:space="preserve">Arquivo:</w:t>
-      </w:r>
-    </w:p>
-    <w:p>
-      <w:pPr>
-        <w:pStyle w:val="BodyText"/>
-      </w:pPr>
-      <w:r>
-        <w:t xml:space="preserve">Subpages/Pena_justa/SEI_35032761_Portaria_549.pdf</w:t>
-      </w:r>
-    </w:p>
-    <w:p>
-      <w:pPr>
-        <w:pStyle w:val="BodyText"/>
-      </w:pPr>
-      <w:r>
-        <w:t xml:space="preserve">Seção:</w:t>
-      </w:r>
-    </w:p>
-    <w:p>
-      <w:pPr>
-        <w:pStyle w:val="BodyText"/>
-      </w:pPr>
-      <w:r>
-        <w:t xml:space="preserve">Documentos públicos de referência</w:t>
+        <w:t xml:space="preserve">Para contextualização institucional da pauta, a ONASP pode utilizar como pontos de partida as referências públicas abaixo, produzidas pelos próprios órgãos do sistema interamericano:</w:t>
       </w:r>
     </w:p>
     <w:p>
@@ -4656,7 +4287,7 @@
         </w:numPr>
       </w:pPr>
       <w:r>
-        <w:t xml:space="preserve">Plano Nacional Pena Justa (PDF): Subpages/Pena_justa/Plano_Nacional_Pena_Justa.pdf</w:t>
+        <w:t xml:space="preserve">O que é a CIDH?: https://www.oas.org/pt/cidh/mandato/que.asp</w:t>
       </w:r>
     </w:p>
     <w:p>
@@ -4668,17 +4299,49 @@
         </w:numPr>
       </w:pPr>
       <w:r>
-        <w:t xml:space="preserve">10 coisas que você precisa saber sobre o Pena Justa (PDF): Subpages/Pena_justa/10_Coisas_que_você_precisa_saber_sobre_o_Pena_Justa.pdf</w:t>
-      </w:r>
-    </w:p>
-    <w:bookmarkEnd w:id="22"/>
-    <w:bookmarkStart w:id="23" w:name="X9010218d04cc9bed3b5085cf6721dd78b5ea4ec"/>
+        <w:t xml:space="preserve">O que é a Corte IDH?: https://www.corteidh.or.cr/que_es_la_corte.cfm?lang=pt</w:t>
+      </w:r>
+    </w:p>
+    <w:p>
+      <w:pPr>
+        <w:pStyle w:val="Compact"/>
+        <w:numPr>
+          <w:ilvl w:val="0"/>
+          <w:numId w:val="1012"/>
+        </w:numPr>
+      </w:pPr>
+      <w:r>
+        <w:t xml:space="preserve">Estatuto da Comissão Interamericana de Direitos Humanos: https://www.oas.org/pt/cidh/mandato/Basicos/estatutoCIDH.asp</w:t>
+      </w:r>
+    </w:p>
+    <w:p>
+      <w:pPr>
+        <w:pStyle w:val="Compact"/>
+        <w:numPr>
+          <w:ilvl w:val="0"/>
+          <w:numId w:val="1012"/>
+        </w:numPr>
+      </w:pPr>
+      <w:r>
+        <w:t xml:space="preserve">Declaração Americana de Direitos e Deveres do Homem: https://www.oas.org/pt/cidh/mandato/Basicos/declaracion.asp</w:t>
+      </w:r>
+    </w:p>
+    <w:p>
+      <w:pPr>
+        <w:pStyle w:val="FirstParagraph"/>
+      </w:pPr>
+      <w:r>
+        <w:t xml:space="preserve">Seção:</w:t>
+      </w:r>
+    </w:p>
+    <w:bookmarkEnd w:id="21"/>
+    <w:bookmarkStart w:id="22" w:name="subpágina-3---plano-pena-justa"/>
     <w:p>
       <w:pPr>
         <w:pStyle w:val="Heading2"/>
       </w:pPr>
       <w:r>
-        <w:t xml:space="preserve">Subpágina 4 - Revista Brasileira de Execução Penal</w:t>
+        <w:t xml:space="preserve">Subpágina 3 - Plano Pena Justa</w:t>
       </w:r>
     </w:p>
     <w:p>
@@ -4694,7 +4357,7 @@
         <w:pStyle w:val="BodyText"/>
       </w:pPr>
       <w:r>
-        <w:t xml:space="preserve">Revista Brasileira de Execução Penal</w:t>
+        <w:t xml:space="preserve">Plano Pena Justa</w:t>
       </w:r>
     </w:p>
     <w:p>
@@ -4710,7 +4373,7 @@
         <w:pStyle w:val="BodyText"/>
       </w:pPr>
       <w:r>
-        <w:t xml:space="preserve">Documentação/Botao_RevistaBrasileira.png</w:t>
+        <w:t xml:space="preserve">Documentação/Botao_PenaJusta.png</w:t>
       </w:r>
     </w:p>
     <w:p>
@@ -4726,7 +4389,7 @@
         <w:pStyle w:val="BodyText"/>
       </w:pPr>
       <w:r>
-        <w:t xml:space="preserve">Botão institucional da Revista Brasileira de Execução Penal.</w:t>
+        <w:t xml:space="preserve">Marca do Plano Pena Justa.</w:t>
       </w:r>
     </w:p>
     <w:p>
@@ -4758,7 +4421,7 @@
         <w:pStyle w:val="BodyText"/>
       </w:pPr>
       <w:r>
-        <w:t xml:space="preserve">Em articulação com a Espen e a DCOM, esta subpágina reúne referências da Revista Brasileira de Execução Penal e destaca dossiês, notícias editoriais e conteúdos com interface com participação social, transparência e direitos no sistema penal.</w:t>
+        <w:t xml:space="preserve">Ambiente dedicado ao Plano Pena Justa, com informações gerais, documentos públicos e marcos relacionados ao fortalecimento das ouvidorias no sistema penal.</w:t>
       </w:r>
     </w:p>
     <w:p>
@@ -4774,7 +4437,7 @@
         <w:pStyle w:val="BodyText"/>
       </w:pPr>
       <w:r>
-        <w:t xml:space="preserve">A Revista</w:t>
+        <w:t xml:space="preserve">O Plano</w:t>
       </w:r>
     </w:p>
     <w:p>
@@ -4790,23 +4453,15 @@
         <w:pStyle w:val="BodyText"/>
       </w:pPr>
       <w:r>
-        <w:t xml:space="preserve">A Revista Brasileira de Execução Penal é o periódico técnico-científico da Secretaria Nacional de Políticas Penais (Senappen/MJSP) e constitui espaço de circulação de artigos, documentos inéditos, entrevistas, relatos de experiência e boas práticas relacionados à execução penal.</w:t>
-      </w:r>
-    </w:p>
-    <w:p>
-      <w:pPr>
-        <w:pStyle w:val="BodyText"/>
-      </w:pPr>
-      <w:r>
-        <w:t xml:space="preserve">A segunda linha do escopo:</w:t>
-      </w:r>
-    </w:p>
-    <w:p>
-      <w:pPr>
-        <w:pStyle w:val="BodyText"/>
-      </w:pPr>
-      <w:r>
-        <w:t xml:space="preserve">No contexto da Ouvidoria, a publicação contribui para aproximar produção técnica, debate qualificado e controle social, reforçando o papel da Ouvidoria como ponte entre Estado e sociedade.</w:t>
+        <w:t xml:space="preserve">O Plano Pena Justa é o Plano Nacional para o Enfrentamento do Estado de Coisas Inconstitucional nas Prisões Brasileiras, no âmbito da ADPF 347. Sua proposta articula ações de qualificação das políticas penais, fortalecimento da segurança pública, valorização dos servidores penais, transparência, participação social e monitoramento das metas pactuadas.</w:t>
+      </w:r>
+    </w:p>
+    <w:p>
+      <w:pPr>
+        <w:pStyle w:val="BodyText"/>
+      </w:pPr>
+      <w:r>
+        <w:t xml:space="preserve">Na perspectiva da Ouvidoria Nacional de Serviços Penais, esta subpágina reúne referências públicas do Plano voltadas ao fortalecimento da participação social, da escuta qualificada e da articulação entre as ouvidorias dos serviços penais nos Estados e no Distrito Federal.</w:t>
       </w:r>
     </w:p>
     <w:p>
@@ -4822,7 +4477,7 @@
         <w:pStyle w:val="BodyText"/>
       </w:pPr>
       <w:r>
-        <w:t xml:space="preserve">Sobre a revista</w:t>
+        <w:t xml:space="preserve">Eixos de atuação</w:t>
       </w:r>
     </w:p>
     <w:p>
@@ -4838,63 +4493,7 @@
         <w:pStyle w:val="BodyText"/>
       </w:pPr>
       <w:r>
-        <w:t xml:space="preserve">A RBEP publica artigos, documentos inéditos, entrevistas, relatos de experiência e descrição de boas práticas que relacionam a experiência profissional, o conhecimento produzido sobre a matéria e o cumprimento da legislação nacional.</w:t>
-      </w:r>
-    </w:p>
-    <w:p>
-      <w:pPr>
-        <w:pStyle w:val="BodyText"/>
-      </w:pPr>
-      <w:r>
-        <w:t xml:space="preserve">A segunda linha da seção:</w:t>
-      </w:r>
-    </w:p>
-    <w:p>
-      <w:pPr>
-        <w:pStyle w:val="BodyText"/>
-      </w:pPr>
-      <w:r>
-        <w:t xml:space="preserve">Os conteúdos são organizados em dossiês temáticos semestrais, e a revista recebeu qualificação A4 na classificação de periódicos Qualis Capes na avaliação do quadriênio 2021-2024.</w:t>
-      </w:r>
-    </w:p>
-    <w:p>
-      <w:pPr>
-        <w:pStyle w:val="BodyText"/>
-      </w:pPr>
-      <w:r>
-        <w:t xml:space="preserve">Seção:</w:t>
-      </w:r>
-    </w:p>
-    <w:p>
-      <w:pPr>
-        <w:pStyle w:val="BodyText"/>
-      </w:pPr>
-      <w:r>
-        <w:t xml:space="preserve">Acesso oficial à RBEP</w:t>
-      </w:r>
-    </w:p>
-    <w:p>
-      <w:pPr>
-        <w:pStyle w:val="BodyText"/>
-      </w:pPr>
-      <w:r>
-        <w:t xml:space="preserve">Texto para colar:</w:t>
-      </w:r>
-    </w:p>
-    <w:p>
-      <w:pPr>
-        <w:pStyle w:val="BodyText"/>
-      </w:pPr>
-      <w:r>
-        <w:t xml:space="preserve">O portal oficial da revista reúne notícias, edição atual, arquivo de edições e informações para submissão de textos.</w:t>
-      </w:r>
-    </w:p>
-    <w:p>
-      <w:pPr>
-        <w:pStyle w:val="BodyText"/>
-      </w:pPr>
-      <w:r>
-        <w:t xml:space="preserve">Links:</w:t>
+        <w:t xml:space="preserve">O Plano Nacional organiza sua atuação em quatro eixos estruturantes:</w:t>
       </w:r>
     </w:p>
     <w:p>
@@ -4906,7 +4505,7 @@
         </w:numPr>
       </w:pPr>
       <w:r>
-        <w:t xml:space="preserve">Portal oficial da Revista Brasileira de Execução Penal: https://rbepsenappen.mj.gov.br/index.php/RBEP/pt_BR</w:t>
+        <w:t xml:space="preserve">Controle da entrada e das vagas do sistema prisional.</w:t>
       </w:r>
     </w:p>
     <w:p>
@@ -4918,7 +4517,7 @@
         </w:numPr>
       </w:pPr>
       <w:r>
-        <w:t xml:space="preserve">Edição atual - edição completa: https://rbepsenappen.mj.gov.br/index.php/RBEP/pt_BR/issue/view/22/58</w:t>
+        <w:t xml:space="preserve">Qualidade da ambiência, dos serviços prestados e da estrutura prisional.</w:t>
       </w:r>
     </w:p>
     <w:p>
@@ -4930,7 +4529,7 @@
         </w:numPr>
       </w:pPr>
       <w:r>
-        <w:t xml:space="preserve">Ver todas as edições: https://rbepsenappen.mj.gov.br/index.php/RBEP/pt_BR/issue/archive</w:t>
+        <w:t xml:space="preserve">Processos de saída da prisão e de reintegração social.</w:t>
       </w:r>
     </w:p>
     <w:p>
@@ -4942,7 +4541,7 @@
         </w:numPr>
       </w:pPr>
       <w:r>
-        <w:t xml:space="preserve">Enviar submissão: https://rbepsenappen.mj.gov.br/index.php/RBEP/pt_BR/about/submissions</w:t>
+        <w:t xml:space="preserve">Políticas de não repetição do Estado de Coisas Inconstitucional no sistema prisional.</w:t>
       </w:r>
     </w:p>
     <w:p>
@@ -4958,15 +4557,247 @@
         <w:pStyle w:val="BodyText"/>
       </w:pPr>
       <w:r>
-        <w:t xml:space="preserve">Referências institucionais</w:t>
-      </w:r>
-    </w:p>
-    <w:p>
-      <w:pPr>
-        <w:pStyle w:val="BodyText"/>
-      </w:pPr>
-      <w:r>
-        <w:t xml:space="preserve">Itens para colar:</w:t>
+        <w:t xml:space="preserve">Governança e acompanhamento</w:t>
+      </w:r>
+    </w:p>
+    <w:p>
+      <w:pPr>
+        <w:pStyle w:val="BodyText"/>
+      </w:pPr>
+      <w:r>
+        <w:t xml:space="preserve">Texto para colar:</w:t>
+      </w:r>
+    </w:p>
+    <w:p>
+      <w:pPr>
+        <w:pStyle w:val="BodyText"/>
+      </w:pPr>
+      <w:r>
+        <w:t xml:space="preserve">No recorte da Ouvidoria Nacional de Serviços Penais, o acompanhamento do Pena Justa prioriza instrumentos que fortaleçam a escuta qualificada, a transparência ativa e a coordenação entre as ouvidorias dos serviços penais.</w:t>
+      </w:r>
+    </w:p>
+    <w:p>
+      <w:pPr>
+        <w:pStyle w:val="BodyText"/>
+      </w:pPr>
+      <w:r>
+        <w:t xml:space="preserve">Esse recorte se materializa por meio de marcos normativos e de cooperação técnica que estruturam parâmetros mínimos de atuação, incentivam integração preferencial ao Fala.BR e consolidam uma rede permanente de intercâmbio entre União, Estados e Distrito Federal.</w:t>
+      </w:r>
+    </w:p>
+    <w:p>
+      <w:pPr>
+        <w:pStyle w:val="BodyText"/>
+      </w:pPr>
+      <w:r>
+        <w:t xml:space="preserve">Seção:</w:t>
+      </w:r>
+    </w:p>
+    <w:p>
+      <w:pPr>
+        <w:pStyle w:val="BodyText"/>
+      </w:pPr>
+      <w:r>
+        <w:t xml:space="preserve">Entregas já formalizadas</w:t>
+      </w:r>
+    </w:p>
+    <w:p>
+      <w:pPr>
+        <w:pStyle w:val="BodyText"/>
+      </w:pPr>
+      <w:r>
+        <w:t xml:space="preserve">Texto para colar:</w:t>
+      </w:r>
+    </w:p>
+    <w:p>
+      <w:pPr>
+        <w:pStyle w:val="BodyText"/>
+      </w:pPr>
+      <w:r>
+        <w:t xml:space="preserve">No campo das ouvidorias e da participação social, o Pena Justa já reúne marcos normativos que podem ser destacados nesta página:</w:t>
+      </w:r>
+    </w:p>
+    <w:p>
+      <w:pPr>
+        <w:pStyle w:val="BodyText"/>
+      </w:pPr>
+      <w:r>
+        <w:t xml:space="preserve">Subtítulo:</w:t>
+      </w:r>
+    </w:p>
+    <w:p>
+      <w:pPr>
+        <w:pStyle w:val="BodyText"/>
+      </w:pPr>
+      <w:r>
+        <w:t xml:space="preserve">Normativo publicado</w:t>
+      </w:r>
+    </w:p>
+    <w:p>
+      <w:pPr>
+        <w:pStyle w:val="BodyText"/>
+      </w:pPr>
+      <w:r>
+        <w:t xml:space="preserve">Título:</w:t>
+      </w:r>
+    </w:p>
+    <w:p>
+      <w:pPr>
+        <w:pStyle w:val="BodyText"/>
+      </w:pPr>
+      <w:r>
+        <w:t xml:space="preserve">Instrução Normativa nº 75/2026</w:t>
+      </w:r>
+    </w:p>
+    <w:p>
+      <w:pPr>
+        <w:pStyle w:val="BodyText"/>
+      </w:pPr>
+      <w:r>
+        <w:t xml:space="preserve">Texto para colar:</w:t>
+      </w:r>
+    </w:p>
+    <w:p>
+      <w:pPr>
+        <w:pStyle w:val="BodyText"/>
+      </w:pPr>
+      <w:r>
+        <w:t xml:space="preserve">Estabelece parâmetros mínimos para a criação e a estruturação de Ouvidorias de Serviços Penais nos Estados e no Distrito Federal, com diretrizes de autonomia, transparência, acessibilidade e integração preferencial ao Fala.BR.</w:t>
+      </w:r>
+    </w:p>
+    <w:p>
+      <w:pPr>
+        <w:pStyle w:val="BodyText"/>
+      </w:pPr>
+      <w:r>
+        <w:t xml:space="preserve">Link:</w:t>
+      </w:r>
+    </w:p>
+    <w:p>
+      <w:pPr>
+        <w:pStyle w:val="BodyText"/>
+      </w:pPr>
+      <w:r>
+        <w:t xml:space="preserve">Acessar a Instrução Normativa (PDF)</w:t>
+      </w:r>
+    </w:p>
+    <w:p>
+      <w:pPr>
+        <w:pStyle w:val="BodyText"/>
+      </w:pPr>
+      <w:r>
+        <w:t xml:space="preserve">Arquivo:</w:t>
+      </w:r>
+    </w:p>
+    <w:p>
+      <w:pPr>
+        <w:pStyle w:val="BodyText"/>
+      </w:pPr>
+      <w:r>
+        <w:t xml:space="preserve">Subpages/Pena_justa/SEI_35153985_Instrucao_Normativa_75.pdf</w:t>
+      </w:r>
+    </w:p>
+    <w:p>
+      <w:pPr>
+        <w:pStyle w:val="BodyText"/>
+      </w:pPr>
+      <w:r>
+        <w:t xml:space="preserve">Subtítulo:</w:t>
+      </w:r>
+    </w:p>
+    <w:p>
+      <w:pPr>
+        <w:pStyle w:val="BodyText"/>
+      </w:pPr>
+      <w:r>
+        <w:t xml:space="preserve">Rede instituída</w:t>
+      </w:r>
+    </w:p>
+    <w:p>
+      <w:pPr>
+        <w:pStyle w:val="BodyText"/>
+      </w:pPr>
+      <w:r>
+        <w:t xml:space="preserve">Título:</w:t>
+      </w:r>
+    </w:p>
+    <w:p>
+      <w:pPr>
+        <w:pStyle w:val="BodyText"/>
+      </w:pPr>
+      <w:r>
+        <w:t xml:space="preserve">Portaria nº 549/2026</w:t>
+      </w:r>
+    </w:p>
+    <w:p>
+      <w:pPr>
+        <w:pStyle w:val="BodyText"/>
+      </w:pPr>
+      <w:r>
+        <w:t xml:space="preserve">Texto para colar:</w:t>
+      </w:r>
+    </w:p>
+    <w:p>
+      <w:pPr>
+        <w:pStyle w:val="BodyText"/>
+      </w:pPr>
+      <w:r>
+        <w:t xml:space="preserve">Institui a Rede Nacional de Ouvidorias de Serviços Penais - Renospen, como instância permanente de cooperação técnica, intercâmbio de informações e fortalecimento institucional das ouvidorias no sistema penal.</w:t>
+      </w:r>
+    </w:p>
+    <w:p>
+      <w:pPr>
+        <w:pStyle w:val="BodyText"/>
+      </w:pPr>
+      <w:r>
+        <w:t xml:space="preserve">Link:</w:t>
+      </w:r>
+    </w:p>
+    <w:p>
+      <w:pPr>
+        <w:pStyle w:val="BodyText"/>
+      </w:pPr>
+      <w:r>
+        <w:t xml:space="preserve">Acessar a Portaria (PDF)</w:t>
+      </w:r>
+    </w:p>
+    <w:p>
+      <w:pPr>
+        <w:pStyle w:val="BodyText"/>
+      </w:pPr>
+      <w:r>
+        <w:t xml:space="preserve">Arquivo:</w:t>
+      </w:r>
+    </w:p>
+    <w:p>
+      <w:pPr>
+        <w:pStyle w:val="BodyText"/>
+      </w:pPr>
+      <w:r>
+        <w:t xml:space="preserve">Subpages/Pena_justa/SEI_35032761_Portaria_549.pdf</w:t>
+      </w:r>
+    </w:p>
+    <w:p>
+      <w:pPr>
+        <w:pStyle w:val="BodyText"/>
+      </w:pPr>
+      <w:r>
+        <w:t xml:space="preserve">Seção:</w:t>
+      </w:r>
+    </w:p>
+    <w:p>
+      <w:pPr>
+        <w:pStyle w:val="BodyText"/>
+      </w:pPr>
+      <w:r>
+        <w:t xml:space="preserve">Documentos públicos de referência</w:t>
+      </w:r>
+    </w:p>
+    <w:p>
+      <w:pPr>
+        <w:pStyle w:val="BodyText"/>
+      </w:pPr>
+      <w:r>
+        <w:t xml:space="preserve">Links:</w:t>
       </w:r>
     </w:p>
     <w:p>
@@ -4978,7 +4809,7 @@
         </w:numPr>
       </w:pPr>
       <w:r>
-        <w:t xml:space="preserve">Qualis Capes 2021-2024: A4.</w:t>
+        <w:t xml:space="preserve">Plano Nacional Pena Justa (PDF): Subpages/Pena_justa/Plano_Nacional_Pena_Justa.pdf</w:t>
       </w:r>
     </w:p>
     <w:p>
@@ -4990,7 +4821,233 @@
         </w:numPr>
       </w:pPr>
       <w:r>
-        <w:t xml:space="preserve">ISSN: 2675-1895.</w:t>
+        <w:t xml:space="preserve">10 coisas que você precisa saber sobre o Pena Justa (PDF): Subpages/Pena_justa/10_Coisas_que_você_precisa_saber_sobre_o_Pena_Justa.pdf</w:t>
+      </w:r>
+    </w:p>
+    <w:bookmarkEnd w:id="22"/>
+    <w:bookmarkStart w:id="23" w:name="X9010218d04cc9bed3b5085cf6721dd78b5ea4ec"/>
+    <w:p>
+      <w:pPr>
+        <w:pStyle w:val="Heading2"/>
+      </w:pPr>
+      <w:r>
+        <w:t xml:space="preserve">Subpágina 4 - Revista Brasileira de Execução Penal</w:t>
+      </w:r>
+    </w:p>
+    <w:p>
+      <w:pPr>
+        <w:pStyle w:val="FirstParagraph"/>
+      </w:pPr>
+      <w:r>
+        <w:t xml:space="preserve">Título da página:</w:t>
+      </w:r>
+    </w:p>
+    <w:p>
+      <w:pPr>
+        <w:pStyle w:val="BodyText"/>
+      </w:pPr>
+      <w:r>
+        <w:t xml:space="preserve">Revista Brasileira de Execução Penal</w:t>
+      </w:r>
+    </w:p>
+    <w:p>
+      <w:pPr>
+        <w:pStyle w:val="BodyText"/>
+      </w:pPr>
+      <w:r>
+        <w:t xml:space="preserve">Imagem de destaque:</w:t>
+      </w:r>
+    </w:p>
+    <w:p>
+      <w:pPr>
+        <w:pStyle w:val="BodyText"/>
+      </w:pPr>
+      <w:r>
+        <w:t xml:space="preserve">Documentação/Botao_RevistaBrasileira.png</w:t>
+      </w:r>
+    </w:p>
+    <w:p>
+      <w:pPr>
+        <w:pStyle w:val="BodyText"/>
+      </w:pPr>
+      <w:r>
+        <w:t xml:space="preserve">Texto alternativo sugerido:</w:t>
+      </w:r>
+    </w:p>
+    <w:p>
+      <w:pPr>
+        <w:pStyle w:val="BodyText"/>
+      </w:pPr>
+      <w:r>
+        <w:t xml:space="preserve">Botão institucional da Revista Brasileira de Execução Penal.</w:t>
+      </w:r>
+    </w:p>
+    <w:p>
+      <w:pPr>
+        <w:pStyle w:val="BodyText"/>
+      </w:pPr>
+      <w:r>
+        <w:t xml:space="preserve">Identificador editorial:</w:t>
+      </w:r>
+    </w:p>
+    <w:p>
+      <w:pPr>
+        <w:pStyle w:val="BodyText"/>
+      </w:pPr>
+      <w:r>
+        <w:t xml:space="preserve">Conteúdo Técnico e Projetos Estruturantes</w:t>
+      </w:r>
+    </w:p>
+    <w:p>
+      <w:pPr>
+        <w:pStyle w:val="BodyText"/>
+      </w:pPr>
+      <w:r>
+        <w:t xml:space="preserve">Texto de destaque:</w:t>
+      </w:r>
+    </w:p>
+    <w:p>
+      <w:pPr>
+        <w:pStyle w:val="BodyText"/>
+      </w:pPr>
+      <w:r>
+        <w:t xml:space="preserve">Em articulação com a Espen e a DCOM, esta subpágina reúne referências da Revista Brasileira de Execução Penal e destaca dossiês, notícias editoriais e conteúdos com interface com participação social, transparência e direitos no sistema penal.</w:t>
+      </w:r>
+    </w:p>
+    <w:p>
+      <w:pPr>
+        <w:pStyle w:val="BodyText"/>
+      </w:pPr>
+      <w:r>
+        <w:t xml:space="preserve">Seção:</w:t>
+      </w:r>
+    </w:p>
+    <w:p>
+      <w:pPr>
+        <w:pStyle w:val="BodyText"/>
+      </w:pPr>
+      <w:r>
+        <w:t xml:space="preserve">A Revista</w:t>
+      </w:r>
+    </w:p>
+    <w:p>
+      <w:pPr>
+        <w:pStyle w:val="BodyText"/>
+      </w:pPr>
+      <w:r>
+        <w:t xml:space="preserve">Texto para colar:</w:t>
+      </w:r>
+    </w:p>
+    <w:p>
+      <w:pPr>
+        <w:pStyle w:val="BodyText"/>
+      </w:pPr>
+      <w:r>
+        <w:t xml:space="preserve">A Revista Brasileira de Execução Penal é o periódico técnico-científico da Secretaria Nacional de Políticas Penais (Senappen/MJSP) e constitui espaço de circulação de artigos, documentos inéditos, entrevistas, relatos de experiência e boas práticas relacionados à execução penal.</w:t>
+      </w:r>
+    </w:p>
+    <w:p>
+      <w:pPr>
+        <w:pStyle w:val="BodyText"/>
+      </w:pPr>
+      <w:r>
+        <w:t xml:space="preserve">A segunda linha do escopo:</w:t>
+      </w:r>
+    </w:p>
+    <w:p>
+      <w:pPr>
+        <w:pStyle w:val="BodyText"/>
+      </w:pPr>
+      <w:r>
+        <w:t xml:space="preserve">No contexto da Ouvidoria, a publicação contribui para aproximar produção técnica, debate qualificado e controle social, reforçando o papel da Ouvidoria como ponte entre Estado e sociedade.</w:t>
+      </w:r>
+    </w:p>
+    <w:p>
+      <w:pPr>
+        <w:pStyle w:val="BodyText"/>
+      </w:pPr>
+      <w:r>
+        <w:t xml:space="preserve">Seção:</w:t>
+      </w:r>
+    </w:p>
+    <w:p>
+      <w:pPr>
+        <w:pStyle w:val="BodyText"/>
+      </w:pPr>
+      <w:r>
+        <w:t xml:space="preserve">Sobre a revista</w:t>
+      </w:r>
+    </w:p>
+    <w:p>
+      <w:pPr>
+        <w:pStyle w:val="BodyText"/>
+      </w:pPr>
+      <w:r>
+        <w:t xml:space="preserve">Texto para colar:</w:t>
+      </w:r>
+    </w:p>
+    <w:p>
+      <w:pPr>
+        <w:pStyle w:val="BodyText"/>
+      </w:pPr>
+      <w:r>
+        <w:t xml:space="preserve">A RBEP publica artigos, documentos inéditos, entrevistas, relatos de experiência e descrição de boas práticas que relacionam a experiência profissional, o conhecimento produzido sobre a matéria e o cumprimento da legislação nacional.</w:t>
+      </w:r>
+    </w:p>
+    <w:p>
+      <w:pPr>
+        <w:pStyle w:val="BodyText"/>
+      </w:pPr>
+      <w:r>
+        <w:t xml:space="preserve">A segunda linha da seção:</w:t>
+      </w:r>
+    </w:p>
+    <w:p>
+      <w:pPr>
+        <w:pStyle w:val="BodyText"/>
+      </w:pPr>
+      <w:r>
+        <w:t xml:space="preserve">Os conteúdos são organizados em dossiês temáticos semestrais, e a revista recebeu qualificação A4 na classificação de periódicos Qualis Capes na avaliação do quadriênio 2021-2024.</w:t>
+      </w:r>
+    </w:p>
+    <w:p>
+      <w:pPr>
+        <w:pStyle w:val="BodyText"/>
+      </w:pPr>
+      <w:r>
+        <w:t xml:space="preserve">Seção:</w:t>
+      </w:r>
+    </w:p>
+    <w:p>
+      <w:pPr>
+        <w:pStyle w:val="BodyText"/>
+      </w:pPr>
+      <w:r>
+        <w:t xml:space="preserve">Acesso oficial à RBEP</w:t>
+      </w:r>
+    </w:p>
+    <w:p>
+      <w:pPr>
+        <w:pStyle w:val="BodyText"/>
+      </w:pPr>
+      <w:r>
+        <w:t xml:space="preserve">Texto para colar:</w:t>
+      </w:r>
+    </w:p>
+    <w:p>
+      <w:pPr>
+        <w:pStyle w:val="BodyText"/>
+      </w:pPr>
+      <w:r>
+        <w:t xml:space="preserve">O portal oficial da revista reúne notícias, edição atual, arquivo de edições e informações para submissão de textos.</w:t>
+      </w:r>
+    </w:p>
+    <w:p>
+      <w:pPr>
+        <w:pStyle w:val="BodyText"/>
+      </w:pPr>
+      <w:r>
+        <w:t xml:space="preserve">Links:</w:t>
       </w:r>
     </w:p>
     <w:p>
@@ -4998,11 +5055,11 @@
         <w:pStyle w:val="Compact"/>
         <w:numPr>
           <w:ilvl w:val="0"/>
-          <w:numId w:val="1014"/>
+          <w:numId w:val="1015"/>
         </w:numPr>
       </w:pPr>
       <w:r>
-        <w:t xml:space="preserve">e-ISSN: 2675-1860.</w:t>
+        <w:t xml:space="preserve">Portal oficial da Revista Brasileira de Execução Penal: https://rbepsenappen.mj.gov.br/index.php/RBEP/pt_BR</w:t>
       </w:r>
     </w:p>
     <w:p>
@@ -5010,7 +5067,103 @@
         <w:pStyle w:val="Compact"/>
         <w:numPr>
           <w:ilvl w:val="0"/>
-          <w:numId w:val="1014"/>
+          <w:numId w:val="1015"/>
+        </w:numPr>
+      </w:pPr>
+      <w:r>
+        <w:t xml:space="preserve">Edição atual - edição completa: https://rbepsenappen.mj.gov.br/index.php/RBEP/pt_BR/issue/view/22/58</w:t>
+      </w:r>
+    </w:p>
+    <w:p>
+      <w:pPr>
+        <w:pStyle w:val="Compact"/>
+        <w:numPr>
+          <w:ilvl w:val="0"/>
+          <w:numId w:val="1015"/>
+        </w:numPr>
+      </w:pPr>
+      <w:r>
+        <w:t xml:space="preserve">Ver todas as edições: https://rbepsenappen.mj.gov.br/index.php/RBEP/pt_BR/issue/archive</w:t>
+      </w:r>
+    </w:p>
+    <w:p>
+      <w:pPr>
+        <w:pStyle w:val="Compact"/>
+        <w:numPr>
+          <w:ilvl w:val="0"/>
+          <w:numId w:val="1015"/>
+        </w:numPr>
+      </w:pPr>
+      <w:r>
+        <w:t xml:space="preserve">Enviar submissão: https://rbepsenappen.mj.gov.br/index.php/RBEP/pt_BR/about/submissions</w:t>
+      </w:r>
+    </w:p>
+    <w:p>
+      <w:pPr>
+        <w:pStyle w:val="FirstParagraph"/>
+      </w:pPr>
+      <w:r>
+        <w:t xml:space="preserve">Seção:</w:t>
+      </w:r>
+    </w:p>
+    <w:p>
+      <w:pPr>
+        <w:pStyle w:val="BodyText"/>
+      </w:pPr>
+      <w:r>
+        <w:t xml:space="preserve">Referências institucionais</w:t>
+      </w:r>
+    </w:p>
+    <w:p>
+      <w:pPr>
+        <w:pStyle w:val="BodyText"/>
+      </w:pPr>
+      <w:r>
+        <w:t xml:space="preserve">Itens para colar:</w:t>
+      </w:r>
+    </w:p>
+    <w:p>
+      <w:pPr>
+        <w:pStyle w:val="Compact"/>
+        <w:numPr>
+          <w:ilvl w:val="0"/>
+          <w:numId w:val="1016"/>
+        </w:numPr>
+      </w:pPr>
+      <w:r>
+        <w:t xml:space="preserve">Qualis Capes 2021-2024: A4.</w:t>
+      </w:r>
+    </w:p>
+    <w:p>
+      <w:pPr>
+        <w:pStyle w:val="Compact"/>
+        <w:numPr>
+          <w:ilvl w:val="0"/>
+          <w:numId w:val="1016"/>
+        </w:numPr>
+      </w:pPr>
+      <w:r>
+        <w:t xml:space="preserve">ISSN: 2675-1895.</w:t>
+      </w:r>
+    </w:p>
+    <w:p>
+      <w:pPr>
+        <w:pStyle w:val="Compact"/>
+        <w:numPr>
+          <w:ilvl w:val="0"/>
+          <w:numId w:val="1016"/>
+        </w:numPr>
+      </w:pPr>
+      <w:r>
+        <w:t xml:space="preserve">e-ISSN: 2675-1860.</w:t>
+      </w:r>
+    </w:p>
+    <w:p>
+      <w:pPr>
+        <w:pStyle w:val="Compact"/>
+        <w:numPr>
+          <w:ilvl w:val="0"/>
+          <w:numId w:val="1016"/>
         </w:numPr>
       </w:pPr>
       <w:r>
@@ -5327,6 +5480,12 @@
     <w:abstractNumId w:val="991"/>
   </w:num>
   <w:num w:numId="1014">
+    <w:abstractNumId w:val="991"/>
+  </w:num>
+  <w:num w:numId="1015">
+    <w:abstractNumId w:val="991"/>
+  </w:num>
+  <w:num w:numId="1016">
     <w:abstractNumId w:val="991"/>
   </w:num>
 </w:numbering>

</xml_diff>

<commit_message>
Reorganiza seção VI Encontro da Renospen
</commit_message>
<xml_diff>
--- a/Documentação/estrutura_completa_pagina_onasp_para_dicom.docx
+++ b/Documentação/estrutura_completa_pagina_onasp_para_dicom.docx
@@ -1309,6 +1309,110 @@
       <w:r>
         <w:t xml:space="preserve">Seção:</w:t>
       </w:r>
+      <w:r>
+        <w:t xml:space="preserve"> </w:t>
+      </w:r>
+      <w:r>
+        <w:t xml:space="preserve">Mapa interativo e destaque por UF</w:t>
+      </w:r>
+    </w:p>
+    <w:p>
+      <w:pPr>
+        <w:pStyle w:val="BodyText"/>
+      </w:pPr>
+      <w:r>
+        <w:t xml:space="preserve">Texto para colar:</w:t>
+      </w:r>
+    </w:p>
+    <w:p>
+      <w:pPr>
+        <w:pStyle w:val="BodyText"/>
+      </w:pPr>
+      <w:r>
+        <w:t xml:space="preserve">Esta prévia reúne, em um único ponto, os contatos institucionais consolidados das unidades da federação. No ambiente de validação local, a consulta foi organizada por meio de um mapa visual com seleção por UF e painel lateral com dados resumidos da ouvidoria correspondente ou, quando cabível, das referências institucionais associadas à mesma unidade da federação.</w:t>
+      </w:r>
+    </w:p>
+    <w:p>
+      <w:pPr>
+        <w:pStyle w:val="BodyText"/>
+      </w:pPr>
+      <w:r>
+        <w:t xml:space="preserve">Orientação para publicação oficial:</w:t>
+      </w:r>
+    </w:p>
+    <w:p>
+      <w:pPr>
+        <w:pStyle w:val="BodyText"/>
+      </w:pPr>
+      <w:r>
+        <w:t xml:space="preserve">No ambiente gov.br, recomenda-se tratar o mapa interativo apenas como referência visual da prévia. A solução mais segura para publicação é manter um seletor simples por UF, um bloco expansível por estado ou, preferencialmente, o quadro textual de contatos apresentado abaixo, sem depender de JavaScript customizado.</w:t>
+      </w:r>
+    </w:p>
+    <w:p>
+      <w:pPr>
+        <w:pStyle w:val="BodyText"/>
+      </w:pPr>
+      <w:r>
+        <w:t xml:space="preserve">Quando a mesma UF tiver mais de uma referência institucional relevante, como ocorre no Espírito Santo, recomenda-se separar as informações em blocos independentes dentro do quadro lateral ou em linhas distintas no quadro textual, evitando misturar órgãos, responsáveis, telefones e endereços em uma única ficha.</w:t>
+      </w:r>
+    </w:p>
+    <w:p>
+      <w:pPr>
+        <w:pStyle w:val="BodyText"/>
+      </w:pPr>
+      <w:r>
+        <w:t xml:space="preserve">Regra editorial obrigatória:</w:t>
+      </w:r>
+    </w:p>
+    <w:p>
+      <w:pPr>
+        <w:pStyle w:val="BodyText"/>
+      </w:pPr>
+      <w:r>
+        <w:t xml:space="preserve">Detalhes de curadoria usados para consolidar os contatos devem permanecer apenas na documentação interna de trabalho. Não publicar na página expressões como</w:t>
+      </w:r>
+      <w:r>
+        <w:t xml:space="preserve"> </w:t>
+      </w:r>
+      <w:r>
+        <w:t xml:space="preserve">“o diagnóstico registrou”</w:t>
+      </w:r>
+      <w:r>
+        <w:t xml:space="preserve">,</w:t>
+      </w:r>
+      <w:r>
+        <w:t xml:space="preserve"> </w:t>
+      </w:r>
+      <w:r>
+        <w:t xml:space="preserve">“a resposta do diagnóstico informa”</w:t>
+      </w:r>
+      <w:r>
+        <w:t xml:space="preserve">, menções a respostas recebidas, observações internas de validação ou listas nominais de servidores designados.</w:t>
+      </w:r>
+    </w:p>
+    <w:p>
+      <w:pPr>
+        <w:pStyle w:val="BodyText"/>
+      </w:pPr>
+      <w:r>
+        <w:t xml:space="preserve">Base interna de consolidação (não publicar na página):</w:t>
+      </w:r>
+    </w:p>
+    <w:p>
+      <w:pPr>
+        <w:pStyle w:val="BodyText"/>
+      </w:pPr>
+      <w:r>
+        <w:t xml:space="preserve">Diagnóstico de Ouvidorias Estaduais, consolidado pela ONASP a partir das respostas recebidas em 2026.</w:t>
+      </w:r>
+    </w:p>
+    <w:p>
+      <w:pPr>
+        <w:pStyle w:val="BodyText"/>
+      </w:pPr>
+      <w:r>
+        <w:t xml:space="preserve">Seção:</w:t>
+      </w:r>
     </w:p>
     <w:p>
       <w:pPr>
@@ -1458,112 +1562,6 @@
     <w:p>
       <w:pPr>
         <w:pStyle w:val="FirstParagraph"/>
-      </w:pPr>
-      <w:r>
-        <w:t xml:space="preserve">Seção:</w:t>
-      </w:r>
-    </w:p>
-    <w:p>
-      <w:pPr>
-        <w:pStyle w:val="BodyText"/>
-      </w:pPr>
-      <w:r>
-        <w:t xml:space="preserve">Mapa interativo e destaque por UF</w:t>
-      </w:r>
-    </w:p>
-    <w:p>
-      <w:pPr>
-        <w:pStyle w:val="BodyText"/>
-      </w:pPr>
-      <w:r>
-        <w:t xml:space="preserve">Texto para colar:</w:t>
-      </w:r>
-    </w:p>
-    <w:p>
-      <w:pPr>
-        <w:pStyle w:val="BodyText"/>
-      </w:pPr>
-      <w:r>
-        <w:t xml:space="preserve">Esta prévia reúne, em um único ponto, os contatos institucionais consolidados das unidades da federação. No ambiente de validação local, a consulta foi organizada por meio de um mapa visual com seleção por UF e painel lateral com dados resumidos da ouvidoria correspondente ou, quando cabível, das referências institucionais associadas à mesma unidade da federação.</w:t>
-      </w:r>
-    </w:p>
-    <w:p>
-      <w:pPr>
-        <w:pStyle w:val="BodyText"/>
-      </w:pPr>
-      <w:r>
-        <w:t xml:space="preserve">Orientação para publicação oficial:</w:t>
-      </w:r>
-    </w:p>
-    <w:p>
-      <w:pPr>
-        <w:pStyle w:val="BodyText"/>
-      </w:pPr>
-      <w:r>
-        <w:t xml:space="preserve">No ambiente gov.br, recomenda-se tratar o mapa interativo apenas como referência visual da prévia. A solução mais segura para publicação é manter um seletor simples por UF, um bloco expansível por estado ou, preferencialmente, o quadro textual de contatos apresentado abaixo, sem depender de JavaScript customizado.</w:t>
-      </w:r>
-    </w:p>
-    <w:p>
-      <w:pPr>
-        <w:pStyle w:val="BodyText"/>
-      </w:pPr>
-      <w:r>
-        <w:t xml:space="preserve">Quando a mesma UF tiver mais de uma referência institucional relevante, como ocorre no Espírito Santo, recomenda-se separar as informações em blocos independentes dentro do quadro lateral ou em linhas distintas no quadro textual, evitando misturar órgãos, responsáveis, telefones e endereços em uma única ficha.</w:t>
-      </w:r>
-    </w:p>
-    <w:p>
-      <w:pPr>
-        <w:pStyle w:val="BodyText"/>
-      </w:pPr>
-      <w:r>
-        <w:t xml:space="preserve">Regra editorial obrigatória:</w:t>
-      </w:r>
-    </w:p>
-    <w:p>
-      <w:pPr>
-        <w:pStyle w:val="BodyText"/>
-      </w:pPr>
-      <w:r>
-        <w:t xml:space="preserve">Detalhes de curadoria usados para consolidar os contatos devem permanecer apenas na documentação interna de trabalho. Não publicar na página expressões como</w:t>
-      </w:r>
-      <w:r>
-        <w:t xml:space="preserve"> </w:t>
-      </w:r>
-      <w:r>
-        <w:t xml:space="preserve">“o diagnóstico registrou”</w:t>
-      </w:r>
-      <w:r>
-        <w:t xml:space="preserve">,</w:t>
-      </w:r>
-      <w:r>
-        <w:t xml:space="preserve"> </w:t>
-      </w:r>
-      <w:r>
-        <w:t xml:space="preserve">“a resposta do diagnóstico informa”</w:t>
-      </w:r>
-      <w:r>
-        <w:t xml:space="preserve">, menções a respostas recebidas, observações internas de validação ou listas nominais de servidores designados.</w:t>
-      </w:r>
-    </w:p>
-    <w:p>
-      <w:pPr>
-        <w:pStyle w:val="BodyText"/>
-      </w:pPr>
-      <w:r>
-        <w:t xml:space="preserve">Base interna de consolidação (não publicar na página):</w:t>
-      </w:r>
-    </w:p>
-    <w:p>
-      <w:pPr>
-        <w:pStyle w:val="BodyText"/>
-      </w:pPr>
-      <w:r>
-        <w:t xml:space="preserve">Diagnóstico de Ouvidorias Estaduais, consolidado pela ONASP a partir das respostas recebidas em 2026.</w:t>
-      </w:r>
-    </w:p>
-    <w:p>
-      <w:pPr>
-        <w:pStyle w:val="BodyText"/>
       </w:pPr>
       <w:r>
         <w:t xml:space="preserve">Seção:</w:t>

</xml_diff>

<commit_message>
Inclui curriculo do ouvidor na homepage
</commit_message>
<xml_diff>
--- a/Documentação/estrutura_completa_pagina_onasp_para_dicom.docx
+++ b/Documentação/estrutura_completa_pagina_onasp_para_dicom.docx
@@ -2,7 +2,7 @@
 <file path=word/document.xml><?xml version="1.0" encoding="utf-8"?>
 <w:document xmlns:w="http://schemas.openxmlformats.org/wordprocessingml/2006/main" xmlns:m="http://schemas.openxmlformats.org/officeDocument/2006/math" xmlns:r="http://schemas.openxmlformats.org/officeDocument/2006/relationships" xmlns:o="urn:schemas-microsoft-com:office:office" xmlns:v="urn:schemas-microsoft-com:vml" xmlns:w10="urn:schemas-microsoft-com:office:word" xmlns:a="http://schemas.openxmlformats.org/drawingml/2006/main" xmlns:pic="http://schemas.openxmlformats.org/drawingml/2006/picture" xmlns:wp="http://schemas.openxmlformats.org/drawingml/2006/wordprocessingDrawing">
   <w:body>
-    <w:bookmarkStart w:id="26" w:name="X651419ee04b722d3d77fb0d3ef8f3cab38d582a"/>
+    <w:bookmarkStart w:id="27" w:name="X651419ee04b722d3d77fb0d3ef8f3cab38d582a"/>
     <w:p>
       <w:pPr>
         <w:pStyle w:val="Heading1"/>
@@ -53,7 +53,7 @@
       </w:r>
     </w:p>
     <w:bookmarkEnd w:id="9"/>
-    <w:bookmarkStart w:id="19" w:name="Xbfa4aa77b994200a22daf31aefaeaa021a9038a"/>
+    <w:bookmarkStart w:id="20" w:name="Xbfa4aa77b994200a22daf31aefaeaa021a9038a"/>
     <w:p>
       <w:pPr>
         <w:pStyle w:val="Heading2"/>
@@ -487,458 +487,12 @@
         <w:t xml:space="preserve">Mapa da sede da SENAPPEN em visualização de ruas</w:t>
       </w:r>
     </w:p>
-    <w:bookmarkEnd w:id="14"/>
-    <w:bookmarkStart w:id="15" w:name="X10cfb45348f17ff5e2a336b10d512ec329838cc"/>
-    <w:p>
-      <w:pPr>
-        <w:pStyle w:val="Heading3"/>
-      </w:pPr>
-      <w:r>
-        <w:t xml:space="preserve">Bloco 6 - Conteúdo Técnico e Projetos Estruturantes</w:t>
-      </w:r>
-    </w:p>
-    <w:p>
-      <w:pPr>
-        <w:pStyle w:val="FirstParagraph"/>
-      </w:pPr>
-      <w:r>
-        <w:t xml:space="preserve">Título da seção:</w:t>
-      </w:r>
-    </w:p>
-    <w:p>
-      <w:pPr>
-        <w:pStyle w:val="BodyText"/>
-      </w:pPr>
-      <w:r>
-        <w:t xml:space="preserve">Conteúdo Técnico e Projetos Estruturantes</w:t>
-      </w:r>
-    </w:p>
-    <w:p>
-      <w:pPr>
-        <w:pStyle w:val="BodyText"/>
-      </w:pPr>
-      <w:r>
-        <w:t xml:space="preserve">Card 1:</w:t>
-      </w:r>
-    </w:p>
-    <w:p>
-      <w:pPr>
-        <w:pStyle w:val="BodyText"/>
-      </w:pPr>
-      <w:r>
-        <w:t xml:space="preserve">Título:</w:t>
-      </w:r>
-    </w:p>
-    <w:p>
-      <w:pPr>
-        <w:pStyle w:val="BodyText"/>
-      </w:pPr>
-      <w:r>
-        <w:t xml:space="preserve">Rede de Ouvidorias</w:t>
-      </w:r>
-    </w:p>
-    <w:p>
-      <w:pPr>
-        <w:pStyle w:val="BodyText"/>
-      </w:pPr>
-      <w:r>
-        <w:t xml:space="preserve">Descrição:</w:t>
-      </w:r>
-    </w:p>
-    <w:p>
-      <w:pPr>
-        <w:pStyle w:val="BodyText"/>
-      </w:pPr>
-      <w:r>
-        <w:t xml:space="preserve">Iniciativa do Plano Pena Justa voltada à cooperação federativa, à harmonização de procedimentos e ao fortalecimento da proteção de direitos no âmbito das Ouvidorias de Serviços Penais.</w:t>
-      </w:r>
-    </w:p>
-    <w:p>
-      <w:pPr>
-        <w:pStyle w:val="BodyText"/>
-      </w:pPr>
-      <w:r>
-        <w:t xml:space="preserve">Imagem:</w:t>
-      </w:r>
-    </w:p>
-    <w:p>
-      <w:pPr>
-        <w:pStyle w:val="BodyText"/>
-      </w:pPr>
-      <w:r>
-        <w:t xml:space="preserve">Documentação/Botao_Renospen.png</w:t>
-      </w:r>
-    </w:p>
-    <w:p>
-      <w:pPr>
-        <w:pStyle w:val="BodyText"/>
-      </w:pPr>
-      <w:r>
-        <w:t xml:space="preserve">Destino:</w:t>
-      </w:r>
-    </w:p>
-    <w:p>
-      <w:pPr>
-        <w:pStyle w:val="BodyText"/>
-      </w:pPr>
-      <w:r>
-        <w:t xml:space="preserve">Subpágina Rede de Ouvidorias</w:t>
-      </w:r>
-    </w:p>
-    <w:p>
-      <w:pPr>
-        <w:pStyle w:val="BodyText"/>
-      </w:pPr>
-      <w:r>
-        <w:t xml:space="preserve">Card 2:</w:t>
-      </w:r>
-    </w:p>
-    <w:p>
-      <w:pPr>
-        <w:pStyle w:val="BodyText"/>
-      </w:pPr>
-      <w:r>
-        <w:t xml:space="preserve">Título:</w:t>
-      </w:r>
-    </w:p>
-    <w:p>
-      <w:pPr>
-        <w:pStyle w:val="BodyText"/>
-      </w:pPr>
-      <w:r>
-        <w:t xml:space="preserve">EMA - SENAPPEN</w:t>
-      </w:r>
-    </w:p>
-    <w:p>
-      <w:pPr>
-        <w:pStyle w:val="BodyText"/>
-      </w:pPr>
-      <w:r>
-        <w:t xml:space="preserve">Descrição:</w:t>
-      </w:r>
-    </w:p>
-    <w:p>
-      <w:pPr>
-        <w:pStyle w:val="BodyText"/>
-      </w:pPr>
-      <w:r>
-        <w:t xml:space="preserve">Espaço da Equipe de Monitoramento e Acompanhamento das decisões e deliberações do Sistema Interamericano de Direitos Humanos em face do sistema penal nacional, dedicado a fortalecer o cumprimento das determinações do SIDH em parceria com as Unidades Federativas.</w:t>
-      </w:r>
-    </w:p>
-    <w:p>
-      <w:pPr>
-        <w:pStyle w:val="BodyText"/>
-      </w:pPr>
-      <w:r>
-        <w:t xml:space="preserve">Imagem:</w:t>
-      </w:r>
-    </w:p>
-    <w:p>
-      <w:pPr>
-        <w:pStyle w:val="BodyText"/>
-      </w:pPr>
-      <w:r>
-        <w:t xml:space="preserve">Documentação/Botao_EMA.png</w:t>
-      </w:r>
-    </w:p>
-    <w:p>
-      <w:pPr>
-        <w:pStyle w:val="BodyText"/>
-      </w:pPr>
-      <w:r>
-        <w:t xml:space="preserve">Destino:</w:t>
-      </w:r>
-    </w:p>
-    <w:p>
-      <w:pPr>
-        <w:pStyle w:val="BodyText"/>
-      </w:pPr>
-      <w:r>
-        <w:t xml:space="preserve">Subpágina EMA - SENAPPEN</w:t>
-      </w:r>
-    </w:p>
-    <w:p>
-      <w:pPr>
-        <w:pStyle w:val="BodyText"/>
-      </w:pPr>
-      <w:r>
-        <w:t xml:space="preserve">Card 3:</w:t>
-      </w:r>
-    </w:p>
-    <w:p>
-      <w:pPr>
-        <w:pStyle w:val="BodyText"/>
-      </w:pPr>
-      <w:r>
-        <w:t xml:space="preserve">Título:</w:t>
-      </w:r>
-    </w:p>
-    <w:p>
-      <w:pPr>
-        <w:pStyle w:val="BodyText"/>
-      </w:pPr>
-      <w:r>
-        <w:t xml:space="preserve">Plano Pena Justa</w:t>
-      </w:r>
-    </w:p>
-    <w:p>
-      <w:pPr>
-        <w:pStyle w:val="BodyText"/>
-      </w:pPr>
-      <w:r>
-        <w:t xml:space="preserve">Descrição:</w:t>
-      </w:r>
-    </w:p>
-    <w:p>
-      <w:pPr>
-        <w:pStyle w:val="BodyText"/>
-      </w:pPr>
-      <w:r>
-        <w:t xml:space="preserve">Ambiente dedicado integralmente ao Plano, que disponibiliza o acesso a cronogramas, documentos técnicos e relatórios de acompanhamento.</w:t>
-      </w:r>
-    </w:p>
-    <w:p>
-      <w:pPr>
-        <w:pStyle w:val="BodyText"/>
-      </w:pPr>
-      <w:r>
-        <w:t xml:space="preserve">Imagem:</w:t>
-      </w:r>
-    </w:p>
-    <w:p>
-      <w:pPr>
-        <w:pStyle w:val="BodyText"/>
-      </w:pPr>
-      <w:r>
-        <w:t xml:space="preserve">Documentação/Botao_PenaJusta.png</w:t>
-      </w:r>
-    </w:p>
-    <w:p>
-      <w:pPr>
-        <w:pStyle w:val="BodyText"/>
-      </w:pPr>
-      <w:r>
-        <w:t xml:space="preserve">Destino:</w:t>
-      </w:r>
-    </w:p>
-    <w:p>
-      <w:pPr>
-        <w:pStyle w:val="BodyText"/>
-      </w:pPr>
-      <w:r>
-        <w:t xml:space="preserve">Subpágina Plano Pena Justa</w:t>
-      </w:r>
-    </w:p>
-    <w:p>
-      <w:pPr>
-        <w:pStyle w:val="BodyText"/>
-      </w:pPr>
-      <w:r>
-        <w:t xml:space="preserve">Card 4:</w:t>
-      </w:r>
-    </w:p>
-    <w:p>
-      <w:pPr>
-        <w:pStyle w:val="BodyText"/>
-      </w:pPr>
-      <w:r>
-        <w:t xml:space="preserve">Título:</w:t>
-      </w:r>
-    </w:p>
-    <w:p>
-      <w:pPr>
-        <w:pStyle w:val="BodyText"/>
-      </w:pPr>
-      <w:r>
-        <w:t xml:space="preserve">Revista Brasileira de Execução Penal</w:t>
-      </w:r>
-    </w:p>
-    <w:p>
-      <w:pPr>
-        <w:pStyle w:val="BodyText"/>
-      </w:pPr>
-      <w:r>
-        <w:t xml:space="preserve">Descrição:</w:t>
-      </w:r>
-    </w:p>
-    <w:p>
-      <w:pPr>
-        <w:pStyle w:val="BodyText"/>
-      </w:pPr>
-      <w:r>
-        <w:t xml:space="preserve">Em articulação com a Espen e a DCOM, a Onasp reúne referências da Revista Brasileira de Execução Penal, com acesso a dossiês, notícias editoriais e conteúdos relacionados à participação social, transparência e direitos no sistema penal.</w:t>
-      </w:r>
-    </w:p>
-    <w:p>
-      <w:pPr>
-        <w:pStyle w:val="BodyText"/>
-      </w:pPr>
-      <w:r>
-        <w:t xml:space="preserve">Imagem:</w:t>
-      </w:r>
-    </w:p>
-    <w:p>
-      <w:pPr>
-        <w:pStyle w:val="BodyText"/>
-      </w:pPr>
-      <w:r>
-        <w:t xml:space="preserve">Documentação/Botao_RevistaBrasileira.png</w:t>
-      </w:r>
-    </w:p>
-    <w:p>
-      <w:pPr>
-        <w:pStyle w:val="BodyText"/>
-      </w:pPr>
-      <w:r>
-        <w:t xml:space="preserve">Destino:</w:t>
-      </w:r>
-    </w:p>
-    <w:p>
-      <w:pPr>
-        <w:pStyle w:val="BodyText"/>
-      </w:pPr>
-      <w:r>
-        <w:t xml:space="preserve">Subpágina Revista Brasileira de Execução Penal</w:t>
-      </w:r>
-    </w:p>
-    <w:bookmarkEnd w:id="15"/>
-    <w:bookmarkStart w:id="16" w:name="bloco-7---plano-de-metas-2026"/>
-    <w:p>
-      <w:pPr>
-        <w:pStyle w:val="Heading3"/>
-      </w:pPr>
-      <w:r>
-        <w:t xml:space="preserve">Bloco 7 - Plano de Metas 2026</w:t>
-      </w:r>
-    </w:p>
-    <w:p>
-      <w:pPr>
-        <w:pStyle w:val="FirstParagraph"/>
-      </w:pPr>
-      <w:r>
-        <w:t xml:space="preserve">Título da seção:</w:t>
-      </w:r>
-    </w:p>
-    <w:p>
-      <w:pPr>
-        <w:pStyle w:val="BodyText"/>
-      </w:pPr>
-      <w:r>
-        <w:t xml:space="preserve">Plano de Metas 2026</w:t>
-      </w:r>
-    </w:p>
-    <w:p>
-      <w:pPr>
-        <w:pStyle w:val="BodyText"/>
-      </w:pPr>
-      <w:r>
-        <w:t xml:space="preserve">Texto para colar:</w:t>
-      </w:r>
-    </w:p>
-    <w:p>
-      <w:pPr>
-        <w:pStyle w:val="BodyText"/>
-      </w:pPr>
-      <w:r>
-        <w:t xml:space="preserve">Alinhada às diretrizes de modernização da Secretaria Nacional de Políticas Penais, a Onasp apresenta seu Plano de Metas para o ciclo 2026. Este planejamento estratégico estrutura-se em eixos fundamentais: inovação tecnológica no atendimento, fortalecimento da governança federativa e educação continuada em cidadania. As ações listadas abaixo representam o compromisso público da Ouvidoria com a eficiência da gestão e a garantia de direitos no sistema penal.</w:t>
-      </w:r>
-    </w:p>
-    <w:p>
-      <w:pPr>
-        <w:pStyle w:val="BodyText"/>
-      </w:pPr>
-      <w:r>
-        <w:t xml:space="preserve">Imagem a inserir:</w:t>
-      </w:r>
-    </w:p>
-    <w:p>
-      <w:pPr>
-        <w:pStyle w:val="BodyText"/>
-      </w:pPr>
-      <w:r>
-        <w:t xml:space="preserve">Documentação/Banner_3_new.png</w:t>
-      </w:r>
-    </w:p>
-    <w:p>
-      <w:pPr>
-        <w:pStyle w:val="BodyText"/>
-      </w:pPr>
-      <w:r>
-        <w:t xml:space="preserve">Texto alternativo sugerido:</w:t>
-      </w:r>
-    </w:p>
-    <w:p>
-      <w:pPr>
-        <w:pStyle w:val="BodyText"/>
-      </w:pPr>
-      <w:r>
-        <w:t xml:space="preserve">Banner Plano de Metas 2026 da Ouvidoria Nacional de Serviços Penais.</w:t>
-      </w:r>
-    </w:p>
-    <w:bookmarkEnd w:id="16"/>
-    <w:bookmarkStart w:id="17" w:name="bloco-8---relatórios-de-gestão"/>
-    <w:p>
-      <w:pPr>
-        <w:pStyle w:val="Heading3"/>
-      </w:pPr>
-      <w:r>
-        <w:t xml:space="preserve">Bloco 8 - Relatórios de Gestão</w:t>
-      </w:r>
-    </w:p>
-    <w:p>
-      <w:pPr>
-        <w:pStyle w:val="FirstParagraph"/>
-      </w:pPr>
-      <w:r>
-        <w:t xml:space="preserve">Título da seção:</w:t>
-      </w:r>
-    </w:p>
-    <w:p>
-      <w:pPr>
-        <w:pStyle w:val="BodyText"/>
-      </w:pPr>
-      <w:r>
-        <w:t xml:space="preserve">Relatórios de Gestão</w:t>
-      </w:r>
-    </w:p>
-    <w:p>
-      <w:pPr>
-        <w:pStyle w:val="BodyText"/>
-      </w:pPr>
-      <w:r>
-        <w:t xml:space="preserve">Texto para colar:</w:t>
-      </w:r>
-    </w:p>
-    <w:p>
-      <w:pPr>
-        <w:pStyle w:val="BodyText"/>
-      </w:pPr>
-      <w:r>
-        <w:t xml:space="preserve">O Relatório de Gestão é o principal instrumento de transparência pública e prestação de contas da ONASP à sociedade.</w:t>
-      </w:r>
-    </w:p>
-    <w:p>
-      <w:pPr>
-        <w:pStyle w:val="BodyText"/>
-      </w:pPr>
-      <w:r>
-        <w:t xml:space="preserve">Este documento consolida, anualmente, as ações estratégicas voltadas ao aprimoramento do controle social, à melhoria das condições estruturais das ouvidorias estaduais e ao aumento da fiscalização sobre denúncias e solicitações.</w:t>
-      </w:r>
-    </w:p>
-    <w:p>
-      <w:pPr>
-        <w:pStyle w:val="BodyText"/>
-      </w:pPr>
-      <w:r>
-        <w:t xml:space="preserve">Ao disponibilizar esses dados, permitimos que cidadãos, pesquisadores e órgãos de controle acompanhem a evolução das políticas penais e os avanços efetivos na defesa de direitos dentro do sistema prisional.</w:t>
-      </w:r>
-    </w:p>
-    <w:p>
-      <w:pPr>
-        <w:pStyle w:val="BodyText"/>
-      </w:pPr>
-      <w:r>
-        <w:t xml:space="preserve">Links por ano:</w:t>
+    <w:p>
+      <w:pPr>
+        <w:pStyle w:val="BodyText"/>
+      </w:pPr>
+      <w:r>
+        <w:t xml:space="preserve">Informações de contato resumidas abaixo do mapa:</w:t>
       </w:r>
     </w:p>
     <w:p>
@@ -950,7 +504,7 @@
         </w:numPr>
       </w:pPr>
       <w:r>
-        <w:t xml:space="preserve">2025: https://www.gov.br/senappen/pt-br/acesso-a-informacao/participacao-social/ouvidoria/relatorio-de-gestao-de-ouvidoria</w:t>
+        <w:t xml:space="preserve">Endereço: Setor Comercial Norte Q 4, Edifício Multibrasil Corporate, Plano Piloto, Brasília - DF, 70714-903.</w:t>
       </w:r>
     </w:p>
     <w:p>
@@ -962,7 +516,7 @@
         </w:numPr>
       </w:pPr>
       <w:r>
-        <w:t xml:space="preserve">2024: https://www.gov.br/senappen/pt-br/acesso-a-informacao/participacao-social/ouvidoria/relatorio-de-gestao-de-ouvidoria</w:t>
+        <w:t xml:space="preserve">Telefone: (61) 3770-5034.</w:t>
       </w:r>
     </w:p>
     <w:p>
@@ -974,17 +528,17 @@
         </w:numPr>
       </w:pPr>
       <w:r>
-        <w:t xml:space="preserve">2023: https://www.gov.br/senappen/pt-br/acesso-a-informacao/participacao-social/ouvidoria/relatorio-de-gestao-de-ouvidoria</w:t>
-      </w:r>
-    </w:p>
-    <w:bookmarkEnd w:id="17"/>
-    <w:bookmarkStart w:id="18" w:name="Xf8c04e3f5703c62803234b98626596682d8e738"/>
+        <w:t xml:space="preserve">E-mail: ouvidoria.senappen@mj.gov.br.</w:t>
+      </w:r>
+    </w:p>
+    <w:bookmarkEnd w:id="14"/>
+    <w:bookmarkStart w:id="15" w:name="bloco-6---currículo-do-ouvidor"/>
     <w:p>
       <w:pPr>
         <w:pStyle w:val="Heading3"/>
       </w:pPr>
       <w:r>
-        <w:t xml:space="preserve">Bloco 9 - Painel de Tratamento de Demandas</w:t>
+        <w:t xml:space="preserve">Bloco 6 - Currículo do Ouvidor</w:t>
       </w:r>
     </w:p>
     <w:p>
@@ -1000,7 +554,23 @@
         <w:pStyle w:val="BodyText"/>
       </w:pPr>
       <w:r>
-        <w:t xml:space="preserve">Painel de Tratamento de Demandas da Ouvidoria Nacional de Serviços Penais</w:t>
+        <w:t xml:space="preserve">Currículo do Ouvidor</w:t>
+      </w:r>
+    </w:p>
+    <w:p>
+      <w:pPr>
+        <w:pStyle w:val="BodyText"/>
+      </w:pPr>
+      <w:r>
+        <w:t xml:space="preserve">Linha de identificação:</w:t>
+      </w:r>
+    </w:p>
+    <w:p>
+      <w:pPr>
+        <w:pStyle w:val="BodyText"/>
+      </w:pPr>
+      <w:r>
+        <w:t xml:space="preserve">João Vitor Elpídio Ferreira | Ouvidor Nacional de Serviços Penais</w:t>
       </w:r>
     </w:p>
     <w:p>
@@ -1016,202 +586,15 @@
         <w:pStyle w:val="BodyText"/>
       </w:pPr>
       <w:r>
-        <w:t xml:space="preserve">O Painel de Tratamento de Demandas da Ouvidoria Nacional de Serviços Penais (Onasp) é uma ferramenta de transparência ativa e gestão estratégica. Por meio de tecnologia de Business Intelligence (BI), o painel permite ao cidadão pesquisar e visualizar estatísticas atualizadas sobre as manifestações recebidas (denúncias, reclamações, solicitações, sugestões e elogios), monitorando os indicadores de desempenho e os temas mais recorrentes no sistema penal. A base de dados contempla registros a partir de janeiro de 2023, sendo atualizada periodicamente para garantir o controle social efetivo.</w:t>
-      </w:r>
-    </w:p>
-    <w:p>
-      <w:pPr>
-        <w:pStyle w:val="BodyText"/>
-      </w:pPr>
-      <w:r>
-        <w:t xml:space="preserve">Embed do Power BI:</w:t>
-      </w:r>
-    </w:p>
-    <w:p>
-      <w:pPr>
-        <w:pStyle w:val="BodyText"/>
-      </w:pPr>
-      <w:r>
-        <w:t xml:space="preserve">https://app.powerbi.com/view?r=eyJrIjoiMDU5NGVlNjQtMjZmZi00YzI0LTk0ZTktMzQwMzdkM2QyMDg5IiwidCI6ImViMDkwNDIwLTQ0NGMtNDNmNy05MWYyLTRiOGRhNmJmZThlMSJ9</w:t>
-      </w:r>
-    </w:p>
-    <w:p>
-      <w:pPr>
-        <w:pStyle w:val="BodyText"/>
-      </w:pPr>
-      <w:r>
-        <w:t xml:space="preserve">Título acessível sugerido para o iframe:</w:t>
-      </w:r>
-    </w:p>
-    <w:p>
-      <w:pPr>
-        <w:pStyle w:val="BodyText"/>
-      </w:pPr>
-      <w:r>
-        <w:t xml:space="preserve">Painel de Tratamento de Demandas da ONASP</w:t>
-      </w:r>
-    </w:p>
-    <w:bookmarkEnd w:id="18"/>
-    <w:bookmarkEnd w:id="19"/>
-    <w:bookmarkStart w:id="20" w:name="subpágina-1---rede-de-ouvidorias"/>
-    <w:p>
-      <w:pPr>
-        <w:pStyle w:val="Heading2"/>
-      </w:pPr>
-      <w:r>
-        <w:t xml:space="preserve">Subpágina 1 - Rede de Ouvidorias</w:t>
-      </w:r>
-    </w:p>
-    <w:p>
-      <w:pPr>
-        <w:pStyle w:val="FirstParagraph"/>
-      </w:pPr>
-      <w:r>
-        <w:t xml:space="preserve">Título da página:</w:t>
-      </w:r>
-    </w:p>
-    <w:p>
-      <w:pPr>
-        <w:pStyle w:val="BodyText"/>
-      </w:pPr>
-      <w:r>
-        <w:t xml:space="preserve">Rede de Ouvidorias</w:t>
-      </w:r>
-    </w:p>
-    <w:p>
-      <w:pPr>
-        <w:pStyle w:val="BodyText"/>
-      </w:pPr>
-      <w:r>
-        <w:t xml:space="preserve">Imagem de destaque:</w:t>
-      </w:r>
-    </w:p>
-    <w:p>
-      <w:pPr>
-        <w:pStyle w:val="BodyText"/>
-      </w:pPr>
-      <w:r>
-        <w:t xml:space="preserve">Documentação/Botao_Renospen.png</w:t>
-      </w:r>
-    </w:p>
-    <w:p>
-      <w:pPr>
-        <w:pStyle w:val="BodyText"/>
-      </w:pPr>
-      <w:r>
-        <w:t xml:space="preserve">Texto alternativo sugerido:</w:t>
-      </w:r>
-    </w:p>
-    <w:p>
-      <w:pPr>
-        <w:pStyle w:val="BodyText"/>
-      </w:pPr>
-      <w:r>
-        <w:t xml:space="preserve">Botão institucional da Rede de Ouvidorias.</w:t>
-      </w:r>
-    </w:p>
-    <w:p>
-      <w:pPr>
-        <w:pStyle w:val="BodyText"/>
-      </w:pPr>
-      <w:r>
-        <w:t xml:space="preserve">Identificador editorial:</w:t>
-      </w:r>
-    </w:p>
-    <w:p>
-      <w:pPr>
-        <w:pStyle w:val="BodyText"/>
-      </w:pPr>
-      <w:r>
-        <w:t xml:space="preserve">Conteúdo Técnico e Projetos Estruturantes</w:t>
-      </w:r>
-    </w:p>
-    <w:p>
-      <w:pPr>
-        <w:pStyle w:val="BodyText"/>
-      </w:pPr>
-      <w:r>
-        <w:t xml:space="preserve">Texto de destaque:</w:t>
-      </w:r>
-    </w:p>
-    <w:p>
-      <w:pPr>
-        <w:pStyle w:val="BodyText"/>
-      </w:pPr>
-      <w:r>
-        <w:t xml:space="preserve">Iniciativa do Plano Pena Justa voltada à cooperação federativa, à harmonização de procedimentos e ao fortalecimento da proteção de direitos no âmbito das Ouvidorias de Serviços Penais.</w:t>
-      </w:r>
-    </w:p>
-    <w:p>
-      <w:pPr>
-        <w:pStyle w:val="BodyText"/>
-      </w:pPr>
-      <w:r>
-        <w:t xml:space="preserve">Seção:</w:t>
-      </w:r>
-    </w:p>
-    <w:p>
-      <w:pPr>
-        <w:pStyle w:val="BodyText"/>
-      </w:pPr>
-      <w:r>
-        <w:t xml:space="preserve">Renospen</w:t>
-      </w:r>
-    </w:p>
-    <w:p>
-      <w:pPr>
-        <w:pStyle w:val="BodyText"/>
-      </w:pPr>
-      <w:r>
-        <w:t xml:space="preserve">Texto para colar:</w:t>
-      </w:r>
-    </w:p>
-    <w:p>
-      <w:pPr>
-        <w:pStyle w:val="BodyText"/>
-      </w:pPr>
-      <w:r>
-        <w:t xml:space="preserve">A Rede de Ouvidorias visa manter a articulação entre as unidades responsáveis pela escuta institucional no sistema penal, com o objetivo de fortalecer a cooperação federativa, qualificar o atendimento ao cidadão e ampliar a proteção de direitos em âmbito nacional.</w:t>
-      </w:r>
-    </w:p>
-    <w:p>
-      <w:pPr>
-        <w:pStyle w:val="BodyText"/>
-      </w:pPr>
-      <w:r>
-        <w:t xml:space="preserve">A segunda linha do escopo:</w:t>
-      </w:r>
-    </w:p>
-    <w:p>
-      <w:pPr>
-        <w:pStyle w:val="BodyText"/>
-      </w:pPr>
-      <w:r>
-        <w:t xml:space="preserve">No contexto da Ouvidoria Nacional de Serviços Penais, esta subpágina reúne referências públicas da iniciativa, favorecendo o intercâmbio de práticas, a harmonização de procedimentos e a consolidação de parâmetros voltados à transparência e ao controle social.</w:t>
-      </w:r>
-    </w:p>
-    <w:p>
-      <w:pPr>
-        <w:pStyle w:val="BodyText"/>
-      </w:pPr>
-      <w:r>
-        <w:t xml:space="preserve">Seção:</w:t>
-      </w:r>
-    </w:p>
-    <w:p>
-      <w:pPr>
-        <w:pStyle w:val="BodyText"/>
-      </w:pPr>
-      <w:r>
-        <w:t xml:space="preserve">Objetivos da Rede</w:t>
-      </w:r>
-    </w:p>
-    <w:p>
-      <w:pPr>
-        <w:pStyle w:val="BodyText"/>
-      </w:pPr>
-      <w:r>
-        <w:t xml:space="preserve">Itens para colar:</w:t>
+        <w:t xml:space="preserve">João Vitor Elpídio Ferreira é Ouvidor Nacional de Serviços Penais, Coordenador-Executivo da Equipe de Monitoramento e Acompanhamento das Decisões do SIDH, Coordenador Executivo-Adjunto da Equipe de Assuntos Internacionais no âmbito da Senappen e Presidente do Grupo de Trabalho voltado à construção de um Manual de Classificação Técnica de Pessoas Privadas de Liberdade.</w:t>
+      </w:r>
+    </w:p>
+    <w:p>
+      <w:pPr>
+        <w:pStyle w:val="BodyText"/>
+      </w:pPr>
+      <w:r>
+        <w:t xml:space="preserve">Formação acadêmica e experiência resumidas:</w:t>
       </w:r>
     </w:p>
     <w:p>
@@ -1223,7 +606,7 @@
         </w:numPr>
       </w:pPr>
       <w:r>
-        <w:t xml:space="preserve">Atuar como espaço de difusão de referências técnicas úteis às ouvidorias de serviços penais.</w:t>
+        <w:t xml:space="preserve">Formação acadêmica: graduação em Direito pela Universidade Vila Velha (2004-2008) e especialização lato sensu em Direito Penal pelo Instituto Damásio de Direito (2017-2018).</w:t>
       </w:r>
     </w:p>
     <w:p>
@@ -1235,7 +618,7 @@
         </w:numPr>
       </w:pPr>
       <w:r>
-        <w:t xml:space="preserve">Fomentar o compartilhamento de práticas, fluxos e instrumentos voltados ao atendimento e ao encaminhamento de manifestações.</w:t>
+        <w:t xml:space="preserve">Formação complementar: Programa Ouvidoria da ENAP (210h), Programa de Formação e Desenvolvimento de Líderes - Identidade Líder Senappen, curso de Diretoria de Inteligência com foco em organizações criminosas e capacitação em gerenciamento de projetos, além de participação no Fórum Brasileiro de Segurança Pública.</w:t>
       </w:r>
     </w:p>
     <w:p>
@@ -1247,19 +630,7 @@
         </w:numPr>
       </w:pPr>
       <w:r>
-        <w:t xml:space="preserve">Estimular a cooperação entre a União, os Estados e o Distrito Federal para o aprimoramento da atuação institucional.</w:t>
-      </w:r>
-    </w:p>
-    <w:p>
-      <w:pPr>
-        <w:pStyle w:val="Compact"/>
-        <w:numPr>
-          <w:ilvl w:val="0"/>
-          <w:numId w:val="1003"/>
-        </w:numPr>
-      </w:pPr>
-      <w:r>
-        <w:t xml:space="preserve">Fortalecer a participação social, a transparência pública e a proteção de direitos no sistema penal.</w:t>
+        <w:t xml:space="preserve">Experiência profissional: Ouvidor Nacional de Serviços Penais desde 2025; policial penal mobilizado na Assessoria Direta do Secretário Nacional de Políticas Penais entre 2024 e 2025; policial penal efetivo da Secretaria de Estado da Justiça do Espírito Santo desde 2015; professor em 2018; advogado entre 2009 e 2015; e assessor de Juiz de 1º Grau no Tribunal de Justiça do Espírito Santo entre 2005 e 2006.</w:t>
       </w:r>
     </w:p>
     <w:p>
@@ -1267,183 +638,7 @@
         <w:pStyle w:val="FirstParagraph"/>
       </w:pPr>
       <w:r>
-        <w:t xml:space="preserve">Seção:</w:t>
-      </w:r>
-    </w:p>
-    <w:p>
-      <w:pPr>
-        <w:pStyle w:val="BodyText"/>
-      </w:pPr>
-      <w:r>
-        <w:t xml:space="preserve">Governança e cooperação técnica</w:t>
-      </w:r>
-    </w:p>
-    <w:p>
-      <w:pPr>
-        <w:pStyle w:val="BodyText"/>
-      </w:pPr>
-      <w:r>
-        <w:t xml:space="preserve">Texto para colar:</w:t>
-      </w:r>
-    </w:p>
-    <w:p>
-      <w:pPr>
-        <w:pStyle w:val="BodyText"/>
-      </w:pPr>
-      <w:r>
-        <w:t xml:space="preserve">No recorte da ONASP, a Rede de Ouvidorias pode ser apresentada como espaço permanente de articulação entre unidades responsáveis pela escuta institucional, com foco em difusão de referências técnicas, intercâmbio de práticas e aperfeiçoamento contínuo da atuação no sistema penal.</w:t>
-      </w:r>
-    </w:p>
-    <w:p>
-      <w:pPr>
-        <w:pStyle w:val="BodyText"/>
-      </w:pPr>
-      <w:r>
-        <w:t xml:space="preserve">Esse arranjo é reforçado por instrumentos que definem parâmetros mínimos para a estruturação das ouvidorias e institucionalizam a Renospen como instância de cooperação técnica, integração federativa e fortalecimento institucional.</w:t>
-      </w:r>
-    </w:p>
-    <w:p>
-      <w:pPr>
-        <w:pStyle w:val="BodyText"/>
-      </w:pPr>
-      <w:r>
-        <w:t xml:space="preserve">Seção:</w:t>
-      </w:r>
-      <w:r>
-        <w:t xml:space="preserve"> </w:t>
-      </w:r>
-      <w:r>
-        <w:t xml:space="preserve">Mapa interativo e destaque por UF</w:t>
-      </w:r>
-    </w:p>
-    <w:p>
-      <w:pPr>
-        <w:pStyle w:val="BodyText"/>
-      </w:pPr>
-      <w:r>
-        <w:t xml:space="preserve">Texto para colar:</w:t>
-      </w:r>
-    </w:p>
-    <w:p>
-      <w:pPr>
-        <w:pStyle w:val="BodyText"/>
-      </w:pPr>
-      <w:r>
-        <w:t xml:space="preserve">Esta prévia reúne, em um único ponto, os contatos institucionais consolidados das unidades da federação. No ambiente de validação local, a consulta foi organizada por meio de um mapa visual com seleção por UF e painel lateral com dados resumidos da ouvidoria correspondente ou, quando cabível, das referências institucionais associadas à mesma unidade da federação.</w:t>
-      </w:r>
-    </w:p>
-    <w:p>
-      <w:pPr>
-        <w:pStyle w:val="BodyText"/>
-      </w:pPr>
-      <w:r>
-        <w:t xml:space="preserve">Orientação para publicação oficial:</w:t>
-      </w:r>
-    </w:p>
-    <w:p>
-      <w:pPr>
-        <w:pStyle w:val="BodyText"/>
-      </w:pPr>
-      <w:r>
-        <w:t xml:space="preserve">No ambiente gov.br, recomenda-se tratar o mapa interativo apenas como referência visual da prévia. A solução mais segura para publicação é manter um seletor simples por UF, um bloco expansível por estado ou, preferencialmente, o quadro textual de contatos apresentado abaixo, sem depender de JavaScript customizado.</w:t>
-      </w:r>
-    </w:p>
-    <w:p>
-      <w:pPr>
-        <w:pStyle w:val="BodyText"/>
-      </w:pPr>
-      <w:r>
-        <w:t xml:space="preserve">Quando a mesma UF tiver mais de uma referência institucional relevante, como ocorre no Espírito Santo, recomenda-se separar as informações em blocos independentes dentro do quadro lateral ou em linhas distintas no quadro textual, evitando misturar órgãos, responsáveis, telefones e endereços em uma única ficha.</w:t>
-      </w:r>
-    </w:p>
-    <w:p>
-      <w:pPr>
-        <w:pStyle w:val="BodyText"/>
-      </w:pPr>
-      <w:r>
-        <w:t xml:space="preserve">Regra editorial obrigatória:</w:t>
-      </w:r>
-    </w:p>
-    <w:p>
-      <w:pPr>
-        <w:pStyle w:val="BodyText"/>
-      </w:pPr>
-      <w:r>
-        <w:t xml:space="preserve">Detalhes de curadoria usados para consolidar os contatos devem permanecer apenas na documentação interna de trabalho. Não publicar na página expressões como</w:t>
-      </w:r>
-      <w:r>
-        <w:t xml:space="preserve"> </w:t>
-      </w:r>
-      <w:r>
-        <w:t xml:space="preserve">“o diagnóstico registrou”</w:t>
-      </w:r>
-      <w:r>
-        <w:t xml:space="preserve">,</w:t>
-      </w:r>
-      <w:r>
-        <w:t xml:space="preserve"> </w:t>
-      </w:r>
-      <w:r>
-        <w:t xml:space="preserve">“a resposta do diagnóstico informa”</w:t>
-      </w:r>
-      <w:r>
-        <w:t xml:space="preserve">, menções a respostas recebidas, observações internas de validação ou listas nominais de servidores designados.</w:t>
-      </w:r>
-    </w:p>
-    <w:p>
-      <w:pPr>
-        <w:pStyle w:val="BodyText"/>
-      </w:pPr>
-      <w:r>
-        <w:t xml:space="preserve">Base interna de consolidação (não publicar na página):</w:t>
-      </w:r>
-    </w:p>
-    <w:p>
-      <w:pPr>
-        <w:pStyle w:val="BodyText"/>
-      </w:pPr>
-      <w:r>
-        <w:t xml:space="preserve">Diagnóstico de Ouvidorias Estaduais, consolidado pela ONASP a partir das respostas recebidas em 2026.</w:t>
-      </w:r>
-    </w:p>
-    <w:p>
-      <w:pPr>
-        <w:pStyle w:val="BodyText"/>
-      </w:pPr>
-      <w:r>
-        <w:t xml:space="preserve">Seção:</w:t>
-      </w:r>
-    </w:p>
-    <w:p>
-      <w:pPr>
-        <w:pStyle w:val="BodyText"/>
-      </w:pPr>
-      <w:r>
-        <w:t xml:space="preserve">VI Encontro Nacional das Ouvidorias do Sistema Penal</w:t>
-      </w:r>
-    </w:p>
-    <w:p>
-      <w:pPr>
-        <w:pStyle w:val="BodyText"/>
-      </w:pPr>
-      <w:r>
-        <w:t xml:space="preserve">Texto para colar:</w:t>
-      </w:r>
-    </w:p>
-    <w:p>
-      <w:pPr>
-        <w:pStyle w:val="BodyText"/>
-      </w:pPr>
-      <w:r>
-        <w:t xml:space="preserve">O VI Encontro Nacional das Ouvidorias do Sistema Penal, promovido pela Senappen entre 8 e 10 de abril, consolidou um novo marco para a gestão penitenciária com o lançamento da Rede Nacional de Ouvidorias de Serviços Penais (Renospen) e a publicação de uma Instrução Normativa para padronizar essas instâncias nos estados. Alinhado ao Plano Nacional Pena Justa, o evento focou no fortalecimento da transparência, do controle social e da promoção de direitos humanos, unificando diretrizes nacionais enquanto respeita as autonomias locais. Além dos painéis sobre gestão estratégica e escuta ética, a iniciativa contemplou a doação de equipamentos tecnológicos para todas as unidades federativas, visando modernizar o atendimento e estreitar a comunicação entre o sistema penal e a sociedade brasileira.</w:t>
-      </w:r>
-    </w:p>
-    <w:p>
-      <w:pPr>
-        <w:pStyle w:val="BodyText"/>
-      </w:pPr>
-      <w:r>
-        <w:t xml:space="preserve">Imagens a inserir:</w:t>
+        <w:t xml:space="preserve">Link documental complementar:</w:t>
       </w:r>
     </w:p>
     <w:p>
@@ -1455,31 +650,17 @@
         </w:numPr>
       </w:pPr>
       <w:r>
-        <w:t xml:space="preserve">Documentação/Banner_Renospen_1.jpeg</w:t>
-      </w:r>
-    </w:p>
-    <w:p>
-      <w:pPr>
-        <w:pStyle w:val="Compact"/>
-        <w:numPr>
-          <w:ilvl w:val="0"/>
-          <w:numId w:val="1004"/>
-        </w:numPr>
-      </w:pPr>
-      <w:r>
-        <w:t xml:space="preserve">Documentação/Banner_Renospen_2.jpeg</w:t>
-      </w:r>
-    </w:p>
-    <w:p>
-      <w:pPr>
-        <w:pStyle w:val="Compact"/>
-        <w:numPr>
-          <w:ilvl w:val="0"/>
-          <w:numId w:val="1004"/>
-        </w:numPr>
-      </w:pPr>
-      <w:r>
-        <w:t xml:space="preserve">Documentação/Banner_Renospen_3.jpeg</w:t>
+        <w:t xml:space="preserve">Currículo completo em PDF: Documentação/Curriculo_Joao_vitor_elpidio_Ferreira.pdf</w:t>
+      </w:r>
+    </w:p>
+    <w:bookmarkEnd w:id="15"/>
+    <w:bookmarkStart w:id="16" w:name="Xccdc27266aaf5dcade8082aa450ae7a31c83649"/>
+    <w:p>
+      <w:pPr>
+        <w:pStyle w:val="Heading3"/>
+      </w:pPr>
+      <w:r>
+        <w:t xml:space="preserve">Bloco 7 - Conteúdo Técnico e Projetos Estruturantes</w:t>
       </w:r>
     </w:p>
     <w:p>
@@ -1487,7 +668,443 @@
         <w:pStyle w:val="FirstParagraph"/>
       </w:pPr>
       <w:r>
-        <w:t xml:space="preserve">Ordem e destaque sugeridos:</w:t>
+        <w:t xml:space="preserve">Título da seção:</w:t>
+      </w:r>
+    </w:p>
+    <w:p>
+      <w:pPr>
+        <w:pStyle w:val="BodyText"/>
+      </w:pPr>
+      <w:r>
+        <w:t xml:space="preserve">Conteúdo Técnico e Projetos Estruturantes</w:t>
+      </w:r>
+    </w:p>
+    <w:p>
+      <w:pPr>
+        <w:pStyle w:val="BodyText"/>
+      </w:pPr>
+      <w:r>
+        <w:t xml:space="preserve">Card 1:</w:t>
+      </w:r>
+    </w:p>
+    <w:p>
+      <w:pPr>
+        <w:pStyle w:val="BodyText"/>
+      </w:pPr>
+      <w:r>
+        <w:t xml:space="preserve">Título:</w:t>
+      </w:r>
+    </w:p>
+    <w:p>
+      <w:pPr>
+        <w:pStyle w:val="BodyText"/>
+      </w:pPr>
+      <w:r>
+        <w:t xml:space="preserve">Rede de Ouvidorias</w:t>
+      </w:r>
+    </w:p>
+    <w:p>
+      <w:pPr>
+        <w:pStyle w:val="BodyText"/>
+      </w:pPr>
+      <w:r>
+        <w:t xml:space="preserve">Descrição:</w:t>
+      </w:r>
+    </w:p>
+    <w:p>
+      <w:pPr>
+        <w:pStyle w:val="BodyText"/>
+      </w:pPr>
+      <w:r>
+        <w:t xml:space="preserve">Iniciativa do Plano Pena Justa voltada à cooperação federativa, à harmonização de procedimentos e ao fortalecimento da proteção de direitos no âmbito das Ouvidorias de Serviços Penais.</w:t>
+      </w:r>
+    </w:p>
+    <w:p>
+      <w:pPr>
+        <w:pStyle w:val="BodyText"/>
+      </w:pPr>
+      <w:r>
+        <w:t xml:space="preserve">Imagem:</w:t>
+      </w:r>
+    </w:p>
+    <w:p>
+      <w:pPr>
+        <w:pStyle w:val="BodyText"/>
+      </w:pPr>
+      <w:r>
+        <w:t xml:space="preserve">Documentação/Botao_Renospen.png</w:t>
+      </w:r>
+    </w:p>
+    <w:p>
+      <w:pPr>
+        <w:pStyle w:val="BodyText"/>
+      </w:pPr>
+      <w:r>
+        <w:t xml:space="preserve">Destino:</w:t>
+      </w:r>
+    </w:p>
+    <w:p>
+      <w:pPr>
+        <w:pStyle w:val="BodyText"/>
+      </w:pPr>
+      <w:r>
+        <w:t xml:space="preserve">Subpágina Rede de Ouvidorias</w:t>
+      </w:r>
+    </w:p>
+    <w:p>
+      <w:pPr>
+        <w:pStyle w:val="BodyText"/>
+      </w:pPr>
+      <w:r>
+        <w:t xml:space="preserve">Card 2:</w:t>
+      </w:r>
+    </w:p>
+    <w:p>
+      <w:pPr>
+        <w:pStyle w:val="BodyText"/>
+      </w:pPr>
+      <w:r>
+        <w:t xml:space="preserve">Título:</w:t>
+      </w:r>
+    </w:p>
+    <w:p>
+      <w:pPr>
+        <w:pStyle w:val="BodyText"/>
+      </w:pPr>
+      <w:r>
+        <w:t xml:space="preserve">EMA - SENAPPEN</w:t>
+      </w:r>
+    </w:p>
+    <w:p>
+      <w:pPr>
+        <w:pStyle w:val="BodyText"/>
+      </w:pPr>
+      <w:r>
+        <w:t xml:space="preserve">Descrição:</w:t>
+      </w:r>
+    </w:p>
+    <w:p>
+      <w:pPr>
+        <w:pStyle w:val="BodyText"/>
+      </w:pPr>
+      <w:r>
+        <w:t xml:space="preserve">Espaço da Equipe de Monitoramento e Acompanhamento das decisões e deliberações do Sistema Interamericano de Direitos Humanos em face do sistema penal nacional, dedicado a fortalecer o cumprimento das determinações do SIDH em parceria com as Unidades Federativas.</w:t>
+      </w:r>
+    </w:p>
+    <w:p>
+      <w:pPr>
+        <w:pStyle w:val="BodyText"/>
+      </w:pPr>
+      <w:r>
+        <w:t xml:space="preserve">Imagem:</w:t>
+      </w:r>
+    </w:p>
+    <w:p>
+      <w:pPr>
+        <w:pStyle w:val="BodyText"/>
+      </w:pPr>
+      <w:r>
+        <w:t xml:space="preserve">Documentação/Botao_EMA.png</w:t>
+      </w:r>
+    </w:p>
+    <w:p>
+      <w:pPr>
+        <w:pStyle w:val="BodyText"/>
+      </w:pPr>
+      <w:r>
+        <w:t xml:space="preserve">Destino:</w:t>
+      </w:r>
+    </w:p>
+    <w:p>
+      <w:pPr>
+        <w:pStyle w:val="BodyText"/>
+      </w:pPr>
+      <w:r>
+        <w:t xml:space="preserve">Subpágina EMA - SENAPPEN</w:t>
+      </w:r>
+    </w:p>
+    <w:p>
+      <w:pPr>
+        <w:pStyle w:val="BodyText"/>
+      </w:pPr>
+      <w:r>
+        <w:t xml:space="preserve">Card 3:</w:t>
+      </w:r>
+    </w:p>
+    <w:p>
+      <w:pPr>
+        <w:pStyle w:val="BodyText"/>
+      </w:pPr>
+      <w:r>
+        <w:t xml:space="preserve">Título:</w:t>
+      </w:r>
+    </w:p>
+    <w:p>
+      <w:pPr>
+        <w:pStyle w:val="BodyText"/>
+      </w:pPr>
+      <w:r>
+        <w:t xml:space="preserve">Plano Pena Justa</w:t>
+      </w:r>
+    </w:p>
+    <w:p>
+      <w:pPr>
+        <w:pStyle w:val="BodyText"/>
+      </w:pPr>
+      <w:r>
+        <w:t xml:space="preserve">Descrição:</w:t>
+      </w:r>
+    </w:p>
+    <w:p>
+      <w:pPr>
+        <w:pStyle w:val="BodyText"/>
+      </w:pPr>
+      <w:r>
+        <w:t xml:space="preserve">Ambiente dedicado integralmente ao Plano, que disponibiliza o acesso a cronogramas, documentos técnicos e relatórios de acompanhamento.</w:t>
+      </w:r>
+    </w:p>
+    <w:p>
+      <w:pPr>
+        <w:pStyle w:val="BodyText"/>
+      </w:pPr>
+      <w:r>
+        <w:t xml:space="preserve">Imagem:</w:t>
+      </w:r>
+    </w:p>
+    <w:p>
+      <w:pPr>
+        <w:pStyle w:val="BodyText"/>
+      </w:pPr>
+      <w:r>
+        <w:t xml:space="preserve">Documentação/Botao_PenaJusta.png</w:t>
+      </w:r>
+    </w:p>
+    <w:p>
+      <w:pPr>
+        <w:pStyle w:val="BodyText"/>
+      </w:pPr>
+      <w:r>
+        <w:t xml:space="preserve">Destino:</w:t>
+      </w:r>
+    </w:p>
+    <w:p>
+      <w:pPr>
+        <w:pStyle w:val="BodyText"/>
+      </w:pPr>
+      <w:r>
+        <w:t xml:space="preserve">Subpágina Plano Pena Justa</w:t>
+      </w:r>
+    </w:p>
+    <w:p>
+      <w:pPr>
+        <w:pStyle w:val="BodyText"/>
+      </w:pPr>
+      <w:r>
+        <w:t xml:space="preserve">Card 4:</w:t>
+      </w:r>
+    </w:p>
+    <w:p>
+      <w:pPr>
+        <w:pStyle w:val="BodyText"/>
+      </w:pPr>
+      <w:r>
+        <w:t xml:space="preserve">Título:</w:t>
+      </w:r>
+    </w:p>
+    <w:p>
+      <w:pPr>
+        <w:pStyle w:val="BodyText"/>
+      </w:pPr>
+      <w:r>
+        <w:t xml:space="preserve">Revista Brasileira de Execução Penal</w:t>
+      </w:r>
+    </w:p>
+    <w:p>
+      <w:pPr>
+        <w:pStyle w:val="BodyText"/>
+      </w:pPr>
+      <w:r>
+        <w:t xml:space="preserve">Descrição:</w:t>
+      </w:r>
+    </w:p>
+    <w:p>
+      <w:pPr>
+        <w:pStyle w:val="BodyText"/>
+      </w:pPr>
+      <w:r>
+        <w:t xml:space="preserve">Em articulação com a Espen e a DCOM, a Onasp reúne referências da Revista Brasileira de Execução Penal, com acesso a dossiês, notícias editoriais e conteúdos relacionados à participação social, transparência e direitos no sistema penal.</w:t>
+      </w:r>
+    </w:p>
+    <w:p>
+      <w:pPr>
+        <w:pStyle w:val="BodyText"/>
+      </w:pPr>
+      <w:r>
+        <w:t xml:space="preserve">Imagem:</w:t>
+      </w:r>
+    </w:p>
+    <w:p>
+      <w:pPr>
+        <w:pStyle w:val="BodyText"/>
+      </w:pPr>
+      <w:r>
+        <w:t xml:space="preserve">Documentação/Botao_RevistaBrasileira.png</w:t>
+      </w:r>
+    </w:p>
+    <w:p>
+      <w:pPr>
+        <w:pStyle w:val="BodyText"/>
+      </w:pPr>
+      <w:r>
+        <w:t xml:space="preserve">Destino:</w:t>
+      </w:r>
+    </w:p>
+    <w:p>
+      <w:pPr>
+        <w:pStyle w:val="BodyText"/>
+      </w:pPr>
+      <w:r>
+        <w:t xml:space="preserve">Subpágina Revista Brasileira de Execução Penal</w:t>
+      </w:r>
+    </w:p>
+    <w:bookmarkEnd w:id="16"/>
+    <w:bookmarkStart w:id="17" w:name="bloco-8---plano-de-metas-2026"/>
+    <w:p>
+      <w:pPr>
+        <w:pStyle w:val="Heading3"/>
+      </w:pPr>
+      <w:r>
+        <w:t xml:space="preserve">Bloco 8 - Plano de Metas 2026</w:t>
+      </w:r>
+    </w:p>
+    <w:p>
+      <w:pPr>
+        <w:pStyle w:val="FirstParagraph"/>
+      </w:pPr>
+      <w:r>
+        <w:t xml:space="preserve">Título da seção:</w:t>
+      </w:r>
+    </w:p>
+    <w:p>
+      <w:pPr>
+        <w:pStyle w:val="BodyText"/>
+      </w:pPr>
+      <w:r>
+        <w:t xml:space="preserve">Plano de Metas 2026</w:t>
+      </w:r>
+    </w:p>
+    <w:p>
+      <w:pPr>
+        <w:pStyle w:val="BodyText"/>
+      </w:pPr>
+      <w:r>
+        <w:t xml:space="preserve">Texto para colar:</w:t>
+      </w:r>
+    </w:p>
+    <w:p>
+      <w:pPr>
+        <w:pStyle w:val="BodyText"/>
+      </w:pPr>
+      <w:r>
+        <w:t xml:space="preserve">Alinhada às diretrizes de modernização da Secretaria Nacional de Políticas Penais, a Onasp apresenta seu Plano de Metas para o ciclo 2026. Este planejamento estratégico estrutura-se em eixos fundamentais: inovação tecnológica no atendimento, fortalecimento da governança federativa e educação continuada em cidadania. As ações listadas abaixo representam o compromisso público da Ouvidoria com a eficiência da gestão e a garantia de direitos no sistema penal.</w:t>
+      </w:r>
+    </w:p>
+    <w:p>
+      <w:pPr>
+        <w:pStyle w:val="BodyText"/>
+      </w:pPr>
+      <w:r>
+        <w:t xml:space="preserve">Imagem a inserir:</w:t>
+      </w:r>
+    </w:p>
+    <w:p>
+      <w:pPr>
+        <w:pStyle w:val="BodyText"/>
+      </w:pPr>
+      <w:r>
+        <w:t xml:space="preserve">Documentação/Banner_3_new.png</w:t>
+      </w:r>
+    </w:p>
+    <w:p>
+      <w:pPr>
+        <w:pStyle w:val="BodyText"/>
+      </w:pPr>
+      <w:r>
+        <w:t xml:space="preserve">Texto alternativo sugerido:</w:t>
+      </w:r>
+    </w:p>
+    <w:p>
+      <w:pPr>
+        <w:pStyle w:val="BodyText"/>
+      </w:pPr>
+      <w:r>
+        <w:t xml:space="preserve">Banner Plano de Metas 2026 da Ouvidoria Nacional de Serviços Penais.</w:t>
+      </w:r>
+    </w:p>
+    <w:bookmarkEnd w:id="17"/>
+    <w:bookmarkStart w:id="18" w:name="bloco-9---relatórios-de-gestão"/>
+    <w:p>
+      <w:pPr>
+        <w:pStyle w:val="Heading3"/>
+      </w:pPr>
+      <w:r>
+        <w:t xml:space="preserve">Bloco 9 - Relatórios de Gestão</w:t>
+      </w:r>
+    </w:p>
+    <w:p>
+      <w:pPr>
+        <w:pStyle w:val="FirstParagraph"/>
+      </w:pPr>
+      <w:r>
+        <w:t xml:space="preserve">Título da seção:</w:t>
+      </w:r>
+    </w:p>
+    <w:p>
+      <w:pPr>
+        <w:pStyle w:val="BodyText"/>
+      </w:pPr>
+      <w:r>
+        <w:t xml:space="preserve">Relatórios de Gestão</w:t>
+      </w:r>
+    </w:p>
+    <w:p>
+      <w:pPr>
+        <w:pStyle w:val="BodyText"/>
+      </w:pPr>
+      <w:r>
+        <w:t xml:space="preserve">Texto para colar:</w:t>
+      </w:r>
+    </w:p>
+    <w:p>
+      <w:pPr>
+        <w:pStyle w:val="BodyText"/>
+      </w:pPr>
+      <w:r>
+        <w:t xml:space="preserve">O Relatório de Gestão é o principal instrumento de transparência pública e prestação de contas da ONASP à sociedade.</w:t>
+      </w:r>
+    </w:p>
+    <w:p>
+      <w:pPr>
+        <w:pStyle w:val="BodyText"/>
+      </w:pPr>
+      <w:r>
+        <w:t xml:space="preserve">Este documento consolida, anualmente, as ações estratégicas voltadas ao aprimoramento do controle social, à melhoria das condições estruturais das ouvidorias estaduais e ao aumento da fiscalização sobre denúncias e solicitações.</w:t>
+      </w:r>
+    </w:p>
+    <w:p>
+      <w:pPr>
+        <w:pStyle w:val="BodyText"/>
+      </w:pPr>
+      <w:r>
+        <w:t xml:space="preserve">Ao disponibilizar esses dados, permitimos que cidadãos, pesquisadores e órgãos de controle acompanhem a evolução das políticas penais e os avanços efetivos na defesa de direitos dentro do sistema prisional.</w:t>
+      </w:r>
+    </w:p>
+    <w:p>
+      <w:pPr>
+        <w:pStyle w:val="BodyText"/>
+      </w:pPr>
+      <w:r>
+        <w:t xml:space="preserve">Links por ano:</w:t>
       </w:r>
     </w:p>
     <w:p>
@@ -1499,6 +1116,555 @@
         </w:numPr>
       </w:pPr>
       <w:r>
+        <w:t xml:space="preserve">2025: https://www.gov.br/senappen/pt-br/acesso-a-informacao/participacao-social/ouvidoria/relatorio-de-gestao-de-ouvidoria</w:t>
+      </w:r>
+    </w:p>
+    <w:p>
+      <w:pPr>
+        <w:pStyle w:val="Compact"/>
+        <w:numPr>
+          <w:ilvl w:val="0"/>
+          <w:numId w:val="1005"/>
+        </w:numPr>
+      </w:pPr>
+      <w:r>
+        <w:t xml:space="preserve">2024: https://www.gov.br/senappen/pt-br/acesso-a-informacao/participacao-social/ouvidoria/relatorio-de-gestao-de-ouvidoria</w:t>
+      </w:r>
+    </w:p>
+    <w:p>
+      <w:pPr>
+        <w:pStyle w:val="Compact"/>
+        <w:numPr>
+          <w:ilvl w:val="0"/>
+          <w:numId w:val="1005"/>
+        </w:numPr>
+      </w:pPr>
+      <w:r>
+        <w:t xml:space="preserve">2023: https://www.gov.br/senappen/pt-br/acesso-a-informacao/participacao-social/ouvidoria/relatorio-de-gestao-de-ouvidoria</w:t>
+      </w:r>
+    </w:p>
+    <w:bookmarkEnd w:id="18"/>
+    <w:bookmarkStart w:id="19" w:name="X53583b821a0a3fdc6c987398bb240b1b43b94e3"/>
+    <w:p>
+      <w:pPr>
+        <w:pStyle w:val="Heading3"/>
+      </w:pPr>
+      <w:r>
+        <w:t xml:space="preserve">Bloco 10 - Painel de Tratamento de Demandas</w:t>
+      </w:r>
+    </w:p>
+    <w:p>
+      <w:pPr>
+        <w:pStyle w:val="FirstParagraph"/>
+      </w:pPr>
+      <w:r>
+        <w:t xml:space="preserve">Título da seção:</w:t>
+      </w:r>
+    </w:p>
+    <w:p>
+      <w:pPr>
+        <w:pStyle w:val="BodyText"/>
+      </w:pPr>
+      <w:r>
+        <w:t xml:space="preserve">Painel de Tratamento de Demandas da Ouvidoria Nacional de Serviços Penais</w:t>
+      </w:r>
+    </w:p>
+    <w:p>
+      <w:pPr>
+        <w:pStyle w:val="BodyText"/>
+      </w:pPr>
+      <w:r>
+        <w:t xml:space="preserve">Texto para colar:</w:t>
+      </w:r>
+    </w:p>
+    <w:p>
+      <w:pPr>
+        <w:pStyle w:val="BodyText"/>
+      </w:pPr>
+      <w:r>
+        <w:t xml:space="preserve">O Painel de Tratamento de Demandas da Ouvidoria Nacional de Serviços Penais (Onasp) é uma ferramenta de transparência ativa e gestão estratégica. Por meio de tecnologia de Business Intelligence (BI), o painel permite ao cidadão pesquisar e visualizar estatísticas atualizadas sobre as manifestações recebidas (denúncias, reclamações, solicitações, sugestões e elogios), monitorando os indicadores de desempenho e os temas mais recorrentes no sistema penal. A base de dados contempla registros a partir de janeiro de 2023, sendo atualizada periodicamente para garantir o controle social efetivo.</w:t>
+      </w:r>
+    </w:p>
+    <w:p>
+      <w:pPr>
+        <w:pStyle w:val="BodyText"/>
+      </w:pPr>
+      <w:r>
+        <w:t xml:space="preserve">Embed do Power BI:</w:t>
+      </w:r>
+    </w:p>
+    <w:p>
+      <w:pPr>
+        <w:pStyle w:val="BodyText"/>
+      </w:pPr>
+      <w:r>
+        <w:t xml:space="preserve">https://app.powerbi.com/view?r=eyJrIjoiMDU5NGVlNjQtMjZmZi00YzI0LTk0ZTktMzQwMzdkM2QyMDg5IiwidCI6ImViMDkwNDIwLTQ0NGMtNDNmNy05MWYyLTRiOGRhNmJmZThlMSJ9</w:t>
+      </w:r>
+    </w:p>
+    <w:p>
+      <w:pPr>
+        <w:pStyle w:val="BodyText"/>
+      </w:pPr>
+      <w:r>
+        <w:t xml:space="preserve">Título acessível sugerido para o iframe:</w:t>
+      </w:r>
+    </w:p>
+    <w:p>
+      <w:pPr>
+        <w:pStyle w:val="BodyText"/>
+      </w:pPr>
+      <w:r>
+        <w:t xml:space="preserve">Painel de Tratamento de Demandas da ONASP</w:t>
+      </w:r>
+    </w:p>
+    <w:bookmarkEnd w:id="19"/>
+    <w:bookmarkEnd w:id="20"/>
+    <w:bookmarkStart w:id="21" w:name="subpágina-1---rede-de-ouvidorias"/>
+    <w:p>
+      <w:pPr>
+        <w:pStyle w:val="Heading2"/>
+      </w:pPr>
+      <w:r>
+        <w:t xml:space="preserve">Subpágina 1 - Rede de Ouvidorias</w:t>
+      </w:r>
+    </w:p>
+    <w:p>
+      <w:pPr>
+        <w:pStyle w:val="FirstParagraph"/>
+      </w:pPr>
+      <w:r>
+        <w:t xml:space="preserve">Título da página:</w:t>
+      </w:r>
+    </w:p>
+    <w:p>
+      <w:pPr>
+        <w:pStyle w:val="BodyText"/>
+      </w:pPr>
+      <w:r>
+        <w:t xml:space="preserve">Rede de Ouvidorias</w:t>
+      </w:r>
+    </w:p>
+    <w:p>
+      <w:pPr>
+        <w:pStyle w:val="BodyText"/>
+      </w:pPr>
+      <w:r>
+        <w:t xml:space="preserve">Imagem de destaque:</w:t>
+      </w:r>
+    </w:p>
+    <w:p>
+      <w:pPr>
+        <w:pStyle w:val="BodyText"/>
+      </w:pPr>
+      <w:r>
+        <w:t xml:space="preserve">Documentação/Botao_Renospen.png</w:t>
+      </w:r>
+    </w:p>
+    <w:p>
+      <w:pPr>
+        <w:pStyle w:val="BodyText"/>
+      </w:pPr>
+      <w:r>
+        <w:t xml:space="preserve">Texto alternativo sugerido:</w:t>
+      </w:r>
+    </w:p>
+    <w:p>
+      <w:pPr>
+        <w:pStyle w:val="BodyText"/>
+      </w:pPr>
+      <w:r>
+        <w:t xml:space="preserve">Botão institucional da Rede de Ouvidorias.</w:t>
+      </w:r>
+    </w:p>
+    <w:p>
+      <w:pPr>
+        <w:pStyle w:val="BodyText"/>
+      </w:pPr>
+      <w:r>
+        <w:t xml:space="preserve">Identificador editorial:</w:t>
+      </w:r>
+    </w:p>
+    <w:p>
+      <w:pPr>
+        <w:pStyle w:val="BodyText"/>
+      </w:pPr>
+      <w:r>
+        <w:t xml:space="preserve">Conteúdo Técnico e Projetos Estruturantes</w:t>
+      </w:r>
+    </w:p>
+    <w:p>
+      <w:pPr>
+        <w:pStyle w:val="BodyText"/>
+      </w:pPr>
+      <w:r>
+        <w:t xml:space="preserve">Texto de destaque:</w:t>
+      </w:r>
+    </w:p>
+    <w:p>
+      <w:pPr>
+        <w:pStyle w:val="BodyText"/>
+      </w:pPr>
+      <w:r>
+        <w:t xml:space="preserve">Iniciativa do Plano Pena Justa voltada à cooperação federativa, à harmonização de procedimentos e ao fortalecimento da proteção de direitos no âmbito das Ouvidorias de Serviços Penais.</w:t>
+      </w:r>
+    </w:p>
+    <w:p>
+      <w:pPr>
+        <w:pStyle w:val="BodyText"/>
+      </w:pPr>
+      <w:r>
+        <w:t xml:space="preserve">Seção:</w:t>
+      </w:r>
+    </w:p>
+    <w:p>
+      <w:pPr>
+        <w:pStyle w:val="BodyText"/>
+      </w:pPr>
+      <w:r>
+        <w:t xml:space="preserve">Renospen</w:t>
+      </w:r>
+    </w:p>
+    <w:p>
+      <w:pPr>
+        <w:pStyle w:val="BodyText"/>
+      </w:pPr>
+      <w:r>
+        <w:t xml:space="preserve">Texto para colar:</w:t>
+      </w:r>
+    </w:p>
+    <w:p>
+      <w:pPr>
+        <w:pStyle w:val="BodyText"/>
+      </w:pPr>
+      <w:r>
+        <w:t xml:space="preserve">A Rede de Ouvidorias visa manter a articulação entre as unidades responsáveis pela escuta institucional no sistema penal, com o objetivo de fortalecer a cooperação federativa, qualificar o atendimento ao cidadão e ampliar a proteção de direitos em âmbito nacional.</w:t>
+      </w:r>
+    </w:p>
+    <w:p>
+      <w:pPr>
+        <w:pStyle w:val="BodyText"/>
+      </w:pPr>
+      <w:r>
+        <w:t xml:space="preserve">A segunda linha do escopo:</w:t>
+      </w:r>
+    </w:p>
+    <w:p>
+      <w:pPr>
+        <w:pStyle w:val="BodyText"/>
+      </w:pPr>
+      <w:r>
+        <w:t xml:space="preserve">No contexto da Ouvidoria Nacional de Serviços Penais, esta subpágina reúne referências públicas da iniciativa, favorecendo o intercâmbio de práticas, a harmonização de procedimentos e a consolidação de parâmetros voltados à transparência e ao controle social.</w:t>
+      </w:r>
+    </w:p>
+    <w:p>
+      <w:pPr>
+        <w:pStyle w:val="BodyText"/>
+      </w:pPr>
+      <w:r>
+        <w:t xml:space="preserve">Seção:</w:t>
+      </w:r>
+    </w:p>
+    <w:p>
+      <w:pPr>
+        <w:pStyle w:val="BodyText"/>
+      </w:pPr>
+      <w:r>
+        <w:t xml:space="preserve">Objetivos da Rede</w:t>
+      </w:r>
+    </w:p>
+    <w:p>
+      <w:pPr>
+        <w:pStyle w:val="BodyText"/>
+      </w:pPr>
+      <w:r>
+        <w:t xml:space="preserve">Itens para colar:</w:t>
+      </w:r>
+    </w:p>
+    <w:p>
+      <w:pPr>
+        <w:pStyle w:val="Compact"/>
+        <w:numPr>
+          <w:ilvl w:val="0"/>
+          <w:numId w:val="1006"/>
+        </w:numPr>
+      </w:pPr>
+      <w:r>
+        <w:t xml:space="preserve">Atuar como espaço de difusão de referências técnicas úteis às ouvidorias de serviços penais.</w:t>
+      </w:r>
+    </w:p>
+    <w:p>
+      <w:pPr>
+        <w:pStyle w:val="Compact"/>
+        <w:numPr>
+          <w:ilvl w:val="0"/>
+          <w:numId w:val="1006"/>
+        </w:numPr>
+      </w:pPr>
+      <w:r>
+        <w:t xml:space="preserve">Fomentar o compartilhamento de práticas, fluxos e instrumentos voltados ao atendimento e ao encaminhamento de manifestações.</w:t>
+      </w:r>
+    </w:p>
+    <w:p>
+      <w:pPr>
+        <w:pStyle w:val="Compact"/>
+        <w:numPr>
+          <w:ilvl w:val="0"/>
+          <w:numId w:val="1006"/>
+        </w:numPr>
+      </w:pPr>
+      <w:r>
+        <w:t xml:space="preserve">Estimular a cooperação entre a União, os Estados e o Distrito Federal para o aprimoramento da atuação institucional.</w:t>
+      </w:r>
+    </w:p>
+    <w:p>
+      <w:pPr>
+        <w:pStyle w:val="Compact"/>
+        <w:numPr>
+          <w:ilvl w:val="0"/>
+          <w:numId w:val="1006"/>
+        </w:numPr>
+      </w:pPr>
+      <w:r>
+        <w:t xml:space="preserve">Fortalecer a participação social, a transparência pública e a proteção de direitos no sistema penal.</w:t>
+      </w:r>
+    </w:p>
+    <w:p>
+      <w:pPr>
+        <w:pStyle w:val="FirstParagraph"/>
+      </w:pPr>
+      <w:r>
+        <w:t xml:space="preserve">Seção:</w:t>
+      </w:r>
+    </w:p>
+    <w:p>
+      <w:pPr>
+        <w:pStyle w:val="BodyText"/>
+      </w:pPr>
+      <w:r>
+        <w:t xml:space="preserve">Governança e cooperação técnica</w:t>
+      </w:r>
+    </w:p>
+    <w:p>
+      <w:pPr>
+        <w:pStyle w:val="BodyText"/>
+      </w:pPr>
+      <w:r>
+        <w:t xml:space="preserve">Texto para colar:</w:t>
+      </w:r>
+    </w:p>
+    <w:p>
+      <w:pPr>
+        <w:pStyle w:val="BodyText"/>
+      </w:pPr>
+      <w:r>
+        <w:t xml:space="preserve">No recorte da ONASP, a Rede de Ouvidorias pode ser apresentada como espaço permanente de articulação entre unidades responsáveis pela escuta institucional, com foco em difusão de referências técnicas, intercâmbio de práticas e aperfeiçoamento contínuo da atuação no sistema penal.</w:t>
+      </w:r>
+    </w:p>
+    <w:p>
+      <w:pPr>
+        <w:pStyle w:val="BodyText"/>
+      </w:pPr>
+      <w:r>
+        <w:t xml:space="preserve">Esse arranjo é reforçado por instrumentos que definem parâmetros mínimos para a estruturação das ouvidorias e institucionalizam a Renospen como instância de cooperação técnica, integração federativa e fortalecimento institucional.</w:t>
+      </w:r>
+    </w:p>
+    <w:p>
+      <w:pPr>
+        <w:pStyle w:val="BodyText"/>
+      </w:pPr>
+      <w:r>
+        <w:t xml:space="preserve">Seção:</w:t>
+      </w:r>
+      <w:r>
+        <w:t xml:space="preserve"> </w:t>
+      </w:r>
+      <w:r>
+        <w:t xml:space="preserve">Mapa interativo e destaque por UF</w:t>
+      </w:r>
+    </w:p>
+    <w:p>
+      <w:pPr>
+        <w:pStyle w:val="BodyText"/>
+      </w:pPr>
+      <w:r>
+        <w:t xml:space="preserve">Texto para colar:</w:t>
+      </w:r>
+    </w:p>
+    <w:p>
+      <w:pPr>
+        <w:pStyle w:val="BodyText"/>
+      </w:pPr>
+      <w:r>
+        <w:t xml:space="preserve">Esta prévia reúne, em um único ponto, os contatos institucionais consolidados das unidades da federação. No ambiente de validação local, a consulta foi organizada por meio de um mapa visual com seleção por UF e painel lateral com dados resumidos da ouvidoria correspondente ou, quando cabível, das referências institucionais associadas à mesma unidade da federação.</w:t>
+      </w:r>
+    </w:p>
+    <w:p>
+      <w:pPr>
+        <w:pStyle w:val="BodyText"/>
+      </w:pPr>
+      <w:r>
+        <w:t xml:space="preserve">Orientação para publicação oficial:</w:t>
+      </w:r>
+    </w:p>
+    <w:p>
+      <w:pPr>
+        <w:pStyle w:val="BodyText"/>
+      </w:pPr>
+      <w:r>
+        <w:t xml:space="preserve">No ambiente gov.br, recomenda-se tratar o mapa interativo apenas como referência visual da prévia. A solução mais segura para publicação é manter um seletor simples por UF, um bloco expansível por estado ou, preferencialmente, o quadro textual de contatos apresentado abaixo, sem depender de JavaScript customizado.</w:t>
+      </w:r>
+    </w:p>
+    <w:p>
+      <w:pPr>
+        <w:pStyle w:val="BodyText"/>
+      </w:pPr>
+      <w:r>
+        <w:t xml:space="preserve">Quando a mesma UF tiver mais de uma referência institucional relevante, como ocorre no Espírito Santo, recomenda-se separar as informações em blocos independentes dentro do quadro lateral ou em linhas distintas no quadro textual, evitando misturar órgãos, responsáveis, telefones e endereços em uma única ficha.</w:t>
+      </w:r>
+    </w:p>
+    <w:p>
+      <w:pPr>
+        <w:pStyle w:val="BodyText"/>
+      </w:pPr>
+      <w:r>
+        <w:t xml:space="preserve">Regra editorial obrigatória:</w:t>
+      </w:r>
+    </w:p>
+    <w:p>
+      <w:pPr>
+        <w:pStyle w:val="BodyText"/>
+      </w:pPr>
+      <w:r>
+        <w:t xml:space="preserve">Detalhes de curadoria usados para consolidar os contatos devem permanecer apenas na documentação interna de trabalho. Não publicar na página expressões como</w:t>
+      </w:r>
+      <w:r>
+        <w:t xml:space="preserve"> </w:t>
+      </w:r>
+      <w:r>
+        <w:t xml:space="preserve">“o diagnóstico registrou”</w:t>
+      </w:r>
+      <w:r>
+        <w:t xml:space="preserve">,</w:t>
+      </w:r>
+      <w:r>
+        <w:t xml:space="preserve"> </w:t>
+      </w:r>
+      <w:r>
+        <w:t xml:space="preserve">“a resposta do diagnóstico informa”</w:t>
+      </w:r>
+      <w:r>
+        <w:t xml:space="preserve">, menções a respostas recebidas, observações internas de validação ou listas nominais de servidores designados.</w:t>
+      </w:r>
+    </w:p>
+    <w:p>
+      <w:pPr>
+        <w:pStyle w:val="BodyText"/>
+      </w:pPr>
+      <w:r>
+        <w:t xml:space="preserve">Base interna de consolidação (não publicar na página):</w:t>
+      </w:r>
+    </w:p>
+    <w:p>
+      <w:pPr>
+        <w:pStyle w:val="BodyText"/>
+      </w:pPr>
+      <w:r>
+        <w:t xml:space="preserve">Diagnóstico de Ouvidorias Estaduais, consolidado pela ONASP a partir das respostas recebidas em 2026.</w:t>
+      </w:r>
+    </w:p>
+    <w:p>
+      <w:pPr>
+        <w:pStyle w:val="BodyText"/>
+      </w:pPr>
+      <w:r>
+        <w:t xml:space="preserve">Seção:</w:t>
+      </w:r>
+    </w:p>
+    <w:p>
+      <w:pPr>
+        <w:pStyle w:val="BodyText"/>
+      </w:pPr>
+      <w:r>
+        <w:t xml:space="preserve">VI Encontro Nacional das Ouvidorias do Sistema Penal</w:t>
+      </w:r>
+    </w:p>
+    <w:p>
+      <w:pPr>
+        <w:pStyle w:val="BodyText"/>
+      </w:pPr>
+      <w:r>
+        <w:t xml:space="preserve">Texto para colar:</w:t>
+      </w:r>
+    </w:p>
+    <w:p>
+      <w:pPr>
+        <w:pStyle w:val="BodyText"/>
+      </w:pPr>
+      <w:r>
+        <w:t xml:space="preserve">O VI Encontro Nacional das Ouvidorias do Sistema Penal, promovido pela Senappen entre 8 e 10 de abril, consolidou um novo marco para a gestão penitenciária com o lançamento da Rede Nacional de Ouvidorias de Serviços Penais (Renospen) e a publicação de uma Instrução Normativa para padronizar essas instâncias nos estados. Alinhado ao Plano Nacional Pena Justa, o evento focou no fortalecimento da transparência, do controle social e da promoção de direitos humanos, unificando diretrizes nacionais enquanto respeita as autonomias locais. Além dos painéis sobre gestão estratégica e escuta ética, a iniciativa contemplou a doação de equipamentos tecnológicos para todas as unidades federativas, visando modernizar o atendimento e estreitar a comunicação entre o sistema penal e a sociedade brasileira.</w:t>
+      </w:r>
+    </w:p>
+    <w:p>
+      <w:pPr>
+        <w:pStyle w:val="BodyText"/>
+      </w:pPr>
+      <w:r>
+        <w:t xml:space="preserve">Imagens a inserir:</w:t>
+      </w:r>
+    </w:p>
+    <w:p>
+      <w:pPr>
+        <w:pStyle w:val="Compact"/>
+        <w:numPr>
+          <w:ilvl w:val="0"/>
+          <w:numId w:val="1007"/>
+        </w:numPr>
+      </w:pPr>
+      <w:r>
+        <w:t xml:space="preserve">Documentação/Banner_Renospen_1.jpeg</w:t>
+      </w:r>
+    </w:p>
+    <w:p>
+      <w:pPr>
+        <w:pStyle w:val="Compact"/>
+        <w:numPr>
+          <w:ilvl w:val="0"/>
+          <w:numId w:val="1007"/>
+        </w:numPr>
+      </w:pPr>
+      <w:r>
+        <w:t xml:space="preserve">Documentação/Banner_Renospen_2.jpeg</w:t>
+      </w:r>
+    </w:p>
+    <w:p>
+      <w:pPr>
+        <w:pStyle w:val="Compact"/>
+        <w:numPr>
+          <w:ilvl w:val="0"/>
+          <w:numId w:val="1007"/>
+        </w:numPr>
+      </w:pPr>
+      <w:r>
+        <w:t xml:space="preserve">Documentação/Banner_Renospen_3.jpeg</w:t>
+      </w:r>
+    </w:p>
+    <w:p>
+      <w:pPr>
+        <w:pStyle w:val="FirstParagraph"/>
+      </w:pPr>
+      <w:r>
+        <w:t xml:space="preserve">Ordem e destaque sugeridos:</w:t>
+      </w:r>
+    </w:p>
+    <w:p>
+      <w:pPr>
+        <w:pStyle w:val="Compact"/>
+        <w:numPr>
+          <w:ilvl w:val="0"/>
+          <w:numId w:val="1008"/>
+        </w:numPr>
+      </w:pPr>
+      <w:r>
         <w:t xml:space="preserve">usar</w:t>
       </w:r>
       <w:r>
@@ -1522,7 +1688,7 @@
         <w:pStyle w:val="Compact"/>
         <w:numPr>
           <w:ilvl w:val="0"/>
-          <w:numId w:val="1005"/>
+          <w:numId w:val="1008"/>
         </w:numPr>
       </w:pPr>
       <w:r>
@@ -3635,381 +3801,11 @@
         <w:pStyle w:val="Compact"/>
         <w:numPr>
           <w:ilvl w:val="0"/>
-          <w:numId w:val="1006"/>
+          <w:numId w:val="1009"/>
         </w:numPr>
       </w:pPr>
       <w:r>
         <w:t xml:space="preserve">Clique e acesse a Instrução Normativa nº 75/2026: Subpages/Pena_justa/SEI_35153985_Instrucao_Normativa_75.pdf</w:t>
-      </w:r>
-    </w:p>
-    <w:p>
-      <w:pPr>
-        <w:pStyle w:val="Compact"/>
-        <w:numPr>
-          <w:ilvl w:val="0"/>
-          <w:numId w:val="1006"/>
-        </w:numPr>
-      </w:pPr>
-      <w:r>
-        <w:t xml:space="preserve">Clique e acesse a Portaria nº 549/2026 - Renospen: Subpages/Pena_justa/SEI_35032761_Portaria_549.pdf</w:t>
-      </w:r>
-    </w:p>
-    <w:p>
-      <w:pPr>
-        <w:pStyle w:val="Compact"/>
-        <w:numPr>
-          <w:ilvl w:val="0"/>
-          <w:numId w:val="1006"/>
-        </w:numPr>
-      </w:pPr>
-      <w:r>
-        <w:t xml:space="preserve">Clique e acesse o Plano Nacional Pena Justa: Subpages/Pena_justa/Plano_Nacional_Pena_Justa.pdf</w:t>
-      </w:r>
-    </w:p>
-    <w:bookmarkEnd w:id="20"/>
-    <w:bookmarkStart w:id="21" w:name="subpágina-2---ema---senappen"/>
-    <w:p>
-      <w:pPr>
-        <w:pStyle w:val="Heading2"/>
-      </w:pPr>
-      <w:r>
-        <w:t xml:space="preserve">Subpágina 2 - EMA - SENAPPEN</w:t>
-      </w:r>
-    </w:p>
-    <w:p>
-      <w:pPr>
-        <w:pStyle w:val="FirstParagraph"/>
-      </w:pPr>
-      <w:r>
-        <w:t xml:space="preserve">Título da página:</w:t>
-      </w:r>
-    </w:p>
-    <w:p>
-      <w:pPr>
-        <w:pStyle w:val="BodyText"/>
-      </w:pPr>
-      <w:r>
-        <w:t xml:space="preserve">EMA - SENAPPEN</w:t>
-      </w:r>
-    </w:p>
-    <w:p>
-      <w:pPr>
-        <w:pStyle w:val="BodyText"/>
-      </w:pPr>
-      <w:r>
-        <w:t xml:space="preserve">Imagem de destaque:</w:t>
-      </w:r>
-    </w:p>
-    <w:p>
-      <w:pPr>
-        <w:pStyle w:val="BodyText"/>
-      </w:pPr>
-      <w:r>
-        <w:t xml:space="preserve">Documentação/Botao_EMA.png</w:t>
-      </w:r>
-    </w:p>
-    <w:p>
-      <w:pPr>
-        <w:pStyle w:val="BodyText"/>
-      </w:pPr>
-      <w:r>
-        <w:t xml:space="preserve">Texto alternativo sugerido:</w:t>
-      </w:r>
-    </w:p>
-    <w:p>
-      <w:pPr>
-        <w:pStyle w:val="BodyText"/>
-      </w:pPr>
-      <w:r>
-        <w:t xml:space="preserve">Botão institucional da EMA - SENAPPEN.</w:t>
-      </w:r>
-    </w:p>
-    <w:p>
-      <w:pPr>
-        <w:pStyle w:val="BodyText"/>
-      </w:pPr>
-      <w:r>
-        <w:t xml:space="preserve">Identificador editorial:</w:t>
-      </w:r>
-    </w:p>
-    <w:p>
-      <w:pPr>
-        <w:pStyle w:val="BodyText"/>
-      </w:pPr>
-      <w:r>
-        <w:t xml:space="preserve">Conteúdo Técnico e Projetos Estruturantes</w:t>
-      </w:r>
-    </w:p>
-    <w:p>
-      <w:pPr>
-        <w:pStyle w:val="BodyText"/>
-      </w:pPr>
-      <w:r>
-        <w:t xml:space="preserve">Texto de destaque:</w:t>
-      </w:r>
-    </w:p>
-    <w:p>
-      <w:pPr>
-        <w:pStyle w:val="BodyText"/>
-      </w:pPr>
-      <w:r>
-        <w:t xml:space="preserve">Espaço da Equipe de Monitoramento e Acompanhamento das decisões e deliberações do Sistema Interamericano de Direitos Humanos em face do sistema penal nacional, dedicado a fortalecer o cumprimento das determinações do SIDH em parceria com as Unidades Federativas.</w:t>
-      </w:r>
-    </w:p>
-    <w:p>
-      <w:pPr>
-        <w:pStyle w:val="BodyText"/>
-      </w:pPr>
-      <w:r>
-        <w:t xml:space="preserve">Seção:</w:t>
-      </w:r>
-    </w:p>
-    <w:p>
-      <w:pPr>
-        <w:pStyle w:val="BodyText"/>
-      </w:pPr>
-      <w:r>
-        <w:t xml:space="preserve">Institucional</w:t>
-      </w:r>
-    </w:p>
-    <w:p>
-      <w:pPr>
-        <w:pStyle w:val="BodyText"/>
-      </w:pPr>
-      <w:r>
-        <w:t xml:space="preserve">Imagem complementar opcional:</w:t>
-      </w:r>
-    </w:p>
-    <w:p>
-      <w:pPr>
-        <w:pStyle w:val="BodyText"/>
-      </w:pPr>
-      <w:r>
-        <w:t xml:space="preserve">Documentação/Banner_Ema_Organograma.png</w:t>
-      </w:r>
-    </w:p>
-    <w:p>
-      <w:pPr>
-        <w:pStyle w:val="BodyText"/>
-      </w:pPr>
-      <w:r>
-        <w:t xml:space="preserve">Texto alternativo sugerido:</w:t>
-      </w:r>
-    </w:p>
-    <w:p>
-      <w:pPr>
-        <w:pStyle w:val="BodyText"/>
-      </w:pPr>
-      <w:r>
-        <w:t xml:space="preserve">Organograma da EMA - SENAPPEN.</w:t>
-      </w:r>
-    </w:p>
-    <w:p>
-      <w:pPr>
-        <w:pStyle w:val="BodyText"/>
-      </w:pPr>
-      <w:r>
-        <w:t xml:space="preserve">Texto para colar:</w:t>
-      </w:r>
-    </w:p>
-    <w:p>
-      <w:pPr>
-        <w:pStyle w:val="BodyText"/>
-      </w:pPr>
-      <w:r>
-        <w:t xml:space="preserve">A EMA-SENAPPEN foi instituída, inicialmente, pela Portaria GABSEC/SENAPPEN/MJSP Nº 350, de 13 de junho de 2024, em um esforço de integrar a Secretaria Nacional de Políticas Penais ao processo de cumprimento das decisões do SIDH, dado seu rol de competências, em especial, a previsão de prestar apoio técnico aos entes federativos quanto à implementação dos princípios e das regras da execução penal.</w:t>
-      </w:r>
-    </w:p>
-    <w:p>
-      <w:pPr>
-        <w:pStyle w:val="BodyText"/>
-      </w:pPr>
-      <w:r>
-        <w:t xml:space="preserve">A segunda linha da seção:</w:t>
-      </w:r>
-    </w:p>
-    <w:p>
-      <w:pPr>
-        <w:pStyle w:val="BodyText"/>
-      </w:pPr>
-      <w:r>
-        <w:t xml:space="preserve">A estrutura da EMA foi alterada em 2025, mediante as Portarias GABSEC/SENAPPEN/MJSP Nº 511, de 13 de outubro de 2025, e Portaria de Pessoal GABSEC/SENAPPEN/MJSP Nº 93, de 10 de março de 2026, as quais possuíam por objetivo o aprimoramento da sua composição institucional, conforme o organograma a seguir:</w:t>
-      </w:r>
-    </w:p>
-    <w:p>
-      <w:pPr>
-        <w:pStyle w:val="BodyText"/>
-      </w:pPr>
-      <w:r>
-        <w:t xml:space="preserve">Seção:</w:t>
-      </w:r>
-    </w:p>
-    <w:p>
-      <w:pPr>
-        <w:pStyle w:val="BodyText"/>
-      </w:pPr>
-      <w:r>
-        <w:t xml:space="preserve">Frentes de Atuação</w:t>
-      </w:r>
-    </w:p>
-    <w:p>
-      <w:pPr>
-        <w:pStyle w:val="BodyText"/>
-      </w:pPr>
-      <w:r>
-        <w:t xml:space="preserve">Itens para colar:</w:t>
-      </w:r>
-    </w:p>
-    <w:p>
-      <w:pPr>
-        <w:pStyle w:val="Compact"/>
-        <w:numPr>
-          <w:ilvl w:val="0"/>
-          <w:numId w:val="1007"/>
-        </w:numPr>
-      </w:pPr>
-      <w:r>
-        <w:t xml:space="preserve">Monitorar e acompanhar as estratégias adotadas pelo Estado Brasileiro para o cumprimento das decisões do SIDH em relação ao sistema penal.</w:t>
-      </w:r>
-    </w:p>
-    <w:p>
-      <w:pPr>
-        <w:pStyle w:val="Compact"/>
-        <w:numPr>
-          <w:ilvl w:val="0"/>
-          <w:numId w:val="1007"/>
-        </w:numPr>
-      </w:pPr>
-      <w:r>
-        <w:t xml:space="preserve">Prevenir e evitar possíveis condenações.</w:t>
-      </w:r>
-    </w:p>
-    <w:p>
-      <w:pPr>
-        <w:pStyle w:val="Compact"/>
-        <w:numPr>
-          <w:ilvl w:val="0"/>
-          <w:numId w:val="1007"/>
-        </w:numPr>
-      </w:pPr>
-      <w:r>
-        <w:t xml:space="preserve">Propagar a cultura de Direitos Humanos, fomentando a aplicação dos Tratados Internacionais sobre a matéria de Direito Penal pelos gestores do sistema penal nacional.</w:t>
-      </w:r>
-    </w:p>
-    <w:p>
-      <w:pPr>
-        <w:pStyle w:val="Compact"/>
-        <w:numPr>
-          <w:ilvl w:val="0"/>
-          <w:numId w:val="1007"/>
-        </w:numPr>
-      </w:pPr>
-      <w:r>
-        <w:t xml:space="preserve">Fortalecer o diálogo entre a proteção de direitos e a governança no sistema penal.</w:t>
-      </w:r>
-    </w:p>
-    <w:p>
-      <w:pPr>
-        <w:pStyle w:val="FirstParagraph"/>
-      </w:pPr>
-      <w:r>
-        <w:t xml:space="preserve">Texto complementar da seção:</w:t>
-      </w:r>
-    </w:p>
-    <w:p>
-      <w:pPr>
-        <w:pStyle w:val="BodyText"/>
-      </w:pPr>
-      <w:r>
-        <w:t xml:space="preserve">Cabe citar a aproximação institucional e a construção de diálogo com órgãos-chave desse processo de monitoramento, como o Ministério das Relações Exteriores, o Ministério dos Direitos Humanos e da Cidadania e o Conselho Nacional de Justiça.</w:t>
-      </w:r>
-    </w:p>
-    <w:p>
-      <w:pPr>
-        <w:pStyle w:val="BodyText"/>
-      </w:pPr>
-      <w:r>
-        <w:t xml:space="preserve">Seção:</w:t>
-      </w:r>
-    </w:p>
-    <w:p>
-      <w:pPr>
-        <w:pStyle w:val="BodyText"/>
-      </w:pPr>
-      <w:r>
-        <w:t xml:space="preserve">Atuação institucional em 2025</w:t>
-      </w:r>
-    </w:p>
-    <w:p>
-      <w:pPr>
-        <w:pStyle w:val="BodyText"/>
-      </w:pPr>
-      <w:r>
-        <w:t xml:space="preserve">Texto para colar:</w:t>
-      </w:r>
-    </w:p>
-    <w:p>
-      <w:pPr>
-        <w:pStyle w:val="BodyText"/>
-      </w:pPr>
-      <w:r>
-        <w:t xml:space="preserve">Em 2025, a EMA/Senappen intensificou o acompanhamento do Sistema Interamericano de Direitos Humanos com foco em decisões, deliberações e medidas com repercussão sobre o sistema penal brasileiro. A atuação combinou articulação interinstitucional, monitoramento técnico e apoio à consolidação de respostas coordenadas do Estado.</w:t>
-      </w:r>
-    </w:p>
-    <w:p>
-      <w:pPr>
-        <w:pStyle w:val="BodyText"/>
-      </w:pPr>
-      <w:r>
-        <w:t xml:space="preserve">A segunda linha da seção:</w:t>
-      </w:r>
-    </w:p>
-    <w:p>
-      <w:pPr>
-        <w:pStyle w:val="BodyText"/>
-      </w:pPr>
-      <w:r>
-        <w:t xml:space="preserve">Nesse período, a equipe ampliou sua participação em agendas voltadas ao acompanhamento de casos perante a Corte Interamericana de Direitos Humanos e ao fortalecimento de mecanismos permanentes de monitoramento no âmbito da política penal.</w:t>
-      </w:r>
-    </w:p>
-    <w:p>
-      <w:pPr>
-        <w:pStyle w:val="BodyText"/>
-      </w:pPr>
-      <w:r>
-        <w:t xml:space="preserve">Imagens complementares opcionais:</w:t>
-      </w:r>
-    </w:p>
-    <w:p>
-      <w:pPr>
-        <w:pStyle w:val="Compact"/>
-        <w:numPr>
-          <w:ilvl w:val="0"/>
-          <w:numId w:val="1008"/>
-        </w:numPr>
-      </w:pPr>
-      <w:r>
-        <w:t xml:space="preserve">Documentação/Banner_Ema.jpg</w:t>
-      </w:r>
-    </w:p>
-    <w:p>
-      <w:pPr>
-        <w:pStyle w:val="Compact"/>
-        <w:numPr>
-          <w:ilvl w:val="0"/>
-          <w:numId w:val="1008"/>
-        </w:numPr>
-      </w:pPr>
-      <w:r>
-        <w:t xml:space="preserve">Documentação/Banner_Ema_2.jpg</w:t>
-      </w:r>
-    </w:p>
-    <w:p>
-      <w:pPr>
-        <w:pStyle w:val="FirstParagraph"/>
-      </w:pPr>
-      <w:r>
-        <w:t xml:space="preserve">Textos alternativos sugeridos:</w:t>
       </w:r>
     </w:p>
     <w:p>
@@ -4021,7 +3817,7 @@
         </w:numPr>
       </w:pPr>
       <w:r>
-        <w:t xml:space="preserve">Participantes reunidos em mesa de trabalho institucional acompanhada pela EMA - SENAPPEN.</w:t>
+        <w:t xml:space="preserve">Clique e acesse a Portaria nº 549/2026 - Renospen: Subpages/Pena_justa/SEI_35032761_Portaria_549.pdf</w:t>
       </w:r>
     </w:p>
     <w:p>
@@ -4033,7 +3829,17 @@
         </w:numPr>
       </w:pPr>
       <w:r>
-        <w:t xml:space="preserve">Participantes posicionados em registro oficial de agenda institucional acompanhada pela EMA - SENAPPEN.</w:t>
+        <w:t xml:space="preserve">Clique e acesse o Plano Nacional Pena Justa: Subpages/Pena_justa/Plano_Nacional_Pena_Justa.pdf</w:t>
+      </w:r>
+    </w:p>
+    <w:bookmarkEnd w:id="21"/>
+    <w:bookmarkStart w:id="22" w:name="subpágina-2---ema---senappen"/>
+    <w:p>
+      <w:pPr>
+        <w:pStyle w:val="Heading2"/>
+      </w:pPr>
+      <w:r>
+        <w:t xml:space="preserve">Subpágina 2 - EMA - SENAPPEN</w:t>
       </w:r>
     </w:p>
     <w:p>
@@ -4041,7 +3847,183 @@
         <w:pStyle w:val="FirstParagraph"/>
       </w:pPr>
       <w:r>
-        <w:t xml:space="preserve">Legendas sugeridas:</w:t>
+        <w:t xml:space="preserve">Título da página:</w:t>
+      </w:r>
+    </w:p>
+    <w:p>
+      <w:pPr>
+        <w:pStyle w:val="BodyText"/>
+      </w:pPr>
+      <w:r>
+        <w:t xml:space="preserve">EMA - SENAPPEN</w:t>
+      </w:r>
+    </w:p>
+    <w:p>
+      <w:pPr>
+        <w:pStyle w:val="BodyText"/>
+      </w:pPr>
+      <w:r>
+        <w:t xml:space="preserve">Imagem de destaque:</w:t>
+      </w:r>
+    </w:p>
+    <w:p>
+      <w:pPr>
+        <w:pStyle w:val="BodyText"/>
+      </w:pPr>
+      <w:r>
+        <w:t xml:space="preserve">Documentação/Botao_EMA.png</w:t>
+      </w:r>
+    </w:p>
+    <w:p>
+      <w:pPr>
+        <w:pStyle w:val="BodyText"/>
+      </w:pPr>
+      <w:r>
+        <w:t xml:space="preserve">Texto alternativo sugerido:</w:t>
+      </w:r>
+    </w:p>
+    <w:p>
+      <w:pPr>
+        <w:pStyle w:val="BodyText"/>
+      </w:pPr>
+      <w:r>
+        <w:t xml:space="preserve">Botão institucional da EMA - SENAPPEN.</w:t>
+      </w:r>
+    </w:p>
+    <w:p>
+      <w:pPr>
+        <w:pStyle w:val="BodyText"/>
+      </w:pPr>
+      <w:r>
+        <w:t xml:space="preserve">Identificador editorial:</w:t>
+      </w:r>
+    </w:p>
+    <w:p>
+      <w:pPr>
+        <w:pStyle w:val="BodyText"/>
+      </w:pPr>
+      <w:r>
+        <w:t xml:space="preserve">Conteúdo Técnico e Projetos Estruturantes</w:t>
+      </w:r>
+    </w:p>
+    <w:p>
+      <w:pPr>
+        <w:pStyle w:val="BodyText"/>
+      </w:pPr>
+      <w:r>
+        <w:t xml:space="preserve">Texto de destaque:</w:t>
+      </w:r>
+    </w:p>
+    <w:p>
+      <w:pPr>
+        <w:pStyle w:val="BodyText"/>
+      </w:pPr>
+      <w:r>
+        <w:t xml:space="preserve">Espaço da Equipe de Monitoramento e Acompanhamento das decisões e deliberações do Sistema Interamericano de Direitos Humanos em face do sistema penal nacional, dedicado a fortalecer o cumprimento das determinações do SIDH em parceria com as Unidades Federativas.</w:t>
+      </w:r>
+    </w:p>
+    <w:p>
+      <w:pPr>
+        <w:pStyle w:val="BodyText"/>
+      </w:pPr>
+      <w:r>
+        <w:t xml:space="preserve">Seção:</w:t>
+      </w:r>
+    </w:p>
+    <w:p>
+      <w:pPr>
+        <w:pStyle w:val="BodyText"/>
+      </w:pPr>
+      <w:r>
+        <w:t xml:space="preserve">Institucional</w:t>
+      </w:r>
+    </w:p>
+    <w:p>
+      <w:pPr>
+        <w:pStyle w:val="BodyText"/>
+      </w:pPr>
+      <w:r>
+        <w:t xml:space="preserve">Imagem complementar opcional:</w:t>
+      </w:r>
+    </w:p>
+    <w:p>
+      <w:pPr>
+        <w:pStyle w:val="BodyText"/>
+      </w:pPr>
+      <w:r>
+        <w:t xml:space="preserve">Documentação/Banner_Ema_Organograma.png</w:t>
+      </w:r>
+    </w:p>
+    <w:p>
+      <w:pPr>
+        <w:pStyle w:val="BodyText"/>
+      </w:pPr>
+      <w:r>
+        <w:t xml:space="preserve">Texto alternativo sugerido:</w:t>
+      </w:r>
+    </w:p>
+    <w:p>
+      <w:pPr>
+        <w:pStyle w:val="BodyText"/>
+      </w:pPr>
+      <w:r>
+        <w:t xml:space="preserve">Organograma da EMA - SENAPPEN.</w:t>
+      </w:r>
+    </w:p>
+    <w:p>
+      <w:pPr>
+        <w:pStyle w:val="BodyText"/>
+      </w:pPr>
+      <w:r>
+        <w:t xml:space="preserve">Texto para colar:</w:t>
+      </w:r>
+    </w:p>
+    <w:p>
+      <w:pPr>
+        <w:pStyle w:val="BodyText"/>
+      </w:pPr>
+      <w:r>
+        <w:t xml:space="preserve">A EMA-SENAPPEN foi instituída, inicialmente, pela Portaria GABSEC/SENAPPEN/MJSP Nº 350, de 13 de junho de 2024, em um esforço de integrar a Secretaria Nacional de Políticas Penais ao processo de cumprimento das decisões do SIDH, dado seu rol de competências, em especial, a previsão de prestar apoio técnico aos entes federativos quanto à implementação dos princípios e das regras da execução penal.</w:t>
+      </w:r>
+    </w:p>
+    <w:p>
+      <w:pPr>
+        <w:pStyle w:val="BodyText"/>
+      </w:pPr>
+      <w:r>
+        <w:t xml:space="preserve">A segunda linha da seção:</w:t>
+      </w:r>
+    </w:p>
+    <w:p>
+      <w:pPr>
+        <w:pStyle w:val="BodyText"/>
+      </w:pPr>
+      <w:r>
+        <w:t xml:space="preserve">A estrutura da EMA foi alterada em 2025, mediante as Portarias GABSEC/SENAPPEN/MJSP Nº 511, de 13 de outubro de 2025, e Portaria de Pessoal GABSEC/SENAPPEN/MJSP Nº 93, de 10 de março de 2026, as quais possuíam por objetivo o aprimoramento da sua composição institucional, conforme o organograma a seguir:</w:t>
+      </w:r>
+    </w:p>
+    <w:p>
+      <w:pPr>
+        <w:pStyle w:val="BodyText"/>
+      </w:pPr>
+      <w:r>
+        <w:t xml:space="preserve">Seção:</w:t>
+      </w:r>
+    </w:p>
+    <w:p>
+      <w:pPr>
+        <w:pStyle w:val="BodyText"/>
+      </w:pPr>
+      <w:r>
+        <w:t xml:space="preserve">Frentes de Atuação</w:t>
+      </w:r>
+    </w:p>
+    <w:p>
+      <w:pPr>
+        <w:pStyle w:val="BodyText"/>
+      </w:pPr>
+      <w:r>
+        <w:t xml:space="preserve">Itens para colar:</w:t>
       </w:r>
     </w:p>
     <w:p>
@@ -4053,7 +4035,7 @@
         </w:numPr>
       </w:pPr>
       <w:r>
-        <w:t xml:space="preserve">Reunião institucional acompanhada pela EMA - SENAPPEN.</w:t>
+        <w:t xml:space="preserve">Monitorar e acompanhar as estratégias adotadas pelo Estado Brasileiro para o cumprimento das decisões do SIDH em relação ao sistema penal.</w:t>
       </w:r>
     </w:p>
     <w:p>
@@ -4065,7 +4047,31 @@
         </w:numPr>
       </w:pPr>
       <w:r>
-        <w:t xml:space="preserve">Registro oficial de agenda institucional da EMA - SENAPPEN.</w:t>
+        <w:t xml:space="preserve">Prevenir e evitar possíveis condenações.</w:t>
+      </w:r>
+    </w:p>
+    <w:p>
+      <w:pPr>
+        <w:pStyle w:val="Compact"/>
+        <w:numPr>
+          <w:ilvl w:val="0"/>
+          <w:numId w:val="1010"/>
+        </w:numPr>
+      </w:pPr>
+      <w:r>
+        <w:t xml:space="preserve">Propagar a cultura de Direitos Humanos, fomentando a aplicação dos Tratados Internacionais sobre a matéria de Direito Penal pelos gestores do sistema penal nacional.</w:t>
+      </w:r>
+    </w:p>
+    <w:p>
+      <w:pPr>
+        <w:pStyle w:val="Compact"/>
+        <w:numPr>
+          <w:ilvl w:val="0"/>
+          <w:numId w:val="1010"/>
+        </w:numPr>
+      </w:pPr>
+      <w:r>
+        <w:t xml:space="preserve">Fortalecer o diálogo entre a proteção de direitos e a governança no sistema penal.</w:t>
       </w:r>
     </w:p>
     <w:p>
@@ -4073,6 +4079,22 @@
         <w:pStyle w:val="FirstParagraph"/>
       </w:pPr>
       <w:r>
+        <w:t xml:space="preserve">Texto complementar da seção:</w:t>
+      </w:r>
+    </w:p>
+    <w:p>
+      <w:pPr>
+        <w:pStyle w:val="BodyText"/>
+      </w:pPr>
+      <w:r>
+        <w:t xml:space="preserve">Cabe citar a aproximação institucional e a construção de diálogo com órgãos-chave desse processo de monitoramento, como o Ministério das Relações Exteriores, o Ministério dos Direitos Humanos e da Cidadania e o Conselho Nacional de Justiça.</w:t>
+      </w:r>
+    </w:p>
+    <w:p>
+      <w:pPr>
+        <w:pStyle w:val="BodyText"/>
+      </w:pPr>
+      <w:r>
         <w:t xml:space="preserve">Seção:</w:t>
       </w:r>
     </w:p>
@@ -4081,7 +4103,7 @@
         <w:pStyle w:val="BodyText"/>
       </w:pPr>
       <w:r>
-        <w:t xml:space="preserve">Caso Pedrinhas</w:t>
+        <w:t xml:space="preserve">Atuação institucional em 2025</w:t>
       </w:r>
     </w:p>
     <w:p>
@@ -4097,7 +4119,7 @@
         <w:pStyle w:val="BodyText"/>
       </w:pPr>
       <w:r>
-        <w:t xml:space="preserve">Em 21 de outubro de 2025, a EMA-SENAPPEN foi convocada a participar, juntamente a outros órgãos representantes do Estado Brasileiro, da audiência privada solicitada pela Corte Interamericana de Direitos Humanos sobre as Medidas Provisórias outorgadas no Caso do Complexo Penitenciário de São Luís, Maranhão (Caso Pedrinhas).</w:t>
+        <w:t xml:space="preserve">Em 2025, a EMA/Senappen intensificou o acompanhamento do Sistema Interamericano de Direitos Humanos com foco em decisões, deliberações e medidas com repercussão sobre o sistema penal brasileiro. A atuação combinou articulação interinstitucional, monitoramento técnico e apoio à consolidação de respostas coordenadas do Estado.</w:t>
       </w:r>
     </w:p>
     <w:p>
@@ -4113,31 +4135,15 @@
         <w:pStyle w:val="BodyText"/>
       </w:pPr>
       <w:r>
-        <w:t xml:space="preserve">Como desdobramento da audiência, a Equipe ficou responsável por coordenar uma mesa de trabalho voltada à elaboração de um plano de cumprimento conjunto, com foco no enfrentamento das fragilidades ainda identificadas no Caso.</w:t>
-      </w:r>
-    </w:p>
-    <w:p>
-      <w:pPr>
-        <w:pStyle w:val="BodyText"/>
-      </w:pPr>
-      <w:r>
-        <w:t xml:space="preserve">Subseção:</w:t>
-      </w:r>
-    </w:p>
-    <w:p>
-      <w:pPr>
-        <w:pStyle w:val="BodyText"/>
-      </w:pPr>
-      <w:r>
-        <w:t xml:space="preserve">Eixos priorizados</w:t>
-      </w:r>
-    </w:p>
-    <w:p>
-      <w:pPr>
-        <w:pStyle w:val="BodyText"/>
-      </w:pPr>
-      <w:r>
-        <w:t xml:space="preserve">Itens para colar:</w:t>
+        <w:t xml:space="preserve">Nesse período, a equipe ampliou sua participação em agendas voltadas ao acompanhamento de casos perante a Corte Interamericana de Direitos Humanos e ao fortalecimento de mecanismos permanentes de monitoramento no âmbito da política penal.</w:t>
+      </w:r>
+    </w:p>
+    <w:p>
+      <w:pPr>
+        <w:pStyle w:val="BodyText"/>
+      </w:pPr>
+      <w:r>
+        <w:t xml:space="preserve">Imagens complementares opcionais:</w:t>
       </w:r>
     </w:p>
     <w:p>
@@ -4149,7 +4155,7 @@
         </w:numPr>
       </w:pPr>
       <w:r>
-        <w:t xml:space="preserve">Superlotação e ambiência no sistema prisional.</w:t>
+        <w:t xml:space="preserve">Documentação/Banner_Ema.jpg</w:t>
       </w:r>
     </w:p>
     <w:p>
@@ -4161,31 +4167,7 @@
         </w:numPr>
       </w:pPr>
       <w:r>
-        <w:t xml:space="preserve">Dignidade e condições de custódia.</w:t>
-      </w:r>
-    </w:p>
-    <w:p>
-      <w:pPr>
-        <w:pStyle w:val="Compact"/>
-        <w:numPr>
-          <w:ilvl w:val="0"/>
-          <w:numId w:val="1011"/>
-        </w:numPr>
-      </w:pPr>
-      <w:r>
-        <w:t xml:space="preserve">Acesso à justiça e prevenção à tortura.</w:t>
-      </w:r>
-    </w:p>
-    <w:p>
-      <w:pPr>
-        <w:pStyle w:val="Compact"/>
-        <w:numPr>
-          <w:ilvl w:val="0"/>
-          <w:numId w:val="1011"/>
-        </w:numPr>
-      </w:pPr>
-      <w:r>
-        <w:t xml:space="preserve">Monitoramento, participação social e coordenação institucional.</w:t>
+        <w:t xml:space="preserve">Documentação/Banner_Ema_2.jpg</w:t>
       </w:r>
     </w:p>
     <w:p>
@@ -4193,87 +4175,7 @@
         <w:pStyle w:val="FirstParagraph"/>
       </w:pPr>
       <w:r>
-        <w:t xml:space="preserve">Subseção:</w:t>
-      </w:r>
-    </w:p>
-    <w:p>
-      <w:pPr>
-        <w:pStyle w:val="BodyText"/>
-      </w:pPr>
-      <w:r>
-        <w:t xml:space="preserve">Desdobramentos e articulação técnica</w:t>
-      </w:r>
-    </w:p>
-    <w:p>
-      <w:pPr>
-        <w:pStyle w:val="BodyText"/>
-      </w:pPr>
-      <w:r>
-        <w:t xml:space="preserve">Texto para colar:</w:t>
-      </w:r>
-    </w:p>
-    <w:p>
-      <w:pPr>
-        <w:pStyle w:val="BodyText"/>
-      </w:pPr>
-      <w:r>
-        <w:t xml:space="preserve">Entre novembro e dezembro de 2025, a EMA/Senappen contribuiu para a formalização da mesa de trabalho, participou de reuniões técnicas dedicadas aos eixos temáticos do caso e apoiou a preparação de visita técnica destinada a consolidar diagnósticos e orientar as próximas medidas.</w:t>
-      </w:r>
-    </w:p>
-    <w:p>
-      <w:pPr>
-        <w:pStyle w:val="BodyText"/>
-      </w:pPr>
-      <w:r>
-        <w:t xml:space="preserve">A segunda linha da subseção:</w:t>
-      </w:r>
-    </w:p>
-    <w:p>
-      <w:pPr>
-        <w:pStyle w:val="BodyText"/>
-      </w:pPr>
-      <w:r>
-        <w:t xml:space="preserve">No mesmo contexto, a equipe atuou de forma articulada com o Plano Pena Justa e acompanhou iniciativas voltadas à criação de instâncias permanentes de monitoramento e à padronização de fluxos para acompanhamento de casos internacionais com incidência sobre o sistema penal brasileiro.</w:t>
-      </w:r>
-    </w:p>
-    <w:p>
-      <w:pPr>
-        <w:pStyle w:val="BodyText"/>
-      </w:pPr>
-      <w:r>
-        <w:t xml:space="preserve">Seção:</w:t>
-      </w:r>
-    </w:p>
-    <w:p>
-      <w:pPr>
-        <w:pStyle w:val="BodyText"/>
-      </w:pPr>
-      <w:r>
-        <w:t xml:space="preserve">Referências públicas do SIDH</w:t>
-      </w:r>
-    </w:p>
-    <w:p>
-      <w:pPr>
-        <w:pStyle w:val="BodyText"/>
-      </w:pPr>
-      <w:r>
-        <w:t xml:space="preserve">Texto para colar:</w:t>
-      </w:r>
-    </w:p>
-    <w:p>
-      <w:pPr>
-        <w:pStyle w:val="BodyText"/>
-      </w:pPr>
-      <w:r>
-        <w:t xml:space="preserve">Para contextualização institucional da pauta, a ONASP pode utilizar como pontos de partida as referências públicas abaixo, produzidas pelos próprios órgãos do sistema interamericano:</w:t>
-      </w:r>
-    </w:p>
-    <w:p>
-      <w:pPr>
-        <w:pStyle w:val="BodyText"/>
-      </w:pPr>
-      <w:r>
-        <w:t xml:space="preserve">Links:</w:t>
+        <w:t xml:space="preserve">Textos alternativos sugeridos:</w:t>
       </w:r>
     </w:p>
     <w:p>
@@ -4285,7 +4187,7 @@
         </w:numPr>
       </w:pPr>
       <w:r>
-        <w:t xml:space="preserve">O que é a CIDH?: https://www.oas.org/pt/cidh/mandato/que.asp</w:t>
+        <w:t xml:space="preserve">Participantes reunidos em mesa de trabalho institucional acompanhada pela EMA - SENAPPEN.</w:t>
       </w:r>
     </w:p>
     <w:p>
@@ -4297,31 +4199,7 @@
         </w:numPr>
       </w:pPr>
       <w:r>
-        <w:t xml:space="preserve">O que é a Corte IDH?: https://www.corteidh.or.cr/que_es_la_corte.cfm?lang=pt</w:t>
-      </w:r>
-    </w:p>
-    <w:p>
-      <w:pPr>
-        <w:pStyle w:val="Compact"/>
-        <w:numPr>
-          <w:ilvl w:val="0"/>
-          <w:numId w:val="1012"/>
-        </w:numPr>
-      </w:pPr>
-      <w:r>
-        <w:t xml:space="preserve">Estatuto da Comissão Interamericana de Direitos Humanos: https://www.oas.org/pt/cidh/mandato/Basicos/estatutoCIDH.asp</w:t>
-      </w:r>
-    </w:p>
-    <w:p>
-      <w:pPr>
-        <w:pStyle w:val="Compact"/>
-        <w:numPr>
-          <w:ilvl w:val="0"/>
-          <w:numId w:val="1012"/>
-        </w:numPr>
-      </w:pPr>
-      <w:r>
-        <w:t xml:space="preserve">Declaração Americana de Direitos e Deveres do Homem: https://www.oas.org/pt/cidh/mandato/Basicos/declaracion.asp</w:t>
+        <w:t xml:space="preserve">Participantes posicionados em registro oficial de agenda institucional acompanhada pela EMA - SENAPPEN.</w:t>
       </w:r>
     </w:p>
     <w:p>
@@ -4329,169 +4207,7 @@
         <w:pStyle w:val="FirstParagraph"/>
       </w:pPr>
       <w:r>
-        <w:t xml:space="preserve">Seção:</w:t>
-      </w:r>
-    </w:p>
-    <w:bookmarkEnd w:id="21"/>
-    <w:bookmarkStart w:id="22" w:name="subpágina-3---plano-pena-justa"/>
-    <w:p>
-      <w:pPr>
-        <w:pStyle w:val="Heading2"/>
-      </w:pPr>
-      <w:r>
-        <w:t xml:space="preserve">Subpágina 3 - Plano Pena Justa</w:t>
-      </w:r>
-    </w:p>
-    <w:p>
-      <w:pPr>
-        <w:pStyle w:val="FirstParagraph"/>
-      </w:pPr>
-      <w:r>
-        <w:t xml:space="preserve">Título da página:</w:t>
-      </w:r>
-    </w:p>
-    <w:p>
-      <w:pPr>
-        <w:pStyle w:val="BodyText"/>
-      </w:pPr>
-      <w:r>
-        <w:t xml:space="preserve">Plano Pena Justa</w:t>
-      </w:r>
-    </w:p>
-    <w:p>
-      <w:pPr>
-        <w:pStyle w:val="BodyText"/>
-      </w:pPr>
-      <w:r>
-        <w:t xml:space="preserve">Imagem de destaque:</w:t>
-      </w:r>
-    </w:p>
-    <w:p>
-      <w:pPr>
-        <w:pStyle w:val="BodyText"/>
-      </w:pPr>
-      <w:r>
-        <w:t xml:space="preserve">Documentação/Botao_PenaJusta.png</w:t>
-      </w:r>
-    </w:p>
-    <w:p>
-      <w:pPr>
-        <w:pStyle w:val="BodyText"/>
-      </w:pPr>
-      <w:r>
-        <w:t xml:space="preserve">Texto alternativo sugerido:</w:t>
-      </w:r>
-    </w:p>
-    <w:p>
-      <w:pPr>
-        <w:pStyle w:val="BodyText"/>
-      </w:pPr>
-      <w:r>
-        <w:t xml:space="preserve">Marca do Plano Pena Justa.</w:t>
-      </w:r>
-    </w:p>
-    <w:p>
-      <w:pPr>
-        <w:pStyle w:val="BodyText"/>
-      </w:pPr>
-      <w:r>
-        <w:t xml:space="preserve">Identificador editorial:</w:t>
-      </w:r>
-    </w:p>
-    <w:p>
-      <w:pPr>
-        <w:pStyle w:val="BodyText"/>
-      </w:pPr>
-      <w:r>
-        <w:t xml:space="preserve">Conteúdo Técnico e Projetos Estruturantes</w:t>
-      </w:r>
-    </w:p>
-    <w:p>
-      <w:pPr>
-        <w:pStyle w:val="BodyText"/>
-      </w:pPr>
-      <w:r>
-        <w:t xml:space="preserve">Texto de destaque:</w:t>
-      </w:r>
-    </w:p>
-    <w:p>
-      <w:pPr>
-        <w:pStyle w:val="BodyText"/>
-      </w:pPr>
-      <w:r>
-        <w:t xml:space="preserve">Ambiente dedicado ao Plano Pena Justa, com informações gerais, documentos públicos e marcos relacionados ao fortalecimento das ouvidorias no sistema penal.</w:t>
-      </w:r>
-    </w:p>
-    <w:p>
-      <w:pPr>
-        <w:pStyle w:val="BodyText"/>
-      </w:pPr>
-      <w:r>
-        <w:t xml:space="preserve">Seção:</w:t>
-      </w:r>
-    </w:p>
-    <w:p>
-      <w:pPr>
-        <w:pStyle w:val="BodyText"/>
-      </w:pPr>
-      <w:r>
-        <w:t xml:space="preserve">O Plano</w:t>
-      </w:r>
-    </w:p>
-    <w:p>
-      <w:pPr>
-        <w:pStyle w:val="BodyText"/>
-      </w:pPr>
-      <w:r>
-        <w:t xml:space="preserve">Texto para colar:</w:t>
-      </w:r>
-    </w:p>
-    <w:p>
-      <w:pPr>
-        <w:pStyle w:val="BodyText"/>
-      </w:pPr>
-      <w:r>
-        <w:t xml:space="preserve">O Plano Pena Justa é o Plano Nacional para o Enfrentamento do Estado de Coisas Inconstitucional nas Prisões Brasileiras, no âmbito da ADPF 347. Sua proposta articula ações de qualificação das políticas penais, fortalecimento da segurança pública, valorização dos servidores penais, transparência, participação social e monitoramento das metas pactuadas.</w:t>
-      </w:r>
-    </w:p>
-    <w:p>
-      <w:pPr>
-        <w:pStyle w:val="BodyText"/>
-      </w:pPr>
-      <w:r>
-        <w:t xml:space="preserve">Na perspectiva da Ouvidoria Nacional de Serviços Penais, esta subpágina reúne referências públicas do Plano voltadas ao fortalecimento da participação social, da escuta qualificada e da articulação entre as ouvidorias dos serviços penais nos Estados e no Distrito Federal.</w:t>
-      </w:r>
-    </w:p>
-    <w:p>
-      <w:pPr>
-        <w:pStyle w:val="BodyText"/>
-      </w:pPr>
-      <w:r>
-        <w:t xml:space="preserve">Seção:</w:t>
-      </w:r>
-    </w:p>
-    <w:p>
-      <w:pPr>
-        <w:pStyle w:val="BodyText"/>
-      </w:pPr>
-      <w:r>
-        <w:t xml:space="preserve">Eixos de atuação</w:t>
-      </w:r>
-    </w:p>
-    <w:p>
-      <w:pPr>
-        <w:pStyle w:val="BodyText"/>
-      </w:pPr>
-      <w:r>
-        <w:t xml:space="preserve">Texto para colar:</w:t>
-      </w:r>
-    </w:p>
-    <w:p>
-      <w:pPr>
-        <w:pStyle w:val="BodyText"/>
-      </w:pPr>
-      <w:r>
-        <w:t xml:space="preserve">O Plano Nacional organiza sua atuação em quatro eixos estruturantes:</w:t>
+        <w:t xml:space="preserve">Legendas sugeridas:</w:t>
       </w:r>
     </w:p>
     <w:p>
@@ -4503,7 +4219,7 @@
         </w:numPr>
       </w:pPr>
       <w:r>
-        <w:t xml:space="preserve">Controle da entrada e das vagas do sistema prisional.</w:t>
+        <w:t xml:space="preserve">Reunião institucional acompanhada pela EMA - SENAPPEN.</w:t>
       </w:r>
     </w:p>
     <w:p>
@@ -4515,31 +4231,7 @@
         </w:numPr>
       </w:pPr>
       <w:r>
-        <w:t xml:space="preserve">Qualidade da ambiência, dos serviços prestados e da estrutura prisional.</w:t>
-      </w:r>
-    </w:p>
-    <w:p>
-      <w:pPr>
-        <w:pStyle w:val="Compact"/>
-        <w:numPr>
-          <w:ilvl w:val="0"/>
-          <w:numId w:val="1013"/>
-        </w:numPr>
-      </w:pPr>
-      <w:r>
-        <w:t xml:space="preserve">Processos de saída da prisão e de reintegração social.</w:t>
-      </w:r>
-    </w:p>
-    <w:p>
-      <w:pPr>
-        <w:pStyle w:val="Compact"/>
-        <w:numPr>
-          <w:ilvl w:val="0"/>
-          <w:numId w:val="1013"/>
-        </w:numPr>
-      </w:pPr>
-      <w:r>
-        <w:t xml:space="preserve">Políticas de não repetição do Estado de Coisas Inconstitucional no sistema prisional.</w:t>
+        <w:t xml:space="preserve">Registro oficial de agenda institucional da EMA - SENAPPEN.</w:t>
       </w:r>
     </w:p>
     <w:p>
@@ -4555,7 +4247,7 @@
         <w:pStyle w:val="BodyText"/>
       </w:pPr>
       <w:r>
-        <w:t xml:space="preserve">Governança e acompanhamento</w:t>
+        <w:t xml:space="preserve">Caso Pedrinhas</w:t>
       </w:r>
     </w:p>
     <w:p>
@@ -4571,231 +4263,47 @@
         <w:pStyle w:val="BodyText"/>
       </w:pPr>
       <w:r>
-        <w:t xml:space="preserve">No recorte da Ouvidoria Nacional de Serviços Penais, o acompanhamento do Pena Justa prioriza instrumentos que fortaleçam a escuta qualificada, a transparência ativa e a coordenação entre as ouvidorias dos serviços penais.</w:t>
-      </w:r>
-    </w:p>
-    <w:p>
-      <w:pPr>
-        <w:pStyle w:val="BodyText"/>
-      </w:pPr>
-      <w:r>
-        <w:t xml:space="preserve">Esse recorte se materializa por meio de marcos normativos e de cooperação técnica que estruturam parâmetros mínimos de atuação, incentivam integração preferencial ao Fala.BR e consolidam uma rede permanente de intercâmbio entre União, Estados e Distrito Federal.</w:t>
-      </w:r>
-    </w:p>
-    <w:p>
-      <w:pPr>
-        <w:pStyle w:val="BodyText"/>
-      </w:pPr>
-      <w:r>
-        <w:t xml:space="preserve">Seção:</w:t>
-      </w:r>
-    </w:p>
-    <w:p>
-      <w:pPr>
-        <w:pStyle w:val="BodyText"/>
-      </w:pPr>
-      <w:r>
-        <w:t xml:space="preserve">Entregas já formalizadas</w:t>
-      </w:r>
-    </w:p>
-    <w:p>
-      <w:pPr>
-        <w:pStyle w:val="BodyText"/>
-      </w:pPr>
-      <w:r>
-        <w:t xml:space="preserve">Texto para colar:</w:t>
-      </w:r>
-    </w:p>
-    <w:p>
-      <w:pPr>
-        <w:pStyle w:val="BodyText"/>
-      </w:pPr>
-      <w:r>
-        <w:t xml:space="preserve">No campo das ouvidorias e da participação social, o Pena Justa já reúne marcos normativos que podem ser destacados nesta página:</w:t>
-      </w:r>
-    </w:p>
-    <w:p>
-      <w:pPr>
-        <w:pStyle w:val="BodyText"/>
-      </w:pPr>
-      <w:r>
-        <w:t xml:space="preserve">Subtítulo:</w:t>
-      </w:r>
-    </w:p>
-    <w:p>
-      <w:pPr>
-        <w:pStyle w:val="BodyText"/>
-      </w:pPr>
-      <w:r>
-        <w:t xml:space="preserve">Normativo publicado</w:t>
-      </w:r>
-    </w:p>
-    <w:p>
-      <w:pPr>
-        <w:pStyle w:val="BodyText"/>
-      </w:pPr>
-      <w:r>
-        <w:t xml:space="preserve">Título:</w:t>
-      </w:r>
-    </w:p>
-    <w:p>
-      <w:pPr>
-        <w:pStyle w:val="BodyText"/>
-      </w:pPr>
-      <w:r>
-        <w:t xml:space="preserve">Instrução Normativa nº 75/2026</w:t>
-      </w:r>
-    </w:p>
-    <w:p>
-      <w:pPr>
-        <w:pStyle w:val="BodyText"/>
-      </w:pPr>
-      <w:r>
-        <w:t xml:space="preserve">Texto para colar:</w:t>
-      </w:r>
-    </w:p>
-    <w:p>
-      <w:pPr>
-        <w:pStyle w:val="BodyText"/>
-      </w:pPr>
-      <w:r>
-        <w:t xml:space="preserve">Estabelece parâmetros mínimos para a criação e a estruturação de Ouvidorias de Serviços Penais nos Estados e no Distrito Federal, com diretrizes de autonomia, transparência, acessibilidade e integração preferencial ao Fala.BR.</w:t>
-      </w:r>
-    </w:p>
-    <w:p>
-      <w:pPr>
-        <w:pStyle w:val="BodyText"/>
-      </w:pPr>
-      <w:r>
-        <w:t xml:space="preserve">Link:</w:t>
-      </w:r>
-    </w:p>
-    <w:p>
-      <w:pPr>
-        <w:pStyle w:val="BodyText"/>
-      </w:pPr>
-      <w:r>
-        <w:t xml:space="preserve">Acessar a Instrução Normativa (PDF)</w:t>
-      </w:r>
-    </w:p>
-    <w:p>
-      <w:pPr>
-        <w:pStyle w:val="BodyText"/>
-      </w:pPr>
-      <w:r>
-        <w:t xml:space="preserve">Arquivo:</w:t>
-      </w:r>
-    </w:p>
-    <w:p>
-      <w:pPr>
-        <w:pStyle w:val="BodyText"/>
-      </w:pPr>
-      <w:r>
-        <w:t xml:space="preserve">Subpages/Pena_justa/SEI_35153985_Instrucao_Normativa_75.pdf</w:t>
-      </w:r>
-    </w:p>
-    <w:p>
-      <w:pPr>
-        <w:pStyle w:val="BodyText"/>
-      </w:pPr>
-      <w:r>
-        <w:t xml:space="preserve">Subtítulo:</w:t>
-      </w:r>
-    </w:p>
-    <w:p>
-      <w:pPr>
-        <w:pStyle w:val="BodyText"/>
-      </w:pPr>
-      <w:r>
-        <w:t xml:space="preserve">Rede instituída</w:t>
-      </w:r>
-    </w:p>
-    <w:p>
-      <w:pPr>
-        <w:pStyle w:val="BodyText"/>
-      </w:pPr>
-      <w:r>
-        <w:t xml:space="preserve">Título:</w:t>
-      </w:r>
-    </w:p>
-    <w:p>
-      <w:pPr>
-        <w:pStyle w:val="BodyText"/>
-      </w:pPr>
-      <w:r>
-        <w:t xml:space="preserve">Portaria nº 549/2026</w:t>
-      </w:r>
-    </w:p>
-    <w:p>
-      <w:pPr>
-        <w:pStyle w:val="BodyText"/>
-      </w:pPr>
-      <w:r>
-        <w:t xml:space="preserve">Texto para colar:</w:t>
-      </w:r>
-    </w:p>
-    <w:p>
-      <w:pPr>
-        <w:pStyle w:val="BodyText"/>
-      </w:pPr>
-      <w:r>
-        <w:t xml:space="preserve">Institui a Rede Nacional de Ouvidorias de Serviços Penais - Renospen, como instância permanente de cooperação técnica, intercâmbio de informações e fortalecimento institucional das ouvidorias no sistema penal.</w:t>
-      </w:r>
-    </w:p>
-    <w:p>
-      <w:pPr>
-        <w:pStyle w:val="BodyText"/>
-      </w:pPr>
-      <w:r>
-        <w:t xml:space="preserve">Link:</w:t>
-      </w:r>
-    </w:p>
-    <w:p>
-      <w:pPr>
-        <w:pStyle w:val="BodyText"/>
-      </w:pPr>
-      <w:r>
-        <w:t xml:space="preserve">Acessar a Portaria (PDF)</w:t>
-      </w:r>
-    </w:p>
-    <w:p>
-      <w:pPr>
-        <w:pStyle w:val="BodyText"/>
-      </w:pPr>
-      <w:r>
-        <w:t xml:space="preserve">Arquivo:</w:t>
-      </w:r>
-    </w:p>
-    <w:p>
-      <w:pPr>
-        <w:pStyle w:val="BodyText"/>
-      </w:pPr>
-      <w:r>
-        <w:t xml:space="preserve">Subpages/Pena_justa/SEI_35032761_Portaria_549.pdf</w:t>
-      </w:r>
-    </w:p>
-    <w:p>
-      <w:pPr>
-        <w:pStyle w:val="BodyText"/>
-      </w:pPr>
-      <w:r>
-        <w:t xml:space="preserve">Seção:</w:t>
-      </w:r>
-    </w:p>
-    <w:p>
-      <w:pPr>
-        <w:pStyle w:val="BodyText"/>
-      </w:pPr>
-      <w:r>
-        <w:t xml:space="preserve">Documentos públicos de referência</w:t>
-      </w:r>
-    </w:p>
-    <w:p>
-      <w:pPr>
-        <w:pStyle w:val="BodyText"/>
-      </w:pPr>
-      <w:r>
-        <w:t xml:space="preserve">Links:</w:t>
+        <w:t xml:space="preserve">Em 21 de outubro de 2025, a EMA-SENAPPEN foi convocada a participar, juntamente a outros órgãos representantes do Estado Brasileiro, da audiência privada solicitada pela Corte Interamericana de Direitos Humanos sobre as Medidas Provisórias outorgadas no Caso do Complexo Penitenciário de São Luís, Maranhão (Caso Pedrinhas).</w:t>
+      </w:r>
+    </w:p>
+    <w:p>
+      <w:pPr>
+        <w:pStyle w:val="BodyText"/>
+      </w:pPr>
+      <w:r>
+        <w:t xml:space="preserve">A segunda linha da seção:</w:t>
+      </w:r>
+    </w:p>
+    <w:p>
+      <w:pPr>
+        <w:pStyle w:val="BodyText"/>
+      </w:pPr>
+      <w:r>
+        <w:t xml:space="preserve">Como desdobramento da audiência, a Equipe ficou responsável por coordenar uma mesa de trabalho voltada à elaboração de um plano de cumprimento conjunto, com foco no enfrentamento das fragilidades ainda identificadas no Caso.</w:t>
+      </w:r>
+    </w:p>
+    <w:p>
+      <w:pPr>
+        <w:pStyle w:val="BodyText"/>
+      </w:pPr>
+      <w:r>
+        <w:t xml:space="preserve">Subseção:</w:t>
+      </w:r>
+    </w:p>
+    <w:p>
+      <w:pPr>
+        <w:pStyle w:val="BodyText"/>
+      </w:pPr>
+      <w:r>
+        <w:t xml:space="preserve">Eixos priorizados</w:t>
+      </w:r>
+    </w:p>
+    <w:p>
+      <w:pPr>
+        <w:pStyle w:val="BodyText"/>
+      </w:pPr>
+      <w:r>
+        <w:t xml:space="preserve">Itens para colar:</w:t>
       </w:r>
     </w:p>
     <w:p>
@@ -4807,7 +4315,7 @@
         </w:numPr>
       </w:pPr>
       <w:r>
-        <w:t xml:space="preserve">Plano Nacional Pena Justa (PDF): Subpages/Pena_justa/Plano_Nacional_Pena_Justa.pdf</w:t>
+        <w:t xml:space="preserve">Superlotação e ambiência no sistema prisional.</w:t>
       </w:r>
     </w:p>
     <w:p>
@@ -4819,17 +4327,31 @@
         </w:numPr>
       </w:pPr>
       <w:r>
-        <w:t xml:space="preserve">10 coisas que você precisa saber sobre o Pena Justa (PDF): Subpages/Pena_justa/10_Coisas_que_você_precisa_saber_sobre_o_Pena_Justa.pdf</w:t>
-      </w:r>
-    </w:p>
-    <w:bookmarkEnd w:id="22"/>
-    <w:bookmarkStart w:id="23" w:name="X9010218d04cc9bed3b5085cf6721dd78b5ea4ec"/>
-    <w:p>
-      <w:pPr>
-        <w:pStyle w:val="Heading2"/>
-      </w:pPr>
-      <w:r>
-        <w:t xml:space="preserve">Subpágina 4 - Revista Brasileira de Execução Penal</w:t>
+        <w:t xml:space="preserve">Dignidade e condições de custódia.</w:t>
+      </w:r>
+    </w:p>
+    <w:p>
+      <w:pPr>
+        <w:pStyle w:val="Compact"/>
+        <w:numPr>
+          <w:ilvl w:val="0"/>
+          <w:numId w:val="1014"/>
+        </w:numPr>
+      </w:pPr>
+      <w:r>
+        <w:t xml:space="preserve">Acesso à justiça e prevenção à tortura.</w:t>
+      </w:r>
+    </w:p>
+    <w:p>
+      <w:pPr>
+        <w:pStyle w:val="Compact"/>
+        <w:numPr>
+          <w:ilvl w:val="0"/>
+          <w:numId w:val="1014"/>
+        </w:numPr>
+      </w:pPr>
+      <w:r>
+        <w:t xml:space="preserve">Monitoramento, participação social e coordenação institucional.</w:t>
       </w:r>
     </w:p>
     <w:p>
@@ -4837,79 +4359,47 @@
         <w:pStyle w:val="FirstParagraph"/>
       </w:pPr>
       <w:r>
-        <w:t xml:space="preserve">Título da página:</w:t>
-      </w:r>
-    </w:p>
-    <w:p>
-      <w:pPr>
-        <w:pStyle w:val="BodyText"/>
-      </w:pPr>
-      <w:r>
-        <w:t xml:space="preserve">Revista Brasileira de Execução Penal</w:t>
-      </w:r>
-    </w:p>
-    <w:p>
-      <w:pPr>
-        <w:pStyle w:val="BodyText"/>
-      </w:pPr>
-      <w:r>
-        <w:t xml:space="preserve">Imagem de destaque:</w:t>
-      </w:r>
-    </w:p>
-    <w:p>
-      <w:pPr>
-        <w:pStyle w:val="BodyText"/>
-      </w:pPr>
-      <w:r>
-        <w:t xml:space="preserve">Documentação/Botao_RevistaBrasileira.png</w:t>
-      </w:r>
-    </w:p>
-    <w:p>
-      <w:pPr>
-        <w:pStyle w:val="BodyText"/>
-      </w:pPr>
-      <w:r>
-        <w:t xml:space="preserve">Texto alternativo sugerido:</w:t>
-      </w:r>
-    </w:p>
-    <w:p>
-      <w:pPr>
-        <w:pStyle w:val="BodyText"/>
-      </w:pPr>
-      <w:r>
-        <w:t xml:space="preserve">Botão institucional da Revista Brasileira de Execução Penal.</w:t>
-      </w:r>
-    </w:p>
-    <w:p>
-      <w:pPr>
-        <w:pStyle w:val="BodyText"/>
-      </w:pPr>
-      <w:r>
-        <w:t xml:space="preserve">Identificador editorial:</w:t>
-      </w:r>
-    </w:p>
-    <w:p>
-      <w:pPr>
-        <w:pStyle w:val="BodyText"/>
-      </w:pPr>
-      <w:r>
-        <w:t xml:space="preserve">Conteúdo Técnico e Projetos Estruturantes</w:t>
-      </w:r>
-    </w:p>
-    <w:p>
-      <w:pPr>
-        <w:pStyle w:val="BodyText"/>
-      </w:pPr>
-      <w:r>
-        <w:t xml:space="preserve">Texto de destaque:</w:t>
-      </w:r>
-    </w:p>
-    <w:p>
-      <w:pPr>
-        <w:pStyle w:val="BodyText"/>
-      </w:pPr>
-      <w:r>
-        <w:t xml:space="preserve">Em articulação com a Espen e a DCOM, esta subpágina reúne referências da Revista Brasileira de Execução Penal e destaca dossiês, notícias editoriais e conteúdos com interface com participação social, transparência e direitos no sistema penal.</w:t>
+        <w:t xml:space="preserve">Subseção:</w:t>
+      </w:r>
+    </w:p>
+    <w:p>
+      <w:pPr>
+        <w:pStyle w:val="BodyText"/>
+      </w:pPr>
+      <w:r>
+        <w:t xml:space="preserve">Desdobramentos e articulação técnica</w:t>
+      </w:r>
+    </w:p>
+    <w:p>
+      <w:pPr>
+        <w:pStyle w:val="BodyText"/>
+      </w:pPr>
+      <w:r>
+        <w:t xml:space="preserve">Texto para colar:</w:t>
+      </w:r>
+    </w:p>
+    <w:p>
+      <w:pPr>
+        <w:pStyle w:val="BodyText"/>
+      </w:pPr>
+      <w:r>
+        <w:t xml:space="preserve">Entre novembro e dezembro de 2025, a EMA/Senappen contribuiu para a formalização da mesa de trabalho, participou de reuniões técnicas dedicadas aos eixos temáticos do caso e apoiou a preparação de visita técnica destinada a consolidar diagnósticos e orientar as próximas medidas.</w:t>
+      </w:r>
+    </w:p>
+    <w:p>
+      <w:pPr>
+        <w:pStyle w:val="BodyText"/>
+      </w:pPr>
+      <w:r>
+        <w:t xml:space="preserve">A segunda linha da subseção:</w:t>
+      </w:r>
+    </w:p>
+    <w:p>
+      <w:pPr>
+        <w:pStyle w:val="BodyText"/>
+      </w:pPr>
+      <w:r>
+        <w:t xml:space="preserve">No mesmo contexto, a equipe atuou de forma articulada com o Plano Pena Justa e acompanhou iniciativas voltadas à criação de instâncias permanentes de monitoramento e à padronização de fluxos para acompanhamento de casos internacionais com incidência sobre o sistema penal brasileiro.</w:t>
       </w:r>
     </w:p>
     <w:p>
@@ -4925,7 +4415,7 @@
         <w:pStyle w:val="BodyText"/>
       </w:pPr>
       <w:r>
-        <w:t xml:space="preserve">A Revista</w:t>
+        <w:t xml:space="preserve">Referências públicas do SIDH</w:t>
       </w:r>
     </w:p>
     <w:p>
@@ -4941,103 +4431,7 @@
         <w:pStyle w:val="BodyText"/>
       </w:pPr>
       <w:r>
-        <w:t xml:space="preserve">A Revista Brasileira de Execução Penal é o periódico técnico-científico da Secretaria Nacional de Políticas Penais (Senappen/MJSP) e constitui espaço de circulação de artigos, documentos inéditos, entrevistas, relatos de experiência e boas práticas relacionados à execução penal.</w:t>
-      </w:r>
-    </w:p>
-    <w:p>
-      <w:pPr>
-        <w:pStyle w:val="BodyText"/>
-      </w:pPr>
-      <w:r>
-        <w:t xml:space="preserve">A segunda linha do escopo:</w:t>
-      </w:r>
-    </w:p>
-    <w:p>
-      <w:pPr>
-        <w:pStyle w:val="BodyText"/>
-      </w:pPr>
-      <w:r>
-        <w:t xml:space="preserve">No contexto da Ouvidoria, a publicação contribui para aproximar produção técnica, debate qualificado e controle social, reforçando o papel da Ouvidoria como ponte entre Estado e sociedade.</w:t>
-      </w:r>
-    </w:p>
-    <w:p>
-      <w:pPr>
-        <w:pStyle w:val="BodyText"/>
-      </w:pPr>
-      <w:r>
-        <w:t xml:space="preserve">Seção:</w:t>
-      </w:r>
-    </w:p>
-    <w:p>
-      <w:pPr>
-        <w:pStyle w:val="BodyText"/>
-      </w:pPr>
-      <w:r>
-        <w:t xml:space="preserve">Sobre a revista</w:t>
-      </w:r>
-    </w:p>
-    <w:p>
-      <w:pPr>
-        <w:pStyle w:val="BodyText"/>
-      </w:pPr>
-      <w:r>
-        <w:t xml:space="preserve">Texto para colar:</w:t>
-      </w:r>
-    </w:p>
-    <w:p>
-      <w:pPr>
-        <w:pStyle w:val="BodyText"/>
-      </w:pPr>
-      <w:r>
-        <w:t xml:space="preserve">A RBEP publica artigos, documentos inéditos, entrevistas, relatos de experiência e descrição de boas práticas que relacionam a experiência profissional, o conhecimento produzido sobre a matéria e o cumprimento da legislação nacional.</w:t>
-      </w:r>
-    </w:p>
-    <w:p>
-      <w:pPr>
-        <w:pStyle w:val="BodyText"/>
-      </w:pPr>
-      <w:r>
-        <w:t xml:space="preserve">A segunda linha da seção:</w:t>
-      </w:r>
-    </w:p>
-    <w:p>
-      <w:pPr>
-        <w:pStyle w:val="BodyText"/>
-      </w:pPr>
-      <w:r>
-        <w:t xml:space="preserve">Os conteúdos são organizados em dossiês temáticos semestrais, e a revista recebeu qualificação A4 na classificação de periódicos Qualis Capes na avaliação do quadriênio 2021-2024.</w:t>
-      </w:r>
-    </w:p>
-    <w:p>
-      <w:pPr>
-        <w:pStyle w:val="BodyText"/>
-      </w:pPr>
-      <w:r>
-        <w:t xml:space="preserve">Seção:</w:t>
-      </w:r>
-    </w:p>
-    <w:p>
-      <w:pPr>
-        <w:pStyle w:val="BodyText"/>
-      </w:pPr>
-      <w:r>
-        <w:t xml:space="preserve">Acesso oficial à RBEP</w:t>
-      </w:r>
-    </w:p>
-    <w:p>
-      <w:pPr>
-        <w:pStyle w:val="BodyText"/>
-      </w:pPr>
-      <w:r>
-        <w:t xml:space="preserve">Texto para colar:</w:t>
-      </w:r>
-    </w:p>
-    <w:p>
-      <w:pPr>
-        <w:pStyle w:val="BodyText"/>
-      </w:pPr>
-      <w:r>
-        <w:t xml:space="preserve">O portal oficial da revista reúne notícias, edição atual, arquivo de edições e informações para submissão de textos.</w:t>
+        <w:t xml:space="preserve">Para contextualização institucional da pauta, a ONASP pode utilizar como pontos de partida as referências públicas abaixo, produzidas pelos próprios órgãos do sistema interamericano:</w:t>
       </w:r>
     </w:p>
     <w:p>
@@ -5057,7 +4451,7 @@
         </w:numPr>
       </w:pPr>
       <w:r>
-        <w:t xml:space="preserve">Portal oficial da Revista Brasileira de Execução Penal: https://rbepsenappen.mj.gov.br/index.php/RBEP/pt_BR</w:t>
+        <w:t xml:space="preserve">O que é a CIDH?: https://www.oas.org/pt/cidh/mandato/que.asp</w:t>
       </w:r>
     </w:p>
     <w:p>
@@ -5069,7 +4463,7 @@
         </w:numPr>
       </w:pPr>
       <w:r>
-        <w:t xml:space="preserve">Edição atual - edição completa: https://rbepsenappen.mj.gov.br/index.php/RBEP/pt_BR/issue/view/22/58</w:t>
+        <w:t xml:space="preserve">O que é a Corte IDH?: https://www.corteidh.or.cr/que_es_la_corte.cfm?lang=pt</w:t>
       </w:r>
     </w:p>
     <w:p>
@@ -5081,7 +4475,7 @@
         </w:numPr>
       </w:pPr>
       <w:r>
-        <w:t xml:space="preserve">Ver todas as edições: https://rbepsenappen.mj.gov.br/index.php/RBEP/pt_BR/issue/archive</w:t>
+        <w:t xml:space="preserve">Estatuto da Comissão Interamericana de Direitos Humanos: https://www.oas.org/pt/cidh/mandato/Basicos/estatutoCIDH.asp</w:t>
       </w:r>
     </w:p>
     <w:p>
@@ -5093,7 +4487,7 @@
         </w:numPr>
       </w:pPr>
       <w:r>
-        <w:t xml:space="preserve">Enviar submissão: https://rbepsenappen.mj.gov.br/index.php/RBEP/pt_BR/about/submissions</w:t>
+        <w:t xml:space="preserve">Declaração Americana de Direitos e Deveres do Homem: https://www.oas.org/pt/cidh/mandato/Basicos/declaracion.asp</w:t>
       </w:r>
     </w:p>
     <w:p>
@@ -5104,20 +4498,166 @@
         <w:t xml:space="preserve">Seção:</w:t>
       </w:r>
     </w:p>
-    <w:p>
-      <w:pPr>
-        <w:pStyle w:val="BodyText"/>
-      </w:pPr>
-      <w:r>
-        <w:t xml:space="preserve">Referências institucionais</w:t>
-      </w:r>
-    </w:p>
-    <w:p>
-      <w:pPr>
-        <w:pStyle w:val="BodyText"/>
-      </w:pPr>
-      <w:r>
-        <w:t xml:space="preserve">Itens para colar:</w:t>
+    <w:bookmarkEnd w:id="22"/>
+    <w:bookmarkStart w:id="23" w:name="subpágina-3---plano-pena-justa"/>
+    <w:p>
+      <w:pPr>
+        <w:pStyle w:val="Heading2"/>
+      </w:pPr>
+      <w:r>
+        <w:t xml:space="preserve">Subpágina 3 - Plano Pena Justa</w:t>
+      </w:r>
+    </w:p>
+    <w:p>
+      <w:pPr>
+        <w:pStyle w:val="FirstParagraph"/>
+      </w:pPr>
+      <w:r>
+        <w:t xml:space="preserve">Título da página:</w:t>
+      </w:r>
+    </w:p>
+    <w:p>
+      <w:pPr>
+        <w:pStyle w:val="BodyText"/>
+      </w:pPr>
+      <w:r>
+        <w:t xml:space="preserve">Plano Pena Justa</w:t>
+      </w:r>
+    </w:p>
+    <w:p>
+      <w:pPr>
+        <w:pStyle w:val="BodyText"/>
+      </w:pPr>
+      <w:r>
+        <w:t xml:space="preserve">Imagem de destaque:</w:t>
+      </w:r>
+    </w:p>
+    <w:p>
+      <w:pPr>
+        <w:pStyle w:val="BodyText"/>
+      </w:pPr>
+      <w:r>
+        <w:t xml:space="preserve">Documentação/Botao_PenaJusta.png</w:t>
+      </w:r>
+    </w:p>
+    <w:p>
+      <w:pPr>
+        <w:pStyle w:val="BodyText"/>
+      </w:pPr>
+      <w:r>
+        <w:t xml:space="preserve">Texto alternativo sugerido:</w:t>
+      </w:r>
+    </w:p>
+    <w:p>
+      <w:pPr>
+        <w:pStyle w:val="BodyText"/>
+      </w:pPr>
+      <w:r>
+        <w:t xml:space="preserve">Marca do Plano Pena Justa.</w:t>
+      </w:r>
+    </w:p>
+    <w:p>
+      <w:pPr>
+        <w:pStyle w:val="BodyText"/>
+      </w:pPr>
+      <w:r>
+        <w:t xml:space="preserve">Identificador editorial:</w:t>
+      </w:r>
+    </w:p>
+    <w:p>
+      <w:pPr>
+        <w:pStyle w:val="BodyText"/>
+      </w:pPr>
+      <w:r>
+        <w:t xml:space="preserve">Conteúdo Técnico e Projetos Estruturantes</w:t>
+      </w:r>
+    </w:p>
+    <w:p>
+      <w:pPr>
+        <w:pStyle w:val="BodyText"/>
+      </w:pPr>
+      <w:r>
+        <w:t xml:space="preserve">Texto de destaque:</w:t>
+      </w:r>
+    </w:p>
+    <w:p>
+      <w:pPr>
+        <w:pStyle w:val="BodyText"/>
+      </w:pPr>
+      <w:r>
+        <w:t xml:space="preserve">Ambiente dedicado ao Plano Pena Justa, com informações gerais, documentos públicos e marcos relacionados ao fortalecimento das ouvidorias no sistema penal.</w:t>
+      </w:r>
+    </w:p>
+    <w:p>
+      <w:pPr>
+        <w:pStyle w:val="BodyText"/>
+      </w:pPr>
+      <w:r>
+        <w:t xml:space="preserve">Seção:</w:t>
+      </w:r>
+    </w:p>
+    <w:p>
+      <w:pPr>
+        <w:pStyle w:val="BodyText"/>
+      </w:pPr>
+      <w:r>
+        <w:t xml:space="preserve">O Plano</w:t>
+      </w:r>
+    </w:p>
+    <w:p>
+      <w:pPr>
+        <w:pStyle w:val="BodyText"/>
+      </w:pPr>
+      <w:r>
+        <w:t xml:space="preserve">Texto para colar:</w:t>
+      </w:r>
+    </w:p>
+    <w:p>
+      <w:pPr>
+        <w:pStyle w:val="BodyText"/>
+      </w:pPr>
+      <w:r>
+        <w:t xml:space="preserve">O Plano Pena Justa é o Plano Nacional para o Enfrentamento do Estado de Coisas Inconstitucional nas Prisões Brasileiras, no âmbito da ADPF 347. Sua proposta articula ações de qualificação das políticas penais, fortalecimento da segurança pública, valorização dos servidores penais, transparência, participação social e monitoramento das metas pactuadas.</w:t>
+      </w:r>
+    </w:p>
+    <w:p>
+      <w:pPr>
+        <w:pStyle w:val="BodyText"/>
+      </w:pPr>
+      <w:r>
+        <w:t xml:space="preserve">Na perspectiva da Ouvidoria Nacional de Serviços Penais, esta subpágina reúne referências públicas do Plano voltadas ao fortalecimento da participação social, da escuta qualificada e da articulação entre as ouvidorias dos serviços penais nos Estados e no Distrito Federal.</w:t>
+      </w:r>
+    </w:p>
+    <w:p>
+      <w:pPr>
+        <w:pStyle w:val="BodyText"/>
+      </w:pPr>
+      <w:r>
+        <w:t xml:space="preserve">Seção:</w:t>
+      </w:r>
+    </w:p>
+    <w:p>
+      <w:pPr>
+        <w:pStyle w:val="BodyText"/>
+      </w:pPr>
+      <w:r>
+        <w:t xml:space="preserve">Eixos de atuação</w:t>
+      </w:r>
+    </w:p>
+    <w:p>
+      <w:pPr>
+        <w:pStyle w:val="BodyText"/>
+      </w:pPr>
+      <w:r>
+        <w:t xml:space="preserve">Texto para colar:</w:t>
+      </w:r>
+    </w:p>
+    <w:p>
+      <w:pPr>
+        <w:pStyle w:val="BodyText"/>
+      </w:pPr>
+      <w:r>
+        <w:t xml:space="preserve">O Plano Nacional organiza sua atuação em quatro eixos estruturantes:</w:t>
       </w:r>
     </w:p>
     <w:p>
@@ -5129,7 +4669,7 @@
         </w:numPr>
       </w:pPr>
       <w:r>
-        <w:t xml:space="preserve">Qualis Capes 2021-2024: A4.</w:t>
+        <w:t xml:space="preserve">Controle da entrada e das vagas do sistema prisional.</w:t>
       </w:r>
     </w:p>
     <w:p>
@@ -5141,7 +4681,7 @@
         </w:numPr>
       </w:pPr>
       <w:r>
-        <w:t xml:space="preserve">ISSN: 2675-1895.</w:t>
+        <w:t xml:space="preserve">Qualidade da ambiência, dos serviços prestados e da estrutura prisional.</w:t>
       </w:r>
     </w:p>
     <w:p>
@@ -5153,7 +4693,7 @@
         </w:numPr>
       </w:pPr>
       <w:r>
-        <w:t xml:space="preserve">e-ISSN: 2675-1860.</w:t>
+        <w:t xml:space="preserve">Processos de saída da prisão e de reintegração social.</w:t>
       </w:r>
     </w:p>
     <w:p>
@@ -5165,11 +4705,637 @@
         </w:numPr>
       </w:pPr>
       <w:r>
+        <w:t xml:space="preserve">Políticas de não repetição do Estado de Coisas Inconstitucional no sistema prisional.</w:t>
+      </w:r>
+    </w:p>
+    <w:p>
+      <w:pPr>
+        <w:pStyle w:val="FirstParagraph"/>
+      </w:pPr>
+      <w:r>
+        <w:t xml:space="preserve">Seção:</w:t>
+      </w:r>
+    </w:p>
+    <w:p>
+      <w:pPr>
+        <w:pStyle w:val="BodyText"/>
+      </w:pPr>
+      <w:r>
+        <w:t xml:space="preserve">Governança e acompanhamento</w:t>
+      </w:r>
+    </w:p>
+    <w:p>
+      <w:pPr>
+        <w:pStyle w:val="BodyText"/>
+      </w:pPr>
+      <w:r>
+        <w:t xml:space="preserve">Texto para colar:</w:t>
+      </w:r>
+    </w:p>
+    <w:p>
+      <w:pPr>
+        <w:pStyle w:val="BodyText"/>
+      </w:pPr>
+      <w:r>
+        <w:t xml:space="preserve">No recorte da Ouvidoria Nacional de Serviços Penais, o acompanhamento do Pena Justa prioriza instrumentos que fortaleçam a escuta qualificada, a transparência ativa e a coordenação entre as ouvidorias dos serviços penais.</w:t>
+      </w:r>
+    </w:p>
+    <w:p>
+      <w:pPr>
+        <w:pStyle w:val="BodyText"/>
+      </w:pPr>
+      <w:r>
+        <w:t xml:space="preserve">Esse recorte se materializa por meio de marcos normativos e de cooperação técnica que estruturam parâmetros mínimos de atuação, incentivam integração preferencial ao Fala.BR e consolidam uma rede permanente de intercâmbio entre União, Estados e Distrito Federal.</w:t>
+      </w:r>
+    </w:p>
+    <w:p>
+      <w:pPr>
+        <w:pStyle w:val="BodyText"/>
+      </w:pPr>
+      <w:r>
+        <w:t xml:space="preserve">Seção:</w:t>
+      </w:r>
+    </w:p>
+    <w:p>
+      <w:pPr>
+        <w:pStyle w:val="BodyText"/>
+      </w:pPr>
+      <w:r>
+        <w:t xml:space="preserve">Entregas já formalizadas</w:t>
+      </w:r>
+    </w:p>
+    <w:p>
+      <w:pPr>
+        <w:pStyle w:val="BodyText"/>
+      </w:pPr>
+      <w:r>
+        <w:t xml:space="preserve">Texto para colar:</w:t>
+      </w:r>
+    </w:p>
+    <w:p>
+      <w:pPr>
+        <w:pStyle w:val="BodyText"/>
+      </w:pPr>
+      <w:r>
+        <w:t xml:space="preserve">No campo das ouvidorias e da participação social, o Pena Justa já reúne marcos normativos que podem ser destacados nesta página:</w:t>
+      </w:r>
+    </w:p>
+    <w:p>
+      <w:pPr>
+        <w:pStyle w:val="BodyText"/>
+      </w:pPr>
+      <w:r>
+        <w:t xml:space="preserve">Subtítulo:</w:t>
+      </w:r>
+    </w:p>
+    <w:p>
+      <w:pPr>
+        <w:pStyle w:val="BodyText"/>
+      </w:pPr>
+      <w:r>
+        <w:t xml:space="preserve">Normativo publicado</w:t>
+      </w:r>
+    </w:p>
+    <w:p>
+      <w:pPr>
+        <w:pStyle w:val="BodyText"/>
+      </w:pPr>
+      <w:r>
+        <w:t xml:space="preserve">Título:</w:t>
+      </w:r>
+    </w:p>
+    <w:p>
+      <w:pPr>
+        <w:pStyle w:val="BodyText"/>
+      </w:pPr>
+      <w:r>
+        <w:t xml:space="preserve">Instrução Normativa nº 75/2026</w:t>
+      </w:r>
+    </w:p>
+    <w:p>
+      <w:pPr>
+        <w:pStyle w:val="BodyText"/>
+      </w:pPr>
+      <w:r>
+        <w:t xml:space="preserve">Texto para colar:</w:t>
+      </w:r>
+    </w:p>
+    <w:p>
+      <w:pPr>
+        <w:pStyle w:val="BodyText"/>
+      </w:pPr>
+      <w:r>
+        <w:t xml:space="preserve">Estabelece parâmetros mínimos para a criação e a estruturação de Ouvidorias de Serviços Penais nos Estados e no Distrito Federal, com diretrizes de autonomia, transparência, acessibilidade e integração preferencial ao Fala.BR.</w:t>
+      </w:r>
+    </w:p>
+    <w:p>
+      <w:pPr>
+        <w:pStyle w:val="BodyText"/>
+      </w:pPr>
+      <w:r>
+        <w:t xml:space="preserve">Link:</w:t>
+      </w:r>
+    </w:p>
+    <w:p>
+      <w:pPr>
+        <w:pStyle w:val="BodyText"/>
+      </w:pPr>
+      <w:r>
+        <w:t xml:space="preserve">Acessar a Instrução Normativa (PDF)</w:t>
+      </w:r>
+    </w:p>
+    <w:p>
+      <w:pPr>
+        <w:pStyle w:val="BodyText"/>
+      </w:pPr>
+      <w:r>
+        <w:t xml:space="preserve">Arquivo:</w:t>
+      </w:r>
+    </w:p>
+    <w:p>
+      <w:pPr>
+        <w:pStyle w:val="BodyText"/>
+      </w:pPr>
+      <w:r>
+        <w:t xml:space="preserve">Subpages/Pena_justa/SEI_35153985_Instrucao_Normativa_75.pdf</w:t>
+      </w:r>
+    </w:p>
+    <w:p>
+      <w:pPr>
+        <w:pStyle w:val="BodyText"/>
+      </w:pPr>
+      <w:r>
+        <w:t xml:space="preserve">Subtítulo:</w:t>
+      </w:r>
+    </w:p>
+    <w:p>
+      <w:pPr>
+        <w:pStyle w:val="BodyText"/>
+      </w:pPr>
+      <w:r>
+        <w:t xml:space="preserve">Rede instituída</w:t>
+      </w:r>
+    </w:p>
+    <w:p>
+      <w:pPr>
+        <w:pStyle w:val="BodyText"/>
+      </w:pPr>
+      <w:r>
+        <w:t xml:space="preserve">Título:</w:t>
+      </w:r>
+    </w:p>
+    <w:p>
+      <w:pPr>
+        <w:pStyle w:val="BodyText"/>
+      </w:pPr>
+      <w:r>
+        <w:t xml:space="preserve">Portaria nº 549/2026</w:t>
+      </w:r>
+    </w:p>
+    <w:p>
+      <w:pPr>
+        <w:pStyle w:val="BodyText"/>
+      </w:pPr>
+      <w:r>
+        <w:t xml:space="preserve">Texto para colar:</w:t>
+      </w:r>
+    </w:p>
+    <w:p>
+      <w:pPr>
+        <w:pStyle w:val="BodyText"/>
+      </w:pPr>
+      <w:r>
+        <w:t xml:space="preserve">Institui a Rede Nacional de Ouvidorias de Serviços Penais - Renospen, como instância permanente de cooperação técnica, intercâmbio de informações e fortalecimento institucional das ouvidorias no sistema penal.</w:t>
+      </w:r>
+    </w:p>
+    <w:p>
+      <w:pPr>
+        <w:pStyle w:val="BodyText"/>
+      </w:pPr>
+      <w:r>
+        <w:t xml:space="preserve">Link:</w:t>
+      </w:r>
+    </w:p>
+    <w:p>
+      <w:pPr>
+        <w:pStyle w:val="BodyText"/>
+      </w:pPr>
+      <w:r>
+        <w:t xml:space="preserve">Acessar a Portaria (PDF)</w:t>
+      </w:r>
+    </w:p>
+    <w:p>
+      <w:pPr>
+        <w:pStyle w:val="BodyText"/>
+      </w:pPr>
+      <w:r>
+        <w:t xml:space="preserve">Arquivo:</w:t>
+      </w:r>
+    </w:p>
+    <w:p>
+      <w:pPr>
+        <w:pStyle w:val="BodyText"/>
+      </w:pPr>
+      <w:r>
+        <w:t xml:space="preserve">Subpages/Pena_justa/SEI_35032761_Portaria_549.pdf</w:t>
+      </w:r>
+    </w:p>
+    <w:p>
+      <w:pPr>
+        <w:pStyle w:val="BodyText"/>
+      </w:pPr>
+      <w:r>
+        <w:t xml:space="preserve">Seção:</w:t>
+      </w:r>
+    </w:p>
+    <w:p>
+      <w:pPr>
+        <w:pStyle w:val="BodyText"/>
+      </w:pPr>
+      <w:r>
+        <w:t xml:space="preserve">Documentos públicos de referência</w:t>
+      </w:r>
+    </w:p>
+    <w:p>
+      <w:pPr>
+        <w:pStyle w:val="BodyText"/>
+      </w:pPr>
+      <w:r>
+        <w:t xml:space="preserve">Links:</w:t>
+      </w:r>
+    </w:p>
+    <w:p>
+      <w:pPr>
+        <w:pStyle w:val="Compact"/>
+        <w:numPr>
+          <w:ilvl w:val="0"/>
+          <w:numId w:val="1017"/>
+        </w:numPr>
+      </w:pPr>
+      <w:r>
+        <w:t xml:space="preserve">Plano Nacional Pena Justa (PDF): Subpages/Pena_justa/Plano_Nacional_Pena_Justa.pdf</w:t>
+      </w:r>
+    </w:p>
+    <w:p>
+      <w:pPr>
+        <w:pStyle w:val="Compact"/>
+        <w:numPr>
+          <w:ilvl w:val="0"/>
+          <w:numId w:val="1017"/>
+        </w:numPr>
+      </w:pPr>
+      <w:r>
+        <w:t xml:space="preserve">10 coisas que você precisa saber sobre o Pena Justa (PDF): Subpages/Pena_justa/10_Coisas_que_você_precisa_saber_sobre_o_Pena_Justa.pdf</w:t>
+      </w:r>
+    </w:p>
+    <w:bookmarkEnd w:id="23"/>
+    <w:bookmarkStart w:id="24" w:name="X9010218d04cc9bed3b5085cf6721dd78b5ea4ec"/>
+    <w:p>
+      <w:pPr>
+        <w:pStyle w:val="Heading2"/>
+      </w:pPr>
+      <w:r>
+        <w:t xml:space="preserve">Subpágina 4 - Revista Brasileira de Execução Penal</w:t>
+      </w:r>
+    </w:p>
+    <w:p>
+      <w:pPr>
+        <w:pStyle w:val="FirstParagraph"/>
+      </w:pPr>
+      <w:r>
+        <w:t xml:space="preserve">Título da página:</w:t>
+      </w:r>
+    </w:p>
+    <w:p>
+      <w:pPr>
+        <w:pStyle w:val="BodyText"/>
+      </w:pPr>
+      <w:r>
+        <w:t xml:space="preserve">Revista Brasileira de Execução Penal</w:t>
+      </w:r>
+    </w:p>
+    <w:p>
+      <w:pPr>
+        <w:pStyle w:val="BodyText"/>
+      </w:pPr>
+      <w:r>
+        <w:t xml:space="preserve">Imagem de destaque:</w:t>
+      </w:r>
+    </w:p>
+    <w:p>
+      <w:pPr>
+        <w:pStyle w:val="BodyText"/>
+      </w:pPr>
+      <w:r>
+        <w:t xml:space="preserve">Documentação/Botao_RevistaBrasileira.png</w:t>
+      </w:r>
+    </w:p>
+    <w:p>
+      <w:pPr>
+        <w:pStyle w:val="BodyText"/>
+      </w:pPr>
+      <w:r>
+        <w:t xml:space="preserve">Texto alternativo sugerido:</w:t>
+      </w:r>
+    </w:p>
+    <w:p>
+      <w:pPr>
+        <w:pStyle w:val="BodyText"/>
+      </w:pPr>
+      <w:r>
+        <w:t xml:space="preserve">Botão institucional da Revista Brasileira de Execução Penal.</w:t>
+      </w:r>
+    </w:p>
+    <w:p>
+      <w:pPr>
+        <w:pStyle w:val="BodyText"/>
+      </w:pPr>
+      <w:r>
+        <w:t xml:space="preserve">Identificador editorial:</w:t>
+      </w:r>
+    </w:p>
+    <w:p>
+      <w:pPr>
+        <w:pStyle w:val="BodyText"/>
+      </w:pPr>
+      <w:r>
+        <w:t xml:space="preserve">Conteúdo Técnico e Projetos Estruturantes</w:t>
+      </w:r>
+    </w:p>
+    <w:p>
+      <w:pPr>
+        <w:pStyle w:val="BodyText"/>
+      </w:pPr>
+      <w:r>
+        <w:t xml:space="preserve">Texto de destaque:</w:t>
+      </w:r>
+    </w:p>
+    <w:p>
+      <w:pPr>
+        <w:pStyle w:val="BodyText"/>
+      </w:pPr>
+      <w:r>
+        <w:t xml:space="preserve">Em articulação com a Espen e a DCOM, esta subpágina reúne referências da Revista Brasileira de Execução Penal e destaca dossiês, notícias editoriais e conteúdos com interface com participação social, transparência e direitos no sistema penal.</w:t>
+      </w:r>
+    </w:p>
+    <w:p>
+      <w:pPr>
+        <w:pStyle w:val="BodyText"/>
+      </w:pPr>
+      <w:r>
+        <w:t xml:space="preserve">Seção:</w:t>
+      </w:r>
+    </w:p>
+    <w:p>
+      <w:pPr>
+        <w:pStyle w:val="BodyText"/>
+      </w:pPr>
+      <w:r>
+        <w:t xml:space="preserve">A Revista</w:t>
+      </w:r>
+    </w:p>
+    <w:p>
+      <w:pPr>
+        <w:pStyle w:val="BodyText"/>
+      </w:pPr>
+      <w:r>
+        <w:t xml:space="preserve">Texto para colar:</w:t>
+      </w:r>
+    </w:p>
+    <w:p>
+      <w:pPr>
+        <w:pStyle w:val="BodyText"/>
+      </w:pPr>
+      <w:r>
+        <w:t xml:space="preserve">A Revista Brasileira de Execução Penal é o periódico técnico-científico da Secretaria Nacional de Políticas Penais (Senappen/MJSP) e constitui espaço de circulação de artigos, documentos inéditos, entrevistas, relatos de experiência e boas práticas relacionados à execução penal.</w:t>
+      </w:r>
+    </w:p>
+    <w:p>
+      <w:pPr>
+        <w:pStyle w:val="BodyText"/>
+      </w:pPr>
+      <w:r>
+        <w:t xml:space="preserve">A segunda linha do escopo:</w:t>
+      </w:r>
+    </w:p>
+    <w:p>
+      <w:pPr>
+        <w:pStyle w:val="BodyText"/>
+      </w:pPr>
+      <w:r>
+        <w:t xml:space="preserve">No contexto da Ouvidoria, a publicação contribui para aproximar produção técnica, debate qualificado e controle social, reforçando o papel da Ouvidoria como ponte entre Estado e sociedade.</w:t>
+      </w:r>
+    </w:p>
+    <w:p>
+      <w:pPr>
+        <w:pStyle w:val="BodyText"/>
+      </w:pPr>
+      <w:r>
+        <w:t xml:space="preserve">Seção:</w:t>
+      </w:r>
+    </w:p>
+    <w:p>
+      <w:pPr>
+        <w:pStyle w:val="BodyText"/>
+      </w:pPr>
+      <w:r>
+        <w:t xml:space="preserve">Sobre a revista</w:t>
+      </w:r>
+    </w:p>
+    <w:p>
+      <w:pPr>
+        <w:pStyle w:val="BodyText"/>
+      </w:pPr>
+      <w:r>
+        <w:t xml:space="preserve">Texto para colar:</w:t>
+      </w:r>
+    </w:p>
+    <w:p>
+      <w:pPr>
+        <w:pStyle w:val="BodyText"/>
+      </w:pPr>
+      <w:r>
+        <w:t xml:space="preserve">A RBEP publica artigos, documentos inéditos, entrevistas, relatos de experiência e descrição de boas práticas que relacionam a experiência profissional, o conhecimento produzido sobre a matéria e o cumprimento da legislação nacional.</w:t>
+      </w:r>
+    </w:p>
+    <w:p>
+      <w:pPr>
+        <w:pStyle w:val="BodyText"/>
+      </w:pPr>
+      <w:r>
+        <w:t xml:space="preserve">A segunda linha da seção:</w:t>
+      </w:r>
+    </w:p>
+    <w:p>
+      <w:pPr>
+        <w:pStyle w:val="BodyText"/>
+      </w:pPr>
+      <w:r>
+        <w:t xml:space="preserve">Os conteúdos são organizados em dossiês temáticos semestrais, e a revista recebeu qualificação A4 na classificação de periódicos Qualis Capes na avaliação do quadriênio 2021-2024.</w:t>
+      </w:r>
+    </w:p>
+    <w:p>
+      <w:pPr>
+        <w:pStyle w:val="BodyText"/>
+      </w:pPr>
+      <w:r>
+        <w:t xml:space="preserve">Seção:</w:t>
+      </w:r>
+    </w:p>
+    <w:p>
+      <w:pPr>
+        <w:pStyle w:val="BodyText"/>
+      </w:pPr>
+      <w:r>
+        <w:t xml:space="preserve">Acesso oficial à RBEP</w:t>
+      </w:r>
+    </w:p>
+    <w:p>
+      <w:pPr>
+        <w:pStyle w:val="BodyText"/>
+      </w:pPr>
+      <w:r>
+        <w:t xml:space="preserve">Texto para colar:</w:t>
+      </w:r>
+    </w:p>
+    <w:p>
+      <w:pPr>
+        <w:pStyle w:val="BodyText"/>
+      </w:pPr>
+      <w:r>
+        <w:t xml:space="preserve">O portal oficial da revista reúne notícias, edição atual, arquivo de edições e informações para submissão de textos.</w:t>
+      </w:r>
+    </w:p>
+    <w:p>
+      <w:pPr>
+        <w:pStyle w:val="BodyText"/>
+      </w:pPr>
+      <w:r>
+        <w:t xml:space="preserve">Links:</w:t>
+      </w:r>
+    </w:p>
+    <w:p>
+      <w:pPr>
+        <w:pStyle w:val="Compact"/>
+        <w:numPr>
+          <w:ilvl w:val="0"/>
+          <w:numId w:val="1018"/>
+        </w:numPr>
+      </w:pPr>
+      <w:r>
+        <w:t xml:space="preserve">Portal oficial da Revista Brasileira de Execução Penal: https://rbepsenappen.mj.gov.br/index.php/RBEP/pt_BR</w:t>
+      </w:r>
+    </w:p>
+    <w:p>
+      <w:pPr>
+        <w:pStyle w:val="Compact"/>
+        <w:numPr>
+          <w:ilvl w:val="0"/>
+          <w:numId w:val="1018"/>
+        </w:numPr>
+      </w:pPr>
+      <w:r>
+        <w:t xml:space="preserve">Edição atual - edição completa: https://rbepsenappen.mj.gov.br/index.php/RBEP/pt_BR/issue/view/22/58</w:t>
+      </w:r>
+    </w:p>
+    <w:p>
+      <w:pPr>
+        <w:pStyle w:val="Compact"/>
+        <w:numPr>
+          <w:ilvl w:val="0"/>
+          <w:numId w:val="1018"/>
+        </w:numPr>
+      </w:pPr>
+      <w:r>
+        <w:t xml:space="preserve">Ver todas as edições: https://rbepsenappen.mj.gov.br/index.php/RBEP/pt_BR/issue/archive</w:t>
+      </w:r>
+    </w:p>
+    <w:p>
+      <w:pPr>
+        <w:pStyle w:val="Compact"/>
+        <w:numPr>
+          <w:ilvl w:val="0"/>
+          <w:numId w:val="1018"/>
+        </w:numPr>
+      </w:pPr>
+      <w:r>
+        <w:t xml:space="preserve">Enviar submissão: https://rbepsenappen.mj.gov.br/index.php/RBEP/pt_BR/about/submissions</w:t>
+      </w:r>
+    </w:p>
+    <w:p>
+      <w:pPr>
+        <w:pStyle w:val="FirstParagraph"/>
+      </w:pPr>
+      <w:r>
+        <w:t xml:space="preserve">Seção:</w:t>
+      </w:r>
+    </w:p>
+    <w:p>
+      <w:pPr>
+        <w:pStyle w:val="BodyText"/>
+      </w:pPr>
+      <w:r>
+        <w:t xml:space="preserve">Referências institucionais</w:t>
+      </w:r>
+    </w:p>
+    <w:p>
+      <w:pPr>
+        <w:pStyle w:val="BodyText"/>
+      </w:pPr>
+      <w:r>
+        <w:t xml:space="preserve">Itens para colar:</w:t>
+      </w:r>
+    </w:p>
+    <w:p>
+      <w:pPr>
+        <w:pStyle w:val="Compact"/>
+        <w:numPr>
+          <w:ilvl w:val="0"/>
+          <w:numId w:val="1019"/>
+        </w:numPr>
+      </w:pPr>
+      <w:r>
+        <w:t xml:space="preserve">Qualis Capes 2021-2024: A4.</w:t>
+      </w:r>
+    </w:p>
+    <w:p>
+      <w:pPr>
+        <w:pStyle w:val="Compact"/>
+        <w:numPr>
+          <w:ilvl w:val="0"/>
+          <w:numId w:val="1019"/>
+        </w:numPr>
+      </w:pPr>
+      <w:r>
+        <w:t xml:space="preserve">ISSN: 2675-1895.</w:t>
+      </w:r>
+    </w:p>
+    <w:p>
+      <w:pPr>
+        <w:pStyle w:val="Compact"/>
+        <w:numPr>
+          <w:ilvl w:val="0"/>
+          <w:numId w:val="1019"/>
+        </w:numPr>
+      </w:pPr>
+      <w:r>
+        <w:t xml:space="preserve">e-ISSN: 2675-1860.</w:t>
+      </w:r>
+    </w:p>
+    <w:p>
+      <w:pPr>
+        <w:pStyle w:val="Compact"/>
+        <w:numPr>
+          <w:ilvl w:val="0"/>
+          <w:numId w:val="1019"/>
+        </w:numPr>
+      </w:pPr>
+      <w:r>
         <w:t xml:space="preserve">Contato da revista: rbep@mj.gov.br.</w:t>
       </w:r>
     </w:p>
-    <w:bookmarkEnd w:id="23"/>
-    <w:bookmarkStart w:id="24" w:name="observações-sobre-formatação"/>
+    <w:bookmarkEnd w:id="24"/>
+    <w:bookmarkStart w:id="25" w:name="observações-sobre-formatação"/>
     <w:p>
       <w:pPr>
         <w:pStyle w:val="Heading2"/>
@@ -5186,8 +5352,8 @@
         <w:t xml:space="preserve">Na prévia local, os textos corridos foram configurados com alinhamento justificado. No gov.br, esse resultado dependerá das opções disponíveis no editor oficial. Caso o editor permita alinhamento do parágrafo, recomenda-se aplicar alinhamento justificado aos textos corridos e manter títulos, links curtos e botões com o alinhamento padrão do componente.</w:t>
       </w:r>
     </w:p>
-    <w:bookmarkEnd w:id="24"/>
-    <w:bookmarkStart w:id="25" w:name="Xf7fe357b8ad8797f48d42cdb4ec1361a8fa006f"/>
+    <w:bookmarkEnd w:id="25"/>
+    <w:bookmarkStart w:id="26" w:name="Xf7fe357b8ad8797f48d42cdb4ec1361a8fa006f"/>
     <w:p>
       <w:pPr>
         <w:pStyle w:val="Heading2"/>
@@ -5220,8 +5386,8 @@
         <w:t xml:space="preserve">Há precedentes úteis dentro do próprio ecossistema da Senappen. A página da ESPEN e a subpágina da RESPEN mostram que o portal oficial já comporta texto institucional, links de destaque para documentos em PDF, listas simples e tabelas extensas por unidade federativa quando houver base oficial validada. Da mesma forma, o portal oficial da RBEP confirma a existência de referências institucionais, acesso à edição atual, arquivo de edições e informações para submissão que podem ser indicadas na subpágina temática da Revista.</w:t>
       </w:r>
     </w:p>
-    <w:bookmarkEnd w:id="25"/>
     <w:bookmarkEnd w:id="26"/>
+    <w:bookmarkEnd w:id="27"/>
     <w:sectPr>
       <w:footnotePr>
         <w:numRestart w:val="eachSect"/>
@@ -5484,6 +5650,15 @@
     <w:abstractNumId w:val="991"/>
   </w:num>
   <w:num w:numId="1016">
+    <w:abstractNumId w:val="991"/>
+  </w:num>
+  <w:num w:numId="1017">
+    <w:abstractNumId w:val="991"/>
+  </w:num>
+  <w:num w:numId="1018">
+    <w:abstractNumId w:val="991"/>
+  </w:num>
+  <w:num w:numId="1019">
     <w:abstractNumId w:val="991"/>
   </w:num>
 </w:numbering>

</xml_diff>

<commit_message>
Ajusta separacao visual e resumo do curriculo
</commit_message>
<xml_diff>
--- a/Documentação/estrutura_completa_pagina_onasp_para_dicom.docx
+++ b/Documentação/estrutura_completa_pagina_onasp_para_dicom.docx
@@ -594,7 +594,7 @@
         <w:pStyle w:val="BodyText"/>
       </w:pPr>
       <w:r>
-        <w:t xml:space="preserve">Formação acadêmica e experiência resumidas:</w:t>
+        <w:t xml:space="preserve">Link documental complementar:</w:t>
       </w:r>
     </w:p>
     <w:p>
@@ -606,31 +606,17 @@
         </w:numPr>
       </w:pPr>
       <w:r>
-        <w:t xml:space="preserve">Formação acadêmica: graduação em Direito pela Universidade Vila Velha (2004-2008) e especialização lato sensu em Direito Penal pelo Instituto Damásio de Direito (2017-2018).</w:t>
-      </w:r>
-    </w:p>
-    <w:p>
-      <w:pPr>
-        <w:pStyle w:val="Compact"/>
-        <w:numPr>
-          <w:ilvl w:val="0"/>
-          <w:numId w:val="1003"/>
-        </w:numPr>
-      </w:pPr>
-      <w:r>
-        <w:t xml:space="preserve">Formação complementar: Programa Ouvidoria da ENAP (210h), Programa de Formação e Desenvolvimento de Líderes - Identidade Líder Senappen, curso de Diretoria de Inteligência com foco em organizações criminosas e capacitação em gerenciamento de projetos, além de participação no Fórum Brasileiro de Segurança Pública.</w:t>
-      </w:r>
-    </w:p>
-    <w:p>
-      <w:pPr>
-        <w:pStyle w:val="Compact"/>
-        <w:numPr>
-          <w:ilvl w:val="0"/>
-          <w:numId w:val="1003"/>
-        </w:numPr>
-      </w:pPr>
-      <w:r>
-        <w:t xml:space="preserve">Experiência profissional: Ouvidor Nacional de Serviços Penais desde 2025; policial penal mobilizado na Assessoria Direta do Secretário Nacional de Políticas Penais entre 2024 e 2025; policial penal efetivo da Secretaria de Estado da Justiça do Espírito Santo desde 2015; professor em 2018; advogado entre 2009 e 2015; e assessor de Juiz de 1º Grau no Tribunal de Justiça do Espírito Santo entre 2005 e 2006.</w:t>
+        <w:t xml:space="preserve">Currículo completo em PDF: Documentação/Curriculo_Joao_vitor_elpidio_Ferreira.pdf</w:t>
+      </w:r>
+    </w:p>
+    <w:bookmarkEnd w:id="15"/>
+    <w:bookmarkStart w:id="16" w:name="Xccdc27266aaf5dcade8082aa450ae7a31c83649"/>
+    <w:p>
+      <w:pPr>
+        <w:pStyle w:val="Heading3"/>
+      </w:pPr>
+      <w:r>
+        <w:t xml:space="preserve">Bloco 7 - Conteúdo Técnico e Projetos Estruturantes</w:t>
       </w:r>
     </w:p>
     <w:p>
@@ -638,7 +624,443 @@
         <w:pStyle w:val="FirstParagraph"/>
       </w:pPr>
       <w:r>
-        <w:t xml:space="preserve">Link documental complementar:</w:t>
+        <w:t xml:space="preserve">Título da seção:</w:t>
+      </w:r>
+    </w:p>
+    <w:p>
+      <w:pPr>
+        <w:pStyle w:val="BodyText"/>
+      </w:pPr>
+      <w:r>
+        <w:t xml:space="preserve">Conteúdo Técnico e Projetos Estruturantes</w:t>
+      </w:r>
+    </w:p>
+    <w:p>
+      <w:pPr>
+        <w:pStyle w:val="BodyText"/>
+      </w:pPr>
+      <w:r>
+        <w:t xml:space="preserve">Card 1:</w:t>
+      </w:r>
+    </w:p>
+    <w:p>
+      <w:pPr>
+        <w:pStyle w:val="BodyText"/>
+      </w:pPr>
+      <w:r>
+        <w:t xml:space="preserve">Título:</w:t>
+      </w:r>
+    </w:p>
+    <w:p>
+      <w:pPr>
+        <w:pStyle w:val="BodyText"/>
+      </w:pPr>
+      <w:r>
+        <w:t xml:space="preserve">Rede de Ouvidorias</w:t>
+      </w:r>
+    </w:p>
+    <w:p>
+      <w:pPr>
+        <w:pStyle w:val="BodyText"/>
+      </w:pPr>
+      <w:r>
+        <w:t xml:space="preserve">Descrição:</w:t>
+      </w:r>
+    </w:p>
+    <w:p>
+      <w:pPr>
+        <w:pStyle w:val="BodyText"/>
+      </w:pPr>
+      <w:r>
+        <w:t xml:space="preserve">Iniciativa do Plano Pena Justa voltada à cooperação federativa, à harmonização de procedimentos e ao fortalecimento da proteção de direitos no âmbito das Ouvidorias de Serviços Penais.</w:t>
+      </w:r>
+    </w:p>
+    <w:p>
+      <w:pPr>
+        <w:pStyle w:val="BodyText"/>
+      </w:pPr>
+      <w:r>
+        <w:t xml:space="preserve">Imagem:</w:t>
+      </w:r>
+    </w:p>
+    <w:p>
+      <w:pPr>
+        <w:pStyle w:val="BodyText"/>
+      </w:pPr>
+      <w:r>
+        <w:t xml:space="preserve">Documentação/Botao_Renospen.png</w:t>
+      </w:r>
+    </w:p>
+    <w:p>
+      <w:pPr>
+        <w:pStyle w:val="BodyText"/>
+      </w:pPr>
+      <w:r>
+        <w:t xml:space="preserve">Destino:</w:t>
+      </w:r>
+    </w:p>
+    <w:p>
+      <w:pPr>
+        <w:pStyle w:val="BodyText"/>
+      </w:pPr>
+      <w:r>
+        <w:t xml:space="preserve">Subpágina Rede de Ouvidorias</w:t>
+      </w:r>
+    </w:p>
+    <w:p>
+      <w:pPr>
+        <w:pStyle w:val="BodyText"/>
+      </w:pPr>
+      <w:r>
+        <w:t xml:space="preserve">Card 2:</w:t>
+      </w:r>
+    </w:p>
+    <w:p>
+      <w:pPr>
+        <w:pStyle w:val="BodyText"/>
+      </w:pPr>
+      <w:r>
+        <w:t xml:space="preserve">Título:</w:t>
+      </w:r>
+    </w:p>
+    <w:p>
+      <w:pPr>
+        <w:pStyle w:val="BodyText"/>
+      </w:pPr>
+      <w:r>
+        <w:t xml:space="preserve">EMA - SENAPPEN</w:t>
+      </w:r>
+    </w:p>
+    <w:p>
+      <w:pPr>
+        <w:pStyle w:val="BodyText"/>
+      </w:pPr>
+      <w:r>
+        <w:t xml:space="preserve">Descrição:</w:t>
+      </w:r>
+    </w:p>
+    <w:p>
+      <w:pPr>
+        <w:pStyle w:val="BodyText"/>
+      </w:pPr>
+      <w:r>
+        <w:t xml:space="preserve">Espaço da Equipe de Monitoramento e Acompanhamento das decisões e deliberações do Sistema Interamericano de Direitos Humanos em face do sistema penal nacional, dedicado a fortalecer o cumprimento das determinações do SIDH em parceria com as Unidades Federativas.</w:t>
+      </w:r>
+    </w:p>
+    <w:p>
+      <w:pPr>
+        <w:pStyle w:val="BodyText"/>
+      </w:pPr>
+      <w:r>
+        <w:t xml:space="preserve">Imagem:</w:t>
+      </w:r>
+    </w:p>
+    <w:p>
+      <w:pPr>
+        <w:pStyle w:val="BodyText"/>
+      </w:pPr>
+      <w:r>
+        <w:t xml:space="preserve">Documentação/Botao_EMA.png</w:t>
+      </w:r>
+    </w:p>
+    <w:p>
+      <w:pPr>
+        <w:pStyle w:val="BodyText"/>
+      </w:pPr>
+      <w:r>
+        <w:t xml:space="preserve">Destino:</w:t>
+      </w:r>
+    </w:p>
+    <w:p>
+      <w:pPr>
+        <w:pStyle w:val="BodyText"/>
+      </w:pPr>
+      <w:r>
+        <w:t xml:space="preserve">Subpágina EMA - SENAPPEN</w:t>
+      </w:r>
+    </w:p>
+    <w:p>
+      <w:pPr>
+        <w:pStyle w:val="BodyText"/>
+      </w:pPr>
+      <w:r>
+        <w:t xml:space="preserve">Card 3:</w:t>
+      </w:r>
+    </w:p>
+    <w:p>
+      <w:pPr>
+        <w:pStyle w:val="BodyText"/>
+      </w:pPr>
+      <w:r>
+        <w:t xml:space="preserve">Título:</w:t>
+      </w:r>
+    </w:p>
+    <w:p>
+      <w:pPr>
+        <w:pStyle w:val="BodyText"/>
+      </w:pPr>
+      <w:r>
+        <w:t xml:space="preserve">Plano Pena Justa</w:t>
+      </w:r>
+    </w:p>
+    <w:p>
+      <w:pPr>
+        <w:pStyle w:val="BodyText"/>
+      </w:pPr>
+      <w:r>
+        <w:t xml:space="preserve">Descrição:</w:t>
+      </w:r>
+    </w:p>
+    <w:p>
+      <w:pPr>
+        <w:pStyle w:val="BodyText"/>
+      </w:pPr>
+      <w:r>
+        <w:t xml:space="preserve">Ambiente dedicado integralmente ao Plano, que disponibiliza o acesso a cronogramas, documentos técnicos e relatórios de acompanhamento.</w:t>
+      </w:r>
+    </w:p>
+    <w:p>
+      <w:pPr>
+        <w:pStyle w:val="BodyText"/>
+      </w:pPr>
+      <w:r>
+        <w:t xml:space="preserve">Imagem:</w:t>
+      </w:r>
+    </w:p>
+    <w:p>
+      <w:pPr>
+        <w:pStyle w:val="BodyText"/>
+      </w:pPr>
+      <w:r>
+        <w:t xml:space="preserve">Documentação/Botao_PenaJusta.png</w:t>
+      </w:r>
+    </w:p>
+    <w:p>
+      <w:pPr>
+        <w:pStyle w:val="BodyText"/>
+      </w:pPr>
+      <w:r>
+        <w:t xml:space="preserve">Destino:</w:t>
+      </w:r>
+    </w:p>
+    <w:p>
+      <w:pPr>
+        <w:pStyle w:val="BodyText"/>
+      </w:pPr>
+      <w:r>
+        <w:t xml:space="preserve">Subpágina Plano Pena Justa</w:t>
+      </w:r>
+    </w:p>
+    <w:p>
+      <w:pPr>
+        <w:pStyle w:val="BodyText"/>
+      </w:pPr>
+      <w:r>
+        <w:t xml:space="preserve">Card 4:</w:t>
+      </w:r>
+    </w:p>
+    <w:p>
+      <w:pPr>
+        <w:pStyle w:val="BodyText"/>
+      </w:pPr>
+      <w:r>
+        <w:t xml:space="preserve">Título:</w:t>
+      </w:r>
+    </w:p>
+    <w:p>
+      <w:pPr>
+        <w:pStyle w:val="BodyText"/>
+      </w:pPr>
+      <w:r>
+        <w:t xml:space="preserve">Revista Brasileira de Execução Penal</w:t>
+      </w:r>
+    </w:p>
+    <w:p>
+      <w:pPr>
+        <w:pStyle w:val="BodyText"/>
+      </w:pPr>
+      <w:r>
+        <w:t xml:space="preserve">Descrição:</w:t>
+      </w:r>
+    </w:p>
+    <w:p>
+      <w:pPr>
+        <w:pStyle w:val="BodyText"/>
+      </w:pPr>
+      <w:r>
+        <w:t xml:space="preserve">Em articulação com a Espen e a DCOM, a Onasp reúne referências da Revista Brasileira de Execução Penal, com acesso a dossiês, notícias editoriais e conteúdos relacionados à participação social, transparência e direitos no sistema penal.</w:t>
+      </w:r>
+    </w:p>
+    <w:p>
+      <w:pPr>
+        <w:pStyle w:val="BodyText"/>
+      </w:pPr>
+      <w:r>
+        <w:t xml:space="preserve">Imagem:</w:t>
+      </w:r>
+    </w:p>
+    <w:p>
+      <w:pPr>
+        <w:pStyle w:val="BodyText"/>
+      </w:pPr>
+      <w:r>
+        <w:t xml:space="preserve">Documentação/Botao_RevistaBrasileira.png</w:t>
+      </w:r>
+    </w:p>
+    <w:p>
+      <w:pPr>
+        <w:pStyle w:val="BodyText"/>
+      </w:pPr>
+      <w:r>
+        <w:t xml:space="preserve">Destino:</w:t>
+      </w:r>
+    </w:p>
+    <w:p>
+      <w:pPr>
+        <w:pStyle w:val="BodyText"/>
+      </w:pPr>
+      <w:r>
+        <w:t xml:space="preserve">Subpágina Revista Brasileira de Execução Penal</w:t>
+      </w:r>
+    </w:p>
+    <w:bookmarkEnd w:id="16"/>
+    <w:bookmarkStart w:id="17" w:name="bloco-8---plano-de-metas-2026"/>
+    <w:p>
+      <w:pPr>
+        <w:pStyle w:val="Heading3"/>
+      </w:pPr>
+      <w:r>
+        <w:t xml:space="preserve">Bloco 8 - Plano de Metas 2026</w:t>
+      </w:r>
+    </w:p>
+    <w:p>
+      <w:pPr>
+        <w:pStyle w:val="FirstParagraph"/>
+      </w:pPr>
+      <w:r>
+        <w:t xml:space="preserve">Título da seção:</w:t>
+      </w:r>
+    </w:p>
+    <w:p>
+      <w:pPr>
+        <w:pStyle w:val="BodyText"/>
+      </w:pPr>
+      <w:r>
+        <w:t xml:space="preserve">Plano de Metas 2026</w:t>
+      </w:r>
+    </w:p>
+    <w:p>
+      <w:pPr>
+        <w:pStyle w:val="BodyText"/>
+      </w:pPr>
+      <w:r>
+        <w:t xml:space="preserve">Texto para colar:</w:t>
+      </w:r>
+    </w:p>
+    <w:p>
+      <w:pPr>
+        <w:pStyle w:val="BodyText"/>
+      </w:pPr>
+      <w:r>
+        <w:t xml:space="preserve">Alinhada às diretrizes de modernização da Secretaria Nacional de Políticas Penais, a Onasp apresenta seu Plano de Metas para o ciclo 2026. Este planejamento estratégico estrutura-se em eixos fundamentais: inovação tecnológica no atendimento, fortalecimento da governança federativa e educação continuada em cidadania. As ações listadas abaixo representam o compromisso público da Ouvidoria com a eficiência da gestão e a garantia de direitos no sistema penal.</w:t>
+      </w:r>
+    </w:p>
+    <w:p>
+      <w:pPr>
+        <w:pStyle w:val="BodyText"/>
+      </w:pPr>
+      <w:r>
+        <w:t xml:space="preserve">Imagem a inserir:</w:t>
+      </w:r>
+    </w:p>
+    <w:p>
+      <w:pPr>
+        <w:pStyle w:val="BodyText"/>
+      </w:pPr>
+      <w:r>
+        <w:t xml:space="preserve">Documentação/Banner_3_new.png</w:t>
+      </w:r>
+    </w:p>
+    <w:p>
+      <w:pPr>
+        <w:pStyle w:val="BodyText"/>
+      </w:pPr>
+      <w:r>
+        <w:t xml:space="preserve">Texto alternativo sugerido:</w:t>
+      </w:r>
+    </w:p>
+    <w:p>
+      <w:pPr>
+        <w:pStyle w:val="BodyText"/>
+      </w:pPr>
+      <w:r>
+        <w:t xml:space="preserve">Banner Plano de Metas 2026 da Ouvidoria Nacional de Serviços Penais.</w:t>
+      </w:r>
+    </w:p>
+    <w:bookmarkEnd w:id="17"/>
+    <w:bookmarkStart w:id="18" w:name="bloco-9---relatórios-de-gestão"/>
+    <w:p>
+      <w:pPr>
+        <w:pStyle w:val="Heading3"/>
+      </w:pPr>
+      <w:r>
+        <w:t xml:space="preserve">Bloco 9 - Relatórios de Gestão</w:t>
+      </w:r>
+    </w:p>
+    <w:p>
+      <w:pPr>
+        <w:pStyle w:val="FirstParagraph"/>
+      </w:pPr>
+      <w:r>
+        <w:t xml:space="preserve">Título da seção:</w:t>
+      </w:r>
+    </w:p>
+    <w:p>
+      <w:pPr>
+        <w:pStyle w:val="BodyText"/>
+      </w:pPr>
+      <w:r>
+        <w:t xml:space="preserve">Relatórios de Gestão</w:t>
+      </w:r>
+    </w:p>
+    <w:p>
+      <w:pPr>
+        <w:pStyle w:val="BodyText"/>
+      </w:pPr>
+      <w:r>
+        <w:t xml:space="preserve">Texto para colar:</w:t>
+      </w:r>
+    </w:p>
+    <w:p>
+      <w:pPr>
+        <w:pStyle w:val="BodyText"/>
+      </w:pPr>
+      <w:r>
+        <w:t xml:space="preserve">O Relatório de Gestão é o principal instrumento de transparência pública e prestação de contas da ONASP à sociedade.</w:t>
+      </w:r>
+    </w:p>
+    <w:p>
+      <w:pPr>
+        <w:pStyle w:val="BodyText"/>
+      </w:pPr>
+      <w:r>
+        <w:t xml:space="preserve">Este documento consolida, anualmente, as ações estratégicas voltadas ao aprimoramento do controle social, à melhoria das condições estruturais das ouvidorias estaduais e ao aumento da fiscalização sobre denúncias e solicitações.</w:t>
+      </w:r>
+    </w:p>
+    <w:p>
+      <w:pPr>
+        <w:pStyle w:val="BodyText"/>
+      </w:pPr>
+      <w:r>
+        <w:t xml:space="preserve">Ao disponibilizar esses dados, permitimos que cidadãos, pesquisadores e órgãos de controle acompanhem a evolução das políticas penais e os avanços efetivos na defesa de direitos dentro do sistema prisional.</w:t>
+      </w:r>
+    </w:p>
+    <w:p>
+      <w:pPr>
+        <w:pStyle w:val="BodyText"/>
+      </w:pPr>
+      <w:r>
+        <w:t xml:space="preserve">Links por ano:</w:t>
       </w:r>
     </w:p>
     <w:p>
@@ -650,17 +1072,41 @@
         </w:numPr>
       </w:pPr>
       <w:r>
-        <w:t xml:space="preserve">Currículo completo em PDF: Documentação/Curriculo_Joao_vitor_elpidio_Ferreira.pdf</w:t>
-      </w:r>
-    </w:p>
-    <w:bookmarkEnd w:id="15"/>
-    <w:bookmarkStart w:id="16" w:name="Xccdc27266aaf5dcade8082aa450ae7a31c83649"/>
+        <w:t xml:space="preserve">2025: https://www.gov.br/senappen/pt-br/acesso-a-informacao/participacao-social/ouvidoria/relatorio-de-gestao-de-ouvidoria</w:t>
+      </w:r>
+    </w:p>
+    <w:p>
+      <w:pPr>
+        <w:pStyle w:val="Compact"/>
+        <w:numPr>
+          <w:ilvl w:val="0"/>
+          <w:numId w:val="1004"/>
+        </w:numPr>
+      </w:pPr>
+      <w:r>
+        <w:t xml:space="preserve">2024: https://www.gov.br/senappen/pt-br/acesso-a-informacao/participacao-social/ouvidoria/relatorio-de-gestao-de-ouvidoria</w:t>
+      </w:r>
+    </w:p>
+    <w:p>
+      <w:pPr>
+        <w:pStyle w:val="Compact"/>
+        <w:numPr>
+          <w:ilvl w:val="0"/>
+          <w:numId w:val="1004"/>
+        </w:numPr>
+      </w:pPr>
+      <w:r>
+        <w:t xml:space="preserve">2023: https://www.gov.br/senappen/pt-br/acesso-a-informacao/participacao-social/ouvidoria/relatorio-de-gestao-de-ouvidoria</w:t>
+      </w:r>
+    </w:p>
+    <w:bookmarkEnd w:id="18"/>
+    <w:bookmarkStart w:id="19" w:name="X53583b821a0a3fdc6c987398bb240b1b43b94e3"/>
     <w:p>
       <w:pPr>
         <w:pStyle w:val="Heading3"/>
       </w:pPr>
       <w:r>
-        <w:t xml:space="preserve">Bloco 7 - Conteúdo Técnico e Projetos Estruturantes</w:t>
+        <w:t xml:space="preserve">Bloco 10 - Painel de Tratamento de Demandas</w:t>
       </w:r>
     </w:p>
     <w:p>
@@ -676,6 +1122,129 @@
         <w:pStyle w:val="BodyText"/>
       </w:pPr>
       <w:r>
+        <w:t xml:space="preserve">Painel de Tratamento de Demandas da Ouvidoria Nacional de Serviços Penais</w:t>
+      </w:r>
+    </w:p>
+    <w:p>
+      <w:pPr>
+        <w:pStyle w:val="BodyText"/>
+      </w:pPr>
+      <w:r>
+        <w:t xml:space="preserve">Texto para colar:</w:t>
+      </w:r>
+    </w:p>
+    <w:p>
+      <w:pPr>
+        <w:pStyle w:val="BodyText"/>
+      </w:pPr>
+      <w:r>
+        <w:t xml:space="preserve">O Painel de Tratamento de Demandas da Ouvidoria Nacional de Serviços Penais (Onasp) é uma ferramenta de transparência ativa e gestão estratégica. Por meio de tecnologia de Business Intelligence (BI), o painel permite ao cidadão pesquisar e visualizar estatísticas atualizadas sobre as manifestações recebidas (denúncias, reclamações, solicitações, sugestões e elogios), monitorando os indicadores de desempenho e os temas mais recorrentes no sistema penal. A base de dados contempla registros a partir de janeiro de 2023, sendo atualizada periodicamente para garantir o controle social efetivo.</w:t>
+      </w:r>
+    </w:p>
+    <w:p>
+      <w:pPr>
+        <w:pStyle w:val="BodyText"/>
+      </w:pPr>
+      <w:r>
+        <w:t xml:space="preserve">Embed do Power BI:</w:t>
+      </w:r>
+    </w:p>
+    <w:p>
+      <w:pPr>
+        <w:pStyle w:val="BodyText"/>
+      </w:pPr>
+      <w:r>
+        <w:t xml:space="preserve">https://app.powerbi.com/view?r=eyJrIjoiMDU5NGVlNjQtMjZmZi00YzI0LTk0ZTktMzQwMzdkM2QyMDg5IiwidCI6ImViMDkwNDIwLTQ0NGMtNDNmNy05MWYyLTRiOGRhNmJmZThlMSJ9</w:t>
+      </w:r>
+    </w:p>
+    <w:p>
+      <w:pPr>
+        <w:pStyle w:val="BodyText"/>
+      </w:pPr>
+      <w:r>
+        <w:t xml:space="preserve">Título acessível sugerido para o iframe:</w:t>
+      </w:r>
+    </w:p>
+    <w:p>
+      <w:pPr>
+        <w:pStyle w:val="BodyText"/>
+      </w:pPr>
+      <w:r>
+        <w:t xml:space="preserve">Painel de Tratamento de Demandas da ONASP</w:t>
+      </w:r>
+    </w:p>
+    <w:bookmarkEnd w:id="19"/>
+    <w:bookmarkEnd w:id="20"/>
+    <w:bookmarkStart w:id="21" w:name="subpágina-1---rede-de-ouvidorias"/>
+    <w:p>
+      <w:pPr>
+        <w:pStyle w:val="Heading2"/>
+      </w:pPr>
+      <w:r>
+        <w:t xml:space="preserve">Subpágina 1 - Rede de Ouvidorias</w:t>
+      </w:r>
+    </w:p>
+    <w:p>
+      <w:pPr>
+        <w:pStyle w:val="FirstParagraph"/>
+      </w:pPr>
+      <w:r>
+        <w:t xml:space="preserve">Título da página:</w:t>
+      </w:r>
+    </w:p>
+    <w:p>
+      <w:pPr>
+        <w:pStyle w:val="BodyText"/>
+      </w:pPr>
+      <w:r>
+        <w:t xml:space="preserve">Rede de Ouvidorias</w:t>
+      </w:r>
+    </w:p>
+    <w:p>
+      <w:pPr>
+        <w:pStyle w:val="BodyText"/>
+      </w:pPr>
+      <w:r>
+        <w:t xml:space="preserve">Imagem de destaque:</w:t>
+      </w:r>
+    </w:p>
+    <w:p>
+      <w:pPr>
+        <w:pStyle w:val="BodyText"/>
+      </w:pPr>
+      <w:r>
+        <w:t xml:space="preserve">Documentação/Botao_Renospen.png</w:t>
+      </w:r>
+    </w:p>
+    <w:p>
+      <w:pPr>
+        <w:pStyle w:val="BodyText"/>
+      </w:pPr>
+      <w:r>
+        <w:t xml:space="preserve">Texto alternativo sugerido:</w:t>
+      </w:r>
+    </w:p>
+    <w:p>
+      <w:pPr>
+        <w:pStyle w:val="BodyText"/>
+      </w:pPr>
+      <w:r>
+        <w:t xml:space="preserve">Botão institucional da Rede de Ouvidorias.</w:t>
+      </w:r>
+    </w:p>
+    <w:p>
+      <w:pPr>
+        <w:pStyle w:val="BodyText"/>
+      </w:pPr>
+      <w:r>
+        <w:t xml:space="preserve">Identificador editorial:</w:t>
+      </w:r>
+    </w:p>
+    <w:p>
+      <w:pPr>
+        <w:pStyle w:val="BodyText"/>
+      </w:pPr>
+      <w:r>
         <w:t xml:space="preserve">Conteúdo Técnico e Projetos Estruturantes</w:t>
       </w:r>
     </w:p>
@@ -684,31 +1253,7 @@
         <w:pStyle w:val="BodyText"/>
       </w:pPr>
       <w:r>
-        <w:t xml:space="preserve">Card 1:</w:t>
-      </w:r>
-    </w:p>
-    <w:p>
-      <w:pPr>
-        <w:pStyle w:val="BodyText"/>
-      </w:pPr>
-      <w:r>
-        <w:t xml:space="preserve">Título:</w:t>
-      </w:r>
-    </w:p>
-    <w:p>
-      <w:pPr>
-        <w:pStyle w:val="BodyText"/>
-      </w:pPr>
-      <w:r>
-        <w:t xml:space="preserve">Rede de Ouvidorias</w:t>
-      </w:r>
-    </w:p>
-    <w:p>
-      <w:pPr>
-        <w:pStyle w:val="BodyText"/>
-      </w:pPr>
-      <w:r>
-        <w:t xml:space="preserve">Descrição:</w:t>
+        <w:t xml:space="preserve">Texto de destaque:</w:t>
       </w:r>
     </w:p>
     <w:p>
@@ -724,273 +1269,15 @@
         <w:pStyle w:val="BodyText"/>
       </w:pPr>
       <w:r>
-        <w:t xml:space="preserve">Imagem:</w:t>
-      </w:r>
-    </w:p>
-    <w:p>
-      <w:pPr>
-        <w:pStyle w:val="BodyText"/>
-      </w:pPr>
-      <w:r>
-        <w:t xml:space="preserve">Documentação/Botao_Renospen.png</w:t>
-      </w:r>
-    </w:p>
-    <w:p>
-      <w:pPr>
-        <w:pStyle w:val="BodyText"/>
-      </w:pPr>
-      <w:r>
-        <w:t xml:space="preserve">Destino:</w:t>
-      </w:r>
-    </w:p>
-    <w:p>
-      <w:pPr>
-        <w:pStyle w:val="BodyText"/>
-      </w:pPr>
-      <w:r>
-        <w:t xml:space="preserve">Subpágina Rede de Ouvidorias</w:t>
-      </w:r>
-    </w:p>
-    <w:p>
-      <w:pPr>
-        <w:pStyle w:val="BodyText"/>
-      </w:pPr>
-      <w:r>
-        <w:t xml:space="preserve">Card 2:</w:t>
-      </w:r>
-    </w:p>
-    <w:p>
-      <w:pPr>
-        <w:pStyle w:val="BodyText"/>
-      </w:pPr>
-      <w:r>
-        <w:t xml:space="preserve">Título:</w:t>
-      </w:r>
-    </w:p>
-    <w:p>
-      <w:pPr>
-        <w:pStyle w:val="BodyText"/>
-      </w:pPr>
-      <w:r>
-        <w:t xml:space="preserve">EMA - SENAPPEN</w:t>
-      </w:r>
-    </w:p>
-    <w:p>
-      <w:pPr>
-        <w:pStyle w:val="BodyText"/>
-      </w:pPr>
-      <w:r>
-        <w:t xml:space="preserve">Descrição:</w:t>
-      </w:r>
-    </w:p>
-    <w:p>
-      <w:pPr>
-        <w:pStyle w:val="BodyText"/>
-      </w:pPr>
-      <w:r>
-        <w:t xml:space="preserve">Espaço da Equipe de Monitoramento e Acompanhamento das decisões e deliberações do Sistema Interamericano de Direitos Humanos em face do sistema penal nacional, dedicado a fortalecer o cumprimento das determinações do SIDH em parceria com as Unidades Federativas.</w:t>
-      </w:r>
-    </w:p>
-    <w:p>
-      <w:pPr>
-        <w:pStyle w:val="BodyText"/>
-      </w:pPr>
-      <w:r>
-        <w:t xml:space="preserve">Imagem:</w:t>
-      </w:r>
-    </w:p>
-    <w:p>
-      <w:pPr>
-        <w:pStyle w:val="BodyText"/>
-      </w:pPr>
-      <w:r>
-        <w:t xml:space="preserve">Documentação/Botao_EMA.png</w:t>
-      </w:r>
-    </w:p>
-    <w:p>
-      <w:pPr>
-        <w:pStyle w:val="BodyText"/>
-      </w:pPr>
-      <w:r>
-        <w:t xml:space="preserve">Destino:</w:t>
-      </w:r>
-    </w:p>
-    <w:p>
-      <w:pPr>
-        <w:pStyle w:val="BodyText"/>
-      </w:pPr>
-      <w:r>
-        <w:t xml:space="preserve">Subpágina EMA - SENAPPEN</w:t>
-      </w:r>
-    </w:p>
-    <w:p>
-      <w:pPr>
-        <w:pStyle w:val="BodyText"/>
-      </w:pPr>
-      <w:r>
-        <w:t xml:space="preserve">Card 3:</w:t>
-      </w:r>
-    </w:p>
-    <w:p>
-      <w:pPr>
-        <w:pStyle w:val="BodyText"/>
-      </w:pPr>
-      <w:r>
-        <w:t xml:space="preserve">Título:</w:t>
-      </w:r>
-    </w:p>
-    <w:p>
-      <w:pPr>
-        <w:pStyle w:val="BodyText"/>
-      </w:pPr>
-      <w:r>
-        <w:t xml:space="preserve">Plano Pena Justa</w:t>
-      </w:r>
-    </w:p>
-    <w:p>
-      <w:pPr>
-        <w:pStyle w:val="BodyText"/>
-      </w:pPr>
-      <w:r>
-        <w:t xml:space="preserve">Descrição:</w:t>
-      </w:r>
-    </w:p>
-    <w:p>
-      <w:pPr>
-        <w:pStyle w:val="BodyText"/>
-      </w:pPr>
-      <w:r>
-        <w:t xml:space="preserve">Ambiente dedicado integralmente ao Plano, que disponibiliza o acesso a cronogramas, documentos técnicos e relatórios de acompanhamento.</w:t>
-      </w:r>
-    </w:p>
-    <w:p>
-      <w:pPr>
-        <w:pStyle w:val="BodyText"/>
-      </w:pPr>
-      <w:r>
-        <w:t xml:space="preserve">Imagem:</w:t>
-      </w:r>
-    </w:p>
-    <w:p>
-      <w:pPr>
-        <w:pStyle w:val="BodyText"/>
-      </w:pPr>
-      <w:r>
-        <w:t xml:space="preserve">Documentação/Botao_PenaJusta.png</w:t>
-      </w:r>
-    </w:p>
-    <w:p>
-      <w:pPr>
-        <w:pStyle w:val="BodyText"/>
-      </w:pPr>
-      <w:r>
-        <w:t xml:space="preserve">Destino:</w:t>
-      </w:r>
-    </w:p>
-    <w:p>
-      <w:pPr>
-        <w:pStyle w:val="BodyText"/>
-      </w:pPr>
-      <w:r>
-        <w:t xml:space="preserve">Subpágina Plano Pena Justa</w:t>
-      </w:r>
-    </w:p>
-    <w:p>
-      <w:pPr>
-        <w:pStyle w:val="BodyText"/>
-      </w:pPr>
-      <w:r>
-        <w:t xml:space="preserve">Card 4:</w:t>
-      </w:r>
-    </w:p>
-    <w:p>
-      <w:pPr>
-        <w:pStyle w:val="BodyText"/>
-      </w:pPr>
-      <w:r>
-        <w:t xml:space="preserve">Título:</w:t>
-      </w:r>
-    </w:p>
-    <w:p>
-      <w:pPr>
-        <w:pStyle w:val="BodyText"/>
-      </w:pPr>
-      <w:r>
-        <w:t xml:space="preserve">Revista Brasileira de Execução Penal</w:t>
-      </w:r>
-    </w:p>
-    <w:p>
-      <w:pPr>
-        <w:pStyle w:val="BodyText"/>
-      </w:pPr>
-      <w:r>
-        <w:t xml:space="preserve">Descrição:</w:t>
-      </w:r>
-    </w:p>
-    <w:p>
-      <w:pPr>
-        <w:pStyle w:val="BodyText"/>
-      </w:pPr>
-      <w:r>
-        <w:t xml:space="preserve">Em articulação com a Espen e a DCOM, a Onasp reúne referências da Revista Brasileira de Execução Penal, com acesso a dossiês, notícias editoriais e conteúdos relacionados à participação social, transparência e direitos no sistema penal.</w:t>
-      </w:r>
-    </w:p>
-    <w:p>
-      <w:pPr>
-        <w:pStyle w:val="BodyText"/>
-      </w:pPr>
-      <w:r>
-        <w:t xml:space="preserve">Imagem:</w:t>
-      </w:r>
-    </w:p>
-    <w:p>
-      <w:pPr>
-        <w:pStyle w:val="BodyText"/>
-      </w:pPr>
-      <w:r>
-        <w:t xml:space="preserve">Documentação/Botao_RevistaBrasileira.png</w:t>
-      </w:r>
-    </w:p>
-    <w:p>
-      <w:pPr>
-        <w:pStyle w:val="BodyText"/>
-      </w:pPr>
-      <w:r>
-        <w:t xml:space="preserve">Destino:</w:t>
-      </w:r>
-    </w:p>
-    <w:p>
-      <w:pPr>
-        <w:pStyle w:val="BodyText"/>
-      </w:pPr>
-      <w:r>
-        <w:t xml:space="preserve">Subpágina Revista Brasileira de Execução Penal</w:t>
-      </w:r>
-    </w:p>
-    <w:bookmarkEnd w:id="16"/>
-    <w:bookmarkStart w:id="17" w:name="bloco-8---plano-de-metas-2026"/>
-    <w:p>
-      <w:pPr>
-        <w:pStyle w:val="Heading3"/>
-      </w:pPr>
-      <w:r>
-        <w:t xml:space="preserve">Bloco 8 - Plano de Metas 2026</w:t>
-      </w:r>
-    </w:p>
-    <w:p>
-      <w:pPr>
-        <w:pStyle w:val="FirstParagraph"/>
-      </w:pPr>
-      <w:r>
-        <w:t xml:space="preserve">Título da seção:</w:t>
-      </w:r>
-    </w:p>
-    <w:p>
-      <w:pPr>
-        <w:pStyle w:val="BodyText"/>
-      </w:pPr>
-      <w:r>
-        <w:t xml:space="preserve">Plano de Metas 2026</w:t>
+        <w:t xml:space="preserve">Seção:</w:t>
+      </w:r>
+    </w:p>
+    <w:p>
+      <w:pPr>
+        <w:pStyle w:val="BodyText"/>
+      </w:pPr>
+      <w:r>
+        <w:t xml:space="preserve">Renospen</w:t>
       </w:r>
     </w:p>
     <w:p>
@@ -1006,105 +1293,47 @@
         <w:pStyle w:val="BodyText"/>
       </w:pPr>
       <w:r>
-        <w:t xml:space="preserve">Alinhada às diretrizes de modernização da Secretaria Nacional de Políticas Penais, a Onasp apresenta seu Plano de Metas para o ciclo 2026. Este planejamento estratégico estrutura-se em eixos fundamentais: inovação tecnológica no atendimento, fortalecimento da governança federativa e educação continuada em cidadania. As ações listadas abaixo representam o compromisso público da Ouvidoria com a eficiência da gestão e a garantia de direitos no sistema penal.</w:t>
-      </w:r>
-    </w:p>
-    <w:p>
-      <w:pPr>
-        <w:pStyle w:val="BodyText"/>
-      </w:pPr>
-      <w:r>
-        <w:t xml:space="preserve">Imagem a inserir:</w:t>
-      </w:r>
-    </w:p>
-    <w:p>
-      <w:pPr>
-        <w:pStyle w:val="BodyText"/>
-      </w:pPr>
-      <w:r>
-        <w:t xml:space="preserve">Documentação/Banner_3_new.png</w:t>
-      </w:r>
-    </w:p>
-    <w:p>
-      <w:pPr>
-        <w:pStyle w:val="BodyText"/>
-      </w:pPr>
-      <w:r>
-        <w:t xml:space="preserve">Texto alternativo sugerido:</w:t>
-      </w:r>
-    </w:p>
-    <w:p>
-      <w:pPr>
-        <w:pStyle w:val="BodyText"/>
-      </w:pPr>
-      <w:r>
-        <w:t xml:space="preserve">Banner Plano de Metas 2026 da Ouvidoria Nacional de Serviços Penais.</w:t>
-      </w:r>
-    </w:p>
-    <w:bookmarkEnd w:id="17"/>
-    <w:bookmarkStart w:id="18" w:name="bloco-9---relatórios-de-gestão"/>
-    <w:p>
-      <w:pPr>
-        <w:pStyle w:val="Heading3"/>
-      </w:pPr>
-      <w:r>
-        <w:t xml:space="preserve">Bloco 9 - Relatórios de Gestão</w:t>
-      </w:r>
-    </w:p>
-    <w:p>
-      <w:pPr>
-        <w:pStyle w:val="FirstParagraph"/>
-      </w:pPr>
-      <w:r>
-        <w:t xml:space="preserve">Título da seção:</w:t>
-      </w:r>
-    </w:p>
-    <w:p>
-      <w:pPr>
-        <w:pStyle w:val="BodyText"/>
-      </w:pPr>
-      <w:r>
-        <w:t xml:space="preserve">Relatórios de Gestão</w:t>
-      </w:r>
-    </w:p>
-    <w:p>
-      <w:pPr>
-        <w:pStyle w:val="BodyText"/>
-      </w:pPr>
-      <w:r>
-        <w:t xml:space="preserve">Texto para colar:</w:t>
-      </w:r>
-    </w:p>
-    <w:p>
-      <w:pPr>
-        <w:pStyle w:val="BodyText"/>
-      </w:pPr>
-      <w:r>
-        <w:t xml:space="preserve">O Relatório de Gestão é o principal instrumento de transparência pública e prestação de contas da ONASP à sociedade.</w:t>
-      </w:r>
-    </w:p>
-    <w:p>
-      <w:pPr>
-        <w:pStyle w:val="BodyText"/>
-      </w:pPr>
-      <w:r>
-        <w:t xml:space="preserve">Este documento consolida, anualmente, as ações estratégicas voltadas ao aprimoramento do controle social, à melhoria das condições estruturais das ouvidorias estaduais e ao aumento da fiscalização sobre denúncias e solicitações.</w:t>
-      </w:r>
-    </w:p>
-    <w:p>
-      <w:pPr>
-        <w:pStyle w:val="BodyText"/>
-      </w:pPr>
-      <w:r>
-        <w:t xml:space="preserve">Ao disponibilizar esses dados, permitimos que cidadãos, pesquisadores e órgãos de controle acompanhem a evolução das políticas penais e os avanços efetivos na defesa de direitos dentro do sistema prisional.</w:t>
-      </w:r>
-    </w:p>
-    <w:p>
-      <w:pPr>
-        <w:pStyle w:val="BodyText"/>
-      </w:pPr>
-      <w:r>
-        <w:t xml:space="preserve">Links por ano:</w:t>
+        <w:t xml:space="preserve">A Rede de Ouvidorias visa manter a articulação entre as unidades responsáveis pela escuta institucional no sistema penal, com o objetivo de fortalecer a cooperação federativa, qualificar o atendimento ao cidadão e ampliar a proteção de direitos em âmbito nacional.</w:t>
+      </w:r>
+    </w:p>
+    <w:p>
+      <w:pPr>
+        <w:pStyle w:val="BodyText"/>
+      </w:pPr>
+      <w:r>
+        <w:t xml:space="preserve">A segunda linha do escopo:</w:t>
+      </w:r>
+    </w:p>
+    <w:p>
+      <w:pPr>
+        <w:pStyle w:val="BodyText"/>
+      </w:pPr>
+      <w:r>
+        <w:t xml:space="preserve">No contexto da Ouvidoria Nacional de Serviços Penais, esta subpágina reúne referências públicas da iniciativa, favorecendo o intercâmbio de práticas, a harmonização de procedimentos e a consolidação de parâmetros voltados à transparência e ao controle social.</w:t>
+      </w:r>
+    </w:p>
+    <w:p>
+      <w:pPr>
+        <w:pStyle w:val="BodyText"/>
+      </w:pPr>
+      <w:r>
+        <w:t xml:space="preserve">Seção:</w:t>
+      </w:r>
+    </w:p>
+    <w:p>
+      <w:pPr>
+        <w:pStyle w:val="BodyText"/>
+      </w:pPr>
+      <w:r>
+        <w:t xml:space="preserve">Objetivos da Rede</w:t>
+      </w:r>
+    </w:p>
+    <w:p>
+      <w:pPr>
+        <w:pStyle w:val="BodyText"/>
+      </w:pPr>
+      <w:r>
+        <w:t xml:space="preserve">Itens para colar:</w:t>
       </w:r>
     </w:p>
     <w:p>
@@ -1116,7 +1345,7 @@
         </w:numPr>
       </w:pPr>
       <w:r>
-        <w:t xml:space="preserve">2025: https://www.gov.br/senappen/pt-br/acesso-a-informacao/participacao-social/ouvidoria/relatorio-de-gestao-de-ouvidoria</w:t>
+        <w:t xml:space="preserve">Atuar como espaço de difusão de referências técnicas úteis às ouvidorias de serviços penais.</w:t>
       </w:r>
     </w:p>
     <w:p>
@@ -1128,7 +1357,7 @@
         </w:numPr>
       </w:pPr>
       <w:r>
-        <w:t xml:space="preserve">2024: https://www.gov.br/senappen/pt-br/acesso-a-informacao/participacao-social/ouvidoria/relatorio-de-gestao-de-ouvidoria</w:t>
+        <w:t xml:space="preserve">Fomentar o compartilhamento de práticas, fluxos e instrumentos voltados ao atendimento e ao encaminhamento de manifestações.</w:t>
       </w:r>
     </w:p>
     <w:p>
@@ -1140,17 +1369,19 @@
         </w:numPr>
       </w:pPr>
       <w:r>
-        <w:t xml:space="preserve">2023: https://www.gov.br/senappen/pt-br/acesso-a-informacao/participacao-social/ouvidoria/relatorio-de-gestao-de-ouvidoria</w:t>
-      </w:r>
-    </w:p>
-    <w:bookmarkEnd w:id="18"/>
-    <w:bookmarkStart w:id="19" w:name="X53583b821a0a3fdc6c987398bb240b1b43b94e3"/>
-    <w:p>
-      <w:pPr>
-        <w:pStyle w:val="Heading3"/>
-      </w:pPr>
-      <w:r>
-        <w:t xml:space="preserve">Bloco 10 - Painel de Tratamento de Demandas</w:t>
+        <w:t xml:space="preserve">Estimular a cooperação entre a União, os Estados e o Distrito Federal para o aprimoramento da atuação institucional.</w:t>
+      </w:r>
+    </w:p>
+    <w:p>
+      <w:pPr>
+        <w:pStyle w:val="Compact"/>
+        <w:numPr>
+          <w:ilvl w:val="0"/>
+          <w:numId w:val="1005"/>
+        </w:numPr>
+      </w:pPr>
+      <w:r>
+        <w:t xml:space="preserve">Fortalecer a participação social, a transparência pública e a proteção de direitos no sistema penal.</w:t>
       </w:r>
     </w:p>
     <w:p>
@@ -1158,15 +1389,15 @@
         <w:pStyle w:val="FirstParagraph"/>
       </w:pPr>
       <w:r>
-        <w:t xml:space="preserve">Título da seção:</w:t>
-      </w:r>
-    </w:p>
-    <w:p>
-      <w:pPr>
-        <w:pStyle w:val="BodyText"/>
-      </w:pPr>
-      <w:r>
-        <w:t xml:space="preserve">Painel de Tratamento de Demandas da Ouvidoria Nacional de Serviços Penais</w:t>
+        <w:t xml:space="preserve">Seção:</w:t>
+      </w:r>
+    </w:p>
+    <w:p>
+      <w:pPr>
+        <w:pStyle w:val="BodyText"/>
+      </w:pPr>
+      <w:r>
+        <w:t xml:space="preserve">Governança e cooperação técnica</w:t>
       </w:r>
     </w:p>
     <w:p>
@@ -1182,130 +1413,15 @@
         <w:pStyle w:val="BodyText"/>
       </w:pPr>
       <w:r>
-        <w:t xml:space="preserve">O Painel de Tratamento de Demandas da Ouvidoria Nacional de Serviços Penais (Onasp) é uma ferramenta de transparência ativa e gestão estratégica. Por meio de tecnologia de Business Intelligence (BI), o painel permite ao cidadão pesquisar e visualizar estatísticas atualizadas sobre as manifestações recebidas (denúncias, reclamações, solicitações, sugestões e elogios), monitorando os indicadores de desempenho e os temas mais recorrentes no sistema penal. A base de dados contempla registros a partir de janeiro de 2023, sendo atualizada periodicamente para garantir o controle social efetivo.</w:t>
-      </w:r>
-    </w:p>
-    <w:p>
-      <w:pPr>
-        <w:pStyle w:val="BodyText"/>
-      </w:pPr>
-      <w:r>
-        <w:t xml:space="preserve">Embed do Power BI:</w:t>
-      </w:r>
-    </w:p>
-    <w:p>
-      <w:pPr>
-        <w:pStyle w:val="BodyText"/>
-      </w:pPr>
-      <w:r>
-        <w:t xml:space="preserve">https://app.powerbi.com/view?r=eyJrIjoiMDU5NGVlNjQtMjZmZi00YzI0LTk0ZTktMzQwMzdkM2QyMDg5IiwidCI6ImViMDkwNDIwLTQ0NGMtNDNmNy05MWYyLTRiOGRhNmJmZThlMSJ9</w:t>
-      </w:r>
-    </w:p>
-    <w:p>
-      <w:pPr>
-        <w:pStyle w:val="BodyText"/>
-      </w:pPr>
-      <w:r>
-        <w:t xml:space="preserve">Título acessível sugerido para o iframe:</w:t>
-      </w:r>
-    </w:p>
-    <w:p>
-      <w:pPr>
-        <w:pStyle w:val="BodyText"/>
-      </w:pPr>
-      <w:r>
-        <w:t xml:space="preserve">Painel de Tratamento de Demandas da ONASP</w:t>
-      </w:r>
-    </w:p>
-    <w:bookmarkEnd w:id="19"/>
-    <w:bookmarkEnd w:id="20"/>
-    <w:bookmarkStart w:id="21" w:name="subpágina-1---rede-de-ouvidorias"/>
-    <w:p>
-      <w:pPr>
-        <w:pStyle w:val="Heading2"/>
-      </w:pPr>
-      <w:r>
-        <w:t xml:space="preserve">Subpágina 1 - Rede de Ouvidorias</w:t>
-      </w:r>
-    </w:p>
-    <w:p>
-      <w:pPr>
-        <w:pStyle w:val="FirstParagraph"/>
-      </w:pPr>
-      <w:r>
-        <w:t xml:space="preserve">Título da página:</w:t>
-      </w:r>
-    </w:p>
-    <w:p>
-      <w:pPr>
-        <w:pStyle w:val="BodyText"/>
-      </w:pPr>
-      <w:r>
-        <w:t xml:space="preserve">Rede de Ouvidorias</w:t>
-      </w:r>
-    </w:p>
-    <w:p>
-      <w:pPr>
-        <w:pStyle w:val="BodyText"/>
-      </w:pPr>
-      <w:r>
-        <w:t xml:space="preserve">Imagem de destaque:</w:t>
-      </w:r>
-    </w:p>
-    <w:p>
-      <w:pPr>
-        <w:pStyle w:val="BodyText"/>
-      </w:pPr>
-      <w:r>
-        <w:t xml:space="preserve">Documentação/Botao_Renospen.png</w:t>
-      </w:r>
-    </w:p>
-    <w:p>
-      <w:pPr>
-        <w:pStyle w:val="BodyText"/>
-      </w:pPr>
-      <w:r>
-        <w:t xml:space="preserve">Texto alternativo sugerido:</w:t>
-      </w:r>
-    </w:p>
-    <w:p>
-      <w:pPr>
-        <w:pStyle w:val="BodyText"/>
-      </w:pPr>
-      <w:r>
-        <w:t xml:space="preserve">Botão institucional da Rede de Ouvidorias.</w:t>
-      </w:r>
-    </w:p>
-    <w:p>
-      <w:pPr>
-        <w:pStyle w:val="BodyText"/>
-      </w:pPr>
-      <w:r>
-        <w:t xml:space="preserve">Identificador editorial:</w:t>
-      </w:r>
-    </w:p>
-    <w:p>
-      <w:pPr>
-        <w:pStyle w:val="BodyText"/>
-      </w:pPr>
-      <w:r>
-        <w:t xml:space="preserve">Conteúdo Técnico e Projetos Estruturantes</w:t>
-      </w:r>
-    </w:p>
-    <w:p>
-      <w:pPr>
-        <w:pStyle w:val="BodyText"/>
-      </w:pPr>
-      <w:r>
-        <w:t xml:space="preserve">Texto de destaque:</w:t>
-      </w:r>
-    </w:p>
-    <w:p>
-      <w:pPr>
-        <w:pStyle w:val="BodyText"/>
-      </w:pPr>
-      <w:r>
-        <w:t xml:space="preserve">Iniciativa do Plano Pena Justa voltada à cooperação federativa, à harmonização de procedimentos e ao fortalecimento da proteção de direitos no âmbito das Ouvidorias de Serviços Penais.</w:t>
+        <w:t xml:space="preserve">No recorte da ONASP, a Rede de Ouvidorias pode ser apresentada como espaço permanente de articulação entre unidades responsáveis pela escuta institucional, com foco em difusão de referências técnicas, intercâmbio de práticas e aperfeiçoamento contínuo da atuação no sistema penal.</w:t>
+      </w:r>
+    </w:p>
+    <w:p>
+      <w:pPr>
+        <w:pStyle w:val="BodyText"/>
+      </w:pPr>
+      <w:r>
+        <w:t xml:space="preserve">Esse arranjo é reforçado por instrumentos que definem parâmetros mínimos para a estruturação das ouvidorias e institucionalizam a Renospen como instância de cooperação técnica, integração federativa e fortalecimento institucional.</w:t>
       </w:r>
     </w:p>
     <w:p>
@@ -1315,13 +1431,11 @@
       <w:r>
         <w:t xml:space="preserve">Seção:</w:t>
       </w:r>
-    </w:p>
-    <w:p>
-      <w:pPr>
-        <w:pStyle w:val="BodyText"/>
-      </w:pPr>
-      <w:r>
-        <w:t xml:space="preserve">Renospen</w:t>
+      <w:r>
+        <w:t xml:space="preserve"> </w:t>
+      </w:r>
+      <w:r>
+        <w:t xml:space="preserve">Mapa interativo e destaque por UF</w:t>
       </w:r>
     </w:p>
     <w:p>
@@ -1337,23 +1451,81 @@
         <w:pStyle w:val="BodyText"/>
       </w:pPr>
       <w:r>
-        <w:t xml:space="preserve">A Rede de Ouvidorias visa manter a articulação entre as unidades responsáveis pela escuta institucional no sistema penal, com o objetivo de fortalecer a cooperação federativa, qualificar o atendimento ao cidadão e ampliar a proteção de direitos em âmbito nacional.</w:t>
-      </w:r>
-    </w:p>
-    <w:p>
-      <w:pPr>
-        <w:pStyle w:val="BodyText"/>
-      </w:pPr>
-      <w:r>
-        <w:t xml:space="preserve">A segunda linha do escopo:</w:t>
-      </w:r>
-    </w:p>
-    <w:p>
-      <w:pPr>
-        <w:pStyle w:val="BodyText"/>
-      </w:pPr>
-      <w:r>
-        <w:t xml:space="preserve">No contexto da Ouvidoria Nacional de Serviços Penais, esta subpágina reúne referências públicas da iniciativa, favorecendo o intercâmbio de práticas, a harmonização de procedimentos e a consolidação de parâmetros voltados à transparência e ao controle social.</w:t>
+        <w:t xml:space="preserve">Esta prévia reúne, em um único ponto, os contatos institucionais consolidados das unidades da federação. No ambiente de validação local, a consulta foi organizada por meio de um mapa visual com seleção por UF e painel lateral com dados resumidos da ouvidoria correspondente ou, quando cabível, das referências institucionais associadas à mesma unidade da federação.</w:t>
+      </w:r>
+    </w:p>
+    <w:p>
+      <w:pPr>
+        <w:pStyle w:val="BodyText"/>
+      </w:pPr>
+      <w:r>
+        <w:t xml:space="preserve">Orientação para publicação oficial:</w:t>
+      </w:r>
+    </w:p>
+    <w:p>
+      <w:pPr>
+        <w:pStyle w:val="BodyText"/>
+      </w:pPr>
+      <w:r>
+        <w:t xml:space="preserve">No ambiente gov.br, recomenda-se tratar o mapa interativo apenas como referência visual da prévia. A solução mais segura para publicação é manter um seletor simples por UF, um bloco expansível por estado ou, preferencialmente, o quadro textual de contatos apresentado abaixo, sem depender de JavaScript customizado.</w:t>
+      </w:r>
+    </w:p>
+    <w:p>
+      <w:pPr>
+        <w:pStyle w:val="BodyText"/>
+      </w:pPr>
+      <w:r>
+        <w:t xml:space="preserve">Quando a mesma UF tiver mais de uma referência institucional relevante, como ocorre no Espírito Santo, recomenda-se separar as informações em blocos independentes dentro do quadro lateral ou em linhas distintas no quadro textual, evitando misturar órgãos, responsáveis, telefones e endereços em uma única ficha.</w:t>
+      </w:r>
+    </w:p>
+    <w:p>
+      <w:pPr>
+        <w:pStyle w:val="BodyText"/>
+      </w:pPr>
+      <w:r>
+        <w:t xml:space="preserve">Regra editorial obrigatória:</w:t>
+      </w:r>
+    </w:p>
+    <w:p>
+      <w:pPr>
+        <w:pStyle w:val="BodyText"/>
+      </w:pPr>
+      <w:r>
+        <w:t xml:space="preserve">Detalhes de curadoria usados para consolidar os contatos devem permanecer apenas na documentação interna de trabalho. Não publicar na página expressões como</w:t>
+      </w:r>
+      <w:r>
+        <w:t xml:space="preserve"> </w:t>
+      </w:r>
+      <w:r>
+        <w:t xml:space="preserve">“o diagnóstico registrou”</w:t>
+      </w:r>
+      <w:r>
+        <w:t xml:space="preserve">,</w:t>
+      </w:r>
+      <w:r>
+        <w:t xml:space="preserve"> </w:t>
+      </w:r>
+      <w:r>
+        <w:t xml:space="preserve">“a resposta do diagnóstico informa”</w:t>
+      </w:r>
+      <w:r>
+        <w:t xml:space="preserve">, menções a respostas recebidas, observações internas de validação ou listas nominais de servidores designados.</w:t>
+      </w:r>
+    </w:p>
+    <w:p>
+      <w:pPr>
+        <w:pStyle w:val="BodyText"/>
+      </w:pPr>
+      <w:r>
+        <w:t xml:space="preserve">Base interna de consolidação (não publicar na página):</w:t>
+      </w:r>
+    </w:p>
+    <w:p>
+      <w:pPr>
+        <w:pStyle w:val="BodyText"/>
+      </w:pPr>
+      <w:r>
+        <w:t xml:space="preserve">Diagnóstico de Ouvidorias Estaduais, consolidado pela ONASP a partir das respostas recebidas em 2026.</w:t>
       </w:r>
     </w:p>
     <w:p>
@@ -1369,15 +1541,31 @@
         <w:pStyle w:val="BodyText"/>
       </w:pPr>
       <w:r>
-        <w:t xml:space="preserve">Objetivos da Rede</w:t>
-      </w:r>
-    </w:p>
-    <w:p>
-      <w:pPr>
-        <w:pStyle w:val="BodyText"/>
-      </w:pPr>
-      <w:r>
-        <w:t xml:space="preserve">Itens para colar:</w:t>
+        <w:t xml:space="preserve">VI Encontro Nacional das Ouvidorias do Sistema Penal</w:t>
+      </w:r>
+    </w:p>
+    <w:p>
+      <w:pPr>
+        <w:pStyle w:val="BodyText"/>
+      </w:pPr>
+      <w:r>
+        <w:t xml:space="preserve">Texto para colar:</w:t>
+      </w:r>
+    </w:p>
+    <w:p>
+      <w:pPr>
+        <w:pStyle w:val="BodyText"/>
+      </w:pPr>
+      <w:r>
+        <w:t xml:space="preserve">O VI Encontro Nacional das Ouvidorias do Sistema Penal, promovido pela Senappen entre 8 e 10 de abril, consolidou um novo marco para a gestão penitenciária com o lançamento da Rede Nacional de Ouvidorias de Serviços Penais (Renospen) e a publicação de uma Instrução Normativa para padronizar essas instâncias nos estados. Alinhado ao Plano Nacional Pena Justa, o evento focou no fortalecimento da transparência, do controle social e da promoção de direitos humanos, unificando diretrizes nacionais enquanto respeita as autonomias locais. Além dos painéis sobre gestão estratégica e escuta ética, a iniciativa contemplou a doação de equipamentos tecnológicos para todas as unidades federativas, visando modernizar o atendimento e estreitar a comunicação entre o sistema penal e a sociedade brasileira.</w:t>
+      </w:r>
+    </w:p>
+    <w:p>
+      <w:pPr>
+        <w:pStyle w:val="BodyText"/>
+      </w:pPr>
+      <w:r>
+        <w:t xml:space="preserve">Imagens a inserir:</w:t>
       </w:r>
     </w:p>
     <w:p>
@@ -1389,7 +1577,7 @@
         </w:numPr>
       </w:pPr>
       <w:r>
-        <w:t xml:space="preserve">Atuar como espaço de difusão de referências técnicas úteis às ouvidorias de serviços penais.</w:t>
+        <w:t xml:space="preserve">Documentação/Banner_Renospen_1.jpeg</w:t>
       </w:r>
     </w:p>
     <w:p>
@@ -1401,7 +1589,7 @@
         </w:numPr>
       </w:pPr>
       <w:r>
-        <w:t xml:space="preserve">Fomentar o compartilhamento de práticas, fluxos e instrumentos voltados ao atendimento e ao encaminhamento de manifestações.</w:t>
+        <w:t xml:space="preserve">Documentação/Banner_Renospen_2.jpeg</w:t>
       </w:r>
     </w:p>
     <w:p>
@@ -1413,19 +1601,7 @@
         </w:numPr>
       </w:pPr>
       <w:r>
-        <w:t xml:space="preserve">Estimular a cooperação entre a União, os Estados e o Distrito Federal para o aprimoramento da atuação institucional.</w:t>
-      </w:r>
-    </w:p>
-    <w:p>
-      <w:pPr>
-        <w:pStyle w:val="Compact"/>
-        <w:numPr>
-          <w:ilvl w:val="0"/>
-          <w:numId w:val="1006"/>
-        </w:numPr>
-      </w:pPr>
-      <w:r>
-        <w:t xml:space="preserve">Fortalecer a participação social, a transparência pública e a proteção de direitos no sistema penal.</w:t>
+        <w:t xml:space="preserve">Documentação/Banner_Renospen_3.jpeg</w:t>
       </w:r>
     </w:p>
     <w:p>
@@ -1433,183 +1609,7 @@
         <w:pStyle w:val="FirstParagraph"/>
       </w:pPr>
       <w:r>
-        <w:t xml:space="preserve">Seção:</w:t>
-      </w:r>
-    </w:p>
-    <w:p>
-      <w:pPr>
-        <w:pStyle w:val="BodyText"/>
-      </w:pPr>
-      <w:r>
-        <w:t xml:space="preserve">Governança e cooperação técnica</w:t>
-      </w:r>
-    </w:p>
-    <w:p>
-      <w:pPr>
-        <w:pStyle w:val="BodyText"/>
-      </w:pPr>
-      <w:r>
-        <w:t xml:space="preserve">Texto para colar:</w:t>
-      </w:r>
-    </w:p>
-    <w:p>
-      <w:pPr>
-        <w:pStyle w:val="BodyText"/>
-      </w:pPr>
-      <w:r>
-        <w:t xml:space="preserve">No recorte da ONASP, a Rede de Ouvidorias pode ser apresentada como espaço permanente de articulação entre unidades responsáveis pela escuta institucional, com foco em difusão de referências técnicas, intercâmbio de práticas e aperfeiçoamento contínuo da atuação no sistema penal.</w:t>
-      </w:r>
-    </w:p>
-    <w:p>
-      <w:pPr>
-        <w:pStyle w:val="BodyText"/>
-      </w:pPr>
-      <w:r>
-        <w:t xml:space="preserve">Esse arranjo é reforçado por instrumentos que definem parâmetros mínimos para a estruturação das ouvidorias e institucionalizam a Renospen como instância de cooperação técnica, integração federativa e fortalecimento institucional.</w:t>
-      </w:r>
-    </w:p>
-    <w:p>
-      <w:pPr>
-        <w:pStyle w:val="BodyText"/>
-      </w:pPr>
-      <w:r>
-        <w:t xml:space="preserve">Seção:</w:t>
-      </w:r>
-      <w:r>
-        <w:t xml:space="preserve"> </w:t>
-      </w:r>
-      <w:r>
-        <w:t xml:space="preserve">Mapa interativo e destaque por UF</w:t>
-      </w:r>
-    </w:p>
-    <w:p>
-      <w:pPr>
-        <w:pStyle w:val="BodyText"/>
-      </w:pPr>
-      <w:r>
-        <w:t xml:space="preserve">Texto para colar:</w:t>
-      </w:r>
-    </w:p>
-    <w:p>
-      <w:pPr>
-        <w:pStyle w:val="BodyText"/>
-      </w:pPr>
-      <w:r>
-        <w:t xml:space="preserve">Esta prévia reúne, em um único ponto, os contatos institucionais consolidados das unidades da federação. No ambiente de validação local, a consulta foi organizada por meio de um mapa visual com seleção por UF e painel lateral com dados resumidos da ouvidoria correspondente ou, quando cabível, das referências institucionais associadas à mesma unidade da federação.</w:t>
-      </w:r>
-    </w:p>
-    <w:p>
-      <w:pPr>
-        <w:pStyle w:val="BodyText"/>
-      </w:pPr>
-      <w:r>
-        <w:t xml:space="preserve">Orientação para publicação oficial:</w:t>
-      </w:r>
-    </w:p>
-    <w:p>
-      <w:pPr>
-        <w:pStyle w:val="BodyText"/>
-      </w:pPr>
-      <w:r>
-        <w:t xml:space="preserve">No ambiente gov.br, recomenda-se tratar o mapa interativo apenas como referência visual da prévia. A solução mais segura para publicação é manter um seletor simples por UF, um bloco expansível por estado ou, preferencialmente, o quadro textual de contatos apresentado abaixo, sem depender de JavaScript customizado.</w:t>
-      </w:r>
-    </w:p>
-    <w:p>
-      <w:pPr>
-        <w:pStyle w:val="BodyText"/>
-      </w:pPr>
-      <w:r>
-        <w:t xml:space="preserve">Quando a mesma UF tiver mais de uma referência institucional relevante, como ocorre no Espírito Santo, recomenda-se separar as informações em blocos independentes dentro do quadro lateral ou em linhas distintas no quadro textual, evitando misturar órgãos, responsáveis, telefones e endereços em uma única ficha.</w:t>
-      </w:r>
-    </w:p>
-    <w:p>
-      <w:pPr>
-        <w:pStyle w:val="BodyText"/>
-      </w:pPr>
-      <w:r>
-        <w:t xml:space="preserve">Regra editorial obrigatória:</w:t>
-      </w:r>
-    </w:p>
-    <w:p>
-      <w:pPr>
-        <w:pStyle w:val="BodyText"/>
-      </w:pPr>
-      <w:r>
-        <w:t xml:space="preserve">Detalhes de curadoria usados para consolidar os contatos devem permanecer apenas na documentação interna de trabalho. Não publicar na página expressões como</w:t>
-      </w:r>
-      <w:r>
-        <w:t xml:space="preserve"> </w:t>
-      </w:r>
-      <w:r>
-        <w:t xml:space="preserve">“o diagnóstico registrou”</w:t>
-      </w:r>
-      <w:r>
-        <w:t xml:space="preserve">,</w:t>
-      </w:r>
-      <w:r>
-        <w:t xml:space="preserve"> </w:t>
-      </w:r>
-      <w:r>
-        <w:t xml:space="preserve">“a resposta do diagnóstico informa”</w:t>
-      </w:r>
-      <w:r>
-        <w:t xml:space="preserve">, menções a respostas recebidas, observações internas de validação ou listas nominais de servidores designados.</w:t>
-      </w:r>
-    </w:p>
-    <w:p>
-      <w:pPr>
-        <w:pStyle w:val="BodyText"/>
-      </w:pPr>
-      <w:r>
-        <w:t xml:space="preserve">Base interna de consolidação (não publicar na página):</w:t>
-      </w:r>
-    </w:p>
-    <w:p>
-      <w:pPr>
-        <w:pStyle w:val="BodyText"/>
-      </w:pPr>
-      <w:r>
-        <w:t xml:space="preserve">Diagnóstico de Ouvidorias Estaduais, consolidado pela ONASP a partir das respostas recebidas em 2026.</w:t>
-      </w:r>
-    </w:p>
-    <w:p>
-      <w:pPr>
-        <w:pStyle w:val="BodyText"/>
-      </w:pPr>
-      <w:r>
-        <w:t xml:space="preserve">Seção:</w:t>
-      </w:r>
-    </w:p>
-    <w:p>
-      <w:pPr>
-        <w:pStyle w:val="BodyText"/>
-      </w:pPr>
-      <w:r>
-        <w:t xml:space="preserve">VI Encontro Nacional das Ouvidorias do Sistema Penal</w:t>
-      </w:r>
-    </w:p>
-    <w:p>
-      <w:pPr>
-        <w:pStyle w:val="BodyText"/>
-      </w:pPr>
-      <w:r>
-        <w:t xml:space="preserve">Texto para colar:</w:t>
-      </w:r>
-    </w:p>
-    <w:p>
-      <w:pPr>
-        <w:pStyle w:val="BodyText"/>
-      </w:pPr>
-      <w:r>
-        <w:t xml:space="preserve">O VI Encontro Nacional das Ouvidorias do Sistema Penal, promovido pela Senappen entre 8 e 10 de abril, consolidou um novo marco para a gestão penitenciária com o lançamento da Rede Nacional de Ouvidorias de Serviços Penais (Renospen) e a publicação de uma Instrução Normativa para padronizar essas instâncias nos estados. Alinhado ao Plano Nacional Pena Justa, o evento focou no fortalecimento da transparência, do controle social e da promoção de direitos humanos, unificando diretrizes nacionais enquanto respeita as autonomias locais. Além dos painéis sobre gestão estratégica e escuta ética, a iniciativa contemplou a doação de equipamentos tecnológicos para todas as unidades federativas, visando modernizar o atendimento e estreitar a comunicação entre o sistema penal e a sociedade brasileira.</w:t>
-      </w:r>
-    </w:p>
-    <w:p>
-      <w:pPr>
-        <w:pStyle w:val="BodyText"/>
-      </w:pPr>
-      <w:r>
-        <w:t xml:space="preserve">Imagens a inserir:</w:t>
+        <w:t xml:space="preserve">Ordem e destaque sugeridos:</w:t>
       </w:r>
     </w:p>
     <w:p>
@@ -1621,7 +1621,22 @@
         </w:numPr>
       </w:pPr>
       <w:r>
-        <w:t xml:space="preserve">Documentação/Banner_Renospen_1.jpeg</w:t>
+        <w:t xml:space="preserve">usar</w:t>
+      </w:r>
+      <w:r>
+        <w:t xml:space="preserve"> </w:t>
+      </w:r>
+      <w:r>
+        <w:rPr>
+          <w:rStyle w:val="VerbatimChar"/>
+        </w:rPr>
+        <w:t xml:space="preserve">Banner_Renospen_1.jpeg</w:t>
+      </w:r>
+      <w:r>
+        <w:t xml:space="preserve"> </w:t>
+      </w:r>
+      <w:r>
+        <w:t xml:space="preserve">em destaque, na largura principal do bloco;</w:t>
       </w:r>
     </w:p>
     <w:p>
@@ -1630,65 +1645,6 @@
         <w:numPr>
           <w:ilvl w:val="0"/>
           <w:numId w:val="1007"/>
-        </w:numPr>
-      </w:pPr>
-      <w:r>
-        <w:t xml:space="preserve">Documentação/Banner_Renospen_2.jpeg</w:t>
-      </w:r>
-    </w:p>
-    <w:p>
-      <w:pPr>
-        <w:pStyle w:val="Compact"/>
-        <w:numPr>
-          <w:ilvl w:val="0"/>
-          <w:numId w:val="1007"/>
-        </w:numPr>
-      </w:pPr>
-      <w:r>
-        <w:t xml:space="preserve">Documentação/Banner_Renospen_3.jpeg</w:t>
-      </w:r>
-    </w:p>
-    <w:p>
-      <w:pPr>
-        <w:pStyle w:val="FirstParagraph"/>
-      </w:pPr>
-      <w:r>
-        <w:t xml:space="preserve">Ordem e destaque sugeridos:</w:t>
-      </w:r>
-    </w:p>
-    <w:p>
-      <w:pPr>
-        <w:pStyle w:val="Compact"/>
-        <w:numPr>
-          <w:ilvl w:val="0"/>
-          <w:numId w:val="1008"/>
-        </w:numPr>
-      </w:pPr>
-      <w:r>
-        <w:t xml:space="preserve">usar</w:t>
-      </w:r>
-      <w:r>
-        <w:t xml:space="preserve"> </w:t>
-      </w:r>
-      <w:r>
-        <w:rPr>
-          <w:rStyle w:val="VerbatimChar"/>
-        </w:rPr>
-        <w:t xml:space="preserve">Banner_Renospen_1.jpeg</w:t>
-      </w:r>
-      <w:r>
-        <w:t xml:space="preserve"> </w:t>
-      </w:r>
-      <w:r>
-        <w:t xml:space="preserve">em destaque, na largura principal do bloco;</w:t>
-      </w:r>
-    </w:p>
-    <w:p>
-      <w:pPr>
-        <w:pStyle w:val="Compact"/>
-        <w:numPr>
-          <w:ilvl w:val="0"/>
-          <w:numId w:val="1008"/>
         </w:numPr>
       </w:pPr>
       <w:r>
@@ -3801,11 +3757,229 @@
         <w:pStyle w:val="Compact"/>
         <w:numPr>
           <w:ilvl w:val="0"/>
-          <w:numId w:val="1009"/>
+          <w:numId w:val="1008"/>
         </w:numPr>
       </w:pPr>
       <w:r>
         <w:t xml:space="preserve">Clique e acesse a Instrução Normativa nº 75/2026: Subpages/Pena_justa/SEI_35153985_Instrucao_Normativa_75.pdf</w:t>
+      </w:r>
+    </w:p>
+    <w:p>
+      <w:pPr>
+        <w:pStyle w:val="Compact"/>
+        <w:numPr>
+          <w:ilvl w:val="0"/>
+          <w:numId w:val="1008"/>
+        </w:numPr>
+      </w:pPr>
+      <w:r>
+        <w:t xml:space="preserve">Clique e acesse a Portaria nº 549/2026 - Renospen: Subpages/Pena_justa/SEI_35032761_Portaria_549.pdf</w:t>
+      </w:r>
+    </w:p>
+    <w:p>
+      <w:pPr>
+        <w:pStyle w:val="Compact"/>
+        <w:numPr>
+          <w:ilvl w:val="0"/>
+          <w:numId w:val="1008"/>
+        </w:numPr>
+      </w:pPr>
+      <w:r>
+        <w:t xml:space="preserve">Clique e acesse o Plano Nacional Pena Justa: Subpages/Pena_justa/Plano_Nacional_Pena_Justa.pdf</w:t>
+      </w:r>
+    </w:p>
+    <w:bookmarkEnd w:id="21"/>
+    <w:bookmarkStart w:id="22" w:name="subpágina-2---ema---senappen"/>
+    <w:p>
+      <w:pPr>
+        <w:pStyle w:val="Heading2"/>
+      </w:pPr>
+      <w:r>
+        <w:t xml:space="preserve">Subpágina 2 - EMA - SENAPPEN</w:t>
+      </w:r>
+    </w:p>
+    <w:p>
+      <w:pPr>
+        <w:pStyle w:val="FirstParagraph"/>
+      </w:pPr>
+      <w:r>
+        <w:t xml:space="preserve">Título da página:</w:t>
+      </w:r>
+    </w:p>
+    <w:p>
+      <w:pPr>
+        <w:pStyle w:val="BodyText"/>
+      </w:pPr>
+      <w:r>
+        <w:t xml:space="preserve">EMA - SENAPPEN</w:t>
+      </w:r>
+    </w:p>
+    <w:p>
+      <w:pPr>
+        <w:pStyle w:val="BodyText"/>
+      </w:pPr>
+      <w:r>
+        <w:t xml:space="preserve">Imagem de destaque:</w:t>
+      </w:r>
+    </w:p>
+    <w:p>
+      <w:pPr>
+        <w:pStyle w:val="BodyText"/>
+      </w:pPr>
+      <w:r>
+        <w:t xml:space="preserve">Documentação/Botao_EMA.png</w:t>
+      </w:r>
+    </w:p>
+    <w:p>
+      <w:pPr>
+        <w:pStyle w:val="BodyText"/>
+      </w:pPr>
+      <w:r>
+        <w:t xml:space="preserve">Texto alternativo sugerido:</w:t>
+      </w:r>
+    </w:p>
+    <w:p>
+      <w:pPr>
+        <w:pStyle w:val="BodyText"/>
+      </w:pPr>
+      <w:r>
+        <w:t xml:space="preserve">Botão institucional da EMA - SENAPPEN.</w:t>
+      </w:r>
+    </w:p>
+    <w:p>
+      <w:pPr>
+        <w:pStyle w:val="BodyText"/>
+      </w:pPr>
+      <w:r>
+        <w:t xml:space="preserve">Identificador editorial:</w:t>
+      </w:r>
+    </w:p>
+    <w:p>
+      <w:pPr>
+        <w:pStyle w:val="BodyText"/>
+      </w:pPr>
+      <w:r>
+        <w:t xml:space="preserve">Conteúdo Técnico e Projetos Estruturantes</w:t>
+      </w:r>
+    </w:p>
+    <w:p>
+      <w:pPr>
+        <w:pStyle w:val="BodyText"/>
+      </w:pPr>
+      <w:r>
+        <w:t xml:space="preserve">Texto de destaque:</w:t>
+      </w:r>
+    </w:p>
+    <w:p>
+      <w:pPr>
+        <w:pStyle w:val="BodyText"/>
+      </w:pPr>
+      <w:r>
+        <w:t xml:space="preserve">Espaço da Equipe de Monitoramento e Acompanhamento das decisões e deliberações do Sistema Interamericano de Direitos Humanos em face do sistema penal nacional, dedicado a fortalecer o cumprimento das determinações do SIDH em parceria com as Unidades Federativas.</w:t>
+      </w:r>
+    </w:p>
+    <w:p>
+      <w:pPr>
+        <w:pStyle w:val="BodyText"/>
+      </w:pPr>
+      <w:r>
+        <w:t xml:space="preserve">Seção:</w:t>
+      </w:r>
+    </w:p>
+    <w:p>
+      <w:pPr>
+        <w:pStyle w:val="BodyText"/>
+      </w:pPr>
+      <w:r>
+        <w:t xml:space="preserve">Institucional</w:t>
+      </w:r>
+    </w:p>
+    <w:p>
+      <w:pPr>
+        <w:pStyle w:val="BodyText"/>
+      </w:pPr>
+      <w:r>
+        <w:t xml:space="preserve">Imagem complementar opcional:</w:t>
+      </w:r>
+    </w:p>
+    <w:p>
+      <w:pPr>
+        <w:pStyle w:val="BodyText"/>
+      </w:pPr>
+      <w:r>
+        <w:t xml:space="preserve">Documentação/Banner_Ema_Organograma.png</w:t>
+      </w:r>
+    </w:p>
+    <w:p>
+      <w:pPr>
+        <w:pStyle w:val="BodyText"/>
+      </w:pPr>
+      <w:r>
+        <w:t xml:space="preserve">Texto alternativo sugerido:</w:t>
+      </w:r>
+    </w:p>
+    <w:p>
+      <w:pPr>
+        <w:pStyle w:val="BodyText"/>
+      </w:pPr>
+      <w:r>
+        <w:t xml:space="preserve">Organograma da EMA - SENAPPEN.</w:t>
+      </w:r>
+    </w:p>
+    <w:p>
+      <w:pPr>
+        <w:pStyle w:val="BodyText"/>
+      </w:pPr>
+      <w:r>
+        <w:t xml:space="preserve">Texto para colar:</w:t>
+      </w:r>
+    </w:p>
+    <w:p>
+      <w:pPr>
+        <w:pStyle w:val="BodyText"/>
+      </w:pPr>
+      <w:r>
+        <w:t xml:space="preserve">A EMA-SENAPPEN foi instituída, inicialmente, pela Portaria GABSEC/SENAPPEN/MJSP Nº 350, de 13 de junho de 2024, em um esforço de integrar a Secretaria Nacional de Políticas Penais ao processo de cumprimento das decisões do SIDH, dado seu rol de competências, em especial, a previsão de prestar apoio técnico aos entes federativos quanto à implementação dos princípios e das regras da execução penal.</w:t>
+      </w:r>
+    </w:p>
+    <w:p>
+      <w:pPr>
+        <w:pStyle w:val="BodyText"/>
+      </w:pPr>
+      <w:r>
+        <w:t xml:space="preserve">A segunda linha da seção:</w:t>
+      </w:r>
+    </w:p>
+    <w:p>
+      <w:pPr>
+        <w:pStyle w:val="BodyText"/>
+      </w:pPr>
+      <w:r>
+        <w:t xml:space="preserve">A estrutura da EMA foi alterada em 2025, mediante as Portarias GABSEC/SENAPPEN/MJSP Nº 511, de 13 de outubro de 2025, e Portaria de Pessoal GABSEC/SENAPPEN/MJSP Nº 93, de 10 de março de 2026, as quais possuíam por objetivo o aprimoramento da sua composição institucional, conforme o organograma a seguir:</w:t>
+      </w:r>
+    </w:p>
+    <w:p>
+      <w:pPr>
+        <w:pStyle w:val="BodyText"/>
+      </w:pPr>
+      <w:r>
+        <w:t xml:space="preserve">Seção:</w:t>
+      </w:r>
+    </w:p>
+    <w:p>
+      <w:pPr>
+        <w:pStyle w:val="BodyText"/>
+      </w:pPr>
+      <w:r>
+        <w:t xml:space="preserve">Frentes de Atuação</w:t>
+      </w:r>
+    </w:p>
+    <w:p>
+      <w:pPr>
+        <w:pStyle w:val="BodyText"/>
+      </w:pPr>
+      <w:r>
+        <w:t xml:space="preserve">Itens para colar:</w:t>
       </w:r>
     </w:p>
     <w:p>
@@ -3817,7 +3991,7 @@
         </w:numPr>
       </w:pPr>
       <w:r>
-        <w:t xml:space="preserve">Clique e acesse a Portaria nº 549/2026 - Renospen: Subpages/Pena_justa/SEI_35032761_Portaria_549.pdf</w:t>
+        <w:t xml:space="preserve">Monitorar e acompanhar as estratégias adotadas pelo Estado Brasileiro para o cumprimento das decisões do SIDH em relação ao sistema penal.</w:t>
       </w:r>
     </w:p>
     <w:p>
@@ -3829,17 +4003,31 @@
         </w:numPr>
       </w:pPr>
       <w:r>
-        <w:t xml:space="preserve">Clique e acesse o Plano Nacional Pena Justa: Subpages/Pena_justa/Plano_Nacional_Pena_Justa.pdf</w:t>
-      </w:r>
-    </w:p>
-    <w:bookmarkEnd w:id="21"/>
-    <w:bookmarkStart w:id="22" w:name="subpágina-2---ema---senappen"/>
-    <w:p>
-      <w:pPr>
-        <w:pStyle w:val="Heading2"/>
-      </w:pPr>
-      <w:r>
-        <w:t xml:space="preserve">Subpágina 2 - EMA - SENAPPEN</w:t>
+        <w:t xml:space="preserve">Prevenir e evitar possíveis condenações.</w:t>
+      </w:r>
+    </w:p>
+    <w:p>
+      <w:pPr>
+        <w:pStyle w:val="Compact"/>
+        <w:numPr>
+          <w:ilvl w:val="0"/>
+          <w:numId w:val="1009"/>
+        </w:numPr>
+      </w:pPr>
+      <w:r>
+        <w:t xml:space="preserve">Propagar a cultura de Direitos Humanos, fomentando a aplicação dos Tratados Internacionais sobre a matéria de Direito Penal pelos gestores do sistema penal nacional.</w:t>
+      </w:r>
+    </w:p>
+    <w:p>
+      <w:pPr>
+        <w:pStyle w:val="Compact"/>
+        <w:numPr>
+          <w:ilvl w:val="0"/>
+          <w:numId w:val="1009"/>
+        </w:numPr>
+      </w:pPr>
+      <w:r>
+        <w:t xml:space="preserve">Fortalecer o diálogo entre a proteção de direitos e a governança no sistema penal.</w:t>
       </w:r>
     </w:p>
     <w:p>
@@ -3847,79 +4035,15 @@
         <w:pStyle w:val="FirstParagraph"/>
       </w:pPr>
       <w:r>
-        <w:t xml:space="preserve">Título da página:</w:t>
-      </w:r>
-    </w:p>
-    <w:p>
-      <w:pPr>
-        <w:pStyle w:val="BodyText"/>
-      </w:pPr>
-      <w:r>
-        <w:t xml:space="preserve">EMA - SENAPPEN</w:t>
-      </w:r>
-    </w:p>
-    <w:p>
-      <w:pPr>
-        <w:pStyle w:val="BodyText"/>
-      </w:pPr>
-      <w:r>
-        <w:t xml:space="preserve">Imagem de destaque:</w:t>
-      </w:r>
-    </w:p>
-    <w:p>
-      <w:pPr>
-        <w:pStyle w:val="BodyText"/>
-      </w:pPr>
-      <w:r>
-        <w:t xml:space="preserve">Documentação/Botao_EMA.png</w:t>
-      </w:r>
-    </w:p>
-    <w:p>
-      <w:pPr>
-        <w:pStyle w:val="BodyText"/>
-      </w:pPr>
-      <w:r>
-        <w:t xml:space="preserve">Texto alternativo sugerido:</w:t>
-      </w:r>
-    </w:p>
-    <w:p>
-      <w:pPr>
-        <w:pStyle w:val="BodyText"/>
-      </w:pPr>
-      <w:r>
-        <w:t xml:space="preserve">Botão institucional da EMA - SENAPPEN.</w:t>
-      </w:r>
-    </w:p>
-    <w:p>
-      <w:pPr>
-        <w:pStyle w:val="BodyText"/>
-      </w:pPr>
-      <w:r>
-        <w:t xml:space="preserve">Identificador editorial:</w:t>
-      </w:r>
-    </w:p>
-    <w:p>
-      <w:pPr>
-        <w:pStyle w:val="BodyText"/>
-      </w:pPr>
-      <w:r>
-        <w:t xml:space="preserve">Conteúdo Técnico e Projetos Estruturantes</w:t>
-      </w:r>
-    </w:p>
-    <w:p>
-      <w:pPr>
-        <w:pStyle w:val="BodyText"/>
-      </w:pPr>
-      <w:r>
-        <w:t xml:space="preserve">Texto de destaque:</w:t>
-      </w:r>
-    </w:p>
-    <w:p>
-      <w:pPr>
-        <w:pStyle w:val="BodyText"/>
-      </w:pPr>
-      <w:r>
-        <w:t xml:space="preserve">Espaço da Equipe de Monitoramento e Acompanhamento das decisões e deliberações do Sistema Interamericano de Direitos Humanos em face do sistema penal nacional, dedicado a fortalecer o cumprimento das determinações do SIDH em parceria com as Unidades Federativas.</w:t>
+        <w:t xml:space="preserve">Texto complementar da seção:</w:t>
+      </w:r>
+    </w:p>
+    <w:p>
+      <w:pPr>
+        <w:pStyle w:val="BodyText"/>
+      </w:pPr>
+      <w:r>
+        <w:t xml:space="preserve">Cabe citar a aproximação institucional e a construção de diálogo com órgãos-chave desse processo de monitoramento, como o Ministério das Relações Exteriores, o Ministério dos Direitos Humanos e da Cidadania e o Conselho Nacional de Justiça.</w:t>
       </w:r>
     </w:p>
     <w:p>
@@ -3935,39 +4059,7 @@
         <w:pStyle w:val="BodyText"/>
       </w:pPr>
       <w:r>
-        <w:t xml:space="preserve">Institucional</w:t>
-      </w:r>
-    </w:p>
-    <w:p>
-      <w:pPr>
-        <w:pStyle w:val="BodyText"/>
-      </w:pPr>
-      <w:r>
-        <w:t xml:space="preserve">Imagem complementar opcional:</w:t>
-      </w:r>
-    </w:p>
-    <w:p>
-      <w:pPr>
-        <w:pStyle w:val="BodyText"/>
-      </w:pPr>
-      <w:r>
-        <w:t xml:space="preserve">Documentação/Banner_Ema_Organograma.png</w:t>
-      </w:r>
-    </w:p>
-    <w:p>
-      <w:pPr>
-        <w:pStyle w:val="BodyText"/>
-      </w:pPr>
-      <w:r>
-        <w:t xml:space="preserve">Texto alternativo sugerido:</w:t>
-      </w:r>
-    </w:p>
-    <w:p>
-      <w:pPr>
-        <w:pStyle w:val="BodyText"/>
-      </w:pPr>
-      <w:r>
-        <w:t xml:space="preserve">Organograma da EMA - SENAPPEN.</w:t>
+        <w:t xml:space="preserve">Atuação institucional em 2025</w:t>
       </w:r>
     </w:p>
     <w:p>
@@ -3983,7 +4075,7 @@
         <w:pStyle w:val="BodyText"/>
       </w:pPr>
       <w:r>
-        <w:t xml:space="preserve">A EMA-SENAPPEN foi instituída, inicialmente, pela Portaria GABSEC/SENAPPEN/MJSP Nº 350, de 13 de junho de 2024, em um esforço de integrar a Secretaria Nacional de Políticas Penais ao processo de cumprimento das decisões do SIDH, dado seu rol de competências, em especial, a previsão de prestar apoio técnico aos entes federativos quanto à implementação dos princípios e das regras da execução penal.</w:t>
+        <w:t xml:space="preserve">Em 2025, a EMA/Senappen intensificou o acompanhamento do Sistema Interamericano de Direitos Humanos com foco em decisões, deliberações e medidas com repercussão sobre o sistema penal brasileiro. A atuação combinou articulação interinstitucional, monitoramento técnico e apoio à consolidação de respostas coordenadas do Estado.</w:t>
       </w:r>
     </w:p>
     <w:p>
@@ -3999,31 +4091,15 @@
         <w:pStyle w:val="BodyText"/>
       </w:pPr>
       <w:r>
-        <w:t xml:space="preserve">A estrutura da EMA foi alterada em 2025, mediante as Portarias GABSEC/SENAPPEN/MJSP Nº 511, de 13 de outubro de 2025, e Portaria de Pessoal GABSEC/SENAPPEN/MJSP Nº 93, de 10 de março de 2026, as quais possuíam por objetivo o aprimoramento da sua composição institucional, conforme o organograma a seguir:</w:t>
-      </w:r>
-    </w:p>
-    <w:p>
-      <w:pPr>
-        <w:pStyle w:val="BodyText"/>
-      </w:pPr>
-      <w:r>
-        <w:t xml:space="preserve">Seção:</w:t>
-      </w:r>
-    </w:p>
-    <w:p>
-      <w:pPr>
-        <w:pStyle w:val="BodyText"/>
-      </w:pPr>
-      <w:r>
-        <w:t xml:space="preserve">Frentes de Atuação</w:t>
-      </w:r>
-    </w:p>
-    <w:p>
-      <w:pPr>
-        <w:pStyle w:val="BodyText"/>
-      </w:pPr>
-      <w:r>
-        <w:t xml:space="preserve">Itens para colar:</w:t>
+        <w:t xml:space="preserve">Nesse período, a equipe ampliou sua participação em agendas voltadas ao acompanhamento de casos perante a Corte Interamericana de Direitos Humanos e ao fortalecimento de mecanismos permanentes de monitoramento no âmbito da política penal.</w:t>
+      </w:r>
+    </w:p>
+    <w:p>
+      <w:pPr>
+        <w:pStyle w:val="BodyText"/>
+      </w:pPr>
+      <w:r>
+        <w:t xml:space="preserve">Imagens complementares opcionais:</w:t>
       </w:r>
     </w:p>
     <w:p>
@@ -4035,7 +4111,7 @@
         </w:numPr>
       </w:pPr>
       <w:r>
-        <w:t xml:space="preserve">Monitorar e acompanhar as estratégias adotadas pelo Estado Brasileiro para o cumprimento das decisões do SIDH em relação ao sistema penal.</w:t>
+        <w:t xml:space="preserve">Documentação/Banner_Ema.jpg</w:t>
       </w:r>
     </w:p>
     <w:p>
@@ -4047,31 +4123,7 @@
         </w:numPr>
       </w:pPr>
       <w:r>
-        <w:t xml:space="preserve">Prevenir e evitar possíveis condenações.</w:t>
-      </w:r>
-    </w:p>
-    <w:p>
-      <w:pPr>
-        <w:pStyle w:val="Compact"/>
-        <w:numPr>
-          <w:ilvl w:val="0"/>
-          <w:numId w:val="1010"/>
-        </w:numPr>
-      </w:pPr>
-      <w:r>
-        <w:t xml:space="preserve">Propagar a cultura de Direitos Humanos, fomentando a aplicação dos Tratados Internacionais sobre a matéria de Direito Penal pelos gestores do sistema penal nacional.</w:t>
-      </w:r>
-    </w:p>
-    <w:p>
-      <w:pPr>
-        <w:pStyle w:val="Compact"/>
-        <w:numPr>
-          <w:ilvl w:val="0"/>
-          <w:numId w:val="1010"/>
-        </w:numPr>
-      </w:pPr>
-      <w:r>
-        <w:t xml:space="preserve">Fortalecer o diálogo entre a proteção de direitos e a governança no sistema penal.</w:t>
+        <w:t xml:space="preserve">Documentação/Banner_Ema_2.jpg</w:t>
       </w:r>
     </w:p>
     <w:p>
@@ -4079,71 +4131,7 @@
         <w:pStyle w:val="FirstParagraph"/>
       </w:pPr>
       <w:r>
-        <w:t xml:space="preserve">Texto complementar da seção:</w:t>
-      </w:r>
-    </w:p>
-    <w:p>
-      <w:pPr>
-        <w:pStyle w:val="BodyText"/>
-      </w:pPr>
-      <w:r>
-        <w:t xml:space="preserve">Cabe citar a aproximação institucional e a construção de diálogo com órgãos-chave desse processo de monitoramento, como o Ministério das Relações Exteriores, o Ministério dos Direitos Humanos e da Cidadania e o Conselho Nacional de Justiça.</w:t>
-      </w:r>
-    </w:p>
-    <w:p>
-      <w:pPr>
-        <w:pStyle w:val="BodyText"/>
-      </w:pPr>
-      <w:r>
-        <w:t xml:space="preserve">Seção:</w:t>
-      </w:r>
-    </w:p>
-    <w:p>
-      <w:pPr>
-        <w:pStyle w:val="BodyText"/>
-      </w:pPr>
-      <w:r>
-        <w:t xml:space="preserve">Atuação institucional em 2025</w:t>
-      </w:r>
-    </w:p>
-    <w:p>
-      <w:pPr>
-        <w:pStyle w:val="BodyText"/>
-      </w:pPr>
-      <w:r>
-        <w:t xml:space="preserve">Texto para colar:</w:t>
-      </w:r>
-    </w:p>
-    <w:p>
-      <w:pPr>
-        <w:pStyle w:val="BodyText"/>
-      </w:pPr>
-      <w:r>
-        <w:t xml:space="preserve">Em 2025, a EMA/Senappen intensificou o acompanhamento do Sistema Interamericano de Direitos Humanos com foco em decisões, deliberações e medidas com repercussão sobre o sistema penal brasileiro. A atuação combinou articulação interinstitucional, monitoramento técnico e apoio à consolidação de respostas coordenadas do Estado.</w:t>
-      </w:r>
-    </w:p>
-    <w:p>
-      <w:pPr>
-        <w:pStyle w:val="BodyText"/>
-      </w:pPr>
-      <w:r>
-        <w:t xml:space="preserve">A segunda linha da seção:</w:t>
-      </w:r>
-    </w:p>
-    <w:p>
-      <w:pPr>
-        <w:pStyle w:val="BodyText"/>
-      </w:pPr>
-      <w:r>
-        <w:t xml:space="preserve">Nesse período, a equipe ampliou sua participação em agendas voltadas ao acompanhamento de casos perante a Corte Interamericana de Direitos Humanos e ao fortalecimento de mecanismos permanentes de monitoramento no âmbito da política penal.</w:t>
-      </w:r>
-    </w:p>
-    <w:p>
-      <w:pPr>
-        <w:pStyle w:val="BodyText"/>
-      </w:pPr>
-      <w:r>
-        <w:t xml:space="preserve">Imagens complementares opcionais:</w:t>
+        <w:t xml:space="preserve">Textos alternativos sugeridos:</w:t>
       </w:r>
     </w:p>
     <w:p>
@@ -4155,7 +4143,7 @@
         </w:numPr>
       </w:pPr>
       <w:r>
-        <w:t xml:space="preserve">Documentação/Banner_Ema.jpg</w:t>
+        <w:t xml:space="preserve">Participantes reunidos em mesa de trabalho institucional acompanhada pela EMA - SENAPPEN.</w:t>
       </w:r>
     </w:p>
     <w:p>
@@ -4167,7 +4155,7 @@
         </w:numPr>
       </w:pPr>
       <w:r>
-        <w:t xml:space="preserve">Documentação/Banner_Ema_2.jpg</w:t>
+        <w:t xml:space="preserve">Participantes posicionados em registro oficial de agenda institucional acompanhada pela EMA - SENAPPEN.</w:t>
       </w:r>
     </w:p>
     <w:p>
@@ -4175,7 +4163,7 @@
         <w:pStyle w:val="FirstParagraph"/>
       </w:pPr>
       <w:r>
-        <w:t xml:space="preserve">Textos alternativos sugeridos:</w:t>
+        <w:t xml:space="preserve">Legendas sugeridas:</w:t>
       </w:r>
     </w:p>
     <w:p>
@@ -4187,7 +4175,7 @@
         </w:numPr>
       </w:pPr>
       <w:r>
-        <w:t xml:space="preserve">Participantes reunidos em mesa de trabalho institucional acompanhada pela EMA - SENAPPEN.</w:t>
+        <w:t xml:space="preserve">Reunião institucional acompanhada pela EMA - SENAPPEN.</w:t>
       </w:r>
     </w:p>
     <w:p>
@@ -4199,7 +4187,7 @@
         </w:numPr>
       </w:pPr>
       <w:r>
-        <w:t xml:space="preserve">Participantes posicionados em registro oficial de agenda institucional acompanhada pela EMA - SENAPPEN.</w:t>
+        <w:t xml:space="preserve">Registro oficial de agenda institucional da EMA - SENAPPEN.</w:t>
       </w:r>
     </w:p>
     <w:p>
@@ -4207,7 +4195,71 @@
         <w:pStyle w:val="FirstParagraph"/>
       </w:pPr>
       <w:r>
-        <w:t xml:space="preserve">Legendas sugeridas:</w:t>
+        <w:t xml:space="preserve">Seção:</w:t>
+      </w:r>
+    </w:p>
+    <w:p>
+      <w:pPr>
+        <w:pStyle w:val="BodyText"/>
+      </w:pPr>
+      <w:r>
+        <w:t xml:space="preserve">Caso Pedrinhas</w:t>
+      </w:r>
+    </w:p>
+    <w:p>
+      <w:pPr>
+        <w:pStyle w:val="BodyText"/>
+      </w:pPr>
+      <w:r>
+        <w:t xml:space="preserve">Texto para colar:</w:t>
+      </w:r>
+    </w:p>
+    <w:p>
+      <w:pPr>
+        <w:pStyle w:val="BodyText"/>
+      </w:pPr>
+      <w:r>
+        <w:t xml:space="preserve">Em 21 de outubro de 2025, a EMA-SENAPPEN foi convocada a participar, juntamente a outros órgãos representantes do Estado Brasileiro, da audiência privada solicitada pela Corte Interamericana de Direitos Humanos sobre as Medidas Provisórias outorgadas no Caso do Complexo Penitenciário de São Luís, Maranhão (Caso Pedrinhas).</w:t>
+      </w:r>
+    </w:p>
+    <w:p>
+      <w:pPr>
+        <w:pStyle w:val="BodyText"/>
+      </w:pPr>
+      <w:r>
+        <w:t xml:space="preserve">A segunda linha da seção:</w:t>
+      </w:r>
+    </w:p>
+    <w:p>
+      <w:pPr>
+        <w:pStyle w:val="BodyText"/>
+      </w:pPr>
+      <w:r>
+        <w:t xml:space="preserve">Como desdobramento da audiência, a Equipe ficou responsável por coordenar uma mesa de trabalho voltada à elaboração de um plano de cumprimento conjunto, com foco no enfrentamento das fragilidades ainda identificadas no Caso.</w:t>
+      </w:r>
+    </w:p>
+    <w:p>
+      <w:pPr>
+        <w:pStyle w:val="BodyText"/>
+      </w:pPr>
+      <w:r>
+        <w:t xml:space="preserve">Subseção:</w:t>
+      </w:r>
+    </w:p>
+    <w:p>
+      <w:pPr>
+        <w:pStyle w:val="BodyText"/>
+      </w:pPr>
+      <w:r>
+        <w:t xml:space="preserve">Eixos priorizados</w:t>
+      </w:r>
+    </w:p>
+    <w:p>
+      <w:pPr>
+        <w:pStyle w:val="BodyText"/>
+      </w:pPr>
+      <w:r>
+        <w:t xml:space="preserve">Itens para colar:</w:t>
       </w:r>
     </w:p>
     <w:p>
@@ -4219,7 +4271,7 @@
         </w:numPr>
       </w:pPr>
       <w:r>
-        <w:t xml:space="preserve">Reunião institucional acompanhada pela EMA - SENAPPEN.</w:t>
+        <w:t xml:space="preserve">Superlotação e ambiência no sistema prisional.</w:t>
       </w:r>
     </w:p>
     <w:p>
@@ -4231,7 +4283,31 @@
         </w:numPr>
       </w:pPr>
       <w:r>
-        <w:t xml:space="preserve">Registro oficial de agenda institucional da EMA - SENAPPEN.</w:t>
+        <w:t xml:space="preserve">Dignidade e condições de custódia.</w:t>
+      </w:r>
+    </w:p>
+    <w:p>
+      <w:pPr>
+        <w:pStyle w:val="Compact"/>
+        <w:numPr>
+          <w:ilvl w:val="0"/>
+          <w:numId w:val="1013"/>
+        </w:numPr>
+      </w:pPr>
+      <w:r>
+        <w:t xml:space="preserve">Acesso à justiça e prevenção à tortura.</w:t>
+      </w:r>
+    </w:p>
+    <w:p>
+      <w:pPr>
+        <w:pStyle w:val="Compact"/>
+        <w:numPr>
+          <w:ilvl w:val="0"/>
+          <w:numId w:val="1013"/>
+        </w:numPr>
+      </w:pPr>
+      <w:r>
+        <w:t xml:space="preserve">Monitoramento, participação social e coordenação institucional.</w:t>
       </w:r>
     </w:p>
     <w:p>
@@ -4239,6 +4315,54 @@
         <w:pStyle w:val="FirstParagraph"/>
       </w:pPr>
       <w:r>
+        <w:t xml:space="preserve">Subseção:</w:t>
+      </w:r>
+    </w:p>
+    <w:p>
+      <w:pPr>
+        <w:pStyle w:val="BodyText"/>
+      </w:pPr>
+      <w:r>
+        <w:t xml:space="preserve">Desdobramentos e articulação técnica</w:t>
+      </w:r>
+    </w:p>
+    <w:p>
+      <w:pPr>
+        <w:pStyle w:val="BodyText"/>
+      </w:pPr>
+      <w:r>
+        <w:t xml:space="preserve">Texto para colar:</w:t>
+      </w:r>
+    </w:p>
+    <w:p>
+      <w:pPr>
+        <w:pStyle w:val="BodyText"/>
+      </w:pPr>
+      <w:r>
+        <w:t xml:space="preserve">Entre novembro e dezembro de 2025, a EMA/Senappen contribuiu para a formalização da mesa de trabalho, participou de reuniões técnicas dedicadas aos eixos temáticos do caso e apoiou a preparação de visita técnica destinada a consolidar diagnósticos e orientar as próximas medidas.</w:t>
+      </w:r>
+    </w:p>
+    <w:p>
+      <w:pPr>
+        <w:pStyle w:val="BodyText"/>
+      </w:pPr>
+      <w:r>
+        <w:t xml:space="preserve">A segunda linha da subseção:</w:t>
+      </w:r>
+    </w:p>
+    <w:p>
+      <w:pPr>
+        <w:pStyle w:val="BodyText"/>
+      </w:pPr>
+      <w:r>
+        <w:t xml:space="preserve">No mesmo contexto, a equipe atuou de forma articulada com o Plano Pena Justa e acompanhou iniciativas voltadas à criação de instâncias permanentes de monitoramento e à padronização de fluxos para acompanhamento de casos internacionais com incidência sobre o sistema penal brasileiro.</w:t>
+      </w:r>
+    </w:p>
+    <w:p>
+      <w:pPr>
+        <w:pStyle w:val="BodyText"/>
+      </w:pPr>
+      <w:r>
         <w:t xml:space="preserve">Seção:</w:t>
       </w:r>
     </w:p>
@@ -4247,7 +4371,7 @@
         <w:pStyle w:val="BodyText"/>
       </w:pPr>
       <w:r>
-        <w:t xml:space="preserve">Caso Pedrinhas</w:t>
+        <w:t xml:space="preserve">Referências públicas do SIDH</w:t>
       </w:r>
     </w:p>
     <w:p>
@@ -4263,47 +4387,15 @@
         <w:pStyle w:val="BodyText"/>
       </w:pPr>
       <w:r>
-        <w:t xml:space="preserve">Em 21 de outubro de 2025, a EMA-SENAPPEN foi convocada a participar, juntamente a outros órgãos representantes do Estado Brasileiro, da audiência privada solicitada pela Corte Interamericana de Direitos Humanos sobre as Medidas Provisórias outorgadas no Caso do Complexo Penitenciário de São Luís, Maranhão (Caso Pedrinhas).</w:t>
-      </w:r>
-    </w:p>
-    <w:p>
-      <w:pPr>
-        <w:pStyle w:val="BodyText"/>
-      </w:pPr>
-      <w:r>
-        <w:t xml:space="preserve">A segunda linha da seção:</w:t>
-      </w:r>
-    </w:p>
-    <w:p>
-      <w:pPr>
-        <w:pStyle w:val="BodyText"/>
-      </w:pPr>
-      <w:r>
-        <w:t xml:space="preserve">Como desdobramento da audiência, a Equipe ficou responsável por coordenar uma mesa de trabalho voltada à elaboração de um plano de cumprimento conjunto, com foco no enfrentamento das fragilidades ainda identificadas no Caso.</w:t>
-      </w:r>
-    </w:p>
-    <w:p>
-      <w:pPr>
-        <w:pStyle w:val="BodyText"/>
-      </w:pPr>
-      <w:r>
-        <w:t xml:space="preserve">Subseção:</w:t>
-      </w:r>
-    </w:p>
-    <w:p>
-      <w:pPr>
-        <w:pStyle w:val="BodyText"/>
-      </w:pPr>
-      <w:r>
-        <w:t xml:space="preserve">Eixos priorizados</w:t>
-      </w:r>
-    </w:p>
-    <w:p>
-      <w:pPr>
-        <w:pStyle w:val="BodyText"/>
-      </w:pPr>
-      <w:r>
-        <w:t xml:space="preserve">Itens para colar:</w:t>
+        <w:t xml:space="preserve">Para contextualização institucional da pauta, a ONASP pode utilizar como pontos de partida as referências públicas abaixo, produzidas pelos próprios órgãos do sistema interamericano:</w:t>
+      </w:r>
+    </w:p>
+    <w:p>
+      <w:pPr>
+        <w:pStyle w:val="BodyText"/>
+      </w:pPr>
+      <w:r>
+        <w:t xml:space="preserve">Links:</w:t>
       </w:r>
     </w:p>
     <w:p>
@@ -4315,7 +4407,7 @@
         </w:numPr>
       </w:pPr>
       <w:r>
-        <w:t xml:space="preserve">Superlotação e ambiência no sistema prisional.</w:t>
+        <w:t xml:space="preserve">O que é a CIDH?: https://www.oas.org/pt/cidh/mandato/que.asp</w:t>
       </w:r>
     </w:p>
     <w:p>
@@ -4327,7 +4419,7 @@
         </w:numPr>
       </w:pPr>
       <w:r>
-        <w:t xml:space="preserve">Dignidade e condições de custódia.</w:t>
+        <w:t xml:space="preserve">O que é a Corte IDH?: https://www.corteidh.or.cr/que_es_la_corte.cfm?lang=pt</w:t>
       </w:r>
     </w:p>
     <w:p>
@@ -4339,7 +4431,7 @@
         </w:numPr>
       </w:pPr>
       <w:r>
-        <w:t xml:space="preserve">Acesso à justiça e prevenção à tortura.</w:t>
+        <w:t xml:space="preserve">Estatuto da Comissão Interamericana de Direitos Humanos: https://www.oas.org/pt/cidh/mandato/Basicos/estatutoCIDH.asp</w:t>
       </w:r>
     </w:p>
     <w:p>
@@ -4351,7 +4443,7 @@
         </w:numPr>
       </w:pPr>
       <w:r>
-        <w:t xml:space="preserve">Monitoramento, participação social e coordenação institucional.</w:t>
+        <w:t xml:space="preserve">Declaração Americana de Direitos e Deveres do Homem: https://www.oas.org/pt/cidh/mandato/Basicos/declaracion.asp</w:t>
       </w:r>
     </w:p>
     <w:p>
@@ -4359,15 +4451,113 @@
         <w:pStyle w:val="FirstParagraph"/>
       </w:pPr>
       <w:r>
-        <w:t xml:space="preserve">Subseção:</w:t>
-      </w:r>
-    </w:p>
-    <w:p>
-      <w:pPr>
-        <w:pStyle w:val="BodyText"/>
-      </w:pPr>
-      <w:r>
-        <w:t xml:space="preserve">Desdobramentos e articulação técnica</w:t>
+        <w:t xml:space="preserve">Seção:</w:t>
+      </w:r>
+    </w:p>
+    <w:bookmarkEnd w:id="22"/>
+    <w:bookmarkStart w:id="23" w:name="subpágina-3---plano-pena-justa"/>
+    <w:p>
+      <w:pPr>
+        <w:pStyle w:val="Heading2"/>
+      </w:pPr>
+      <w:r>
+        <w:t xml:space="preserve">Subpágina 3 - Plano Pena Justa</w:t>
+      </w:r>
+    </w:p>
+    <w:p>
+      <w:pPr>
+        <w:pStyle w:val="FirstParagraph"/>
+      </w:pPr>
+      <w:r>
+        <w:t xml:space="preserve">Título da página:</w:t>
+      </w:r>
+    </w:p>
+    <w:p>
+      <w:pPr>
+        <w:pStyle w:val="BodyText"/>
+      </w:pPr>
+      <w:r>
+        <w:t xml:space="preserve">Plano Pena Justa</w:t>
+      </w:r>
+    </w:p>
+    <w:p>
+      <w:pPr>
+        <w:pStyle w:val="BodyText"/>
+      </w:pPr>
+      <w:r>
+        <w:t xml:space="preserve">Imagem de destaque:</w:t>
+      </w:r>
+    </w:p>
+    <w:p>
+      <w:pPr>
+        <w:pStyle w:val="BodyText"/>
+      </w:pPr>
+      <w:r>
+        <w:t xml:space="preserve">Documentação/Botao_PenaJusta.png</w:t>
+      </w:r>
+    </w:p>
+    <w:p>
+      <w:pPr>
+        <w:pStyle w:val="BodyText"/>
+      </w:pPr>
+      <w:r>
+        <w:t xml:space="preserve">Texto alternativo sugerido:</w:t>
+      </w:r>
+    </w:p>
+    <w:p>
+      <w:pPr>
+        <w:pStyle w:val="BodyText"/>
+      </w:pPr>
+      <w:r>
+        <w:t xml:space="preserve">Marca do Plano Pena Justa.</w:t>
+      </w:r>
+    </w:p>
+    <w:p>
+      <w:pPr>
+        <w:pStyle w:val="BodyText"/>
+      </w:pPr>
+      <w:r>
+        <w:t xml:space="preserve">Identificador editorial:</w:t>
+      </w:r>
+    </w:p>
+    <w:p>
+      <w:pPr>
+        <w:pStyle w:val="BodyText"/>
+      </w:pPr>
+      <w:r>
+        <w:t xml:space="preserve">Conteúdo Técnico e Projetos Estruturantes</w:t>
+      </w:r>
+    </w:p>
+    <w:p>
+      <w:pPr>
+        <w:pStyle w:val="BodyText"/>
+      </w:pPr>
+      <w:r>
+        <w:t xml:space="preserve">Texto de destaque:</w:t>
+      </w:r>
+    </w:p>
+    <w:p>
+      <w:pPr>
+        <w:pStyle w:val="BodyText"/>
+      </w:pPr>
+      <w:r>
+        <w:t xml:space="preserve">Ambiente dedicado ao Plano Pena Justa, com informações gerais, documentos públicos e marcos relacionados ao fortalecimento das ouvidorias no sistema penal.</w:t>
+      </w:r>
+    </w:p>
+    <w:p>
+      <w:pPr>
+        <w:pStyle w:val="BodyText"/>
+      </w:pPr>
+      <w:r>
+        <w:t xml:space="preserve">Seção:</w:t>
+      </w:r>
+    </w:p>
+    <w:p>
+      <w:pPr>
+        <w:pStyle w:val="BodyText"/>
+      </w:pPr>
+      <w:r>
+        <w:t xml:space="preserve">O Plano</w:t>
       </w:r>
     </w:p>
     <w:p>
@@ -4383,23 +4573,15 @@
         <w:pStyle w:val="BodyText"/>
       </w:pPr>
       <w:r>
-        <w:t xml:space="preserve">Entre novembro e dezembro de 2025, a EMA/Senappen contribuiu para a formalização da mesa de trabalho, participou de reuniões técnicas dedicadas aos eixos temáticos do caso e apoiou a preparação de visita técnica destinada a consolidar diagnósticos e orientar as próximas medidas.</w:t>
-      </w:r>
-    </w:p>
-    <w:p>
-      <w:pPr>
-        <w:pStyle w:val="BodyText"/>
-      </w:pPr>
-      <w:r>
-        <w:t xml:space="preserve">A segunda linha da subseção:</w:t>
-      </w:r>
-    </w:p>
-    <w:p>
-      <w:pPr>
-        <w:pStyle w:val="BodyText"/>
-      </w:pPr>
-      <w:r>
-        <w:t xml:space="preserve">No mesmo contexto, a equipe atuou de forma articulada com o Plano Pena Justa e acompanhou iniciativas voltadas à criação de instâncias permanentes de monitoramento e à padronização de fluxos para acompanhamento de casos internacionais com incidência sobre o sistema penal brasileiro.</w:t>
+        <w:t xml:space="preserve">O Plano Pena Justa é o Plano Nacional para o Enfrentamento do Estado de Coisas Inconstitucional nas Prisões Brasileiras, no âmbito da ADPF 347. Sua proposta articula ações de qualificação das políticas penais, fortalecimento da segurança pública, valorização dos servidores penais, transparência, participação social e monitoramento das metas pactuadas.</w:t>
+      </w:r>
+    </w:p>
+    <w:p>
+      <w:pPr>
+        <w:pStyle w:val="BodyText"/>
+      </w:pPr>
+      <w:r>
+        <w:t xml:space="preserve">Na perspectiva da Ouvidoria Nacional de Serviços Penais, esta subpágina reúne referências públicas do Plano voltadas ao fortalecimento da participação social, da escuta qualificada e da articulação entre as ouvidorias dos serviços penais nos Estados e no Distrito Federal.</w:t>
       </w:r>
     </w:p>
     <w:p>
@@ -4415,7 +4597,7 @@
         <w:pStyle w:val="BodyText"/>
       </w:pPr>
       <w:r>
-        <w:t xml:space="preserve">Referências públicas do SIDH</w:t>
+        <w:t xml:space="preserve">Eixos de atuação</w:t>
       </w:r>
     </w:p>
     <w:p>
@@ -4431,15 +4613,7 @@
         <w:pStyle w:val="BodyText"/>
       </w:pPr>
       <w:r>
-        <w:t xml:space="preserve">Para contextualização institucional da pauta, a ONASP pode utilizar como pontos de partida as referências públicas abaixo, produzidas pelos próprios órgãos do sistema interamericano:</w:t>
-      </w:r>
-    </w:p>
-    <w:p>
-      <w:pPr>
-        <w:pStyle w:val="BodyText"/>
-      </w:pPr>
-      <w:r>
-        <w:t xml:space="preserve">Links:</w:t>
+        <w:t xml:space="preserve">O Plano Nacional organiza sua atuação em quatro eixos estruturantes:</w:t>
       </w:r>
     </w:p>
     <w:p>
@@ -4451,7 +4625,7 @@
         </w:numPr>
       </w:pPr>
       <w:r>
-        <w:t xml:space="preserve">O que é a CIDH?: https://www.oas.org/pt/cidh/mandato/que.asp</w:t>
+        <w:t xml:space="preserve">Controle da entrada e das vagas do sistema prisional.</w:t>
       </w:r>
     </w:p>
     <w:p>
@@ -4463,7 +4637,7 @@
         </w:numPr>
       </w:pPr>
       <w:r>
-        <w:t xml:space="preserve">O que é a Corte IDH?: https://www.corteidh.or.cr/que_es_la_corte.cfm?lang=pt</w:t>
+        <w:t xml:space="preserve">Qualidade da ambiência, dos serviços prestados e da estrutura prisional.</w:t>
       </w:r>
     </w:p>
     <w:p>
@@ -4475,7 +4649,7 @@
         </w:numPr>
       </w:pPr>
       <w:r>
-        <w:t xml:space="preserve">Estatuto da Comissão Interamericana de Direitos Humanos: https://www.oas.org/pt/cidh/mandato/Basicos/estatutoCIDH.asp</w:t>
+        <w:t xml:space="preserve">Processos de saída da prisão e de reintegração social.</w:t>
       </w:r>
     </w:p>
     <w:p>
@@ -4487,7 +4661,7 @@
         </w:numPr>
       </w:pPr>
       <w:r>
-        <w:t xml:space="preserve">Declaração Americana de Direitos e Deveres do Homem: https://www.oas.org/pt/cidh/mandato/Basicos/declaracion.asp</w:t>
+        <w:t xml:space="preserve">Políticas de não repetição do Estado de Coisas Inconstitucional no sistema prisional.</w:t>
       </w:r>
     </w:p>
     <w:p>
@@ -4498,94 +4672,36 @@
         <w:t xml:space="preserve">Seção:</w:t>
       </w:r>
     </w:p>
-    <w:bookmarkEnd w:id="22"/>
-    <w:bookmarkStart w:id="23" w:name="subpágina-3---plano-pena-justa"/>
-    <w:p>
-      <w:pPr>
-        <w:pStyle w:val="Heading2"/>
-      </w:pPr>
-      <w:r>
-        <w:t xml:space="preserve">Subpágina 3 - Plano Pena Justa</w:t>
-      </w:r>
-    </w:p>
-    <w:p>
-      <w:pPr>
-        <w:pStyle w:val="FirstParagraph"/>
-      </w:pPr>
-      <w:r>
-        <w:t xml:space="preserve">Título da página:</w:t>
-      </w:r>
-    </w:p>
-    <w:p>
-      <w:pPr>
-        <w:pStyle w:val="BodyText"/>
-      </w:pPr>
-      <w:r>
-        <w:t xml:space="preserve">Plano Pena Justa</w:t>
-      </w:r>
-    </w:p>
-    <w:p>
-      <w:pPr>
-        <w:pStyle w:val="BodyText"/>
-      </w:pPr>
-      <w:r>
-        <w:t xml:space="preserve">Imagem de destaque:</w:t>
-      </w:r>
-    </w:p>
-    <w:p>
-      <w:pPr>
-        <w:pStyle w:val="BodyText"/>
-      </w:pPr>
-      <w:r>
-        <w:t xml:space="preserve">Documentação/Botao_PenaJusta.png</w:t>
-      </w:r>
-    </w:p>
-    <w:p>
-      <w:pPr>
-        <w:pStyle w:val="BodyText"/>
-      </w:pPr>
-      <w:r>
-        <w:t xml:space="preserve">Texto alternativo sugerido:</w:t>
-      </w:r>
-    </w:p>
-    <w:p>
-      <w:pPr>
-        <w:pStyle w:val="BodyText"/>
-      </w:pPr>
-      <w:r>
-        <w:t xml:space="preserve">Marca do Plano Pena Justa.</w:t>
-      </w:r>
-    </w:p>
-    <w:p>
-      <w:pPr>
-        <w:pStyle w:val="BodyText"/>
-      </w:pPr>
-      <w:r>
-        <w:t xml:space="preserve">Identificador editorial:</w:t>
-      </w:r>
-    </w:p>
-    <w:p>
-      <w:pPr>
-        <w:pStyle w:val="BodyText"/>
-      </w:pPr>
-      <w:r>
-        <w:t xml:space="preserve">Conteúdo Técnico e Projetos Estruturantes</w:t>
-      </w:r>
-    </w:p>
-    <w:p>
-      <w:pPr>
-        <w:pStyle w:val="BodyText"/>
-      </w:pPr>
-      <w:r>
-        <w:t xml:space="preserve">Texto de destaque:</w:t>
-      </w:r>
-    </w:p>
-    <w:p>
-      <w:pPr>
-        <w:pStyle w:val="BodyText"/>
-      </w:pPr>
-      <w:r>
-        <w:t xml:space="preserve">Ambiente dedicado ao Plano Pena Justa, com informações gerais, documentos públicos e marcos relacionados ao fortalecimento das ouvidorias no sistema penal.</w:t>
+    <w:p>
+      <w:pPr>
+        <w:pStyle w:val="BodyText"/>
+      </w:pPr>
+      <w:r>
+        <w:t xml:space="preserve">Governança e acompanhamento</w:t>
+      </w:r>
+    </w:p>
+    <w:p>
+      <w:pPr>
+        <w:pStyle w:val="BodyText"/>
+      </w:pPr>
+      <w:r>
+        <w:t xml:space="preserve">Texto para colar:</w:t>
+      </w:r>
+    </w:p>
+    <w:p>
+      <w:pPr>
+        <w:pStyle w:val="BodyText"/>
+      </w:pPr>
+      <w:r>
+        <w:t xml:space="preserve">No recorte da Ouvidoria Nacional de Serviços Penais, o acompanhamento do Pena Justa prioriza instrumentos que fortaleçam a escuta qualificada, a transparência ativa e a coordenação entre as ouvidorias dos serviços penais.</w:t>
+      </w:r>
+    </w:p>
+    <w:p>
+      <w:pPr>
+        <w:pStyle w:val="BodyText"/>
+      </w:pPr>
+      <w:r>
+        <w:t xml:space="preserve">Esse recorte se materializa por meio de marcos normativos e de cooperação técnica que estruturam parâmetros mínimos de atuação, incentivam integração preferencial ao Fala.BR e consolidam uma rede permanente de intercâmbio entre União, Estados e Distrito Federal.</w:t>
       </w:r>
     </w:p>
     <w:p>
@@ -4601,7 +4717,7 @@
         <w:pStyle w:val="BodyText"/>
       </w:pPr>
       <w:r>
-        <w:t xml:space="preserve">O Plano</w:t>
+        <w:t xml:space="preserve">Entregas já formalizadas</w:t>
       </w:r>
     </w:p>
     <w:p>
@@ -4617,15 +4733,167 @@
         <w:pStyle w:val="BodyText"/>
       </w:pPr>
       <w:r>
-        <w:t xml:space="preserve">O Plano Pena Justa é o Plano Nacional para o Enfrentamento do Estado de Coisas Inconstitucional nas Prisões Brasileiras, no âmbito da ADPF 347. Sua proposta articula ações de qualificação das políticas penais, fortalecimento da segurança pública, valorização dos servidores penais, transparência, participação social e monitoramento das metas pactuadas.</w:t>
-      </w:r>
-    </w:p>
-    <w:p>
-      <w:pPr>
-        <w:pStyle w:val="BodyText"/>
-      </w:pPr>
-      <w:r>
-        <w:t xml:space="preserve">Na perspectiva da Ouvidoria Nacional de Serviços Penais, esta subpágina reúne referências públicas do Plano voltadas ao fortalecimento da participação social, da escuta qualificada e da articulação entre as ouvidorias dos serviços penais nos Estados e no Distrito Federal.</w:t>
+        <w:t xml:space="preserve">No campo das ouvidorias e da participação social, o Pena Justa já reúne marcos normativos que podem ser destacados nesta página:</w:t>
+      </w:r>
+    </w:p>
+    <w:p>
+      <w:pPr>
+        <w:pStyle w:val="BodyText"/>
+      </w:pPr>
+      <w:r>
+        <w:t xml:space="preserve">Subtítulo:</w:t>
+      </w:r>
+    </w:p>
+    <w:p>
+      <w:pPr>
+        <w:pStyle w:val="BodyText"/>
+      </w:pPr>
+      <w:r>
+        <w:t xml:space="preserve">Normativo publicado</w:t>
+      </w:r>
+    </w:p>
+    <w:p>
+      <w:pPr>
+        <w:pStyle w:val="BodyText"/>
+      </w:pPr>
+      <w:r>
+        <w:t xml:space="preserve">Título:</w:t>
+      </w:r>
+    </w:p>
+    <w:p>
+      <w:pPr>
+        <w:pStyle w:val="BodyText"/>
+      </w:pPr>
+      <w:r>
+        <w:t xml:space="preserve">Instrução Normativa nº 75/2026</w:t>
+      </w:r>
+    </w:p>
+    <w:p>
+      <w:pPr>
+        <w:pStyle w:val="BodyText"/>
+      </w:pPr>
+      <w:r>
+        <w:t xml:space="preserve">Texto para colar:</w:t>
+      </w:r>
+    </w:p>
+    <w:p>
+      <w:pPr>
+        <w:pStyle w:val="BodyText"/>
+      </w:pPr>
+      <w:r>
+        <w:t xml:space="preserve">Estabelece parâmetros mínimos para a criação e a estruturação de Ouvidorias de Serviços Penais nos Estados e no Distrito Federal, com diretrizes de autonomia, transparência, acessibilidade e integração preferencial ao Fala.BR.</w:t>
+      </w:r>
+    </w:p>
+    <w:p>
+      <w:pPr>
+        <w:pStyle w:val="BodyText"/>
+      </w:pPr>
+      <w:r>
+        <w:t xml:space="preserve">Link:</w:t>
+      </w:r>
+    </w:p>
+    <w:p>
+      <w:pPr>
+        <w:pStyle w:val="BodyText"/>
+      </w:pPr>
+      <w:r>
+        <w:t xml:space="preserve">Acessar a Instrução Normativa (PDF)</w:t>
+      </w:r>
+    </w:p>
+    <w:p>
+      <w:pPr>
+        <w:pStyle w:val="BodyText"/>
+      </w:pPr>
+      <w:r>
+        <w:t xml:space="preserve">Arquivo:</w:t>
+      </w:r>
+    </w:p>
+    <w:p>
+      <w:pPr>
+        <w:pStyle w:val="BodyText"/>
+      </w:pPr>
+      <w:r>
+        <w:t xml:space="preserve">Subpages/Pena_justa/SEI_35153985_Instrucao_Normativa_75.pdf</w:t>
+      </w:r>
+    </w:p>
+    <w:p>
+      <w:pPr>
+        <w:pStyle w:val="BodyText"/>
+      </w:pPr>
+      <w:r>
+        <w:t xml:space="preserve">Subtítulo:</w:t>
+      </w:r>
+    </w:p>
+    <w:p>
+      <w:pPr>
+        <w:pStyle w:val="BodyText"/>
+      </w:pPr>
+      <w:r>
+        <w:t xml:space="preserve">Rede instituída</w:t>
+      </w:r>
+    </w:p>
+    <w:p>
+      <w:pPr>
+        <w:pStyle w:val="BodyText"/>
+      </w:pPr>
+      <w:r>
+        <w:t xml:space="preserve">Título:</w:t>
+      </w:r>
+    </w:p>
+    <w:p>
+      <w:pPr>
+        <w:pStyle w:val="BodyText"/>
+      </w:pPr>
+      <w:r>
+        <w:t xml:space="preserve">Portaria nº 549/2026</w:t>
+      </w:r>
+    </w:p>
+    <w:p>
+      <w:pPr>
+        <w:pStyle w:val="BodyText"/>
+      </w:pPr>
+      <w:r>
+        <w:t xml:space="preserve">Texto para colar:</w:t>
+      </w:r>
+    </w:p>
+    <w:p>
+      <w:pPr>
+        <w:pStyle w:val="BodyText"/>
+      </w:pPr>
+      <w:r>
+        <w:t xml:space="preserve">Institui a Rede Nacional de Ouvidorias de Serviços Penais - Renospen, como instância permanente de cooperação técnica, intercâmbio de informações e fortalecimento institucional das ouvidorias no sistema penal.</w:t>
+      </w:r>
+    </w:p>
+    <w:p>
+      <w:pPr>
+        <w:pStyle w:val="BodyText"/>
+      </w:pPr>
+      <w:r>
+        <w:t xml:space="preserve">Link:</w:t>
+      </w:r>
+    </w:p>
+    <w:p>
+      <w:pPr>
+        <w:pStyle w:val="BodyText"/>
+      </w:pPr>
+      <w:r>
+        <w:t xml:space="preserve">Acessar a Portaria (PDF)</w:t>
+      </w:r>
+    </w:p>
+    <w:p>
+      <w:pPr>
+        <w:pStyle w:val="BodyText"/>
+      </w:pPr>
+      <w:r>
+        <w:t xml:space="preserve">Arquivo:</w:t>
+      </w:r>
+    </w:p>
+    <w:p>
+      <w:pPr>
+        <w:pStyle w:val="BodyText"/>
+      </w:pPr>
+      <w:r>
+        <w:t xml:space="preserve">Subpages/Pena_justa/SEI_35032761_Portaria_549.pdf</w:t>
       </w:r>
     </w:p>
     <w:p>
@@ -4641,23 +4909,15 @@
         <w:pStyle w:val="BodyText"/>
       </w:pPr>
       <w:r>
-        <w:t xml:space="preserve">Eixos de atuação</w:t>
-      </w:r>
-    </w:p>
-    <w:p>
-      <w:pPr>
-        <w:pStyle w:val="BodyText"/>
-      </w:pPr>
-      <w:r>
-        <w:t xml:space="preserve">Texto para colar:</w:t>
-      </w:r>
-    </w:p>
-    <w:p>
-      <w:pPr>
-        <w:pStyle w:val="BodyText"/>
-      </w:pPr>
-      <w:r>
-        <w:t xml:space="preserve">O Plano Nacional organiza sua atuação em quatro eixos estruturantes:</w:t>
+        <w:t xml:space="preserve">Documentos públicos de referência</w:t>
+      </w:r>
+    </w:p>
+    <w:p>
+      <w:pPr>
+        <w:pStyle w:val="BodyText"/>
+      </w:pPr>
+      <w:r>
+        <w:t xml:space="preserve">Links:</w:t>
       </w:r>
     </w:p>
     <w:p>
@@ -4669,7 +4929,7 @@
         </w:numPr>
       </w:pPr>
       <w:r>
-        <w:t xml:space="preserve">Controle da entrada e das vagas do sistema prisional.</w:t>
+        <w:t xml:space="preserve">Plano Nacional Pena Justa (PDF): Subpages/Pena_justa/Plano_Nacional_Pena_Justa.pdf</w:t>
       </w:r>
     </w:p>
     <w:p>
@@ -4681,31 +4941,17 @@
         </w:numPr>
       </w:pPr>
       <w:r>
-        <w:t xml:space="preserve">Qualidade da ambiência, dos serviços prestados e da estrutura prisional.</w:t>
-      </w:r>
-    </w:p>
-    <w:p>
-      <w:pPr>
-        <w:pStyle w:val="Compact"/>
-        <w:numPr>
-          <w:ilvl w:val="0"/>
-          <w:numId w:val="1016"/>
-        </w:numPr>
-      </w:pPr>
-      <w:r>
-        <w:t xml:space="preserve">Processos de saída da prisão e de reintegração social.</w:t>
-      </w:r>
-    </w:p>
-    <w:p>
-      <w:pPr>
-        <w:pStyle w:val="Compact"/>
-        <w:numPr>
-          <w:ilvl w:val="0"/>
-          <w:numId w:val="1016"/>
-        </w:numPr>
-      </w:pPr>
-      <w:r>
-        <w:t xml:space="preserve">Políticas de não repetição do Estado de Coisas Inconstitucional no sistema prisional.</w:t>
+        <w:t xml:space="preserve">10 coisas que você precisa saber sobre o Pena Justa (PDF): Subpages/Pena_justa/10_Coisas_que_você_precisa_saber_sobre_o_Pena_Justa.pdf</w:t>
+      </w:r>
+    </w:p>
+    <w:bookmarkEnd w:id="23"/>
+    <w:bookmarkStart w:id="24" w:name="X9010218d04cc9bed3b5085cf6721dd78b5ea4ec"/>
+    <w:p>
+      <w:pPr>
+        <w:pStyle w:val="Heading2"/>
+      </w:pPr>
+      <w:r>
+        <w:t xml:space="preserve">Subpágina 4 - Revista Brasileira de Execução Penal</w:t>
       </w:r>
     </w:p>
     <w:p>
@@ -4713,6 +4959,86 @@
         <w:pStyle w:val="FirstParagraph"/>
       </w:pPr>
       <w:r>
+        <w:t xml:space="preserve">Título da página:</w:t>
+      </w:r>
+    </w:p>
+    <w:p>
+      <w:pPr>
+        <w:pStyle w:val="BodyText"/>
+      </w:pPr>
+      <w:r>
+        <w:t xml:space="preserve">Revista Brasileira de Execução Penal</w:t>
+      </w:r>
+    </w:p>
+    <w:p>
+      <w:pPr>
+        <w:pStyle w:val="BodyText"/>
+      </w:pPr>
+      <w:r>
+        <w:t xml:space="preserve">Imagem de destaque:</w:t>
+      </w:r>
+    </w:p>
+    <w:p>
+      <w:pPr>
+        <w:pStyle w:val="BodyText"/>
+      </w:pPr>
+      <w:r>
+        <w:t xml:space="preserve">Documentação/Botao_RevistaBrasileira.png</w:t>
+      </w:r>
+    </w:p>
+    <w:p>
+      <w:pPr>
+        <w:pStyle w:val="BodyText"/>
+      </w:pPr>
+      <w:r>
+        <w:t xml:space="preserve">Texto alternativo sugerido:</w:t>
+      </w:r>
+    </w:p>
+    <w:p>
+      <w:pPr>
+        <w:pStyle w:val="BodyText"/>
+      </w:pPr>
+      <w:r>
+        <w:t xml:space="preserve">Botão institucional da Revista Brasileira de Execução Penal.</w:t>
+      </w:r>
+    </w:p>
+    <w:p>
+      <w:pPr>
+        <w:pStyle w:val="BodyText"/>
+      </w:pPr>
+      <w:r>
+        <w:t xml:space="preserve">Identificador editorial:</w:t>
+      </w:r>
+    </w:p>
+    <w:p>
+      <w:pPr>
+        <w:pStyle w:val="BodyText"/>
+      </w:pPr>
+      <w:r>
+        <w:t xml:space="preserve">Conteúdo Técnico e Projetos Estruturantes</w:t>
+      </w:r>
+    </w:p>
+    <w:p>
+      <w:pPr>
+        <w:pStyle w:val="BodyText"/>
+      </w:pPr>
+      <w:r>
+        <w:t xml:space="preserve">Texto de destaque:</w:t>
+      </w:r>
+    </w:p>
+    <w:p>
+      <w:pPr>
+        <w:pStyle w:val="BodyText"/>
+      </w:pPr>
+      <w:r>
+        <w:t xml:space="preserve">Em articulação com a Espen e a DCOM, esta subpágina reúne referências da Revista Brasileira de Execução Penal e destaca dossiês, notícias editoriais e conteúdos com interface com participação social, transparência e direitos no sistema penal.</w:t>
+      </w:r>
+    </w:p>
+    <w:p>
+      <w:pPr>
+        <w:pStyle w:val="BodyText"/>
+      </w:pPr>
+      <w:r>
         <w:t xml:space="preserve">Seção:</w:t>
       </w:r>
     </w:p>
@@ -4721,7 +5047,7 @@
         <w:pStyle w:val="BodyText"/>
       </w:pPr>
       <w:r>
-        <w:t xml:space="preserve">Governança e acompanhamento</w:t>
+        <w:t xml:space="preserve">A Revista</w:t>
       </w:r>
     </w:p>
     <w:p>
@@ -4737,15 +5063,23 @@
         <w:pStyle w:val="BodyText"/>
       </w:pPr>
       <w:r>
-        <w:t xml:space="preserve">No recorte da Ouvidoria Nacional de Serviços Penais, o acompanhamento do Pena Justa prioriza instrumentos que fortaleçam a escuta qualificada, a transparência ativa e a coordenação entre as ouvidorias dos serviços penais.</w:t>
-      </w:r>
-    </w:p>
-    <w:p>
-      <w:pPr>
-        <w:pStyle w:val="BodyText"/>
-      </w:pPr>
-      <w:r>
-        <w:t xml:space="preserve">Esse recorte se materializa por meio de marcos normativos e de cooperação técnica que estruturam parâmetros mínimos de atuação, incentivam integração preferencial ao Fala.BR e consolidam uma rede permanente de intercâmbio entre União, Estados e Distrito Federal.</w:t>
+        <w:t xml:space="preserve">A Revista Brasileira de Execução Penal é o periódico técnico-científico da Secretaria Nacional de Políticas Penais (Senappen/MJSP) e constitui espaço de circulação de artigos, documentos inéditos, entrevistas, relatos de experiência e boas práticas relacionados à execução penal.</w:t>
+      </w:r>
+    </w:p>
+    <w:p>
+      <w:pPr>
+        <w:pStyle w:val="BodyText"/>
+      </w:pPr>
+      <w:r>
+        <w:t xml:space="preserve">A segunda linha do escopo:</w:t>
+      </w:r>
+    </w:p>
+    <w:p>
+      <w:pPr>
+        <w:pStyle w:val="BodyText"/>
+      </w:pPr>
+      <w:r>
+        <w:t xml:space="preserve">No contexto da Ouvidoria, a publicação contribui para aproximar produção técnica, debate qualificado e controle social, reforçando o papel da Ouvidoria como ponte entre Estado e sociedade.</w:t>
       </w:r>
     </w:p>
     <w:p>
@@ -4761,7 +5095,7 @@
         <w:pStyle w:val="BodyText"/>
       </w:pPr>
       <w:r>
-        <w:t xml:space="preserve">Entregas já formalizadas</w:t>
+        <w:t xml:space="preserve">Sobre a revista</w:t>
       </w:r>
     </w:p>
     <w:p>
@@ -4777,39 +5111,39 @@
         <w:pStyle w:val="BodyText"/>
       </w:pPr>
       <w:r>
-        <w:t xml:space="preserve">No campo das ouvidorias e da participação social, o Pena Justa já reúne marcos normativos que podem ser destacados nesta página:</w:t>
-      </w:r>
-    </w:p>
-    <w:p>
-      <w:pPr>
-        <w:pStyle w:val="BodyText"/>
-      </w:pPr>
-      <w:r>
-        <w:t xml:space="preserve">Subtítulo:</w:t>
-      </w:r>
-    </w:p>
-    <w:p>
-      <w:pPr>
-        <w:pStyle w:val="BodyText"/>
-      </w:pPr>
-      <w:r>
-        <w:t xml:space="preserve">Normativo publicado</w:t>
-      </w:r>
-    </w:p>
-    <w:p>
-      <w:pPr>
-        <w:pStyle w:val="BodyText"/>
-      </w:pPr>
-      <w:r>
-        <w:t xml:space="preserve">Título:</w:t>
-      </w:r>
-    </w:p>
-    <w:p>
-      <w:pPr>
-        <w:pStyle w:val="BodyText"/>
-      </w:pPr>
-      <w:r>
-        <w:t xml:space="preserve">Instrução Normativa nº 75/2026</w:t>
+        <w:t xml:space="preserve">A RBEP publica artigos, documentos inéditos, entrevistas, relatos de experiência e descrição de boas práticas que relacionam a experiência profissional, o conhecimento produzido sobre a matéria e o cumprimento da legislação nacional.</w:t>
+      </w:r>
+    </w:p>
+    <w:p>
+      <w:pPr>
+        <w:pStyle w:val="BodyText"/>
+      </w:pPr>
+      <w:r>
+        <w:t xml:space="preserve">A segunda linha da seção:</w:t>
+      </w:r>
+    </w:p>
+    <w:p>
+      <w:pPr>
+        <w:pStyle w:val="BodyText"/>
+      </w:pPr>
+      <w:r>
+        <w:t xml:space="preserve">Os conteúdos são organizados em dossiês temáticos semestrais, e a revista recebeu qualificação A4 na classificação de periódicos Qualis Capes na avaliação do quadriênio 2021-2024.</w:t>
+      </w:r>
+    </w:p>
+    <w:p>
+      <w:pPr>
+        <w:pStyle w:val="BodyText"/>
+      </w:pPr>
+      <w:r>
+        <w:t xml:space="preserve">Seção:</w:t>
+      </w:r>
+    </w:p>
+    <w:p>
+      <w:pPr>
+        <w:pStyle w:val="BodyText"/>
+      </w:pPr>
+      <w:r>
+        <w:t xml:space="preserve">Acesso oficial à RBEP</w:t>
       </w:r>
     </w:p>
     <w:p>
@@ -4825,135 +5159,7 @@
         <w:pStyle w:val="BodyText"/>
       </w:pPr>
       <w:r>
-        <w:t xml:space="preserve">Estabelece parâmetros mínimos para a criação e a estruturação de Ouvidorias de Serviços Penais nos Estados e no Distrito Federal, com diretrizes de autonomia, transparência, acessibilidade e integração preferencial ao Fala.BR.</w:t>
-      </w:r>
-    </w:p>
-    <w:p>
-      <w:pPr>
-        <w:pStyle w:val="BodyText"/>
-      </w:pPr>
-      <w:r>
-        <w:t xml:space="preserve">Link:</w:t>
-      </w:r>
-    </w:p>
-    <w:p>
-      <w:pPr>
-        <w:pStyle w:val="BodyText"/>
-      </w:pPr>
-      <w:r>
-        <w:t xml:space="preserve">Acessar a Instrução Normativa (PDF)</w:t>
-      </w:r>
-    </w:p>
-    <w:p>
-      <w:pPr>
-        <w:pStyle w:val="BodyText"/>
-      </w:pPr>
-      <w:r>
-        <w:t xml:space="preserve">Arquivo:</w:t>
-      </w:r>
-    </w:p>
-    <w:p>
-      <w:pPr>
-        <w:pStyle w:val="BodyText"/>
-      </w:pPr>
-      <w:r>
-        <w:t xml:space="preserve">Subpages/Pena_justa/SEI_35153985_Instrucao_Normativa_75.pdf</w:t>
-      </w:r>
-    </w:p>
-    <w:p>
-      <w:pPr>
-        <w:pStyle w:val="BodyText"/>
-      </w:pPr>
-      <w:r>
-        <w:t xml:space="preserve">Subtítulo:</w:t>
-      </w:r>
-    </w:p>
-    <w:p>
-      <w:pPr>
-        <w:pStyle w:val="BodyText"/>
-      </w:pPr>
-      <w:r>
-        <w:t xml:space="preserve">Rede instituída</w:t>
-      </w:r>
-    </w:p>
-    <w:p>
-      <w:pPr>
-        <w:pStyle w:val="BodyText"/>
-      </w:pPr>
-      <w:r>
-        <w:t xml:space="preserve">Título:</w:t>
-      </w:r>
-    </w:p>
-    <w:p>
-      <w:pPr>
-        <w:pStyle w:val="BodyText"/>
-      </w:pPr>
-      <w:r>
-        <w:t xml:space="preserve">Portaria nº 549/2026</w:t>
-      </w:r>
-    </w:p>
-    <w:p>
-      <w:pPr>
-        <w:pStyle w:val="BodyText"/>
-      </w:pPr>
-      <w:r>
-        <w:t xml:space="preserve">Texto para colar:</w:t>
-      </w:r>
-    </w:p>
-    <w:p>
-      <w:pPr>
-        <w:pStyle w:val="BodyText"/>
-      </w:pPr>
-      <w:r>
-        <w:t xml:space="preserve">Institui a Rede Nacional de Ouvidorias de Serviços Penais - Renospen, como instância permanente de cooperação técnica, intercâmbio de informações e fortalecimento institucional das ouvidorias no sistema penal.</w:t>
-      </w:r>
-    </w:p>
-    <w:p>
-      <w:pPr>
-        <w:pStyle w:val="BodyText"/>
-      </w:pPr>
-      <w:r>
-        <w:t xml:space="preserve">Link:</w:t>
-      </w:r>
-    </w:p>
-    <w:p>
-      <w:pPr>
-        <w:pStyle w:val="BodyText"/>
-      </w:pPr>
-      <w:r>
-        <w:t xml:space="preserve">Acessar a Portaria (PDF)</w:t>
-      </w:r>
-    </w:p>
-    <w:p>
-      <w:pPr>
-        <w:pStyle w:val="BodyText"/>
-      </w:pPr>
-      <w:r>
-        <w:t xml:space="preserve">Arquivo:</w:t>
-      </w:r>
-    </w:p>
-    <w:p>
-      <w:pPr>
-        <w:pStyle w:val="BodyText"/>
-      </w:pPr>
-      <w:r>
-        <w:t xml:space="preserve">Subpages/Pena_justa/SEI_35032761_Portaria_549.pdf</w:t>
-      </w:r>
-    </w:p>
-    <w:p>
-      <w:pPr>
-        <w:pStyle w:val="BodyText"/>
-      </w:pPr>
-      <w:r>
-        <w:t xml:space="preserve">Seção:</w:t>
-      </w:r>
-    </w:p>
-    <w:p>
-      <w:pPr>
-        <w:pStyle w:val="BodyText"/>
-      </w:pPr>
-      <w:r>
-        <w:t xml:space="preserve">Documentos públicos de referência</w:t>
+        <w:t xml:space="preserve">O portal oficial da revista reúne notícias, edição atual, arquivo de edições e informações para submissão de textos.</w:t>
       </w:r>
     </w:p>
     <w:p>
@@ -4973,7 +5179,7 @@
         </w:numPr>
       </w:pPr>
       <w:r>
-        <w:t xml:space="preserve">Plano Nacional Pena Justa (PDF): Subpages/Pena_justa/Plano_Nacional_Pena_Justa.pdf</w:t>
+        <w:t xml:space="preserve">Portal oficial da Revista Brasileira de Execução Penal: https://rbepsenappen.mj.gov.br/index.php/RBEP/pt_BR</w:t>
       </w:r>
     </w:p>
     <w:p>
@@ -4985,17 +5191,31 @@
         </w:numPr>
       </w:pPr>
       <w:r>
-        <w:t xml:space="preserve">10 coisas que você precisa saber sobre o Pena Justa (PDF): Subpages/Pena_justa/10_Coisas_que_você_precisa_saber_sobre_o_Pena_Justa.pdf</w:t>
-      </w:r>
-    </w:p>
-    <w:bookmarkEnd w:id="23"/>
-    <w:bookmarkStart w:id="24" w:name="X9010218d04cc9bed3b5085cf6721dd78b5ea4ec"/>
-    <w:p>
-      <w:pPr>
-        <w:pStyle w:val="Heading2"/>
-      </w:pPr>
-      <w:r>
-        <w:t xml:space="preserve">Subpágina 4 - Revista Brasileira de Execução Penal</w:t>
+        <w:t xml:space="preserve">Edição atual - edição completa: https://rbepsenappen.mj.gov.br/index.php/RBEP/pt_BR/issue/view/22/58</w:t>
+      </w:r>
+    </w:p>
+    <w:p>
+      <w:pPr>
+        <w:pStyle w:val="Compact"/>
+        <w:numPr>
+          <w:ilvl w:val="0"/>
+          <w:numId w:val="1017"/>
+        </w:numPr>
+      </w:pPr>
+      <w:r>
+        <w:t xml:space="preserve">Ver todas as edições: https://rbepsenappen.mj.gov.br/index.php/RBEP/pt_BR/issue/archive</w:t>
+      </w:r>
+    </w:p>
+    <w:p>
+      <w:pPr>
+        <w:pStyle w:val="Compact"/>
+        <w:numPr>
+          <w:ilvl w:val="0"/>
+          <w:numId w:val="1017"/>
+        </w:numPr>
+      </w:pPr>
+      <w:r>
+        <w:t xml:space="preserve">Enviar submissão: https://rbepsenappen.mj.gov.br/index.php/RBEP/pt_BR/about/submissions</w:t>
       </w:r>
     </w:p>
     <w:p>
@@ -5003,86 +5223,6 @@
         <w:pStyle w:val="FirstParagraph"/>
       </w:pPr>
       <w:r>
-        <w:t xml:space="preserve">Título da página:</w:t>
-      </w:r>
-    </w:p>
-    <w:p>
-      <w:pPr>
-        <w:pStyle w:val="BodyText"/>
-      </w:pPr>
-      <w:r>
-        <w:t xml:space="preserve">Revista Brasileira de Execução Penal</w:t>
-      </w:r>
-    </w:p>
-    <w:p>
-      <w:pPr>
-        <w:pStyle w:val="BodyText"/>
-      </w:pPr>
-      <w:r>
-        <w:t xml:space="preserve">Imagem de destaque:</w:t>
-      </w:r>
-    </w:p>
-    <w:p>
-      <w:pPr>
-        <w:pStyle w:val="BodyText"/>
-      </w:pPr>
-      <w:r>
-        <w:t xml:space="preserve">Documentação/Botao_RevistaBrasileira.png</w:t>
-      </w:r>
-    </w:p>
-    <w:p>
-      <w:pPr>
-        <w:pStyle w:val="BodyText"/>
-      </w:pPr>
-      <w:r>
-        <w:t xml:space="preserve">Texto alternativo sugerido:</w:t>
-      </w:r>
-    </w:p>
-    <w:p>
-      <w:pPr>
-        <w:pStyle w:val="BodyText"/>
-      </w:pPr>
-      <w:r>
-        <w:t xml:space="preserve">Botão institucional da Revista Brasileira de Execução Penal.</w:t>
-      </w:r>
-    </w:p>
-    <w:p>
-      <w:pPr>
-        <w:pStyle w:val="BodyText"/>
-      </w:pPr>
-      <w:r>
-        <w:t xml:space="preserve">Identificador editorial:</w:t>
-      </w:r>
-    </w:p>
-    <w:p>
-      <w:pPr>
-        <w:pStyle w:val="BodyText"/>
-      </w:pPr>
-      <w:r>
-        <w:t xml:space="preserve">Conteúdo Técnico e Projetos Estruturantes</w:t>
-      </w:r>
-    </w:p>
-    <w:p>
-      <w:pPr>
-        <w:pStyle w:val="BodyText"/>
-      </w:pPr>
-      <w:r>
-        <w:t xml:space="preserve">Texto de destaque:</w:t>
-      </w:r>
-    </w:p>
-    <w:p>
-      <w:pPr>
-        <w:pStyle w:val="BodyText"/>
-      </w:pPr>
-      <w:r>
-        <w:t xml:space="preserve">Em articulação com a Espen e a DCOM, esta subpágina reúne referências da Revista Brasileira de Execução Penal e destaca dossiês, notícias editoriais e conteúdos com interface com participação social, transparência e direitos no sistema penal.</w:t>
-      </w:r>
-    </w:p>
-    <w:p>
-      <w:pPr>
-        <w:pStyle w:val="BodyText"/>
-      </w:pPr>
-      <w:r>
         <w:t xml:space="preserve">Seção:</w:t>
       </w:r>
     </w:p>
@@ -5091,127 +5231,15 @@
         <w:pStyle w:val="BodyText"/>
       </w:pPr>
       <w:r>
-        <w:t xml:space="preserve">A Revista</w:t>
-      </w:r>
-    </w:p>
-    <w:p>
-      <w:pPr>
-        <w:pStyle w:val="BodyText"/>
-      </w:pPr>
-      <w:r>
-        <w:t xml:space="preserve">Texto para colar:</w:t>
-      </w:r>
-    </w:p>
-    <w:p>
-      <w:pPr>
-        <w:pStyle w:val="BodyText"/>
-      </w:pPr>
-      <w:r>
-        <w:t xml:space="preserve">A Revista Brasileira de Execução Penal é o periódico técnico-científico da Secretaria Nacional de Políticas Penais (Senappen/MJSP) e constitui espaço de circulação de artigos, documentos inéditos, entrevistas, relatos de experiência e boas práticas relacionados à execução penal.</w:t>
-      </w:r>
-    </w:p>
-    <w:p>
-      <w:pPr>
-        <w:pStyle w:val="BodyText"/>
-      </w:pPr>
-      <w:r>
-        <w:t xml:space="preserve">A segunda linha do escopo:</w:t>
-      </w:r>
-    </w:p>
-    <w:p>
-      <w:pPr>
-        <w:pStyle w:val="BodyText"/>
-      </w:pPr>
-      <w:r>
-        <w:t xml:space="preserve">No contexto da Ouvidoria, a publicação contribui para aproximar produção técnica, debate qualificado e controle social, reforçando o papel da Ouvidoria como ponte entre Estado e sociedade.</w:t>
-      </w:r>
-    </w:p>
-    <w:p>
-      <w:pPr>
-        <w:pStyle w:val="BodyText"/>
-      </w:pPr>
-      <w:r>
-        <w:t xml:space="preserve">Seção:</w:t>
-      </w:r>
-    </w:p>
-    <w:p>
-      <w:pPr>
-        <w:pStyle w:val="BodyText"/>
-      </w:pPr>
-      <w:r>
-        <w:t xml:space="preserve">Sobre a revista</w:t>
-      </w:r>
-    </w:p>
-    <w:p>
-      <w:pPr>
-        <w:pStyle w:val="BodyText"/>
-      </w:pPr>
-      <w:r>
-        <w:t xml:space="preserve">Texto para colar:</w:t>
-      </w:r>
-    </w:p>
-    <w:p>
-      <w:pPr>
-        <w:pStyle w:val="BodyText"/>
-      </w:pPr>
-      <w:r>
-        <w:t xml:space="preserve">A RBEP publica artigos, documentos inéditos, entrevistas, relatos de experiência e descrição de boas práticas que relacionam a experiência profissional, o conhecimento produzido sobre a matéria e o cumprimento da legislação nacional.</w:t>
-      </w:r>
-    </w:p>
-    <w:p>
-      <w:pPr>
-        <w:pStyle w:val="BodyText"/>
-      </w:pPr>
-      <w:r>
-        <w:t xml:space="preserve">A segunda linha da seção:</w:t>
-      </w:r>
-    </w:p>
-    <w:p>
-      <w:pPr>
-        <w:pStyle w:val="BodyText"/>
-      </w:pPr>
-      <w:r>
-        <w:t xml:space="preserve">Os conteúdos são organizados em dossiês temáticos semestrais, e a revista recebeu qualificação A4 na classificação de periódicos Qualis Capes na avaliação do quadriênio 2021-2024.</w:t>
-      </w:r>
-    </w:p>
-    <w:p>
-      <w:pPr>
-        <w:pStyle w:val="BodyText"/>
-      </w:pPr>
-      <w:r>
-        <w:t xml:space="preserve">Seção:</w:t>
-      </w:r>
-    </w:p>
-    <w:p>
-      <w:pPr>
-        <w:pStyle w:val="BodyText"/>
-      </w:pPr>
-      <w:r>
-        <w:t xml:space="preserve">Acesso oficial à RBEP</w:t>
-      </w:r>
-    </w:p>
-    <w:p>
-      <w:pPr>
-        <w:pStyle w:val="BodyText"/>
-      </w:pPr>
-      <w:r>
-        <w:t xml:space="preserve">Texto para colar:</w:t>
-      </w:r>
-    </w:p>
-    <w:p>
-      <w:pPr>
-        <w:pStyle w:val="BodyText"/>
-      </w:pPr>
-      <w:r>
-        <w:t xml:space="preserve">O portal oficial da revista reúne notícias, edição atual, arquivo de edições e informações para submissão de textos.</w:t>
-      </w:r>
-    </w:p>
-    <w:p>
-      <w:pPr>
-        <w:pStyle w:val="BodyText"/>
-      </w:pPr>
-      <w:r>
-        <w:t xml:space="preserve">Links:</w:t>
+        <w:t xml:space="preserve">Referências institucionais</w:t>
+      </w:r>
+    </w:p>
+    <w:p>
+      <w:pPr>
+        <w:pStyle w:val="BodyText"/>
+      </w:pPr>
+      <w:r>
+        <w:t xml:space="preserve">Itens para colar:</w:t>
       </w:r>
     </w:p>
     <w:p>
@@ -5223,7 +5251,7 @@
         </w:numPr>
       </w:pPr>
       <w:r>
-        <w:t xml:space="preserve">Portal oficial da Revista Brasileira de Execução Penal: https://rbepsenappen.mj.gov.br/index.php/RBEP/pt_BR</w:t>
+        <w:t xml:space="preserve">Qualis Capes 2021-2024: A4.</w:t>
       </w:r>
     </w:p>
     <w:p>
@@ -5235,7 +5263,7 @@
         </w:numPr>
       </w:pPr>
       <w:r>
-        <w:t xml:space="preserve">Edição atual - edição completa: https://rbepsenappen.mj.gov.br/index.php/RBEP/pt_BR/issue/view/22/58</w:t>
+        <w:t xml:space="preserve">ISSN: 2675-1895.</w:t>
       </w:r>
     </w:p>
     <w:p>
@@ -5247,7 +5275,7 @@
         </w:numPr>
       </w:pPr>
       <w:r>
-        <w:t xml:space="preserve">Ver todas as edições: https://rbepsenappen.mj.gov.br/index.php/RBEP/pt_BR/issue/archive</w:t>
+        <w:t xml:space="preserve">e-ISSN: 2675-1860.</w:t>
       </w:r>
     </w:p>
     <w:p>
@@ -5256,78 +5284,6 @@
         <w:numPr>
           <w:ilvl w:val="0"/>
           <w:numId w:val="1018"/>
-        </w:numPr>
-      </w:pPr>
-      <w:r>
-        <w:t xml:space="preserve">Enviar submissão: https://rbepsenappen.mj.gov.br/index.php/RBEP/pt_BR/about/submissions</w:t>
-      </w:r>
-    </w:p>
-    <w:p>
-      <w:pPr>
-        <w:pStyle w:val="FirstParagraph"/>
-      </w:pPr>
-      <w:r>
-        <w:t xml:space="preserve">Seção:</w:t>
-      </w:r>
-    </w:p>
-    <w:p>
-      <w:pPr>
-        <w:pStyle w:val="BodyText"/>
-      </w:pPr>
-      <w:r>
-        <w:t xml:space="preserve">Referências institucionais</w:t>
-      </w:r>
-    </w:p>
-    <w:p>
-      <w:pPr>
-        <w:pStyle w:val="BodyText"/>
-      </w:pPr>
-      <w:r>
-        <w:t xml:space="preserve">Itens para colar:</w:t>
-      </w:r>
-    </w:p>
-    <w:p>
-      <w:pPr>
-        <w:pStyle w:val="Compact"/>
-        <w:numPr>
-          <w:ilvl w:val="0"/>
-          <w:numId w:val="1019"/>
-        </w:numPr>
-      </w:pPr>
-      <w:r>
-        <w:t xml:space="preserve">Qualis Capes 2021-2024: A4.</w:t>
-      </w:r>
-    </w:p>
-    <w:p>
-      <w:pPr>
-        <w:pStyle w:val="Compact"/>
-        <w:numPr>
-          <w:ilvl w:val="0"/>
-          <w:numId w:val="1019"/>
-        </w:numPr>
-      </w:pPr>
-      <w:r>
-        <w:t xml:space="preserve">ISSN: 2675-1895.</w:t>
-      </w:r>
-    </w:p>
-    <w:p>
-      <w:pPr>
-        <w:pStyle w:val="Compact"/>
-        <w:numPr>
-          <w:ilvl w:val="0"/>
-          <w:numId w:val="1019"/>
-        </w:numPr>
-      </w:pPr>
-      <w:r>
-        <w:t xml:space="preserve">e-ISSN: 2675-1860.</w:t>
-      </w:r>
-    </w:p>
-    <w:p>
-      <w:pPr>
-        <w:pStyle w:val="Compact"/>
-        <w:numPr>
-          <w:ilvl w:val="0"/>
-          <w:numId w:val="1019"/>
         </w:numPr>
       </w:pPr>
       <w:r>
@@ -5656,9 +5612,6 @@
     <w:abstractNumId w:val="991"/>
   </w:num>
   <w:num w:numId="1018">
-    <w:abstractNumId w:val="991"/>
-  </w:num>
-  <w:num w:numId="1019">
     <w:abstractNumId w:val="991"/>
   </w:num>
 </w:numbering>

</xml_diff>

<commit_message>
Adiciona seção de legislação na home da ONASP
</commit_message>
<xml_diff>
--- a/Documentação/estrutura_completa_pagina_onasp_para_dicom.docx
+++ b/Documentação/estrutura_completa_pagina_onasp_para_dicom.docx
@@ -2,7 +2,7 @@
 <file path=word/document.xml><?xml version="1.0" encoding="utf-8"?>
 <w:document xmlns:w="http://schemas.openxmlformats.org/wordprocessingml/2006/main" xmlns:m="http://schemas.openxmlformats.org/officeDocument/2006/math" xmlns:r="http://schemas.openxmlformats.org/officeDocument/2006/relationships" xmlns:o="urn:schemas-microsoft-com:office:office" xmlns:v="urn:schemas-microsoft-com:vml" xmlns:w10="urn:schemas-microsoft-com:office:word" xmlns:a="http://schemas.openxmlformats.org/drawingml/2006/main" xmlns:pic="http://schemas.openxmlformats.org/drawingml/2006/picture" xmlns:wp="http://schemas.openxmlformats.org/drawingml/2006/wordprocessingDrawing">
   <w:body>
-    <w:bookmarkStart w:id="27" w:name="X651419ee04b722d3d77fb0d3ef8f3cab38d582a"/>
+    <w:bookmarkStart w:id="28" w:name="X651419ee04b722d3d77fb0d3ef8f3cab38d582a"/>
     <w:p>
       <w:pPr>
         <w:pStyle w:val="Heading1"/>
@@ -53,7 +53,7 @@
       </w:r>
     </w:p>
     <w:bookmarkEnd w:id="9"/>
-    <w:bookmarkStart w:id="20" w:name="Xbfa4aa77b994200a22daf31aefaeaa021a9038a"/>
+    <w:bookmarkStart w:id="21" w:name="Xbfa4aa77b994200a22daf31aefaeaa021a9038a"/>
     <w:p>
       <w:pPr>
         <w:pStyle w:val="Heading2"/>
@@ -1174,14 +1174,13 @@
       </w:r>
     </w:p>
     <w:bookmarkEnd w:id="19"/>
-    <w:bookmarkEnd w:id="20"/>
-    <w:bookmarkStart w:id="21" w:name="subpágina-1---rede-de-ouvidorias"/>
-    <w:p>
-      <w:pPr>
-        <w:pStyle w:val="Heading2"/>
-      </w:pPr>
-      <w:r>
-        <w:t xml:space="preserve">Subpágina 1 - Rede de Ouvidorias</w:t>
+    <w:bookmarkStart w:id="20" w:name="bloco-11---legislação"/>
+    <w:p>
+      <w:pPr>
+        <w:pStyle w:val="Heading3"/>
+      </w:pPr>
+      <w:r>
+        <w:t xml:space="preserve">Bloco 11 - Legislação</w:t>
       </w:r>
     </w:p>
     <w:p>
@@ -1189,151 +1188,39 @@
         <w:pStyle w:val="FirstParagraph"/>
       </w:pPr>
       <w:r>
-        <w:t xml:space="preserve">Título da página:</w:t>
-      </w:r>
-    </w:p>
-    <w:p>
-      <w:pPr>
-        <w:pStyle w:val="BodyText"/>
-      </w:pPr>
-      <w:r>
-        <w:t xml:space="preserve">Rede de Ouvidorias</w:t>
-      </w:r>
-    </w:p>
-    <w:p>
-      <w:pPr>
-        <w:pStyle w:val="BodyText"/>
-      </w:pPr>
-      <w:r>
-        <w:t xml:space="preserve">Imagem de destaque:</w:t>
-      </w:r>
-    </w:p>
-    <w:p>
-      <w:pPr>
-        <w:pStyle w:val="BodyText"/>
-      </w:pPr>
-      <w:r>
-        <w:t xml:space="preserve">Documentação/Botao_Renospen.png</w:t>
-      </w:r>
-    </w:p>
-    <w:p>
-      <w:pPr>
-        <w:pStyle w:val="BodyText"/>
-      </w:pPr>
-      <w:r>
-        <w:t xml:space="preserve">Texto alternativo sugerido:</w:t>
-      </w:r>
-    </w:p>
-    <w:p>
-      <w:pPr>
-        <w:pStyle w:val="BodyText"/>
-      </w:pPr>
-      <w:r>
-        <w:t xml:space="preserve">Botão institucional da Rede de Ouvidorias.</w:t>
-      </w:r>
-    </w:p>
-    <w:p>
-      <w:pPr>
-        <w:pStyle w:val="BodyText"/>
-      </w:pPr>
-      <w:r>
-        <w:t xml:space="preserve">Identificador editorial:</w:t>
-      </w:r>
-    </w:p>
-    <w:p>
-      <w:pPr>
-        <w:pStyle w:val="BodyText"/>
-      </w:pPr>
-      <w:r>
-        <w:t xml:space="preserve">Conteúdo Técnico e Projetos Estruturantes</w:t>
-      </w:r>
-    </w:p>
-    <w:p>
-      <w:pPr>
-        <w:pStyle w:val="BodyText"/>
-      </w:pPr>
-      <w:r>
-        <w:t xml:space="preserve">Texto de destaque:</w:t>
-      </w:r>
-    </w:p>
-    <w:p>
-      <w:pPr>
-        <w:pStyle w:val="BodyText"/>
-      </w:pPr>
-      <w:r>
-        <w:t xml:space="preserve">Iniciativa do Plano Pena Justa voltada à cooperação federativa, à harmonização de procedimentos e ao fortalecimento da proteção de direitos no âmbito das Ouvidorias de Serviços Penais.</w:t>
-      </w:r>
-    </w:p>
-    <w:p>
-      <w:pPr>
-        <w:pStyle w:val="BodyText"/>
-      </w:pPr>
-      <w:r>
-        <w:t xml:space="preserve">Seção:</w:t>
-      </w:r>
-    </w:p>
-    <w:p>
-      <w:pPr>
-        <w:pStyle w:val="BodyText"/>
-      </w:pPr>
-      <w:r>
-        <w:t xml:space="preserve">Renospen</w:t>
-      </w:r>
-    </w:p>
-    <w:p>
-      <w:pPr>
-        <w:pStyle w:val="BodyText"/>
-      </w:pPr>
-      <w:r>
-        <w:t xml:space="preserve">Texto para colar:</w:t>
-      </w:r>
-    </w:p>
-    <w:p>
-      <w:pPr>
-        <w:pStyle w:val="BodyText"/>
-      </w:pPr>
-      <w:r>
-        <w:t xml:space="preserve">A Rede de Ouvidorias visa manter a articulação entre as unidades responsáveis pela escuta institucional no sistema penal, com o objetivo de fortalecer a cooperação federativa, qualificar o atendimento ao cidadão e ampliar a proteção de direitos em âmbito nacional.</w:t>
-      </w:r>
-    </w:p>
-    <w:p>
-      <w:pPr>
-        <w:pStyle w:val="BodyText"/>
-      </w:pPr>
-      <w:r>
-        <w:t xml:space="preserve">A segunda linha do escopo:</w:t>
-      </w:r>
-    </w:p>
-    <w:p>
-      <w:pPr>
-        <w:pStyle w:val="BodyText"/>
-      </w:pPr>
-      <w:r>
-        <w:t xml:space="preserve">No contexto da Ouvidoria Nacional de Serviços Penais, esta subpágina reúne referências públicas da iniciativa, favorecendo o intercâmbio de práticas, a harmonização de procedimentos e a consolidação de parâmetros voltados à transparência e ao controle social.</w:t>
-      </w:r>
-    </w:p>
-    <w:p>
-      <w:pPr>
-        <w:pStyle w:val="BodyText"/>
-      </w:pPr>
-      <w:r>
-        <w:t xml:space="preserve">Seção:</w:t>
-      </w:r>
-    </w:p>
-    <w:p>
-      <w:pPr>
-        <w:pStyle w:val="BodyText"/>
-      </w:pPr>
-      <w:r>
-        <w:t xml:space="preserve">Objetivos da Rede</w:t>
-      </w:r>
-    </w:p>
-    <w:p>
-      <w:pPr>
-        <w:pStyle w:val="BodyText"/>
-      </w:pPr>
-      <w:r>
-        <w:t xml:space="preserve">Itens para colar:</w:t>
+        <w:t xml:space="preserve">Título da seção:</w:t>
+      </w:r>
+    </w:p>
+    <w:p>
+      <w:pPr>
+        <w:pStyle w:val="BodyText"/>
+      </w:pPr>
+      <w:r>
+        <w:t xml:space="preserve">Legislação</w:t>
+      </w:r>
+    </w:p>
+    <w:p>
+      <w:pPr>
+        <w:pStyle w:val="BodyText"/>
+      </w:pPr>
+      <w:r>
+        <w:t xml:space="preserve">Texto introdutório sugerido:</w:t>
+      </w:r>
+    </w:p>
+    <w:p>
+      <w:pPr>
+        <w:pStyle w:val="BodyText"/>
+      </w:pPr>
+      <w:r>
+        <w:t xml:space="preserve">Os normativos basilares abaixo reúnem referências atualmente disponíveis no pacote documental da Ouvidoria e podem ser publicados como links simples na homepage, abaixo do painel de tratamento de demandas.</w:t>
+      </w:r>
+    </w:p>
+    <w:p>
+      <w:pPr>
+        <w:pStyle w:val="BodyText"/>
+      </w:pPr>
+      <w:r>
+        <w:t xml:space="preserve">Links a publicar:</w:t>
       </w:r>
     </w:p>
     <w:p>
@@ -1345,7 +1232,13 @@
         </w:numPr>
       </w:pPr>
       <w:r>
-        <w:t xml:space="preserve">Atuar como espaço de difusão de referências técnicas úteis às ouvidorias de serviços penais.</w:t>
+        <w:t xml:space="preserve">Lei nº 13.460, de 26 de junho de 2017: Documentação/Normativas Basilares de Ouvidoria/LEI N°13.460.2017.pdf</w:t>
+      </w:r>
+      <w:r>
+        <w:t xml:space="preserve"> </w:t>
+      </w:r>
+      <w:r>
+        <w:t xml:space="preserve">Descrição: Dispõe sobre participação, proteção e defesa dos direitos do usuário dos serviços públicos da administração pública.</w:t>
       </w:r>
     </w:p>
     <w:p>
@@ -1357,7 +1250,13 @@
         </w:numPr>
       </w:pPr>
       <w:r>
-        <w:t xml:space="preserve">Fomentar o compartilhamento de práticas, fluxos e instrumentos voltados ao atendimento e ao encaminhamento de manifestações.</w:t>
+        <w:t xml:space="preserve">Decreto nº 9.492, de 5 de setembro de 2018: Documentação/Normativas Basilares de Ouvidoria/Decreto N°9.492.2018.pdf</w:t>
+      </w:r>
+      <w:r>
+        <w:t xml:space="preserve"> </w:t>
+      </w:r>
+      <w:r>
+        <w:t xml:space="preserve">Descrição: Regulamenta a Lei nº 13.460, de 26 de junho de 2017, institui o Sistema de Ouvidoria do Poder Executivo federal e altera o Decreto nº 8.910, de 22 de novembro de 2016.</w:t>
       </w:r>
     </w:p>
     <w:p>
@@ -1369,7 +1268,13 @@
         </w:numPr>
       </w:pPr>
       <w:r>
-        <w:t xml:space="preserve">Estimular a cooperação entre a União, os Estados e o Distrito Federal para o aprimoramento da atuação institucional.</w:t>
+        <w:t xml:space="preserve">Decreto nº 10.153, de 3 de dezembro de 2019: Documentação/Normativas Basilares de Ouvidoria/Decreto N°10.153.2019.pdf</w:t>
+      </w:r>
+      <w:r>
+        <w:t xml:space="preserve"> </w:t>
+      </w:r>
+      <w:r>
+        <w:t xml:space="preserve">Descrição: Dispõe sobre as salvaguardas de proteção à identidade dos denunciantes de ilícitos e de irregularidades praticados contra a administração pública federal direta e indireta.</w:t>
       </w:r>
     </w:p>
     <w:p>
@@ -1381,7 +1286,60 @@
         </w:numPr>
       </w:pPr>
       <w:r>
-        <w:t xml:space="preserve">Fortalecer a participação social, a transparência pública e a proteção de direitos no sistema penal.</w:t>
+        <w:t xml:space="preserve">Portaria Normativa CGU nº 116, de 18 de março de 2024: Documentação/Normativas Basilares de Ouvidoria/Portaria Normativa CGU - N°116.2024.pdf</w:t>
+      </w:r>
+      <w:r>
+        <w:t xml:space="preserve"> </w:t>
+      </w:r>
+      <w:r>
+        <w:t xml:space="preserve">Descrição: Estabelece orientações para o exercício das competências das unidades do Sistema de Ouvidoria do Poder Executivo Federal, instituído pelo Decreto nº 9.492, de 5 de setembro de 2018, no âmbito do Poder Executivo federal, e dá outras providências.</w:t>
+      </w:r>
+    </w:p>
+    <w:p>
+      <w:pPr>
+        <w:pStyle w:val="Compact"/>
+        <w:numPr>
+          <w:ilvl w:val="0"/>
+          <w:numId w:val="1005"/>
+        </w:numPr>
+      </w:pPr>
+      <w:r>
+        <w:t xml:space="preserve">Lei nº 12.527, de 18 de novembro de 2011: Documentação/Normativas Basilares de Ouvidoria/LEI N°12.527.2011.pdf</w:t>
+      </w:r>
+      <w:r>
+        <w:t xml:space="preserve"> </w:t>
+      </w:r>
+      <w:r>
+        <w:t xml:space="preserve">Descrição: Regula o acesso a informações previsto no inciso XXXIII do art. 5º, no inciso II do § 3º do art. 37 e no § 2º do art. 216 da Constituição Federal.</w:t>
+      </w:r>
+    </w:p>
+    <w:p>
+      <w:pPr>
+        <w:pStyle w:val="Compact"/>
+        <w:numPr>
+          <w:ilvl w:val="0"/>
+          <w:numId w:val="1005"/>
+        </w:numPr>
+      </w:pPr>
+      <w:r>
+        <w:t xml:space="preserve">Lei nº 13.709, de 14 de agosto de 2018: Documentação/Normativas Basilares de Ouvidoria/LEI N°13.709.2018.pdf</w:t>
+      </w:r>
+      <w:r>
+        <w:t xml:space="preserve"> </w:t>
+      </w:r>
+      <w:r>
+        <w:t xml:space="preserve">Descrição: Dispõe sobre a proteção de dados pessoais e altera a Lei nº 12.965, de 23 de abril de 2014 (Marco Civil da Internet).</w:t>
+      </w:r>
+    </w:p>
+    <w:bookmarkEnd w:id="20"/>
+    <w:bookmarkEnd w:id="21"/>
+    <w:bookmarkStart w:id="22" w:name="subpágina-1---rede-de-ouvidorias"/>
+    <w:p>
+      <w:pPr>
+        <w:pStyle w:val="Heading2"/>
+      </w:pPr>
+      <w:r>
+        <w:t xml:space="preserve">Subpágina 1 - Rede de Ouvidorias</w:t>
       </w:r>
     </w:p>
     <w:p>
@@ -1389,6 +1347,86 @@
         <w:pStyle w:val="FirstParagraph"/>
       </w:pPr>
       <w:r>
+        <w:t xml:space="preserve">Título da página:</w:t>
+      </w:r>
+    </w:p>
+    <w:p>
+      <w:pPr>
+        <w:pStyle w:val="BodyText"/>
+      </w:pPr>
+      <w:r>
+        <w:t xml:space="preserve">Rede de Ouvidorias</w:t>
+      </w:r>
+    </w:p>
+    <w:p>
+      <w:pPr>
+        <w:pStyle w:val="BodyText"/>
+      </w:pPr>
+      <w:r>
+        <w:t xml:space="preserve">Imagem de destaque:</w:t>
+      </w:r>
+    </w:p>
+    <w:p>
+      <w:pPr>
+        <w:pStyle w:val="BodyText"/>
+      </w:pPr>
+      <w:r>
+        <w:t xml:space="preserve">Documentação/Botao_Renospen.png</w:t>
+      </w:r>
+    </w:p>
+    <w:p>
+      <w:pPr>
+        <w:pStyle w:val="BodyText"/>
+      </w:pPr>
+      <w:r>
+        <w:t xml:space="preserve">Texto alternativo sugerido:</w:t>
+      </w:r>
+    </w:p>
+    <w:p>
+      <w:pPr>
+        <w:pStyle w:val="BodyText"/>
+      </w:pPr>
+      <w:r>
+        <w:t xml:space="preserve">Botão institucional da Rede de Ouvidorias.</w:t>
+      </w:r>
+    </w:p>
+    <w:p>
+      <w:pPr>
+        <w:pStyle w:val="BodyText"/>
+      </w:pPr>
+      <w:r>
+        <w:t xml:space="preserve">Identificador editorial:</w:t>
+      </w:r>
+    </w:p>
+    <w:p>
+      <w:pPr>
+        <w:pStyle w:val="BodyText"/>
+      </w:pPr>
+      <w:r>
+        <w:t xml:space="preserve">Conteúdo Técnico e Projetos Estruturantes</w:t>
+      </w:r>
+    </w:p>
+    <w:p>
+      <w:pPr>
+        <w:pStyle w:val="BodyText"/>
+      </w:pPr>
+      <w:r>
+        <w:t xml:space="preserve">Texto de destaque:</w:t>
+      </w:r>
+    </w:p>
+    <w:p>
+      <w:pPr>
+        <w:pStyle w:val="BodyText"/>
+      </w:pPr>
+      <w:r>
+        <w:t xml:space="preserve">Iniciativa do Plano Pena Justa voltada à cooperação federativa, à harmonização de procedimentos e ao fortalecimento da proteção de direitos no âmbito das Ouvidorias de Serviços Penais.</w:t>
+      </w:r>
+    </w:p>
+    <w:p>
+      <w:pPr>
+        <w:pStyle w:val="BodyText"/>
+      </w:pPr>
+      <w:r>
         <w:t xml:space="preserve">Seção:</w:t>
       </w:r>
     </w:p>
@@ -1397,7 +1435,7 @@
         <w:pStyle w:val="BodyText"/>
       </w:pPr>
       <w:r>
-        <w:t xml:space="preserve">Governança e cooperação técnica</w:t>
+        <w:t xml:space="preserve">Renospen</w:t>
       </w:r>
     </w:p>
     <w:p>
@@ -1413,15 +1451,23 @@
         <w:pStyle w:val="BodyText"/>
       </w:pPr>
       <w:r>
-        <w:t xml:space="preserve">No recorte da ONASP, a Rede de Ouvidorias pode ser apresentada como espaço permanente de articulação entre unidades responsáveis pela escuta institucional, com foco em difusão de referências técnicas, intercâmbio de práticas e aperfeiçoamento contínuo da atuação no sistema penal.</w:t>
-      </w:r>
-    </w:p>
-    <w:p>
-      <w:pPr>
-        <w:pStyle w:val="BodyText"/>
-      </w:pPr>
-      <w:r>
-        <w:t xml:space="preserve">Esse arranjo é reforçado por instrumentos que definem parâmetros mínimos para a estruturação das ouvidorias e institucionalizam a Renospen como instância de cooperação técnica, integração federativa e fortalecimento institucional.</w:t>
+        <w:t xml:space="preserve">A Rede de Ouvidorias visa manter a articulação entre as unidades responsáveis pela escuta institucional no sistema penal, com o objetivo de fortalecer a cooperação federativa, qualificar o atendimento ao cidadão e ampliar a proteção de direitos em âmbito nacional.</w:t>
+      </w:r>
+    </w:p>
+    <w:p>
+      <w:pPr>
+        <w:pStyle w:val="BodyText"/>
+      </w:pPr>
+      <w:r>
+        <w:t xml:space="preserve">A segunda linha do escopo:</w:t>
+      </w:r>
+    </w:p>
+    <w:p>
+      <w:pPr>
+        <w:pStyle w:val="BodyText"/>
+      </w:pPr>
+      <w:r>
+        <w:t xml:space="preserve">No contexto da Ouvidoria Nacional de Serviços Penais, esta subpágina reúne referências públicas da iniciativa, favorecendo o intercâmbio de práticas, a harmonização de procedimentos e a consolidação de parâmetros voltados à transparência e ao controle social.</w:t>
       </w:r>
     </w:p>
     <w:p>
@@ -1431,141 +1477,21 @@
       <w:r>
         <w:t xml:space="preserve">Seção:</w:t>
       </w:r>
-      <w:r>
-        <w:t xml:space="preserve"> </w:t>
-      </w:r>
-      <w:r>
-        <w:t xml:space="preserve">Mapa interativo e destaque por UF</w:t>
-      </w:r>
-    </w:p>
-    <w:p>
-      <w:pPr>
-        <w:pStyle w:val="BodyText"/>
-      </w:pPr>
-      <w:r>
-        <w:t xml:space="preserve">Texto para colar:</w:t>
-      </w:r>
-    </w:p>
-    <w:p>
-      <w:pPr>
-        <w:pStyle w:val="BodyText"/>
-      </w:pPr>
-      <w:r>
-        <w:t xml:space="preserve">Esta prévia reúne, em um único ponto, os contatos institucionais consolidados das unidades da federação. No ambiente de validação local, a consulta foi organizada por meio de um mapa visual com seleção por UF e painel lateral com dados resumidos da ouvidoria correspondente ou, quando cabível, das referências institucionais associadas à mesma unidade da federação.</w:t>
-      </w:r>
-    </w:p>
-    <w:p>
-      <w:pPr>
-        <w:pStyle w:val="BodyText"/>
-      </w:pPr>
-      <w:r>
-        <w:t xml:space="preserve">Orientação para publicação oficial:</w:t>
-      </w:r>
-    </w:p>
-    <w:p>
-      <w:pPr>
-        <w:pStyle w:val="BodyText"/>
-      </w:pPr>
-      <w:r>
-        <w:t xml:space="preserve">No ambiente gov.br, recomenda-se tratar o mapa interativo apenas como referência visual da prévia. A solução mais segura para publicação é manter um seletor simples por UF, um bloco expansível por estado ou, preferencialmente, o quadro textual de contatos apresentado abaixo, sem depender de JavaScript customizado.</w:t>
-      </w:r>
-    </w:p>
-    <w:p>
-      <w:pPr>
-        <w:pStyle w:val="BodyText"/>
-      </w:pPr>
-      <w:r>
-        <w:t xml:space="preserve">Quando a mesma UF tiver mais de uma referência institucional relevante, como ocorre no Espírito Santo, recomenda-se separar as informações em blocos independentes dentro do quadro lateral ou em linhas distintas no quadro textual, evitando misturar órgãos, responsáveis, telefones e endereços em uma única ficha.</w:t>
-      </w:r>
-    </w:p>
-    <w:p>
-      <w:pPr>
-        <w:pStyle w:val="BodyText"/>
-      </w:pPr>
-      <w:r>
-        <w:t xml:space="preserve">Regra editorial obrigatória:</w:t>
-      </w:r>
-    </w:p>
-    <w:p>
-      <w:pPr>
-        <w:pStyle w:val="BodyText"/>
-      </w:pPr>
-      <w:r>
-        <w:t xml:space="preserve">Detalhes de curadoria usados para consolidar os contatos devem permanecer apenas na documentação interna de trabalho. Não publicar na página expressões como</w:t>
-      </w:r>
-      <w:r>
-        <w:t xml:space="preserve"> </w:t>
-      </w:r>
-      <w:r>
-        <w:t xml:space="preserve">“o diagnóstico registrou”</w:t>
-      </w:r>
-      <w:r>
-        <w:t xml:space="preserve">,</w:t>
-      </w:r>
-      <w:r>
-        <w:t xml:space="preserve"> </w:t>
-      </w:r>
-      <w:r>
-        <w:t xml:space="preserve">“a resposta do diagnóstico informa”</w:t>
-      </w:r>
-      <w:r>
-        <w:t xml:space="preserve">, menções a respostas recebidas, observações internas de validação ou listas nominais de servidores designados.</w:t>
-      </w:r>
-    </w:p>
-    <w:p>
-      <w:pPr>
-        <w:pStyle w:val="BodyText"/>
-      </w:pPr>
-      <w:r>
-        <w:t xml:space="preserve">Base interna de consolidação (não publicar na página):</w:t>
-      </w:r>
-    </w:p>
-    <w:p>
-      <w:pPr>
-        <w:pStyle w:val="BodyText"/>
-      </w:pPr>
-      <w:r>
-        <w:t xml:space="preserve">Diagnóstico de Ouvidorias Estaduais, consolidado pela ONASP a partir das respostas recebidas em 2026.</w:t>
-      </w:r>
-    </w:p>
-    <w:p>
-      <w:pPr>
-        <w:pStyle w:val="BodyText"/>
-      </w:pPr>
-      <w:r>
-        <w:t xml:space="preserve">Seção:</w:t>
-      </w:r>
-    </w:p>
-    <w:p>
-      <w:pPr>
-        <w:pStyle w:val="BodyText"/>
-      </w:pPr>
-      <w:r>
-        <w:t xml:space="preserve">VI Encontro Nacional das Ouvidorias do Sistema Penal</w:t>
-      </w:r>
-    </w:p>
-    <w:p>
-      <w:pPr>
-        <w:pStyle w:val="BodyText"/>
-      </w:pPr>
-      <w:r>
-        <w:t xml:space="preserve">Texto para colar:</w:t>
-      </w:r>
-    </w:p>
-    <w:p>
-      <w:pPr>
-        <w:pStyle w:val="BodyText"/>
-      </w:pPr>
-      <w:r>
-        <w:t xml:space="preserve">O VI Encontro Nacional das Ouvidorias do Sistema Penal, promovido pela Senappen entre 8 e 10 de abril, consolidou um novo marco para a gestão penitenciária com o lançamento da Rede Nacional de Ouvidorias de Serviços Penais (Renospen) e a publicação de uma Instrução Normativa para padronizar essas instâncias nos estados. Alinhado ao Plano Nacional Pena Justa, o evento focou no fortalecimento da transparência, do controle social e da promoção de direitos humanos, unificando diretrizes nacionais enquanto respeita as autonomias locais. Além dos painéis sobre gestão estratégica e escuta ética, a iniciativa contemplou a doação de equipamentos tecnológicos para todas as unidades federativas, visando modernizar o atendimento e estreitar a comunicação entre o sistema penal e a sociedade brasileira.</w:t>
-      </w:r>
-    </w:p>
-    <w:p>
-      <w:pPr>
-        <w:pStyle w:val="BodyText"/>
-      </w:pPr>
-      <w:r>
-        <w:t xml:space="preserve">Imagens a inserir:</w:t>
+    </w:p>
+    <w:p>
+      <w:pPr>
+        <w:pStyle w:val="BodyText"/>
+      </w:pPr>
+      <w:r>
+        <w:t xml:space="preserve">Objetivos da Rede</w:t>
+      </w:r>
+    </w:p>
+    <w:p>
+      <w:pPr>
+        <w:pStyle w:val="BodyText"/>
+      </w:pPr>
+      <w:r>
+        <w:t xml:space="preserve">Itens para colar:</w:t>
       </w:r>
     </w:p>
     <w:p>
@@ -1577,7 +1503,7 @@
         </w:numPr>
       </w:pPr>
       <w:r>
-        <w:t xml:space="preserve">Documentação/Banner_Renospen_1.jpeg</w:t>
+        <w:t xml:space="preserve">Atuar como espaço de difusão de referências técnicas úteis às ouvidorias de serviços penais.</w:t>
       </w:r>
     </w:p>
     <w:p>
@@ -1589,7 +1515,7 @@
         </w:numPr>
       </w:pPr>
       <w:r>
-        <w:t xml:space="preserve">Documentação/Banner_Renospen_2.jpeg</w:t>
+        <w:t xml:space="preserve">Fomentar o compartilhamento de práticas, fluxos e instrumentos voltados ao atendimento e ao encaminhamento de manifestações.</w:t>
       </w:r>
     </w:p>
     <w:p>
@@ -1601,7 +1527,19 @@
         </w:numPr>
       </w:pPr>
       <w:r>
-        <w:t xml:space="preserve">Documentação/Banner_Renospen_3.jpeg</w:t>
+        <w:t xml:space="preserve">Estimular a cooperação entre a União, os Estados e o Distrito Federal para o aprimoramento da atuação institucional.</w:t>
+      </w:r>
+    </w:p>
+    <w:p>
+      <w:pPr>
+        <w:pStyle w:val="Compact"/>
+        <w:numPr>
+          <w:ilvl w:val="0"/>
+          <w:numId w:val="1006"/>
+        </w:numPr>
+      </w:pPr>
+      <w:r>
+        <w:t xml:space="preserve">Fortalecer a participação social, a transparência pública e a proteção de direitos no sistema penal.</w:t>
       </w:r>
     </w:p>
     <w:p>
@@ -1609,7 +1547,183 @@
         <w:pStyle w:val="FirstParagraph"/>
       </w:pPr>
       <w:r>
-        <w:t xml:space="preserve">Ordem e destaque sugeridos:</w:t>
+        <w:t xml:space="preserve">Seção:</w:t>
+      </w:r>
+    </w:p>
+    <w:p>
+      <w:pPr>
+        <w:pStyle w:val="BodyText"/>
+      </w:pPr>
+      <w:r>
+        <w:t xml:space="preserve">Governança e cooperação técnica</w:t>
+      </w:r>
+    </w:p>
+    <w:p>
+      <w:pPr>
+        <w:pStyle w:val="BodyText"/>
+      </w:pPr>
+      <w:r>
+        <w:t xml:space="preserve">Texto para colar:</w:t>
+      </w:r>
+    </w:p>
+    <w:p>
+      <w:pPr>
+        <w:pStyle w:val="BodyText"/>
+      </w:pPr>
+      <w:r>
+        <w:t xml:space="preserve">No recorte da ONASP, a Rede de Ouvidorias pode ser apresentada como espaço permanente de articulação entre unidades responsáveis pela escuta institucional, com foco em difusão de referências técnicas, intercâmbio de práticas e aperfeiçoamento contínuo da atuação no sistema penal.</w:t>
+      </w:r>
+    </w:p>
+    <w:p>
+      <w:pPr>
+        <w:pStyle w:val="BodyText"/>
+      </w:pPr>
+      <w:r>
+        <w:t xml:space="preserve">Esse arranjo é reforçado por instrumentos que definem parâmetros mínimos para a estruturação das ouvidorias e institucionalizam a Renospen como instância de cooperação técnica, integração federativa e fortalecimento institucional.</w:t>
+      </w:r>
+    </w:p>
+    <w:p>
+      <w:pPr>
+        <w:pStyle w:val="BodyText"/>
+      </w:pPr>
+      <w:r>
+        <w:t xml:space="preserve">Seção:</w:t>
+      </w:r>
+      <w:r>
+        <w:t xml:space="preserve"> </w:t>
+      </w:r>
+      <w:r>
+        <w:t xml:space="preserve">Mapa interativo e destaque por UF</w:t>
+      </w:r>
+    </w:p>
+    <w:p>
+      <w:pPr>
+        <w:pStyle w:val="BodyText"/>
+      </w:pPr>
+      <w:r>
+        <w:t xml:space="preserve">Texto para colar:</w:t>
+      </w:r>
+    </w:p>
+    <w:p>
+      <w:pPr>
+        <w:pStyle w:val="BodyText"/>
+      </w:pPr>
+      <w:r>
+        <w:t xml:space="preserve">Esta prévia reúne, em um único ponto, os contatos institucionais consolidados das unidades da federação. No ambiente de validação local, a consulta foi organizada por meio de um mapa visual com seleção por UF e painel lateral com dados resumidos da ouvidoria correspondente ou, quando cabível, das referências institucionais associadas à mesma unidade da federação.</w:t>
+      </w:r>
+    </w:p>
+    <w:p>
+      <w:pPr>
+        <w:pStyle w:val="BodyText"/>
+      </w:pPr>
+      <w:r>
+        <w:t xml:space="preserve">Orientação para publicação oficial:</w:t>
+      </w:r>
+    </w:p>
+    <w:p>
+      <w:pPr>
+        <w:pStyle w:val="BodyText"/>
+      </w:pPr>
+      <w:r>
+        <w:t xml:space="preserve">No ambiente gov.br, recomenda-se tratar o mapa interativo apenas como referência visual da prévia. A solução mais segura para publicação é manter um seletor simples por UF, um bloco expansível por estado ou, preferencialmente, o quadro textual de contatos apresentado abaixo, sem depender de JavaScript customizado.</w:t>
+      </w:r>
+    </w:p>
+    <w:p>
+      <w:pPr>
+        <w:pStyle w:val="BodyText"/>
+      </w:pPr>
+      <w:r>
+        <w:t xml:space="preserve">Quando a mesma UF tiver mais de uma referência institucional relevante, como ocorre no Espírito Santo, recomenda-se separar as informações em blocos independentes dentro do quadro lateral ou em linhas distintas no quadro textual, evitando misturar órgãos, responsáveis, telefones e endereços em uma única ficha.</w:t>
+      </w:r>
+    </w:p>
+    <w:p>
+      <w:pPr>
+        <w:pStyle w:val="BodyText"/>
+      </w:pPr>
+      <w:r>
+        <w:t xml:space="preserve">Regra editorial obrigatória:</w:t>
+      </w:r>
+    </w:p>
+    <w:p>
+      <w:pPr>
+        <w:pStyle w:val="BodyText"/>
+      </w:pPr>
+      <w:r>
+        <w:t xml:space="preserve">Detalhes de curadoria usados para consolidar os contatos devem permanecer apenas na documentação interna de trabalho. Não publicar na página expressões como</w:t>
+      </w:r>
+      <w:r>
+        <w:t xml:space="preserve"> </w:t>
+      </w:r>
+      <w:r>
+        <w:t xml:space="preserve">“o diagnóstico registrou”</w:t>
+      </w:r>
+      <w:r>
+        <w:t xml:space="preserve">,</w:t>
+      </w:r>
+      <w:r>
+        <w:t xml:space="preserve"> </w:t>
+      </w:r>
+      <w:r>
+        <w:t xml:space="preserve">“a resposta do diagnóstico informa”</w:t>
+      </w:r>
+      <w:r>
+        <w:t xml:space="preserve">, menções a respostas recebidas, observações internas de validação ou listas nominais de servidores designados.</w:t>
+      </w:r>
+    </w:p>
+    <w:p>
+      <w:pPr>
+        <w:pStyle w:val="BodyText"/>
+      </w:pPr>
+      <w:r>
+        <w:t xml:space="preserve">Base interna de consolidação (não publicar na página):</w:t>
+      </w:r>
+    </w:p>
+    <w:p>
+      <w:pPr>
+        <w:pStyle w:val="BodyText"/>
+      </w:pPr>
+      <w:r>
+        <w:t xml:space="preserve">Diagnóstico de Ouvidorias Estaduais, consolidado pela ONASP a partir das respostas recebidas em 2026.</w:t>
+      </w:r>
+    </w:p>
+    <w:p>
+      <w:pPr>
+        <w:pStyle w:val="BodyText"/>
+      </w:pPr>
+      <w:r>
+        <w:t xml:space="preserve">Seção:</w:t>
+      </w:r>
+    </w:p>
+    <w:p>
+      <w:pPr>
+        <w:pStyle w:val="BodyText"/>
+      </w:pPr>
+      <w:r>
+        <w:t xml:space="preserve">VI Encontro Nacional das Ouvidorias do Sistema Penal</w:t>
+      </w:r>
+    </w:p>
+    <w:p>
+      <w:pPr>
+        <w:pStyle w:val="BodyText"/>
+      </w:pPr>
+      <w:r>
+        <w:t xml:space="preserve">Texto para colar:</w:t>
+      </w:r>
+    </w:p>
+    <w:p>
+      <w:pPr>
+        <w:pStyle w:val="BodyText"/>
+      </w:pPr>
+      <w:r>
+        <w:t xml:space="preserve">O VI Encontro Nacional das Ouvidorias do Sistema Penal, promovido pela Senappen entre 8 e 10 de abril, consolidou um novo marco para a gestão penitenciária com o lançamento da Rede Nacional de Ouvidorias de Serviços Penais (Renospen) e a publicação de uma Instrução Normativa para padronizar essas instâncias nos estados. Alinhado ao Plano Nacional Pena Justa, o evento focou no fortalecimento da transparência, do controle social e da promoção de direitos humanos, unificando diretrizes nacionais enquanto respeita as autonomias locais. Além dos painéis sobre gestão estratégica e escuta ética, a iniciativa contemplou a doação de equipamentos tecnológicos para todas as unidades federativas, visando modernizar o atendimento e estreitar a comunicação entre o sistema penal e a sociedade brasileira.</w:t>
+      </w:r>
+    </w:p>
+    <w:p>
+      <w:pPr>
+        <w:pStyle w:val="BodyText"/>
+      </w:pPr>
+      <w:r>
+        <w:t xml:space="preserve">Imagens a inserir:</w:t>
       </w:r>
     </w:p>
     <w:p>
@@ -1621,6 +1735,50 @@
         </w:numPr>
       </w:pPr>
       <w:r>
+        <w:t xml:space="preserve">Documentação/Banner_Renospen_1.jpeg</w:t>
+      </w:r>
+    </w:p>
+    <w:p>
+      <w:pPr>
+        <w:pStyle w:val="Compact"/>
+        <w:numPr>
+          <w:ilvl w:val="0"/>
+          <w:numId w:val="1007"/>
+        </w:numPr>
+      </w:pPr>
+      <w:r>
+        <w:t xml:space="preserve">Documentação/Banner_Renospen_2.jpeg</w:t>
+      </w:r>
+    </w:p>
+    <w:p>
+      <w:pPr>
+        <w:pStyle w:val="Compact"/>
+        <w:numPr>
+          <w:ilvl w:val="0"/>
+          <w:numId w:val="1007"/>
+        </w:numPr>
+      </w:pPr>
+      <w:r>
+        <w:t xml:space="preserve">Documentação/Banner_Renospen_3.jpeg</w:t>
+      </w:r>
+    </w:p>
+    <w:p>
+      <w:pPr>
+        <w:pStyle w:val="FirstParagraph"/>
+      </w:pPr>
+      <w:r>
+        <w:t xml:space="preserve">Ordem e destaque sugeridos:</w:t>
+      </w:r>
+    </w:p>
+    <w:p>
+      <w:pPr>
+        <w:pStyle w:val="Compact"/>
+        <w:numPr>
+          <w:ilvl w:val="0"/>
+          <w:numId w:val="1008"/>
+        </w:numPr>
+      </w:pPr>
+      <w:r>
         <w:t xml:space="preserve">usar</w:t>
       </w:r>
       <w:r>
@@ -1644,7 +1802,7 @@
         <w:pStyle w:val="Compact"/>
         <w:numPr>
           <w:ilvl w:val="0"/>
-          <w:numId w:val="1007"/>
+          <w:numId w:val="1008"/>
         </w:numPr>
       </w:pPr>
       <w:r>
@@ -3757,229 +3915,11 @@
         <w:pStyle w:val="Compact"/>
         <w:numPr>
           <w:ilvl w:val="0"/>
-          <w:numId w:val="1008"/>
+          <w:numId w:val="1009"/>
         </w:numPr>
       </w:pPr>
       <w:r>
         <w:t xml:space="preserve">Clique e acesse a Instrução Normativa nº 75/2026: Subpages/Pena_justa/SEI_35153985_Instrucao_Normativa_75.pdf</w:t>
-      </w:r>
-    </w:p>
-    <w:p>
-      <w:pPr>
-        <w:pStyle w:val="Compact"/>
-        <w:numPr>
-          <w:ilvl w:val="0"/>
-          <w:numId w:val="1008"/>
-        </w:numPr>
-      </w:pPr>
-      <w:r>
-        <w:t xml:space="preserve">Clique e acesse a Portaria nº 549/2026 - Renospen: Subpages/Pena_justa/SEI_35032761_Portaria_549.pdf</w:t>
-      </w:r>
-    </w:p>
-    <w:p>
-      <w:pPr>
-        <w:pStyle w:val="Compact"/>
-        <w:numPr>
-          <w:ilvl w:val="0"/>
-          <w:numId w:val="1008"/>
-        </w:numPr>
-      </w:pPr>
-      <w:r>
-        <w:t xml:space="preserve">Clique e acesse o Plano Nacional Pena Justa: Subpages/Pena_justa/Plano_Nacional_Pena_Justa.pdf</w:t>
-      </w:r>
-    </w:p>
-    <w:bookmarkEnd w:id="21"/>
-    <w:bookmarkStart w:id="22" w:name="subpágina-2---ema---senappen"/>
-    <w:p>
-      <w:pPr>
-        <w:pStyle w:val="Heading2"/>
-      </w:pPr>
-      <w:r>
-        <w:t xml:space="preserve">Subpágina 2 - EMA - SENAPPEN</w:t>
-      </w:r>
-    </w:p>
-    <w:p>
-      <w:pPr>
-        <w:pStyle w:val="FirstParagraph"/>
-      </w:pPr>
-      <w:r>
-        <w:t xml:space="preserve">Título da página:</w:t>
-      </w:r>
-    </w:p>
-    <w:p>
-      <w:pPr>
-        <w:pStyle w:val="BodyText"/>
-      </w:pPr>
-      <w:r>
-        <w:t xml:space="preserve">EMA - SENAPPEN</w:t>
-      </w:r>
-    </w:p>
-    <w:p>
-      <w:pPr>
-        <w:pStyle w:val="BodyText"/>
-      </w:pPr>
-      <w:r>
-        <w:t xml:space="preserve">Imagem de destaque:</w:t>
-      </w:r>
-    </w:p>
-    <w:p>
-      <w:pPr>
-        <w:pStyle w:val="BodyText"/>
-      </w:pPr>
-      <w:r>
-        <w:t xml:space="preserve">Documentação/Botao_EMA.png</w:t>
-      </w:r>
-    </w:p>
-    <w:p>
-      <w:pPr>
-        <w:pStyle w:val="BodyText"/>
-      </w:pPr>
-      <w:r>
-        <w:t xml:space="preserve">Texto alternativo sugerido:</w:t>
-      </w:r>
-    </w:p>
-    <w:p>
-      <w:pPr>
-        <w:pStyle w:val="BodyText"/>
-      </w:pPr>
-      <w:r>
-        <w:t xml:space="preserve">Botão institucional da EMA - SENAPPEN.</w:t>
-      </w:r>
-    </w:p>
-    <w:p>
-      <w:pPr>
-        <w:pStyle w:val="BodyText"/>
-      </w:pPr>
-      <w:r>
-        <w:t xml:space="preserve">Identificador editorial:</w:t>
-      </w:r>
-    </w:p>
-    <w:p>
-      <w:pPr>
-        <w:pStyle w:val="BodyText"/>
-      </w:pPr>
-      <w:r>
-        <w:t xml:space="preserve">Conteúdo Técnico e Projetos Estruturantes</w:t>
-      </w:r>
-    </w:p>
-    <w:p>
-      <w:pPr>
-        <w:pStyle w:val="BodyText"/>
-      </w:pPr>
-      <w:r>
-        <w:t xml:space="preserve">Texto de destaque:</w:t>
-      </w:r>
-    </w:p>
-    <w:p>
-      <w:pPr>
-        <w:pStyle w:val="BodyText"/>
-      </w:pPr>
-      <w:r>
-        <w:t xml:space="preserve">Espaço da Equipe de Monitoramento e Acompanhamento das decisões e deliberações do Sistema Interamericano de Direitos Humanos em face do sistema penal nacional, dedicado a fortalecer o cumprimento das determinações do SIDH em parceria com as Unidades Federativas.</w:t>
-      </w:r>
-    </w:p>
-    <w:p>
-      <w:pPr>
-        <w:pStyle w:val="BodyText"/>
-      </w:pPr>
-      <w:r>
-        <w:t xml:space="preserve">Seção:</w:t>
-      </w:r>
-    </w:p>
-    <w:p>
-      <w:pPr>
-        <w:pStyle w:val="BodyText"/>
-      </w:pPr>
-      <w:r>
-        <w:t xml:space="preserve">Institucional</w:t>
-      </w:r>
-    </w:p>
-    <w:p>
-      <w:pPr>
-        <w:pStyle w:val="BodyText"/>
-      </w:pPr>
-      <w:r>
-        <w:t xml:space="preserve">Imagem complementar opcional:</w:t>
-      </w:r>
-    </w:p>
-    <w:p>
-      <w:pPr>
-        <w:pStyle w:val="BodyText"/>
-      </w:pPr>
-      <w:r>
-        <w:t xml:space="preserve">Documentação/Banner_Ema_Organograma.png</w:t>
-      </w:r>
-    </w:p>
-    <w:p>
-      <w:pPr>
-        <w:pStyle w:val="BodyText"/>
-      </w:pPr>
-      <w:r>
-        <w:t xml:space="preserve">Texto alternativo sugerido:</w:t>
-      </w:r>
-    </w:p>
-    <w:p>
-      <w:pPr>
-        <w:pStyle w:val="BodyText"/>
-      </w:pPr>
-      <w:r>
-        <w:t xml:space="preserve">Organograma da EMA - SENAPPEN.</w:t>
-      </w:r>
-    </w:p>
-    <w:p>
-      <w:pPr>
-        <w:pStyle w:val="BodyText"/>
-      </w:pPr>
-      <w:r>
-        <w:t xml:space="preserve">Texto para colar:</w:t>
-      </w:r>
-    </w:p>
-    <w:p>
-      <w:pPr>
-        <w:pStyle w:val="BodyText"/>
-      </w:pPr>
-      <w:r>
-        <w:t xml:space="preserve">A EMA-SENAPPEN foi instituída, inicialmente, pela Portaria GABSEC/SENAPPEN/MJSP Nº 350, de 13 de junho de 2024, em um esforço de integrar a Secretaria Nacional de Políticas Penais ao processo de cumprimento das decisões do SIDH, dado seu rol de competências, em especial, a previsão de prestar apoio técnico aos entes federativos quanto à implementação dos princípios e das regras da execução penal.</w:t>
-      </w:r>
-    </w:p>
-    <w:p>
-      <w:pPr>
-        <w:pStyle w:val="BodyText"/>
-      </w:pPr>
-      <w:r>
-        <w:t xml:space="preserve">A segunda linha da seção:</w:t>
-      </w:r>
-    </w:p>
-    <w:p>
-      <w:pPr>
-        <w:pStyle w:val="BodyText"/>
-      </w:pPr>
-      <w:r>
-        <w:t xml:space="preserve">A estrutura da EMA foi alterada em 2025, mediante as Portarias GABSEC/SENAPPEN/MJSP Nº 511, de 13 de outubro de 2025, e Portaria de Pessoal GABSEC/SENAPPEN/MJSP Nº 93, de 10 de março de 2026, as quais possuíam por objetivo o aprimoramento da sua composição institucional, conforme o organograma a seguir:</w:t>
-      </w:r>
-    </w:p>
-    <w:p>
-      <w:pPr>
-        <w:pStyle w:val="BodyText"/>
-      </w:pPr>
-      <w:r>
-        <w:t xml:space="preserve">Seção:</w:t>
-      </w:r>
-    </w:p>
-    <w:p>
-      <w:pPr>
-        <w:pStyle w:val="BodyText"/>
-      </w:pPr>
-      <w:r>
-        <w:t xml:space="preserve">Frentes de Atuação</w:t>
-      </w:r>
-    </w:p>
-    <w:p>
-      <w:pPr>
-        <w:pStyle w:val="BodyText"/>
-      </w:pPr>
-      <w:r>
-        <w:t xml:space="preserve">Itens para colar:</w:t>
       </w:r>
     </w:p>
     <w:p>
@@ -3991,7 +3931,7 @@
         </w:numPr>
       </w:pPr>
       <w:r>
-        <w:t xml:space="preserve">Monitorar e acompanhar as estratégias adotadas pelo Estado Brasileiro para o cumprimento das decisões do SIDH em relação ao sistema penal.</w:t>
+        <w:t xml:space="preserve">Clique e acesse a Portaria nº 549/2026 - Renospen: Subpages/Pena_justa/SEI_35032761_Portaria_549.pdf</w:t>
       </w:r>
     </w:p>
     <w:p>
@@ -4003,31 +3943,17 @@
         </w:numPr>
       </w:pPr>
       <w:r>
-        <w:t xml:space="preserve">Prevenir e evitar possíveis condenações.</w:t>
-      </w:r>
-    </w:p>
-    <w:p>
-      <w:pPr>
-        <w:pStyle w:val="Compact"/>
-        <w:numPr>
-          <w:ilvl w:val="0"/>
-          <w:numId w:val="1009"/>
-        </w:numPr>
-      </w:pPr>
-      <w:r>
-        <w:t xml:space="preserve">Propagar a cultura de Direitos Humanos, fomentando a aplicação dos Tratados Internacionais sobre a matéria de Direito Penal pelos gestores do sistema penal nacional.</w:t>
-      </w:r>
-    </w:p>
-    <w:p>
-      <w:pPr>
-        <w:pStyle w:val="Compact"/>
-        <w:numPr>
-          <w:ilvl w:val="0"/>
-          <w:numId w:val="1009"/>
-        </w:numPr>
-      </w:pPr>
-      <w:r>
-        <w:t xml:space="preserve">Fortalecer o diálogo entre a proteção de direitos e a governança no sistema penal.</w:t>
+        <w:t xml:space="preserve">Clique e acesse o Plano Nacional Pena Justa: Subpages/Pena_justa/Plano_Nacional_Pena_Justa.pdf</w:t>
+      </w:r>
+    </w:p>
+    <w:bookmarkEnd w:id="22"/>
+    <w:bookmarkStart w:id="23" w:name="subpágina-2---ema---senappen"/>
+    <w:p>
+      <w:pPr>
+        <w:pStyle w:val="Heading2"/>
+      </w:pPr>
+      <w:r>
+        <w:t xml:space="preserve">Subpágina 2 - EMA - SENAPPEN</w:t>
       </w:r>
     </w:p>
     <w:p>
@@ -4035,15 +3961,79 @@
         <w:pStyle w:val="FirstParagraph"/>
       </w:pPr>
       <w:r>
-        <w:t xml:space="preserve">Texto complementar da seção:</w:t>
-      </w:r>
-    </w:p>
-    <w:p>
-      <w:pPr>
-        <w:pStyle w:val="BodyText"/>
-      </w:pPr>
-      <w:r>
-        <w:t xml:space="preserve">Cabe citar a aproximação institucional e a construção de diálogo com órgãos-chave desse processo de monitoramento, como o Ministério das Relações Exteriores, o Ministério dos Direitos Humanos e da Cidadania e o Conselho Nacional de Justiça.</w:t>
+        <w:t xml:space="preserve">Título da página:</w:t>
+      </w:r>
+    </w:p>
+    <w:p>
+      <w:pPr>
+        <w:pStyle w:val="BodyText"/>
+      </w:pPr>
+      <w:r>
+        <w:t xml:space="preserve">EMA - SENAPPEN</w:t>
+      </w:r>
+    </w:p>
+    <w:p>
+      <w:pPr>
+        <w:pStyle w:val="BodyText"/>
+      </w:pPr>
+      <w:r>
+        <w:t xml:space="preserve">Imagem de destaque:</w:t>
+      </w:r>
+    </w:p>
+    <w:p>
+      <w:pPr>
+        <w:pStyle w:val="BodyText"/>
+      </w:pPr>
+      <w:r>
+        <w:t xml:space="preserve">Documentação/Botao_EMA.png</w:t>
+      </w:r>
+    </w:p>
+    <w:p>
+      <w:pPr>
+        <w:pStyle w:val="BodyText"/>
+      </w:pPr>
+      <w:r>
+        <w:t xml:space="preserve">Texto alternativo sugerido:</w:t>
+      </w:r>
+    </w:p>
+    <w:p>
+      <w:pPr>
+        <w:pStyle w:val="BodyText"/>
+      </w:pPr>
+      <w:r>
+        <w:t xml:space="preserve">Botão institucional da EMA - SENAPPEN.</w:t>
+      </w:r>
+    </w:p>
+    <w:p>
+      <w:pPr>
+        <w:pStyle w:val="BodyText"/>
+      </w:pPr>
+      <w:r>
+        <w:t xml:space="preserve">Identificador editorial:</w:t>
+      </w:r>
+    </w:p>
+    <w:p>
+      <w:pPr>
+        <w:pStyle w:val="BodyText"/>
+      </w:pPr>
+      <w:r>
+        <w:t xml:space="preserve">Conteúdo Técnico e Projetos Estruturantes</w:t>
+      </w:r>
+    </w:p>
+    <w:p>
+      <w:pPr>
+        <w:pStyle w:val="BodyText"/>
+      </w:pPr>
+      <w:r>
+        <w:t xml:space="preserve">Texto de destaque:</w:t>
+      </w:r>
+    </w:p>
+    <w:p>
+      <w:pPr>
+        <w:pStyle w:val="BodyText"/>
+      </w:pPr>
+      <w:r>
+        <w:t xml:space="preserve">Espaço da Equipe de Monitoramento e Acompanhamento das decisões e deliberações do Sistema Interamericano de Direitos Humanos em face do sistema penal nacional, dedicado a fortalecer o cumprimento das determinações do SIDH em parceria com as Unidades Federativas.</w:t>
       </w:r>
     </w:p>
     <w:p>
@@ -4059,7 +4049,39 @@
         <w:pStyle w:val="BodyText"/>
       </w:pPr>
       <w:r>
-        <w:t xml:space="preserve">Atuação institucional em 2025</w:t>
+        <w:t xml:space="preserve">Institucional</w:t>
+      </w:r>
+    </w:p>
+    <w:p>
+      <w:pPr>
+        <w:pStyle w:val="BodyText"/>
+      </w:pPr>
+      <w:r>
+        <w:t xml:space="preserve">Imagem complementar opcional:</w:t>
+      </w:r>
+    </w:p>
+    <w:p>
+      <w:pPr>
+        <w:pStyle w:val="BodyText"/>
+      </w:pPr>
+      <w:r>
+        <w:t xml:space="preserve">Documentação/Banner_Ema_Organograma.png</w:t>
+      </w:r>
+    </w:p>
+    <w:p>
+      <w:pPr>
+        <w:pStyle w:val="BodyText"/>
+      </w:pPr>
+      <w:r>
+        <w:t xml:space="preserve">Texto alternativo sugerido:</w:t>
+      </w:r>
+    </w:p>
+    <w:p>
+      <w:pPr>
+        <w:pStyle w:val="BodyText"/>
+      </w:pPr>
+      <w:r>
+        <w:t xml:space="preserve">Organograma da EMA - SENAPPEN.</w:t>
       </w:r>
     </w:p>
     <w:p>
@@ -4075,7 +4097,7 @@
         <w:pStyle w:val="BodyText"/>
       </w:pPr>
       <w:r>
-        <w:t xml:space="preserve">Em 2025, a EMA/Senappen intensificou o acompanhamento do Sistema Interamericano de Direitos Humanos com foco em decisões, deliberações e medidas com repercussão sobre o sistema penal brasileiro. A atuação combinou articulação interinstitucional, monitoramento técnico e apoio à consolidação de respostas coordenadas do Estado.</w:t>
+        <w:t xml:space="preserve">A EMA-SENAPPEN foi instituída, inicialmente, pela Portaria GABSEC/SENAPPEN/MJSP Nº 350, de 13 de junho de 2024, em um esforço de integrar a Secretaria Nacional de Políticas Penais ao processo de cumprimento das decisões do SIDH, dado seu rol de competências, em especial, a previsão de prestar apoio técnico aos entes federativos quanto à implementação dos princípios e das regras da execução penal.</w:t>
       </w:r>
     </w:p>
     <w:p>
@@ -4091,15 +4113,31 @@
         <w:pStyle w:val="BodyText"/>
       </w:pPr>
       <w:r>
-        <w:t xml:space="preserve">Nesse período, a equipe ampliou sua participação em agendas voltadas ao acompanhamento de casos perante a Corte Interamericana de Direitos Humanos e ao fortalecimento de mecanismos permanentes de monitoramento no âmbito da política penal.</w:t>
-      </w:r>
-    </w:p>
-    <w:p>
-      <w:pPr>
-        <w:pStyle w:val="BodyText"/>
-      </w:pPr>
-      <w:r>
-        <w:t xml:space="preserve">Imagens complementares opcionais:</w:t>
+        <w:t xml:space="preserve">A estrutura da EMA foi alterada em 2025, mediante as Portarias GABSEC/SENAPPEN/MJSP Nº 511, de 13 de outubro de 2025, e Portaria de Pessoal GABSEC/SENAPPEN/MJSP Nº 93, de 10 de março de 2026, as quais possuíam por objetivo o aprimoramento da sua composição institucional, conforme o organograma a seguir:</w:t>
+      </w:r>
+    </w:p>
+    <w:p>
+      <w:pPr>
+        <w:pStyle w:val="BodyText"/>
+      </w:pPr>
+      <w:r>
+        <w:t xml:space="preserve">Seção:</w:t>
+      </w:r>
+    </w:p>
+    <w:p>
+      <w:pPr>
+        <w:pStyle w:val="BodyText"/>
+      </w:pPr>
+      <w:r>
+        <w:t xml:space="preserve">Frentes de Atuação</w:t>
+      </w:r>
+    </w:p>
+    <w:p>
+      <w:pPr>
+        <w:pStyle w:val="BodyText"/>
+      </w:pPr>
+      <w:r>
+        <w:t xml:space="preserve">Itens para colar:</w:t>
       </w:r>
     </w:p>
     <w:p>
@@ -4111,7 +4149,7 @@
         </w:numPr>
       </w:pPr>
       <w:r>
-        <w:t xml:space="preserve">Documentação/Banner_Ema.jpg</w:t>
+        <w:t xml:space="preserve">Monitorar e acompanhar as estratégias adotadas pelo Estado Brasileiro para o cumprimento das decisões do SIDH em relação ao sistema penal.</w:t>
       </w:r>
     </w:p>
     <w:p>
@@ -4123,7 +4161,31 @@
         </w:numPr>
       </w:pPr>
       <w:r>
-        <w:t xml:space="preserve">Documentação/Banner_Ema_2.jpg</w:t>
+        <w:t xml:space="preserve">Prevenir e evitar possíveis condenações.</w:t>
+      </w:r>
+    </w:p>
+    <w:p>
+      <w:pPr>
+        <w:pStyle w:val="Compact"/>
+        <w:numPr>
+          <w:ilvl w:val="0"/>
+          <w:numId w:val="1010"/>
+        </w:numPr>
+      </w:pPr>
+      <w:r>
+        <w:t xml:space="preserve">Propagar a cultura de Direitos Humanos, fomentando a aplicação dos Tratados Internacionais sobre a matéria de Direito Penal pelos gestores do sistema penal nacional.</w:t>
+      </w:r>
+    </w:p>
+    <w:p>
+      <w:pPr>
+        <w:pStyle w:val="Compact"/>
+        <w:numPr>
+          <w:ilvl w:val="0"/>
+          <w:numId w:val="1010"/>
+        </w:numPr>
+      </w:pPr>
+      <w:r>
+        <w:t xml:space="preserve">Fortalecer o diálogo entre a proteção de direitos e a governança no sistema penal.</w:t>
       </w:r>
     </w:p>
     <w:p>
@@ -4131,7 +4193,71 @@
         <w:pStyle w:val="FirstParagraph"/>
       </w:pPr>
       <w:r>
-        <w:t xml:space="preserve">Textos alternativos sugeridos:</w:t>
+        <w:t xml:space="preserve">Texto complementar da seção:</w:t>
+      </w:r>
+    </w:p>
+    <w:p>
+      <w:pPr>
+        <w:pStyle w:val="BodyText"/>
+      </w:pPr>
+      <w:r>
+        <w:t xml:space="preserve">Cabe citar a aproximação institucional e a construção de diálogo com órgãos-chave desse processo de monitoramento, como o Ministério das Relações Exteriores, o Ministério dos Direitos Humanos e da Cidadania e o Conselho Nacional de Justiça.</w:t>
+      </w:r>
+    </w:p>
+    <w:p>
+      <w:pPr>
+        <w:pStyle w:val="BodyText"/>
+      </w:pPr>
+      <w:r>
+        <w:t xml:space="preserve">Seção:</w:t>
+      </w:r>
+    </w:p>
+    <w:p>
+      <w:pPr>
+        <w:pStyle w:val="BodyText"/>
+      </w:pPr>
+      <w:r>
+        <w:t xml:space="preserve">Atuação institucional em 2025</w:t>
+      </w:r>
+    </w:p>
+    <w:p>
+      <w:pPr>
+        <w:pStyle w:val="BodyText"/>
+      </w:pPr>
+      <w:r>
+        <w:t xml:space="preserve">Texto para colar:</w:t>
+      </w:r>
+    </w:p>
+    <w:p>
+      <w:pPr>
+        <w:pStyle w:val="BodyText"/>
+      </w:pPr>
+      <w:r>
+        <w:t xml:space="preserve">Em 2025, a EMA/Senappen intensificou o acompanhamento do Sistema Interamericano de Direitos Humanos com foco em decisões, deliberações e medidas com repercussão sobre o sistema penal brasileiro. A atuação combinou articulação interinstitucional, monitoramento técnico e apoio à consolidação de respostas coordenadas do Estado.</w:t>
+      </w:r>
+    </w:p>
+    <w:p>
+      <w:pPr>
+        <w:pStyle w:val="BodyText"/>
+      </w:pPr>
+      <w:r>
+        <w:t xml:space="preserve">A segunda linha da seção:</w:t>
+      </w:r>
+    </w:p>
+    <w:p>
+      <w:pPr>
+        <w:pStyle w:val="BodyText"/>
+      </w:pPr>
+      <w:r>
+        <w:t xml:space="preserve">Nesse período, a equipe ampliou sua participação em agendas voltadas ao acompanhamento de casos perante a Corte Interamericana de Direitos Humanos e ao fortalecimento de mecanismos permanentes de monitoramento no âmbito da política penal.</w:t>
+      </w:r>
+    </w:p>
+    <w:p>
+      <w:pPr>
+        <w:pStyle w:val="BodyText"/>
+      </w:pPr>
+      <w:r>
+        <w:t xml:space="preserve">Imagens complementares opcionais:</w:t>
       </w:r>
     </w:p>
     <w:p>
@@ -4143,7 +4269,7 @@
         </w:numPr>
       </w:pPr>
       <w:r>
-        <w:t xml:space="preserve">Participantes reunidos em mesa de trabalho institucional acompanhada pela EMA - SENAPPEN.</w:t>
+        <w:t xml:space="preserve">Documentação/Banner_Ema.jpg</w:t>
       </w:r>
     </w:p>
     <w:p>
@@ -4155,7 +4281,7 @@
         </w:numPr>
       </w:pPr>
       <w:r>
-        <w:t xml:space="preserve">Participantes posicionados em registro oficial de agenda institucional acompanhada pela EMA - SENAPPEN.</w:t>
+        <w:t xml:space="preserve">Documentação/Banner_Ema_2.jpg</w:t>
       </w:r>
     </w:p>
     <w:p>
@@ -4163,7 +4289,7 @@
         <w:pStyle w:val="FirstParagraph"/>
       </w:pPr>
       <w:r>
-        <w:t xml:space="preserve">Legendas sugeridas:</w:t>
+        <w:t xml:space="preserve">Textos alternativos sugeridos:</w:t>
       </w:r>
     </w:p>
     <w:p>
@@ -4175,7 +4301,7 @@
         </w:numPr>
       </w:pPr>
       <w:r>
-        <w:t xml:space="preserve">Reunião institucional acompanhada pela EMA - SENAPPEN.</w:t>
+        <w:t xml:space="preserve">Participantes reunidos em mesa de trabalho institucional acompanhada pela EMA - SENAPPEN.</w:t>
       </w:r>
     </w:p>
     <w:p>
@@ -4187,7 +4313,7 @@
         </w:numPr>
       </w:pPr>
       <w:r>
-        <w:t xml:space="preserve">Registro oficial de agenda institucional da EMA - SENAPPEN.</w:t>
+        <w:t xml:space="preserve">Participantes posicionados em registro oficial de agenda institucional acompanhada pela EMA - SENAPPEN.</w:t>
       </w:r>
     </w:p>
     <w:p>
@@ -4195,71 +4321,7 @@
         <w:pStyle w:val="FirstParagraph"/>
       </w:pPr>
       <w:r>
-        <w:t xml:space="preserve">Seção:</w:t>
-      </w:r>
-    </w:p>
-    <w:p>
-      <w:pPr>
-        <w:pStyle w:val="BodyText"/>
-      </w:pPr>
-      <w:r>
-        <w:t xml:space="preserve">Caso Pedrinhas</w:t>
-      </w:r>
-    </w:p>
-    <w:p>
-      <w:pPr>
-        <w:pStyle w:val="BodyText"/>
-      </w:pPr>
-      <w:r>
-        <w:t xml:space="preserve">Texto para colar:</w:t>
-      </w:r>
-    </w:p>
-    <w:p>
-      <w:pPr>
-        <w:pStyle w:val="BodyText"/>
-      </w:pPr>
-      <w:r>
-        <w:t xml:space="preserve">Em 21 de outubro de 2025, a EMA-SENAPPEN foi convocada a participar, juntamente a outros órgãos representantes do Estado Brasileiro, da audiência privada solicitada pela Corte Interamericana de Direitos Humanos sobre as Medidas Provisórias outorgadas no Caso do Complexo Penitenciário de São Luís, Maranhão (Caso Pedrinhas).</w:t>
-      </w:r>
-    </w:p>
-    <w:p>
-      <w:pPr>
-        <w:pStyle w:val="BodyText"/>
-      </w:pPr>
-      <w:r>
-        <w:t xml:space="preserve">A segunda linha da seção:</w:t>
-      </w:r>
-    </w:p>
-    <w:p>
-      <w:pPr>
-        <w:pStyle w:val="BodyText"/>
-      </w:pPr>
-      <w:r>
-        <w:t xml:space="preserve">Como desdobramento da audiência, a Equipe ficou responsável por coordenar uma mesa de trabalho voltada à elaboração de um plano de cumprimento conjunto, com foco no enfrentamento das fragilidades ainda identificadas no Caso.</w:t>
-      </w:r>
-    </w:p>
-    <w:p>
-      <w:pPr>
-        <w:pStyle w:val="BodyText"/>
-      </w:pPr>
-      <w:r>
-        <w:t xml:space="preserve">Subseção:</w:t>
-      </w:r>
-    </w:p>
-    <w:p>
-      <w:pPr>
-        <w:pStyle w:val="BodyText"/>
-      </w:pPr>
-      <w:r>
-        <w:t xml:space="preserve">Eixos priorizados</w:t>
-      </w:r>
-    </w:p>
-    <w:p>
-      <w:pPr>
-        <w:pStyle w:val="BodyText"/>
-      </w:pPr>
-      <w:r>
-        <w:t xml:space="preserve">Itens para colar:</w:t>
+        <w:t xml:space="preserve">Legendas sugeridas:</w:t>
       </w:r>
     </w:p>
     <w:p>
@@ -4271,7 +4333,7 @@
         </w:numPr>
       </w:pPr>
       <w:r>
-        <w:t xml:space="preserve">Superlotação e ambiência no sistema prisional.</w:t>
+        <w:t xml:space="preserve">Reunião institucional acompanhada pela EMA - SENAPPEN.</w:t>
       </w:r>
     </w:p>
     <w:p>
@@ -4283,31 +4345,7 @@
         </w:numPr>
       </w:pPr>
       <w:r>
-        <w:t xml:space="preserve">Dignidade e condições de custódia.</w:t>
-      </w:r>
-    </w:p>
-    <w:p>
-      <w:pPr>
-        <w:pStyle w:val="Compact"/>
-        <w:numPr>
-          <w:ilvl w:val="0"/>
-          <w:numId w:val="1013"/>
-        </w:numPr>
-      </w:pPr>
-      <w:r>
-        <w:t xml:space="preserve">Acesso à justiça e prevenção à tortura.</w:t>
-      </w:r>
-    </w:p>
-    <w:p>
-      <w:pPr>
-        <w:pStyle w:val="Compact"/>
-        <w:numPr>
-          <w:ilvl w:val="0"/>
-          <w:numId w:val="1013"/>
-        </w:numPr>
-      </w:pPr>
-      <w:r>
-        <w:t xml:space="preserve">Monitoramento, participação social e coordenação institucional.</w:t>
+        <w:t xml:space="preserve">Registro oficial de agenda institucional da EMA - SENAPPEN.</w:t>
       </w:r>
     </w:p>
     <w:p>
@@ -4315,6 +4353,54 @@
         <w:pStyle w:val="FirstParagraph"/>
       </w:pPr>
       <w:r>
+        <w:t xml:space="preserve">Seção:</w:t>
+      </w:r>
+    </w:p>
+    <w:p>
+      <w:pPr>
+        <w:pStyle w:val="BodyText"/>
+      </w:pPr>
+      <w:r>
+        <w:t xml:space="preserve">Caso Pedrinhas</w:t>
+      </w:r>
+    </w:p>
+    <w:p>
+      <w:pPr>
+        <w:pStyle w:val="BodyText"/>
+      </w:pPr>
+      <w:r>
+        <w:t xml:space="preserve">Texto para colar:</w:t>
+      </w:r>
+    </w:p>
+    <w:p>
+      <w:pPr>
+        <w:pStyle w:val="BodyText"/>
+      </w:pPr>
+      <w:r>
+        <w:t xml:space="preserve">Em 21 de outubro de 2025, a EMA-SENAPPEN foi convocada a participar, juntamente a outros órgãos representantes do Estado Brasileiro, da audiência privada solicitada pela Corte Interamericana de Direitos Humanos sobre as Medidas Provisórias outorgadas no Caso do Complexo Penitenciário de São Luís, Maranhão (Caso Pedrinhas).</w:t>
+      </w:r>
+    </w:p>
+    <w:p>
+      <w:pPr>
+        <w:pStyle w:val="BodyText"/>
+      </w:pPr>
+      <w:r>
+        <w:t xml:space="preserve">A segunda linha da seção:</w:t>
+      </w:r>
+    </w:p>
+    <w:p>
+      <w:pPr>
+        <w:pStyle w:val="BodyText"/>
+      </w:pPr>
+      <w:r>
+        <w:t xml:space="preserve">Como desdobramento da audiência, a Equipe ficou responsável por coordenar uma mesa de trabalho voltada à elaboração de um plano de cumprimento conjunto, com foco no enfrentamento das fragilidades ainda identificadas no Caso.</w:t>
+      </w:r>
+    </w:p>
+    <w:p>
+      <w:pPr>
+        <w:pStyle w:val="BodyText"/>
+      </w:pPr>
+      <w:r>
         <w:t xml:space="preserve">Subseção:</w:t>
       </w:r>
     </w:p>
@@ -4323,79 +4409,15 @@
         <w:pStyle w:val="BodyText"/>
       </w:pPr>
       <w:r>
-        <w:t xml:space="preserve">Desdobramentos e articulação técnica</w:t>
-      </w:r>
-    </w:p>
-    <w:p>
-      <w:pPr>
-        <w:pStyle w:val="BodyText"/>
-      </w:pPr>
-      <w:r>
-        <w:t xml:space="preserve">Texto para colar:</w:t>
-      </w:r>
-    </w:p>
-    <w:p>
-      <w:pPr>
-        <w:pStyle w:val="BodyText"/>
-      </w:pPr>
-      <w:r>
-        <w:t xml:space="preserve">Entre novembro e dezembro de 2025, a EMA/Senappen contribuiu para a formalização da mesa de trabalho, participou de reuniões técnicas dedicadas aos eixos temáticos do caso e apoiou a preparação de visita técnica destinada a consolidar diagnósticos e orientar as próximas medidas.</w:t>
-      </w:r>
-    </w:p>
-    <w:p>
-      <w:pPr>
-        <w:pStyle w:val="BodyText"/>
-      </w:pPr>
-      <w:r>
-        <w:t xml:space="preserve">A segunda linha da subseção:</w:t>
-      </w:r>
-    </w:p>
-    <w:p>
-      <w:pPr>
-        <w:pStyle w:val="BodyText"/>
-      </w:pPr>
-      <w:r>
-        <w:t xml:space="preserve">No mesmo contexto, a equipe atuou de forma articulada com o Plano Pena Justa e acompanhou iniciativas voltadas à criação de instâncias permanentes de monitoramento e à padronização de fluxos para acompanhamento de casos internacionais com incidência sobre o sistema penal brasileiro.</w:t>
-      </w:r>
-    </w:p>
-    <w:p>
-      <w:pPr>
-        <w:pStyle w:val="BodyText"/>
-      </w:pPr>
-      <w:r>
-        <w:t xml:space="preserve">Seção:</w:t>
-      </w:r>
-    </w:p>
-    <w:p>
-      <w:pPr>
-        <w:pStyle w:val="BodyText"/>
-      </w:pPr>
-      <w:r>
-        <w:t xml:space="preserve">Referências públicas do SIDH</w:t>
-      </w:r>
-    </w:p>
-    <w:p>
-      <w:pPr>
-        <w:pStyle w:val="BodyText"/>
-      </w:pPr>
-      <w:r>
-        <w:t xml:space="preserve">Texto para colar:</w:t>
-      </w:r>
-    </w:p>
-    <w:p>
-      <w:pPr>
-        <w:pStyle w:val="BodyText"/>
-      </w:pPr>
-      <w:r>
-        <w:t xml:space="preserve">Para contextualização institucional da pauta, a ONASP pode utilizar como pontos de partida as referências públicas abaixo, produzidas pelos próprios órgãos do sistema interamericano:</w:t>
-      </w:r>
-    </w:p>
-    <w:p>
-      <w:pPr>
-        <w:pStyle w:val="BodyText"/>
-      </w:pPr>
-      <w:r>
-        <w:t xml:space="preserve">Links:</w:t>
+        <w:t xml:space="preserve">Eixos priorizados</w:t>
+      </w:r>
+    </w:p>
+    <w:p>
+      <w:pPr>
+        <w:pStyle w:val="BodyText"/>
+      </w:pPr>
+      <w:r>
+        <w:t xml:space="preserve">Itens para colar:</w:t>
       </w:r>
     </w:p>
     <w:p>
@@ -4407,7 +4429,7 @@
         </w:numPr>
       </w:pPr>
       <w:r>
-        <w:t xml:space="preserve">O que é a CIDH?: https://www.oas.org/pt/cidh/mandato/que.asp</w:t>
+        <w:t xml:space="preserve">Superlotação e ambiência no sistema prisional.</w:t>
       </w:r>
     </w:p>
     <w:p>
@@ -4419,7 +4441,7 @@
         </w:numPr>
       </w:pPr>
       <w:r>
-        <w:t xml:space="preserve">O que é a Corte IDH?: https://www.corteidh.or.cr/que_es_la_corte.cfm?lang=pt</w:t>
+        <w:t xml:space="preserve">Dignidade e condições de custódia.</w:t>
       </w:r>
     </w:p>
     <w:p>
@@ -4431,7 +4453,7 @@
         </w:numPr>
       </w:pPr>
       <w:r>
-        <w:t xml:space="preserve">Estatuto da Comissão Interamericana de Direitos Humanos: https://www.oas.org/pt/cidh/mandato/Basicos/estatutoCIDH.asp</w:t>
+        <w:t xml:space="preserve">Acesso à justiça e prevenção à tortura.</w:t>
       </w:r>
     </w:p>
     <w:p>
@@ -4443,7 +4465,7 @@
         </w:numPr>
       </w:pPr>
       <w:r>
-        <w:t xml:space="preserve">Declaração Americana de Direitos e Deveres do Homem: https://www.oas.org/pt/cidh/mandato/Basicos/declaracion.asp</w:t>
+        <w:t xml:space="preserve">Monitoramento, participação social e coordenação institucional.</w:t>
       </w:r>
     </w:p>
     <w:p>
@@ -4451,113 +4473,63 @@
         <w:pStyle w:val="FirstParagraph"/>
       </w:pPr>
       <w:r>
+        <w:t xml:space="preserve">Subseção:</w:t>
+      </w:r>
+    </w:p>
+    <w:p>
+      <w:pPr>
+        <w:pStyle w:val="BodyText"/>
+      </w:pPr>
+      <w:r>
+        <w:t xml:space="preserve">Desdobramentos e articulação técnica</w:t>
+      </w:r>
+    </w:p>
+    <w:p>
+      <w:pPr>
+        <w:pStyle w:val="BodyText"/>
+      </w:pPr>
+      <w:r>
+        <w:t xml:space="preserve">Texto para colar:</w:t>
+      </w:r>
+    </w:p>
+    <w:p>
+      <w:pPr>
+        <w:pStyle w:val="BodyText"/>
+      </w:pPr>
+      <w:r>
+        <w:t xml:space="preserve">Entre novembro e dezembro de 2025, a EMA/Senappen contribuiu para a formalização da mesa de trabalho, participou de reuniões técnicas dedicadas aos eixos temáticos do caso e apoiou a preparação de visita técnica destinada a consolidar diagnósticos e orientar as próximas medidas.</w:t>
+      </w:r>
+    </w:p>
+    <w:p>
+      <w:pPr>
+        <w:pStyle w:val="BodyText"/>
+      </w:pPr>
+      <w:r>
+        <w:t xml:space="preserve">A segunda linha da subseção:</w:t>
+      </w:r>
+    </w:p>
+    <w:p>
+      <w:pPr>
+        <w:pStyle w:val="BodyText"/>
+      </w:pPr>
+      <w:r>
+        <w:t xml:space="preserve">No mesmo contexto, a equipe atuou de forma articulada com o Plano Pena Justa e acompanhou iniciativas voltadas à criação de instâncias permanentes de monitoramento e à padronização de fluxos para acompanhamento de casos internacionais com incidência sobre o sistema penal brasileiro.</w:t>
+      </w:r>
+    </w:p>
+    <w:p>
+      <w:pPr>
+        <w:pStyle w:val="BodyText"/>
+      </w:pPr>
+      <w:r>
         <w:t xml:space="preserve">Seção:</w:t>
       </w:r>
     </w:p>
-    <w:bookmarkEnd w:id="22"/>
-    <w:bookmarkStart w:id="23" w:name="subpágina-3---plano-pena-justa"/>
-    <w:p>
-      <w:pPr>
-        <w:pStyle w:val="Heading2"/>
-      </w:pPr>
-      <w:r>
-        <w:t xml:space="preserve">Subpágina 3 - Plano Pena Justa</w:t>
-      </w:r>
-    </w:p>
-    <w:p>
-      <w:pPr>
-        <w:pStyle w:val="FirstParagraph"/>
-      </w:pPr>
-      <w:r>
-        <w:t xml:space="preserve">Título da página:</w:t>
-      </w:r>
-    </w:p>
-    <w:p>
-      <w:pPr>
-        <w:pStyle w:val="BodyText"/>
-      </w:pPr>
-      <w:r>
-        <w:t xml:space="preserve">Plano Pena Justa</w:t>
-      </w:r>
-    </w:p>
-    <w:p>
-      <w:pPr>
-        <w:pStyle w:val="BodyText"/>
-      </w:pPr>
-      <w:r>
-        <w:t xml:space="preserve">Imagem de destaque:</w:t>
-      </w:r>
-    </w:p>
-    <w:p>
-      <w:pPr>
-        <w:pStyle w:val="BodyText"/>
-      </w:pPr>
-      <w:r>
-        <w:t xml:space="preserve">Documentação/Botao_PenaJusta.png</w:t>
-      </w:r>
-    </w:p>
-    <w:p>
-      <w:pPr>
-        <w:pStyle w:val="BodyText"/>
-      </w:pPr>
-      <w:r>
-        <w:t xml:space="preserve">Texto alternativo sugerido:</w:t>
-      </w:r>
-    </w:p>
-    <w:p>
-      <w:pPr>
-        <w:pStyle w:val="BodyText"/>
-      </w:pPr>
-      <w:r>
-        <w:t xml:space="preserve">Marca do Plano Pena Justa.</w:t>
-      </w:r>
-    </w:p>
-    <w:p>
-      <w:pPr>
-        <w:pStyle w:val="BodyText"/>
-      </w:pPr>
-      <w:r>
-        <w:t xml:space="preserve">Identificador editorial:</w:t>
-      </w:r>
-    </w:p>
-    <w:p>
-      <w:pPr>
-        <w:pStyle w:val="BodyText"/>
-      </w:pPr>
-      <w:r>
-        <w:t xml:space="preserve">Conteúdo Técnico e Projetos Estruturantes</w:t>
-      </w:r>
-    </w:p>
-    <w:p>
-      <w:pPr>
-        <w:pStyle w:val="BodyText"/>
-      </w:pPr>
-      <w:r>
-        <w:t xml:space="preserve">Texto de destaque:</w:t>
-      </w:r>
-    </w:p>
-    <w:p>
-      <w:pPr>
-        <w:pStyle w:val="BodyText"/>
-      </w:pPr>
-      <w:r>
-        <w:t xml:space="preserve">Ambiente dedicado ao Plano Pena Justa, com informações gerais, documentos públicos e marcos relacionados ao fortalecimento das ouvidorias no sistema penal.</w:t>
-      </w:r>
-    </w:p>
-    <w:p>
-      <w:pPr>
-        <w:pStyle w:val="BodyText"/>
-      </w:pPr>
-      <w:r>
-        <w:t xml:space="preserve">Seção:</w:t>
-      </w:r>
-    </w:p>
-    <w:p>
-      <w:pPr>
-        <w:pStyle w:val="BodyText"/>
-      </w:pPr>
-      <w:r>
-        <w:t xml:space="preserve">O Plano</w:t>
+    <w:p>
+      <w:pPr>
+        <w:pStyle w:val="BodyText"/>
+      </w:pPr>
+      <w:r>
+        <w:t xml:space="preserve">Referências públicas do SIDH</w:t>
       </w:r>
     </w:p>
     <w:p>
@@ -4573,47 +4545,15 @@
         <w:pStyle w:val="BodyText"/>
       </w:pPr>
       <w:r>
-        <w:t xml:space="preserve">O Plano Pena Justa é o Plano Nacional para o Enfrentamento do Estado de Coisas Inconstitucional nas Prisões Brasileiras, no âmbito da ADPF 347. Sua proposta articula ações de qualificação das políticas penais, fortalecimento da segurança pública, valorização dos servidores penais, transparência, participação social e monitoramento das metas pactuadas.</w:t>
-      </w:r>
-    </w:p>
-    <w:p>
-      <w:pPr>
-        <w:pStyle w:val="BodyText"/>
-      </w:pPr>
-      <w:r>
-        <w:t xml:space="preserve">Na perspectiva da Ouvidoria Nacional de Serviços Penais, esta subpágina reúne referências públicas do Plano voltadas ao fortalecimento da participação social, da escuta qualificada e da articulação entre as ouvidorias dos serviços penais nos Estados e no Distrito Federal.</w:t>
-      </w:r>
-    </w:p>
-    <w:p>
-      <w:pPr>
-        <w:pStyle w:val="BodyText"/>
-      </w:pPr>
-      <w:r>
-        <w:t xml:space="preserve">Seção:</w:t>
-      </w:r>
-    </w:p>
-    <w:p>
-      <w:pPr>
-        <w:pStyle w:val="BodyText"/>
-      </w:pPr>
-      <w:r>
-        <w:t xml:space="preserve">Eixos de atuação</w:t>
-      </w:r>
-    </w:p>
-    <w:p>
-      <w:pPr>
-        <w:pStyle w:val="BodyText"/>
-      </w:pPr>
-      <w:r>
-        <w:t xml:space="preserve">Texto para colar:</w:t>
-      </w:r>
-    </w:p>
-    <w:p>
-      <w:pPr>
-        <w:pStyle w:val="BodyText"/>
-      </w:pPr>
-      <w:r>
-        <w:t xml:space="preserve">O Plano Nacional organiza sua atuação em quatro eixos estruturantes:</w:t>
+        <w:t xml:space="preserve">Para contextualização institucional da pauta, a ONASP pode utilizar como pontos de partida as referências públicas abaixo, produzidas pelos próprios órgãos do sistema interamericano:</w:t>
+      </w:r>
+    </w:p>
+    <w:p>
+      <w:pPr>
+        <w:pStyle w:val="BodyText"/>
+      </w:pPr>
+      <w:r>
+        <w:t xml:space="preserve">Links:</w:t>
       </w:r>
     </w:p>
     <w:p>
@@ -4625,7 +4565,7 @@
         </w:numPr>
       </w:pPr>
       <w:r>
-        <w:t xml:space="preserve">Controle da entrada e das vagas do sistema prisional.</w:t>
+        <w:t xml:space="preserve">O que é a CIDH?: https://www.oas.org/pt/cidh/mandato/que.asp</w:t>
       </w:r>
     </w:p>
     <w:p>
@@ -4637,7 +4577,7 @@
         </w:numPr>
       </w:pPr>
       <w:r>
-        <w:t xml:space="preserve">Qualidade da ambiência, dos serviços prestados e da estrutura prisional.</w:t>
+        <w:t xml:space="preserve">O que é a Corte IDH?: https://www.corteidh.or.cr/que_es_la_corte.cfm?lang=pt</w:t>
       </w:r>
     </w:p>
     <w:p>
@@ -4649,7 +4589,7 @@
         </w:numPr>
       </w:pPr>
       <w:r>
-        <w:t xml:space="preserve">Processos de saída da prisão e de reintegração social.</w:t>
+        <w:t xml:space="preserve">Estatuto da Comissão Interamericana de Direitos Humanos: https://www.oas.org/pt/cidh/mandato/Basicos/estatutoCIDH.asp</w:t>
       </w:r>
     </w:p>
     <w:p>
@@ -4661,7 +4601,7 @@
         </w:numPr>
       </w:pPr>
       <w:r>
-        <w:t xml:space="preserve">Políticas de não repetição do Estado de Coisas Inconstitucional no sistema prisional.</w:t>
+        <w:t xml:space="preserve">Declaração Americana de Direitos e Deveres do Homem: https://www.oas.org/pt/cidh/mandato/Basicos/declaracion.asp</w:t>
       </w:r>
     </w:p>
     <w:p>
@@ -4672,12 +4612,110 @@
         <w:t xml:space="preserve">Seção:</w:t>
       </w:r>
     </w:p>
-    <w:p>
-      <w:pPr>
-        <w:pStyle w:val="BodyText"/>
-      </w:pPr>
-      <w:r>
-        <w:t xml:space="preserve">Governança e acompanhamento</w:t>
+    <w:bookmarkEnd w:id="23"/>
+    <w:bookmarkStart w:id="24" w:name="subpágina-3---plano-pena-justa"/>
+    <w:p>
+      <w:pPr>
+        <w:pStyle w:val="Heading2"/>
+      </w:pPr>
+      <w:r>
+        <w:t xml:space="preserve">Subpágina 3 - Plano Pena Justa</w:t>
+      </w:r>
+    </w:p>
+    <w:p>
+      <w:pPr>
+        <w:pStyle w:val="FirstParagraph"/>
+      </w:pPr>
+      <w:r>
+        <w:t xml:space="preserve">Título da página:</w:t>
+      </w:r>
+    </w:p>
+    <w:p>
+      <w:pPr>
+        <w:pStyle w:val="BodyText"/>
+      </w:pPr>
+      <w:r>
+        <w:t xml:space="preserve">Plano Pena Justa</w:t>
+      </w:r>
+    </w:p>
+    <w:p>
+      <w:pPr>
+        <w:pStyle w:val="BodyText"/>
+      </w:pPr>
+      <w:r>
+        <w:t xml:space="preserve">Imagem de destaque:</w:t>
+      </w:r>
+    </w:p>
+    <w:p>
+      <w:pPr>
+        <w:pStyle w:val="BodyText"/>
+      </w:pPr>
+      <w:r>
+        <w:t xml:space="preserve">Documentação/Botao_PenaJusta.png</w:t>
+      </w:r>
+    </w:p>
+    <w:p>
+      <w:pPr>
+        <w:pStyle w:val="BodyText"/>
+      </w:pPr>
+      <w:r>
+        <w:t xml:space="preserve">Texto alternativo sugerido:</w:t>
+      </w:r>
+    </w:p>
+    <w:p>
+      <w:pPr>
+        <w:pStyle w:val="BodyText"/>
+      </w:pPr>
+      <w:r>
+        <w:t xml:space="preserve">Marca do Plano Pena Justa.</w:t>
+      </w:r>
+    </w:p>
+    <w:p>
+      <w:pPr>
+        <w:pStyle w:val="BodyText"/>
+      </w:pPr>
+      <w:r>
+        <w:t xml:space="preserve">Identificador editorial:</w:t>
+      </w:r>
+    </w:p>
+    <w:p>
+      <w:pPr>
+        <w:pStyle w:val="BodyText"/>
+      </w:pPr>
+      <w:r>
+        <w:t xml:space="preserve">Conteúdo Técnico e Projetos Estruturantes</w:t>
+      </w:r>
+    </w:p>
+    <w:p>
+      <w:pPr>
+        <w:pStyle w:val="BodyText"/>
+      </w:pPr>
+      <w:r>
+        <w:t xml:space="preserve">Texto de destaque:</w:t>
+      </w:r>
+    </w:p>
+    <w:p>
+      <w:pPr>
+        <w:pStyle w:val="BodyText"/>
+      </w:pPr>
+      <w:r>
+        <w:t xml:space="preserve">Ambiente dedicado ao Plano Pena Justa, com informações gerais, documentos públicos e marcos relacionados ao fortalecimento das ouvidorias no sistema penal.</w:t>
+      </w:r>
+    </w:p>
+    <w:p>
+      <w:pPr>
+        <w:pStyle w:val="BodyText"/>
+      </w:pPr>
+      <w:r>
+        <w:t xml:space="preserve">Seção:</w:t>
+      </w:r>
+    </w:p>
+    <w:p>
+      <w:pPr>
+        <w:pStyle w:val="BodyText"/>
+      </w:pPr>
+      <w:r>
+        <w:t xml:space="preserve">O Plano</w:t>
       </w:r>
     </w:p>
     <w:p>
@@ -4693,15 +4731,15 @@
         <w:pStyle w:val="BodyText"/>
       </w:pPr>
       <w:r>
-        <w:t xml:space="preserve">No recorte da Ouvidoria Nacional de Serviços Penais, o acompanhamento do Pena Justa prioriza instrumentos que fortaleçam a escuta qualificada, a transparência ativa e a coordenação entre as ouvidorias dos serviços penais.</w:t>
-      </w:r>
-    </w:p>
-    <w:p>
-      <w:pPr>
-        <w:pStyle w:val="BodyText"/>
-      </w:pPr>
-      <w:r>
-        <w:t xml:space="preserve">Esse recorte se materializa por meio de marcos normativos e de cooperação técnica que estruturam parâmetros mínimos de atuação, incentivam integração preferencial ao Fala.BR e consolidam uma rede permanente de intercâmbio entre União, Estados e Distrito Federal.</w:t>
+        <w:t xml:space="preserve">O Plano Pena Justa é o Plano Nacional para o Enfrentamento do Estado de Coisas Inconstitucional nas Prisões Brasileiras, no âmbito da ADPF 347. Sua proposta articula ações de qualificação das políticas penais, fortalecimento da segurança pública, valorização dos servidores penais, transparência, participação social e monitoramento das metas pactuadas.</w:t>
+      </w:r>
+    </w:p>
+    <w:p>
+      <w:pPr>
+        <w:pStyle w:val="BodyText"/>
+      </w:pPr>
+      <w:r>
+        <w:t xml:space="preserve">Na perspectiva da Ouvidoria Nacional de Serviços Penais, esta subpágina reúne referências públicas do Plano voltadas ao fortalecimento da participação social, da escuta qualificada e da articulação entre as ouvidorias dos serviços penais nos Estados e no Distrito Federal.</w:t>
       </w:r>
     </w:p>
     <w:p>
@@ -4717,7 +4755,7 @@
         <w:pStyle w:val="BodyText"/>
       </w:pPr>
       <w:r>
-        <w:t xml:space="preserve">Entregas já formalizadas</w:t>
+        <w:t xml:space="preserve">Eixos de atuação</w:t>
       </w:r>
     </w:p>
     <w:p>
@@ -4733,191 +4771,7 @@
         <w:pStyle w:val="BodyText"/>
       </w:pPr>
       <w:r>
-        <w:t xml:space="preserve">No campo das ouvidorias e da participação social, o Pena Justa já reúne marcos normativos que podem ser destacados nesta página:</w:t>
-      </w:r>
-    </w:p>
-    <w:p>
-      <w:pPr>
-        <w:pStyle w:val="BodyText"/>
-      </w:pPr>
-      <w:r>
-        <w:t xml:space="preserve">Subtítulo:</w:t>
-      </w:r>
-    </w:p>
-    <w:p>
-      <w:pPr>
-        <w:pStyle w:val="BodyText"/>
-      </w:pPr>
-      <w:r>
-        <w:t xml:space="preserve">Normativo publicado</w:t>
-      </w:r>
-    </w:p>
-    <w:p>
-      <w:pPr>
-        <w:pStyle w:val="BodyText"/>
-      </w:pPr>
-      <w:r>
-        <w:t xml:space="preserve">Título:</w:t>
-      </w:r>
-    </w:p>
-    <w:p>
-      <w:pPr>
-        <w:pStyle w:val="BodyText"/>
-      </w:pPr>
-      <w:r>
-        <w:t xml:space="preserve">Instrução Normativa nº 75/2026</w:t>
-      </w:r>
-    </w:p>
-    <w:p>
-      <w:pPr>
-        <w:pStyle w:val="BodyText"/>
-      </w:pPr>
-      <w:r>
-        <w:t xml:space="preserve">Texto para colar:</w:t>
-      </w:r>
-    </w:p>
-    <w:p>
-      <w:pPr>
-        <w:pStyle w:val="BodyText"/>
-      </w:pPr>
-      <w:r>
-        <w:t xml:space="preserve">Estabelece parâmetros mínimos para a criação e a estruturação de Ouvidorias de Serviços Penais nos Estados e no Distrito Federal, com diretrizes de autonomia, transparência, acessibilidade e integração preferencial ao Fala.BR.</w:t>
-      </w:r>
-    </w:p>
-    <w:p>
-      <w:pPr>
-        <w:pStyle w:val="BodyText"/>
-      </w:pPr>
-      <w:r>
-        <w:t xml:space="preserve">Link:</w:t>
-      </w:r>
-    </w:p>
-    <w:p>
-      <w:pPr>
-        <w:pStyle w:val="BodyText"/>
-      </w:pPr>
-      <w:r>
-        <w:t xml:space="preserve">Acessar a Instrução Normativa (PDF)</w:t>
-      </w:r>
-    </w:p>
-    <w:p>
-      <w:pPr>
-        <w:pStyle w:val="BodyText"/>
-      </w:pPr>
-      <w:r>
-        <w:t xml:space="preserve">Arquivo:</w:t>
-      </w:r>
-    </w:p>
-    <w:p>
-      <w:pPr>
-        <w:pStyle w:val="BodyText"/>
-      </w:pPr>
-      <w:r>
-        <w:t xml:space="preserve">Subpages/Pena_justa/SEI_35153985_Instrucao_Normativa_75.pdf</w:t>
-      </w:r>
-    </w:p>
-    <w:p>
-      <w:pPr>
-        <w:pStyle w:val="BodyText"/>
-      </w:pPr>
-      <w:r>
-        <w:t xml:space="preserve">Subtítulo:</w:t>
-      </w:r>
-    </w:p>
-    <w:p>
-      <w:pPr>
-        <w:pStyle w:val="BodyText"/>
-      </w:pPr>
-      <w:r>
-        <w:t xml:space="preserve">Rede instituída</w:t>
-      </w:r>
-    </w:p>
-    <w:p>
-      <w:pPr>
-        <w:pStyle w:val="BodyText"/>
-      </w:pPr>
-      <w:r>
-        <w:t xml:space="preserve">Título:</w:t>
-      </w:r>
-    </w:p>
-    <w:p>
-      <w:pPr>
-        <w:pStyle w:val="BodyText"/>
-      </w:pPr>
-      <w:r>
-        <w:t xml:space="preserve">Portaria nº 549/2026</w:t>
-      </w:r>
-    </w:p>
-    <w:p>
-      <w:pPr>
-        <w:pStyle w:val="BodyText"/>
-      </w:pPr>
-      <w:r>
-        <w:t xml:space="preserve">Texto para colar:</w:t>
-      </w:r>
-    </w:p>
-    <w:p>
-      <w:pPr>
-        <w:pStyle w:val="BodyText"/>
-      </w:pPr>
-      <w:r>
-        <w:t xml:space="preserve">Institui a Rede Nacional de Ouvidorias de Serviços Penais - Renospen, como instância permanente de cooperação técnica, intercâmbio de informações e fortalecimento institucional das ouvidorias no sistema penal.</w:t>
-      </w:r>
-    </w:p>
-    <w:p>
-      <w:pPr>
-        <w:pStyle w:val="BodyText"/>
-      </w:pPr>
-      <w:r>
-        <w:t xml:space="preserve">Link:</w:t>
-      </w:r>
-    </w:p>
-    <w:p>
-      <w:pPr>
-        <w:pStyle w:val="BodyText"/>
-      </w:pPr>
-      <w:r>
-        <w:t xml:space="preserve">Acessar a Portaria (PDF)</w:t>
-      </w:r>
-    </w:p>
-    <w:p>
-      <w:pPr>
-        <w:pStyle w:val="BodyText"/>
-      </w:pPr>
-      <w:r>
-        <w:t xml:space="preserve">Arquivo:</w:t>
-      </w:r>
-    </w:p>
-    <w:p>
-      <w:pPr>
-        <w:pStyle w:val="BodyText"/>
-      </w:pPr>
-      <w:r>
-        <w:t xml:space="preserve">Subpages/Pena_justa/SEI_35032761_Portaria_549.pdf</w:t>
-      </w:r>
-    </w:p>
-    <w:p>
-      <w:pPr>
-        <w:pStyle w:val="BodyText"/>
-      </w:pPr>
-      <w:r>
-        <w:t xml:space="preserve">Seção:</w:t>
-      </w:r>
-    </w:p>
-    <w:p>
-      <w:pPr>
-        <w:pStyle w:val="BodyText"/>
-      </w:pPr>
-      <w:r>
-        <w:t xml:space="preserve">Documentos públicos de referência</w:t>
-      </w:r>
-    </w:p>
-    <w:p>
-      <w:pPr>
-        <w:pStyle w:val="BodyText"/>
-      </w:pPr>
-      <w:r>
-        <w:t xml:space="preserve">Links:</w:t>
+        <w:t xml:space="preserve">O Plano Nacional organiza sua atuação em quatro eixos estruturantes:</w:t>
       </w:r>
     </w:p>
     <w:p>
@@ -4929,7 +4783,7 @@
         </w:numPr>
       </w:pPr>
       <w:r>
-        <w:t xml:space="preserve">Plano Nacional Pena Justa (PDF): Subpages/Pena_justa/Plano_Nacional_Pena_Justa.pdf</w:t>
+        <w:t xml:space="preserve">Controle da entrada e das vagas do sistema prisional.</w:t>
       </w:r>
     </w:p>
     <w:p>
@@ -4941,17 +4795,31 @@
         </w:numPr>
       </w:pPr>
       <w:r>
-        <w:t xml:space="preserve">10 coisas que você precisa saber sobre o Pena Justa (PDF): Subpages/Pena_justa/10_Coisas_que_você_precisa_saber_sobre_o_Pena_Justa.pdf</w:t>
-      </w:r>
-    </w:p>
-    <w:bookmarkEnd w:id="23"/>
-    <w:bookmarkStart w:id="24" w:name="X9010218d04cc9bed3b5085cf6721dd78b5ea4ec"/>
-    <w:p>
-      <w:pPr>
-        <w:pStyle w:val="Heading2"/>
-      </w:pPr>
-      <w:r>
-        <w:t xml:space="preserve">Subpágina 4 - Revista Brasileira de Execução Penal</w:t>
+        <w:t xml:space="preserve">Qualidade da ambiência, dos serviços prestados e da estrutura prisional.</w:t>
+      </w:r>
+    </w:p>
+    <w:p>
+      <w:pPr>
+        <w:pStyle w:val="Compact"/>
+        <w:numPr>
+          <w:ilvl w:val="0"/>
+          <w:numId w:val="1016"/>
+        </w:numPr>
+      </w:pPr>
+      <w:r>
+        <w:t xml:space="preserve">Processos de saída da prisão e de reintegração social.</w:t>
+      </w:r>
+    </w:p>
+    <w:p>
+      <w:pPr>
+        <w:pStyle w:val="Compact"/>
+        <w:numPr>
+          <w:ilvl w:val="0"/>
+          <w:numId w:val="1016"/>
+        </w:numPr>
+      </w:pPr>
+      <w:r>
+        <w:t xml:space="preserve">Políticas de não repetição do Estado de Coisas Inconstitucional no sistema prisional.</w:t>
       </w:r>
     </w:p>
     <w:p>
@@ -4959,86 +4827,6 @@
         <w:pStyle w:val="FirstParagraph"/>
       </w:pPr>
       <w:r>
-        <w:t xml:space="preserve">Título da página:</w:t>
-      </w:r>
-    </w:p>
-    <w:p>
-      <w:pPr>
-        <w:pStyle w:val="BodyText"/>
-      </w:pPr>
-      <w:r>
-        <w:t xml:space="preserve">Revista Brasileira de Execução Penal</w:t>
-      </w:r>
-    </w:p>
-    <w:p>
-      <w:pPr>
-        <w:pStyle w:val="BodyText"/>
-      </w:pPr>
-      <w:r>
-        <w:t xml:space="preserve">Imagem de destaque:</w:t>
-      </w:r>
-    </w:p>
-    <w:p>
-      <w:pPr>
-        <w:pStyle w:val="BodyText"/>
-      </w:pPr>
-      <w:r>
-        <w:t xml:space="preserve">Documentação/Botao_RevistaBrasileira.png</w:t>
-      </w:r>
-    </w:p>
-    <w:p>
-      <w:pPr>
-        <w:pStyle w:val="BodyText"/>
-      </w:pPr>
-      <w:r>
-        <w:t xml:space="preserve">Texto alternativo sugerido:</w:t>
-      </w:r>
-    </w:p>
-    <w:p>
-      <w:pPr>
-        <w:pStyle w:val="BodyText"/>
-      </w:pPr>
-      <w:r>
-        <w:t xml:space="preserve">Botão institucional da Revista Brasileira de Execução Penal.</w:t>
-      </w:r>
-    </w:p>
-    <w:p>
-      <w:pPr>
-        <w:pStyle w:val="BodyText"/>
-      </w:pPr>
-      <w:r>
-        <w:t xml:space="preserve">Identificador editorial:</w:t>
-      </w:r>
-    </w:p>
-    <w:p>
-      <w:pPr>
-        <w:pStyle w:val="BodyText"/>
-      </w:pPr>
-      <w:r>
-        <w:t xml:space="preserve">Conteúdo Técnico e Projetos Estruturantes</w:t>
-      </w:r>
-    </w:p>
-    <w:p>
-      <w:pPr>
-        <w:pStyle w:val="BodyText"/>
-      </w:pPr>
-      <w:r>
-        <w:t xml:space="preserve">Texto de destaque:</w:t>
-      </w:r>
-    </w:p>
-    <w:p>
-      <w:pPr>
-        <w:pStyle w:val="BodyText"/>
-      </w:pPr>
-      <w:r>
-        <w:t xml:space="preserve">Em articulação com a Espen e a DCOM, esta subpágina reúne referências da Revista Brasileira de Execução Penal e destaca dossiês, notícias editoriais e conteúdos com interface com participação social, transparência e direitos no sistema penal.</w:t>
-      </w:r>
-    </w:p>
-    <w:p>
-      <w:pPr>
-        <w:pStyle w:val="BodyText"/>
-      </w:pPr>
-      <w:r>
         <w:t xml:space="preserve">Seção:</w:t>
       </w:r>
     </w:p>
@@ -5047,7 +4835,7 @@
         <w:pStyle w:val="BodyText"/>
       </w:pPr>
       <w:r>
-        <w:t xml:space="preserve">A Revista</w:t>
+        <w:t xml:space="preserve">Governança e acompanhamento</w:t>
       </w:r>
     </w:p>
     <w:p>
@@ -5063,23 +4851,15 @@
         <w:pStyle w:val="BodyText"/>
       </w:pPr>
       <w:r>
-        <w:t xml:space="preserve">A Revista Brasileira de Execução Penal é o periódico técnico-científico da Secretaria Nacional de Políticas Penais (Senappen/MJSP) e constitui espaço de circulação de artigos, documentos inéditos, entrevistas, relatos de experiência e boas práticas relacionados à execução penal.</w:t>
-      </w:r>
-    </w:p>
-    <w:p>
-      <w:pPr>
-        <w:pStyle w:val="BodyText"/>
-      </w:pPr>
-      <w:r>
-        <w:t xml:space="preserve">A segunda linha do escopo:</w:t>
-      </w:r>
-    </w:p>
-    <w:p>
-      <w:pPr>
-        <w:pStyle w:val="BodyText"/>
-      </w:pPr>
-      <w:r>
-        <w:t xml:space="preserve">No contexto da Ouvidoria, a publicação contribui para aproximar produção técnica, debate qualificado e controle social, reforçando o papel da Ouvidoria como ponte entre Estado e sociedade.</w:t>
+        <w:t xml:space="preserve">No recorte da Ouvidoria Nacional de Serviços Penais, o acompanhamento do Pena Justa prioriza instrumentos que fortaleçam a escuta qualificada, a transparência ativa e a coordenação entre as ouvidorias dos serviços penais.</w:t>
+      </w:r>
+    </w:p>
+    <w:p>
+      <w:pPr>
+        <w:pStyle w:val="BodyText"/>
+      </w:pPr>
+      <w:r>
+        <w:t xml:space="preserve">Esse recorte se materializa por meio de marcos normativos e de cooperação técnica que estruturam parâmetros mínimos de atuação, incentivam integração preferencial ao Fala.BR e consolidam uma rede permanente de intercâmbio entre União, Estados e Distrito Federal.</w:t>
       </w:r>
     </w:p>
     <w:p>
@@ -5095,7 +4875,7 @@
         <w:pStyle w:val="BodyText"/>
       </w:pPr>
       <w:r>
-        <w:t xml:space="preserve">Sobre a revista</w:t>
+        <w:t xml:space="preserve">Entregas já formalizadas</w:t>
       </w:r>
     </w:p>
     <w:p>
@@ -5111,23 +4891,167 @@
         <w:pStyle w:val="BodyText"/>
       </w:pPr>
       <w:r>
-        <w:t xml:space="preserve">A RBEP publica artigos, documentos inéditos, entrevistas, relatos de experiência e descrição de boas práticas que relacionam a experiência profissional, o conhecimento produzido sobre a matéria e o cumprimento da legislação nacional.</w:t>
-      </w:r>
-    </w:p>
-    <w:p>
-      <w:pPr>
-        <w:pStyle w:val="BodyText"/>
-      </w:pPr>
-      <w:r>
-        <w:t xml:space="preserve">A segunda linha da seção:</w:t>
-      </w:r>
-    </w:p>
-    <w:p>
-      <w:pPr>
-        <w:pStyle w:val="BodyText"/>
-      </w:pPr>
-      <w:r>
-        <w:t xml:space="preserve">Os conteúdos são organizados em dossiês temáticos semestrais, e a revista recebeu qualificação A4 na classificação de periódicos Qualis Capes na avaliação do quadriênio 2021-2024.</w:t>
+        <w:t xml:space="preserve">No campo das ouvidorias e da participação social, o Pena Justa já reúne marcos normativos que podem ser destacados nesta página:</w:t>
+      </w:r>
+    </w:p>
+    <w:p>
+      <w:pPr>
+        <w:pStyle w:val="BodyText"/>
+      </w:pPr>
+      <w:r>
+        <w:t xml:space="preserve">Subtítulo:</w:t>
+      </w:r>
+    </w:p>
+    <w:p>
+      <w:pPr>
+        <w:pStyle w:val="BodyText"/>
+      </w:pPr>
+      <w:r>
+        <w:t xml:space="preserve">Normativo publicado</w:t>
+      </w:r>
+    </w:p>
+    <w:p>
+      <w:pPr>
+        <w:pStyle w:val="BodyText"/>
+      </w:pPr>
+      <w:r>
+        <w:t xml:space="preserve">Título:</w:t>
+      </w:r>
+    </w:p>
+    <w:p>
+      <w:pPr>
+        <w:pStyle w:val="BodyText"/>
+      </w:pPr>
+      <w:r>
+        <w:t xml:space="preserve">Instrução Normativa nº 75/2026</w:t>
+      </w:r>
+    </w:p>
+    <w:p>
+      <w:pPr>
+        <w:pStyle w:val="BodyText"/>
+      </w:pPr>
+      <w:r>
+        <w:t xml:space="preserve">Texto para colar:</w:t>
+      </w:r>
+    </w:p>
+    <w:p>
+      <w:pPr>
+        <w:pStyle w:val="BodyText"/>
+      </w:pPr>
+      <w:r>
+        <w:t xml:space="preserve">Estabelece parâmetros mínimos para a criação e a estruturação de Ouvidorias de Serviços Penais nos Estados e no Distrito Federal, com diretrizes de autonomia, transparência, acessibilidade e integração preferencial ao Fala.BR.</w:t>
+      </w:r>
+    </w:p>
+    <w:p>
+      <w:pPr>
+        <w:pStyle w:val="BodyText"/>
+      </w:pPr>
+      <w:r>
+        <w:t xml:space="preserve">Link:</w:t>
+      </w:r>
+    </w:p>
+    <w:p>
+      <w:pPr>
+        <w:pStyle w:val="BodyText"/>
+      </w:pPr>
+      <w:r>
+        <w:t xml:space="preserve">Acessar a Instrução Normativa (PDF)</w:t>
+      </w:r>
+    </w:p>
+    <w:p>
+      <w:pPr>
+        <w:pStyle w:val="BodyText"/>
+      </w:pPr>
+      <w:r>
+        <w:t xml:space="preserve">Arquivo:</w:t>
+      </w:r>
+    </w:p>
+    <w:p>
+      <w:pPr>
+        <w:pStyle w:val="BodyText"/>
+      </w:pPr>
+      <w:r>
+        <w:t xml:space="preserve">Subpages/Pena_justa/SEI_35153985_Instrucao_Normativa_75.pdf</w:t>
+      </w:r>
+    </w:p>
+    <w:p>
+      <w:pPr>
+        <w:pStyle w:val="BodyText"/>
+      </w:pPr>
+      <w:r>
+        <w:t xml:space="preserve">Subtítulo:</w:t>
+      </w:r>
+    </w:p>
+    <w:p>
+      <w:pPr>
+        <w:pStyle w:val="BodyText"/>
+      </w:pPr>
+      <w:r>
+        <w:t xml:space="preserve">Rede instituída</w:t>
+      </w:r>
+    </w:p>
+    <w:p>
+      <w:pPr>
+        <w:pStyle w:val="BodyText"/>
+      </w:pPr>
+      <w:r>
+        <w:t xml:space="preserve">Título:</w:t>
+      </w:r>
+    </w:p>
+    <w:p>
+      <w:pPr>
+        <w:pStyle w:val="BodyText"/>
+      </w:pPr>
+      <w:r>
+        <w:t xml:space="preserve">Portaria nº 549/2026</w:t>
+      </w:r>
+    </w:p>
+    <w:p>
+      <w:pPr>
+        <w:pStyle w:val="BodyText"/>
+      </w:pPr>
+      <w:r>
+        <w:t xml:space="preserve">Texto para colar:</w:t>
+      </w:r>
+    </w:p>
+    <w:p>
+      <w:pPr>
+        <w:pStyle w:val="BodyText"/>
+      </w:pPr>
+      <w:r>
+        <w:t xml:space="preserve">Institui a Rede Nacional de Ouvidorias de Serviços Penais - Renospen, como instância permanente de cooperação técnica, intercâmbio de informações e fortalecimento institucional das ouvidorias no sistema penal.</w:t>
+      </w:r>
+    </w:p>
+    <w:p>
+      <w:pPr>
+        <w:pStyle w:val="BodyText"/>
+      </w:pPr>
+      <w:r>
+        <w:t xml:space="preserve">Link:</w:t>
+      </w:r>
+    </w:p>
+    <w:p>
+      <w:pPr>
+        <w:pStyle w:val="BodyText"/>
+      </w:pPr>
+      <w:r>
+        <w:t xml:space="preserve">Acessar a Portaria (PDF)</w:t>
+      </w:r>
+    </w:p>
+    <w:p>
+      <w:pPr>
+        <w:pStyle w:val="BodyText"/>
+      </w:pPr>
+      <w:r>
+        <w:t xml:space="preserve">Arquivo:</w:t>
+      </w:r>
+    </w:p>
+    <w:p>
+      <w:pPr>
+        <w:pStyle w:val="BodyText"/>
+      </w:pPr>
+      <w:r>
+        <w:t xml:space="preserve">Subpages/Pena_justa/SEI_35032761_Portaria_549.pdf</w:t>
       </w:r>
     </w:p>
     <w:p>
@@ -5143,23 +5067,7 @@
         <w:pStyle w:val="BodyText"/>
       </w:pPr>
       <w:r>
-        <w:t xml:space="preserve">Acesso oficial à RBEP</w:t>
-      </w:r>
-    </w:p>
-    <w:p>
-      <w:pPr>
-        <w:pStyle w:val="BodyText"/>
-      </w:pPr>
-      <w:r>
-        <w:t xml:space="preserve">Texto para colar:</w:t>
-      </w:r>
-    </w:p>
-    <w:p>
-      <w:pPr>
-        <w:pStyle w:val="BodyText"/>
-      </w:pPr>
-      <w:r>
-        <w:t xml:space="preserve">O portal oficial da revista reúne notícias, edição atual, arquivo de edições e informações para submissão de textos.</w:t>
+        <w:t xml:space="preserve">Documentos públicos de referência</w:t>
       </w:r>
     </w:p>
     <w:p>
@@ -5179,7 +5087,7 @@
         </w:numPr>
       </w:pPr>
       <w:r>
-        <w:t xml:space="preserve">Portal oficial da Revista Brasileira de Execução Penal: https://rbepsenappen.mj.gov.br/index.php/RBEP/pt_BR</w:t>
+        <w:t xml:space="preserve">Plano Nacional Pena Justa (PDF): Subpages/Pena_justa/Plano_Nacional_Pena_Justa.pdf</w:t>
       </w:r>
     </w:p>
     <w:p>
@@ -5191,31 +5099,17 @@
         </w:numPr>
       </w:pPr>
       <w:r>
-        <w:t xml:space="preserve">Edição atual - edição completa: https://rbepsenappen.mj.gov.br/index.php/RBEP/pt_BR/issue/view/22/58</w:t>
-      </w:r>
-    </w:p>
-    <w:p>
-      <w:pPr>
-        <w:pStyle w:val="Compact"/>
-        <w:numPr>
-          <w:ilvl w:val="0"/>
-          <w:numId w:val="1017"/>
-        </w:numPr>
-      </w:pPr>
-      <w:r>
-        <w:t xml:space="preserve">Ver todas as edições: https://rbepsenappen.mj.gov.br/index.php/RBEP/pt_BR/issue/archive</w:t>
-      </w:r>
-    </w:p>
-    <w:p>
-      <w:pPr>
-        <w:pStyle w:val="Compact"/>
-        <w:numPr>
-          <w:ilvl w:val="0"/>
-          <w:numId w:val="1017"/>
-        </w:numPr>
-      </w:pPr>
-      <w:r>
-        <w:t xml:space="preserve">Enviar submissão: https://rbepsenappen.mj.gov.br/index.php/RBEP/pt_BR/about/submissions</w:t>
+        <w:t xml:space="preserve">10 coisas que você precisa saber sobre o Pena Justa (PDF): Subpages/Pena_justa/10_Coisas_que_você_precisa_saber_sobre_o_Pena_Justa.pdf</w:t>
+      </w:r>
+    </w:p>
+    <w:bookmarkEnd w:id="24"/>
+    <w:bookmarkStart w:id="25" w:name="X9010218d04cc9bed3b5085cf6721dd78b5ea4ec"/>
+    <w:p>
+      <w:pPr>
+        <w:pStyle w:val="Heading2"/>
+      </w:pPr>
+      <w:r>
+        <w:t xml:space="preserve">Subpágina 4 - Revista Brasileira de Execução Penal</w:t>
       </w:r>
     </w:p>
     <w:p>
@@ -5223,6 +5117,86 @@
         <w:pStyle w:val="FirstParagraph"/>
       </w:pPr>
       <w:r>
+        <w:t xml:space="preserve">Título da página:</w:t>
+      </w:r>
+    </w:p>
+    <w:p>
+      <w:pPr>
+        <w:pStyle w:val="BodyText"/>
+      </w:pPr>
+      <w:r>
+        <w:t xml:space="preserve">Revista Brasileira de Execução Penal</w:t>
+      </w:r>
+    </w:p>
+    <w:p>
+      <w:pPr>
+        <w:pStyle w:val="BodyText"/>
+      </w:pPr>
+      <w:r>
+        <w:t xml:space="preserve">Imagem de destaque:</w:t>
+      </w:r>
+    </w:p>
+    <w:p>
+      <w:pPr>
+        <w:pStyle w:val="BodyText"/>
+      </w:pPr>
+      <w:r>
+        <w:t xml:space="preserve">Documentação/Botao_RevistaBrasileira.png</w:t>
+      </w:r>
+    </w:p>
+    <w:p>
+      <w:pPr>
+        <w:pStyle w:val="BodyText"/>
+      </w:pPr>
+      <w:r>
+        <w:t xml:space="preserve">Texto alternativo sugerido:</w:t>
+      </w:r>
+    </w:p>
+    <w:p>
+      <w:pPr>
+        <w:pStyle w:val="BodyText"/>
+      </w:pPr>
+      <w:r>
+        <w:t xml:space="preserve">Botão institucional da Revista Brasileira de Execução Penal.</w:t>
+      </w:r>
+    </w:p>
+    <w:p>
+      <w:pPr>
+        <w:pStyle w:val="BodyText"/>
+      </w:pPr>
+      <w:r>
+        <w:t xml:space="preserve">Identificador editorial:</w:t>
+      </w:r>
+    </w:p>
+    <w:p>
+      <w:pPr>
+        <w:pStyle w:val="BodyText"/>
+      </w:pPr>
+      <w:r>
+        <w:t xml:space="preserve">Conteúdo Técnico e Projetos Estruturantes</w:t>
+      </w:r>
+    </w:p>
+    <w:p>
+      <w:pPr>
+        <w:pStyle w:val="BodyText"/>
+      </w:pPr>
+      <w:r>
+        <w:t xml:space="preserve">Texto de destaque:</w:t>
+      </w:r>
+    </w:p>
+    <w:p>
+      <w:pPr>
+        <w:pStyle w:val="BodyText"/>
+      </w:pPr>
+      <w:r>
+        <w:t xml:space="preserve">Em articulação com a Espen e a DCOM, esta subpágina reúne referências da Revista Brasileira de Execução Penal e destaca dossiês, notícias editoriais e conteúdos com interface com participação social, transparência e direitos no sistema penal.</w:t>
+      </w:r>
+    </w:p>
+    <w:p>
+      <w:pPr>
+        <w:pStyle w:val="BodyText"/>
+      </w:pPr>
+      <w:r>
         <w:t xml:space="preserve">Seção:</w:t>
       </w:r>
     </w:p>
@@ -5231,15 +5205,127 @@
         <w:pStyle w:val="BodyText"/>
       </w:pPr>
       <w:r>
-        <w:t xml:space="preserve">Referências institucionais</w:t>
-      </w:r>
-    </w:p>
-    <w:p>
-      <w:pPr>
-        <w:pStyle w:val="BodyText"/>
-      </w:pPr>
-      <w:r>
-        <w:t xml:space="preserve">Itens para colar:</w:t>
+        <w:t xml:space="preserve">A Revista</w:t>
+      </w:r>
+    </w:p>
+    <w:p>
+      <w:pPr>
+        <w:pStyle w:val="BodyText"/>
+      </w:pPr>
+      <w:r>
+        <w:t xml:space="preserve">Texto para colar:</w:t>
+      </w:r>
+    </w:p>
+    <w:p>
+      <w:pPr>
+        <w:pStyle w:val="BodyText"/>
+      </w:pPr>
+      <w:r>
+        <w:t xml:space="preserve">A Revista Brasileira de Execução Penal é o periódico técnico-científico da Secretaria Nacional de Políticas Penais (Senappen/MJSP) e constitui espaço de circulação de artigos, documentos inéditos, entrevistas, relatos de experiência e boas práticas relacionados à execução penal.</w:t>
+      </w:r>
+    </w:p>
+    <w:p>
+      <w:pPr>
+        <w:pStyle w:val="BodyText"/>
+      </w:pPr>
+      <w:r>
+        <w:t xml:space="preserve">A segunda linha do escopo:</w:t>
+      </w:r>
+    </w:p>
+    <w:p>
+      <w:pPr>
+        <w:pStyle w:val="BodyText"/>
+      </w:pPr>
+      <w:r>
+        <w:t xml:space="preserve">No contexto da Ouvidoria, a publicação contribui para aproximar produção técnica, debate qualificado e controle social, reforçando o papel da Ouvidoria como ponte entre Estado e sociedade.</w:t>
+      </w:r>
+    </w:p>
+    <w:p>
+      <w:pPr>
+        <w:pStyle w:val="BodyText"/>
+      </w:pPr>
+      <w:r>
+        <w:t xml:space="preserve">Seção:</w:t>
+      </w:r>
+    </w:p>
+    <w:p>
+      <w:pPr>
+        <w:pStyle w:val="BodyText"/>
+      </w:pPr>
+      <w:r>
+        <w:t xml:space="preserve">Sobre a revista</w:t>
+      </w:r>
+    </w:p>
+    <w:p>
+      <w:pPr>
+        <w:pStyle w:val="BodyText"/>
+      </w:pPr>
+      <w:r>
+        <w:t xml:space="preserve">Texto para colar:</w:t>
+      </w:r>
+    </w:p>
+    <w:p>
+      <w:pPr>
+        <w:pStyle w:val="BodyText"/>
+      </w:pPr>
+      <w:r>
+        <w:t xml:space="preserve">A RBEP publica artigos, documentos inéditos, entrevistas, relatos de experiência e descrição de boas práticas que relacionam a experiência profissional, o conhecimento produzido sobre a matéria e o cumprimento da legislação nacional.</w:t>
+      </w:r>
+    </w:p>
+    <w:p>
+      <w:pPr>
+        <w:pStyle w:val="BodyText"/>
+      </w:pPr>
+      <w:r>
+        <w:t xml:space="preserve">A segunda linha da seção:</w:t>
+      </w:r>
+    </w:p>
+    <w:p>
+      <w:pPr>
+        <w:pStyle w:val="BodyText"/>
+      </w:pPr>
+      <w:r>
+        <w:t xml:space="preserve">Os conteúdos são organizados em dossiês temáticos semestrais, e a revista recebeu qualificação A4 na classificação de periódicos Qualis Capes na avaliação do quadriênio 2021-2024.</w:t>
+      </w:r>
+    </w:p>
+    <w:p>
+      <w:pPr>
+        <w:pStyle w:val="BodyText"/>
+      </w:pPr>
+      <w:r>
+        <w:t xml:space="preserve">Seção:</w:t>
+      </w:r>
+    </w:p>
+    <w:p>
+      <w:pPr>
+        <w:pStyle w:val="BodyText"/>
+      </w:pPr>
+      <w:r>
+        <w:t xml:space="preserve">Acesso oficial à RBEP</w:t>
+      </w:r>
+    </w:p>
+    <w:p>
+      <w:pPr>
+        <w:pStyle w:val="BodyText"/>
+      </w:pPr>
+      <w:r>
+        <w:t xml:space="preserve">Texto para colar:</w:t>
+      </w:r>
+    </w:p>
+    <w:p>
+      <w:pPr>
+        <w:pStyle w:val="BodyText"/>
+      </w:pPr>
+      <w:r>
+        <w:t xml:space="preserve">O portal oficial da revista reúne notícias, edição atual, arquivo de edições e informações para submissão de textos.</w:t>
+      </w:r>
+    </w:p>
+    <w:p>
+      <w:pPr>
+        <w:pStyle w:val="BodyText"/>
+      </w:pPr>
+      <w:r>
+        <w:t xml:space="preserve">Links:</w:t>
       </w:r>
     </w:p>
     <w:p>
@@ -5251,7 +5337,7 @@
         </w:numPr>
       </w:pPr>
       <w:r>
-        <w:t xml:space="preserve">Qualis Capes 2021-2024: A4.</w:t>
+        <w:t xml:space="preserve">Portal oficial da Revista Brasileira de Execução Penal: https://rbepsenappen.mj.gov.br/index.php/RBEP/pt_BR</w:t>
       </w:r>
     </w:p>
     <w:p>
@@ -5263,7 +5349,7 @@
         </w:numPr>
       </w:pPr>
       <w:r>
-        <w:t xml:space="preserve">ISSN: 2675-1895.</w:t>
+        <w:t xml:space="preserve">Edição atual - edição completa: https://rbepsenappen.mj.gov.br/index.php/RBEP/pt_BR/issue/view/22/58</w:t>
       </w:r>
     </w:p>
     <w:p>
@@ -5275,7 +5361,7 @@
         </w:numPr>
       </w:pPr>
       <w:r>
-        <w:t xml:space="preserve">e-ISSN: 2675-1860.</w:t>
+        <w:t xml:space="preserve">Ver todas as edições: https://rbepsenappen.mj.gov.br/index.php/RBEP/pt_BR/issue/archive</w:t>
       </w:r>
     </w:p>
     <w:p>
@@ -5287,11 +5373,83 @@
         </w:numPr>
       </w:pPr>
       <w:r>
+        <w:t xml:space="preserve">Enviar submissão: https://rbepsenappen.mj.gov.br/index.php/RBEP/pt_BR/about/submissions</w:t>
+      </w:r>
+    </w:p>
+    <w:p>
+      <w:pPr>
+        <w:pStyle w:val="FirstParagraph"/>
+      </w:pPr>
+      <w:r>
+        <w:t xml:space="preserve">Seção:</w:t>
+      </w:r>
+    </w:p>
+    <w:p>
+      <w:pPr>
+        <w:pStyle w:val="BodyText"/>
+      </w:pPr>
+      <w:r>
+        <w:t xml:space="preserve">Referências institucionais</w:t>
+      </w:r>
+    </w:p>
+    <w:p>
+      <w:pPr>
+        <w:pStyle w:val="BodyText"/>
+      </w:pPr>
+      <w:r>
+        <w:t xml:space="preserve">Itens para colar:</w:t>
+      </w:r>
+    </w:p>
+    <w:p>
+      <w:pPr>
+        <w:pStyle w:val="Compact"/>
+        <w:numPr>
+          <w:ilvl w:val="0"/>
+          <w:numId w:val="1019"/>
+        </w:numPr>
+      </w:pPr>
+      <w:r>
+        <w:t xml:space="preserve">Qualis Capes 2021-2024: A4.</w:t>
+      </w:r>
+    </w:p>
+    <w:p>
+      <w:pPr>
+        <w:pStyle w:val="Compact"/>
+        <w:numPr>
+          <w:ilvl w:val="0"/>
+          <w:numId w:val="1019"/>
+        </w:numPr>
+      </w:pPr>
+      <w:r>
+        <w:t xml:space="preserve">ISSN: 2675-1895.</w:t>
+      </w:r>
+    </w:p>
+    <w:p>
+      <w:pPr>
+        <w:pStyle w:val="Compact"/>
+        <w:numPr>
+          <w:ilvl w:val="0"/>
+          <w:numId w:val="1019"/>
+        </w:numPr>
+      </w:pPr>
+      <w:r>
+        <w:t xml:space="preserve">e-ISSN: 2675-1860.</w:t>
+      </w:r>
+    </w:p>
+    <w:p>
+      <w:pPr>
+        <w:pStyle w:val="Compact"/>
+        <w:numPr>
+          <w:ilvl w:val="0"/>
+          <w:numId w:val="1019"/>
+        </w:numPr>
+      </w:pPr>
+      <w:r>
         <w:t xml:space="preserve">Contato da revista: rbep@mj.gov.br.</w:t>
       </w:r>
     </w:p>
-    <w:bookmarkEnd w:id="24"/>
-    <w:bookmarkStart w:id="25" w:name="observações-sobre-formatação"/>
+    <w:bookmarkEnd w:id="25"/>
+    <w:bookmarkStart w:id="26" w:name="observações-sobre-formatação"/>
     <w:p>
       <w:pPr>
         <w:pStyle w:val="Heading2"/>
@@ -5308,8 +5466,8 @@
         <w:t xml:space="preserve">Na prévia local, os textos corridos foram configurados com alinhamento justificado. No gov.br, esse resultado dependerá das opções disponíveis no editor oficial. Caso o editor permita alinhamento do parágrafo, recomenda-se aplicar alinhamento justificado aos textos corridos e manter títulos, links curtos e botões com o alinhamento padrão do componente.</w:t>
       </w:r>
     </w:p>
-    <w:bookmarkEnd w:id="25"/>
-    <w:bookmarkStart w:id="26" w:name="Xf7fe357b8ad8797f48d42cdb4ec1361a8fa006f"/>
+    <w:bookmarkEnd w:id="26"/>
+    <w:bookmarkStart w:id="27" w:name="Xf7fe357b8ad8797f48d42cdb4ec1361a8fa006f"/>
     <w:p>
       <w:pPr>
         <w:pStyle w:val="Heading2"/>
@@ -5342,8 +5500,8 @@
         <w:t xml:space="preserve">Há precedentes úteis dentro do próprio ecossistema da Senappen. A página da ESPEN e a subpágina da RESPEN mostram que o portal oficial já comporta texto institucional, links de destaque para documentos em PDF, listas simples e tabelas extensas por unidade federativa quando houver base oficial validada. Da mesma forma, o portal oficial da RBEP confirma a existência de referências institucionais, acesso à edição atual, arquivo de edições e informações para submissão que podem ser indicadas na subpágina temática da Revista.</w:t>
       </w:r>
     </w:p>
-    <w:bookmarkEnd w:id="26"/>
     <w:bookmarkEnd w:id="27"/>
+    <w:bookmarkEnd w:id="28"/>
     <w:sectPr>
       <w:footnotePr>
         <w:numRestart w:val="eachSect"/>
@@ -5612,6 +5770,9 @@
     <w:abstractNumId w:val="991"/>
   </w:num>
   <w:num w:numId="1018">
+    <w:abstractNumId w:val="991"/>
+  </w:num>
+  <w:num w:numId="1019">
     <w:abstractNumId w:val="991"/>
   </w:num>
 </w:numbering>

</xml_diff>

<commit_message>
Inclui notícias da ouvidoria na home da ONASP
</commit_message>
<xml_diff>
--- a/Documentação/estrutura_completa_pagina_onasp_para_dicom.docx
+++ b/Documentação/estrutura_completa_pagina_onasp_para_dicom.docx
@@ -2,7 +2,7 @@
 <file path=word/document.xml><?xml version="1.0" encoding="utf-8"?>
 <w:document xmlns:w="http://schemas.openxmlformats.org/wordprocessingml/2006/main" xmlns:m="http://schemas.openxmlformats.org/officeDocument/2006/math" xmlns:r="http://schemas.openxmlformats.org/officeDocument/2006/relationships" xmlns:o="urn:schemas-microsoft-com:office:office" xmlns:v="urn:schemas-microsoft-com:vml" xmlns:w10="urn:schemas-microsoft-com:office:word" xmlns:a="http://schemas.openxmlformats.org/drawingml/2006/main" xmlns:pic="http://schemas.openxmlformats.org/drawingml/2006/picture" xmlns:wp="http://schemas.openxmlformats.org/drawingml/2006/wordprocessingDrawing">
   <w:body>
-    <w:bookmarkStart w:id="28" w:name="X651419ee04b722d3d77fb0d3ef8f3cab38d582a"/>
+    <w:bookmarkStart w:id="36" w:name="X651419ee04b722d3d77fb0d3ef8f3cab38d582a"/>
     <w:p>
       <w:pPr>
         <w:pStyle w:val="Heading1"/>
@@ -53,7 +53,7 @@
       </w:r>
     </w:p>
     <w:bookmarkEnd w:id="9"/>
-    <w:bookmarkStart w:id="21" w:name="Xbfa4aa77b994200a22daf31aefaeaa021a9038a"/>
+    <w:bookmarkStart w:id="29" w:name="Xbfa4aa77b994200a22daf31aefaeaa021a9038a"/>
     <w:p>
       <w:pPr>
         <w:pStyle w:val="Heading2"/>
@@ -1100,13 +1100,13 @@
       </w:r>
     </w:p>
     <w:bookmarkEnd w:id="18"/>
-    <w:bookmarkStart w:id="19" w:name="X53583b821a0a3fdc6c987398bb240b1b43b94e3"/>
+    <w:bookmarkStart w:id="26" w:name="bloco-10---notícias-da-ouvidoria"/>
     <w:p>
       <w:pPr>
         <w:pStyle w:val="Heading3"/>
       </w:pPr>
       <w:r>
-        <w:t xml:space="preserve">Bloco 10 - Painel de Tratamento de Demandas</w:t>
+        <w:t xml:space="preserve">Bloco 10 - Notícias da Ouvidoria</w:t>
       </w:r>
     </w:p>
     <w:p>
@@ -1122,81 +1122,7 @@
         <w:pStyle w:val="BodyText"/>
       </w:pPr>
       <w:r>
-        <w:t xml:space="preserve">Painel de Tratamento de Demandas da Ouvidoria Nacional de Serviços Penais</w:t>
-      </w:r>
-    </w:p>
-    <w:p>
-      <w:pPr>
-        <w:pStyle w:val="BodyText"/>
-      </w:pPr>
-      <w:r>
-        <w:t xml:space="preserve">Texto para colar:</w:t>
-      </w:r>
-    </w:p>
-    <w:p>
-      <w:pPr>
-        <w:pStyle w:val="BodyText"/>
-      </w:pPr>
-      <w:r>
-        <w:t xml:space="preserve">O Painel de Tratamento de Demandas da Ouvidoria Nacional de Serviços Penais (Onasp) é uma ferramenta de transparência ativa e gestão estratégica. Por meio de tecnologia de Business Intelligence (BI), o painel permite ao cidadão pesquisar e visualizar estatísticas atualizadas sobre as manifestações recebidas (denúncias, reclamações, solicitações, sugestões e elogios), monitorando os indicadores de desempenho e os temas mais recorrentes no sistema penal. A base de dados contempla registros a partir de janeiro de 2023, sendo atualizada periodicamente para garantir o controle social efetivo.</w:t>
-      </w:r>
-    </w:p>
-    <w:p>
-      <w:pPr>
-        <w:pStyle w:val="BodyText"/>
-      </w:pPr>
-      <w:r>
-        <w:t xml:space="preserve">Embed do Power BI:</w:t>
-      </w:r>
-    </w:p>
-    <w:p>
-      <w:pPr>
-        <w:pStyle w:val="BodyText"/>
-      </w:pPr>
-      <w:r>
-        <w:t xml:space="preserve">https://app.powerbi.com/view?r=eyJrIjoiMDU5NGVlNjQtMjZmZi00YzI0LTk0ZTktMzQwMzdkM2QyMDg5IiwidCI6ImViMDkwNDIwLTQ0NGMtNDNmNy05MWYyLTRiOGRhNmJmZThlMSJ9</w:t>
-      </w:r>
-    </w:p>
-    <w:p>
-      <w:pPr>
-        <w:pStyle w:val="BodyText"/>
-      </w:pPr>
-      <w:r>
-        <w:t xml:space="preserve">Título acessível sugerido para o iframe:</w:t>
-      </w:r>
-    </w:p>
-    <w:p>
-      <w:pPr>
-        <w:pStyle w:val="BodyText"/>
-      </w:pPr>
-      <w:r>
-        <w:t xml:space="preserve">Painel de Tratamento de Demandas da ONASP</w:t>
-      </w:r>
-    </w:p>
-    <w:bookmarkEnd w:id="19"/>
-    <w:bookmarkStart w:id="20" w:name="bloco-11---legislação"/>
-    <w:p>
-      <w:pPr>
-        <w:pStyle w:val="Heading3"/>
-      </w:pPr>
-      <w:r>
-        <w:t xml:space="preserve">Bloco 11 - Legislação</w:t>
-      </w:r>
-    </w:p>
-    <w:p>
-      <w:pPr>
-        <w:pStyle w:val="FirstParagraph"/>
-      </w:pPr>
-      <w:r>
-        <w:t xml:space="preserve">Título da seção:</w:t>
-      </w:r>
-    </w:p>
-    <w:p>
-      <w:pPr>
-        <w:pStyle w:val="BodyText"/>
-      </w:pPr>
-      <w:r>
-        <w:t xml:space="preserve">Legislação</w:t>
+        <w:t xml:space="preserve">Notícias da Ouvidoria</w:t>
       </w:r>
     </w:p>
     <w:p>
@@ -1212,15 +1138,15 @@
         <w:pStyle w:val="BodyText"/>
       </w:pPr>
       <w:r>
-        <w:t xml:space="preserve">Os normativos basilares abaixo reúnem referências atualmente disponíveis no pacote documental da Ouvidoria e podem ser publicados como links simples na homepage, abaixo do painel de tratamento de demandas.</w:t>
-      </w:r>
-    </w:p>
-    <w:p>
-      <w:pPr>
-        <w:pStyle w:val="BodyText"/>
-      </w:pPr>
-      <w:r>
-        <w:t xml:space="preserve">Links a publicar:</w:t>
+        <w:t xml:space="preserve">Seleção de notícias publicadas no portal da SENAPPEN com relação direta à ONASP, à Rede de Ouvidorias e aos canais de atendimento ao cidadão.</w:t>
+      </w:r>
+    </w:p>
+    <w:p>
+      <w:pPr>
+        <w:pStyle w:val="BodyText"/>
+      </w:pPr>
+      <w:r>
+        <w:t xml:space="preserve">Lista de notícias sugerida:</w:t>
       </w:r>
     </w:p>
     <w:p>
@@ -1232,13 +1158,24 @@
         </w:numPr>
       </w:pPr>
       <w:r>
-        <w:t xml:space="preserve">Lei nº 13.460, de 26 de junho de 2017: Documentação/Normativas Basilares de Ouvidoria/LEI N°13.460.2017.pdf</w:t>
+        <w:t xml:space="preserve">27/04/2026 -</w:t>
       </w:r>
       <w:r>
         <w:t xml:space="preserve"> </w:t>
       </w:r>
-      <w:r>
-        <w:t xml:space="preserve">Descrição: Dispõe sobre participação, proteção e defesa dos direitos do usuário dos serviços públicos da administração pública.</w:t>
+      <w:hyperlink r:id="rId19">
+        <w:r>
+          <w:rPr>
+            <w:rStyle w:val="Hyperlink"/>
+          </w:rPr>
+          <w:t xml:space="preserve">18ª Reunião do CONSEJ: SENAPPEN reforça parceria com estados para o aprimoramento das políticas penais</w:t>
+        </w:r>
+      </w:hyperlink>
+      <w:r>
+        <w:t xml:space="preserve"> </w:t>
+      </w:r>
+      <w:r>
+        <w:t xml:space="preserve">Descrição: A pauta destacou a atuação da Ouvidoria e da EMA/SENAPPEN na articulação federativa.</w:t>
       </w:r>
     </w:p>
     <w:p>
@@ -1250,13 +1187,24 @@
         </w:numPr>
       </w:pPr>
       <w:r>
-        <w:t xml:space="preserve">Decreto nº 9.492, de 5 de setembro de 2018: Documentação/Normativas Basilares de Ouvidoria/Decreto N°9.492.2018.pdf</w:t>
+        <w:t xml:space="preserve">14/04/2026 -</w:t>
       </w:r>
       <w:r>
         <w:t xml:space="preserve"> </w:t>
       </w:r>
-      <w:r>
-        <w:t xml:space="preserve">Descrição: Regulamenta a Lei nº 13.460, de 26 de junho de 2017, institui o Sistema de Ouvidoria do Poder Executivo federal e altera o Decreto nº 8.910, de 22 de novembro de 2016.</w:t>
+      <w:hyperlink r:id="rId20">
+        <w:r>
+          <w:rPr>
+            <w:rStyle w:val="Hyperlink"/>
+          </w:rPr>
+          <w:t xml:space="preserve">SENAPPEN fomenta atuação da Ouvidoria da Polícia Penal de Goiás com apoio à modernização tecnológica</w:t>
+        </w:r>
+      </w:hyperlink>
+      <w:r>
+        <w:t xml:space="preserve"> </w:t>
+      </w:r>
+      <w:r>
+        <w:t xml:space="preserve">Descrição: Ação voltada ao fortalecimento da escuta institucional, com chatbot e ampliação do acesso aos canais de atendimento.</w:t>
       </w:r>
     </w:p>
     <w:p>
@@ -1268,13 +1216,24 @@
         </w:numPr>
       </w:pPr>
       <w:r>
-        <w:t xml:space="preserve">Decreto nº 10.153, de 3 de dezembro de 2019: Documentação/Normativas Basilares de Ouvidoria/Decreto N°10.153.2019.pdf</w:t>
+        <w:t xml:space="preserve">13/04/2026 -</w:t>
       </w:r>
       <w:r>
         <w:t xml:space="preserve"> </w:t>
       </w:r>
-      <w:r>
-        <w:t xml:space="preserve">Descrição: Dispõe sobre as salvaguardas de proteção à identidade dos denunciantes de ilícitos e de irregularidades praticados contra a administração pública federal direta e indireta.</w:t>
+      <w:hyperlink r:id="rId21">
+        <w:r>
+          <w:rPr>
+            <w:rStyle w:val="Hyperlink"/>
+          </w:rPr>
+          <w:t xml:space="preserve">VI Encontro Nacional das Ouvidorias do Sistema Penal fortalece a escuta qualificada e a participação social</w:t>
+        </w:r>
+      </w:hyperlink>
+      <w:r>
+        <w:t xml:space="preserve"> </w:t>
+      </w:r>
+      <w:r>
+        <w:t xml:space="preserve">Descrição: O encontro marcou a criação da RENOSPEN e a publicação de diretrizes para atuação das ouvidorias.</w:t>
       </w:r>
     </w:p>
     <w:p>
@@ -1286,13 +1245,24 @@
         </w:numPr>
       </w:pPr>
       <w:r>
-        <w:t xml:space="preserve">Portaria Normativa CGU nº 116, de 18 de março de 2024: Documentação/Normativas Basilares de Ouvidoria/Portaria Normativa CGU - N°116.2024.pdf</w:t>
+        <w:t xml:space="preserve">02/04/2026 -</w:t>
       </w:r>
       <w:r>
         <w:t xml:space="preserve"> </w:t>
       </w:r>
-      <w:r>
-        <w:t xml:space="preserve">Descrição: Estabelece orientações para o exercício das competências das unidades do Sistema de Ouvidoria do Poder Executivo Federal, instituído pelo Decreto nº 9.492, de 5 de setembro de 2018, no âmbito do Poder Executivo federal, e dá outras providências.</w:t>
+      <w:hyperlink r:id="rId22">
+        <w:r>
+          <w:rPr>
+            <w:rStyle w:val="Hyperlink"/>
+          </w:rPr>
+          <w:t xml:space="preserve">Ouvidoria da SENAPPEN divulga orientações sobre recebimento e tratamento de denúncias</w:t>
+        </w:r>
+      </w:hyperlink>
+      <w:r>
+        <w:t xml:space="preserve"> </w:t>
+      </w:r>
+      <w:r>
+        <w:t xml:space="preserve">Descrição: A notícia apresenta o fluxo de denúncias da ONASP e reforça os canais de atendimento e participação social.</w:t>
       </w:r>
     </w:p>
     <w:p>
@@ -1304,13 +1274,24 @@
         </w:numPr>
       </w:pPr>
       <w:r>
-        <w:t xml:space="preserve">Lei nº 12.527, de 18 de novembro de 2011: Documentação/Normativas Basilares de Ouvidoria/LEI N°12.527.2011.pdf</w:t>
+        <w:t xml:space="preserve">31/10/2025 -</w:t>
       </w:r>
       <w:r>
         <w:t xml:space="preserve"> </w:t>
       </w:r>
-      <w:r>
-        <w:t xml:space="preserve">Descrição: Regula o acesso a informações previsto no inciso XXXIII do art. 5º, no inciso II do § 3º do art. 37 e no § 2º do art. 216 da Constituição Federal.</w:t>
+      <w:hyperlink r:id="rId23">
+        <w:r>
+          <w:rPr>
+            <w:rStyle w:val="Hyperlink"/>
+          </w:rPr>
+          <w:t xml:space="preserve">Com foco em escuta qualificada, SENAPPEN amplia diálogo com ouvidorias de São Paulo e Goiás</w:t>
+        </w:r>
+      </w:hyperlink>
+      <w:r>
+        <w:t xml:space="preserve"> </w:t>
+      </w:r>
+      <w:r>
+        <w:t xml:space="preserve">Descrição: A agenda fortaleceu a Rede Nacional de Ouvidorias e o intercâmbio de boas práticas com os estados.</w:t>
       </w:r>
     </w:p>
     <w:p>
@@ -1322,24 +1303,63 @@
         </w:numPr>
       </w:pPr>
       <w:r>
-        <w:t xml:space="preserve">Lei nº 13.709, de 14 de agosto de 2018: Documentação/Normativas Basilares de Ouvidoria/LEI N°13.709.2018.pdf</w:t>
+        <w:t xml:space="preserve">06/12/2024 -</w:t>
       </w:r>
       <w:r>
         <w:t xml:space="preserve"> </w:t>
       </w:r>
-      <w:r>
-        <w:t xml:space="preserve">Descrição: Dispõe sobre a proteção de dados pessoais e altera a Lei nº 12.965, de 23 de abril de 2014 (Marco Civil da Internet).</w:t>
-      </w:r>
-    </w:p>
-    <w:bookmarkEnd w:id="20"/>
-    <w:bookmarkEnd w:id="21"/>
-    <w:bookmarkStart w:id="22" w:name="subpágina-1---rede-de-ouvidorias"/>
-    <w:p>
-      <w:pPr>
-        <w:pStyle w:val="Heading2"/>
-      </w:pPr>
-      <w:r>
-        <w:t xml:space="preserve">Subpágina 1 - Rede de Ouvidorias</w:t>
+      <w:hyperlink r:id="rId24">
+        <w:r>
+          <w:rPr>
+            <w:rStyle w:val="Hyperlink"/>
+          </w:rPr>
+          <w:t xml:space="preserve">SENAPPEN lança canal de comunicação via WhatsApp para facilitar o acesso a informações sobre o sistema de execução penal</w:t>
+        </w:r>
+      </w:hyperlink>
+      <w:r>
+        <w:t xml:space="preserve"> </w:t>
+      </w:r>
+      <w:r>
+        <w:t xml:space="preserve">Descrição: Lançamento do canal da ONASP no WhatsApp para tornar o atendimento mais ágil e acessível.</w:t>
+      </w:r>
+    </w:p>
+    <w:p>
+      <w:pPr>
+        <w:pStyle w:val="Compact"/>
+        <w:numPr>
+          <w:ilvl w:val="0"/>
+          <w:numId w:val="1005"/>
+        </w:numPr>
+      </w:pPr>
+      <w:r>
+        <w:t xml:space="preserve">25/07/2023 -</w:t>
+      </w:r>
+      <w:r>
+        <w:t xml:space="preserve"> </w:t>
+      </w:r>
+      <w:hyperlink r:id="rId25">
+        <w:r>
+          <w:rPr>
+            <w:rStyle w:val="Hyperlink"/>
+          </w:rPr>
+          <w:t xml:space="preserve">ONASP ministra treinamento para servidores do estado do RN</w:t>
+        </w:r>
+      </w:hyperlink>
+      <w:r>
+        <w:t xml:space="preserve"> </w:t>
+      </w:r>
+      <w:r>
+        <w:t xml:space="preserve">Descrição: Capacitação com foco em ouvidoria para aprimorar o atendimento e os fluxos de manifestação no sistema penal.</w:t>
+      </w:r>
+    </w:p>
+    <w:bookmarkEnd w:id="26"/>
+    <w:bookmarkStart w:id="27" w:name="X66bb28c02d722bd407aa00f2f1f0e42b630fd55"/>
+    <w:p>
+      <w:pPr>
+        <w:pStyle w:val="Heading3"/>
+      </w:pPr>
+      <w:r>
+        <w:t xml:space="preserve">Bloco 11 - Painel de Tratamento de Demandas</w:t>
       </w:r>
     </w:p>
     <w:p>
@@ -1347,95 +1367,15 @@
         <w:pStyle w:val="FirstParagraph"/>
       </w:pPr>
       <w:r>
-        <w:t xml:space="preserve">Título da página:</w:t>
-      </w:r>
-    </w:p>
-    <w:p>
-      <w:pPr>
-        <w:pStyle w:val="BodyText"/>
-      </w:pPr>
-      <w:r>
-        <w:t xml:space="preserve">Rede de Ouvidorias</w:t>
-      </w:r>
-    </w:p>
-    <w:p>
-      <w:pPr>
-        <w:pStyle w:val="BodyText"/>
-      </w:pPr>
-      <w:r>
-        <w:t xml:space="preserve">Imagem de destaque:</w:t>
-      </w:r>
-    </w:p>
-    <w:p>
-      <w:pPr>
-        <w:pStyle w:val="BodyText"/>
-      </w:pPr>
-      <w:r>
-        <w:t xml:space="preserve">Documentação/Botao_Renospen.png</w:t>
-      </w:r>
-    </w:p>
-    <w:p>
-      <w:pPr>
-        <w:pStyle w:val="BodyText"/>
-      </w:pPr>
-      <w:r>
-        <w:t xml:space="preserve">Texto alternativo sugerido:</w:t>
-      </w:r>
-    </w:p>
-    <w:p>
-      <w:pPr>
-        <w:pStyle w:val="BodyText"/>
-      </w:pPr>
-      <w:r>
-        <w:t xml:space="preserve">Botão institucional da Rede de Ouvidorias.</w:t>
-      </w:r>
-    </w:p>
-    <w:p>
-      <w:pPr>
-        <w:pStyle w:val="BodyText"/>
-      </w:pPr>
-      <w:r>
-        <w:t xml:space="preserve">Identificador editorial:</w:t>
-      </w:r>
-    </w:p>
-    <w:p>
-      <w:pPr>
-        <w:pStyle w:val="BodyText"/>
-      </w:pPr>
-      <w:r>
-        <w:t xml:space="preserve">Conteúdo Técnico e Projetos Estruturantes</w:t>
-      </w:r>
-    </w:p>
-    <w:p>
-      <w:pPr>
-        <w:pStyle w:val="BodyText"/>
-      </w:pPr>
-      <w:r>
-        <w:t xml:space="preserve">Texto de destaque:</w:t>
-      </w:r>
-    </w:p>
-    <w:p>
-      <w:pPr>
-        <w:pStyle w:val="BodyText"/>
-      </w:pPr>
-      <w:r>
-        <w:t xml:space="preserve">Iniciativa do Plano Pena Justa voltada à cooperação federativa, à harmonização de procedimentos e ao fortalecimento da proteção de direitos no âmbito das Ouvidorias de Serviços Penais.</w:t>
-      </w:r>
-    </w:p>
-    <w:p>
-      <w:pPr>
-        <w:pStyle w:val="BodyText"/>
-      </w:pPr>
-      <w:r>
-        <w:t xml:space="preserve">Seção:</w:t>
-      </w:r>
-    </w:p>
-    <w:p>
-      <w:pPr>
-        <w:pStyle w:val="BodyText"/>
-      </w:pPr>
-      <w:r>
-        <w:t xml:space="preserve">Renospen</w:t>
+        <w:t xml:space="preserve">Título da seção:</w:t>
+      </w:r>
+    </w:p>
+    <w:p>
+      <w:pPr>
+        <w:pStyle w:val="BodyText"/>
+      </w:pPr>
+      <w:r>
+        <w:t xml:space="preserve">Painel de Tratamento de Demandas da Ouvidoria Nacional de Serviços Penais</w:t>
       </w:r>
     </w:p>
     <w:p>
@@ -1451,47 +1391,89 @@
         <w:pStyle w:val="BodyText"/>
       </w:pPr>
       <w:r>
-        <w:t xml:space="preserve">A Rede de Ouvidorias visa manter a articulação entre as unidades responsáveis pela escuta institucional no sistema penal, com o objetivo de fortalecer a cooperação federativa, qualificar o atendimento ao cidadão e ampliar a proteção de direitos em âmbito nacional.</w:t>
-      </w:r>
-    </w:p>
-    <w:p>
-      <w:pPr>
-        <w:pStyle w:val="BodyText"/>
-      </w:pPr>
-      <w:r>
-        <w:t xml:space="preserve">A segunda linha do escopo:</w:t>
-      </w:r>
-    </w:p>
-    <w:p>
-      <w:pPr>
-        <w:pStyle w:val="BodyText"/>
-      </w:pPr>
-      <w:r>
-        <w:t xml:space="preserve">No contexto da Ouvidoria Nacional de Serviços Penais, esta subpágina reúne referências públicas da iniciativa, favorecendo o intercâmbio de práticas, a harmonização de procedimentos e a consolidação de parâmetros voltados à transparência e ao controle social.</w:t>
-      </w:r>
-    </w:p>
-    <w:p>
-      <w:pPr>
-        <w:pStyle w:val="BodyText"/>
-      </w:pPr>
-      <w:r>
-        <w:t xml:space="preserve">Seção:</w:t>
-      </w:r>
-    </w:p>
-    <w:p>
-      <w:pPr>
-        <w:pStyle w:val="BodyText"/>
-      </w:pPr>
-      <w:r>
-        <w:t xml:space="preserve">Objetivos da Rede</w:t>
-      </w:r>
-    </w:p>
-    <w:p>
-      <w:pPr>
-        <w:pStyle w:val="BodyText"/>
-      </w:pPr>
-      <w:r>
-        <w:t xml:space="preserve">Itens para colar:</w:t>
+        <w:t xml:space="preserve">O Painel de Tratamento de Demandas da Ouvidoria Nacional de Serviços Penais (Onasp) é uma ferramenta de transparência ativa e gestão estratégica. Por meio de tecnologia de Business Intelligence (BI), o painel permite ao cidadão pesquisar e visualizar estatísticas atualizadas sobre as manifestações recebidas (denúncias, reclamações, solicitações, sugestões e elogios), monitorando os indicadores de desempenho e os temas mais recorrentes no sistema penal. A base de dados contempla registros a partir de janeiro de 2023, sendo atualizada periodicamente para garantir o controle social efetivo.</w:t>
+      </w:r>
+    </w:p>
+    <w:p>
+      <w:pPr>
+        <w:pStyle w:val="BodyText"/>
+      </w:pPr>
+      <w:r>
+        <w:t xml:space="preserve">Embed do Power BI:</w:t>
+      </w:r>
+    </w:p>
+    <w:p>
+      <w:pPr>
+        <w:pStyle w:val="BodyText"/>
+      </w:pPr>
+      <w:r>
+        <w:t xml:space="preserve">https://app.powerbi.com/view?r=eyJrIjoiMDU5NGVlNjQtMjZmZi00YzI0LTk0ZTktMzQwMzdkM2QyMDg5IiwidCI6ImViMDkwNDIwLTQ0NGMtNDNmNy05MWYyLTRiOGRhNmJmZThlMSJ9</w:t>
+      </w:r>
+    </w:p>
+    <w:p>
+      <w:pPr>
+        <w:pStyle w:val="BodyText"/>
+      </w:pPr>
+      <w:r>
+        <w:t xml:space="preserve">Título acessível sugerido para o iframe:</w:t>
+      </w:r>
+    </w:p>
+    <w:p>
+      <w:pPr>
+        <w:pStyle w:val="BodyText"/>
+      </w:pPr>
+      <w:r>
+        <w:t xml:space="preserve">Painel de Tratamento de Demandas da ONASP</w:t>
+      </w:r>
+    </w:p>
+    <w:bookmarkEnd w:id="27"/>
+    <w:bookmarkStart w:id="28" w:name="bloco-12---legislação"/>
+    <w:p>
+      <w:pPr>
+        <w:pStyle w:val="Heading3"/>
+      </w:pPr>
+      <w:r>
+        <w:t xml:space="preserve">Bloco 12 - Legislação</w:t>
+      </w:r>
+    </w:p>
+    <w:p>
+      <w:pPr>
+        <w:pStyle w:val="FirstParagraph"/>
+      </w:pPr>
+      <w:r>
+        <w:t xml:space="preserve">Título da seção:</w:t>
+      </w:r>
+    </w:p>
+    <w:p>
+      <w:pPr>
+        <w:pStyle w:val="BodyText"/>
+      </w:pPr>
+      <w:r>
+        <w:t xml:space="preserve">Legislação</w:t>
+      </w:r>
+    </w:p>
+    <w:p>
+      <w:pPr>
+        <w:pStyle w:val="BodyText"/>
+      </w:pPr>
+      <w:r>
+        <w:t xml:space="preserve">Texto introdutório sugerido:</w:t>
+      </w:r>
+    </w:p>
+    <w:p>
+      <w:pPr>
+        <w:pStyle w:val="BodyText"/>
+      </w:pPr>
+      <w:r>
+        <w:t xml:space="preserve">Os normativos basilares abaixo reúnem referências atualmente disponíveis no pacote documental da Ouvidoria e podem ser publicados como links simples na homepage, abaixo do painel de tratamento de demandas.</w:t>
+      </w:r>
+    </w:p>
+    <w:p>
+      <w:pPr>
+        <w:pStyle w:val="BodyText"/>
+      </w:pPr>
+      <w:r>
+        <w:t xml:space="preserve">Links a publicar:</w:t>
       </w:r>
     </w:p>
     <w:p>
@@ -1503,7 +1485,13 @@
         </w:numPr>
       </w:pPr>
       <w:r>
-        <w:t xml:space="preserve">Atuar como espaço de difusão de referências técnicas úteis às ouvidorias de serviços penais.</w:t>
+        <w:t xml:space="preserve">Lei nº 13.460, de 26 de junho de 2017: Documentação/Normativas Basilares de Ouvidoria/LEI N°13.460.2017.pdf</w:t>
+      </w:r>
+      <w:r>
+        <w:t xml:space="preserve"> </w:t>
+      </w:r>
+      <w:r>
+        <w:t xml:space="preserve">Descrição: Dispõe sobre participação, proteção e defesa dos direitos do usuário dos serviços públicos da administração pública.</w:t>
       </w:r>
     </w:p>
     <w:p>
@@ -1515,7 +1503,13 @@
         </w:numPr>
       </w:pPr>
       <w:r>
-        <w:t xml:space="preserve">Fomentar o compartilhamento de práticas, fluxos e instrumentos voltados ao atendimento e ao encaminhamento de manifestações.</w:t>
+        <w:t xml:space="preserve">Decreto nº 9.492, de 5 de setembro de 2018: Documentação/Normativas Basilares de Ouvidoria/Decreto N°9.492.2018.pdf</w:t>
+      </w:r>
+      <w:r>
+        <w:t xml:space="preserve"> </w:t>
+      </w:r>
+      <w:r>
+        <w:t xml:space="preserve">Descrição: Regulamenta a Lei nº 13.460, de 26 de junho de 2017, institui o Sistema de Ouvidoria do Poder Executivo federal e altera o Decreto nº 8.910, de 22 de novembro de 2016.</w:t>
       </w:r>
     </w:p>
     <w:p>
@@ -1527,7 +1521,13 @@
         </w:numPr>
       </w:pPr>
       <w:r>
-        <w:t xml:space="preserve">Estimular a cooperação entre a União, os Estados e o Distrito Federal para o aprimoramento da atuação institucional.</w:t>
+        <w:t xml:space="preserve">Decreto nº 10.153, de 3 de dezembro de 2019: Documentação/Normativas Basilares de Ouvidoria/Decreto N°10.153.2019.pdf</w:t>
+      </w:r>
+      <w:r>
+        <w:t xml:space="preserve"> </w:t>
+      </w:r>
+      <w:r>
+        <w:t xml:space="preserve">Descrição: Dispõe sobre as salvaguardas de proteção à identidade dos denunciantes de ilícitos e de irregularidades praticados contra a administração pública federal direta e indireta.</w:t>
       </w:r>
     </w:p>
     <w:p>
@@ -1539,7 +1539,60 @@
         </w:numPr>
       </w:pPr>
       <w:r>
-        <w:t xml:space="preserve">Fortalecer a participação social, a transparência pública e a proteção de direitos no sistema penal.</w:t>
+        <w:t xml:space="preserve">Portaria Normativa CGU nº 116, de 18 de março de 2024: Documentação/Normativas Basilares de Ouvidoria/Portaria Normativa CGU - N°116.2024.pdf</w:t>
+      </w:r>
+      <w:r>
+        <w:t xml:space="preserve"> </w:t>
+      </w:r>
+      <w:r>
+        <w:t xml:space="preserve">Descrição: Estabelece orientações para o exercício das competências das unidades do Sistema de Ouvidoria do Poder Executivo Federal, instituído pelo Decreto nº 9.492, de 5 de setembro de 2018, no âmbito do Poder Executivo federal, e dá outras providências.</w:t>
+      </w:r>
+    </w:p>
+    <w:p>
+      <w:pPr>
+        <w:pStyle w:val="Compact"/>
+        <w:numPr>
+          <w:ilvl w:val="0"/>
+          <w:numId w:val="1006"/>
+        </w:numPr>
+      </w:pPr>
+      <w:r>
+        <w:t xml:space="preserve">Lei nº 12.527, de 18 de novembro de 2011: Documentação/Normativas Basilares de Ouvidoria/LEI N°12.527.2011.pdf</w:t>
+      </w:r>
+      <w:r>
+        <w:t xml:space="preserve"> </w:t>
+      </w:r>
+      <w:r>
+        <w:t xml:space="preserve">Descrição: Regula o acesso a informações previsto no inciso XXXIII do art. 5º, no inciso II do § 3º do art. 37 e no § 2º do art. 216 da Constituição Federal.</w:t>
+      </w:r>
+    </w:p>
+    <w:p>
+      <w:pPr>
+        <w:pStyle w:val="Compact"/>
+        <w:numPr>
+          <w:ilvl w:val="0"/>
+          <w:numId w:val="1006"/>
+        </w:numPr>
+      </w:pPr>
+      <w:r>
+        <w:t xml:space="preserve">Lei nº 13.709, de 14 de agosto de 2018: Documentação/Normativas Basilares de Ouvidoria/LEI N°13.709.2018.pdf</w:t>
+      </w:r>
+      <w:r>
+        <w:t xml:space="preserve"> </w:t>
+      </w:r>
+      <w:r>
+        <w:t xml:space="preserve">Descrição: Dispõe sobre a proteção de dados pessoais e altera a Lei nº 12.965, de 23 de abril de 2014 (Marco Civil da Internet).</w:t>
+      </w:r>
+    </w:p>
+    <w:bookmarkEnd w:id="28"/>
+    <w:bookmarkEnd w:id="29"/>
+    <w:bookmarkStart w:id="30" w:name="subpágina-1---rede-de-ouvidorias"/>
+    <w:p>
+      <w:pPr>
+        <w:pStyle w:val="Heading2"/>
+      </w:pPr>
+      <w:r>
+        <w:t xml:space="preserve">Subpágina 1 - Rede de Ouvidorias</w:t>
       </w:r>
     </w:p>
     <w:p>
@@ -1547,6 +1600,86 @@
         <w:pStyle w:val="FirstParagraph"/>
       </w:pPr>
       <w:r>
+        <w:t xml:space="preserve">Título da página:</w:t>
+      </w:r>
+    </w:p>
+    <w:p>
+      <w:pPr>
+        <w:pStyle w:val="BodyText"/>
+      </w:pPr>
+      <w:r>
+        <w:t xml:space="preserve">Rede de Ouvidorias</w:t>
+      </w:r>
+    </w:p>
+    <w:p>
+      <w:pPr>
+        <w:pStyle w:val="BodyText"/>
+      </w:pPr>
+      <w:r>
+        <w:t xml:space="preserve">Imagem de destaque:</w:t>
+      </w:r>
+    </w:p>
+    <w:p>
+      <w:pPr>
+        <w:pStyle w:val="BodyText"/>
+      </w:pPr>
+      <w:r>
+        <w:t xml:space="preserve">Documentação/Botao_Renospen.png</w:t>
+      </w:r>
+    </w:p>
+    <w:p>
+      <w:pPr>
+        <w:pStyle w:val="BodyText"/>
+      </w:pPr>
+      <w:r>
+        <w:t xml:space="preserve">Texto alternativo sugerido:</w:t>
+      </w:r>
+    </w:p>
+    <w:p>
+      <w:pPr>
+        <w:pStyle w:val="BodyText"/>
+      </w:pPr>
+      <w:r>
+        <w:t xml:space="preserve">Botão institucional da Rede de Ouvidorias.</w:t>
+      </w:r>
+    </w:p>
+    <w:p>
+      <w:pPr>
+        <w:pStyle w:val="BodyText"/>
+      </w:pPr>
+      <w:r>
+        <w:t xml:space="preserve">Identificador editorial:</w:t>
+      </w:r>
+    </w:p>
+    <w:p>
+      <w:pPr>
+        <w:pStyle w:val="BodyText"/>
+      </w:pPr>
+      <w:r>
+        <w:t xml:space="preserve">Conteúdo Técnico e Projetos Estruturantes</w:t>
+      </w:r>
+    </w:p>
+    <w:p>
+      <w:pPr>
+        <w:pStyle w:val="BodyText"/>
+      </w:pPr>
+      <w:r>
+        <w:t xml:space="preserve">Texto de destaque:</w:t>
+      </w:r>
+    </w:p>
+    <w:p>
+      <w:pPr>
+        <w:pStyle w:val="BodyText"/>
+      </w:pPr>
+      <w:r>
+        <w:t xml:space="preserve">Iniciativa do Plano Pena Justa voltada à cooperação federativa, à harmonização de procedimentos e ao fortalecimento da proteção de direitos no âmbito das Ouvidorias de Serviços Penais.</w:t>
+      </w:r>
+    </w:p>
+    <w:p>
+      <w:pPr>
+        <w:pStyle w:val="BodyText"/>
+      </w:pPr>
+      <w:r>
         <w:t xml:space="preserve">Seção:</w:t>
       </w:r>
     </w:p>
@@ -1555,7 +1688,7 @@
         <w:pStyle w:val="BodyText"/>
       </w:pPr>
       <w:r>
-        <w:t xml:space="preserve">Governança e cooperação técnica</w:t>
+        <w:t xml:space="preserve">Renospen</w:t>
       </w:r>
     </w:p>
     <w:p>
@@ -1571,15 +1704,23 @@
         <w:pStyle w:val="BodyText"/>
       </w:pPr>
       <w:r>
-        <w:t xml:space="preserve">No recorte da ONASP, a Rede de Ouvidorias pode ser apresentada como espaço permanente de articulação entre unidades responsáveis pela escuta institucional, com foco em difusão de referências técnicas, intercâmbio de práticas e aperfeiçoamento contínuo da atuação no sistema penal.</w:t>
-      </w:r>
-    </w:p>
-    <w:p>
-      <w:pPr>
-        <w:pStyle w:val="BodyText"/>
-      </w:pPr>
-      <w:r>
-        <w:t xml:space="preserve">Esse arranjo é reforçado por instrumentos que definem parâmetros mínimos para a estruturação das ouvidorias e institucionalizam a Renospen como instância de cooperação técnica, integração federativa e fortalecimento institucional.</w:t>
+        <w:t xml:space="preserve">A Rede de Ouvidorias visa manter a articulação entre as unidades responsáveis pela escuta institucional no sistema penal, com o objetivo de fortalecer a cooperação federativa, qualificar o atendimento ao cidadão e ampliar a proteção de direitos em âmbito nacional.</w:t>
+      </w:r>
+    </w:p>
+    <w:p>
+      <w:pPr>
+        <w:pStyle w:val="BodyText"/>
+      </w:pPr>
+      <w:r>
+        <w:t xml:space="preserve">A segunda linha do escopo:</w:t>
+      </w:r>
+    </w:p>
+    <w:p>
+      <w:pPr>
+        <w:pStyle w:val="BodyText"/>
+      </w:pPr>
+      <w:r>
+        <w:t xml:space="preserve">No contexto da Ouvidoria Nacional de Serviços Penais, esta subpágina reúne referências públicas da iniciativa, favorecendo o intercâmbio de práticas, a harmonização de procedimentos e a consolidação de parâmetros voltados à transparência e ao controle social.</w:t>
       </w:r>
     </w:p>
     <w:p>
@@ -1589,141 +1730,21 @@
       <w:r>
         <w:t xml:space="preserve">Seção:</w:t>
       </w:r>
-      <w:r>
-        <w:t xml:space="preserve"> </w:t>
-      </w:r>
-      <w:r>
-        <w:t xml:space="preserve">Mapa interativo e destaque por UF</w:t>
-      </w:r>
-    </w:p>
-    <w:p>
-      <w:pPr>
-        <w:pStyle w:val="BodyText"/>
-      </w:pPr>
-      <w:r>
-        <w:t xml:space="preserve">Texto para colar:</w:t>
-      </w:r>
-    </w:p>
-    <w:p>
-      <w:pPr>
-        <w:pStyle w:val="BodyText"/>
-      </w:pPr>
-      <w:r>
-        <w:t xml:space="preserve">Esta prévia reúne, em um único ponto, os contatos institucionais consolidados das unidades da federação. No ambiente de validação local, a consulta foi organizada por meio de um mapa visual com seleção por UF e painel lateral com dados resumidos da ouvidoria correspondente ou, quando cabível, das referências institucionais associadas à mesma unidade da federação.</w:t>
-      </w:r>
-    </w:p>
-    <w:p>
-      <w:pPr>
-        <w:pStyle w:val="BodyText"/>
-      </w:pPr>
-      <w:r>
-        <w:t xml:space="preserve">Orientação para publicação oficial:</w:t>
-      </w:r>
-    </w:p>
-    <w:p>
-      <w:pPr>
-        <w:pStyle w:val="BodyText"/>
-      </w:pPr>
-      <w:r>
-        <w:t xml:space="preserve">No ambiente gov.br, recomenda-se tratar o mapa interativo apenas como referência visual da prévia. A solução mais segura para publicação é manter um seletor simples por UF, um bloco expansível por estado ou, preferencialmente, o quadro textual de contatos apresentado abaixo, sem depender de JavaScript customizado.</w:t>
-      </w:r>
-    </w:p>
-    <w:p>
-      <w:pPr>
-        <w:pStyle w:val="BodyText"/>
-      </w:pPr>
-      <w:r>
-        <w:t xml:space="preserve">Quando a mesma UF tiver mais de uma referência institucional relevante, como ocorre no Espírito Santo, recomenda-se separar as informações em blocos independentes dentro do quadro lateral ou em linhas distintas no quadro textual, evitando misturar órgãos, responsáveis, telefones e endereços em uma única ficha.</w:t>
-      </w:r>
-    </w:p>
-    <w:p>
-      <w:pPr>
-        <w:pStyle w:val="BodyText"/>
-      </w:pPr>
-      <w:r>
-        <w:t xml:space="preserve">Regra editorial obrigatória:</w:t>
-      </w:r>
-    </w:p>
-    <w:p>
-      <w:pPr>
-        <w:pStyle w:val="BodyText"/>
-      </w:pPr>
-      <w:r>
-        <w:t xml:space="preserve">Detalhes de curadoria usados para consolidar os contatos devem permanecer apenas na documentação interna de trabalho. Não publicar na página expressões como</w:t>
-      </w:r>
-      <w:r>
-        <w:t xml:space="preserve"> </w:t>
-      </w:r>
-      <w:r>
-        <w:t xml:space="preserve">“o diagnóstico registrou”</w:t>
-      </w:r>
-      <w:r>
-        <w:t xml:space="preserve">,</w:t>
-      </w:r>
-      <w:r>
-        <w:t xml:space="preserve"> </w:t>
-      </w:r>
-      <w:r>
-        <w:t xml:space="preserve">“a resposta do diagnóstico informa”</w:t>
-      </w:r>
-      <w:r>
-        <w:t xml:space="preserve">, menções a respostas recebidas, observações internas de validação ou listas nominais de servidores designados.</w:t>
-      </w:r>
-    </w:p>
-    <w:p>
-      <w:pPr>
-        <w:pStyle w:val="BodyText"/>
-      </w:pPr>
-      <w:r>
-        <w:t xml:space="preserve">Base interna de consolidação (não publicar na página):</w:t>
-      </w:r>
-    </w:p>
-    <w:p>
-      <w:pPr>
-        <w:pStyle w:val="BodyText"/>
-      </w:pPr>
-      <w:r>
-        <w:t xml:space="preserve">Diagnóstico de Ouvidorias Estaduais, consolidado pela ONASP a partir das respostas recebidas em 2026.</w:t>
-      </w:r>
-    </w:p>
-    <w:p>
-      <w:pPr>
-        <w:pStyle w:val="BodyText"/>
-      </w:pPr>
-      <w:r>
-        <w:t xml:space="preserve">Seção:</w:t>
-      </w:r>
-    </w:p>
-    <w:p>
-      <w:pPr>
-        <w:pStyle w:val="BodyText"/>
-      </w:pPr>
-      <w:r>
-        <w:t xml:space="preserve">VI Encontro Nacional das Ouvidorias do Sistema Penal</w:t>
-      </w:r>
-    </w:p>
-    <w:p>
-      <w:pPr>
-        <w:pStyle w:val="BodyText"/>
-      </w:pPr>
-      <w:r>
-        <w:t xml:space="preserve">Texto para colar:</w:t>
-      </w:r>
-    </w:p>
-    <w:p>
-      <w:pPr>
-        <w:pStyle w:val="BodyText"/>
-      </w:pPr>
-      <w:r>
-        <w:t xml:space="preserve">O VI Encontro Nacional das Ouvidorias do Sistema Penal, promovido pela Senappen entre 8 e 10 de abril, consolidou um novo marco para a gestão penitenciária com o lançamento da Rede Nacional de Ouvidorias de Serviços Penais (Renospen) e a publicação de uma Instrução Normativa para padronizar essas instâncias nos estados. Alinhado ao Plano Nacional Pena Justa, o evento focou no fortalecimento da transparência, do controle social e da promoção de direitos humanos, unificando diretrizes nacionais enquanto respeita as autonomias locais. Além dos painéis sobre gestão estratégica e escuta ética, a iniciativa contemplou a doação de equipamentos tecnológicos para todas as unidades federativas, visando modernizar o atendimento e estreitar a comunicação entre o sistema penal e a sociedade brasileira.</w:t>
-      </w:r>
-    </w:p>
-    <w:p>
-      <w:pPr>
-        <w:pStyle w:val="BodyText"/>
-      </w:pPr>
-      <w:r>
-        <w:t xml:space="preserve">Imagens a inserir:</w:t>
+    </w:p>
+    <w:p>
+      <w:pPr>
+        <w:pStyle w:val="BodyText"/>
+      </w:pPr>
+      <w:r>
+        <w:t xml:space="preserve">Objetivos da Rede</w:t>
+      </w:r>
+    </w:p>
+    <w:p>
+      <w:pPr>
+        <w:pStyle w:val="BodyText"/>
+      </w:pPr>
+      <w:r>
+        <w:t xml:space="preserve">Itens para colar:</w:t>
       </w:r>
     </w:p>
     <w:p>
@@ -1735,7 +1756,7 @@
         </w:numPr>
       </w:pPr>
       <w:r>
-        <w:t xml:space="preserve">Documentação/Banner_Renospen_1.jpeg</w:t>
+        <w:t xml:space="preserve">Atuar como espaço de difusão de referências técnicas úteis às ouvidorias de serviços penais.</w:t>
       </w:r>
     </w:p>
     <w:p>
@@ -1747,7 +1768,7 @@
         </w:numPr>
       </w:pPr>
       <w:r>
-        <w:t xml:space="preserve">Documentação/Banner_Renospen_2.jpeg</w:t>
+        <w:t xml:space="preserve">Fomentar o compartilhamento de práticas, fluxos e instrumentos voltados ao atendimento e ao encaminhamento de manifestações.</w:t>
       </w:r>
     </w:p>
     <w:p>
@@ -1759,7 +1780,19 @@
         </w:numPr>
       </w:pPr>
       <w:r>
-        <w:t xml:space="preserve">Documentação/Banner_Renospen_3.jpeg</w:t>
+        <w:t xml:space="preserve">Estimular a cooperação entre a União, os Estados e o Distrito Federal para o aprimoramento da atuação institucional.</w:t>
+      </w:r>
+    </w:p>
+    <w:p>
+      <w:pPr>
+        <w:pStyle w:val="Compact"/>
+        <w:numPr>
+          <w:ilvl w:val="0"/>
+          <w:numId w:val="1007"/>
+        </w:numPr>
+      </w:pPr>
+      <w:r>
+        <w:t xml:space="preserve">Fortalecer a participação social, a transparência pública e a proteção de direitos no sistema penal.</w:t>
       </w:r>
     </w:p>
     <w:p>
@@ -1767,7 +1800,183 @@
         <w:pStyle w:val="FirstParagraph"/>
       </w:pPr>
       <w:r>
-        <w:t xml:space="preserve">Ordem e destaque sugeridos:</w:t>
+        <w:t xml:space="preserve">Seção:</w:t>
+      </w:r>
+    </w:p>
+    <w:p>
+      <w:pPr>
+        <w:pStyle w:val="BodyText"/>
+      </w:pPr>
+      <w:r>
+        <w:t xml:space="preserve">Governança e cooperação técnica</w:t>
+      </w:r>
+    </w:p>
+    <w:p>
+      <w:pPr>
+        <w:pStyle w:val="BodyText"/>
+      </w:pPr>
+      <w:r>
+        <w:t xml:space="preserve">Texto para colar:</w:t>
+      </w:r>
+    </w:p>
+    <w:p>
+      <w:pPr>
+        <w:pStyle w:val="BodyText"/>
+      </w:pPr>
+      <w:r>
+        <w:t xml:space="preserve">No recorte da ONASP, a Rede de Ouvidorias pode ser apresentada como espaço permanente de articulação entre unidades responsáveis pela escuta institucional, com foco em difusão de referências técnicas, intercâmbio de práticas e aperfeiçoamento contínuo da atuação no sistema penal.</w:t>
+      </w:r>
+    </w:p>
+    <w:p>
+      <w:pPr>
+        <w:pStyle w:val="BodyText"/>
+      </w:pPr>
+      <w:r>
+        <w:t xml:space="preserve">Esse arranjo é reforçado por instrumentos que definem parâmetros mínimos para a estruturação das ouvidorias e institucionalizam a Renospen como instância de cooperação técnica, integração federativa e fortalecimento institucional.</w:t>
+      </w:r>
+    </w:p>
+    <w:p>
+      <w:pPr>
+        <w:pStyle w:val="BodyText"/>
+      </w:pPr>
+      <w:r>
+        <w:t xml:space="preserve">Seção:</w:t>
+      </w:r>
+      <w:r>
+        <w:t xml:space="preserve"> </w:t>
+      </w:r>
+      <w:r>
+        <w:t xml:space="preserve">Mapa interativo e destaque por UF</w:t>
+      </w:r>
+    </w:p>
+    <w:p>
+      <w:pPr>
+        <w:pStyle w:val="BodyText"/>
+      </w:pPr>
+      <w:r>
+        <w:t xml:space="preserve">Texto para colar:</w:t>
+      </w:r>
+    </w:p>
+    <w:p>
+      <w:pPr>
+        <w:pStyle w:val="BodyText"/>
+      </w:pPr>
+      <w:r>
+        <w:t xml:space="preserve">Esta prévia reúne, em um único ponto, os contatos institucionais consolidados das unidades da federação. No ambiente de validação local, a consulta foi organizada por meio de um mapa visual com seleção por UF e painel lateral com dados resumidos da ouvidoria correspondente ou, quando cabível, das referências institucionais associadas à mesma unidade da federação.</w:t>
+      </w:r>
+    </w:p>
+    <w:p>
+      <w:pPr>
+        <w:pStyle w:val="BodyText"/>
+      </w:pPr>
+      <w:r>
+        <w:t xml:space="preserve">Orientação para publicação oficial:</w:t>
+      </w:r>
+    </w:p>
+    <w:p>
+      <w:pPr>
+        <w:pStyle w:val="BodyText"/>
+      </w:pPr>
+      <w:r>
+        <w:t xml:space="preserve">No ambiente gov.br, recomenda-se tratar o mapa interativo apenas como referência visual da prévia. A solução mais segura para publicação é manter um seletor simples por UF, um bloco expansível por estado ou, preferencialmente, o quadro textual de contatos apresentado abaixo, sem depender de JavaScript customizado.</w:t>
+      </w:r>
+    </w:p>
+    <w:p>
+      <w:pPr>
+        <w:pStyle w:val="BodyText"/>
+      </w:pPr>
+      <w:r>
+        <w:t xml:space="preserve">Quando a mesma UF tiver mais de uma referência institucional relevante, como ocorre no Espírito Santo, recomenda-se separar as informações em blocos independentes dentro do quadro lateral ou em linhas distintas no quadro textual, evitando misturar órgãos, responsáveis, telefones e endereços em uma única ficha.</w:t>
+      </w:r>
+    </w:p>
+    <w:p>
+      <w:pPr>
+        <w:pStyle w:val="BodyText"/>
+      </w:pPr>
+      <w:r>
+        <w:t xml:space="preserve">Regra editorial obrigatória:</w:t>
+      </w:r>
+    </w:p>
+    <w:p>
+      <w:pPr>
+        <w:pStyle w:val="BodyText"/>
+      </w:pPr>
+      <w:r>
+        <w:t xml:space="preserve">Detalhes de curadoria usados para consolidar os contatos devem permanecer apenas na documentação interna de trabalho. Não publicar na página expressões como</w:t>
+      </w:r>
+      <w:r>
+        <w:t xml:space="preserve"> </w:t>
+      </w:r>
+      <w:r>
+        <w:t xml:space="preserve">“o diagnóstico registrou”</w:t>
+      </w:r>
+      <w:r>
+        <w:t xml:space="preserve">,</w:t>
+      </w:r>
+      <w:r>
+        <w:t xml:space="preserve"> </w:t>
+      </w:r>
+      <w:r>
+        <w:t xml:space="preserve">“a resposta do diagnóstico informa”</w:t>
+      </w:r>
+      <w:r>
+        <w:t xml:space="preserve">, menções a respostas recebidas, observações internas de validação ou listas nominais de servidores designados.</w:t>
+      </w:r>
+    </w:p>
+    <w:p>
+      <w:pPr>
+        <w:pStyle w:val="BodyText"/>
+      </w:pPr>
+      <w:r>
+        <w:t xml:space="preserve">Base interna de consolidação (não publicar na página):</w:t>
+      </w:r>
+    </w:p>
+    <w:p>
+      <w:pPr>
+        <w:pStyle w:val="BodyText"/>
+      </w:pPr>
+      <w:r>
+        <w:t xml:space="preserve">Diagnóstico de Ouvidorias Estaduais, consolidado pela ONASP a partir das respostas recebidas em 2026.</w:t>
+      </w:r>
+    </w:p>
+    <w:p>
+      <w:pPr>
+        <w:pStyle w:val="BodyText"/>
+      </w:pPr>
+      <w:r>
+        <w:t xml:space="preserve">Seção:</w:t>
+      </w:r>
+    </w:p>
+    <w:p>
+      <w:pPr>
+        <w:pStyle w:val="BodyText"/>
+      </w:pPr>
+      <w:r>
+        <w:t xml:space="preserve">VI Encontro Nacional das Ouvidorias do Sistema Penal</w:t>
+      </w:r>
+    </w:p>
+    <w:p>
+      <w:pPr>
+        <w:pStyle w:val="BodyText"/>
+      </w:pPr>
+      <w:r>
+        <w:t xml:space="preserve">Texto para colar:</w:t>
+      </w:r>
+    </w:p>
+    <w:p>
+      <w:pPr>
+        <w:pStyle w:val="BodyText"/>
+      </w:pPr>
+      <w:r>
+        <w:t xml:space="preserve">O VI Encontro Nacional das Ouvidorias do Sistema Penal, promovido pela Senappen entre 8 e 10 de abril, consolidou um novo marco para a gestão penitenciária com o lançamento da Rede Nacional de Ouvidorias de Serviços Penais (Renospen) e a publicação de uma Instrução Normativa para padronizar essas instâncias nos estados. Alinhado ao Plano Nacional Pena Justa, o evento focou no fortalecimento da transparência, do controle social e da promoção de direitos humanos, unificando diretrizes nacionais enquanto respeita as autonomias locais. Além dos painéis sobre gestão estratégica e escuta ética, a iniciativa contemplou a doação de equipamentos tecnológicos para todas as unidades federativas, visando modernizar o atendimento e estreitar a comunicação entre o sistema penal e a sociedade brasileira.</w:t>
+      </w:r>
+    </w:p>
+    <w:p>
+      <w:pPr>
+        <w:pStyle w:val="BodyText"/>
+      </w:pPr>
+      <w:r>
+        <w:t xml:space="preserve">Imagens a inserir:</w:t>
       </w:r>
     </w:p>
     <w:p>
@@ -1779,6 +1988,50 @@
         </w:numPr>
       </w:pPr>
       <w:r>
+        <w:t xml:space="preserve">Documentação/Banner_Renospen_1.jpeg</w:t>
+      </w:r>
+    </w:p>
+    <w:p>
+      <w:pPr>
+        <w:pStyle w:val="Compact"/>
+        <w:numPr>
+          <w:ilvl w:val="0"/>
+          <w:numId w:val="1008"/>
+        </w:numPr>
+      </w:pPr>
+      <w:r>
+        <w:t xml:space="preserve">Documentação/Banner_Renospen_2.jpeg</w:t>
+      </w:r>
+    </w:p>
+    <w:p>
+      <w:pPr>
+        <w:pStyle w:val="Compact"/>
+        <w:numPr>
+          <w:ilvl w:val="0"/>
+          <w:numId w:val="1008"/>
+        </w:numPr>
+      </w:pPr>
+      <w:r>
+        <w:t xml:space="preserve">Documentação/Banner_Renospen_3.jpeg</w:t>
+      </w:r>
+    </w:p>
+    <w:p>
+      <w:pPr>
+        <w:pStyle w:val="FirstParagraph"/>
+      </w:pPr>
+      <w:r>
+        <w:t xml:space="preserve">Ordem e destaque sugeridos:</w:t>
+      </w:r>
+    </w:p>
+    <w:p>
+      <w:pPr>
+        <w:pStyle w:val="Compact"/>
+        <w:numPr>
+          <w:ilvl w:val="0"/>
+          <w:numId w:val="1009"/>
+        </w:numPr>
+      </w:pPr>
+      <w:r>
         <w:t xml:space="preserve">usar</w:t>
       </w:r>
       <w:r>
@@ -1802,7 +2055,7 @@
         <w:pStyle w:val="Compact"/>
         <w:numPr>
           <w:ilvl w:val="0"/>
-          <w:numId w:val="1008"/>
+          <w:numId w:val="1009"/>
         </w:numPr>
       </w:pPr>
       <w:r>
@@ -3915,229 +4168,11 @@
         <w:pStyle w:val="Compact"/>
         <w:numPr>
           <w:ilvl w:val="0"/>
-          <w:numId w:val="1009"/>
+          <w:numId w:val="1010"/>
         </w:numPr>
       </w:pPr>
       <w:r>
         <w:t xml:space="preserve">Clique e acesse a Instrução Normativa nº 75/2026: Subpages/Pena_justa/SEI_35153985_Instrucao_Normativa_75.pdf</w:t>
-      </w:r>
-    </w:p>
-    <w:p>
-      <w:pPr>
-        <w:pStyle w:val="Compact"/>
-        <w:numPr>
-          <w:ilvl w:val="0"/>
-          <w:numId w:val="1009"/>
-        </w:numPr>
-      </w:pPr>
-      <w:r>
-        <w:t xml:space="preserve">Clique e acesse a Portaria nº 549/2026 - Renospen: Subpages/Pena_justa/SEI_35032761_Portaria_549.pdf</w:t>
-      </w:r>
-    </w:p>
-    <w:p>
-      <w:pPr>
-        <w:pStyle w:val="Compact"/>
-        <w:numPr>
-          <w:ilvl w:val="0"/>
-          <w:numId w:val="1009"/>
-        </w:numPr>
-      </w:pPr>
-      <w:r>
-        <w:t xml:space="preserve">Clique e acesse o Plano Nacional Pena Justa: Subpages/Pena_justa/Plano_Nacional_Pena_Justa.pdf</w:t>
-      </w:r>
-    </w:p>
-    <w:bookmarkEnd w:id="22"/>
-    <w:bookmarkStart w:id="23" w:name="subpágina-2---ema---senappen"/>
-    <w:p>
-      <w:pPr>
-        <w:pStyle w:val="Heading2"/>
-      </w:pPr>
-      <w:r>
-        <w:t xml:space="preserve">Subpágina 2 - EMA - SENAPPEN</w:t>
-      </w:r>
-    </w:p>
-    <w:p>
-      <w:pPr>
-        <w:pStyle w:val="FirstParagraph"/>
-      </w:pPr>
-      <w:r>
-        <w:t xml:space="preserve">Título da página:</w:t>
-      </w:r>
-    </w:p>
-    <w:p>
-      <w:pPr>
-        <w:pStyle w:val="BodyText"/>
-      </w:pPr>
-      <w:r>
-        <w:t xml:space="preserve">EMA - SENAPPEN</w:t>
-      </w:r>
-    </w:p>
-    <w:p>
-      <w:pPr>
-        <w:pStyle w:val="BodyText"/>
-      </w:pPr>
-      <w:r>
-        <w:t xml:space="preserve">Imagem de destaque:</w:t>
-      </w:r>
-    </w:p>
-    <w:p>
-      <w:pPr>
-        <w:pStyle w:val="BodyText"/>
-      </w:pPr>
-      <w:r>
-        <w:t xml:space="preserve">Documentação/Botao_EMA.png</w:t>
-      </w:r>
-    </w:p>
-    <w:p>
-      <w:pPr>
-        <w:pStyle w:val="BodyText"/>
-      </w:pPr>
-      <w:r>
-        <w:t xml:space="preserve">Texto alternativo sugerido:</w:t>
-      </w:r>
-    </w:p>
-    <w:p>
-      <w:pPr>
-        <w:pStyle w:val="BodyText"/>
-      </w:pPr>
-      <w:r>
-        <w:t xml:space="preserve">Botão institucional da EMA - SENAPPEN.</w:t>
-      </w:r>
-    </w:p>
-    <w:p>
-      <w:pPr>
-        <w:pStyle w:val="BodyText"/>
-      </w:pPr>
-      <w:r>
-        <w:t xml:space="preserve">Identificador editorial:</w:t>
-      </w:r>
-    </w:p>
-    <w:p>
-      <w:pPr>
-        <w:pStyle w:val="BodyText"/>
-      </w:pPr>
-      <w:r>
-        <w:t xml:space="preserve">Conteúdo Técnico e Projetos Estruturantes</w:t>
-      </w:r>
-    </w:p>
-    <w:p>
-      <w:pPr>
-        <w:pStyle w:val="BodyText"/>
-      </w:pPr>
-      <w:r>
-        <w:t xml:space="preserve">Texto de destaque:</w:t>
-      </w:r>
-    </w:p>
-    <w:p>
-      <w:pPr>
-        <w:pStyle w:val="BodyText"/>
-      </w:pPr>
-      <w:r>
-        <w:t xml:space="preserve">Espaço da Equipe de Monitoramento e Acompanhamento das decisões e deliberações do Sistema Interamericano de Direitos Humanos em face do sistema penal nacional, dedicado a fortalecer o cumprimento das determinações do SIDH em parceria com as Unidades Federativas.</w:t>
-      </w:r>
-    </w:p>
-    <w:p>
-      <w:pPr>
-        <w:pStyle w:val="BodyText"/>
-      </w:pPr>
-      <w:r>
-        <w:t xml:space="preserve">Seção:</w:t>
-      </w:r>
-    </w:p>
-    <w:p>
-      <w:pPr>
-        <w:pStyle w:val="BodyText"/>
-      </w:pPr>
-      <w:r>
-        <w:t xml:space="preserve">Institucional</w:t>
-      </w:r>
-    </w:p>
-    <w:p>
-      <w:pPr>
-        <w:pStyle w:val="BodyText"/>
-      </w:pPr>
-      <w:r>
-        <w:t xml:space="preserve">Imagem complementar opcional:</w:t>
-      </w:r>
-    </w:p>
-    <w:p>
-      <w:pPr>
-        <w:pStyle w:val="BodyText"/>
-      </w:pPr>
-      <w:r>
-        <w:t xml:space="preserve">Documentação/Banner_Ema_Organograma.png</w:t>
-      </w:r>
-    </w:p>
-    <w:p>
-      <w:pPr>
-        <w:pStyle w:val="BodyText"/>
-      </w:pPr>
-      <w:r>
-        <w:t xml:space="preserve">Texto alternativo sugerido:</w:t>
-      </w:r>
-    </w:p>
-    <w:p>
-      <w:pPr>
-        <w:pStyle w:val="BodyText"/>
-      </w:pPr>
-      <w:r>
-        <w:t xml:space="preserve">Organograma da EMA - SENAPPEN.</w:t>
-      </w:r>
-    </w:p>
-    <w:p>
-      <w:pPr>
-        <w:pStyle w:val="BodyText"/>
-      </w:pPr>
-      <w:r>
-        <w:t xml:space="preserve">Texto para colar:</w:t>
-      </w:r>
-    </w:p>
-    <w:p>
-      <w:pPr>
-        <w:pStyle w:val="BodyText"/>
-      </w:pPr>
-      <w:r>
-        <w:t xml:space="preserve">A EMA-SENAPPEN foi instituída, inicialmente, pela Portaria GABSEC/SENAPPEN/MJSP Nº 350, de 13 de junho de 2024, em um esforço de integrar a Secretaria Nacional de Políticas Penais ao processo de cumprimento das decisões do SIDH, dado seu rol de competências, em especial, a previsão de prestar apoio técnico aos entes federativos quanto à implementação dos princípios e das regras da execução penal.</w:t>
-      </w:r>
-    </w:p>
-    <w:p>
-      <w:pPr>
-        <w:pStyle w:val="BodyText"/>
-      </w:pPr>
-      <w:r>
-        <w:t xml:space="preserve">A segunda linha da seção:</w:t>
-      </w:r>
-    </w:p>
-    <w:p>
-      <w:pPr>
-        <w:pStyle w:val="BodyText"/>
-      </w:pPr>
-      <w:r>
-        <w:t xml:space="preserve">A estrutura da EMA foi alterada em 2025, mediante as Portarias GABSEC/SENAPPEN/MJSP Nº 511, de 13 de outubro de 2025, e Portaria de Pessoal GABSEC/SENAPPEN/MJSP Nº 93, de 10 de março de 2026, as quais possuíam por objetivo o aprimoramento da sua composição institucional, conforme o organograma a seguir:</w:t>
-      </w:r>
-    </w:p>
-    <w:p>
-      <w:pPr>
-        <w:pStyle w:val="BodyText"/>
-      </w:pPr>
-      <w:r>
-        <w:t xml:space="preserve">Seção:</w:t>
-      </w:r>
-    </w:p>
-    <w:p>
-      <w:pPr>
-        <w:pStyle w:val="BodyText"/>
-      </w:pPr>
-      <w:r>
-        <w:t xml:space="preserve">Frentes de Atuação</w:t>
-      </w:r>
-    </w:p>
-    <w:p>
-      <w:pPr>
-        <w:pStyle w:val="BodyText"/>
-      </w:pPr>
-      <w:r>
-        <w:t xml:space="preserve">Itens para colar:</w:t>
       </w:r>
     </w:p>
     <w:p>
@@ -4149,7 +4184,7 @@
         </w:numPr>
       </w:pPr>
       <w:r>
-        <w:t xml:space="preserve">Monitorar e acompanhar as estratégias adotadas pelo Estado Brasileiro para o cumprimento das decisões do SIDH em relação ao sistema penal.</w:t>
+        <w:t xml:space="preserve">Clique e acesse a Portaria nº 549/2026 - Renospen: Subpages/Pena_justa/SEI_35032761_Portaria_549.pdf</w:t>
       </w:r>
     </w:p>
     <w:p>
@@ -4161,31 +4196,17 @@
         </w:numPr>
       </w:pPr>
       <w:r>
-        <w:t xml:space="preserve">Prevenir e evitar possíveis condenações.</w:t>
-      </w:r>
-    </w:p>
-    <w:p>
-      <w:pPr>
-        <w:pStyle w:val="Compact"/>
-        <w:numPr>
-          <w:ilvl w:val="0"/>
-          <w:numId w:val="1010"/>
-        </w:numPr>
-      </w:pPr>
-      <w:r>
-        <w:t xml:space="preserve">Propagar a cultura de Direitos Humanos, fomentando a aplicação dos Tratados Internacionais sobre a matéria de Direito Penal pelos gestores do sistema penal nacional.</w:t>
-      </w:r>
-    </w:p>
-    <w:p>
-      <w:pPr>
-        <w:pStyle w:val="Compact"/>
-        <w:numPr>
-          <w:ilvl w:val="0"/>
-          <w:numId w:val="1010"/>
-        </w:numPr>
-      </w:pPr>
-      <w:r>
-        <w:t xml:space="preserve">Fortalecer o diálogo entre a proteção de direitos e a governança no sistema penal.</w:t>
+        <w:t xml:space="preserve">Clique e acesse o Plano Nacional Pena Justa: Subpages/Pena_justa/Plano_Nacional_Pena_Justa.pdf</w:t>
+      </w:r>
+    </w:p>
+    <w:bookmarkEnd w:id="30"/>
+    <w:bookmarkStart w:id="31" w:name="subpágina-2---ema---senappen"/>
+    <w:p>
+      <w:pPr>
+        <w:pStyle w:val="Heading2"/>
+      </w:pPr>
+      <w:r>
+        <w:t xml:space="preserve">Subpágina 2 - EMA - SENAPPEN</w:t>
       </w:r>
     </w:p>
     <w:p>
@@ -4193,15 +4214,79 @@
         <w:pStyle w:val="FirstParagraph"/>
       </w:pPr>
       <w:r>
-        <w:t xml:space="preserve">Texto complementar da seção:</w:t>
-      </w:r>
-    </w:p>
-    <w:p>
-      <w:pPr>
-        <w:pStyle w:val="BodyText"/>
-      </w:pPr>
-      <w:r>
-        <w:t xml:space="preserve">Cabe citar a aproximação institucional e a construção de diálogo com órgãos-chave desse processo de monitoramento, como o Ministério das Relações Exteriores, o Ministério dos Direitos Humanos e da Cidadania e o Conselho Nacional de Justiça.</w:t>
+        <w:t xml:space="preserve">Título da página:</w:t>
+      </w:r>
+    </w:p>
+    <w:p>
+      <w:pPr>
+        <w:pStyle w:val="BodyText"/>
+      </w:pPr>
+      <w:r>
+        <w:t xml:space="preserve">EMA - SENAPPEN</w:t>
+      </w:r>
+    </w:p>
+    <w:p>
+      <w:pPr>
+        <w:pStyle w:val="BodyText"/>
+      </w:pPr>
+      <w:r>
+        <w:t xml:space="preserve">Imagem de destaque:</w:t>
+      </w:r>
+    </w:p>
+    <w:p>
+      <w:pPr>
+        <w:pStyle w:val="BodyText"/>
+      </w:pPr>
+      <w:r>
+        <w:t xml:space="preserve">Documentação/Botao_EMA.png</w:t>
+      </w:r>
+    </w:p>
+    <w:p>
+      <w:pPr>
+        <w:pStyle w:val="BodyText"/>
+      </w:pPr>
+      <w:r>
+        <w:t xml:space="preserve">Texto alternativo sugerido:</w:t>
+      </w:r>
+    </w:p>
+    <w:p>
+      <w:pPr>
+        <w:pStyle w:val="BodyText"/>
+      </w:pPr>
+      <w:r>
+        <w:t xml:space="preserve">Botão institucional da EMA - SENAPPEN.</w:t>
+      </w:r>
+    </w:p>
+    <w:p>
+      <w:pPr>
+        <w:pStyle w:val="BodyText"/>
+      </w:pPr>
+      <w:r>
+        <w:t xml:space="preserve">Identificador editorial:</w:t>
+      </w:r>
+    </w:p>
+    <w:p>
+      <w:pPr>
+        <w:pStyle w:val="BodyText"/>
+      </w:pPr>
+      <w:r>
+        <w:t xml:space="preserve">Conteúdo Técnico e Projetos Estruturantes</w:t>
+      </w:r>
+    </w:p>
+    <w:p>
+      <w:pPr>
+        <w:pStyle w:val="BodyText"/>
+      </w:pPr>
+      <w:r>
+        <w:t xml:space="preserve">Texto de destaque:</w:t>
+      </w:r>
+    </w:p>
+    <w:p>
+      <w:pPr>
+        <w:pStyle w:val="BodyText"/>
+      </w:pPr>
+      <w:r>
+        <w:t xml:space="preserve">Espaço da Equipe de Monitoramento e Acompanhamento das decisões e deliberações do Sistema Interamericano de Direitos Humanos em face do sistema penal nacional, dedicado a fortalecer o cumprimento das determinações do SIDH em parceria com as Unidades Federativas.</w:t>
       </w:r>
     </w:p>
     <w:p>
@@ -4217,7 +4302,39 @@
         <w:pStyle w:val="BodyText"/>
       </w:pPr>
       <w:r>
-        <w:t xml:space="preserve">Atuação institucional em 2025</w:t>
+        <w:t xml:space="preserve">Institucional</w:t>
+      </w:r>
+    </w:p>
+    <w:p>
+      <w:pPr>
+        <w:pStyle w:val="BodyText"/>
+      </w:pPr>
+      <w:r>
+        <w:t xml:space="preserve">Imagem complementar opcional:</w:t>
+      </w:r>
+    </w:p>
+    <w:p>
+      <w:pPr>
+        <w:pStyle w:val="BodyText"/>
+      </w:pPr>
+      <w:r>
+        <w:t xml:space="preserve">Documentação/Banner_Ema_Organograma.png</w:t>
+      </w:r>
+    </w:p>
+    <w:p>
+      <w:pPr>
+        <w:pStyle w:val="BodyText"/>
+      </w:pPr>
+      <w:r>
+        <w:t xml:space="preserve">Texto alternativo sugerido:</w:t>
+      </w:r>
+    </w:p>
+    <w:p>
+      <w:pPr>
+        <w:pStyle w:val="BodyText"/>
+      </w:pPr>
+      <w:r>
+        <w:t xml:space="preserve">Organograma da EMA - SENAPPEN.</w:t>
       </w:r>
     </w:p>
     <w:p>
@@ -4233,7 +4350,7 @@
         <w:pStyle w:val="BodyText"/>
       </w:pPr>
       <w:r>
-        <w:t xml:space="preserve">Em 2025, a EMA/Senappen intensificou o acompanhamento do Sistema Interamericano de Direitos Humanos com foco em decisões, deliberações e medidas com repercussão sobre o sistema penal brasileiro. A atuação combinou articulação interinstitucional, monitoramento técnico e apoio à consolidação de respostas coordenadas do Estado.</w:t>
+        <w:t xml:space="preserve">A EMA-SENAPPEN foi instituída, inicialmente, pela Portaria GABSEC/SENAPPEN/MJSP Nº 350, de 13 de junho de 2024, em um esforço de integrar a Secretaria Nacional de Políticas Penais ao processo de cumprimento das decisões do SIDH, dado seu rol de competências, em especial, a previsão de prestar apoio técnico aos entes federativos quanto à implementação dos princípios e das regras da execução penal.</w:t>
       </w:r>
     </w:p>
     <w:p>
@@ -4249,15 +4366,31 @@
         <w:pStyle w:val="BodyText"/>
       </w:pPr>
       <w:r>
-        <w:t xml:space="preserve">Nesse período, a equipe ampliou sua participação em agendas voltadas ao acompanhamento de casos perante a Corte Interamericana de Direitos Humanos e ao fortalecimento de mecanismos permanentes de monitoramento no âmbito da política penal.</w:t>
-      </w:r>
-    </w:p>
-    <w:p>
-      <w:pPr>
-        <w:pStyle w:val="BodyText"/>
-      </w:pPr>
-      <w:r>
-        <w:t xml:space="preserve">Imagens complementares opcionais:</w:t>
+        <w:t xml:space="preserve">A estrutura da EMA foi alterada em 2025, mediante as Portarias GABSEC/SENAPPEN/MJSP Nº 511, de 13 de outubro de 2025, e Portaria de Pessoal GABSEC/SENAPPEN/MJSP Nº 93, de 10 de março de 2026, as quais possuíam por objetivo o aprimoramento da sua composição institucional, conforme o organograma a seguir:</w:t>
+      </w:r>
+    </w:p>
+    <w:p>
+      <w:pPr>
+        <w:pStyle w:val="BodyText"/>
+      </w:pPr>
+      <w:r>
+        <w:t xml:space="preserve">Seção:</w:t>
+      </w:r>
+    </w:p>
+    <w:p>
+      <w:pPr>
+        <w:pStyle w:val="BodyText"/>
+      </w:pPr>
+      <w:r>
+        <w:t xml:space="preserve">Frentes de Atuação</w:t>
+      </w:r>
+    </w:p>
+    <w:p>
+      <w:pPr>
+        <w:pStyle w:val="BodyText"/>
+      </w:pPr>
+      <w:r>
+        <w:t xml:space="preserve">Itens para colar:</w:t>
       </w:r>
     </w:p>
     <w:p>
@@ -4269,7 +4402,7 @@
         </w:numPr>
       </w:pPr>
       <w:r>
-        <w:t xml:space="preserve">Documentação/Banner_Ema.jpg</w:t>
+        <w:t xml:space="preserve">Monitorar e acompanhar as estratégias adotadas pelo Estado Brasileiro para o cumprimento das decisões do SIDH em relação ao sistema penal.</w:t>
       </w:r>
     </w:p>
     <w:p>
@@ -4281,7 +4414,31 @@
         </w:numPr>
       </w:pPr>
       <w:r>
-        <w:t xml:space="preserve">Documentação/Banner_Ema_2.jpg</w:t>
+        <w:t xml:space="preserve">Prevenir e evitar possíveis condenações.</w:t>
+      </w:r>
+    </w:p>
+    <w:p>
+      <w:pPr>
+        <w:pStyle w:val="Compact"/>
+        <w:numPr>
+          <w:ilvl w:val="0"/>
+          <w:numId w:val="1011"/>
+        </w:numPr>
+      </w:pPr>
+      <w:r>
+        <w:t xml:space="preserve">Propagar a cultura de Direitos Humanos, fomentando a aplicação dos Tratados Internacionais sobre a matéria de Direito Penal pelos gestores do sistema penal nacional.</w:t>
+      </w:r>
+    </w:p>
+    <w:p>
+      <w:pPr>
+        <w:pStyle w:val="Compact"/>
+        <w:numPr>
+          <w:ilvl w:val="0"/>
+          <w:numId w:val="1011"/>
+        </w:numPr>
+      </w:pPr>
+      <w:r>
+        <w:t xml:space="preserve">Fortalecer o diálogo entre a proteção de direitos e a governança no sistema penal.</w:t>
       </w:r>
     </w:p>
     <w:p>
@@ -4289,7 +4446,71 @@
         <w:pStyle w:val="FirstParagraph"/>
       </w:pPr>
       <w:r>
-        <w:t xml:space="preserve">Textos alternativos sugeridos:</w:t>
+        <w:t xml:space="preserve">Texto complementar da seção:</w:t>
+      </w:r>
+    </w:p>
+    <w:p>
+      <w:pPr>
+        <w:pStyle w:val="BodyText"/>
+      </w:pPr>
+      <w:r>
+        <w:t xml:space="preserve">Cabe citar a aproximação institucional e a construção de diálogo com órgãos-chave desse processo de monitoramento, como o Ministério das Relações Exteriores, o Ministério dos Direitos Humanos e da Cidadania e o Conselho Nacional de Justiça.</w:t>
+      </w:r>
+    </w:p>
+    <w:p>
+      <w:pPr>
+        <w:pStyle w:val="BodyText"/>
+      </w:pPr>
+      <w:r>
+        <w:t xml:space="preserve">Seção:</w:t>
+      </w:r>
+    </w:p>
+    <w:p>
+      <w:pPr>
+        <w:pStyle w:val="BodyText"/>
+      </w:pPr>
+      <w:r>
+        <w:t xml:space="preserve">Atuação institucional em 2025</w:t>
+      </w:r>
+    </w:p>
+    <w:p>
+      <w:pPr>
+        <w:pStyle w:val="BodyText"/>
+      </w:pPr>
+      <w:r>
+        <w:t xml:space="preserve">Texto para colar:</w:t>
+      </w:r>
+    </w:p>
+    <w:p>
+      <w:pPr>
+        <w:pStyle w:val="BodyText"/>
+      </w:pPr>
+      <w:r>
+        <w:t xml:space="preserve">Em 2025, a EMA/Senappen intensificou o acompanhamento do Sistema Interamericano de Direitos Humanos com foco em decisões, deliberações e medidas com repercussão sobre o sistema penal brasileiro. A atuação combinou articulação interinstitucional, monitoramento técnico e apoio à consolidação de respostas coordenadas do Estado.</w:t>
+      </w:r>
+    </w:p>
+    <w:p>
+      <w:pPr>
+        <w:pStyle w:val="BodyText"/>
+      </w:pPr>
+      <w:r>
+        <w:t xml:space="preserve">A segunda linha da seção:</w:t>
+      </w:r>
+    </w:p>
+    <w:p>
+      <w:pPr>
+        <w:pStyle w:val="BodyText"/>
+      </w:pPr>
+      <w:r>
+        <w:t xml:space="preserve">Nesse período, a equipe ampliou sua participação em agendas voltadas ao acompanhamento de casos perante a Corte Interamericana de Direitos Humanos e ao fortalecimento de mecanismos permanentes de monitoramento no âmbito da política penal.</w:t>
+      </w:r>
+    </w:p>
+    <w:p>
+      <w:pPr>
+        <w:pStyle w:val="BodyText"/>
+      </w:pPr>
+      <w:r>
+        <w:t xml:space="preserve">Imagens complementares opcionais:</w:t>
       </w:r>
     </w:p>
     <w:p>
@@ -4301,7 +4522,7 @@
         </w:numPr>
       </w:pPr>
       <w:r>
-        <w:t xml:space="preserve">Participantes reunidos em mesa de trabalho institucional acompanhada pela EMA - SENAPPEN.</w:t>
+        <w:t xml:space="preserve">Documentação/Banner_Ema.jpg</w:t>
       </w:r>
     </w:p>
     <w:p>
@@ -4313,7 +4534,7 @@
         </w:numPr>
       </w:pPr>
       <w:r>
-        <w:t xml:space="preserve">Participantes posicionados em registro oficial de agenda institucional acompanhada pela EMA - SENAPPEN.</w:t>
+        <w:t xml:space="preserve">Documentação/Banner_Ema_2.jpg</w:t>
       </w:r>
     </w:p>
     <w:p>
@@ -4321,7 +4542,7 @@
         <w:pStyle w:val="FirstParagraph"/>
       </w:pPr>
       <w:r>
-        <w:t xml:space="preserve">Legendas sugeridas:</w:t>
+        <w:t xml:space="preserve">Textos alternativos sugeridos:</w:t>
       </w:r>
     </w:p>
     <w:p>
@@ -4333,7 +4554,7 @@
         </w:numPr>
       </w:pPr>
       <w:r>
-        <w:t xml:space="preserve">Reunião institucional acompanhada pela EMA - SENAPPEN.</w:t>
+        <w:t xml:space="preserve">Participantes reunidos em mesa de trabalho institucional acompanhada pela EMA - SENAPPEN.</w:t>
       </w:r>
     </w:p>
     <w:p>
@@ -4345,7 +4566,7 @@
         </w:numPr>
       </w:pPr>
       <w:r>
-        <w:t xml:space="preserve">Registro oficial de agenda institucional da EMA - SENAPPEN.</w:t>
+        <w:t xml:space="preserve">Participantes posicionados em registro oficial de agenda institucional acompanhada pela EMA - SENAPPEN.</w:t>
       </w:r>
     </w:p>
     <w:p>
@@ -4353,71 +4574,7 @@
         <w:pStyle w:val="FirstParagraph"/>
       </w:pPr>
       <w:r>
-        <w:t xml:space="preserve">Seção:</w:t>
-      </w:r>
-    </w:p>
-    <w:p>
-      <w:pPr>
-        <w:pStyle w:val="BodyText"/>
-      </w:pPr>
-      <w:r>
-        <w:t xml:space="preserve">Caso Pedrinhas</w:t>
-      </w:r>
-    </w:p>
-    <w:p>
-      <w:pPr>
-        <w:pStyle w:val="BodyText"/>
-      </w:pPr>
-      <w:r>
-        <w:t xml:space="preserve">Texto para colar:</w:t>
-      </w:r>
-    </w:p>
-    <w:p>
-      <w:pPr>
-        <w:pStyle w:val="BodyText"/>
-      </w:pPr>
-      <w:r>
-        <w:t xml:space="preserve">Em 21 de outubro de 2025, a EMA-SENAPPEN foi convocada a participar, juntamente a outros órgãos representantes do Estado Brasileiro, da audiência privada solicitada pela Corte Interamericana de Direitos Humanos sobre as Medidas Provisórias outorgadas no Caso do Complexo Penitenciário de São Luís, Maranhão (Caso Pedrinhas).</w:t>
-      </w:r>
-    </w:p>
-    <w:p>
-      <w:pPr>
-        <w:pStyle w:val="BodyText"/>
-      </w:pPr>
-      <w:r>
-        <w:t xml:space="preserve">A segunda linha da seção:</w:t>
-      </w:r>
-    </w:p>
-    <w:p>
-      <w:pPr>
-        <w:pStyle w:val="BodyText"/>
-      </w:pPr>
-      <w:r>
-        <w:t xml:space="preserve">Como desdobramento da audiência, a Equipe ficou responsável por coordenar uma mesa de trabalho voltada à elaboração de um plano de cumprimento conjunto, com foco no enfrentamento das fragilidades ainda identificadas no Caso.</w:t>
-      </w:r>
-    </w:p>
-    <w:p>
-      <w:pPr>
-        <w:pStyle w:val="BodyText"/>
-      </w:pPr>
-      <w:r>
-        <w:t xml:space="preserve">Subseção:</w:t>
-      </w:r>
-    </w:p>
-    <w:p>
-      <w:pPr>
-        <w:pStyle w:val="BodyText"/>
-      </w:pPr>
-      <w:r>
-        <w:t xml:space="preserve">Eixos priorizados</w:t>
-      </w:r>
-    </w:p>
-    <w:p>
-      <w:pPr>
-        <w:pStyle w:val="BodyText"/>
-      </w:pPr>
-      <w:r>
-        <w:t xml:space="preserve">Itens para colar:</w:t>
+        <w:t xml:space="preserve">Legendas sugeridas:</w:t>
       </w:r>
     </w:p>
     <w:p>
@@ -4429,7 +4586,7 @@
         </w:numPr>
       </w:pPr>
       <w:r>
-        <w:t xml:space="preserve">Superlotação e ambiência no sistema prisional.</w:t>
+        <w:t xml:space="preserve">Reunião institucional acompanhada pela EMA - SENAPPEN.</w:t>
       </w:r>
     </w:p>
     <w:p>
@@ -4441,31 +4598,7 @@
         </w:numPr>
       </w:pPr>
       <w:r>
-        <w:t xml:space="preserve">Dignidade e condições de custódia.</w:t>
-      </w:r>
-    </w:p>
-    <w:p>
-      <w:pPr>
-        <w:pStyle w:val="Compact"/>
-        <w:numPr>
-          <w:ilvl w:val="0"/>
-          <w:numId w:val="1014"/>
-        </w:numPr>
-      </w:pPr>
-      <w:r>
-        <w:t xml:space="preserve">Acesso à justiça e prevenção à tortura.</w:t>
-      </w:r>
-    </w:p>
-    <w:p>
-      <w:pPr>
-        <w:pStyle w:val="Compact"/>
-        <w:numPr>
-          <w:ilvl w:val="0"/>
-          <w:numId w:val="1014"/>
-        </w:numPr>
-      </w:pPr>
-      <w:r>
-        <w:t xml:space="preserve">Monitoramento, participação social e coordenação institucional.</w:t>
+        <w:t xml:space="preserve">Registro oficial de agenda institucional da EMA - SENAPPEN.</w:t>
       </w:r>
     </w:p>
     <w:p>
@@ -4473,6 +4606,54 @@
         <w:pStyle w:val="FirstParagraph"/>
       </w:pPr>
       <w:r>
+        <w:t xml:space="preserve">Seção:</w:t>
+      </w:r>
+    </w:p>
+    <w:p>
+      <w:pPr>
+        <w:pStyle w:val="BodyText"/>
+      </w:pPr>
+      <w:r>
+        <w:t xml:space="preserve">Caso Pedrinhas</w:t>
+      </w:r>
+    </w:p>
+    <w:p>
+      <w:pPr>
+        <w:pStyle w:val="BodyText"/>
+      </w:pPr>
+      <w:r>
+        <w:t xml:space="preserve">Texto para colar:</w:t>
+      </w:r>
+    </w:p>
+    <w:p>
+      <w:pPr>
+        <w:pStyle w:val="BodyText"/>
+      </w:pPr>
+      <w:r>
+        <w:t xml:space="preserve">Em 21 de outubro de 2025, a EMA-SENAPPEN foi convocada a participar, juntamente a outros órgãos representantes do Estado Brasileiro, da audiência privada solicitada pela Corte Interamericana de Direitos Humanos sobre as Medidas Provisórias outorgadas no Caso do Complexo Penitenciário de São Luís, Maranhão (Caso Pedrinhas).</w:t>
+      </w:r>
+    </w:p>
+    <w:p>
+      <w:pPr>
+        <w:pStyle w:val="BodyText"/>
+      </w:pPr>
+      <w:r>
+        <w:t xml:space="preserve">A segunda linha da seção:</w:t>
+      </w:r>
+    </w:p>
+    <w:p>
+      <w:pPr>
+        <w:pStyle w:val="BodyText"/>
+      </w:pPr>
+      <w:r>
+        <w:t xml:space="preserve">Como desdobramento da audiência, a Equipe ficou responsável por coordenar uma mesa de trabalho voltada à elaboração de um plano de cumprimento conjunto, com foco no enfrentamento das fragilidades ainda identificadas no Caso.</w:t>
+      </w:r>
+    </w:p>
+    <w:p>
+      <w:pPr>
+        <w:pStyle w:val="BodyText"/>
+      </w:pPr>
+      <w:r>
         <w:t xml:space="preserve">Subseção:</w:t>
       </w:r>
     </w:p>
@@ -4481,79 +4662,15 @@
         <w:pStyle w:val="BodyText"/>
       </w:pPr>
       <w:r>
-        <w:t xml:space="preserve">Desdobramentos e articulação técnica</w:t>
-      </w:r>
-    </w:p>
-    <w:p>
-      <w:pPr>
-        <w:pStyle w:val="BodyText"/>
-      </w:pPr>
-      <w:r>
-        <w:t xml:space="preserve">Texto para colar:</w:t>
-      </w:r>
-    </w:p>
-    <w:p>
-      <w:pPr>
-        <w:pStyle w:val="BodyText"/>
-      </w:pPr>
-      <w:r>
-        <w:t xml:space="preserve">Entre novembro e dezembro de 2025, a EMA/Senappen contribuiu para a formalização da mesa de trabalho, participou de reuniões técnicas dedicadas aos eixos temáticos do caso e apoiou a preparação de visita técnica destinada a consolidar diagnósticos e orientar as próximas medidas.</w:t>
-      </w:r>
-    </w:p>
-    <w:p>
-      <w:pPr>
-        <w:pStyle w:val="BodyText"/>
-      </w:pPr>
-      <w:r>
-        <w:t xml:space="preserve">A segunda linha da subseção:</w:t>
-      </w:r>
-    </w:p>
-    <w:p>
-      <w:pPr>
-        <w:pStyle w:val="BodyText"/>
-      </w:pPr>
-      <w:r>
-        <w:t xml:space="preserve">No mesmo contexto, a equipe atuou de forma articulada com o Plano Pena Justa e acompanhou iniciativas voltadas à criação de instâncias permanentes de monitoramento e à padronização de fluxos para acompanhamento de casos internacionais com incidência sobre o sistema penal brasileiro.</w:t>
-      </w:r>
-    </w:p>
-    <w:p>
-      <w:pPr>
-        <w:pStyle w:val="BodyText"/>
-      </w:pPr>
-      <w:r>
-        <w:t xml:space="preserve">Seção:</w:t>
-      </w:r>
-    </w:p>
-    <w:p>
-      <w:pPr>
-        <w:pStyle w:val="BodyText"/>
-      </w:pPr>
-      <w:r>
-        <w:t xml:space="preserve">Referências públicas do SIDH</w:t>
-      </w:r>
-    </w:p>
-    <w:p>
-      <w:pPr>
-        <w:pStyle w:val="BodyText"/>
-      </w:pPr>
-      <w:r>
-        <w:t xml:space="preserve">Texto para colar:</w:t>
-      </w:r>
-    </w:p>
-    <w:p>
-      <w:pPr>
-        <w:pStyle w:val="BodyText"/>
-      </w:pPr>
-      <w:r>
-        <w:t xml:space="preserve">Para contextualização institucional da pauta, a ONASP pode utilizar como pontos de partida as referências públicas abaixo, produzidas pelos próprios órgãos do sistema interamericano:</w:t>
-      </w:r>
-    </w:p>
-    <w:p>
-      <w:pPr>
-        <w:pStyle w:val="BodyText"/>
-      </w:pPr>
-      <w:r>
-        <w:t xml:space="preserve">Links:</w:t>
+        <w:t xml:space="preserve">Eixos priorizados</w:t>
+      </w:r>
+    </w:p>
+    <w:p>
+      <w:pPr>
+        <w:pStyle w:val="BodyText"/>
+      </w:pPr>
+      <w:r>
+        <w:t xml:space="preserve">Itens para colar:</w:t>
       </w:r>
     </w:p>
     <w:p>
@@ -4565,7 +4682,7 @@
         </w:numPr>
       </w:pPr>
       <w:r>
-        <w:t xml:space="preserve">O que é a CIDH?: https://www.oas.org/pt/cidh/mandato/que.asp</w:t>
+        <w:t xml:space="preserve">Superlotação e ambiência no sistema prisional.</w:t>
       </w:r>
     </w:p>
     <w:p>
@@ -4577,7 +4694,7 @@
         </w:numPr>
       </w:pPr>
       <w:r>
-        <w:t xml:space="preserve">O que é a Corte IDH?: https://www.corteidh.or.cr/que_es_la_corte.cfm?lang=pt</w:t>
+        <w:t xml:space="preserve">Dignidade e condições de custódia.</w:t>
       </w:r>
     </w:p>
     <w:p>
@@ -4589,7 +4706,7 @@
         </w:numPr>
       </w:pPr>
       <w:r>
-        <w:t xml:space="preserve">Estatuto da Comissão Interamericana de Direitos Humanos: https://www.oas.org/pt/cidh/mandato/Basicos/estatutoCIDH.asp</w:t>
+        <w:t xml:space="preserve">Acesso à justiça e prevenção à tortura.</w:t>
       </w:r>
     </w:p>
     <w:p>
@@ -4601,7 +4718,7 @@
         </w:numPr>
       </w:pPr>
       <w:r>
-        <w:t xml:space="preserve">Declaração Americana de Direitos e Deveres do Homem: https://www.oas.org/pt/cidh/mandato/Basicos/declaracion.asp</w:t>
+        <w:t xml:space="preserve">Monitoramento, participação social e coordenação institucional.</w:t>
       </w:r>
     </w:p>
     <w:p>
@@ -4609,113 +4726,63 @@
         <w:pStyle w:val="FirstParagraph"/>
       </w:pPr>
       <w:r>
+        <w:t xml:space="preserve">Subseção:</w:t>
+      </w:r>
+    </w:p>
+    <w:p>
+      <w:pPr>
+        <w:pStyle w:val="BodyText"/>
+      </w:pPr>
+      <w:r>
+        <w:t xml:space="preserve">Desdobramentos e articulação técnica</w:t>
+      </w:r>
+    </w:p>
+    <w:p>
+      <w:pPr>
+        <w:pStyle w:val="BodyText"/>
+      </w:pPr>
+      <w:r>
+        <w:t xml:space="preserve">Texto para colar:</w:t>
+      </w:r>
+    </w:p>
+    <w:p>
+      <w:pPr>
+        <w:pStyle w:val="BodyText"/>
+      </w:pPr>
+      <w:r>
+        <w:t xml:space="preserve">Entre novembro e dezembro de 2025, a EMA/Senappen contribuiu para a formalização da mesa de trabalho, participou de reuniões técnicas dedicadas aos eixos temáticos do caso e apoiou a preparação de visita técnica destinada a consolidar diagnósticos e orientar as próximas medidas.</w:t>
+      </w:r>
+    </w:p>
+    <w:p>
+      <w:pPr>
+        <w:pStyle w:val="BodyText"/>
+      </w:pPr>
+      <w:r>
+        <w:t xml:space="preserve">A segunda linha da subseção:</w:t>
+      </w:r>
+    </w:p>
+    <w:p>
+      <w:pPr>
+        <w:pStyle w:val="BodyText"/>
+      </w:pPr>
+      <w:r>
+        <w:t xml:space="preserve">No mesmo contexto, a equipe atuou de forma articulada com o Plano Pena Justa e acompanhou iniciativas voltadas à criação de instâncias permanentes de monitoramento e à padronização de fluxos para acompanhamento de casos internacionais com incidência sobre o sistema penal brasileiro.</w:t>
+      </w:r>
+    </w:p>
+    <w:p>
+      <w:pPr>
+        <w:pStyle w:val="BodyText"/>
+      </w:pPr>
+      <w:r>
         <w:t xml:space="preserve">Seção:</w:t>
       </w:r>
     </w:p>
-    <w:bookmarkEnd w:id="23"/>
-    <w:bookmarkStart w:id="24" w:name="subpágina-3---plano-pena-justa"/>
-    <w:p>
-      <w:pPr>
-        <w:pStyle w:val="Heading2"/>
-      </w:pPr>
-      <w:r>
-        <w:t xml:space="preserve">Subpágina 3 - Plano Pena Justa</w:t>
-      </w:r>
-    </w:p>
-    <w:p>
-      <w:pPr>
-        <w:pStyle w:val="FirstParagraph"/>
-      </w:pPr>
-      <w:r>
-        <w:t xml:space="preserve">Título da página:</w:t>
-      </w:r>
-    </w:p>
-    <w:p>
-      <w:pPr>
-        <w:pStyle w:val="BodyText"/>
-      </w:pPr>
-      <w:r>
-        <w:t xml:space="preserve">Plano Pena Justa</w:t>
-      </w:r>
-    </w:p>
-    <w:p>
-      <w:pPr>
-        <w:pStyle w:val="BodyText"/>
-      </w:pPr>
-      <w:r>
-        <w:t xml:space="preserve">Imagem de destaque:</w:t>
-      </w:r>
-    </w:p>
-    <w:p>
-      <w:pPr>
-        <w:pStyle w:val="BodyText"/>
-      </w:pPr>
-      <w:r>
-        <w:t xml:space="preserve">Documentação/Botao_PenaJusta.png</w:t>
-      </w:r>
-    </w:p>
-    <w:p>
-      <w:pPr>
-        <w:pStyle w:val="BodyText"/>
-      </w:pPr>
-      <w:r>
-        <w:t xml:space="preserve">Texto alternativo sugerido:</w:t>
-      </w:r>
-    </w:p>
-    <w:p>
-      <w:pPr>
-        <w:pStyle w:val="BodyText"/>
-      </w:pPr>
-      <w:r>
-        <w:t xml:space="preserve">Marca do Plano Pena Justa.</w:t>
-      </w:r>
-    </w:p>
-    <w:p>
-      <w:pPr>
-        <w:pStyle w:val="BodyText"/>
-      </w:pPr>
-      <w:r>
-        <w:t xml:space="preserve">Identificador editorial:</w:t>
-      </w:r>
-    </w:p>
-    <w:p>
-      <w:pPr>
-        <w:pStyle w:val="BodyText"/>
-      </w:pPr>
-      <w:r>
-        <w:t xml:space="preserve">Conteúdo Técnico e Projetos Estruturantes</w:t>
-      </w:r>
-    </w:p>
-    <w:p>
-      <w:pPr>
-        <w:pStyle w:val="BodyText"/>
-      </w:pPr>
-      <w:r>
-        <w:t xml:space="preserve">Texto de destaque:</w:t>
-      </w:r>
-    </w:p>
-    <w:p>
-      <w:pPr>
-        <w:pStyle w:val="BodyText"/>
-      </w:pPr>
-      <w:r>
-        <w:t xml:space="preserve">Ambiente dedicado ao Plano Pena Justa, com informações gerais, documentos públicos e marcos relacionados ao fortalecimento das ouvidorias no sistema penal.</w:t>
-      </w:r>
-    </w:p>
-    <w:p>
-      <w:pPr>
-        <w:pStyle w:val="BodyText"/>
-      </w:pPr>
-      <w:r>
-        <w:t xml:space="preserve">Seção:</w:t>
-      </w:r>
-    </w:p>
-    <w:p>
-      <w:pPr>
-        <w:pStyle w:val="BodyText"/>
-      </w:pPr>
-      <w:r>
-        <w:t xml:space="preserve">O Plano</w:t>
+    <w:p>
+      <w:pPr>
+        <w:pStyle w:val="BodyText"/>
+      </w:pPr>
+      <w:r>
+        <w:t xml:space="preserve">Referências públicas do SIDH</w:t>
       </w:r>
     </w:p>
     <w:p>
@@ -4731,47 +4798,15 @@
         <w:pStyle w:val="BodyText"/>
       </w:pPr>
       <w:r>
-        <w:t xml:space="preserve">O Plano Pena Justa é o Plano Nacional para o Enfrentamento do Estado de Coisas Inconstitucional nas Prisões Brasileiras, no âmbito da ADPF 347. Sua proposta articula ações de qualificação das políticas penais, fortalecimento da segurança pública, valorização dos servidores penais, transparência, participação social e monitoramento das metas pactuadas.</w:t>
-      </w:r>
-    </w:p>
-    <w:p>
-      <w:pPr>
-        <w:pStyle w:val="BodyText"/>
-      </w:pPr>
-      <w:r>
-        <w:t xml:space="preserve">Na perspectiva da Ouvidoria Nacional de Serviços Penais, esta subpágina reúne referências públicas do Plano voltadas ao fortalecimento da participação social, da escuta qualificada e da articulação entre as ouvidorias dos serviços penais nos Estados e no Distrito Federal.</w:t>
-      </w:r>
-    </w:p>
-    <w:p>
-      <w:pPr>
-        <w:pStyle w:val="BodyText"/>
-      </w:pPr>
-      <w:r>
-        <w:t xml:space="preserve">Seção:</w:t>
-      </w:r>
-    </w:p>
-    <w:p>
-      <w:pPr>
-        <w:pStyle w:val="BodyText"/>
-      </w:pPr>
-      <w:r>
-        <w:t xml:space="preserve">Eixos de atuação</w:t>
-      </w:r>
-    </w:p>
-    <w:p>
-      <w:pPr>
-        <w:pStyle w:val="BodyText"/>
-      </w:pPr>
-      <w:r>
-        <w:t xml:space="preserve">Texto para colar:</w:t>
-      </w:r>
-    </w:p>
-    <w:p>
-      <w:pPr>
-        <w:pStyle w:val="BodyText"/>
-      </w:pPr>
-      <w:r>
-        <w:t xml:space="preserve">O Plano Nacional organiza sua atuação em quatro eixos estruturantes:</w:t>
+        <w:t xml:space="preserve">Para contextualização institucional da pauta, a ONASP pode utilizar como pontos de partida as referências públicas abaixo, produzidas pelos próprios órgãos do sistema interamericano:</w:t>
+      </w:r>
+    </w:p>
+    <w:p>
+      <w:pPr>
+        <w:pStyle w:val="BodyText"/>
+      </w:pPr>
+      <w:r>
+        <w:t xml:space="preserve">Links:</w:t>
       </w:r>
     </w:p>
     <w:p>
@@ -4783,7 +4818,7 @@
         </w:numPr>
       </w:pPr>
       <w:r>
-        <w:t xml:space="preserve">Controle da entrada e das vagas do sistema prisional.</w:t>
+        <w:t xml:space="preserve">O que é a CIDH?: https://www.oas.org/pt/cidh/mandato/que.asp</w:t>
       </w:r>
     </w:p>
     <w:p>
@@ -4795,7 +4830,7 @@
         </w:numPr>
       </w:pPr>
       <w:r>
-        <w:t xml:space="preserve">Qualidade da ambiência, dos serviços prestados e da estrutura prisional.</w:t>
+        <w:t xml:space="preserve">O que é a Corte IDH?: https://www.corteidh.or.cr/que_es_la_corte.cfm?lang=pt</w:t>
       </w:r>
     </w:p>
     <w:p>
@@ -4807,7 +4842,7 @@
         </w:numPr>
       </w:pPr>
       <w:r>
-        <w:t xml:space="preserve">Processos de saída da prisão e de reintegração social.</w:t>
+        <w:t xml:space="preserve">Estatuto da Comissão Interamericana de Direitos Humanos: https://www.oas.org/pt/cidh/mandato/Basicos/estatutoCIDH.asp</w:t>
       </w:r>
     </w:p>
     <w:p>
@@ -4819,7 +4854,7 @@
         </w:numPr>
       </w:pPr>
       <w:r>
-        <w:t xml:space="preserve">Políticas de não repetição do Estado de Coisas Inconstitucional no sistema prisional.</w:t>
+        <w:t xml:space="preserve">Declaração Americana de Direitos e Deveres do Homem: https://www.oas.org/pt/cidh/mandato/Basicos/declaracion.asp</w:t>
       </w:r>
     </w:p>
     <w:p>
@@ -4830,12 +4865,110 @@
         <w:t xml:space="preserve">Seção:</w:t>
       </w:r>
     </w:p>
-    <w:p>
-      <w:pPr>
-        <w:pStyle w:val="BodyText"/>
-      </w:pPr>
-      <w:r>
-        <w:t xml:space="preserve">Governança e acompanhamento</w:t>
+    <w:bookmarkEnd w:id="31"/>
+    <w:bookmarkStart w:id="32" w:name="subpágina-3---plano-pena-justa"/>
+    <w:p>
+      <w:pPr>
+        <w:pStyle w:val="Heading2"/>
+      </w:pPr>
+      <w:r>
+        <w:t xml:space="preserve">Subpágina 3 - Plano Pena Justa</w:t>
+      </w:r>
+    </w:p>
+    <w:p>
+      <w:pPr>
+        <w:pStyle w:val="FirstParagraph"/>
+      </w:pPr>
+      <w:r>
+        <w:t xml:space="preserve">Título da página:</w:t>
+      </w:r>
+    </w:p>
+    <w:p>
+      <w:pPr>
+        <w:pStyle w:val="BodyText"/>
+      </w:pPr>
+      <w:r>
+        <w:t xml:space="preserve">Plano Pena Justa</w:t>
+      </w:r>
+    </w:p>
+    <w:p>
+      <w:pPr>
+        <w:pStyle w:val="BodyText"/>
+      </w:pPr>
+      <w:r>
+        <w:t xml:space="preserve">Imagem de destaque:</w:t>
+      </w:r>
+    </w:p>
+    <w:p>
+      <w:pPr>
+        <w:pStyle w:val="BodyText"/>
+      </w:pPr>
+      <w:r>
+        <w:t xml:space="preserve">Documentação/Botao_PenaJusta.png</w:t>
+      </w:r>
+    </w:p>
+    <w:p>
+      <w:pPr>
+        <w:pStyle w:val="BodyText"/>
+      </w:pPr>
+      <w:r>
+        <w:t xml:space="preserve">Texto alternativo sugerido:</w:t>
+      </w:r>
+    </w:p>
+    <w:p>
+      <w:pPr>
+        <w:pStyle w:val="BodyText"/>
+      </w:pPr>
+      <w:r>
+        <w:t xml:space="preserve">Marca do Plano Pena Justa.</w:t>
+      </w:r>
+    </w:p>
+    <w:p>
+      <w:pPr>
+        <w:pStyle w:val="BodyText"/>
+      </w:pPr>
+      <w:r>
+        <w:t xml:space="preserve">Identificador editorial:</w:t>
+      </w:r>
+    </w:p>
+    <w:p>
+      <w:pPr>
+        <w:pStyle w:val="BodyText"/>
+      </w:pPr>
+      <w:r>
+        <w:t xml:space="preserve">Conteúdo Técnico e Projetos Estruturantes</w:t>
+      </w:r>
+    </w:p>
+    <w:p>
+      <w:pPr>
+        <w:pStyle w:val="BodyText"/>
+      </w:pPr>
+      <w:r>
+        <w:t xml:space="preserve">Texto de destaque:</w:t>
+      </w:r>
+    </w:p>
+    <w:p>
+      <w:pPr>
+        <w:pStyle w:val="BodyText"/>
+      </w:pPr>
+      <w:r>
+        <w:t xml:space="preserve">Ambiente dedicado ao Plano Pena Justa, com informações gerais, documentos públicos e marcos relacionados ao fortalecimento das ouvidorias no sistema penal.</w:t>
+      </w:r>
+    </w:p>
+    <w:p>
+      <w:pPr>
+        <w:pStyle w:val="BodyText"/>
+      </w:pPr>
+      <w:r>
+        <w:t xml:space="preserve">Seção:</w:t>
+      </w:r>
+    </w:p>
+    <w:p>
+      <w:pPr>
+        <w:pStyle w:val="BodyText"/>
+      </w:pPr>
+      <w:r>
+        <w:t xml:space="preserve">O Plano</w:t>
       </w:r>
     </w:p>
     <w:p>
@@ -4851,15 +4984,15 @@
         <w:pStyle w:val="BodyText"/>
       </w:pPr>
       <w:r>
-        <w:t xml:space="preserve">No recorte da Ouvidoria Nacional de Serviços Penais, o acompanhamento do Pena Justa prioriza instrumentos que fortaleçam a escuta qualificada, a transparência ativa e a coordenação entre as ouvidorias dos serviços penais.</w:t>
-      </w:r>
-    </w:p>
-    <w:p>
-      <w:pPr>
-        <w:pStyle w:val="BodyText"/>
-      </w:pPr>
-      <w:r>
-        <w:t xml:space="preserve">Esse recorte se materializa por meio de marcos normativos e de cooperação técnica que estruturam parâmetros mínimos de atuação, incentivam integração preferencial ao Fala.BR e consolidam uma rede permanente de intercâmbio entre União, Estados e Distrito Federal.</w:t>
+        <w:t xml:space="preserve">O Plano Pena Justa é o Plano Nacional para o Enfrentamento do Estado de Coisas Inconstitucional nas Prisões Brasileiras, no âmbito da ADPF 347. Sua proposta articula ações de qualificação das políticas penais, fortalecimento da segurança pública, valorização dos servidores penais, transparência, participação social e monitoramento das metas pactuadas.</w:t>
+      </w:r>
+    </w:p>
+    <w:p>
+      <w:pPr>
+        <w:pStyle w:val="BodyText"/>
+      </w:pPr>
+      <w:r>
+        <w:t xml:space="preserve">Na perspectiva da Ouvidoria Nacional de Serviços Penais, esta subpágina reúne referências públicas do Plano voltadas ao fortalecimento da participação social, da escuta qualificada e da articulação entre as ouvidorias dos serviços penais nos Estados e no Distrito Federal.</w:t>
       </w:r>
     </w:p>
     <w:p>
@@ -4875,7 +5008,7 @@
         <w:pStyle w:val="BodyText"/>
       </w:pPr>
       <w:r>
-        <w:t xml:space="preserve">Entregas já formalizadas</w:t>
+        <w:t xml:space="preserve">Eixos de atuação</w:t>
       </w:r>
     </w:p>
     <w:p>
@@ -4891,191 +5024,7 @@
         <w:pStyle w:val="BodyText"/>
       </w:pPr>
       <w:r>
-        <w:t xml:space="preserve">No campo das ouvidorias e da participação social, o Pena Justa já reúne marcos normativos que podem ser destacados nesta página:</w:t>
-      </w:r>
-    </w:p>
-    <w:p>
-      <w:pPr>
-        <w:pStyle w:val="BodyText"/>
-      </w:pPr>
-      <w:r>
-        <w:t xml:space="preserve">Subtítulo:</w:t>
-      </w:r>
-    </w:p>
-    <w:p>
-      <w:pPr>
-        <w:pStyle w:val="BodyText"/>
-      </w:pPr>
-      <w:r>
-        <w:t xml:space="preserve">Normativo publicado</w:t>
-      </w:r>
-    </w:p>
-    <w:p>
-      <w:pPr>
-        <w:pStyle w:val="BodyText"/>
-      </w:pPr>
-      <w:r>
-        <w:t xml:space="preserve">Título:</w:t>
-      </w:r>
-    </w:p>
-    <w:p>
-      <w:pPr>
-        <w:pStyle w:val="BodyText"/>
-      </w:pPr>
-      <w:r>
-        <w:t xml:space="preserve">Instrução Normativa nº 75/2026</w:t>
-      </w:r>
-    </w:p>
-    <w:p>
-      <w:pPr>
-        <w:pStyle w:val="BodyText"/>
-      </w:pPr>
-      <w:r>
-        <w:t xml:space="preserve">Texto para colar:</w:t>
-      </w:r>
-    </w:p>
-    <w:p>
-      <w:pPr>
-        <w:pStyle w:val="BodyText"/>
-      </w:pPr>
-      <w:r>
-        <w:t xml:space="preserve">Estabelece parâmetros mínimos para a criação e a estruturação de Ouvidorias de Serviços Penais nos Estados e no Distrito Federal, com diretrizes de autonomia, transparência, acessibilidade e integração preferencial ao Fala.BR.</w:t>
-      </w:r>
-    </w:p>
-    <w:p>
-      <w:pPr>
-        <w:pStyle w:val="BodyText"/>
-      </w:pPr>
-      <w:r>
-        <w:t xml:space="preserve">Link:</w:t>
-      </w:r>
-    </w:p>
-    <w:p>
-      <w:pPr>
-        <w:pStyle w:val="BodyText"/>
-      </w:pPr>
-      <w:r>
-        <w:t xml:space="preserve">Acessar a Instrução Normativa (PDF)</w:t>
-      </w:r>
-    </w:p>
-    <w:p>
-      <w:pPr>
-        <w:pStyle w:val="BodyText"/>
-      </w:pPr>
-      <w:r>
-        <w:t xml:space="preserve">Arquivo:</w:t>
-      </w:r>
-    </w:p>
-    <w:p>
-      <w:pPr>
-        <w:pStyle w:val="BodyText"/>
-      </w:pPr>
-      <w:r>
-        <w:t xml:space="preserve">Subpages/Pena_justa/SEI_35153985_Instrucao_Normativa_75.pdf</w:t>
-      </w:r>
-    </w:p>
-    <w:p>
-      <w:pPr>
-        <w:pStyle w:val="BodyText"/>
-      </w:pPr>
-      <w:r>
-        <w:t xml:space="preserve">Subtítulo:</w:t>
-      </w:r>
-    </w:p>
-    <w:p>
-      <w:pPr>
-        <w:pStyle w:val="BodyText"/>
-      </w:pPr>
-      <w:r>
-        <w:t xml:space="preserve">Rede instituída</w:t>
-      </w:r>
-    </w:p>
-    <w:p>
-      <w:pPr>
-        <w:pStyle w:val="BodyText"/>
-      </w:pPr>
-      <w:r>
-        <w:t xml:space="preserve">Título:</w:t>
-      </w:r>
-    </w:p>
-    <w:p>
-      <w:pPr>
-        <w:pStyle w:val="BodyText"/>
-      </w:pPr>
-      <w:r>
-        <w:t xml:space="preserve">Portaria nº 549/2026</w:t>
-      </w:r>
-    </w:p>
-    <w:p>
-      <w:pPr>
-        <w:pStyle w:val="BodyText"/>
-      </w:pPr>
-      <w:r>
-        <w:t xml:space="preserve">Texto para colar:</w:t>
-      </w:r>
-    </w:p>
-    <w:p>
-      <w:pPr>
-        <w:pStyle w:val="BodyText"/>
-      </w:pPr>
-      <w:r>
-        <w:t xml:space="preserve">Institui a Rede Nacional de Ouvidorias de Serviços Penais - Renospen, como instância permanente de cooperação técnica, intercâmbio de informações e fortalecimento institucional das ouvidorias no sistema penal.</w:t>
-      </w:r>
-    </w:p>
-    <w:p>
-      <w:pPr>
-        <w:pStyle w:val="BodyText"/>
-      </w:pPr>
-      <w:r>
-        <w:t xml:space="preserve">Link:</w:t>
-      </w:r>
-    </w:p>
-    <w:p>
-      <w:pPr>
-        <w:pStyle w:val="BodyText"/>
-      </w:pPr>
-      <w:r>
-        <w:t xml:space="preserve">Acessar a Portaria (PDF)</w:t>
-      </w:r>
-    </w:p>
-    <w:p>
-      <w:pPr>
-        <w:pStyle w:val="BodyText"/>
-      </w:pPr>
-      <w:r>
-        <w:t xml:space="preserve">Arquivo:</w:t>
-      </w:r>
-    </w:p>
-    <w:p>
-      <w:pPr>
-        <w:pStyle w:val="BodyText"/>
-      </w:pPr>
-      <w:r>
-        <w:t xml:space="preserve">Subpages/Pena_justa/SEI_35032761_Portaria_549.pdf</w:t>
-      </w:r>
-    </w:p>
-    <w:p>
-      <w:pPr>
-        <w:pStyle w:val="BodyText"/>
-      </w:pPr>
-      <w:r>
-        <w:t xml:space="preserve">Seção:</w:t>
-      </w:r>
-    </w:p>
-    <w:p>
-      <w:pPr>
-        <w:pStyle w:val="BodyText"/>
-      </w:pPr>
-      <w:r>
-        <w:t xml:space="preserve">Documentos públicos de referência</w:t>
-      </w:r>
-    </w:p>
-    <w:p>
-      <w:pPr>
-        <w:pStyle w:val="BodyText"/>
-      </w:pPr>
-      <w:r>
-        <w:t xml:space="preserve">Links:</w:t>
+        <w:t xml:space="preserve">O Plano Nacional organiza sua atuação em quatro eixos estruturantes:</w:t>
       </w:r>
     </w:p>
     <w:p>
@@ -5087,7 +5036,7 @@
         </w:numPr>
       </w:pPr>
       <w:r>
-        <w:t xml:space="preserve">Plano Nacional Pena Justa (PDF): Subpages/Pena_justa/Plano_Nacional_Pena_Justa.pdf</w:t>
+        <w:t xml:space="preserve">Controle da entrada e das vagas do sistema prisional.</w:t>
       </w:r>
     </w:p>
     <w:p>
@@ -5099,17 +5048,31 @@
         </w:numPr>
       </w:pPr>
       <w:r>
-        <w:t xml:space="preserve">10 coisas que você precisa saber sobre o Pena Justa (PDF): Subpages/Pena_justa/10_Coisas_que_você_precisa_saber_sobre_o_Pena_Justa.pdf</w:t>
-      </w:r>
-    </w:p>
-    <w:bookmarkEnd w:id="24"/>
-    <w:bookmarkStart w:id="25" w:name="X9010218d04cc9bed3b5085cf6721dd78b5ea4ec"/>
-    <w:p>
-      <w:pPr>
-        <w:pStyle w:val="Heading2"/>
-      </w:pPr>
-      <w:r>
-        <w:t xml:space="preserve">Subpágina 4 - Revista Brasileira de Execução Penal</w:t>
+        <w:t xml:space="preserve">Qualidade da ambiência, dos serviços prestados e da estrutura prisional.</w:t>
+      </w:r>
+    </w:p>
+    <w:p>
+      <w:pPr>
+        <w:pStyle w:val="Compact"/>
+        <w:numPr>
+          <w:ilvl w:val="0"/>
+          <w:numId w:val="1017"/>
+        </w:numPr>
+      </w:pPr>
+      <w:r>
+        <w:t xml:space="preserve">Processos de saída da prisão e de reintegração social.</w:t>
+      </w:r>
+    </w:p>
+    <w:p>
+      <w:pPr>
+        <w:pStyle w:val="Compact"/>
+        <w:numPr>
+          <w:ilvl w:val="0"/>
+          <w:numId w:val="1017"/>
+        </w:numPr>
+      </w:pPr>
+      <w:r>
+        <w:t xml:space="preserve">Políticas de não repetição do Estado de Coisas Inconstitucional no sistema prisional.</w:t>
       </w:r>
     </w:p>
     <w:p>
@@ -5117,86 +5080,6 @@
         <w:pStyle w:val="FirstParagraph"/>
       </w:pPr>
       <w:r>
-        <w:t xml:space="preserve">Título da página:</w:t>
-      </w:r>
-    </w:p>
-    <w:p>
-      <w:pPr>
-        <w:pStyle w:val="BodyText"/>
-      </w:pPr>
-      <w:r>
-        <w:t xml:space="preserve">Revista Brasileira de Execução Penal</w:t>
-      </w:r>
-    </w:p>
-    <w:p>
-      <w:pPr>
-        <w:pStyle w:val="BodyText"/>
-      </w:pPr>
-      <w:r>
-        <w:t xml:space="preserve">Imagem de destaque:</w:t>
-      </w:r>
-    </w:p>
-    <w:p>
-      <w:pPr>
-        <w:pStyle w:val="BodyText"/>
-      </w:pPr>
-      <w:r>
-        <w:t xml:space="preserve">Documentação/Botao_RevistaBrasileira.png</w:t>
-      </w:r>
-    </w:p>
-    <w:p>
-      <w:pPr>
-        <w:pStyle w:val="BodyText"/>
-      </w:pPr>
-      <w:r>
-        <w:t xml:space="preserve">Texto alternativo sugerido:</w:t>
-      </w:r>
-    </w:p>
-    <w:p>
-      <w:pPr>
-        <w:pStyle w:val="BodyText"/>
-      </w:pPr>
-      <w:r>
-        <w:t xml:space="preserve">Botão institucional da Revista Brasileira de Execução Penal.</w:t>
-      </w:r>
-    </w:p>
-    <w:p>
-      <w:pPr>
-        <w:pStyle w:val="BodyText"/>
-      </w:pPr>
-      <w:r>
-        <w:t xml:space="preserve">Identificador editorial:</w:t>
-      </w:r>
-    </w:p>
-    <w:p>
-      <w:pPr>
-        <w:pStyle w:val="BodyText"/>
-      </w:pPr>
-      <w:r>
-        <w:t xml:space="preserve">Conteúdo Técnico e Projetos Estruturantes</w:t>
-      </w:r>
-    </w:p>
-    <w:p>
-      <w:pPr>
-        <w:pStyle w:val="BodyText"/>
-      </w:pPr>
-      <w:r>
-        <w:t xml:space="preserve">Texto de destaque:</w:t>
-      </w:r>
-    </w:p>
-    <w:p>
-      <w:pPr>
-        <w:pStyle w:val="BodyText"/>
-      </w:pPr>
-      <w:r>
-        <w:t xml:space="preserve">Em articulação com a Espen e a DCOM, esta subpágina reúne referências da Revista Brasileira de Execução Penal e destaca dossiês, notícias editoriais e conteúdos com interface com participação social, transparência e direitos no sistema penal.</w:t>
-      </w:r>
-    </w:p>
-    <w:p>
-      <w:pPr>
-        <w:pStyle w:val="BodyText"/>
-      </w:pPr>
-      <w:r>
         <w:t xml:space="preserve">Seção:</w:t>
       </w:r>
     </w:p>
@@ -5205,7 +5088,7 @@
         <w:pStyle w:val="BodyText"/>
       </w:pPr>
       <w:r>
-        <w:t xml:space="preserve">A Revista</w:t>
+        <w:t xml:space="preserve">Governança e acompanhamento</w:t>
       </w:r>
     </w:p>
     <w:p>
@@ -5221,23 +5104,15 @@
         <w:pStyle w:val="BodyText"/>
       </w:pPr>
       <w:r>
-        <w:t xml:space="preserve">A Revista Brasileira de Execução Penal é o periódico técnico-científico da Secretaria Nacional de Políticas Penais (Senappen/MJSP) e constitui espaço de circulação de artigos, documentos inéditos, entrevistas, relatos de experiência e boas práticas relacionados à execução penal.</w:t>
-      </w:r>
-    </w:p>
-    <w:p>
-      <w:pPr>
-        <w:pStyle w:val="BodyText"/>
-      </w:pPr>
-      <w:r>
-        <w:t xml:space="preserve">A segunda linha do escopo:</w:t>
-      </w:r>
-    </w:p>
-    <w:p>
-      <w:pPr>
-        <w:pStyle w:val="BodyText"/>
-      </w:pPr>
-      <w:r>
-        <w:t xml:space="preserve">No contexto da Ouvidoria, a publicação contribui para aproximar produção técnica, debate qualificado e controle social, reforçando o papel da Ouvidoria como ponte entre Estado e sociedade.</w:t>
+        <w:t xml:space="preserve">No recorte da Ouvidoria Nacional de Serviços Penais, o acompanhamento do Pena Justa prioriza instrumentos que fortaleçam a escuta qualificada, a transparência ativa e a coordenação entre as ouvidorias dos serviços penais.</w:t>
+      </w:r>
+    </w:p>
+    <w:p>
+      <w:pPr>
+        <w:pStyle w:val="BodyText"/>
+      </w:pPr>
+      <w:r>
+        <w:t xml:space="preserve">Esse recorte se materializa por meio de marcos normativos e de cooperação técnica que estruturam parâmetros mínimos de atuação, incentivam integração preferencial ao Fala.BR e consolidam uma rede permanente de intercâmbio entre União, Estados e Distrito Federal.</w:t>
       </w:r>
     </w:p>
     <w:p>
@@ -5253,7 +5128,7 @@
         <w:pStyle w:val="BodyText"/>
       </w:pPr>
       <w:r>
-        <w:t xml:space="preserve">Sobre a revista</w:t>
+        <w:t xml:space="preserve">Entregas já formalizadas</w:t>
       </w:r>
     </w:p>
     <w:p>
@@ -5269,23 +5144,167 @@
         <w:pStyle w:val="BodyText"/>
       </w:pPr>
       <w:r>
-        <w:t xml:space="preserve">A RBEP publica artigos, documentos inéditos, entrevistas, relatos de experiência e descrição de boas práticas que relacionam a experiência profissional, o conhecimento produzido sobre a matéria e o cumprimento da legislação nacional.</w:t>
-      </w:r>
-    </w:p>
-    <w:p>
-      <w:pPr>
-        <w:pStyle w:val="BodyText"/>
-      </w:pPr>
-      <w:r>
-        <w:t xml:space="preserve">A segunda linha da seção:</w:t>
-      </w:r>
-    </w:p>
-    <w:p>
-      <w:pPr>
-        <w:pStyle w:val="BodyText"/>
-      </w:pPr>
-      <w:r>
-        <w:t xml:space="preserve">Os conteúdos são organizados em dossiês temáticos semestrais, e a revista recebeu qualificação A4 na classificação de periódicos Qualis Capes na avaliação do quadriênio 2021-2024.</w:t>
+        <w:t xml:space="preserve">No campo das ouvidorias e da participação social, o Pena Justa já reúne marcos normativos que podem ser destacados nesta página:</w:t>
+      </w:r>
+    </w:p>
+    <w:p>
+      <w:pPr>
+        <w:pStyle w:val="BodyText"/>
+      </w:pPr>
+      <w:r>
+        <w:t xml:space="preserve">Subtítulo:</w:t>
+      </w:r>
+    </w:p>
+    <w:p>
+      <w:pPr>
+        <w:pStyle w:val="BodyText"/>
+      </w:pPr>
+      <w:r>
+        <w:t xml:space="preserve">Normativo publicado</w:t>
+      </w:r>
+    </w:p>
+    <w:p>
+      <w:pPr>
+        <w:pStyle w:val="BodyText"/>
+      </w:pPr>
+      <w:r>
+        <w:t xml:space="preserve">Título:</w:t>
+      </w:r>
+    </w:p>
+    <w:p>
+      <w:pPr>
+        <w:pStyle w:val="BodyText"/>
+      </w:pPr>
+      <w:r>
+        <w:t xml:space="preserve">Instrução Normativa nº 75/2026</w:t>
+      </w:r>
+    </w:p>
+    <w:p>
+      <w:pPr>
+        <w:pStyle w:val="BodyText"/>
+      </w:pPr>
+      <w:r>
+        <w:t xml:space="preserve">Texto para colar:</w:t>
+      </w:r>
+    </w:p>
+    <w:p>
+      <w:pPr>
+        <w:pStyle w:val="BodyText"/>
+      </w:pPr>
+      <w:r>
+        <w:t xml:space="preserve">Estabelece parâmetros mínimos para a criação e a estruturação de Ouvidorias de Serviços Penais nos Estados e no Distrito Federal, com diretrizes de autonomia, transparência, acessibilidade e integração preferencial ao Fala.BR.</w:t>
+      </w:r>
+    </w:p>
+    <w:p>
+      <w:pPr>
+        <w:pStyle w:val="BodyText"/>
+      </w:pPr>
+      <w:r>
+        <w:t xml:space="preserve">Link:</w:t>
+      </w:r>
+    </w:p>
+    <w:p>
+      <w:pPr>
+        <w:pStyle w:val="BodyText"/>
+      </w:pPr>
+      <w:r>
+        <w:t xml:space="preserve">Acessar a Instrução Normativa (PDF)</w:t>
+      </w:r>
+    </w:p>
+    <w:p>
+      <w:pPr>
+        <w:pStyle w:val="BodyText"/>
+      </w:pPr>
+      <w:r>
+        <w:t xml:space="preserve">Arquivo:</w:t>
+      </w:r>
+    </w:p>
+    <w:p>
+      <w:pPr>
+        <w:pStyle w:val="BodyText"/>
+      </w:pPr>
+      <w:r>
+        <w:t xml:space="preserve">Subpages/Pena_justa/SEI_35153985_Instrucao_Normativa_75.pdf</w:t>
+      </w:r>
+    </w:p>
+    <w:p>
+      <w:pPr>
+        <w:pStyle w:val="BodyText"/>
+      </w:pPr>
+      <w:r>
+        <w:t xml:space="preserve">Subtítulo:</w:t>
+      </w:r>
+    </w:p>
+    <w:p>
+      <w:pPr>
+        <w:pStyle w:val="BodyText"/>
+      </w:pPr>
+      <w:r>
+        <w:t xml:space="preserve">Rede instituída</w:t>
+      </w:r>
+    </w:p>
+    <w:p>
+      <w:pPr>
+        <w:pStyle w:val="BodyText"/>
+      </w:pPr>
+      <w:r>
+        <w:t xml:space="preserve">Título:</w:t>
+      </w:r>
+    </w:p>
+    <w:p>
+      <w:pPr>
+        <w:pStyle w:val="BodyText"/>
+      </w:pPr>
+      <w:r>
+        <w:t xml:space="preserve">Portaria nº 549/2026</w:t>
+      </w:r>
+    </w:p>
+    <w:p>
+      <w:pPr>
+        <w:pStyle w:val="BodyText"/>
+      </w:pPr>
+      <w:r>
+        <w:t xml:space="preserve">Texto para colar:</w:t>
+      </w:r>
+    </w:p>
+    <w:p>
+      <w:pPr>
+        <w:pStyle w:val="BodyText"/>
+      </w:pPr>
+      <w:r>
+        <w:t xml:space="preserve">Institui a Rede Nacional de Ouvidorias de Serviços Penais - Renospen, como instância permanente de cooperação técnica, intercâmbio de informações e fortalecimento institucional das ouvidorias no sistema penal.</w:t>
+      </w:r>
+    </w:p>
+    <w:p>
+      <w:pPr>
+        <w:pStyle w:val="BodyText"/>
+      </w:pPr>
+      <w:r>
+        <w:t xml:space="preserve">Link:</w:t>
+      </w:r>
+    </w:p>
+    <w:p>
+      <w:pPr>
+        <w:pStyle w:val="BodyText"/>
+      </w:pPr>
+      <w:r>
+        <w:t xml:space="preserve">Acessar a Portaria (PDF)</w:t>
+      </w:r>
+    </w:p>
+    <w:p>
+      <w:pPr>
+        <w:pStyle w:val="BodyText"/>
+      </w:pPr>
+      <w:r>
+        <w:t xml:space="preserve">Arquivo:</w:t>
+      </w:r>
+    </w:p>
+    <w:p>
+      <w:pPr>
+        <w:pStyle w:val="BodyText"/>
+      </w:pPr>
+      <w:r>
+        <w:t xml:space="preserve">Subpages/Pena_justa/SEI_35032761_Portaria_549.pdf</w:t>
       </w:r>
     </w:p>
     <w:p>
@@ -5301,23 +5320,7 @@
         <w:pStyle w:val="BodyText"/>
       </w:pPr>
       <w:r>
-        <w:t xml:space="preserve">Acesso oficial à RBEP</w:t>
-      </w:r>
-    </w:p>
-    <w:p>
-      <w:pPr>
-        <w:pStyle w:val="BodyText"/>
-      </w:pPr>
-      <w:r>
-        <w:t xml:space="preserve">Texto para colar:</w:t>
-      </w:r>
-    </w:p>
-    <w:p>
-      <w:pPr>
-        <w:pStyle w:val="BodyText"/>
-      </w:pPr>
-      <w:r>
-        <w:t xml:space="preserve">O portal oficial da revista reúne notícias, edição atual, arquivo de edições e informações para submissão de textos.</w:t>
+        <w:t xml:space="preserve">Documentos públicos de referência</w:t>
       </w:r>
     </w:p>
     <w:p>
@@ -5337,7 +5340,7 @@
         </w:numPr>
       </w:pPr>
       <w:r>
-        <w:t xml:space="preserve">Portal oficial da Revista Brasileira de Execução Penal: https://rbepsenappen.mj.gov.br/index.php/RBEP/pt_BR</w:t>
+        <w:t xml:space="preserve">Plano Nacional Pena Justa (PDF): Subpages/Pena_justa/Plano_Nacional_Pena_Justa.pdf</w:t>
       </w:r>
     </w:p>
     <w:p>
@@ -5349,31 +5352,17 @@
         </w:numPr>
       </w:pPr>
       <w:r>
-        <w:t xml:space="preserve">Edição atual - edição completa: https://rbepsenappen.mj.gov.br/index.php/RBEP/pt_BR/issue/view/22/58</w:t>
-      </w:r>
-    </w:p>
-    <w:p>
-      <w:pPr>
-        <w:pStyle w:val="Compact"/>
-        <w:numPr>
-          <w:ilvl w:val="0"/>
-          <w:numId w:val="1018"/>
-        </w:numPr>
-      </w:pPr>
-      <w:r>
-        <w:t xml:space="preserve">Ver todas as edições: https://rbepsenappen.mj.gov.br/index.php/RBEP/pt_BR/issue/archive</w:t>
-      </w:r>
-    </w:p>
-    <w:p>
-      <w:pPr>
-        <w:pStyle w:val="Compact"/>
-        <w:numPr>
-          <w:ilvl w:val="0"/>
-          <w:numId w:val="1018"/>
-        </w:numPr>
-      </w:pPr>
-      <w:r>
-        <w:t xml:space="preserve">Enviar submissão: https://rbepsenappen.mj.gov.br/index.php/RBEP/pt_BR/about/submissions</w:t>
+        <w:t xml:space="preserve">10 coisas que você precisa saber sobre o Pena Justa (PDF): Subpages/Pena_justa/10_Coisas_que_você_precisa_saber_sobre_o_Pena_Justa.pdf</w:t>
+      </w:r>
+    </w:p>
+    <w:bookmarkEnd w:id="32"/>
+    <w:bookmarkStart w:id="33" w:name="X9010218d04cc9bed3b5085cf6721dd78b5ea4ec"/>
+    <w:p>
+      <w:pPr>
+        <w:pStyle w:val="Heading2"/>
+      </w:pPr>
+      <w:r>
+        <w:t xml:space="preserve">Subpágina 4 - Revista Brasileira de Execução Penal</w:t>
       </w:r>
     </w:p>
     <w:p>
@@ -5381,6 +5370,86 @@
         <w:pStyle w:val="FirstParagraph"/>
       </w:pPr>
       <w:r>
+        <w:t xml:space="preserve">Título da página:</w:t>
+      </w:r>
+    </w:p>
+    <w:p>
+      <w:pPr>
+        <w:pStyle w:val="BodyText"/>
+      </w:pPr>
+      <w:r>
+        <w:t xml:space="preserve">Revista Brasileira de Execução Penal</w:t>
+      </w:r>
+    </w:p>
+    <w:p>
+      <w:pPr>
+        <w:pStyle w:val="BodyText"/>
+      </w:pPr>
+      <w:r>
+        <w:t xml:space="preserve">Imagem de destaque:</w:t>
+      </w:r>
+    </w:p>
+    <w:p>
+      <w:pPr>
+        <w:pStyle w:val="BodyText"/>
+      </w:pPr>
+      <w:r>
+        <w:t xml:space="preserve">Documentação/Botao_RevistaBrasileira.png</w:t>
+      </w:r>
+    </w:p>
+    <w:p>
+      <w:pPr>
+        <w:pStyle w:val="BodyText"/>
+      </w:pPr>
+      <w:r>
+        <w:t xml:space="preserve">Texto alternativo sugerido:</w:t>
+      </w:r>
+    </w:p>
+    <w:p>
+      <w:pPr>
+        <w:pStyle w:val="BodyText"/>
+      </w:pPr>
+      <w:r>
+        <w:t xml:space="preserve">Botão institucional da Revista Brasileira de Execução Penal.</w:t>
+      </w:r>
+    </w:p>
+    <w:p>
+      <w:pPr>
+        <w:pStyle w:val="BodyText"/>
+      </w:pPr>
+      <w:r>
+        <w:t xml:space="preserve">Identificador editorial:</w:t>
+      </w:r>
+    </w:p>
+    <w:p>
+      <w:pPr>
+        <w:pStyle w:val="BodyText"/>
+      </w:pPr>
+      <w:r>
+        <w:t xml:space="preserve">Conteúdo Técnico e Projetos Estruturantes</w:t>
+      </w:r>
+    </w:p>
+    <w:p>
+      <w:pPr>
+        <w:pStyle w:val="BodyText"/>
+      </w:pPr>
+      <w:r>
+        <w:t xml:space="preserve">Texto de destaque:</w:t>
+      </w:r>
+    </w:p>
+    <w:p>
+      <w:pPr>
+        <w:pStyle w:val="BodyText"/>
+      </w:pPr>
+      <w:r>
+        <w:t xml:space="preserve">Em articulação com a Espen e a DCOM, esta subpágina reúne referências da Revista Brasileira de Execução Penal e destaca dossiês, notícias editoriais e conteúdos com interface com participação social, transparência e direitos no sistema penal.</w:t>
+      </w:r>
+    </w:p>
+    <w:p>
+      <w:pPr>
+        <w:pStyle w:val="BodyText"/>
+      </w:pPr>
+      <w:r>
         <w:t xml:space="preserve">Seção:</w:t>
       </w:r>
     </w:p>
@@ -5389,15 +5458,127 @@
         <w:pStyle w:val="BodyText"/>
       </w:pPr>
       <w:r>
-        <w:t xml:space="preserve">Referências institucionais</w:t>
-      </w:r>
-    </w:p>
-    <w:p>
-      <w:pPr>
-        <w:pStyle w:val="BodyText"/>
-      </w:pPr>
-      <w:r>
-        <w:t xml:space="preserve">Itens para colar:</w:t>
+        <w:t xml:space="preserve">A Revista</w:t>
+      </w:r>
+    </w:p>
+    <w:p>
+      <w:pPr>
+        <w:pStyle w:val="BodyText"/>
+      </w:pPr>
+      <w:r>
+        <w:t xml:space="preserve">Texto para colar:</w:t>
+      </w:r>
+    </w:p>
+    <w:p>
+      <w:pPr>
+        <w:pStyle w:val="BodyText"/>
+      </w:pPr>
+      <w:r>
+        <w:t xml:space="preserve">A Revista Brasileira de Execução Penal é o periódico técnico-científico da Secretaria Nacional de Políticas Penais (Senappen/MJSP) e constitui espaço de circulação de artigos, documentos inéditos, entrevistas, relatos de experiência e boas práticas relacionados à execução penal.</w:t>
+      </w:r>
+    </w:p>
+    <w:p>
+      <w:pPr>
+        <w:pStyle w:val="BodyText"/>
+      </w:pPr>
+      <w:r>
+        <w:t xml:space="preserve">A segunda linha do escopo:</w:t>
+      </w:r>
+    </w:p>
+    <w:p>
+      <w:pPr>
+        <w:pStyle w:val="BodyText"/>
+      </w:pPr>
+      <w:r>
+        <w:t xml:space="preserve">No contexto da Ouvidoria, a publicação contribui para aproximar produção técnica, debate qualificado e controle social, reforçando o papel da Ouvidoria como ponte entre Estado e sociedade.</w:t>
+      </w:r>
+    </w:p>
+    <w:p>
+      <w:pPr>
+        <w:pStyle w:val="BodyText"/>
+      </w:pPr>
+      <w:r>
+        <w:t xml:space="preserve">Seção:</w:t>
+      </w:r>
+    </w:p>
+    <w:p>
+      <w:pPr>
+        <w:pStyle w:val="BodyText"/>
+      </w:pPr>
+      <w:r>
+        <w:t xml:space="preserve">Sobre a revista</w:t>
+      </w:r>
+    </w:p>
+    <w:p>
+      <w:pPr>
+        <w:pStyle w:val="BodyText"/>
+      </w:pPr>
+      <w:r>
+        <w:t xml:space="preserve">Texto para colar:</w:t>
+      </w:r>
+    </w:p>
+    <w:p>
+      <w:pPr>
+        <w:pStyle w:val="BodyText"/>
+      </w:pPr>
+      <w:r>
+        <w:t xml:space="preserve">A RBEP publica artigos, documentos inéditos, entrevistas, relatos de experiência e descrição de boas práticas que relacionam a experiência profissional, o conhecimento produzido sobre a matéria e o cumprimento da legislação nacional.</w:t>
+      </w:r>
+    </w:p>
+    <w:p>
+      <w:pPr>
+        <w:pStyle w:val="BodyText"/>
+      </w:pPr>
+      <w:r>
+        <w:t xml:space="preserve">A segunda linha da seção:</w:t>
+      </w:r>
+    </w:p>
+    <w:p>
+      <w:pPr>
+        <w:pStyle w:val="BodyText"/>
+      </w:pPr>
+      <w:r>
+        <w:t xml:space="preserve">Os conteúdos são organizados em dossiês temáticos semestrais, e a revista recebeu qualificação A4 na classificação de periódicos Qualis Capes na avaliação do quadriênio 2021-2024.</w:t>
+      </w:r>
+    </w:p>
+    <w:p>
+      <w:pPr>
+        <w:pStyle w:val="BodyText"/>
+      </w:pPr>
+      <w:r>
+        <w:t xml:space="preserve">Seção:</w:t>
+      </w:r>
+    </w:p>
+    <w:p>
+      <w:pPr>
+        <w:pStyle w:val="BodyText"/>
+      </w:pPr>
+      <w:r>
+        <w:t xml:space="preserve">Acesso oficial à RBEP</w:t>
+      </w:r>
+    </w:p>
+    <w:p>
+      <w:pPr>
+        <w:pStyle w:val="BodyText"/>
+      </w:pPr>
+      <w:r>
+        <w:t xml:space="preserve">Texto para colar:</w:t>
+      </w:r>
+    </w:p>
+    <w:p>
+      <w:pPr>
+        <w:pStyle w:val="BodyText"/>
+      </w:pPr>
+      <w:r>
+        <w:t xml:space="preserve">O portal oficial da revista reúne notícias, edição atual, arquivo de edições e informações para submissão de textos.</w:t>
+      </w:r>
+    </w:p>
+    <w:p>
+      <w:pPr>
+        <w:pStyle w:val="BodyText"/>
+      </w:pPr>
+      <w:r>
+        <w:t xml:space="preserve">Links:</w:t>
       </w:r>
     </w:p>
     <w:p>
@@ -5409,7 +5590,7 @@
         </w:numPr>
       </w:pPr>
       <w:r>
-        <w:t xml:space="preserve">Qualis Capes 2021-2024: A4.</w:t>
+        <w:t xml:space="preserve">Portal oficial da Revista Brasileira de Execução Penal: https://rbepsenappen.mj.gov.br/index.php/RBEP/pt_BR</w:t>
       </w:r>
     </w:p>
     <w:p>
@@ -5421,7 +5602,7 @@
         </w:numPr>
       </w:pPr>
       <w:r>
-        <w:t xml:space="preserve">ISSN: 2675-1895.</w:t>
+        <w:t xml:space="preserve">Edição atual - edição completa: https://rbepsenappen.mj.gov.br/index.php/RBEP/pt_BR/issue/view/22/58</w:t>
       </w:r>
     </w:p>
     <w:p>
@@ -5433,7 +5614,7 @@
         </w:numPr>
       </w:pPr>
       <w:r>
-        <w:t xml:space="preserve">e-ISSN: 2675-1860.</w:t>
+        <w:t xml:space="preserve">Ver todas as edições: https://rbepsenappen.mj.gov.br/index.php/RBEP/pt_BR/issue/archive</w:t>
       </w:r>
     </w:p>
     <w:p>
@@ -5445,11 +5626,83 @@
         </w:numPr>
       </w:pPr>
       <w:r>
+        <w:t xml:space="preserve">Enviar submissão: https://rbepsenappen.mj.gov.br/index.php/RBEP/pt_BR/about/submissions</w:t>
+      </w:r>
+    </w:p>
+    <w:p>
+      <w:pPr>
+        <w:pStyle w:val="FirstParagraph"/>
+      </w:pPr>
+      <w:r>
+        <w:t xml:space="preserve">Seção:</w:t>
+      </w:r>
+    </w:p>
+    <w:p>
+      <w:pPr>
+        <w:pStyle w:val="BodyText"/>
+      </w:pPr>
+      <w:r>
+        <w:t xml:space="preserve">Referências institucionais</w:t>
+      </w:r>
+    </w:p>
+    <w:p>
+      <w:pPr>
+        <w:pStyle w:val="BodyText"/>
+      </w:pPr>
+      <w:r>
+        <w:t xml:space="preserve">Itens para colar:</w:t>
+      </w:r>
+    </w:p>
+    <w:p>
+      <w:pPr>
+        <w:pStyle w:val="Compact"/>
+        <w:numPr>
+          <w:ilvl w:val="0"/>
+          <w:numId w:val="1020"/>
+        </w:numPr>
+      </w:pPr>
+      <w:r>
+        <w:t xml:space="preserve">Qualis Capes 2021-2024: A4.</w:t>
+      </w:r>
+    </w:p>
+    <w:p>
+      <w:pPr>
+        <w:pStyle w:val="Compact"/>
+        <w:numPr>
+          <w:ilvl w:val="0"/>
+          <w:numId w:val="1020"/>
+        </w:numPr>
+      </w:pPr>
+      <w:r>
+        <w:t xml:space="preserve">ISSN: 2675-1895.</w:t>
+      </w:r>
+    </w:p>
+    <w:p>
+      <w:pPr>
+        <w:pStyle w:val="Compact"/>
+        <w:numPr>
+          <w:ilvl w:val="0"/>
+          <w:numId w:val="1020"/>
+        </w:numPr>
+      </w:pPr>
+      <w:r>
+        <w:t xml:space="preserve">e-ISSN: 2675-1860.</w:t>
+      </w:r>
+    </w:p>
+    <w:p>
+      <w:pPr>
+        <w:pStyle w:val="Compact"/>
+        <w:numPr>
+          <w:ilvl w:val="0"/>
+          <w:numId w:val="1020"/>
+        </w:numPr>
+      </w:pPr>
+      <w:r>
         <w:t xml:space="preserve">Contato da revista: rbep@mj.gov.br.</w:t>
       </w:r>
     </w:p>
-    <w:bookmarkEnd w:id="25"/>
-    <w:bookmarkStart w:id="26" w:name="observações-sobre-formatação"/>
+    <w:bookmarkEnd w:id="33"/>
+    <w:bookmarkStart w:id="34" w:name="observações-sobre-formatação"/>
     <w:p>
       <w:pPr>
         <w:pStyle w:val="Heading2"/>
@@ -5466,8 +5719,8 @@
         <w:t xml:space="preserve">Na prévia local, os textos corridos foram configurados com alinhamento justificado. No gov.br, esse resultado dependerá das opções disponíveis no editor oficial. Caso o editor permita alinhamento do parágrafo, recomenda-se aplicar alinhamento justificado aos textos corridos e manter títulos, links curtos e botões com o alinhamento padrão do componente.</w:t>
       </w:r>
     </w:p>
-    <w:bookmarkEnd w:id="26"/>
-    <w:bookmarkStart w:id="27" w:name="Xf7fe357b8ad8797f48d42cdb4ec1361a8fa006f"/>
+    <w:bookmarkEnd w:id="34"/>
+    <w:bookmarkStart w:id="35" w:name="Xf7fe357b8ad8797f48d42cdb4ec1361a8fa006f"/>
     <w:p>
       <w:pPr>
         <w:pStyle w:val="Heading2"/>
@@ -5500,8 +5753,8 @@
         <w:t xml:space="preserve">Há precedentes úteis dentro do próprio ecossistema da Senappen. A página da ESPEN e a subpágina da RESPEN mostram que o portal oficial já comporta texto institucional, links de destaque para documentos em PDF, listas simples e tabelas extensas por unidade federativa quando houver base oficial validada. Da mesma forma, o portal oficial da RBEP confirma a existência de referências institucionais, acesso à edição atual, arquivo de edições e informações para submissão que podem ser indicadas na subpágina temática da Revista.</w:t>
       </w:r>
     </w:p>
-    <w:bookmarkEnd w:id="27"/>
-    <w:bookmarkEnd w:id="28"/>
+    <w:bookmarkEnd w:id="35"/>
+    <w:bookmarkEnd w:id="36"/>
     <w:sectPr>
       <w:footnotePr>
         <w:numRestart w:val="eachSect"/>
@@ -5773,6 +6026,9 @@
     <w:abstractNumId w:val="991"/>
   </w:num>
   <w:num w:numId="1019">
+    <w:abstractNumId w:val="991"/>
+  </w:num>
+  <w:num w:numId="1020">
     <w:abstractNumId w:val="991"/>
   </w:num>
 </w:numbering>

</xml_diff>

<commit_message>
Padroniza notícias e legislação na home da ONASP
</commit_message>
<xml_diff>
--- a/Documentação/estrutura_completa_pagina_onasp_para_dicom.docx
+++ b/Documentação/estrutura_completa_pagina_onasp_para_dicom.docx
@@ -2,7 +2,7 @@
 <file path=word/document.xml><?xml version="1.0" encoding="utf-8"?>
 <w:document xmlns:w="http://schemas.openxmlformats.org/wordprocessingml/2006/main" xmlns:m="http://schemas.openxmlformats.org/officeDocument/2006/math" xmlns:r="http://schemas.openxmlformats.org/officeDocument/2006/relationships" xmlns:o="urn:schemas-microsoft-com:office:office" xmlns:v="urn:schemas-microsoft-com:vml" xmlns:w10="urn:schemas-microsoft-com:office:word" xmlns:a="http://schemas.openxmlformats.org/drawingml/2006/main" xmlns:pic="http://schemas.openxmlformats.org/drawingml/2006/picture" xmlns:wp="http://schemas.openxmlformats.org/drawingml/2006/wordprocessingDrawing">
   <w:body>
-    <w:bookmarkStart w:id="36" w:name="X651419ee04b722d3d77fb0d3ef8f3cab38d582a"/>
+    <w:bookmarkStart w:id="34" w:name="X651419ee04b722d3d77fb0d3ef8f3cab38d582a"/>
     <w:p>
       <w:pPr>
         <w:pStyle w:val="Heading1"/>
@@ -53,7 +53,7 @@
       </w:r>
     </w:p>
     <w:bookmarkEnd w:id="9"/>
-    <w:bookmarkStart w:id="29" w:name="Xbfa4aa77b994200a22daf31aefaeaa021a9038a"/>
+    <w:bookmarkStart w:id="27" w:name="Xbfa4aa77b994200a22daf31aefaeaa021a9038a"/>
     <w:p>
       <w:pPr>
         <w:pStyle w:val="Heading2"/>
@@ -1100,7 +1100,7 @@
       </w:r>
     </w:p>
     <w:bookmarkEnd w:id="18"/>
-    <w:bookmarkStart w:id="26" w:name="bloco-10---notícias-da-ouvidoria"/>
+    <w:bookmarkStart w:id="24" w:name="bloco-10---notícias-da-ouvidoria"/>
     <w:p>
       <w:pPr>
         <w:pStyle w:val="Heading3"/>
@@ -1139,6 +1139,22 @@
       </w:pPr>
       <w:r>
         <w:t xml:space="preserve">Seleção de notícias publicadas no portal da SENAPPEN com relação direta à ONASP, à Rede de Ouvidorias e aos canais de atendimento ao cidadão.</w:t>
+      </w:r>
+    </w:p>
+    <w:p>
+      <w:pPr>
+        <w:pStyle w:val="BodyText"/>
+      </w:pPr>
+      <w:r>
+        <w:t xml:space="preserve">Padrão visual recomendado para publicação:</w:t>
+      </w:r>
+    </w:p>
+    <w:p>
+      <w:pPr>
+        <w:pStyle w:val="BodyText"/>
+      </w:pPr>
+      <w:r>
+        <w:t xml:space="preserve">Usar texto rico com blocos curtos, sem marcadores: link principal em destaque e, logo abaixo, uma descrição breve com data e contexto.</w:t>
       </w:r>
     </w:p>
     <w:p>
@@ -1294,66 +1310,8 @@
         <w:t xml:space="preserve">Descrição: A agenda fortaleceu a Rede Nacional de Ouvidorias e o intercâmbio de boas práticas com os estados.</w:t>
       </w:r>
     </w:p>
-    <w:p>
-      <w:pPr>
-        <w:pStyle w:val="Compact"/>
-        <w:numPr>
-          <w:ilvl w:val="0"/>
-          <w:numId w:val="1005"/>
-        </w:numPr>
-      </w:pPr>
-      <w:r>
-        <w:t xml:space="preserve">06/12/2024 -</w:t>
-      </w:r>
-      <w:r>
-        <w:t xml:space="preserve"> </w:t>
-      </w:r>
-      <w:hyperlink r:id="rId24">
-        <w:r>
-          <w:rPr>
-            <w:rStyle w:val="Hyperlink"/>
-          </w:rPr>
-          <w:t xml:space="preserve">SENAPPEN lança canal de comunicação via WhatsApp para facilitar o acesso a informações sobre o sistema de execução penal</w:t>
-        </w:r>
-      </w:hyperlink>
-      <w:r>
-        <w:t xml:space="preserve"> </w:t>
-      </w:r>
-      <w:r>
-        <w:t xml:space="preserve">Descrição: Lançamento do canal da ONASP no WhatsApp para tornar o atendimento mais ágil e acessível.</w:t>
-      </w:r>
-    </w:p>
-    <w:p>
-      <w:pPr>
-        <w:pStyle w:val="Compact"/>
-        <w:numPr>
-          <w:ilvl w:val="0"/>
-          <w:numId w:val="1005"/>
-        </w:numPr>
-      </w:pPr>
-      <w:r>
-        <w:t xml:space="preserve">25/07/2023 -</w:t>
-      </w:r>
-      <w:r>
-        <w:t xml:space="preserve"> </w:t>
-      </w:r>
-      <w:hyperlink r:id="rId25">
-        <w:r>
-          <w:rPr>
-            <w:rStyle w:val="Hyperlink"/>
-          </w:rPr>
-          <w:t xml:space="preserve">ONASP ministra treinamento para servidores do estado do RN</w:t>
-        </w:r>
-      </w:hyperlink>
-      <w:r>
-        <w:t xml:space="preserve"> </w:t>
-      </w:r>
-      <w:r>
-        <w:t xml:space="preserve">Descrição: Capacitação com foco em ouvidoria para aprimorar o atendimento e os fluxos de manifestação no sistema penal.</w:t>
-      </w:r>
-    </w:p>
-    <w:bookmarkEnd w:id="26"/>
-    <w:bookmarkStart w:id="27" w:name="X66bb28c02d722bd407aa00f2f1f0e42b630fd55"/>
+    <w:bookmarkEnd w:id="24"/>
+    <w:bookmarkStart w:id="25" w:name="X66bb28c02d722bd407aa00f2f1f0e42b630fd55"/>
     <w:p>
       <w:pPr>
         <w:pStyle w:val="Heading3"/>
@@ -1426,8 +1384,8 @@
         <w:t xml:space="preserve">Painel de Tratamento de Demandas da ONASP</w:t>
       </w:r>
     </w:p>
-    <w:bookmarkEnd w:id="27"/>
-    <w:bookmarkStart w:id="28" w:name="bloco-12---legislação"/>
+    <w:bookmarkEnd w:id="25"/>
+    <w:bookmarkStart w:id="26" w:name="bloco-12---legislação"/>
     <w:p>
       <w:pPr>
         <w:pStyle w:val="Heading3"/>
@@ -1466,6 +1424,22 @@
       </w:pPr>
       <w:r>
         <w:t xml:space="preserve">Os normativos basilares abaixo reúnem referências atualmente disponíveis no pacote documental da Ouvidoria e podem ser publicados como links simples na homepage, abaixo do painel de tratamento de demandas.</w:t>
+      </w:r>
+    </w:p>
+    <w:p>
+      <w:pPr>
+        <w:pStyle w:val="BodyText"/>
+      </w:pPr>
+      <w:r>
+        <w:t xml:space="preserve">Padrão visual recomendado para publicação:</w:t>
+      </w:r>
+    </w:p>
+    <w:p>
+      <w:pPr>
+        <w:pStyle w:val="BodyText"/>
+      </w:pPr>
+      <w:r>
+        <w:t xml:space="preserve">Usar o mesmo padrão da seção de notícias: texto rico com blocos curtos, sem marcadores, apresentando link principal em destaque e descrição breve logo abaixo.</w:t>
       </w:r>
     </w:p>
     <w:p>
@@ -1584,9 +1558,9 @@
         <w:t xml:space="preserve">Descrição: Dispõe sobre a proteção de dados pessoais e altera a Lei nº 12.965, de 23 de abril de 2014 (Marco Civil da Internet).</w:t>
       </w:r>
     </w:p>
-    <w:bookmarkEnd w:id="28"/>
-    <w:bookmarkEnd w:id="29"/>
-    <w:bookmarkStart w:id="30" w:name="subpágina-1---rede-de-ouvidorias"/>
+    <w:bookmarkEnd w:id="26"/>
+    <w:bookmarkEnd w:id="27"/>
+    <w:bookmarkStart w:id="28" w:name="subpágina-1---rede-de-ouvidorias"/>
     <w:p>
       <w:pPr>
         <w:pStyle w:val="Heading2"/>
@@ -4199,8 +4173,8 @@
         <w:t xml:space="preserve">Clique e acesse o Plano Nacional Pena Justa: Subpages/Pena_justa/Plano_Nacional_Pena_Justa.pdf</w:t>
       </w:r>
     </w:p>
-    <w:bookmarkEnd w:id="30"/>
-    <w:bookmarkStart w:id="31" w:name="subpágina-2---ema---senappen"/>
+    <w:bookmarkEnd w:id="28"/>
+    <w:bookmarkStart w:id="29" w:name="subpágina-2---ema---senappen"/>
     <w:p>
       <w:pPr>
         <w:pStyle w:val="Heading2"/>
@@ -4865,8 +4839,8 @@
         <w:t xml:space="preserve">Seção:</w:t>
       </w:r>
     </w:p>
-    <w:bookmarkEnd w:id="31"/>
-    <w:bookmarkStart w:id="32" w:name="subpágina-3---plano-pena-justa"/>
+    <w:bookmarkEnd w:id="29"/>
+    <w:bookmarkStart w:id="30" w:name="subpágina-3---plano-pena-justa"/>
     <w:p>
       <w:pPr>
         <w:pStyle w:val="Heading2"/>
@@ -5355,8 +5329,8 @@
         <w:t xml:space="preserve">10 coisas que você precisa saber sobre o Pena Justa (PDF): Subpages/Pena_justa/10_Coisas_que_você_precisa_saber_sobre_o_Pena_Justa.pdf</w:t>
       </w:r>
     </w:p>
-    <w:bookmarkEnd w:id="32"/>
-    <w:bookmarkStart w:id="33" w:name="X9010218d04cc9bed3b5085cf6721dd78b5ea4ec"/>
+    <w:bookmarkEnd w:id="30"/>
+    <w:bookmarkStart w:id="31" w:name="X9010218d04cc9bed3b5085cf6721dd78b5ea4ec"/>
     <w:p>
       <w:pPr>
         <w:pStyle w:val="Heading2"/>
@@ -5701,60 +5675,60 @@
         <w:t xml:space="preserve">Contato da revista: rbep@mj.gov.br.</w:t>
       </w:r>
     </w:p>
+    <w:bookmarkEnd w:id="31"/>
+    <w:bookmarkStart w:id="32" w:name="observações-sobre-formatação"/>
+    <w:p>
+      <w:pPr>
+        <w:pStyle w:val="Heading2"/>
+      </w:pPr>
+      <w:r>
+        <w:t xml:space="preserve">Observações sobre formatação</w:t>
+      </w:r>
+    </w:p>
+    <w:p>
+      <w:pPr>
+        <w:pStyle w:val="FirstParagraph"/>
+      </w:pPr>
+      <w:r>
+        <w:t xml:space="preserve">Na prévia local, os textos corridos foram configurados com alinhamento justificado. No gov.br, esse resultado dependerá das opções disponíveis no editor oficial. Caso o editor permita alinhamento do parágrafo, recomenda-se aplicar alinhamento justificado aos textos corridos e manter títulos, links curtos e botões com o alinhamento padrão do componente.</w:t>
+      </w:r>
+    </w:p>
+    <w:bookmarkEnd w:id="32"/>
+    <w:bookmarkStart w:id="33" w:name="Xf7fe357b8ad8797f48d42cdb4ec1361a8fa006f"/>
+    <w:p>
+      <w:pPr>
+        <w:pStyle w:val="Heading2"/>
+      </w:pPr>
+      <w:r>
+        <w:t xml:space="preserve">Observações sobre WordPress, Plone e reaproveitamento</w:t>
+      </w:r>
+    </w:p>
+    <w:p>
+      <w:pPr>
+        <w:pStyle w:val="FirstParagraph"/>
+      </w:pPr>
+      <w:r>
+        <w:t xml:space="preserve">As páginas do domínio gov.br normalmente são administradas em ambiente gov.br/Plone, e não em WordPress. A DCOM pode confirmar o ambiente exato de edição utilizado internamente, mas a estrutura pública analisada segue o padrão do gov.br, com componentes próprios de publicação.</w:t>
+      </w:r>
+    </w:p>
+    <w:p>
+      <w:pPr>
+        <w:pStyle w:val="BodyText"/>
+      </w:pPr>
+      <w:r>
+        <w:t xml:space="preserve">Por isso, recomenda-se não tratar a prévia como um pacote WordPress. A DCOM deve aproveitar os textos, imagens, links, embeds e ordem dos blocos, reproduzindo a montagem com os componentes oficiais disponíveis no portal.</w:t>
+      </w:r>
+    </w:p>
+    <w:p>
+      <w:pPr>
+        <w:pStyle w:val="BodyText"/>
+      </w:pPr>
+      <w:r>
+        <w:t xml:space="preserve">Há precedentes úteis dentro do próprio ecossistema da Senappen. A página da ESPEN e a subpágina da RESPEN mostram que o portal oficial já comporta texto institucional, links de destaque para documentos em PDF, listas simples e tabelas extensas por unidade federativa quando houver base oficial validada. Da mesma forma, o portal oficial da RBEP confirma a existência de referências institucionais, acesso à edição atual, arquivo de edições e informações para submissão que podem ser indicadas na subpágina temática da Revista.</w:t>
+      </w:r>
+    </w:p>
     <w:bookmarkEnd w:id="33"/>
-    <w:bookmarkStart w:id="34" w:name="observações-sobre-formatação"/>
-    <w:p>
-      <w:pPr>
-        <w:pStyle w:val="Heading2"/>
-      </w:pPr>
-      <w:r>
-        <w:t xml:space="preserve">Observações sobre formatação</w:t>
-      </w:r>
-    </w:p>
-    <w:p>
-      <w:pPr>
-        <w:pStyle w:val="FirstParagraph"/>
-      </w:pPr>
-      <w:r>
-        <w:t xml:space="preserve">Na prévia local, os textos corridos foram configurados com alinhamento justificado. No gov.br, esse resultado dependerá das opções disponíveis no editor oficial. Caso o editor permita alinhamento do parágrafo, recomenda-se aplicar alinhamento justificado aos textos corridos e manter títulos, links curtos e botões com o alinhamento padrão do componente.</w:t>
-      </w:r>
-    </w:p>
     <w:bookmarkEnd w:id="34"/>
-    <w:bookmarkStart w:id="35" w:name="Xf7fe357b8ad8797f48d42cdb4ec1361a8fa006f"/>
-    <w:p>
-      <w:pPr>
-        <w:pStyle w:val="Heading2"/>
-      </w:pPr>
-      <w:r>
-        <w:t xml:space="preserve">Observações sobre WordPress, Plone e reaproveitamento</w:t>
-      </w:r>
-    </w:p>
-    <w:p>
-      <w:pPr>
-        <w:pStyle w:val="FirstParagraph"/>
-      </w:pPr>
-      <w:r>
-        <w:t xml:space="preserve">As páginas do domínio gov.br normalmente são administradas em ambiente gov.br/Plone, e não em WordPress. A DCOM pode confirmar o ambiente exato de edição utilizado internamente, mas a estrutura pública analisada segue o padrão do gov.br, com componentes próprios de publicação.</w:t>
-      </w:r>
-    </w:p>
-    <w:p>
-      <w:pPr>
-        <w:pStyle w:val="BodyText"/>
-      </w:pPr>
-      <w:r>
-        <w:t xml:space="preserve">Por isso, recomenda-se não tratar a prévia como um pacote WordPress. A DCOM deve aproveitar os textos, imagens, links, embeds e ordem dos blocos, reproduzindo a montagem com os componentes oficiais disponíveis no portal.</w:t>
-      </w:r>
-    </w:p>
-    <w:p>
-      <w:pPr>
-        <w:pStyle w:val="BodyText"/>
-      </w:pPr>
-      <w:r>
-        <w:t xml:space="preserve">Há precedentes úteis dentro do próprio ecossistema da Senappen. A página da ESPEN e a subpágina da RESPEN mostram que o portal oficial já comporta texto institucional, links de destaque para documentos em PDF, listas simples e tabelas extensas por unidade federativa quando houver base oficial validada. Da mesma forma, o portal oficial da RBEP confirma a existência de referências institucionais, acesso à edição atual, arquivo de edições e informações para submissão que podem ser indicadas na subpágina temática da Revista.</w:t>
-      </w:r>
-    </w:p>
-    <w:bookmarkEnd w:id="35"/>
-    <w:bookmarkEnd w:id="36"/>
     <w:sectPr>
       <w:footnotePr>
         <w:numRestart w:val="eachSect"/>

</xml_diff>

<commit_message>
Inclui quadro de eixos no Pena Justa
</commit_message>
<xml_diff>
--- a/Documentação/estrutura_completa_pagina_onasp_para_dicom.docx
+++ b/Documentação/estrutura_completa_pagina_onasp_para_dicom.docx
@@ -5054,255 +5054,7 @@
         <w:pStyle w:val="FirstParagraph"/>
       </w:pPr>
       <w:r>
-        <w:t xml:space="preserve">Seção:</w:t>
-      </w:r>
-    </w:p>
-    <w:p>
-      <w:pPr>
-        <w:pStyle w:val="BodyText"/>
-      </w:pPr>
-      <w:r>
-        <w:t xml:space="preserve">Governança e acompanhamento</w:t>
-      </w:r>
-    </w:p>
-    <w:p>
-      <w:pPr>
-        <w:pStyle w:val="BodyText"/>
-      </w:pPr>
-      <w:r>
-        <w:t xml:space="preserve">Texto para colar:</w:t>
-      </w:r>
-    </w:p>
-    <w:p>
-      <w:pPr>
-        <w:pStyle w:val="BodyText"/>
-      </w:pPr>
-      <w:r>
-        <w:t xml:space="preserve">No recorte da Ouvidoria Nacional de Serviços Penais, o acompanhamento do Pena Justa prioriza instrumentos que fortaleçam a escuta qualificada, a transparência ativa e a coordenação entre as ouvidorias dos serviços penais.</w:t>
-      </w:r>
-    </w:p>
-    <w:p>
-      <w:pPr>
-        <w:pStyle w:val="BodyText"/>
-      </w:pPr>
-      <w:r>
-        <w:t xml:space="preserve">Esse recorte se materializa por meio de marcos normativos e de cooperação técnica que estruturam parâmetros mínimos de atuação, incentivam integração preferencial ao Fala.BR e consolidam uma rede permanente de intercâmbio entre União, Estados e Distrito Federal.</w:t>
-      </w:r>
-    </w:p>
-    <w:p>
-      <w:pPr>
-        <w:pStyle w:val="BodyText"/>
-      </w:pPr>
-      <w:r>
-        <w:t xml:space="preserve">Seção:</w:t>
-      </w:r>
-    </w:p>
-    <w:p>
-      <w:pPr>
-        <w:pStyle w:val="BodyText"/>
-      </w:pPr>
-      <w:r>
-        <w:t xml:space="preserve">Entregas já formalizadas</w:t>
-      </w:r>
-    </w:p>
-    <w:p>
-      <w:pPr>
-        <w:pStyle w:val="BodyText"/>
-      </w:pPr>
-      <w:r>
-        <w:t xml:space="preserve">Texto para colar:</w:t>
-      </w:r>
-    </w:p>
-    <w:p>
-      <w:pPr>
-        <w:pStyle w:val="BodyText"/>
-      </w:pPr>
-      <w:r>
-        <w:t xml:space="preserve">No campo das ouvidorias e da participação social, o Pena Justa já reúne marcos normativos que podem ser destacados nesta página:</w:t>
-      </w:r>
-    </w:p>
-    <w:p>
-      <w:pPr>
-        <w:pStyle w:val="BodyText"/>
-      </w:pPr>
-      <w:r>
-        <w:t xml:space="preserve">Subtítulo:</w:t>
-      </w:r>
-    </w:p>
-    <w:p>
-      <w:pPr>
-        <w:pStyle w:val="BodyText"/>
-      </w:pPr>
-      <w:r>
-        <w:t xml:space="preserve">Normativo publicado</w:t>
-      </w:r>
-    </w:p>
-    <w:p>
-      <w:pPr>
-        <w:pStyle w:val="BodyText"/>
-      </w:pPr>
-      <w:r>
-        <w:t xml:space="preserve">Título:</w:t>
-      </w:r>
-    </w:p>
-    <w:p>
-      <w:pPr>
-        <w:pStyle w:val="BodyText"/>
-      </w:pPr>
-      <w:r>
-        <w:t xml:space="preserve">Instrução Normativa nº 75/2026</w:t>
-      </w:r>
-    </w:p>
-    <w:p>
-      <w:pPr>
-        <w:pStyle w:val="BodyText"/>
-      </w:pPr>
-      <w:r>
-        <w:t xml:space="preserve">Texto para colar:</w:t>
-      </w:r>
-    </w:p>
-    <w:p>
-      <w:pPr>
-        <w:pStyle w:val="BodyText"/>
-      </w:pPr>
-      <w:r>
-        <w:t xml:space="preserve">Estabelece parâmetros mínimos para a criação e a estruturação de Ouvidorias de Serviços Penais nos Estados e no Distrito Federal, com diretrizes de autonomia, transparência, acessibilidade e integração preferencial ao Fala.BR.</w:t>
-      </w:r>
-    </w:p>
-    <w:p>
-      <w:pPr>
-        <w:pStyle w:val="BodyText"/>
-      </w:pPr>
-      <w:r>
-        <w:t xml:space="preserve">Link:</w:t>
-      </w:r>
-    </w:p>
-    <w:p>
-      <w:pPr>
-        <w:pStyle w:val="BodyText"/>
-      </w:pPr>
-      <w:r>
-        <w:t xml:space="preserve">Acessar a Instrução Normativa (PDF)</w:t>
-      </w:r>
-    </w:p>
-    <w:p>
-      <w:pPr>
-        <w:pStyle w:val="BodyText"/>
-      </w:pPr>
-      <w:r>
-        <w:t xml:space="preserve">Arquivo:</w:t>
-      </w:r>
-    </w:p>
-    <w:p>
-      <w:pPr>
-        <w:pStyle w:val="BodyText"/>
-      </w:pPr>
-      <w:r>
-        <w:t xml:space="preserve">Subpages/Pena_justa/SEI_35153985_Instrucao_Normativa_75.pdf</w:t>
-      </w:r>
-    </w:p>
-    <w:p>
-      <w:pPr>
-        <w:pStyle w:val="BodyText"/>
-      </w:pPr>
-      <w:r>
-        <w:t xml:space="preserve">Subtítulo:</w:t>
-      </w:r>
-    </w:p>
-    <w:p>
-      <w:pPr>
-        <w:pStyle w:val="BodyText"/>
-      </w:pPr>
-      <w:r>
-        <w:t xml:space="preserve">Rede instituída</w:t>
-      </w:r>
-    </w:p>
-    <w:p>
-      <w:pPr>
-        <w:pStyle w:val="BodyText"/>
-      </w:pPr>
-      <w:r>
-        <w:t xml:space="preserve">Título:</w:t>
-      </w:r>
-    </w:p>
-    <w:p>
-      <w:pPr>
-        <w:pStyle w:val="BodyText"/>
-      </w:pPr>
-      <w:r>
-        <w:t xml:space="preserve">Portaria nº 549/2026</w:t>
-      </w:r>
-    </w:p>
-    <w:p>
-      <w:pPr>
-        <w:pStyle w:val="BodyText"/>
-      </w:pPr>
-      <w:r>
-        <w:t xml:space="preserve">Texto para colar:</w:t>
-      </w:r>
-    </w:p>
-    <w:p>
-      <w:pPr>
-        <w:pStyle w:val="BodyText"/>
-      </w:pPr>
-      <w:r>
-        <w:t xml:space="preserve">Institui a Rede Nacional de Ouvidorias de Serviços Penais - Renospen, como instância permanente de cooperação técnica, intercâmbio de informações e fortalecimento institucional das ouvidorias no sistema penal.</w:t>
-      </w:r>
-    </w:p>
-    <w:p>
-      <w:pPr>
-        <w:pStyle w:val="BodyText"/>
-      </w:pPr>
-      <w:r>
-        <w:t xml:space="preserve">Link:</w:t>
-      </w:r>
-    </w:p>
-    <w:p>
-      <w:pPr>
-        <w:pStyle w:val="BodyText"/>
-      </w:pPr>
-      <w:r>
-        <w:t xml:space="preserve">Acessar a Portaria (PDF)</w:t>
-      </w:r>
-    </w:p>
-    <w:p>
-      <w:pPr>
-        <w:pStyle w:val="BodyText"/>
-      </w:pPr>
-      <w:r>
-        <w:t xml:space="preserve">Arquivo:</w:t>
-      </w:r>
-    </w:p>
-    <w:p>
-      <w:pPr>
-        <w:pStyle w:val="BodyText"/>
-      </w:pPr>
-      <w:r>
-        <w:t xml:space="preserve">Subpages/Pena_justa/SEI_35032761_Portaria_549.pdf</w:t>
-      </w:r>
-    </w:p>
-    <w:p>
-      <w:pPr>
-        <w:pStyle w:val="BodyText"/>
-      </w:pPr>
-      <w:r>
-        <w:t xml:space="preserve">Seção:</w:t>
-      </w:r>
-    </w:p>
-    <w:p>
-      <w:pPr>
-        <w:pStyle w:val="BodyText"/>
-      </w:pPr>
-      <w:r>
-        <w:t xml:space="preserve">Documentos públicos de referência</w:t>
-      </w:r>
-    </w:p>
-    <w:p>
-      <w:pPr>
-        <w:pStyle w:val="BodyText"/>
-      </w:pPr>
-      <w:r>
-        <w:t xml:space="preserve">Links:</w:t>
+        <w:t xml:space="preserve">Quadro de apoio a inserir logo abaixo da lista de eixos:</w:t>
       </w:r>
     </w:p>
     <w:p>
@@ -5314,7 +5066,16 @@
         </w:numPr>
       </w:pPr>
       <w:r>
-        <w:t xml:space="preserve">Plano Nacional Pena Justa (PDF): Subpages/Pena_justa/Plano_Nacional_Pena_Justa.pdf</w:t>
+        <w:t xml:space="preserve">Imagem:</w:t>
+      </w:r>
+      <w:r>
+        <w:t xml:space="preserve"> </w:t>
+      </w:r>
+      <w:r>
+        <w:rPr>
+          <w:rStyle w:val="VerbatimChar"/>
+        </w:rPr>
+        <w:t xml:space="preserve">Documentação/Plano_pena_justa.png</w:t>
       </w:r>
     </w:p>
     <w:p>
@@ -5326,17 +5087,19 @@
         </w:numPr>
       </w:pPr>
       <w:r>
-        <w:t xml:space="preserve">10 coisas que você precisa saber sobre o Pena Justa (PDF): Subpages/Pena_justa/10_Coisas_que_você_precisa_saber_sobre_o_Pena_Justa.pdf</w:t>
-      </w:r>
-    </w:p>
-    <w:bookmarkEnd w:id="30"/>
-    <w:bookmarkStart w:id="31" w:name="X9010218d04cc9bed3b5085cf6721dd78b5ea4ec"/>
-    <w:p>
-      <w:pPr>
-        <w:pStyle w:val="Heading2"/>
-      </w:pPr>
-      <w:r>
-        <w:t xml:space="preserve">Subpágina 4 - Revista Brasileira de Execução Penal</w:t>
+        <w:t xml:space="preserve">Texto de apoio acima da imagem: O quadro abaixo sintetiza medidas, metas e atores estratégicos dos eixos 2 e 4 com incidência direta sobre transparência, escuta institucional, canais de denúncia e fortalecimento das ouvidorias no sistema penal.</w:t>
+      </w:r>
+    </w:p>
+    <w:p>
+      <w:pPr>
+        <w:pStyle w:val="Compact"/>
+        <w:numPr>
+          <w:ilvl w:val="0"/>
+          <w:numId w:val="1018"/>
+        </w:numPr>
+      </w:pPr>
+      <w:r>
+        <w:t xml:space="preserve">Texto de apoio abaixo da imagem: No recorte de interesse da Onasp, o quadro destaca especialmente medidas voltadas à qualificação dos serviços prestados nas prisões, à institucionalização de canais efetivos de denúncia, à criação e estruturação de ouvidorias estaduais e ao fortalecimento de políticas de não repetição.</w:t>
       </w:r>
     </w:p>
     <w:p>
@@ -5344,86 +5107,6 @@
         <w:pStyle w:val="FirstParagraph"/>
       </w:pPr>
       <w:r>
-        <w:t xml:space="preserve">Título da página:</w:t>
-      </w:r>
-    </w:p>
-    <w:p>
-      <w:pPr>
-        <w:pStyle w:val="BodyText"/>
-      </w:pPr>
-      <w:r>
-        <w:t xml:space="preserve">Revista Brasileira de Execução Penal</w:t>
-      </w:r>
-    </w:p>
-    <w:p>
-      <w:pPr>
-        <w:pStyle w:val="BodyText"/>
-      </w:pPr>
-      <w:r>
-        <w:t xml:space="preserve">Imagem de destaque:</w:t>
-      </w:r>
-    </w:p>
-    <w:p>
-      <w:pPr>
-        <w:pStyle w:val="BodyText"/>
-      </w:pPr>
-      <w:r>
-        <w:t xml:space="preserve">Documentação/Botao_RevistaBrasileira.png</w:t>
-      </w:r>
-    </w:p>
-    <w:p>
-      <w:pPr>
-        <w:pStyle w:val="BodyText"/>
-      </w:pPr>
-      <w:r>
-        <w:t xml:space="preserve">Texto alternativo sugerido:</w:t>
-      </w:r>
-    </w:p>
-    <w:p>
-      <w:pPr>
-        <w:pStyle w:val="BodyText"/>
-      </w:pPr>
-      <w:r>
-        <w:t xml:space="preserve">Botão institucional da Revista Brasileira de Execução Penal.</w:t>
-      </w:r>
-    </w:p>
-    <w:p>
-      <w:pPr>
-        <w:pStyle w:val="BodyText"/>
-      </w:pPr>
-      <w:r>
-        <w:t xml:space="preserve">Identificador editorial:</w:t>
-      </w:r>
-    </w:p>
-    <w:p>
-      <w:pPr>
-        <w:pStyle w:val="BodyText"/>
-      </w:pPr>
-      <w:r>
-        <w:t xml:space="preserve">Conteúdo Técnico e Projetos Estruturantes</w:t>
-      </w:r>
-    </w:p>
-    <w:p>
-      <w:pPr>
-        <w:pStyle w:val="BodyText"/>
-      </w:pPr>
-      <w:r>
-        <w:t xml:space="preserve">Texto de destaque:</w:t>
-      </w:r>
-    </w:p>
-    <w:p>
-      <w:pPr>
-        <w:pStyle w:val="BodyText"/>
-      </w:pPr>
-      <w:r>
-        <w:t xml:space="preserve">Em articulação com a Espen e a DCOM, esta subpágina reúne referências da Revista Brasileira de Execução Penal e destaca dossiês, notícias editoriais e conteúdos com interface com participação social, transparência e direitos no sistema penal.</w:t>
-      </w:r>
-    </w:p>
-    <w:p>
-      <w:pPr>
-        <w:pStyle w:val="BodyText"/>
-      </w:pPr>
-      <w:r>
         <w:t xml:space="preserve">Seção:</w:t>
       </w:r>
     </w:p>
@@ -5432,7 +5115,7 @@
         <w:pStyle w:val="BodyText"/>
       </w:pPr>
       <w:r>
-        <w:t xml:space="preserve">A Revista</w:t>
+        <w:t xml:space="preserve">Governança e acompanhamento</w:t>
       </w:r>
     </w:p>
     <w:p>
@@ -5448,23 +5131,15 @@
         <w:pStyle w:val="BodyText"/>
       </w:pPr>
       <w:r>
-        <w:t xml:space="preserve">A Revista Brasileira de Execução Penal é o periódico técnico-científico da Secretaria Nacional de Políticas Penais (Senappen/MJSP) e constitui espaço de circulação de artigos, documentos inéditos, entrevistas, relatos de experiência e boas práticas relacionados à execução penal.</w:t>
-      </w:r>
-    </w:p>
-    <w:p>
-      <w:pPr>
-        <w:pStyle w:val="BodyText"/>
-      </w:pPr>
-      <w:r>
-        <w:t xml:space="preserve">A segunda linha do escopo:</w:t>
-      </w:r>
-    </w:p>
-    <w:p>
-      <w:pPr>
-        <w:pStyle w:val="BodyText"/>
-      </w:pPr>
-      <w:r>
-        <w:t xml:space="preserve">No contexto da Ouvidoria, a publicação contribui para aproximar produção técnica, debate qualificado e controle social, reforçando o papel da Ouvidoria como ponte entre Estado e sociedade.</w:t>
+        <w:t xml:space="preserve">No recorte da Ouvidoria Nacional de Serviços Penais, o acompanhamento do Pena Justa prioriza instrumentos que fortaleçam a escuta qualificada, a transparência ativa e a coordenação entre as ouvidorias dos serviços penais.</w:t>
+      </w:r>
+    </w:p>
+    <w:p>
+      <w:pPr>
+        <w:pStyle w:val="BodyText"/>
+      </w:pPr>
+      <w:r>
+        <w:t xml:space="preserve">Esse recorte se materializa por meio de marcos normativos e de cooperação técnica que estruturam parâmetros mínimos de atuação, incentivam integração preferencial ao Fala.BR e consolidam uma rede permanente de intercâmbio entre União, Estados e Distrito Federal.</w:t>
       </w:r>
     </w:p>
     <w:p>
@@ -5480,7 +5155,7 @@
         <w:pStyle w:val="BodyText"/>
       </w:pPr>
       <w:r>
-        <w:t xml:space="preserve">Sobre a revista</w:t>
+        <w:t xml:space="preserve">Entregas já formalizadas</w:t>
       </w:r>
     </w:p>
     <w:p>
@@ -5496,23 +5171,167 @@
         <w:pStyle w:val="BodyText"/>
       </w:pPr>
       <w:r>
-        <w:t xml:space="preserve">A RBEP publica artigos, documentos inéditos, entrevistas, relatos de experiência e descrição de boas práticas que relacionam a experiência profissional, o conhecimento produzido sobre a matéria e o cumprimento da legislação nacional.</w:t>
-      </w:r>
-    </w:p>
-    <w:p>
-      <w:pPr>
-        <w:pStyle w:val="BodyText"/>
-      </w:pPr>
-      <w:r>
-        <w:t xml:space="preserve">A segunda linha da seção:</w:t>
-      </w:r>
-    </w:p>
-    <w:p>
-      <w:pPr>
-        <w:pStyle w:val="BodyText"/>
-      </w:pPr>
-      <w:r>
-        <w:t xml:space="preserve">Os conteúdos são organizados em dossiês temáticos semestrais, e a revista recebeu qualificação A4 na classificação de periódicos Qualis Capes na avaliação do quadriênio 2021-2024.</w:t>
+        <w:t xml:space="preserve">No campo das ouvidorias e da participação social, o Pena Justa já reúne marcos normativos que podem ser destacados nesta página:</w:t>
+      </w:r>
+    </w:p>
+    <w:p>
+      <w:pPr>
+        <w:pStyle w:val="BodyText"/>
+      </w:pPr>
+      <w:r>
+        <w:t xml:space="preserve">Subtítulo:</w:t>
+      </w:r>
+    </w:p>
+    <w:p>
+      <w:pPr>
+        <w:pStyle w:val="BodyText"/>
+      </w:pPr>
+      <w:r>
+        <w:t xml:space="preserve">Normativo publicado</w:t>
+      </w:r>
+    </w:p>
+    <w:p>
+      <w:pPr>
+        <w:pStyle w:val="BodyText"/>
+      </w:pPr>
+      <w:r>
+        <w:t xml:space="preserve">Título:</w:t>
+      </w:r>
+    </w:p>
+    <w:p>
+      <w:pPr>
+        <w:pStyle w:val="BodyText"/>
+      </w:pPr>
+      <w:r>
+        <w:t xml:space="preserve">Instrução Normativa nº 75/2026</w:t>
+      </w:r>
+    </w:p>
+    <w:p>
+      <w:pPr>
+        <w:pStyle w:val="BodyText"/>
+      </w:pPr>
+      <w:r>
+        <w:t xml:space="preserve">Texto para colar:</w:t>
+      </w:r>
+    </w:p>
+    <w:p>
+      <w:pPr>
+        <w:pStyle w:val="BodyText"/>
+      </w:pPr>
+      <w:r>
+        <w:t xml:space="preserve">Estabelece parâmetros mínimos para a criação e a estruturação de Ouvidorias de Serviços Penais nos Estados e no Distrito Federal, com diretrizes de autonomia, transparência, acessibilidade e integração preferencial ao Fala.BR.</w:t>
+      </w:r>
+    </w:p>
+    <w:p>
+      <w:pPr>
+        <w:pStyle w:val="BodyText"/>
+      </w:pPr>
+      <w:r>
+        <w:t xml:space="preserve">Link:</w:t>
+      </w:r>
+    </w:p>
+    <w:p>
+      <w:pPr>
+        <w:pStyle w:val="BodyText"/>
+      </w:pPr>
+      <w:r>
+        <w:t xml:space="preserve">Acessar a Instrução Normativa (PDF)</w:t>
+      </w:r>
+    </w:p>
+    <w:p>
+      <w:pPr>
+        <w:pStyle w:val="BodyText"/>
+      </w:pPr>
+      <w:r>
+        <w:t xml:space="preserve">Arquivo:</w:t>
+      </w:r>
+    </w:p>
+    <w:p>
+      <w:pPr>
+        <w:pStyle w:val="BodyText"/>
+      </w:pPr>
+      <w:r>
+        <w:t xml:space="preserve">Subpages/Pena_justa/SEI_35153985_Instrucao_Normativa_75.pdf</w:t>
+      </w:r>
+    </w:p>
+    <w:p>
+      <w:pPr>
+        <w:pStyle w:val="BodyText"/>
+      </w:pPr>
+      <w:r>
+        <w:t xml:space="preserve">Subtítulo:</w:t>
+      </w:r>
+    </w:p>
+    <w:p>
+      <w:pPr>
+        <w:pStyle w:val="BodyText"/>
+      </w:pPr>
+      <w:r>
+        <w:t xml:space="preserve">Rede instituída</w:t>
+      </w:r>
+    </w:p>
+    <w:p>
+      <w:pPr>
+        <w:pStyle w:val="BodyText"/>
+      </w:pPr>
+      <w:r>
+        <w:t xml:space="preserve">Título:</w:t>
+      </w:r>
+    </w:p>
+    <w:p>
+      <w:pPr>
+        <w:pStyle w:val="BodyText"/>
+      </w:pPr>
+      <w:r>
+        <w:t xml:space="preserve">Portaria nº 549/2026</w:t>
+      </w:r>
+    </w:p>
+    <w:p>
+      <w:pPr>
+        <w:pStyle w:val="BodyText"/>
+      </w:pPr>
+      <w:r>
+        <w:t xml:space="preserve">Texto para colar:</w:t>
+      </w:r>
+    </w:p>
+    <w:p>
+      <w:pPr>
+        <w:pStyle w:val="BodyText"/>
+      </w:pPr>
+      <w:r>
+        <w:t xml:space="preserve">Institui a Rede Nacional de Ouvidorias de Serviços Penais - Renospen, como instância permanente de cooperação técnica, intercâmbio de informações e fortalecimento institucional das ouvidorias no sistema penal.</w:t>
+      </w:r>
+    </w:p>
+    <w:p>
+      <w:pPr>
+        <w:pStyle w:val="BodyText"/>
+      </w:pPr>
+      <w:r>
+        <w:t xml:space="preserve">Link:</w:t>
+      </w:r>
+    </w:p>
+    <w:p>
+      <w:pPr>
+        <w:pStyle w:val="BodyText"/>
+      </w:pPr>
+      <w:r>
+        <w:t xml:space="preserve">Acessar a Portaria (PDF)</w:t>
+      </w:r>
+    </w:p>
+    <w:p>
+      <w:pPr>
+        <w:pStyle w:val="BodyText"/>
+      </w:pPr>
+      <w:r>
+        <w:t xml:space="preserve">Arquivo:</w:t>
+      </w:r>
+    </w:p>
+    <w:p>
+      <w:pPr>
+        <w:pStyle w:val="BodyText"/>
+      </w:pPr>
+      <w:r>
+        <w:t xml:space="preserve">Subpages/Pena_justa/SEI_35032761_Portaria_549.pdf</w:t>
       </w:r>
     </w:p>
     <w:p>
@@ -5528,23 +5347,7 @@
         <w:pStyle w:val="BodyText"/>
       </w:pPr>
       <w:r>
-        <w:t xml:space="preserve">Acesso oficial à RBEP</w:t>
-      </w:r>
-    </w:p>
-    <w:p>
-      <w:pPr>
-        <w:pStyle w:val="BodyText"/>
-      </w:pPr>
-      <w:r>
-        <w:t xml:space="preserve">Texto para colar:</w:t>
-      </w:r>
-    </w:p>
-    <w:p>
-      <w:pPr>
-        <w:pStyle w:val="BodyText"/>
-      </w:pPr>
-      <w:r>
-        <w:t xml:space="preserve">O portal oficial da revista reúne notícias, edição atual, arquivo de edições e informações para submissão de textos.</w:t>
+        <w:t xml:space="preserve">Documentos públicos de referência</w:t>
       </w:r>
     </w:p>
     <w:p>
@@ -5564,7 +5367,7 @@
         </w:numPr>
       </w:pPr>
       <w:r>
-        <w:t xml:space="preserve">Portal oficial da Revista Brasileira de Execução Penal: https://rbepsenappen.mj.gov.br/index.php/RBEP/pt_BR</w:t>
+        <w:t xml:space="preserve">Plano Nacional Pena Justa (PDF): Subpages/Pena_justa/Plano_Nacional_Pena_Justa.pdf</w:t>
       </w:r>
     </w:p>
     <w:p>
@@ -5576,31 +5379,17 @@
         </w:numPr>
       </w:pPr>
       <w:r>
-        <w:t xml:space="preserve">Edição atual - edição completa: https://rbepsenappen.mj.gov.br/index.php/RBEP/pt_BR/issue/view/22/58</w:t>
-      </w:r>
-    </w:p>
-    <w:p>
-      <w:pPr>
-        <w:pStyle w:val="Compact"/>
-        <w:numPr>
-          <w:ilvl w:val="0"/>
-          <w:numId w:val="1019"/>
-        </w:numPr>
-      </w:pPr>
-      <w:r>
-        <w:t xml:space="preserve">Ver todas as edições: https://rbepsenappen.mj.gov.br/index.php/RBEP/pt_BR/issue/archive</w:t>
-      </w:r>
-    </w:p>
-    <w:p>
-      <w:pPr>
-        <w:pStyle w:val="Compact"/>
-        <w:numPr>
-          <w:ilvl w:val="0"/>
-          <w:numId w:val="1019"/>
-        </w:numPr>
-      </w:pPr>
-      <w:r>
-        <w:t xml:space="preserve">Enviar submissão: https://rbepsenappen.mj.gov.br/index.php/RBEP/pt_BR/about/submissions</w:t>
+        <w:t xml:space="preserve">10 coisas que você precisa saber sobre o Pena Justa (PDF): Subpages/Pena_justa/10_Coisas_que_você_precisa_saber_sobre_o_Pena_Justa.pdf</w:t>
+      </w:r>
+    </w:p>
+    <w:bookmarkEnd w:id="30"/>
+    <w:bookmarkStart w:id="31" w:name="X9010218d04cc9bed3b5085cf6721dd78b5ea4ec"/>
+    <w:p>
+      <w:pPr>
+        <w:pStyle w:val="Heading2"/>
+      </w:pPr>
+      <w:r>
+        <w:t xml:space="preserve">Subpágina 4 - Revista Brasileira de Execução Penal</w:t>
       </w:r>
     </w:p>
     <w:p>
@@ -5608,6 +5397,86 @@
         <w:pStyle w:val="FirstParagraph"/>
       </w:pPr>
       <w:r>
+        <w:t xml:space="preserve">Título da página:</w:t>
+      </w:r>
+    </w:p>
+    <w:p>
+      <w:pPr>
+        <w:pStyle w:val="BodyText"/>
+      </w:pPr>
+      <w:r>
+        <w:t xml:space="preserve">Revista Brasileira de Execução Penal</w:t>
+      </w:r>
+    </w:p>
+    <w:p>
+      <w:pPr>
+        <w:pStyle w:val="BodyText"/>
+      </w:pPr>
+      <w:r>
+        <w:t xml:space="preserve">Imagem de destaque:</w:t>
+      </w:r>
+    </w:p>
+    <w:p>
+      <w:pPr>
+        <w:pStyle w:val="BodyText"/>
+      </w:pPr>
+      <w:r>
+        <w:t xml:space="preserve">Documentação/Botao_RevistaBrasileira.png</w:t>
+      </w:r>
+    </w:p>
+    <w:p>
+      <w:pPr>
+        <w:pStyle w:val="BodyText"/>
+      </w:pPr>
+      <w:r>
+        <w:t xml:space="preserve">Texto alternativo sugerido:</w:t>
+      </w:r>
+    </w:p>
+    <w:p>
+      <w:pPr>
+        <w:pStyle w:val="BodyText"/>
+      </w:pPr>
+      <w:r>
+        <w:t xml:space="preserve">Botão institucional da Revista Brasileira de Execução Penal.</w:t>
+      </w:r>
+    </w:p>
+    <w:p>
+      <w:pPr>
+        <w:pStyle w:val="BodyText"/>
+      </w:pPr>
+      <w:r>
+        <w:t xml:space="preserve">Identificador editorial:</w:t>
+      </w:r>
+    </w:p>
+    <w:p>
+      <w:pPr>
+        <w:pStyle w:val="BodyText"/>
+      </w:pPr>
+      <w:r>
+        <w:t xml:space="preserve">Conteúdo Técnico e Projetos Estruturantes</w:t>
+      </w:r>
+    </w:p>
+    <w:p>
+      <w:pPr>
+        <w:pStyle w:val="BodyText"/>
+      </w:pPr>
+      <w:r>
+        <w:t xml:space="preserve">Texto de destaque:</w:t>
+      </w:r>
+    </w:p>
+    <w:p>
+      <w:pPr>
+        <w:pStyle w:val="BodyText"/>
+      </w:pPr>
+      <w:r>
+        <w:t xml:space="preserve">Em articulação com a Espen e a DCOM, esta subpágina reúne referências da Revista Brasileira de Execução Penal e destaca dossiês, notícias editoriais e conteúdos com interface com participação social, transparência e direitos no sistema penal.</w:t>
+      </w:r>
+    </w:p>
+    <w:p>
+      <w:pPr>
+        <w:pStyle w:val="BodyText"/>
+      </w:pPr>
+      <w:r>
         <w:t xml:space="preserve">Seção:</w:t>
       </w:r>
     </w:p>
@@ -5616,15 +5485,127 @@
         <w:pStyle w:val="BodyText"/>
       </w:pPr>
       <w:r>
-        <w:t xml:space="preserve">Referências institucionais</w:t>
-      </w:r>
-    </w:p>
-    <w:p>
-      <w:pPr>
-        <w:pStyle w:val="BodyText"/>
-      </w:pPr>
-      <w:r>
-        <w:t xml:space="preserve">Itens para colar:</w:t>
+        <w:t xml:space="preserve">A Revista</w:t>
+      </w:r>
+    </w:p>
+    <w:p>
+      <w:pPr>
+        <w:pStyle w:val="BodyText"/>
+      </w:pPr>
+      <w:r>
+        <w:t xml:space="preserve">Texto para colar:</w:t>
+      </w:r>
+    </w:p>
+    <w:p>
+      <w:pPr>
+        <w:pStyle w:val="BodyText"/>
+      </w:pPr>
+      <w:r>
+        <w:t xml:space="preserve">A Revista Brasileira de Execução Penal é o periódico técnico-científico da Secretaria Nacional de Políticas Penais (Senappen/MJSP) e constitui espaço de circulação de artigos, documentos inéditos, entrevistas, relatos de experiência e boas práticas relacionados à execução penal.</w:t>
+      </w:r>
+    </w:p>
+    <w:p>
+      <w:pPr>
+        <w:pStyle w:val="BodyText"/>
+      </w:pPr>
+      <w:r>
+        <w:t xml:space="preserve">A segunda linha do escopo:</w:t>
+      </w:r>
+    </w:p>
+    <w:p>
+      <w:pPr>
+        <w:pStyle w:val="BodyText"/>
+      </w:pPr>
+      <w:r>
+        <w:t xml:space="preserve">No contexto da Ouvidoria, a publicação contribui para aproximar produção técnica, debate qualificado e controle social, reforçando o papel da Ouvidoria como ponte entre Estado e sociedade.</w:t>
+      </w:r>
+    </w:p>
+    <w:p>
+      <w:pPr>
+        <w:pStyle w:val="BodyText"/>
+      </w:pPr>
+      <w:r>
+        <w:t xml:space="preserve">Seção:</w:t>
+      </w:r>
+    </w:p>
+    <w:p>
+      <w:pPr>
+        <w:pStyle w:val="BodyText"/>
+      </w:pPr>
+      <w:r>
+        <w:t xml:space="preserve">Sobre a revista</w:t>
+      </w:r>
+    </w:p>
+    <w:p>
+      <w:pPr>
+        <w:pStyle w:val="BodyText"/>
+      </w:pPr>
+      <w:r>
+        <w:t xml:space="preserve">Texto para colar:</w:t>
+      </w:r>
+    </w:p>
+    <w:p>
+      <w:pPr>
+        <w:pStyle w:val="BodyText"/>
+      </w:pPr>
+      <w:r>
+        <w:t xml:space="preserve">A RBEP publica artigos, documentos inéditos, entrevistas, relatos de experiência e descrição de boas práticas que relacionam a experiência profissional, o conhecimento produzido sobre a matéria e o cumprimento da legislação nacional.</w:t>
+      </w:r>
+    </w:p>
+    <w:p>
+      <w:pPr>
+        <w:pStyle w:val="BodyText"/>
+      </w:pPr>
+      <w:r>
+        <w:t xml:space="preserve">A segunda linha da seção:</w:t>
+      </w:r>
+    </w:p>
+    <w:p>
+      <w:pPr>
+        <w:pStyle w:val="BodyText"/>
+      </w:pPr>
+      <w:r>
+        <w:t xml:space="preserve">Os conteúdos são organizados em dossiês temáticos semestrais, e a revista recebeu qualificação A4 na classificação de periódicos Qualis Capes na avaliação do quadriênio 2021-2024.</w:t>
+      </w:r>
+    </w:p>
+    <w:p>
+      <w:pPr>
+        <w:pStyle w:val="BodyText"/>
+      </w:pPr>
+      <w:r>
+        <w:t xml:space="preserve">Seção:</w:t>
+      </w:r>
+    </w:p>
+    <w:p>
+      <w:pPr>
+        <w:pStyle w:val="BodyText"/>
+      </w:pPr>
+      <w:r>
+        <w:t xml:space="preserve">Acesso oficial à RBEP</w:t>
+      </w:r>
+    </w:p>
+    <w:p>
+      <w:pPr>
+        <w:pStyle w:val="BodyText"/>
+      </w:pPr>
+      <w:r>
+        <w:t xml:space="preserve">Texto para colar:</w:t>
+      </w:r>
+    </w:p>
+    <w:p>
+      <w:pPr>
+        <w:pStyle w:val="BodyText"/>
+      </w:pPr>
+      <w:r>
+        <w:t xml:space="preserve">O portal oficial da revista reúne notícias, edição atual, arquivo de edições e informações para submissão de textos.</w:t>
+      </w:r>
+    </w:p>
+    <w:p>
+      <w:pPr>
+        <w:pStyle w:val="BodyText"/>
+      </w:pPr>
+      <w:r>
+        <w:t xml:space="preserve">Links:</w:t>
       </w:r>
     </w:p>
     <w:p>
@@ -5636,7 +5617,7 @@
         </w:numPr>
       </w:pPr>
       <w:r>
-        <w:t xml:space="preserve">Qualis Capes 2021-2024: A4.</w:t>
+        <w:t xml:space="preserve">Portal oficial da Revista Brasileira de Execução Penal: https://rbepsenappen.mj.gov.br/index.php/RBEP/pt_BR</w:t>
       </w:r>
     </w:p>
     <w:p>
@@ -5648,7 +5629,7 @@
         </w:numPr>
       </w:pPr>
       <w:r>
-        <w:t xml:space="preserve">ISSN: 2675-1895.</w:t>
+        <w:t xml:space="preserve">Edição atual - edição completa: https://rbepsenappen.mj.gov.br/index.php/RBEP/pt_BR/issue/view/22/58</w:t>
       </w:r>
     </w:p>
     <w:p>
@@ -5660,7 +5641,7 @@
         </w:numPr>
       </w:pPr>
       <w:r>
-        <w:t xml:space="preserve">e-ISSN: 2675-1860.</w:t>
+        <w:t xml:space="preserve">Ver todas as edições: https://rbepsenappen.mj.gov.br/index.php/RBEP/pt_BR/issue/archive</w:t>
       </w:r>
     </w:p>
     <w:p>
@@ -5669,6 +5650,78 @@
         <w:numPr>
           <w:ilvl w:val="0"/>
           <w:numId w:val="1020"/>
+        </w:numPr>
+      </w:pPr>
+      <w:r>
+        <w:t xml:space="preserve">Enviar submissão: https://rbepsenappen.mj.gov.br/index.php/RBEP/pt_BR/about/submissions</w:t>
+      </w:r>
+    </w:p>
+    <w:p>
+      <w:pPr>
+        <w:pStyle w:val="FirstParagraph"/>
+      </w:pPr>
+      <w:r>
+        <w:t xml:space="preserve">Seção:</w:t>
+      </w:r>
+    </w:p>
+    <w:p>
+      <w:pPr>
+        <w:pStyle w:val="BodyText"/>
+      </w:pPr>
+      <w:r>
+        <w:t xml:space="preserve">Referências institucionais</w:t>
+      </w:r>
+    </w:p>
+    <w:p>
+      <w:pPr>
+        <w:pStyle w:val="BodyText"/>
+      </w:pPr>
+      <w:r>
+        <w:t xml:space="preserve">Itens para colar:</w:t>
+      </w:r>
+    </w:p>
+    <w:p>
+      <w:pPr>
+        <w:pStyle w:val="Compact"/>
+        <w:numPr>
+          <w:ilvl w:val="0"/>
+          <w:numId w:val="1021"/>
+        </w:numPr>
+      </w:pPr>
+      <w:r>
+        <w:t xml:space="preserve">Qualis Capes 2021-2024: A4.</w:t>
+      </w:r>
+    </w:p>
+    <w:p>
+      <w:pPr>
+        <w:pStyle w:val="Compact"/>
+        <w:numPr>
+          <w:ilvl w:val="0"/>
+          <w:numId w:val="1021"/>
+        </w:numPr>
+      </w:pPr>
+      <w:r>
+        <w:t xml:space="preserve">ISSN: 2675-1895.</w:t>
+      </w:r>
+    </w:p>
+    <w:p>
+      <w:pPr>
+        <w:pStyle w:val="Compact"/>
+        <w:numPr>
+          <w:ilvl w:val="0"/>
+          <w:numId w:val="1021"/>
+        </w:numPr>
+      </w:pPr>
+      <w:r>
+        <w:t xml:space="preserve">e-ISSN: 2675-1860.</w:t>
+      </w:r>
+    </w:p>
+    <w:p>
+      <w:pPr>
+        <w:pStyle w:val="Compact"/>
+        <w:numPr>
+          <w:ilvl w:val="0"/>
+          <w:numId w:val="1021"/>
         </w:numPr>
       </w:pPr>
       <w:r>
@@ -6003,6 +6056,9 @@
     <w:abstractNumId w:val="991"/>
   </w:num>
   <w:num w:numId="1020">
+    <w:abstractNumId w:val="991"/>
+  </w:num>
+  <w:num w:numId="1021">
     <w:abstractNumId w:val="991"/>
   </w:num>
 </w:numbering>

</xml_diff>

<commit_message>
Reorganiza home com normativos e notícias
</commit_message>
<xml_diff>
--- a/Documentação/estrutura_completa_pagina_onasp_para_dicom.docx
+++ b/Documentação/estrutura_completa_pagina_onasp_para_dicom.docx
@@ -2,7 +2,7 @@
 <file path=word/document.xml><?xml version="1.0" encoding="utf-8"?>
 <w:document xmlns:w="http://schemas.openxmlformats.org/wordprocessingml/2006/main" xmlns:m="http://schemas.openxmlformats.org/officeDocument/2006/math" xmlns:r="http://schemas.openxmlformats.org/officeDocument/2006/relationships" xmlns:o="urn:schemas-microsoft-com:office:office" xmlns:v="urn:schemas-microsoft-com:vml" xmlns:w10="urn:schemas-microsoft-com:office:word" xmlns:a="http://schemas.openxmlformats.org/drawingml/2006/main" xmlns:pic="http://schemas.openxmlformats.org/drawingml/2006/picture" xmlns:wp="http://schemas.openxmlformats.org/drawingml/2006/wordprocessingDrawing">
   <w:body>
-    <w:bookmarkStart w:id="34" w:name="X651419ee04b722d3d77fb0d3ef8f3cab38d582a"/>
+    <w:bookmarkStart w:id="35" w:name="X651419ee04b722d3d77fb0d3ef8f3cab38d582a"/>
     <w:p>
       <w:pPr>
         <w:pStyle w:val="Heading1"/>
@@ -53,7 +53,7 @@
       </w:r>
     </w:p>
     <w:bookmarkEnd w:id="9"/>
-    <w:bookmarkStart w:id="27" w:name="Xbfa4aa77b994200a22daf31aefaeaa021a9038a"/>
+    <w:bookmarkStart w:id="28" w:name="Xbfa4aa77b994200a22daf31aefaeaa021a9038a"/>
     <w:p>
       <w:pPr>
         <w:pStyle w:val="Heading2"/>
@@ -1100,13 +1100,13 @@
       </w:r>
     </w:p>
     <w:bookmarkEnd w:id="18"/>
-    <w:bookmarkStart w:id="24" w:name="bloco-10---notícias-da-ouvidoria"/>
+    <w:bookmarkStart w:id="19" w:name="X53583b821a0a3fdc6c987398bb240b1b43b94e3"/>
     <w:p>
       <w:pPr>
         <w:pStyle w:val="Heading3"/>
       </w:pPr>
       <w:r>
-        <w:t xml:space="preserve">Bloco 10 - Notícias da Ouvidoria</w:t>
+        <w:t xml:space="preserve">Bloco 10 - Painel de Tratamento de Demandas</w:t>
       </w:r>
     </w:p>
     <w:p>
@@ -1122,23 +1122,105 @@
         <w:pStyle w:val="BodyText"/>
       </w:pPr>
       <w:r>
-        <w:t xml:space="preserve">Notícias da Ouvidoria</w:t>
-      </w:r>
-    </w:p>
-    <w:p>
-      <w:pPr>
-        <w:pStyle w:val="BodyText"/>
-      </w:pPr>
-      <w:r>
-        <w:t xml:space="preserve">Texto introdutório sugerido:</w:t>
-      </w:r>
-    </w:p>
-    <w:p>
-      <w:pPr>
-        <w:pStyle w:val="BodyText"/>
-      </w:pPr>
-      <w:r>
-        <w:t xml:space="preserve">Seleção de notícias publicadas no portal da SENAPPEN com relação direta à ONASP, à Rede de Ouvidorias e aos canais de atendimento ao cidadão.</w:t>
+        <w:t xml:space="preserve">Painel de Tratamento de Demandas da Ouvidoria Nacional de Serviços Penais</w:t>
+      </w:r>
+    </w:p>
+    <w:p>
+      <w:pPr>
+        <w:pStyle w:val="BodyText"/>
+      </w:pPr>
+      <w:r>
+        <w:t xml:space="preserve">Texto para colar:</w:t>
+      </w:r>
+    </w:p>
+    <w:p>
+      <w:pPr>
+        <w:pStyle w:val="BodyText"/>
+      </w:pPr>
+      <w:r>
+        <w:t xml:space="preserve">O Painel de Tratamento de Demandas da Ouvidoria Nacional de Serviços Penais (Onasp) é uma ferramenta de transparência ativa e gestão estratégica. Por meio de tecnologia de Business Intelligence (BI), o painel permite ao cidadão pesquisar e visualizar estatísticas atualizadas sobre as manifestações recebidas (denúncias, reclamações, solicitações, sugestões e elogios), monitorando os indicadores de desempenho e os temas mais recorrentes no sistema penal. A base de dados contempla registros a partir de janeiro de 2023, sendo atualizada periodicamente para garantir o controle social efetivo.</w:t>
+      </w:r>
+    </w:p>
+    <w:p>
+      <w:pPr>
+        <w:pStyle w:val="BodyText"/>
+      </w:pPr>
+      <w:r>
+        <w:t xml:space="preserve">Embed do Power BI:</w:t>
+      </w:r>
+    </w:p>
+    <w:p>
+      <w:pPr>
+        <w:pStyle w:val="BodyText"/>
+      </w:pPr>
+      <w:r>
+        <w:t xml:space="preserve">https://app.powerbi.com/view?r=eyJrIjoiMDU5NGVlNjQtMjZmZi00YzI0LTk0ZTktMzQwMzdkM2QyMDg5IiwidCI6ImViMDkwNDIwLTQ0NGMtNDNmNy05MWYyLTRiOGRhNmJmZThlMSJ9</w:t>
+      </w:r>
+    </w:p>
+    <w:p>
+      <w:pPr>
+        <w:pStyle w:val="BodyText"/>
+      </w:pPr>
+      <w:r>
+        <w:t xml:space="preserve">Título acessível sugerido para o iframe:</w:t>
+      </w:r>
+    </w:p>
+    <w:p>
+      <w:pPr>
+        <w:pStyle w:val="BodyText"/>
+      </w:pPr>
+      <w:r>
+        <w:t xml:space="preserve">Painel de Tratamento de Demandas da ONASP</w:t>
+      </w:r>
+    </w:p>
+    <w:bookmarkEnd w:id="19"/>
+    <w:bookmarkStart w:id="20" w:name="bloco-11---normativos"/>
+    <w:p>
+      <w:pPr>
+        <w:pStyle w:val="Heading3"/>
+      </w:pPr>
+      <w:r>
+        <w:t xml:space="preserve">Bloco 11 - Normativos</w:t>
+      </w:r>
+    </w:p>
+    <w:p>
+      <w:pPr>
+        <w:pStyle w:val="FirstParagraph"/>
+      </w:pPr>
+      <w:r>
+        <w:t xml:space="preserve">Título da seção:</w:t>
+      </w:r>
+    </w:p>
+    <w:p>
+      <w:pPr>
+        <w:pStyle w:val="BodyText"/>
+      </w:pPr>
+      <w:r>
+        <w:t xml:space="preserve">Normativos</w:t>
+      </w:r>
+    </w:p>
+    <w:p>
+      <w:pPr>
+        <w:pStyle w:val="BodyText"/>
+      </w:pPr>
+      <w:r>
+        <w:t xml:space="preserve">Linha de atualização sugerida:</w:t>
+      </w:r>
+    </w:p>
+    <w:p>
+      <w:pPr>
+        <w:pStyle w:val="BodyText"/>
+      </w:pPr>
+      <w:r>
+        <w:t xml:space="preserve">Publicado em 13/05/2026</w:t>
+      </w:r>
+    </w:p>
+    <w:p>
+      <w:pPr>
+        <w:pStyle w:val="BodyText"/>
+      </w:pPr>
+      <w:r>
+        <w:t xml:space="preserve">Atualizado em 13/05/2026</w:t>
       </w:r>
     </w:p>
     <w:p>
@@ -1154,15 +1236,96 @@
         <w:pStyle w:val="BodyText"/>
       </w:pPr>
       <w:r>
-        <w:t xml:space="preserve">Usar texto rico com blocos curtos, sem marcadores: link principal em destaque e, logo abaixo, uma descrição breve com data e contexto.</w:t>
-      </w:r>
-    </w:p>
-    <w:p>
-      <w:pPr>
-        <w:pStyle w:val="BodyText"/>
-      </w:pPr>
-      <w:r>
-        <w:t xml:space="preserve">Lista de notícias sugerida:</w:t>
+        <w:t xml:space="preserve">Apresentar abaixo do painel em tabela editorial inspirada na página</w:t>
+      </w:r>
+      <w:r>
+        <w:t xml:space="preserve"> </w:t>
+      </w:r>
+      <w:r>
+        <w:rPr>
+          <w:rStyle w:val="VerbatimChar"/>
+        </w:rPr>
+        <w:t xml:space="preserve">Normativos</w:t>
+      </w:r>
+      <w:r>
+        <w:t xml:space="preserve"> </w:t>
+      </w:r>
+      <w:r>
+        <w:t xml:space="preserve">da ESPEN, com colunas</w:t>
+      </w:r>
+      <w:r>
+        <w:t xml:space="preserve"> </w:t>
+      </w:r>
+      <w:r>
+        <w:rPr>
+          <w:rStyle w:val="VerbatimChar"/>
+        </w:rPr>
+        <w:t xml:space="preserve">Título</w:t>
+      </w:r>
+      <w:r>
+        <w:t xml:space="preserve">,</w:t>
+      </w:r>
+      <w:r>
+        <w:t xml:space="preserve"> </w:t>
+      </w:r>
+      <w:r>
+        <w:rPr>
+          <w:rStyle w:val="VerbatimChar"/>
+        </w:rPr>
+        <w:t xml:space="preserve">Tipo</w:t>
+      </w:r>
+      <w:r>
+        <w:t xml:space="preserve"> </w:t>
+      </w:r>
+      <w:r>
+        <w:t xml:space="preserve">e</w:t>
+      </w:r>
+      <w:r>
+        <w:t xml:space="preserve"> </w:t>
+      </w:r>
+      <w:r>
+        <w:rPr>
+          <w:rStyle w:val="VerbatimChar"/>
+        </w:rPr>
+        <w:t xml:space="preserve">Descrição</w:t>
+      </w:r>
+      <w:r>
+        <w:t xml:space="preserve">. Para os seis itens abaixo, o campo</w:t>
+      </w:r>
+      <w:r>
+        <w:t xml:space="preserve"> </w:t>
+      </w:r>
+      <w:r>
+        <w:rPr>
+          <w:rStyle w:val="VerbatimChar"/>
+        </w:rPr>
+        <w:t xml:space="preserve">Tipo</w:t>
+      </w:r>
+      <w:r>
+        <w:t xml:space="preserve"> </w:t>
+      </w:r>
+      <w:r>
+        <w:t xml:space="preserve">pode ser publicado como</w:t>
+      </w:r>
+      <w:r>
+        <w:t xml:space="preserve"> </w:t>
+      </w:r>
+      <w:r>
+        <w:rPr>
+          <w:rStyle w:val="VerbatimChar"/>
+        </w:rPr>
+        <w:t xml:space="preserve">Arquivo</w:t>
+      </w:r>
+      <w:r>
+        <w:t xml:space="preserve">.</w:t>
+      </w:r>
+    </w:p>
+    <w:p>
+      <w:pPr>
+        <w:pStyle w:val="BodyText"/>
+      </w:pPr>
+      <w:r>
+        <w:t xml:space="preserve">Links a publicar:</w:t>
       </w:r>
     </w:p>
     <w:p>
@@ -1174,12 +1337,214 @@
         </w:numPr>
       </w:pPr>
       <w:r>
+        <w:t xml:space="preserve">Lei nº 13.460, de 26 de junho de 2017: Documentação/Normativas Basilares de Ouvidoria/LEI N°13.460.2017.pdf</w:t>
+      </w:r>
+      <w:r>
+        <w:t xml:space="preserve"> </w:t>
+      </w:r>
+      <w:r>
+        <w:t xml:space="preserve">Descrição: Dispõe sobre participação, proteção e defesa dos direitos do usuário dos serviços públicos da administração pública.</w:t>
+      </w:r>
+    </w:p>
+    <w:p>
+      <w:pPr>
+        <w:pStyle w:val="Compact"/>
+        <w:numPr>
+          <w:ilvl w:val="0"/>
+          <w:numId w:val="1005"/>
+        </w:numPr>
+      </w:pPr>
+      <w:r>
+        <w:t xml:space="preserve">Decreto nº 9.492, de 5 de setembro de 2018: Documentação/Normativas Basilares de Ouvidoria/Decreto N°9.492.2018.pdf</w:t>
+      </w:r>
+      <w:r>
+        <w:t xml:space="preserve"> </w:t>
+      </w:r>
+      <w:r>
+        <w:t xml:space="preserve">Descrição: Regulamenta a Lei nº 13.460, de 26 de junho de 2017, institui o Sistema de Ouvidoria do Poder Executivo federal e altera o Decreto nº 8.910, de 22 de novembro de 2016.</w:t>
+      </w:r>
+    </w:p>
+    <w:p>
+      <w:pPr>
+        <w:pStyle w:val="Compact"/>
+        <w:numPr>
+          <w:ilvl w:val="0"/>
+          <w:numId w:val="1005"/>
+        </w:numPr>
+      </w:pPr>
+      <w:r>
+        <w:t xml:space="preserve">Decreto nº 10.153, de 3 de dezembro de 2019: Documentação/Normativas Basilares de Ouvidoria/Decreto N°10.153.2019.pdf</w:t>
+      </w:r>
+      <w:r>
+        <w:t xml:space="preserve"> </w:t>
+      </w:r>
+      <w:r>
+        <w:t xml:space="preserve">Descrição: Dispõe sobre as salvaguardas de proteção à identidade dos denunciantes de ilícitos e de irregularidades praticados contra a administração pública federal direta e indireta.</w:t>
+      </w:r>
+    </w:p>
+    <w:p>
+      <w:pPr>
+        <w:pStyle w:val="Compact"/>
+        <w:numPr>
+          <w:ilvl w:val="0"/>
+          <w:numId w:val="1005"/>
+        </w:numPr>
+      </w:pPr>
+      <w:r>
+        <w:t xml:space="preserve">Portaria Normativa CGU nº 116, de 18 de março de 2024: Documentação/Normativas Basilares de Ouvidoria/Portaria Normativa CGU - N°116.2024.pdf</w:t>
+      </w:r>
+      <w:r>
+        <w:t xml:space="preserve"> </w:t>
+      </w:r>
+      <w:r>
+        <w:t xml:space="preserve">Descrição: Estabelece orientações para o exercício das competências das unidades do Sistema de Ouvidoria do Poder Executivo Federal, instituído pelo Decreto nº 9.492, de 5 de setembro de 2018, no âmbito do Poder Executivo federal, e dá outras providências.</w:t>
+      </w:r>
+    </w:p>
+    <w:p>
+      <w:pPr>
+        <w:pStyle w:val="Compact"/>
+        <w:numPr>
+          <w:ilvl w:val="0"/>
+          <w:numId w:val="1005"/>
+        </w:numPr>
+      </w:pPr>
+      <w:r>
+        <w:t xml:space="preserve">Lei nº 12.527, de 18 de novembro de 2011: Documentação/Normativas Basilares de Ouvidoria/LEI N°12.527.2011.pdf</w:t>
+      </w:r>
+      <w:r>
+        <w:t xml:space="preserve"> </w:t>
+      </w:r>
+      <w:r>
+        <w:t xml:space="preserve">Descrição: Regula o acesso a informações previsto no inciso XXXIII do art. 5º, no inciso II do § 3º do art. 37 e no § 2º do art. 216 da Constituição Federal.</w:t>
+      </w:r>
+    </w:p>
+    <w:p>
+      <w:pPr>
+        <w:pStyle w:val="Compact"/>
+        <w:numPr>
+          <w:ilvl w:val="0"/>
+          <w:numId w:val="1005"/>
+        </w:numPr>
+      </w:pPr>
+      <w:r>
+        <w:t xml:space="preserve">Lei nº 13.709, de 14 de agosto de 2018: Documentação/Normativas Basilares de Ouvidoria/LEI N°13.709.2018.pdf</w:t>
+      </w:r>
+      <w:r>
+        <w:t xml:space="preserve"> </w:t>
+      </w:r>
+      <w:r>
+        <w:t xml:space="preserve">Descrição: Dispõe sobre a proteção de dados pessoais e altera a Lei nº 12.965, de 23 de abril de 2014 (Marco Civil da Internet).</w:t>
+      </w:r>
+    </w:p>
+    <w:bookmarkEnd w:id="20"/>
+    <w:bookmarkStart w:id="27" w:name="bloco-12---notícias-da-ouvidoria"/>
+    <w:p>
+      <w:pPr>
+        <w:pStyle w:val="Heading3"/>
+      </w:pPr>
+      <w:r>
+        <w:t xml:space="preserve">Bloco 12 - Notícias da Ouvidoria</w:t>
+      </w:r>
+    </w:p>
+    <w:p>
+      <w:pPr>
+        <w:pStyle w:val="FirstParagraph"/>
+      </w:pPr>
+      <w:r>
+        <w:t xml:space="preserve">Título da seção:</w:t>
+      </w:r>
+    </w:p>
+    <w:p>
+      <w:pPr>
+        <w:pStyle w:val="BodyText"/>
+      </w:pPr>
+      <w:r>
+        <w:t xml:space="preserve">Notícias da Ouvidoria</w:t>
+      </w:r>
+    </w:p>
+    <w:p>
+      <w:pPr>
+        <w:pStyle w:val="BodyText"/>
+      </w:pPr>
+      <w:r>
+        <w:t xml:space="preserve">Posicionamento na página:</w:t>
+      </w:r>
+    </w:p>
+    <w:p>
+      <w:pPr>
+        <w:pStyle w:val="BodyText"/>
+      </w:pPr>
+      <w:r>
+        <w:t xml:space="preserve">Último bloco da homepage, abaixo de</w:t>
+      </w:r>
+      <w:r>
+        <w:t xml:space="preserve"> </w:t>
+      </w:r>
+      <w:r>
+        <w:rPr>
+          <w:rStyle w:val="VerbatimChar"/>
+        </w:rPr>
+        <w:t xml:space="preserve">Normativos</w:t>
+      </w:r>
+      <w:r>
+        <w:t xml:space="preserve">.</w:t>
+      </w:r>
+    </w:p>
+    <w:p>
+      <w:pPr>
+        <w:pStyle w:val="BodyText"/>
+      </w:pPr>
+      <w:r>
+        <w:t xml:space="preserve">Texto introdutório sugerido:</w:t>
+      </w:r>
+    </w:p>
+    <w:p>
+      <w:pPr>
+        <w:pStyle w:val="BodyText"/>
+      </w:pPr>
+      <w:r>
+        <w:t xml:space="preserve">Curadoria manual com seis notícias do portal da SENAPPEN ligadas à ONASP, à Rede de Ouvidorias e à qualificação dos canais de atendimento ao cidadão.</w:t>
+      </w:r>
+    </w:p>
+    <w:p>
+      <w:pPr>
+        <w:pStyle w:val="BodyText"/>
+      </w:pPr>
+      <w:r>
+        <w:t xml:space="preserve">Padrão visual recomendado para publicação:</w:t>
+      </w:r>
+    </w:p>
+    <w:p>
+      <w:pPr>
+        <w:pStyle w:val="BodyText"/>
+      </w:pPr>
+      <w:r>
+        <w:t xml:space="preserve">No protótipo, apresentar em seis cards editoriais compactos, em grade 3x2 inspirada na vitrine de notícias da ESPEN: imagem no topo, rubrica curta, título clicável, resumo breve e data. Na publicação gov.br, reproduzir com componente nativo equivalente, sem feed dinâmico e sem ícones de compartilhamento.</w:t>
+      </w:r>
+    </w:p>
+    <w:p>
+      <w:pPr>
+        <w:pStyle w:val="BodyText"/>
+      </w:pPr>
+      <w:r>
+        <w:t xml:space="preserve">Lista de notícias sugerida:</w:t>
+      </w:r>
+    </w:p>
+    <w:p>
+      <w:pPr>
+        <w:pStyle w:val="Compact"/>
+        <w:numPr>
+          <w:ilvl w:val="0"/>
+          <w:numId w:val="1006"/>
+        </w:numPr>
+      </w:pPr>
+      <w:r>
         <w:t xml:space="preserve">27/04/2026 -</w:t>
       </w:r>
       <w:r>
         <w:t xml:space="preserve"> </w:t>
       </w:r>
-      <w:hyperlink r:id="rId19">
+      <w:hyperlink r:id="rId21">
         <w:r>
           <w:rPr>
             <w:rStyle w:val="Hyperlink"/>
@@ -1191,7 +1556,7 @@
         <w:t xml:space="preserve"> </w:t>
       </w:r>
       <w:r>
-        <w:t xml:space="preserve">Descrição: A pauta destacou a atuação da Ouvidoria e da EMA/SENAPPEN na articulação federativa.</w:t>
+        <w:t xml:space="preserve">Descrição: Pauta destacou a Ouvidoria e a EMA/SENAPPEN na articulação federativa.</w:t>
       </w:r>
     </w:p>
     <w:p>
@@ -1199,7 +1564,7 @@
         <w:pStyle w:val="Compact"/>
         <w:numPr>
           <w:ilvl w:val="0"/>
-          <w:numId w:val="1005"/>
+          <w:numId w:val="1006"/>
         </w:numPr>
       </w:pPr>
       <w:r>
@@ -1208,7 +1573,7 @@
       <w:r>
         <w:t xml:space="preserve"> </w:t>
       </w:r>
-      <w:hyperlink r:id="rId20">
+      <w:hyperlink r:id="rId22">
         <w:r>
           <w:rPr>
             <w:rStyle w:val="Hyperlink"/>
@@ -1220,7 +1585,7 @@
         <w:t xml:space="preserve"> </w:t>
       </w:r>
       <w:r>
-        <w:t xml:space="preserve">Descrição: Ação voltada ao fortalecimento da escuta institucional, com chatbot e ampliação do acesso aos canais de atendimento.</w:t>
+        <w:t xml:space="preserve">Descrição: Ação ampliou a escuta institucional e o acesso aos canais de atendimento.</w:t>
       </w:r>
     </w:p>
     <w:p>
@@ -1228,7 +1593,7 @@
         <w:pStyle w:val="Compact"/>
         <w:numPr>
           <w:ilvl w:val="0"/>
-          <w:numId w:val="1005"/>
+          <w:numId w:val="1006"/>
         </w:numPr>
       </w:pPr>
       <w:r>
@@ -1237,7 +1602,7 @@
       <w:r>
         <w:t xml:space="preserve"> </w:t>
       </w:r>
-      <w:hyperlink r:id="rId21">
+      <w:hyperlink r:id="rId23">
         <w:r>
           <w:rPr>
             <w:rStyle w:val="Hyperlink"/>
@@ -1249,7 +1614,7 @@
         <w:t xml:space="preserve"> </w:t>
       </w:r>
       <w:r>
-        <w:t xml:space="preserve">Descrição: O encontro marcou a criação da RENOSPEN e a publicação de diretrizes para atuação das ouvidorias.</w:t>
+        <w:t xml:space="preserve">Descrição: Encontro consolidou a RENOSPEN e publicou diretrizes para as ouvidorias.</w:t>
       </w:r>
     </w:p>
     <w:p>
@@ -1257,7 +1622,7 @@
         <w:pStyle w:val="Compact"/>
         <w:numPr>
           <w:ilvl w:val="0"/>
-          <w:numId w:val="1005"/>
+          <w:numId w:val="1006"/>
         </w:numPr>
       </w:pPr>
       <w:r>
@@ -1266,7 +1631,7 @@
       <w:r>
         <w:t xml:space="preserve"> </w:t>
       </w:r>
-      <w:hyperlink r:id="rId22">
+      <w:hyperlink r:id="rId24">
         <w:r>
           <w:rPr>
             <w:rStyle w:val="Hyperlink"/>
@@ -1278,7 +1643,7 @@
         <w:t xml:space="preserve"> </w:t>
       </w:r>
       <w:r>
-        <w:t xml:space="preserve">Descrição: A notícia apresenta o fluxo de denúncias da ONASP e reforça os canais de atendimento e participação social.</w:t>
+        <w:t xml:space="preserve">Descrição: Fluxo reforça transparência, integridade institucional e proteção de direitos.</w:t>
       </w:r>
     </w:p>
     <w:p>
@@ -1286,16 +1651,45 @@
         <w:pStyle w:val="Compact"/>
         <w:numPr>
           <w:ilvl w:val="0"/>
-          <w:numId w:val="1005"/>
+          <w:numId w:val="1006"/>
         </w:numPr>
       </w:pPr>
       <w:r>
+        <w:t xml:space="preserve">01/12/2025 -</w:t>
+      </w:r>
+      <w:r>
+        <w:t xml:space="preserve"> </w:t>
+      </w:r>
+      <w:hyperlink r:id="rId25">
+        <w:r>
+          <w:rPr>
+            <w:rStyle w:val="Hyperlink"/>
+          </w:rPr>
+          <w:t xml:space="preserve">SENAPPEN participa de encontro nacional para fortalecer ouvidorias e redes de proteção social</w:t>
+        </w:r>
+      </w:hyperlink>
+      <w:r>
+        <w:t xml:space="preserve"> </w:t>
+      </w:r>
+      <w:r>
+        <w:t xml:space="preserve">Descrição: Evento aproximou ouvidorias, assistência social e Plano Pena Justa.</w:t>
+      </w:r>
+    </w:p>
+    <w:p>
+      <w:pPr>
+        <w:pStyle w:val="Compact"/>
+        <w:numPr>
+          <w:ilvl w:val="0"/>
+          <w:numId w:val="1006"/>
+        </w:numPr>
+      </w:pPr>
+      <w:r>
         <w:t xml:space="preserve">31/10/2025 -</w:t>
       </w:r>
       <w:r>
         <w:t xml:space="preserve"> </w:t>
       </w:r>
-      <w:hyperlink r:id="rId23">
+      <w:hyperlink r:id="rId26">
         <w:r>
           <w:rPr>
             <w:rStyle w:val="Hyperlink"/>
@@ -1307,260 +1701,12 @@
         <w:t xml:space="preserve"> </w:t>
       </w:r>
       <w:r>
-        <w:t xml:space="preserve">Descrição: A agenda fortaleceu a Rede Nacional de Ouvidorias e o intercâmbio de boas práticas com os estados.</w:t>
-      </w:r>
-    </w:p>
-    <w:bookmarkEnd w:id="24"/>
-    <w:bookmarkStart w:id="25" w:name="X66bb28c02d722bd407aa00f2f1f0e42b630fd55"/>
-    <w:p>
-      <w:pPr>
-        <w:pStyle w:val="Heading3"/>
-      </w:pPr>
-      <w:r>
-        <w:t xml:space="preserve">Bloco 11 - Painel de Tratamento de Demandas</w:t>
-      </w:r>
-    </w:p>
-    <w:p>
-      <w:pPr>
-        <w:pStyle w:val="FirstParagraph"/>
-      </w:pPr>
-      <w:r>
-        <w:t xml:space="preserve">Título da seção:</w:t>
-      </w:r>
-    </w:p>
-    <w:p>
-      <w:pPr>
-        <w:pStyle w:val="BodyText"/>
-      </w:pPr>
-      <w:r>
-        <w:t xml:space="preserve">Painel de Tratamento de Demandas da Ouvidoria Nacional de Serviços Penais</w:t>
-      </w:r>
-    </w:p>
-    <w:p>
-      <w:pPr>
-        <w:pStyle w:val="BodyText"/>
-      </w:pPr>
-      <w:r>
-        <w:t xml:space="preserve">Texto para colar:</w:t>
-      </w:r>
-    </w:p>
-    <w:p>
-      <w:pPr>
-        <w:pStyle w:val="BodyText"/>
-      </w:pPr>
-      <w:r>
-        <w:t xml:space="preserve">O Painel de Tratamento de Demandas da Ouvidoria Nacional de Serviços Penais (Onasp) é uma ferramenta de transparência ativa e gestão estratégica. Por meio de tecnologia de Business Intelligence (BI), o painel permite ao cidadão pesquisar e visualizar estatísticas atualizadas sobre as manifestações recebidas (denúncias, reclamações, solicitações, sugestões e elogios), monitorando os indicadores de desempenho e os temas mais recorrentes no sistema penal. A base de dados contempla registros a partir de janeiro de 2023, sendo atualizada periodicamente para garantir o controle social efetivo.</w:t>
-      </w:r>
-    </w:p>
-    <w:p>
-      <w:pPr>
-        <w:pStyle w:val="BodyText"/>
-      </w:pPr>
-      <w:r>
-        <w:t xml:space="preserve">Embed do Power BI:</w:t>
-      </w:r>
-    </w:p>
-    <w:p>
-      <w:pPr>
-        <w:pStyle w:val="BodyText"/>
-      </w:pPr>
-      <w:r>
-        <w:t xml:space="preserve">https://app.powerbi.com/view?r=eyJrIjoiMDU5NGVlNjQtMjZmZi00YzI0LTk0ZTktMzQwMzdkM2QyMDg5IiwidCI6ImViMDkwNDIwLTQ0NGMtNDNmNy05MWYyLTRiOGRhNmJmZThlMSJ9</w:t>
-      </w:r>
-    </w:p>
-    <w:p>
-      <w:pPr>
-        <w:pStyle w:val="BodyText"/>
-      </w:pPr>
-      <w:r>
-        <w:t xml:space="preserve">Título acessível sugerido para o iframe:</w:t>
-      </w:r>
-    </w:p>
-    <w:p>
-      <w:pPr>
-        <w:pStyle w:val="BodyText"/>
-      </w:pPr>
-      <w:r>
-        <w:t xml:space="preserve">Painel de Tratamento de Demandas da ONASP</w:t>
-      </w:r>
-    </w:p>
-    <w:bookmarkEnd w:id="25"/>
-    <w:bookmarkStart w:id="26" w:name="bloco-12---legislação"/>
-    <w:p>
-      <w:pPr>
-        <w:pStyle w:val="Heading3"/>
-      </w:pPr>
-      <w:r>
-        <w:t xml:space="preserve">Bloco 12 - Legislação</w:t>
-      </w:r>
-    </w:p>
-    <w:p>
-      <w:pPr>
-        <w:pStyle w:val="FirstParagraph"/>
-      </w:pPr>
-      <w:r>
-        <w:t xml:space="preserve">Título da seção:</w:t>
-      </w:r>
-    </w:p>
-    <w:p>
-      <w:pPr>
-        <w:pStyle w:val="BodyText"/>
-      </w:pPr>
-      <w:r>
-        <w:t xml:space="preserve">Legislação</w:t>
-      </w:r>
-    </w:p>
-    <w:p>
-      <w:pPr>
-        <w:pStyle w:val="BodyText"/>
-      </w:pPr>
-      <w:r>
-        <w:t xml:space="preserve">Texto introdutório sugerido:</w:t>
-      </w:r>
-    </w:p>
-    <w:p>
-      <w:pPr>
-        <w:pStyle w:val="BodyText"/>
-      </w:pPr>
-      <w:r>
-        <w:t xml:space="preserve">Os normativos basilares abaixo reúnem referências atualmente disponíveis no pacote documental da Ouvidoria e podem ser publicados como links simples na homepage, abaixo do painel de tratamento de demandas.</w:t>
-      </w:r>
-    </w:p>
-    <w:p>
-      <w:pPr>
-        <w:pStyle w:val="BodyText"/>
-      </w:pPr>
-      <w:r>
-        <w:t xml:space="preserve">Padrão visual recomendado para publicação:</w:t>
-      </w:r>
-    </w:p>
-    <w:p>
-      <w:pPr>
-        <w:pStyle w:val="BodyText"/>
-      </w:pPr>
-      <w:r>
-        <w:t xml:space="preserve">Usar o mesmo padrão da seção de notícias: texto rico com blocos curtos, sem marcadores, apresentando link principal em destaque e descrição breve logo abaixo.</w:t>
-      </w:r>
-    </w:p>
-    <w:p>
-      <w:pPr>
-        <w:pStyle w:val="BodyText"/>
-      </w:pPr>
-      <w:r>
-        <w:t xml:space="preserve">Links a publicar:</w:t>
-      </w:r>
-    </w:p>
-    <w:p>
-      <w:pPr>
-        <w:pStyle w:val="Compact"/>
-        <w:numPr>
-          <w:ilvl w:val="0"/>
-          <w:numId w:val="1006"/>
-        </w:numPr>
-      </w:pPr>
-      <w:r>
-        <w:t xml:space="preserve">Lei nº 13.460, de 26 de junho de 2017: Documentação/Normativas Basilares de Ouvidoria/LEI N°13.460.2017.pdf</w:t>
-      </w:r>
-      <w:r>
-        <w:t xml:space="preserve"> </w:t>
-      </w:r>
-      <w:r>
-        <w:t xml:space="preserve">Descrição: Dispõe sobre participação, proteção e defesa dos direitos do usuário dos serviços públicos da administração pública.</w:t>
-      </w:r>
-    </w:p>
-    <w:p>
-      <w:pPr>
-        <w:pStyle w:val="Compact"/>
-        <w:numPr>
-          <w:ilvl w:val="0"/>
-          <w:numId w:val="1006"/>
-        </w:numPr>
-      </w:pPr>
-      <w:r>
-        <w:t xml:space="preserve">Decreto nº 9.492, de 5 de setembro de 2018: Documentação/Normativas Basilares de Ouvidoria/Decreto N°9.492.2018.pdf</w:t>
-      </w:r>
-      <w:r>
-        <w:t xml:space="preserve"> </w:t>
-      </w:r>
-      <w:r>
-        <w:t xml:space="preserve">Descrição: Regulamenta a Lei nº 13.460, de 26 de junho de 2017, institui o Sistema de Ouvidoria do Poder Executivo federal e altera o Decreto nº 8.910, de 22 de novembro de 2016.</w:t>
-      </w:r>
-    </w:p>
-    <w:p>
-      <w:pPr>
-        <w:pStyle w:val="Compact"/>
-        <w:numPr>
-          <w:ilvl w:val="0"/>
-          <w:numId w:val="1006"/>
-        </w:numPr>
-      </w:pPr>
-      <w:r>
-        <w:t xml:space="preserve">Decreto nº 10.153, de 3 de dezembro de 2019: Documentação/Normativas Basilares de Ouvidoria/Decreto N°10.153.2019.pdf</w:t>
-      </w:r>
-      <w:r>
-        <w:t xml:space="preserve"> </w:t>
-      </w:r>
-      <w:r>
-        <w:t xml:space="preserve">Descrição: Dispõe sobre as salvaguardas de proteção à identidade dos denunciantes de ilícitos e de irregularidades praticados contra a administração pública federal direta e indireta.</w:t>
-      </w:r>
-    </w:p>
-    <w:p>
-      <w:pPr>
-        <w:pStyle w:val="Compact"/>
-        <w:numPr>
-          <w:ilvl w:val="0"/>
-          <w:numId w:val="1006"/>
-        </w:numPr>
-      </w:pPr>
-      <w:r>
-        <w:t xml:space="preserve">Portaria Normativa CGU nº 116, de 18 de março de 2024: Documentação/Normativas Basilares de Ouvidoria/Portaria Normativa CGU - N°116.2024.pdf</w:t>
-      </w:r>
-      <w:r>
-        <w:t xml:space="preserve"> </w:t>
-      </w:r>
-      <w:r>
-        <w:t xml:space="preserve">Descrição: Estabelece orientações para o exercício das competências das unidades do Sistema de Ouvidoria do Poder Executivo Federal, instituído pelo Decreto nº 9.492, de 5 de setembro de 2018, no âmbito do Poder Executivo federal, e dá outras providências.</w:t>
-      </w:r>
-    </w:p>
-    <w:p>
-      <w:pPr>
-        <w:pStyle w:val="Compact"/>
-        <w:numPr>
-          <w:ilvl w:val="0"/>
-          <w:numId w:val="1006"/>
-        </w:numPr>
-      </w:pPr>
-      <w:r>
-        <w:t xml:space="preserve">Lei nº 12.527, de 18 de novembro de 2011: Documentação/Normativas Basilares de Ouvidoria/LEI N°12.527.2011.pdf</w:t>
-      </w:r>
-      <w:r>
-        <w:t xml:space="preserve"> </w:t>
-      </w:r>
-      <w:r>
-        <w:t xml:space="preserve">Descrição: Regula o acesso a informações previsto no inciso XXXIII do art. 5º, no inciso II do § 3º do art. 37 e no § 2º do art. 216 da Constituição Federal.</w:t>
-      </w:r>
-    </w:p>
-    <w:p>
-      <w:pPr>
-        <w:pStyle w:val="Compact"/>
-        <w:numPr>
-          <w:ilvl w:val="0"/>
-          <w:numId w:val="1006"/>
-        </w:numPr>
-      </w:pPr>
-      <w:r>
-        <w:t xml:space="preserve">Lei nº 13.709, de 14 de agosto de 2018: Documentação/Normativas Basilares de Ouvidoria/LEI N°13.709.2018.pdf</w:t>
-      </w:r>
-      <w:r>
-        <w:t xml:space="preserve"> </w:t>
-      </w:r>
-      <w:r>
-        <w:t xml:space="preserve">Descrição: Dispõe sobre a proteção de dados pessoais e altera a Lei nº 12.965, de 23 de abril de 2014 (Marco Civil da Internet).</w:t>
-      </w:r>
-    </w:p>
-    <w:bookmarkEnd w:id="26"/>
+        <w:t xml:space="preserve">Descrição: Agenda fortaleceu a Rede Nacional de Ouvidorias e o intercâmbio com os estados.</w:t>
+      </w:r>
+    </w:p>
     <w:bookmarkEnd w:id="27"/>
-    <w:bookmarkStart w:id="28" w:name="subpágina-1---rede-de-ouvidorias"/>
+    <w:bookmarkEnd w:id="28"/>
+    <w:bookmarkStart w:id="29" w:name="subpágina-1---rede-de-ouvidorias"/>
     <w:p>
       <w:pPr>
         <w:pStyle w:val="Heading2"/>
@@ -4173,8 +4319,8 @@
         <w:t xml:space="preserve">Clique e acesse o Plano Nacional Pena Justa: Subpages/Pena_justa/Plano_Nacional_Pena_Justa.pdf</w:t>
       </w:r>
     </w:p>
-    <w:bookmarkEnd w:id="28"/>
-    <w:bookmarkStart w:id="29" w:name="subpágina-2---ema---senappen"/>
+    <w:bookmarkEnd w:id="29"/>
+    <w:bookmarkStart w:id="30" w:name="subpágina-2---ema---senappen"/>
     <w:p>
       <w:pPr>
         <w:pStyle w:val="Heading2"/>
@@ -4839,8 +4985,8 @@
         <w:t xml:space="preserve">Seção:</w:t>
       </w:r>
     </w:p>
-    <w:bookmarkEnd w:id="29"/>
-    <w:bookmarkStart w:id="30" w:name="subpágina-3---plano-pena-justa"/>
+    <w:bookmarkEnd w:id="30"/>
+    <w:bookmarkStart w:id="31" w:name="subpágina-3---plano-pena-justa"/>
     <w:p>
       <w:pPr>
         <w:pStyle w:val="Heading2"/>
@@ -5382,8 +5528,8 @@
         <w:t xml:space="preserve">10 coisas que você precisa saber sobre o Pena Justa (PDF): Subpages/Pena_justa/10_Coisas_que_você_precisa_saber_sobre_o_Pena_Justa.pdf</w:t>
       </w:r>
     </w:p>
-    <w:bookmarkEnd w:id="30"/>
-    <w:bookmarkStart w:id="31" w:name="X9010218d04cc9bed3b5085cf6721dd78b5ea4ec"/>
+    <w:bookmarkEnd w:id="31"/>
+    <w:bookmarkStart w:id="32" w:name="X9010218d04cc9bed3b5085cf6721dd78b5ea4ec"/>
     <w:p>
       <w:pPr>
         <w:pStyle w:val="Heading2"/>
@@ -5728,8 +5874,8 @@
         <w:t xml:space="preserve">Contato da revista: rbep@mj.gov.br.</w:t>
       </w:r>
     </w:p>
-    <w:bookmarkEnd w:id="31"/>
-    <w:bookmarkStart w:id="32" w:name="observações-sobre-formatação"/>
+    <w:bookmarkEnd w:id="32"/>
+    <w:bookmarkStart w:id="33" w:name="observações-sobre-formatação"/>
     <w:p>
       <w:pPr>
         <w:pStyle w:val="Heading2"/>
@@ -5746,8 +5892,8 @@
         <w:t xml:space="preserve">Na prévia local, os textos corridos foram configurados com alinhamento justificado. No gov.br, esse resultado dependerá das opções disponíveis no editor oficial. Caso o editor permita alinhamento do parágrafo, recomenda-se aplicar alinhamento justificado aos textos corridos e manter títulos, links curtos e botões com o alinhamento padrão do componente.</w:t>
       </w:r>
     </w:p>
-    <w:bookmarkEnd w:id="32"/>
-    <w:bookmarkStart w:id="33" w:name="Xf7fe357b8ad8797f48d42cdb4ec1361a8fa006f"/>
+    <w:bookmarkEnd w:id="33"/>
+    <w:bookmarkStart w:id="34" w:name="Xf7fe357b8ad8797f48d42cdb4ec1361a8fa006f"/>
     <w:p>
       <w:pPr>
         <w:pStyle w:val="Heading2"/>
@@ -5780,8 +5926,8 @@
         <w:t xml:space="preserve">Há precedentes úteis dentro do próprio ecossistema da Senappen. A página da ESPEN e a subpágina da RESPEN mostram que o portal oficial já comporta texto institucional, links de destaque para documentos em PDF, listas simples e tabelas extensas por unidade federativa quando houver base oficial validada. Da mesma forma, o portal oficial da RBEP confirma a existência de referências institucionais, acesso à edição atual, arquivo de edições e informações para submissão que podem ser indicadas na subpágina temática da Revista.</w:t>
       </w:r>
     </w:p>
-    <w:bookmarkEnd w:id="33"/>
     <w:bookmarkEnd w:id="34"/>
+    <w:bookmarkEnd w:id="35"/>
     <w:sectPr>
       <w:footnotePr>
         <w:numRestart w:val="eachSect"/>

</xml_diff>

<commit_message>
Atualiza imagens da página Pena Justa
</commit_message>
<xml_diff>
--- a/Documentação/estrutura_completa_pagina_onasp_para_dicom.docx
+++ b/Documentação/estrutura_completa_pagina_onasp_para_dicom.docx
@@ -5120,31 +5120,7 @@
         <w:pStyle w:val="BodyText"/>
       </w:pPr>
       <w:r>
-        <w:t xml:space="preserve">Seção:</w:t>
-      </w:r>
-    </w:p>
-    <w:p>
-      <w:pPr>
-        <w:pStyle w:val="BodyText"/>
-      </w:pPr>
-      <w:r>
-        <w:t xml:space="preserve">Eixos de atuação</w:t>
-      </w:r>
-    </w:p>
-    <w:p>
-      <w:pPr>
-        <w:pStyle w:val="BodyText"/>
-      </w:pPr>
-      <w:r>
-        <w:t xml:space="preserve">Texto para colar:</w:t>
-      </w:r>
-    </w:p>
-    <w:p>
-      <w:pPr>
-        <w:pStyle w:val="BodyText"/>
-      </w:pPr>
-      <w:r>
-        <w:t xml:space="preserve">O Plano Nacional organiza sua atuação em quatro eixos estruturantes:</w:t>
+        <w:t xml:space="preserve">Imagem institucional a inserir logo abaixo do texto introdutório:</w:t>
       </w:r>
     </w:p>
     <w:p>
@@ -5156,7 +5132,16 @@
         </w:numPr>
       </w:pPr>
       <w:r>
-        <w:t xml:space="preserve">Controle da entrada e das vagas do sistema prisional.</w:t>
+        <w:t xml:space="preserve">Imagem:</w:t>
+      </w:r>
+      <w:r>
+        <w:t xml:space="preserve"> </w:t>
+      </w:r>
+      <w:r>
+        <w:rPr>
+          <w:rStyle w:val="VerbatimChar"/>
+        </w:rPr>
+        <w:t xml:space="preserve">Documentação/Banner_PenaJusta_f1.jpg</w:t>
       </w:r>
     </w:p>
     <w:p>
@@ -5168,7 +5153,7 @@
         </w:numPr>
       </w:pPr>
       <w:r>
-        <w:t xml:space="preserve">Qualidade da ambiência, dos serviços prestados e da estrutura prisional.</w:t>
+        <w:t xml:space="preserve">Texto de apoio acima da imagem: O registro abaixo documenta agenda institucional relacionada ao Plano Pena Justa e evidencia a participação da Onasp nos espaços de apresentação e articulação vinculados à ADPF 347.</w:t>
       </w:r>
     </w:p>
     <w:p>
@@ -5180,19 +5165,7 @@
         </w:numPr>
       </w:pPr>
       <w:r>
-        <w:t xml:space="preserve">Processos de saída da prisão e de reintegração social.</w:t>
-      </w:r>
-    </w:p>
-    <w:p>
-      <w:pPr>
-        <w:pStyle w:val="Compact"/>
-        <w:numPr>
-          <w:ilvl w:val="0"/>
-          <w:numId w:val="1017"/>
-        </w:numPr>
-      </w:pPr>
-      <w:r>
-        <w:t xml:space="preserve">Políticas de não repetição do Estado de Coisas Inconstitucional no sistema prisional.</w:t>
+        <w:t xml:space="preserve">Texto de apoio abaixo da imagem: A presença dessa imagem reforça o caráter interinstitucional do Plano e a atuação da Ouvidoria em agendas de coordenação, acompanhamento e diálogo sobre a implementação das medidas pactuadas.</w:t>
       </w:r>
     </w:p>
     <w:p>
@@ -5200,7 +5173,31 @@
         <w:pStyle w:val="FirstParagraph"/>
       </w:pPr>
       <w:r>
-        <w:t xml:space="preserve">Quadro de apoio a inserir logo abaixo da lista de eixos:</w:t>
+        <w:t xml:space="preserve">Seção:</w:t>
+      </w:r>
+    </w:p>
+    <w:p>
+      <w:pPr>
+        <w:pStyle w:val="BodyText"/>
+      </w:pPr>
+      <w:r>
+        <w:t xml:space="preserve">Eixos de atuação</w:t>
+      </w:r>
+    </w:p>
+    <w:p>
+      <w:pPr>
+        <w:pStyle w:val="BodyText"/>
+      </w:pPr>
+      <w:r>
+        <w:t xml:space="preserve">Texto para colar:</w:t>
+      </w:r>
+    </w:p>
+    <w:p>
+      <w:pPr>
+        <w:pStyle w:val="BodyText"/>
+      </w:pPr>
+      <w:r>
+        <w:t xml:space="preserve">O Plano Nacional organiza sua atuação em quatro eixos estruturantes:</w:t>
       </w:r>
     </w:p>
     <w:p>
@@ -5212,16 +5209,7 @@
         </w:numPr>
       </w:pPr>
       <w:r>
-        <w:t xml:space="preserve">Imagem:</w:t>
-      </w:r>
-      <w:r>
-        <w:t xml:space="preserve"> </w:t>
-      </w:r>
-      <w:r>
-        <w:rPr>
-          <w:rStyle w:val="VerbatimChar"/>
-        </w:rPr>
-        <w:t xml:space="preserve">Documentação/Plano_pena_justa.png</w:t>
+        <w:t xml:space="preserve">Controle da entrada e das vagas do sistema prisional.</w:t>
       </w:r>
     </w:p>
     <w:p>
@@ -5233,7 +5221,7 @@
         </w:numPr>
       </w:pPr>
       <w:r>
-        <w:t xml:space="preserve">Texto de apoio acima da imagem: O quadro abaixo sintetiza medidas, metas e atores estratégicos dos eixos 2 e 4 com incidência direta sobre transparência, escuta institucional, canais de denúncia e fortalecimento das ouvidorias no sistema penal.</w:t>
+        <w:t xml:space="preserve">Qualidade da ambiência, dos serviços prestados e da estrutura prisional.</w:t>
       </w:r>
     </w:p>
     <w:p>
@@ -5245,7 +5233,19 @@
         </w:numPr>
       </w:pPr>
       <w:r>
-        <w:t xml:space="preserve">Texto de apoio abaixo da imagem: No recorte de interesse da Onasp, o quadro destaca especialmente medidas voltadas à qualificação dos serviços prestados nas prisões, à institucionalização de canais efetivos de denúncia, à criação e estruturação de ouvidorias estaduais e ao fortalecimento de políticas de não repetição.</w:t>
+        <w:t xml:space="preserve">Processos de saída da prisão e de reintegração social.</w:t>
+      </w:r>
+    </w:p>
+    <w:p>
+      <w:pPr>
+        <w:pStyle w:val="Compact"/>
+        <w:numPr>
+          <w:ilvl w:val="0"/>
+          <w:numId w:val="1018"/>
+        </w:numPr>
+      </w:pPr>
+      <w:r>
+        <w:t xml:space="preserve">Políticas de não repetição do Estado de Coisas Inconstitucional no sistema prisional.</w:t>
       </w:r>
     </w:p>
     <w:p>
@@ -5253,255 +5253,7 @@
         <w:pStyle w:val="FirstParagraph"/>
       </w:pPr>
       <w:r>
-        <w:t xml:space="preserve">Seção:</w:t>
-      </w:r>
-    </w:p>
-    <w:p>
-      <w:pPr>
-        <w:pStyle w:val="BodyText"/>
-      </w:pPr>
-      <w:r>
-        <w:t xml:space="preserve">Governança e acompanhamento</w:t>
-      </w:r>
-    </w:p>
-    <w:p>
-      <w:pPr>
-        <w:pStyle w:val="BodyText"/>
-      </w:pPr>
-      <w:r>
-        <w:t xml:space="preserve">Texto para colar:</w:t>
-      </w:r>
-    </w:p>
-    <w:p>
-      <w:pPr>
-        <w:pStyle w:val="BodyText"/>
-      </w:pPr>
-      <w:r>
-        <w:t xml:space="preserve">No recorte da Ouvidoria Nacional de Serviços Penais, o acompanhamento do Pena Justa prioriza instrumentos que fortaleçam a escuta qualificada, a transparência ativa e a coordenação entre as ouvidorias dos serviços penais.</w:t>
-      </w:r>
-    </w:p>
-    <w:p>
-      <w:pPr>
-        <w:pStyle w:val="BodyText"/>
-      </w:pPr>
-      <w:r>
-        <w:t xml:space="preserve">Esse recorte se materializa por meio de marcos normativos e de cooperação técnica que estruturam parâmetros mínimos de atuação, incentivam integração preferencial ao Fala.BR e consolidam uma rede permanente de intercâmbio entre União, Estados e Distrito Federal.</w:t>
-      </w:r>
-    </w:p>
-    <w:p>
-      <w:pPr>
-        <w:pStyle w:val="BodyText"/>
-      </w:pPr>
-      <w:r>
-        <w:t xml:space="preserve">Seção:</w:t>
-      </w:r>
-    </w:p>
-    <w:p>
-      <w:pPr>
-        <w:pStyle w:val="BodyText"/>
-      </w:pPr>
-      <w:r>
-        <w:t xml:space="preserve">Entregas já formalizadas</w:t>
-      </w:r>
-    </w:p>
-    <w:p>
-      <w:pPr>
-        <w:pStyle w:val="BodyText"/>
-      </w:pPr>
-      <w:r>
-        <w:t xml:space="preserve">Texto para colar:</w:t>
-      </w:r>
-    </w:p>
-    <w:p>
-      <w:pPr>
-        <w:pStyle w:val="BodyText"/>
-      </w:pPr>
-      <w:r>
-        <w:t xml:space="preserve">No campo das ouvidorias e da participação social, o Pena Justa já reúne marcos normativos que podem ser destacados nesta página:</w:t>
-      </w:r>
-    </w:p>
-    <w:p>
-      <w:pPr>
-        <w:pStyle w:val="BodyText"/>
-      </w:pPr>
-      <w:r>
-        <w:t xml:space="preserve">Subtítulo:</w:t>
-      </w:r>
-    </w:p>
-    <w:p>
-      <w:pPr>
-        <w:pStyle w:val="BodyText"/>
-      </w:pPr>
-      <w:r>
-        <w:t xml:space="preserve">Normativo publicado</w:t>
-      </w:r>
-    </w:p>
-    <w:p>
-      <w:pPr>
-        <w:pStyle w:val="BodyText"/>
-      </w:pPr>
-      <w:r>
-        <w:t xml:space="preserve">Título:</w:t>
-      </w:r>
-    </w:p>
-    <w:p>
-      <w:pPr>
-        <w:pStyle w:val="BodyText"/>
-      </w:pPr>
-      <w:r>
-        <w:t xml:space="preserve">Instrução Normativa nº 75/2026</w:t>
-      </w:r>
-    </w:p>
-    <w:p>
-      <w:pPr>
-        <w:pStyle w:val="BodyText"/>
-      </w:pPr>
-      <w:r>
-        <w:t xml:space="preserve">Texto para colar:</w:t>
-      </w:r>
-    </w:p>
-    <w:p>
-      <w:pPr>
-        <w:pStyle w:val="BodyText"/>
-      </w:pPr>
-      <w:r>
-        <w:t xml:space="preserve">Estabelece parâmetros mínimos para a criação e a estruturação de Ouvidorias de Serviços Penais nos Estados e no Distrito Federal, com diretrizes de autonomia, transparência, acessibilidade e integração preferencial ao Fala.BR.</w:t>
-      </w:r>
-    </w:p>
-    <w:p>
-      <w:pPr>
-        <w:pStyle w:val="BodyText"/>
-      </w:pPr>
-      <w:r>
-        <w:t xml:space="preserve">Link:</w:t>
-      </w:r>
-    </w:p>
-    <w:p>
-      <w:pPr>
-        <w:pStyle w:val="BodyText"/>
-      </w:pPr>
-      <w:r>
-        <w:t xml:space="preserve">Acessar a Instrução Normativa (PDF)</w:t>
-      </w:r>
-    </w:p>
-    <w:p>
-      <w:pPr>
-        <w:pStyle w:val="BodyText"/>
-      </w:pPr>
-      <w:r>
-        <w:t xml:space="preserve">Arquivo:</w:t>
-      </w:r>
-    </w:p>
-    <w:p>
-      <w:pPr>
-        <w:pStyle w:val="BodyText"/>
-      </w:pPr>
-      <w:r>
-        <w:t xml:space="preserve">Subpages/Pena_justa/SEI_35153985_Instrucao_Normativa_75.pdf</w:t>
-      </w:r>
-    </w:p>
-    <w:p>
-      <w:pPr>
-        <w:pStyle w:val="BodyText"/>
-      </w:pPr>
-      <w:r>
-        <w:t xml:space="preserve">Subtítulo:</w:t>
-      </w:r>
-    </w:p>
-    <w:p>
-      <w:pPr>
-        <w:pStyle w:val="BodyText"/>
-      </w:pPr>
-      <w:r>
-        <w:t xml:space="preserve">Rede instituída</w:t>
-      </w:r>
-    </w:p>
-    <w:p>
-      <w:pPr>
-        <w:pStyle w:val="BodyText"/>
-      </w:pPr>
-      <w:r>
-        <w:t xml:space="preserve">Título:</w:t>
-      </w:r>
-    </w:p>
-    <w:p>
-      <w:pPr>
-        <w:pStyle w:val="BodyText"/>
-      </w:pPr>
-      <w:r>
-        <w:t xml:space="preserve">Portaria nº 549/2026</w:t>
-      </w:r>
-    </w:p>
-    <w:p>
-      <w:pPr>
-        <w:pStyle w:val="BodyText"/>
-      </w:pPr>
-      <w:r>
-        <w:t xml:space="preserve">Texto para colar:</w:t>
-      </w:r>
-    </w:p>
-    <w:p>
-      <w:pPr>
-        <w:pStyle w:val="BodyText"/>
-      </w:pPr>
-      <w:r>
-        <w:t xml:space="preserve">Institui a Rede Nacional de Ouvidorias de Serviços Penais - Renospen, como instância permanente de cooperação técnica, intercâmbio de informações e fortalecimento institucional das ouvidorias no sistema penal.</w:t>
-      </w:r>
-    </w:p>
-    <w:p>
-      <w:pPr>
-        <w:pStyle w:val="BodyText"/>
-      </w:pPr>
-      <w:r>
-        <w:t xml:space="preserve">Link:</w:t>
-      </w:r>
-    </w:p>
-    <w:p>
-      <w:pPr>
-        <w:pStyle w:val="BodyText"/>
-      </w:pPr>
-      <w:r>
-        <w:t xml:space="preserve">Acessar a Portaria (PDF)</w:t>
-      </w:r>
-    </w:p>
-    <w:p>
-      <w:pPr>
-        <w:pStyle w:val="BodyText"/>
-      </w:pPr>
-      <w:r>
-        <w:t xml:space="preserve">Arquivo:</w:t>
-      </w:r>
-    </w:p>
-    <w:p>
-      <w:pPr>
-        <w:pStyle w:val="BodyText"/>
-      </w:pPr>
-      <w:r>
-        <w:t xml:space="preserve">Subpages/Pena_justa/SEI_35032761_Portaria_549.pdf</w:t>
-      </w:r>
-    </w:p>
-    <w:p>
-      <w:pPr>
-        <w:pStyle w:val="BodyText"/>
-      </w:pPr>
-      <w:r>
-        <w:t xml:space="preserve">Seção:</w:t>
-      </w:r>
-    </w:p>
-    <w:p>
-      <w:pPr>
-        <w:pStyle w:val="BodyText"/>
-      </w:pPr>
-      <w:r>
-        <w:t xml:space="preserve">Documentos públicos de referência</w:t>
-      </w:r>
-    </w:p>
-    <w:p>
-      <w:pPr>
-        <w:pStyle w:val="BodyText"/>
-      </w:pPr>
-      <w:r>
-        <w:t xml:space="preserve">Links:</w:t>
+        <w:t xml:space="preserve">Quadro de apoio a inserir logo abaixo da lista de eixos:</w:t>
       </w:r>
     </w:p>
     <w:p>
@@ -5513,7 +5265,16 @@
         </w:numPr>
       </w:pPr>
       <w:r>
-        <w:t xml:space="preserve">Plano Nacional Pena Justa (PDF): Subpages/Pena_justa/Plano_Nacional_Pena_Justa.pdf</w:t>
+        <w:t xml:space="preserve">Imagem:</w:t>
+      </w:r>
+      <w:r>
+        <w:t xml:space="preserve"> </w:t>
+      </w:r>
+      <w:r>
+        <w:rPr>
+          <w:rStyle w:val="VerbatimChar"/>
+        </w:rPr>
+        <w:t xml:space="preserve">Documentação/Plano_pena_justa.png</w:t>
       </w:r>
     </w:p>
     <w:p>
@@ -5525,17 +5286,19 @@
         </w:numPr>
       </w:pPr>
       <w:r>
-        <w:t xml:space="preserve">10 coisas que você precisa saber sobre o Pena Justa (PDF): Subpages/Pena_justa/10_Coisas_que_você_precisa_saber_sobre_o_Pena_Justa.pdf</w:t>
-      </w:r>
-    </w:p>
-    <w:bookmarkEnd w:id="31"/>
-    <w:bookmarkStart w:id="32" w:name="X9010218d04cc9bed3b5085cf6721dd78b5ea4ec"/>
-    <w:p>
-      <w:pPr>
-        <w:pStyle w:val="Heading2"/>
-      </w:pPr>
-      <w:r>
-        <w:t xml:space="preserve">Subpágina 4 - Revista Brasileira de Execução Penal</w:t>
+        <w:t xml:space="preserve">Texto de apoio acima da imagem: O quadro abaixo sintetiza medidas, metas e atores estratégicos dos eixos 2 e 4 com incidência direta sobre transparência, escuta institucional, canais de denúncia e fortalecimento das ouvidorias no sistema penal.</w:t>
+      </w:r>
+    </w:p>
+    <w:p>
+      <w:pPr>
+        <w:pStyle w:val="Compact"/>
+        <w:numPr>
+          <w:ilvl w:val="0"/>
+          <w:numId w:val="1019"/>
+        </w:numPr>
+      </w:pPr>
+      <w:r>
+        <w:t xml:space="preserve">Texto de apoio abaixo da imagem: No recorte de interesse da Onasp, o quadro destaca especialmente medidas voltadas à qualificação dos serviços prestados nas prisões, à institucionalização de canais efetivos de denúncia, à criação e estruturação de ouvidorias estaduais e ao fortalecimento de políticas de não repetição.</w:t>
       </w:r>
     </w:p>
     <w:p>
@@ -5543,86 +5306,6 @@
         <w:pStyle w:val="FirstParagraph"/>
       </w:pPr>
       <w:r>
-        <w:t xml:space="preserve">Título da página:</w:t>
-      </w:r>
-    </w:p>
-    <w:p>
-      <w:pPr>
-        <w:pStyle w:val="BodyText"/>
-      </w:pPr>
-      <w:r>
-        <w:t xml:space="preserve">Revista Brasileira de Execução Penal</w:t>
-      </w:r>
-    </w:p>
-    <w:p>
-      <w:pPr>
-        <w:pStyle w:val="BodyText"/>
-      </w:pPr>
-      <w:r>
-        <w:t xml:space="preserve">Imagem de destaque:</w:t>
-      </w:r>
-    </w:p>
-    <w:p>
-      <w:pPr>
-        <w:pStyle w:val="BodyText"/>
-      </w:pPr>
-      <w:r>
-        <w:t xml:space="preserve">Documentação/Botao_RevistaBrasileira.png</w:t>
-      </w:r>
-    </w:p>
-    <w:p>
-      <w:pPr>
-        <w:pStyle w:val="BodyText"/>
-      </w:pPr>
-      <w:r>
-        <w:t xml:space="preserve">Texto alternativo sugerido:</w:t>
-      </w:r>
-    </w:p>
-    <w:p>
-      <w:pPr>
-        <w:pStyle w:val="BodyText"/>
-      </w:pPr>
-      <w:r>
-        <w:t xml:space="preserve">Botão institucional da Revista Brasileira de Execução Penal.</w:t>
-      </w:r>
-    </w:p>
-    <w:p>
-      <w:pPr>
-        <w:pStyle w:val="BodyText"/>
-      </w:pPr>
-      <w:r>
-        <w:t xml:space="preserve">Identificador editorial:</w:t>
-      </w:r>
-    </w:p>
-    <w:p>
-      <w:pPr>
-        <w:pStyle w:val="BodyText"/>
-      </w:pPr>
-      <w:r>
-        <w:t xml:space="preserve">Conteúdo Técnico e Projetos Estruturantes</w:t>
-      </w:r>
-    </w:p>
-    <w:p>
-      <w:pPr>
-        <w:pStyle w:val="BodyText"/>
-      </w:pPr>
-      <w:r>
-        <w:t xml:space="preserve">Texto de destaque:</w:t>
-      </w:r>
-    </w:p>
-    <w:p>
-      <w:pPr>
-        <w:pStyle w:val="BodyText"/>
-      </w:pPr>
-      <w:r>
-        <w:t xml:space="preserve">Em articulação com a Espen e a DCOM, esta subpágina reúne referências da Revista Brasileira de Execução Penal e destaca dossiês, notícias editoriais e conteúdos com interface com participação social, transparência e direitos no sistema penal.</w:t>
-      </w:r>
-    </w:p>
-    <w:p>
-      <w:pPr>
-        <w:pStyle w:val="BodyText"/>
-      </w:pPr>
-      <w:r>
         <w:t xml:space="preserve">Seção:</w:t>
       </w:r>
     </w:p>
@@ -5631,7 +5314,7 @@
         <w:pStyle w:val="BodyText"/>
       </w:pPr>
       <w:r>
-        <w:t xml:space="preserve">A Revista</w:t>
+        <w:t xml:space="preserve">Governança e acompanhamento</w:t>
       </w:r>
     </w:p>
     <w:p>
@@ -5647,23 +5330,15 @@
         <w:pStyle w:val="BodyText"/>
       </w:pPr>
       <w:r>
-        <w:t xml:space="preserve">A Revista Brasileira de Execução Penal é o periódico técnico-científico da Secretaria Nacional de Políticas Penais (Senappen/MJSP) e constitui espaço de circulação de artigos, documentos inéditos, entrevistas, relatos de experiência e boas práticas relacionados à execução penal.</w:t>
-      </w:r>
-    </w:p>
-    <w:p>
-      <w:pPr>
-        <w:pStyle w:val="BodyText"/>
-      </w:pPr>
-      <w:r>
-        <w:t xml:space="preserve">A segunda linha do escopo:</w:t>
-      </w:r>
-    </w:p>
-    <w:p>
-      <w:pPr>
-        <w:pStyle w:val="BodyText"/>
-      </w:pPr>
-      <w:r>
-        <w:t xml:space="preserve">No contexto da Ouvidoria, a publicação contribui para aproximar produção técnica, debate qualificado e controle social, reforçando o papel da Ouvidoria como ponte entre Estado e sociedade.</w:t>
+        <w:t xml:space="preserve">No recorte da Ouvidoria Nacional de Serviços Penais, o acompanhamento do Pena Justa prioriza instrumentos que fortaleçam a escuta qualificada, a transparência ativa e a coordenação entre as ouvidorias dos serviços penais.</w:t>
+      </w:r>
+    </w:p>
+    <w:p>
+      <w:pPr>
+        <w:pStyle w:val="BodyText"/>
+      </w:pPr>
+      <w:r>
+        <w:t xml:space="preserve">Esse recorte se materializa por meio de marcos normativos e de cooperação técnica que estruturam parâmetros mínimos de atuação, incentivam integração preferencial ao Fala.BR e consolidam uma rede permanente de intercâmbio entre União, Estados e Distrito Federal.</w:t>
       </w:r>
     </w:p>
     <w:p>
@@ -5679,7 +5354,7 @@
         <w:pStyle w:val="BodyText"/>
       </w:pPr>
       <w:r>
-        <w:t xml:space="preserve">Sobre a revista</w:t>
+        <w:t xml:space="preserve">Entregas já formalizadas</w:t>
       </w:r>
     </w:p>
     <w:p>
@@ -5695,23 +5370,167 @@
         <w:pStyle w:val="BodyText"/>
       </w:pPr>
       <w:r>
-        <w:t xml:space="preserve">A RBEP publica artigos, documentos inéditos, entrevistas, relatos de experiência e descrição de boas práticas que relacionam a experiência profissional, o conhecimento produzido sobre a matéria e o cumprimento da legislação nacional.</w:t>
-      </w:r>
-    </w:p>
-    <w:p>
-      <w:pPr>
-        <w:pStyle w:val="BodyText"/>
-      </w:pPr>
-      <w:r>
-        <w:t xml:space="preserve">A segunda linha da seção:</w:t>
-      </w:r>
-    </w:p>
-    <w:p>
-      <w:pPr>
-        <w:pStyle w:val="BodyText"/>
-      </w:pPr>
-      <w:r>
-        <w:t xml:space="preserve">Os conteúdos são organizados em dossiês temáticos semestrais, e a revista recebeu qualificação A4 na classificação de periódicos Qualis Capes na avaliação do quadriênio 2021-2024.</w:t>
+        <w:t xml:space="preserve">No campo das ouvidorias e da participação social, o Pena Justa já reúne marcos normativos que podem ser destacados nesta página:</w:t>
+      </w:r>
+    </w:p>
+    <w:p>
+      <w:pPr>
+        <w:pStyle w:val="BodyText"/>
+      </w:pPr>
+      <w:r>
+        <w:t xml:space="preserve">Subtítulo:</w:t>
+      </w:r>
+    </w:p>
+    <w:p>
+      <w:pPr>
+        <w:pStyle w:val="BodyText"/>
+      </w:pPr>
+      <w:r>
+        <w:t xml:space="preserve">Normativo publicado</w:t>
+      </w:r>
+    </w:p>
+    <w:p>
+      <w:pPr>
+        <w:pStyle w:val="BodyText"/>
+      </w:pPr>
+      <w:r>
+        <w:t xml:space="preserve">Título:</w:t>
+      </w:r>
+    </w:p>
+    <w:p>
+      <w:pPr>
+        <w:pStyle w:val="BodyText"/>
+      </w:pPr>
+      <w:r>
+        <w:t xml:space="preserve">Instrução Normativa nº 75/2026</w:t>
+      </w:r>
+    </w:p>
+    <w:p>
+      <w:pPr>
+        <w:pStyle w:val="BodyText"/>
+      </w:pPr>
+      <w:r>
+        <w:t xml:space="preserve">Texto para colar:</w:t>
+      </w:r>
+    </w:p>
+    <w:p>
+      <w:pPr>
+        <w:pStyle w:val="BodyText"/>
+      </w:pPr>
+      <w:r>
+        <w:t xml:space="preserve">Estabelece parâmetros mínimos para a criação e a estruturação de Ouvidorias de Serviços Penais nos Estados e no Distrito Federal, com diretrizes de autonomia, transparência, acessibilidade e integração preferencial ao Fala.BR.</w:t>
+      </w:r>
+    </w:p>
+    <w:p>
+      <w:pPr>
+        <w:pStyle w:val="BodyText"/>
+      </w:pPr>
+      <w:r>
+        <w:t xml:space="preserve">Link:</w:t>
+      </w:r>
+    </w:p>
+    <w:p>
+      <w:pPr>
+        <w:pStyle w:val="BodyText"/>
+      </w:pPr>
+      <w:r>
+        <w:t xml:space="preserve">Acessar a Instrução Normativa (PDF)</w:t>
+      </w:r>
+    </w:p>
+    <w:p>
+      <w:pPr>
+        <w:pStyle w:val="BodyText"/>
+      </w:pPr>
+      <w:r>
+        <w:t xml:space="preserve">Arquivo:</w:t>
+      </w:r>
+    </w:p>
+    <w:p>
+      <w:pPr>
+        <w:pStyle w:val="BodyText"/>
+      </w:pPr>
+      <w:r>
+        <w:t xml:space="preserve">Subpages/Pena_justa/SEI_35153985_Instrucao_Normativa_75.pdf</w:t>
+      </w:r>
+    </w:p>
+    <w:p>
+      <w:pPr>
+        <w:pStyle w:val="BodyText"/>
+      </w:pPr>
+      <w:r>
+        <w:t xml:space="preserve">Subtítulo:</w:t>
+      </w:r>
+    </w:p>
+    <w:p>
+      <w:pPr>
+        <w:pStyle w:val="BodyText"/>
+      </w:pPr>
+      <w:r>
+        <w:t xml:space="preserve">Rede instituída</w:t>
+      </w:r>
+    </w:p>
+    <w:p>
+      <w:pPr>
+        <w:pStyle w:val="BodyText"/>
+      </w:pPr>
+      <w:r>
+        <w:t xml:space="preserve">Título:</w:t>
+      </w:r>
+    </w:p>
+    <w:p>
+      <w:pPr>
+        <w:pStyle w:val="BodyText"/>
+      </w:pPr>
+      <w:r>
+        <w:t xml:space="preserve">Portaria nº 549/2026</w:t>
+      </w:r>
+    </w:p>
+    <w:p>
+      <w:pPr>
+        <w:pStyle w:val="BodyText"/>
+      </w:pPr>
+      <w:r>
+        <w:t xml:space="preserve">Texto para colar:</w:t>
+      </w:r>
+    </w:p>
+    <w:p>
+      <w:pPr>
+        <w:pStyle w:val="BodyText"/>
+      </w:pPr>
+      <w:r>
+        <w:t xml:space="preserve">Institui a Rede Nacional de Ouvidorias de Serviços Penais - Renospen, como instância permanente de cooperação técnica, intercâmbio de informações e fortalecimento institucional das ouvidorias no sistema penal.</w:t>
+      </w:r>
+    </w:p>
+    <w:p>
+      <w:pPr>
+        <w:pStyle w:val="BodyText"/>
+      </w:pPr>
+      <w:r>
+        <w:t xml:space="preserve">Link:</w:t>
+      </w:r>
+    </w:p>
+    <w:p>
+      <w:pPr>
+        <w:pStyle w:val="BodyText"/>
+      </w:pPr>
+      <w:r>
+        <w:t xml:space="preserve">Acessar a Portaria (PDF)</w:t>
+      </w:r>
+    </w:p>
+    <w:p>
+      <w:pPr>
+        <w:pStyle w:val="BodyText"/>
+      </w:pPr>
+      <w:r>
+        <w:t xml:space="preserve">Arquivo:</w:t>
+      </w:r>
+    </w:p>
+    <w:p>
+      <w:pPr>
+        <w:pStyle w:val="BodyText"/>
+      </w:pPr>
+      <w:r>
+        <w:t xml:space="preserve">Subpages/Pena_justa/SEI_35032761_Portaria_549.pdf</w:t>
       </w:r>
     </w:p>
     <w:p>
@@ -5727,23 +5546,7 @@
         <w:pStyle w:val="BodyText"/>
       </w:pPr>
       <w:r>
-        <w:t xml:space="preserve">Acesso oficial à RBEP</w:t>
-      </w:r>
-    </w:p>
-    <w:p>
-      <w:pPr>
-        <w:pStyle w:val="BodyText"/>
-      </w:pPr>
-      <w:r>
-        <w:t xml:space="preserve">Texto para colar:</w:t>
-      </w:r>
-    </w:p>
-    <w:p>
-      <w:pPr>
-        <w:pStyle w:val="BodyText"/>
-      </w:pPr>
-      <w:r>
-        <w:t xml:space="preserve">O portal oficial da revista reúne notícias, edição atual, arquivo de edições e informações para submissão de textos.</w:t>
+        <w:t xml:space="preserve">Documentos públicos de referência</w:t>
       </w:r>
     </w:p>
     <w:p>
@@ -5763,7 +5566,7 @@
         </w:numPr>
       </w:pPr>
       <w:r>
-        <w:t xml:space="preserve">Portal oficial da Revista Brasileira de Execução Penal: https://rbepsenappen.mj.gov.br/index.php/RBEP/pt_BR</w:t>
+        <w:t xml:space="preserve">Plano Nacional Pena Justa (PDF): Subpages/Pena_justa/Plano_Nacional_Pena_Justa.pdf</w:t>
       </w:r>
     </w:p>
     <w:p>
@@ -5775,31 +5578,17 @@
         </w:numPr>
       </w:pPr>
       <w:r>
-        <w:t xml:space="preserve">Edição atual - edição completa: https://rbepsenappen.mj.gov.br/index.php/RBEP/pt_BR/issue/view/22/58</w:t>
-      </w:r>
-    </w:p>
-    <w:p>
-      <w:pPr>
-        <w:pStyle w:val="Compact"/>
-        <w:numPr>
-          <w:ilvl w:val="0"/>
-          <w:numId w:val="1020"/>
-        </w:numPr>
-      </w:pPr>
-      <w:r>
-        <w:t xml:space="preserve">Ver todas as edições: https://rbepsenappen.mj.gov.br/index.php/RBEP/pt_BR/issue/archive</w:t>
-      </w:r>
-    </w:p>
-    <w:p>
-      <w:pPr>
-        <w:pStyle w:val="Compact"/>
-        <w:numPr>
-          <w:ilvl w:val="0"/>
-          <w:numId w:val="1020"/>
-        </w:numPr>
-      </w:pPr>
-      <w:r>
-        <w:t xml:space="preserve">Enviar submissão: https://rbepsenappen.mj.gov.br/index.php/RBEP/pt_BR/about/submissions</w:t>
+        <w:t xml:space="preserve">10 coisas que você precisa saber sobre o Pena Justa (PDF): Subpages/Pena_justa/10_Coisas_que_você_precisa_saber_sobre_o_Pena_Justa.pdf</w:t>
+      </w:r>
+    </w:p>
+    <w:bookmarkEnd w:id="31"/>
+    <w:bookmarkStart w:id="32" w:name="X9010218d04cc9bed3b5085cf6721dd78b5ea4ec"/>
+    <w:p>
+      <w:pPr>
+        <w:pStyle w:val="Heading2"/>
+      </w:pPr>
+      <w:r>
+        <w:t xml:space="preserve">Subpágina 4 - Revista Brasileira de Execução Penal</w:t>
       </w:r>
     </w:p>
     <w:p>
@@ -5807,6 +5596,86 @@
         <w:pStyle w:val="FirstParagraph"/>
       </w:pPr>
       <w:r>
+        <w:t xml:space="preserve">Título da página:</w:t>
+      </w:r>
+    </w:p>
+    <w:p>
+      <w:pPr>
+        <w:pStyle w:val="BodyText"/>
+      </w:pPr>
+      <w:r>
+        <w:t xml:space="preserve">Revista Brasileira de Execução Penal</w:t>
+      </w:r>
+    </w:p>
+    <w:p>
+      <w:pPr>
+        <w:pStyle w:val="BodyText"/>
+      </w:pPr>
+      <w:r>
+        <w:t xml:space="preserve">Imagem de destaque:</w:t>
+      </w:r>
+    </w:p>
+    <w:p>
+      <w:pPr>
+        <w:pStyle w:val="BodyText"/>
+      </w:pPr>
+      <w:r>
+        <w:t xml:space="preserve">Documentação/Botao_RevistaBrasileira.png</w:t>
+      </w:r>
+    </w:p>
+    <w:p>
+      <w:pPr>
+        <w:pStyle w:val="BodyText"/>
+      </w:pPr>
+      <w:r>
+        <w:t xml:space="preserve">Texto alternativo sugerido:</w:t>
+      </w:r>
+    </w:p>
+    <w:p>
+      <w:pPr>
+        <w:pStyle w:val="BodyText"/>
+      </w:pPr>
+      <w:r>
+        <w:t xml:space="preserve">Botão institucional da Revista Brasileira de Execução Penal.</w:t>
+      </w:r>
+    </w:p>
+    <w:p>
+      <w:pPr>
+        <w:pStyle w:val="BodyText"/>
+      </w:pPr>
+      <w:r>
+        <w:t xml:space="preserve">Identificador editorial:</w:t>
+      </w:r>
+    </w:p>
+    <w:p>
+      <w:pPr>
+        <w:pStyle w:val="BodyText"/>
+      </w:pPr>
+      <w:r>
+        <w:t xml:space="preserve">Conteúdo Técnico e Projetos Estruturantes</w:t>
+      </w:r>
+    </w:p>
+    <w:p>
+      <w:pPr>
+        <w:pStyle w:val="BodyText"/>
+      </w:pPr>
+      <w:r>
+        <w:t xml:space="preserve">Texto de destaque:</w:t>
+      </w:r>
+    </w:p>
+    <w:p>
+      <w:pPr>
+        <w:pStyle w:val="BodyText"/>
+      </w:pPr>
+      <w:r>
+        <w:t xml:space="preserve">Em articulação com a Espen e a DCOM, esta subpágina reúne referências da Revista Brasileira de Execução Penal e destaca dossiês, notícias editoriais e conteúdos com interface com participação social, transparência e direitos no sistema penal.</w:t>
+      </w:r>
+    </w:p>
+    <w:p>
+      <w:pPr>
+        <w:pStyle w:val="BodyText"/>
+      </w:pPr>
+      <w:r>
         <w:t xml:space="preserve">Seção:</w:t>
       </w:r>
     </w:p>
@@ -5815,15 +5684,127 @@
         <w:pStyle w:val="BodyText"/>
       </w:pPr>
       <w:r>
-        <w:t xml:space="preserve">Referências institucionais</w:t>
-      </w:r>
-    </w:p>
-    <w:p>
-      <w:pPr>
-        <w:pStyle w:val="BodyText"/>
-      </w:pPr>
-      <w:r>
-        <w:t xml:space="preserve">Itens para colar:</w:t>
+        <w:t xml:space="preserve">A Revista</w:t>
+      </w:r>
+    </w:p>
+    <w:p>
+      <w:pPr>
+        <w:pStyle w:val="BodyText"/>
+      </w:pPr>
+      <w:r>
+        <w:t xml:space="preserve">Texto para colar:</w:t>
+      </w:r>
+    </w:p>
+    <w:p>
+      <w:pPr>
+        <w:pStyle w:val="BodyText"/>
+      </w:pPr>
+      <w:r>
+        <w:t xml:space="preserve">A Revista Brasileira de Execução Penal é o periódico técnico-científico da Secretaria Nacional de Políticas Penais (Senappen/MJSP) e constitui espaço de circulação de artigos, documentos inéditos, entrevistas, relatos de experiência e boas práticas relacionados à execução penal.</w:t>
+      </w:r>
+    </w:p>
+    <w:p>
+      <w:pPr>
+        <w:pStyle w:val="BodyText"/>
+      </w:pPr>
+      <w:r>
+        <w:t xml:space="preserve">A segunda linha do escopo:</w:t>
+      </w:r>
+    </w:p>
+    <w:p>
+      <w:pPr>
+        <w:pStyle w:val="BodyText"/>
+      </w:pPr>
+      <w:r>
+        <w:t xml:space="preserve">No contexto da Ouvidoria, a publicação contribui para aproximar produção técnica, debate qualificado e controle social, reforçando o papel da Ouvidoria como ponte entre Estado e sociedade.</w:t>
+      </w:r>
+    </w:p>
+    <w:p>
+      <w:pPr>
+        <w:pStyle w:val="BodyText"/>
+      </w:pPr>
+      <w:r>
+        <w:t xml:space="preserve">Seção:</w:t>
+      </w:r>
+    </w:p>
+    <w:p>
+      <w:pPr>
+        <w:pStyle w:val="BodyText"/>
+      </w:pPr>
+      <w:r>
+        <w:t xml:space="preserve">Sobre a revista</w:t>
+      </w:r>
+    </w:p>
+    <w:p>
+      <w:pPr>
+        <w:pStyle w:val="BodyText"/>
+      </w:pPr>
+      <w:r>
+        <w:t xml:space="preserve">Texto para colar:</w:t>
+      </w:r>
+    </w:p>
+    <w:p>
+      <w:pPr>
+        <w:pStyle w:val="BodyText"/>
+      </w:pPr>
+      <w:r>
+        <w:t xml:space="preserve">A RBEP publica artigos, documentos inéditos, entrevistas, relatos de experiência e descrição de boas práticas que relacionam a experiência profissional, o conhecimento produzido sobre a matéria e o cumprimento da legislação nacional.</w:t>
+      </w:r>
+    </w:p>
+    <w:p>
+      <w:pPr>
+        <w:pStyle w:val="BodyText"/>
+      </w:pPr>
+      <w:r>
+        <w:t xml:space="preserve">A segunda linha da seção:</w:t>
+      </w:r>
+    </w:p>
+    <w:p>
+      <w:pPr>
+        <w:pStyle w:val="BodyText"/>
+      </w:pPr>
+      <w:r>
+        <w:t xml:space="preserve">Os conteúdos são organizados em dossiês temáticos semestrais, e a revista recebeu qualificação A4 na classificação de periódicos Qualis Capes na avaliação do quadriênio 2021-2024.</w:t>
+      </w:r>
+    </w:p>
+    <w:p>
+      <w:pPr>
+        <w:pStyle w:val="BodyText"/>
+      </w:pPr>
+      <w:r>
+        <w:t xml:space="preserve">Seção:</w:t>
+      </w:r>
+    </w:p>
+    <w:p>
+      <w:pPr>
+        <w:pStyle w:val="BodyText"/>
+      </w:pPr>
+      <w:r>
+        <w:t xml:space="preserve">Acesso oficial à RBEP</w:t>
+      </w:r>
+    </w:p>
+    <w:p>
+      <w:pPr>
+        <w:pStyle w:val="BodyText"/>
+      </w:pPr>
+      <w:r>
+        <w:t xml:space="preserve">Texto para colar:</w:t>
+      </w:r>
+    </w:p>
+    <w:p>
+      <w:pPr>
+        <w:pStyle w:val="BodyText"/>
+      </w:pPr>
+      <w:r>
+        <w:t xml:space="preserve">O portal oficial da revista reúne notícias, edição atual, arquivo de edições e informações para submissão de textos.</w:t>
+      </w:r>
+    </w:p>
+    <w:p>
+      <w:pPr>
+        <w:pStyle w:val="BodyText"/>
+      </w:pPr>
+      <w:r>
+        <w:t xml:space="preserve">Links:</w:t>
       </w:r>
     </w:p>
     <w:p>
@@ -5835,7 +5816,7 @@
         </w:numPr>
       </w:pPr>
       <w:r>
-        <w:t xml:space="preserve">Qualis Capes 2021-2024: A4.</w:t>
+        <w:t xml:space="preserve">Portal oficial da Revista Brasileira de Execução Penal: https://rbepsenappen.mj.gov.br/index.php/RBEP/pt_BR</w:t>
       </w:r>
     </w:p>
     <w:p>
@@ -5847,7 +5828,7 @@
         </w:numPr>
       </w:pPr>
       <w:r>
-        <w:t xml:space="preserve">ISSN: 2675-1895.</w:t>
+        <w:t xml:space="preserve">Edição atual - edição completa: https://rbepsenappen.mj.gov.br/index.php/RBEP/pt_BR/issue/view/22/58</w:t>
       </w:r>
     </w:p>
     <w:p>
@@ -5859,7 +5840,7 @@
         </w:numPr>
       </w:pPr>
       <w:r>
-        <w:t xml:space="preserve">e-ISSN: 2675-1860.</w:t>
+        <w:t xml:space="preserve">Ver todas as edições: https://rbepsenappen.mj.gov.br/index.php/RBEP/pt_BR/issue/archive</w:t>
       </w:r>
     </w:p>
     <w:p>
@@ -5868,6 +5849,78 @@
         <w:numPr>
           <w:ilvl w:val="0"/>
           <w:numId w:val="1021"/>
+        </w:numPr>
+      </w:pPr>
+      <w:r>
+        <w:t xml:space="preserve">Enviar submissão: https://rbepsenappen.mj.gov.br/index.php/RBEP/pt_BR/about/submissions</w:t>
+      </w:r>
+    </w:p>
+    <w:p>
+      <w:pPr>
+        <w:pStyle w:val="FirstParagraph"/>
+      </w:pPr>
+      <w:r>
+        <w:t xml:space="preserve">Seção:</w:t>
+      </w:r>
+    </w:p>
+    <w:p>
+      <w:pPr>
+        <w:pStyle w:val="BodyText"/>
+      </w:pPr>
+      <w:r>
+        <w:t xml:space="preserve">Referências institucionais</w:t>
+      </w:r>
+    </w:p>
+    <w:p>
+      <w:pPr>
+        <w:pStyle w:val="BodyText"/>
+      </w:pPr>
+      <w:r>
+        <w:t xml:space="preserve">Itens para colar:</w:t>
+      </w:r>
+    </w:p>
+    <w:p>
+      <w:pPr>
+        <w:pStyle w:val="Compact"/>
+        <w:numPr>
+          <w:ilvl w:val="0"/>
+          <w:numId w:val="1022"/>
+        </w:numPr>
+      </w:pPr>
+      <w:r>
+        <w:t xml:space="preserve">Qualis Capes 2021-2024: A4.</w:t>
+      </w:r>
+    </w:p>
+    <w:p>
+      <w:pPr>
+        <w:pStyle w:val="Compact"/>
+        <w:numPr>
+          <w:ilvl w:val="0"/>
+          <w:numId w:val="1022"/>
+        </w:numPr>
+      </w:pPr>
+      <w:r>
+        <w:t xml:space="preserve">ISSN: 2675-1895.</w:t>
+      </w:r>
+    </w:p>
+    <w:p>
+      <w:pPr>
+        <w:pStyle w:val="Compact"/>
+        <w:numPr>
+          <w:ilvl w:val="0"/>
+          <w:numId w:val="1022"/>
+        </w:numPr>
+      </w:pPr>
+      <w:r>
+        <w:t xml:space="preserve">e-ISSN: 2675-1860.</w:t>
+      </w:r>
+    </w:p>
+    <w:p>
+      <w:pPr>
+        <w:pStyle w:val="Compact"/>
+        <w:numPr>
+          <w:ilvl w:val="0"/>
+          <w:numId w:val="1022"/>
         </w:numPr>
       </w:pPr>
       <w:r>
@@ -6205,6 +6258,9 @@
     <w:abstractNumId w:val="991"/>
   </w:num>
   <w:num w:numId="1021">
+    <w:abstractNumId w:val="991"/>
+  </w:num>
+  <w:num w:numId="1022">
     <w:abstractNumId w:val="991"/>
   </w:num>
 </w:numbering>

</xml_diff>

<commit_message>
Regenerate page structure docx
</commit_message>
<xml_diff>
--- a/Documentação/estrutura_completa_pagina_onasp_para_dicom.docx
+++ b/Documentação/estrutura_completa_pagina_onasp_para_dicom.docx
@@ -53,7 +53,7 @@
       </w:r>
     </w:p>
     <w:bookmarkEnd w:id="9"/>
-    <w:bookmarkStart w:id="28" w:name="Xbfa4aa77b994200a22daf31aefaeaa021a9038a"/>
+    <w:bookmarkStart w:id="27" w:name="Xbfa4aa77b994200a22daf31aefaeaa021a9038a"/>
     <w:p>
       <w:pPr>
         <w:pStyle w:val="Heading2"/>
@@ -672,7 +672,7 @@
         <w:pStyle w:val="BodyText"/>
       </w:pPr>
       <w:r>
-        <w:t xml:space="preserve">Iniciativa do Plano Pena Justa voltada à cooperação federativa, à harmonização de procedimentos e ao fortalecimento da proteção de direitos no âmbito das Ouvidorias de Serviços Penais.</w:t>
+        <w:t xml:space="preserve">Ação prevista no Plano Pena Justa voltada à cooperação federativa, à harmonização de procedimentos e ao fortalecimento da proteção de direitos no âmbito das Ouvidorias de Serviços Penais.</w:t>
       </w:r>
     </w:p>
     <w:p>
@@ -816,7 +816,7 @@
         <w:pStyle w:val="BodyText"/>
       </w:pPr>
       <w:r>
-        <w:t xml:space="preserve">Ambiente dedicado integralmente ao Plano, que disponibiliza o acesso a cronogramas, documentos técnicos e relatórios de acompanhamento.</w:t>
+        <w:t xml:space="preserve">As ações específicas da Ouvidoria Nacional de Serviços Penais frente ao Plano Pena Justa, com informações gerais, documentos públicos e marcos relacionados ao fortalecimento das ouvidorias no sistema penal.</w:t>
       </w:r>
     </w:p>
     <w:p>
@@ -888,7 +888,7 @@
         <w:pStyle w:val="BodyText"/>
       </w:pPr>
       <w:r>
-        <w:t xml:space="preserve">Em articulação com a Espen e a DCOM, a Onasp reúne referências da Revista Brasileira de Execução Penal, com acesso a dossiês, notícias editoriais e conteúdos relacionados à participação social, transparência e direitos no sistema penal.</w:t>
+        <w:t xml:space="preserve">Dossiê temático voltado ao diálogo entre comunicação social, participação social e os serviços de ouvidorias penais.</w:t>
       </w:r>
     </w:p>
     <w:p>
@@ -921,6 +921,78 @@
       </w:pPr>
       <w:r>
         <w:t xml:space="preserve">Subpágina Revista Brasileira de Execução Penal</w:t>
+      </w:r>
+    </w:p>
+    <w:p>
+      <w:pPr>
+        <w:pStyle w:val="BodyText"/>
+      </w:pPr>
+      <w:r>
+        <w:t xml:space="preserve">Card 5:</w:t>
+      </w:r>
+    </w:p>
+    <w:p>
+      <w:pPr>
+        <w:pStyle w:val="BodyText"/>
+      </w:pPr>
+      <w:r>
+        <w:t xml:space="preserve">Título:</w:t>
+      </w:r>
+    </w:p>
+    <w:p>
+      <w:pPr>
+        <w:pStyle w:val="BodyText"/>
+      </w:pPr>
+      <w:r>
+        <w:t xml:space="preserve">Normativos</w:t>
+      </w:r>
+    </w:p>
+    <w:p>
+      <w:pPr>
+        <w:pStyle w:val="BodyText"/>
+      </w:pPr>
+      <w:r>
+        <w:t xml:space="preserve">Descrição:</w:t>
+      </w:r>
+    </w:p>
+    <w:p>
+      <w:pPr>
+        <w:pStyle w:val="BodyText"/>
+      </w:pPr>
+      <w:r>
+        <w:t xml:space="preserve">Subpágina com os principais marcos legais que orientam a atuação da Ouvidoria Nacional de Serviços Penais, reunindo leis, decretos e portarias de referência em um único acervo.</w:t>
+      </w:r>
+    </w:p>
+    <w:p>
+      <w:pPr>
+        <w:pStyle w:val="BodyText"/>
+      </w:pPr>
+      <w:r>
+        <w:t xml:space="preserve">Imagem:</w:t>
+      </w:r>
+    </w:p>
+    <w:p>
+      <w:pPr>
+        <w:pStyle w:val="BodyText"/>
+      </w:pPr>
+      <w:r>
+        <w:t xml:space="preserve">Documentação/Botao_Normativos.png</w:t>
+      </w:r>
+    </w:p>
+    <w:p>
+      <w:pPr>
+        <w:pStyle w:val="BodyText"/>
+      </w:pPr>
+      <w:r>
+        <w:t xml:space="preserve">Destino:</w:t>
+      </w:r>
+    </w:p>
+    <w:p>
+      <w:pPr>
+        <w:pStyle w:val="BodyText"/>
+      </w:pPr>
+      <w:r>
+        <w:t xml:space="preserve">Subpágina Normativos</w:t>
       </w:r>
     </w:p>
     <w:bookmarkEnd w:id="16"/>
@@ -1174,13 +1246,13 @@
       </w:r>
     </w:p>
     <w:bookmarkEnd w:id="19"/>
-    <w:bookmarkStart w:id="20" w:name="bloco-11---normativos"/>
+    <w:bookmarkStart w:id="26" w:name="bloco-11---notícias-da-ouvidoria"/>
     <w:p>
       <w:pPr>
         <w:pStyle w:val="Heading3"/>
       </w:pPr>
       <w:r>
-        <w:t xml:space="preserve">Bloco 11 - Normativos</w:t>
+        <w:t xml:space="preserve">Bloco 11 - Notícias da Ouvidoria</w:t>
       </w:r>
     </w:p>
     <w:p>
@@ -1196,47 +1268,23 @@
         <w:pStyle w:val="BodyText"/>
       </w:pPr>
       <w:r>
-        <w:t xml:space="preserve">Normativos</w:t>
-      </w:r>
-    </w:p>
-    <w:p>
-      <w:pPr>
-        <w:pStyle w:val="BodyText"/>
-      </w:pPr>
-      <w:r>
-        <w:t xml:space="preserve">Linha de atualização sugerida:</w:t>
-      </w:r>
-    </w:p>
-    <w:p>
-      <w:pPr>
-        <w:pStyle w:val="BodyText"/>
-      </w:pPr>
-      <w:r>
-        <w:t xml:space="preserve">Publicado em 13/05/2026</w:t>
-      </w:r>
-    </w:p>
-    <w:p>
-      <w:pPr>
-        <w:pStyle w:val="BodyText"/>
-      </w:pPr>
-      <w:r>
-        <w:t xml:space="preserve">Atualizado em 13/05/2026</w:t>
-      </w:r>
-    </w:p>
-    <w:p>
-      <w:pPr>
-        <w:pStyle w:val="BodyText"/>
-      </w:pPr>
-      <w:r>
-        <w:t xml:space="preserve">Padrão visual recomendado para publicação:</w:t>
-      </w:r>
-    </w:p>
-    <w:p>
-      <w:pPr>
-        <w:pStyle w:val="BodyText"/>
-      </w:pPr>
-      <w:r>
-        <w:t xml:space="preserve">Apresentar abaixo do painel em tabela editorial inspirada na página</w:t>
+        <w:t xml:space="preserve">Notícias da Ouvidoria</w:t>
+      </w:r>
+    </w:p>
+    <w:p>
+      <w:pPr>
+        <w:pStyle w:val="BodyText"/>
+      </w:pPr>
+      <w:r>
+        <w:t xml:space="preserve">Posicionamento na página:</w:t>
+      </w:r>
+    </w:p>
+    <w:p>
+      <w:pPr>
+        <w:pStyle w:val="BodyText"/>
+      </w:pPr>
+      <w:r>
+        <w:t xml:space="preserve">Último bloco da homepage, abaixo do</w:t>
       </w:r>
       <w:r>
         <w:t xml:space="preserve"> </w:t>
@@ -1245,76 +1293,7 @@
         <w:rPr>
           <w:rStyle w:val="VerbatimChar"/>
         </w:rPr>
-        <w:t xml:space="preserve">Normativos</w:t>
-      </w:r>
-      <w:r>
-        <w:t xml:space="preserve"> </w:t>
-      </w:r>
-      <w:r>
-        <w:t xml:space="preserve">da ESPEN, com colunas</w:t>
-      </w:r>
-      <w:r>
-        <w:t xml:space="preserve"> </w:t>
-      </w:r>
-      <w:r>
-        <w:rPr>
-          <w:rStyle w:val="VerbatimChar"/>
-        </w:rPr>
-        <w:t xml:space="preserve">Título</w:t>
-      </w:r>
-      <w:r>
-        <w:t xml:space="preserve">,</w:t>
-      </w:r>
-      <w:r>
-        <w:t xml:space="preserve"> </w:t>
-      </w:r>
-      <w:r>
-        <w:rPr>
-          <w:rStyle w:val="VerbatimChar"/>
-        </w:rPr>
-        <w:t xml:space="preserve">Tipo</w:t>
-      </w:r>
-      <w:r>
-        <w:t xml:space="preserve"> </w:t>
-      </w:r>
-      <w:r>
-        <w:t xml:space="preserve">e</w:t>
-      </w:r>
-      <w:r>
-        <w:t xml:space="preserve"> </w:t>
-      </w:r>
-      <w:r>
-        <w:rPr>
-          <w:rStyle w:val="VerbatimChar"/>
-        </w:rPr>
-        <w:t xml:space="preserve">Descrição</w:t>
-      </w:r>
-      <w:r>
-        <w:t xml:space="preserve">. Para os seis itens abaixo, o campo</w:t>
-      </w:r>
-      <w:r>
-        <w:t xml:space="preserve"> </w:t>
-      </w:r>
-      <w:r>
-        <w:rPr>
-          <w:rStyle w:val="VerbatimChar"/>
-        </w:rPr>
-        <w:t xml:space="preserve">Tipo</w:t>
-      </w:r>
-      <w:r>
-        <w:t xml:space="preserve"> </w:t>
-      </w:r>
-      <w:r>
-        <w:t xml:space="preserve">pode ser publicado como</w:t>
-      </w:r>
-      <w:r>
-        <w:t xml:space="preserve"> </w:t>
-      </w:r>
-      <w:r>
-        <w:rPr>
-          <w:rStyle w:val="VerbatimChar"/>
-        </w:rPr>
-        <w:t xml:space="preserve">Arquivo</w:t>
+        <w:t xml:space="preserve">Painel de Tratamento de Demandas</w:t>
       </w:r>
       <w:r>
         <w:t xml:space="preserve">.</w:t>
@@ -1325,7 +1304,39 @@
         <w:pStyle w:val="BodyText"/>
       </w:pPr>
       <w:r>
-        <w:t xml:space="preserve">Links a publicar:</w:t>
+        <w:t xml:space="preserve">Texto introdutório sugerido:</w:t>
+      </w:r>
+    </w:p>
+    <w:p>
+      <w:pPr>
+        <w:pStyle w:val="BodyText"/>
+      </w:pPr>
+      <w:r>
+        <w:t xml:space="preserve">Curadoria manual com seis notícias do portal da SENAPPEN ligadas à ONASP, à Rede de Ouvidorias e à qualificação dos canais de atendimento ao cidadão.</w:t>
+      </w:r>
+    </w:p>
+    <w:p>
+      <w:pPr>
+        <w:pStyle w:val="BodyText"/>
+      </w:pPr>
+      <w:r>
+        <w:t xml:space="preserve">Padrão visual recomendado para publicação:</w:t>
+      </w:r>
+    </w:p>
+    <w:p>
+      <w:pPr>
+        <w:pStyle w:val="BodyText"/>
+      </w:pPr>
+      <w:r>
+        <w:t xml:space="preserve">No protótipo, apresentar em seis cards editoriais compactos, em grade 3x2 inspirada na vitrine de notícias da ESPEN: imagem no topo, rubrica curta, título clicável, resumo breve e data. Na publicação gov.br, reproduzir com componente nativo equivalente, sem feed dinâmico e sem ícones de compartilhamento.</w:t>
+      </w:r>
+    </w:p>
+    <w:p>
+      <w:pPr>
+        <w:pStyle w:val="BodyText"/>
+      </w:pPr>
+      <w:r>
+        <w:t xml:space="preserve">Lista de notícias sugerida:</w:t>
       </w:r>
     </w:p>
     <w:p>
@@ -1337,214 +1348,12 @@
         </w:numPr>
       </w:pPr>
       <w:r>
-        <w:t xml:space="preserve">Lei nº 13.460, de 26 de junho de 2017: Documentação/Normativas Basilares de Ouvidoria/LEI N°13.460.2017.pdf</w:t>
+        <w:t xml:space="preserve">27/04/2026 -</w:t>
       </w:r>
       <w:r>
         <w:t xml:space="preserve"> </w:t>
       </w:r>
-      <w:r>
-        <w:t xml:space="preserve">Descrição: Dispõe sobre participação, proteção e defesa dos direitos do usuário dos serviços públicos da administração pública.</w:t>
-      </w:r>
-    </w:p>
-    <w:p>
-      <w:pPr>
-        <w:pStyle w:val="Compact"/>
-        <w:numPr>
-          <w:ilvl w:val="0"/>
-          <w:numId w:val="1005"/>
-        </w:numPr>
-      </w:pPr>
-      <w:r>
-        <w:t xml:space="preserve">Decreto nº 9.492, de 5 de setembro de 2018: Documentação/Normativas Basilares de Ouvidoria/Decreto N°9.492.2018.pdf</w:t>
-      </w:r>
-      <w:r>
-        <w:t xml:space="preserve"> </w:t>
-      </w:r>
-      <w:r>
-        <w:t xml:space="preserve">Descrição: Regulamenta a Lei nº 13.460, de 26 de junho de 2017, institui o Sistema de Ouvidoria do Poder Executivo federal e altera o Decreto nº 8.910, de 22 de novembro de 2016.</w:t>
-      </w:r>
-    </w:p>
-    <w:p>
-      <w:pPr>
-        <w:pStyle w:val="Compact"/>
-        <w:numPr>
-          <w:ilvl w:val="0"/>
-          <w:numId w:val="1005"/>
-        </w:numPr>
-      </w:pPr>
-      <w:r>
-        <w:t xml:space="preserve">Decreto nº 10.153, de 3 de dezembro de 2019: Documentação/Normativas Basilares de Ouvidoria/Decreto N°10.153.2019.pdf</w:t>
-      </w:r>
-      <w:r>
-        <w:t xml:space="preserve"> </w:t>
-      </w:r>
-      <w:r>
-        <w:t xml:space="preserve">Descrição: Dispõe sobre as salvaguardas de proteção à identidade dos denunciantes de ilícitos e de irregularidades praticados contra a administração pública federal direta e indireta.</w:t>
-      </w:r>
-    </w:p>
-    <w:p>
-      <w:pPr>
-        <w:pStyle w:val="Compact"/>
-        <w:numPr>
-          <w:ilvl w:val="0"/>
-          <w:numId w:val="1005"/>
-        </w:numPr>
-      </w:pPr>
-      <w:r>
-        <w:t xml:space="preserve">Portaria Normativa CGU nº 116, de 18 de março de 2024: Documentação/Normativas Basilares de Ouvidoria/Portaria Normativa CGU - N°116.2024.pdf</w:t>
-      </w:r>
-      <w:r>
-        <w:t xml:space="preserve"> </w:t>
-      </w:r>
-      <w:r>
-        <w:t xml:space="preserve">Descrição: Estabelece orientações para o exercício das competências das unidades do Sistema de Ouvidoria do Poder Executivo Federal, instituído pelo Decreto nº 9.492, de 5 de setembro de 2018, no âmbito do Poder Executivo federal, e dá outras providências.</w:t>
-      </w:r>
-    </w:p>
-    <w:p>
-      <w:pPr>
-        <w:pStyle w:val="Compact"/>
-        <w:numPr>
-          <w:ilvl w:val="0"/>
-          <w:numId w:val="1005"/>
-        </w:numPr>
-      </w:pPr>
-      <w:r>
-        <w:t xml:space="preserve">Lei nº 12.527, de 18 de novembro de 2011: Documentação/Normativas Basilares de Ouvidoria/LEI N°12.527.2011.pdf</w:t>
-      </w:r>
-      <w:r>
-        <w:t xml:space="preserve"> </w:t>
-      </w:r>
-      <w:r>
-        <w:t xml:space="preserve">Descrição: Regula o acesso a informações previsto no inciso XXXIII do art. 5º, no inciso II do § 3º do art. 37 e no § 2º do art. 216 da Constituição Federal.</w:t>
-      </w:r>
-    </w:p>
-    <w:p>
-      <w:pPr>
-        <w:pStyle w:val="Compact"/>
-        <w:numPr>
-          <w:ilvl w:val="0"/>
-          <w:numId w:val="1005"/>
-        </w:numPr>
-      </w:pPr>
-      <w:r>
-        <w:t xml:space="preserve">Lei nº 13.709, de 14 de agosto de 2018: Documentação/Normativas Basilares de Ouvidoria/LEI N°13.709.2018.pdf</w:t>
-      </w:r>
-      <w:r>
-        <w:t xml:space="preserve"> </w:t>
-      </w:r>
-      <w:r>
-        <w:t xml:space="preserve">Descrição: Dispõe sobre a proteção de dados pessoais e altera a Lei nº 12.965, de 23 de abril de 2014 (Marco Civil da Internet).</w:t>
-      </w:r>
-    </w:p>
-    <w:bookmarkEnd w:id="20"/>
-    <w:bookmarkStart w:id="27" w:name="bloco-12---notícias-da-ouvidoria"/>
-    <w:p>
-      <w:pPr>
-        <w:pStyle w:val="Heading3"/>
-      </w:pPr>
-      <w:r>
-        <w:t xml:space="preserve">Bloco 12 - Notícias da Ouvidoria</w:t>
-      </w:r>
-    </w:p>
-    <w:p>
-      <w:pPr>
-        <w:pStyle w:val="FirstParagraph"/>
-      </w:pPr>
-      <w:r>
-        <w:t xml:space="preserve">Título da seção:</w:t>
-      </w:r>
-    </w:p>
-    <w:p>
-      <w:pPr>
-        <w:pStyle w:val="BodyText"/>
-      </w:pPr>
-      <w:r>
-        <w:t xml:space="preserve">Notícias da Ouvidoria</w:t>
-      </w:r>
-    </w:p>
-    <w:p>
-      <w:pPr>
-        <w:pStyle w:val="BodyText"/>
-      </w:pPr>
-      <w:r>
-        <w:t xml:space="preserve">Posicionamento na página:</w:t>
-      </w:r>
-    </w:p>
-    <w:p>
-      <w:pPr>
-        <w:pStyle w:val="BodyText"/>
-      </w:pPr>
-      <w:r>
-        <w:t xml:space="preserve">Último bloco da homepage, abaixo de</w:t>
-      </w:r>
-      <w:r>
-        <w:t xml:space="preserve"> </w:t>
-      </w:r>
-      <w:r>
-        <w:rPr>
-          <w:rStyle w:val="VerbatimChar"/>
-        </w:rPr>
-        <w:t xml:space="preserve">Normativos</w:t>
-      </w:r>
-      <w:r>
-        <w:t xml:space="preserve">.</w:t>
-      </w:r>
-    </w:p>
-    <w:p>
-      <w:pPr>
-        <w:pStyle w:val="BodyText"/>
-      </w:pPr>
-      <w:r>
-        <w:t xml:space="preserve">Texto introdutório sugerido:</w:t>
-      </w:r>
-    </w:p>
-    <w:p>
-      <w:pPr>
-        <w:pStyle w:val="BodyText"/>
-      </w:pPr>
-      <w:r>
-        <w:t xml:space="preserve">Curadoria manual com seis notícias do portal da SENAPPEN ligadas à ONASP, à Rede de Ouvidorias e à qualificação dos canais de atendimento ao cidadão.</w:t>
-      </w:r>
-    </w:p>
-    <w:p>
-      <w:pPr>
-        <w:pStyle w:val="BodyText"/>
-      </w:pPr>
-      <w:r>
-        <w:t xml:space="preserve">Padrão visual recomendado para publicação:</w:t>
-      </w:r>
-    </w:p>
-    <w:p>
-      <w:pPr>
-        <w:pStyle w:val="BodyText"/>
-      </w:pPr>
-      <w:r>
-        <w:t xml:space="preserve">No protótipo, apresentar em seis cards editoriais compactos, em grade 3x2 inspirada na vitrine de notícias da ESPEN: imagem no topo, rubrica curta, título clicável, resumo breve e data. Na publicação gov.br, reproduzir com componente nativo equivalente, sem feed dinâmico e sem ícones de compartilhamento.</w:t>
-      </w:r>
-    </w:p>
-    <w:p>
-      <w:pPr>
-        <w:pStyle w:val="BodyText"/>
-      </w:pPr>
-      <w:r>
-        <w:t xml:space="preserve">Lista de notícias sugerida:</w:t>
-      </w:r>
-    </w:p>
-    <w:p>
-      <w:pPr>
-        <w:pStyle w:val="Compact"/>
-        <w:numPr>
-          <w:ilvl w:val="0"/>
-          <w:numId w:val="1006"/>
-        </w:numPr>
-      </w:pPr>
-      <w:r>
-        <w:t xml:space="preserve">27/04/2026 -</w:t>
-      </w:r>
-      <w:r>
-        <w:t xml:space="preserve"> </w:t>
-      </w:r>
-      <w:hyperlink r:id="rId21">
+      <w:hyperlink r:id="rId20">
         <w:r>
           <w:rPr>
             <w:rStyle w:val="Hyperlink"/>
@@ -1564,7 +1373,7 @@
         <w:pStyle w:val="Compact"/>
         <w:numPr>
           <w:ilvl w:val="0"/>
-          <w:numId w:val="1006"/>
+          <w:numId w:val="1005"/>
         </w:numPr>
       </w:pPr>
       <w:r>
@@ -1573,7 +1382,7 @@
       <w:r>
         <w:t xml:space="preserve"> </w:t>
       </w:r>
-      <w:hyperlink r:id="rId22">
+      <w:hyperlink r:id="rId21">
         <w:r>
           <w:rPr>
             <w:rStyle w:val="Hyperlink"/>
@@ -1593,7 +1402,7 @@
         <w:pStyle w:val="Compact"/>
         <w:numPr>
           <w:ilvl w:val="0"/>
-          <w:numId w:val="1006"/>
+          <w:numId w:val="1005"/>
         </w:numPr>
       </w:pPr>
       <w:r>
@@ -1602,7 +1411,7 @@
       <w:r>
         <w:t xml:space="preserve"> </w:t>
       </w:r>
-      <w:hyperlink r:id="rId23">
+      <w:hyperlink r:id="rId22">
         <w:r>
           <w:rPr>
             <w:rStyle w:val="Hyperlink"/>
@@ -1622,7 +1431,7 @@
         <w:pStyle w:val="Compact"/>
         <w:numPr>
           <w:ilvl w:val="0"/>
-          <w:numId w:val="1006"/>
+          <w:numId w:val="1005"/>
         </w:numPr>
       </w:pPr>
       <w:r>
@@ -1631,7 +1440,7 @@
       <w:r>
         <w:t xml:space="preserve"> </w:t>
       </w:r>
-      <w:hyperlink r:id="rId24">
+      <w:hyperlink r:id="rId23">
         <w:r>
           <w:rPr>
             <w:rStyle w:val="Hyperlink"/>
@@ -1651,7 +1460,7 @@
         <w:pStyle w:val="Compact"/>
         <w:numPr>
           <w:ilvl w:val="0"/>
-          <w:numId w:val="1006"/>
+          <w:numId w:val="1005"/>
         </w:numPr>
       </w:pPr>
       <w:r>
@@ -1660,7 +1469,7 @@
       <w:r>
         <w:t xml:space="preserve"> </w:t>
       </w:r>
-      <w:hyperlink r:id="rId25">
+      <w:hyperlink r:id="rId24">
         <w:r>
           <w:rPr>
             <w:rStyle w:val="Hyperlink"/>
@@ -1680,7 +1489,7 @@
         <w:pStyle w:val="Compact"/>
         <w:numPr>
           <w:ilvl w:val="0"/>
-          <w:numId w:val="1006"/>
+          <w:numId w:val="1005"/>
         </w:numPr>
       </w:pPr>
       <w:r>
@@ -1689,7 +1498,7 @@
       <w:r>
         <w:t xml:space="preserve"> </w:t>
       </w:r>
-      <w:hyperlink r:id="rId26">
+      <w:hyperlink r:id="rId25">
         <w:r>
           <w:rPr>
             <w:rStyle w:val="Hyperlink"/>
@@ -1704,9 +1513,9 @@
         <w:t xml:space="preserve">Descrição: Agenda fortaleceu a Rede Nacional de Ouvidorias e o intercâmbio com os estados.</w:t>
       </w:r>
     </w:p>
+    <w:bookmarkEnd w:id="26"/>
     <w:bookmarkEnd w:id="27"/>
-    <w:bookmarkEnd w:id="28"/>
-    <w:bookmarkStart w:id="29" w:name="subpágina-1---rede-de-ouvidorias"/>
+    <w:bookmarkStart w:id="28" w:name="subpágina-1---rede-de-ouvidorias"/>
     <w:p>
       <w:pPr>
         <w:pStyle w:val="Heading2"/>
@@ -1792,7 +1601,7 @@
         <w:pStyle w:val="BodyText"/>
       </w:pPr>
       <w:r>
-        <w:t xml:space="preserve">Iniciativa do Plano Pena Justa voltada à cooperação federativa, à harmonização de procedimentos e ao fortalecimento da proteção de direitos no âmbito das Ouvidorias de Serviços Penais.</w:t>
+        <w:t xml:space="preserve">Ação prevista no Plano Pena Justa voltada à cooperação federativa, à harmonização de procedimentos e ao fortalecimento da proteção de direitos no âmbito das Ouvidorias de Serviços Penais.</w:t>
       </w:r>
     </w:p>
     <w:p>
@@ -1865,6 +1674,238 @@
       </w:pPr>
       <w:r>
         <w:t xml:space="preserve">Itens para colar:</w:t>
+      </w:r>
+    </w:p>
+    <w:p>
+      <w:pPr>
+        <w:pStyle w:val="Compact"/>
+        <w:numPr>
+          <w:ilvl w:val="0"/>
+          <w:numId w:val="1006"/>
+        </w:numPr>
+      </w:pPr>
+      <w:r>
+        <w:t xml:space="preserve">Atuar como espaço de difusão de referências técnicas úteis às ouvidorias de serviços penais.</w:t>
+      </w:r>
+    </w:p>
+    <w:p>
+      <w:pPr>
+        <w:pStyle w:val="Compact"/>
+        <w:numPr>
+          <w:ilvl w:val="0"/>
+          <w:numId w:val="1006"/>
+        </w:numPr>
+      </w:pPr>
+      <w:r>
+        <w:t xml:space="preserve">Fomentar o compartilhamento de práticas, fluxos e instrumentos voltados ao atendimento e ao encaminhamento de manifestações.</w:t>
+      </w:r>
+    </w:p>
+    <w:p>
+      <w:pPr>
+        <w:pStyle w:val="Compact"/>
+        <w:numPr>
+          <w:ilvl w:val="0"/>
+          <w:numId w:val="1006"/>
+        </w:numPr>
+      </w:pPr>
+      <w:r>
+        <w:t xml:space="preserve">Estimular a cooperação entre a União, os Estados e o Distrito Federal para o aprimoramento da atuação institucional.</w:t>
+      </w:r>
+    </w:p>
+    <w:p>
+      <w:pPr>
+        <w:pStyle w:val="Compact"/>
+        <w:numPr>
+          <w:ilvl w:val="0"/>
+          <w:numId w:val="1006"/>
+        </w:numPr>
+      </w:pPr>
+      <w:r>
+        <w:t xml:space="preserve">Fortalecer a participação social, a transparência pública e a proteção de direitos no sistema penal.</w:t>
+      </w:r>
+    </w:p>
+    <w:p>
+      <w:pPr>
+        <w:pStyle w:val="FirstParagraph"/>
+      </w:pPr>
+      <w:r>
+        <w:t xml:space="preserve">Seção:</w:t>
+      </w:r>
+    </w:p>
+    <w:p>
+      <w:pPr>
+        <w:pStyle w:val="BodyText"/>
+      </w:pPr>
+      <w:r>
+        <w:t xml:space="preserve">Governança e cooperação técnica</w:t>
+      </w:r>
+    </w:p>
+    <w:p>
+      <w:pPr>
+        <w:pStyle w:val="BodyText"/>
+      </w:pPr>
+      <w:r>
+        <w:t xml:space="preserve">Texto para colar:</w:t>
+      </w:r>
+    </w:p>
+    <w:p>
+      <w:pPr>
+        <w:pStyle w:val="BodyText"/>
+      </w:pPr>
+      <w:r>
+        <w:t xml:space="preserve">No recorte da ONASP, a Rede de Ouvidorias pode ser apresentada como espaço permanente de articulação entre unidades responsáveis pela escuta institucional, com foco em difusão de referências técnicas, intercâmbio de práticas e aperfeiçoamento contínuo da atuação no sistema penal.</w:t>
+      </w:r>
+    </w:p>
+    <w:p>
+      <w:pPr>
+        <w:pStyle w:val="BodyText"/>
+      </w:pPr>
+      <w:r>
+        <w:t xml:space="preserve">Esse arranjo é reforçado por instrumentos que definem parâmetros mínimos para a estruturação das ouvidorias e institucionalizam a Renospen como instância de cooperação técnica, integração federativa e fortalecimento institucional.</w:t>
+      </w:r>
+    </w:p>
+    <w:p>
+      <w:pPr>
+        <w:pStyle w:val="BodyText"/>
+      </w:pPr>
+      <w:r>
+        <w:t xml:space="preserve">Seção:</w:t>
+      </w:r>
+      <w:r>
+        <w:t xml:space="preserve"> </w:t>
+      </w:r>
+      <w:r>
+        <w:t xml:space="preserve">Mapa interativo e destaque por UF</w:t>
+      </w:r>
+    </w:p>
+    <w:p>
+      <w:pPr>
+        <w:pStyle w:val="BodyText"/>
+      </w:pPr>
+      <w:r>
+        <w:t xml:space="preserve">Texto para colar:</w:t>
+      </w:r>
+    </w:p>
+    <w:p>
+      <w:pPr>
+        <w:pStyle w:val="BodyText"/>
+      </w:pPr>
+      <w:r>
+        <w:t xml:space="preserve">Esta prévia reúne, em um único ponto, os contatos institucionais consolidados das unidades da federação. No ambiente de validação local, a consulta foi organizada por meio de um mapa visual com seleção por UF e painel lateral com dados resumidos da ouvidoria correspondente ou, quando cabível, das referências institucionais associadas à mesma unidade da federação.</w:t>
+      </w:r>
+    </w:p>
+    <w:p>
+      <w:pPr>
+        <w:pStyle w:val="BodyText"/>
+      </w:pPr>
+      <w:r>
+        <w:t xml:space="preserve">Orientação para publicação oficial:</w:t>
+      </w:r>
+    </w:p>
+    <w:p>
+      <w:pPr>
+        <w:pStyle w:val="BodyText"/>
+      </w:pPr>
+      <w:r>
+        <w:t xml:space="preserve">No ambiente gov.br, recomenda-se tratar o mapa interativo apenas como referência visual da prévia. A solução mais segura para publicação é manter um seletor simples por UF, um bloco expansível por estado ou, preferencialmente, o quadro textual de contatos apresentado abaixo, sem depender de JavaScript customizado.</w:t>
+      </w:r>
+    </w:p>
+    <w:p>
+      <w:pPr>
+        <w:pStyle w:val="BodyText"/>
+      </w:pPr>
+      <w:r>
+        <w:t xml:space="preserve">Quando a mesma UF tiver mais de uma referência institucional relevante, como ocorre no Espírito Santo, recomenda-se separar as informações em blocos independentes dentro do quadro lateral ou em linhas distintas no quadro textual, evitando misturar órgãos, responsáveis, telefones e endereços em uma única ficha.</w:t>
+      </w:r>
+    </w:p>
+    <w:p>
+      <w:pPr>
+        <w:pStyle w:val="BodyText"/>
+      </w:pPr>
+      <w:r>
+        <w:t xml:space="preserve">Regra editorial obrigatória:</w:t>
+      </w:r>
+    </w:p>
+    <w:p>
+      <w:pPr>
+        <w:pStyle w:val="BodyText"/>
+      </w:pPr>
+      <w:r>
+        <w:t xml:space="preserve">Detalhes de curadoria usados para consolidar os contatos devem permanecer apenas na documentação interna de trabalho. Não publicar na página expressões como</w:t>
+      </w:r>
+      <w:r>
+        <w:t xml:space="preserve"> </w:t>
+      </w:r>
+      <w:r>
+        <w:t xml:space="preserve">“o diagnóstico registrou”</w:t>
+      </w:r>
+      <w:r>
+        <w:t xml:space="preserve">,</w:t>
+      </w:r>
+      <w:r>
+        <w:t xml:space="preserve"> </w:t>
+      </w:r>
+      <w:r>
+        <w:t xml:space="preserve">“a resposta do diagnóstico informa”</w:t>
+      </w:r>
+      <w:r>
+        <w:t xml:space="preserve">, menções a respostas recebidas, observações internas de validação ou listas nominais de servidores designados.</w:t>
+      </w:r>
+    </w:p>
+    <w:p>
+      <w:pPr>
+        <w:pStyle w:val="BodyText"/>
+      </w:pPr>
+      <w:r>
+        <w:t xml:space="preserve">Base interna de consolidação (não publicar na página):</w:t>
+      </w:r>
+    </w:p>
+    <w:p>
+      <w:pPr>
+        <w:pStyle w:val="BodyText"/>
+      </w:pPr>
+      <w:r>
+        <w:t xml:space="preserve">Diagnóstico de Ouvidorias Estaduais, consolidado pela ONASP a partir das respostas recebidas em 2026.</w:t>
+      </w:r>
+    </w:p>
+    <w:p>
+      <w:pPr>
+        <w:pStyle w:val="BodyText"/>
+      </w:pPr>
+      <w:r>
+        <w:t xml:space="preserve">Seção:</w:t>
+      </w:r>
+    </w:p>
+    <w:p>
+      <w:pPr>
+        <w:pStyle w:val="BodyText"/>
+      </w:pPr>
+      <w:r>
+        <w:t xml:space="preserve">VI Encontro Nacional das Ouvidorias do Sistema Penal</w:t>
+      </w:r>
+    </w:p>
+    <w:p>
+      <w:pPr>
+        <w:pStyle w:val="BodyText"/>
+      </w:pPr>
+      <w:r>
+        <w:t xml:space="preserve">Texto para colar:</w:t>
+      </w:r>
+    </w:p>
+    <w:p>
+      <w:pPr>
+        <w:pStyle w:val="BodyText"/>
+      </w:pPr>
+      <w:r>
+        <w:t xml:space="preserve">O VI Encontro Nacional das Ouvidorias do Sistema Penal, promovido pela Senappen entre 8 e 10 de abril, consolidou um novo marco para a gestão penitenciária com o lançamento da Rede Nacional de Ouvidorias de Serviços Penais (Renospen) e a publicação de uma Instrução Normativa para padronizar essas instâncias nos estados. Alinhado ao Plano Nacional Pena Justa, o evento focou no fortalecimento da transparência, do controle social e da promoção de direitos humanos, unificando diretrizes nacionais enquanto respeita as autonomias locais. Além dos painéis sobre gestão estratégica e escuta ética, a iniciativa contemplou a doação de equipamentos tecnológicos para todas as unidades federativas, visando modernizar o atendimento e estreitar a comunicação entre o sistema penal e a sociedade brasileira.</w:t>
+      </w:r>
+    </w:p>
+    <w:p>
+      <w:pPr>
+        <w:pStyle w:val="BodyText"/>
+      </w:pPr>
+      <w:r>
+        <w:t xml:space="preserve">Imagens a inserir:</w:t>
       </w:r>
     </w:p>
     <w:p>
@@ -1876,7 +1917,7 @@
         </w:numPr>
       </w:pPr>
       <w:r>
-        <w:t xml:space="preserve">Atuar como espaço de difusão de referências técnicas úteis às ouvidorias de serviços penais.</w:t>
+        <w:t xml:space="preserve">Documentação/Banner_Renospen_1.jpeg</w:t>
       </w:r>
     </w:p>
     <w:p>
@@ -1888,7 +1929,7 @@
         </w:numPr>
       </w:pPr>
       <w:r>
-        <w:t xml:space="preserve">Fomentar o compartilhamento de práticas, fluxos e instrumentos voltados ao atendimento e ao encaminhamento de manifestações.</w:t>
+        <w:t xml:space="preserve">Documentação/Banner_Renospen_2.jpeg</w:t>
       </w:r>
     </w:p>
     <w:p>
@@ -1900,19 +1941,7 @@
         </w:numPr>
       </w:pPr>
       <w:r>
-        <w:t xml:space="preserve">Estimular a cooperação entre a União, os Estados e o Distrito Federal para o aprimoramento da atuação institucional.</w:t>
-      </w:r>
-    </w:p>
-    <w:p>
-      <w:pPr>
-        <w:pStyle w:val="Compact"/>
-        <w:numPr>
-          <w:ilvl w:val="0"/>
-          <w:numId w:val="1007"/>
-        </w:numPr>
-      </w:pPr>
-      <w:r>
-        <w:t xml:space="preserve">Fortalecer a participação social, a transparência pública e a proteção de direitos no sistema penal.</w:t>
+        <w:t xml:space="preserve">Documentação/Banner_Renospen_3.jpeg</w:t>
       </w:r>
     </w:p>
     <w:p>
@@ -1920,183 +1949,7 @@
         <w:pStyle w:val="FirstParagraph"/>
       </w:pPr>
       <w:r>
-        <w:t xml:space="preserve">Seção:</w:t>
-      </w:r>
-    </w:p>
-    <w:p>
-      <w:pPr>
-        <w:pStyle w:val="BodyText"/>
-      </w:pPr>
-      <w:r>
-        <w:t xml:space="preserve">Governança e cooperação técnica</w:t>
-      </w:r>
-    </w:p>
-    <w:p>
-      <w:pPr>
-        <w:pStyle w:val="BodyText"/>
-      </w:pPr>
-      <w:r>
-        <w:t xml:space="preserve">Texto para colar:</w:t>
-      </w:r>
-    </w:p>
-    <w:p>
-      <w:pPr>
-        <w:pStyle w:val="BodyText"/>
-      </w:pPr>
-      <w:r>
-        <w:t xml:space="preserve">No recorte da ONASP, a Rede de Ouvidorias pode ser apresentada como espaço permanente de articulação entre unidades responsáveis pela escuta institucional, com foco em difusão de referências técnicas, intercâmbio de práticas e aperfeiçoamento contínuo da atuação no sistema penal.</w:t>
-      </w:r>
-    </w:p>
-    <w:p>
-      <w:pPr>
-        <w:pStyle w:val="BodyText"/>
-      </w:pPr>
-      <w:r>
-        <w:t xml:space="preserve">Esse arranjo é reforçado por instrumentos que definem parâmetros mínimos para a estruturação das ouvidorias e institucionalizam a Renospen como instância de cooperação técnica, integração federativa e fortalecimento institucional.</w:t>
-      </w:r>
-    </w:p>
-    <w:p>
-      <w:pPr>
-        <w:pStyle w:val="BodyText"/>
-      </w:pPr>
-      <w:r>
-        <w:t xml:space="preserve">Seção:</w:t>
-      </w:r>
-      <w:r>
-        <w:t xml:space="preserve"> </w:t>
-      </w:r>
-      <w:r>
-        <w:t xml:space="preserve">Mapa interativo e destaque por UF</w:t>
-      </w:r>
-    </w:p>
-    <w:p>
-      <w:pPr>
-        <w:pStyle w:val="BodyText"/>
-      </w:pPr>
-      <w:r>
-        <w:t xml:space="preserve">Texto para colar:</w:t>
-      </w:r>
-    </w:p>
-    <w:p>
-      <w:pPr>
-        <w:pStyle w:val="BodyText"/>
-      </w:pPr>
-      <w:r>
-        <w:t xml:space="preserve">Esta prévia reúne, em um único ponto, os contatos institucionais consolidados das unidades da federação. No ambiente de validação local, a consulta foi organizada por meio de um mapa visual com seleção por UF e painel lateral com dados resumidos da ouvidoria correspondente ou, quando cabível, das referências institucionais associadas à mesma unidade da federação.</w:t>
-      </w:r>
-    </w:p>
-    <w:p>
-      <w:pPr>
-        <w:pStyle w:val="BodyText"/>
-      </w:pPr>
-      <w:r>
-        <w:t xml:space="preserve">Orientação para publicação oficial:</w:t>
-      </w:r>
-    </w:p>
-    <w:p>
-      <w:pPr>
-        <w:pStyle w:val="BodyText"/>
-      </w:pPr>
-      <w:r>
-        <w:t xml:space="preserve">No ambiente gov.br, recomenda-se tratar o mapa interativo apenas como referência visual da prévia. A solução mais segura para publicação é manter um seletor simples por UF, um bloco expansível por estado ou, preferencialmente, o quadro textual de contatos apresentado abaixo, sem depender de JavaScript customizado.</w:t>
-      </w:r>
-    </w:p>
-    <w:p>
-      <w:pPr>
-        <w:pStyle w:val="BodyText"/>
-      </w:pPr>
-      <w:r>
-        <w:t xml:space="preserve">Quando a mesma UF tiver mais de uma referência institucional relevante, como ocorre no Espírito Santo, recomenda-se separar as informações em blocos independentes dentro do quadro lateral ou em linhas distintas no quadro textual, evitando misturar órgãos, responsáveis, telefones e endereços em uma única ficha.</w:t>
-      </w:r>
-    </w:p>
-    <w:p>
-      <w:pPr>
-        <w:pStyle w:val="BodyText"/>
-      </w:pPr>
-      <w:r>
-        <w:t xml:space="preserve">Regra editorial obrigatória:</w:t>
-      </w:r>
-    </w:p>
-    <w:p>
-      <w:pPr>
-        <w:pStyle w:val="BodyText"/>
-      </w:pPr>
-      <w:r>
-        <w:t xml:space="preserve">Detalhes de curadoria usados para consolidar os contatos devem permanecer apenas na documentação interna de trabalho. Não publicar na página expressões como</w:t>
-      </w:r>
-      <w:r>
-        <w:t xml:space="preserve"> </w:t>
-      </w:r>
-      <w:r>
-        <w:t xml:space="preserve">“o diagnóstico registrou”</w:t>
-      </w:r>
-      <w:r>
-        <w:t xml:space="preserve">,</w:t>
-      </w:r>
-      <w:r>
-        <w:t xml:space="preserve"> </w:t>
-      </w:r>
-      <w:r>
-        <w:t xml:space="preserve">“a resposta do diagnóstico informa”</w:t>
-      </w:r>
-      <w:r>
-        <w:t xml:space="preserve">, menções a respostas recebidas, observações internas de validação ou listas nominais de servidores designados.</w:t>
-      </w:r>
-    </w:p>
-    <w:p>
-      <w:pPr>
-        <w:pStyle w:val="BodyText"/>
-      </w:pPr>
-      <w:r>
-        <w:t xml:space="preserve">Base interna de consolidação (não publicar na página):</w:t>
-      </w:r>
-    </w:p>
-    <w:p>
-      <w:pPr>
-        <w:pStyle w:val="BodyText"/>
-      </w:pPr>
-      <w:r>
-        <w:t xml:space="preserve">Diagnóstico de Ouvidorias Estaduais, consolidado pela ONASP a partir das respostas recebidas em 2026.</w:t>
-      </w:r>
-    </w:p>
-    <w:p>
-      <w:pPr>
-        <w:pStyle w:val="BodyText"/>
-      </w:pPr>
-      <w:r>
-        <w:t xml:space="preserve">Seção:</w:t>
-      </w:r>
-    </w:p>
-    <w:p>
-      <w:pPr>
-        <w:pStyle w:val="BodyText"/>
-      </w:pPr>
-      <w:r>
-        <w:t xml:space="preserve">VI Encontro Nacional das Ouvidorias do Sistema Penal</w:t>
-      </w:r>
-    </w:p>
-    <w:p>
-      <w:pPr>
-        <w:pStyle w:val="BodyText"/>
-      </w:pPr>
-      <w:r>
-        <w:t xml:space="preserve">Texto para colar:</w:t>
-      </w:r>
-    </w:p>
-    <w:p>
-      <w:pPr>
-        <w:pStyle w:val="BodyText"/>
-      </w:pPr>
-      <w:r>
-        <w:t xml:space="preserve">O VI Encontro Nacional das Ouvidorias do Sistema Penal, promovido pela Senappen entre 8 e 10 de abril, consolidou um novo marco para a gestão penitenciária com o lançamento da Rede Nacional de Ouvidorias de Serviços Penais (Renospen) e a publicação de uma Instrução Normativa para padronizar essas instâncias nos estados. Alinhado ao Plano Nacional Pena Justa, o evento focou no fortalecimento da transparência, do controle social e da promoção de direitos humanos, unificando diretrizes nacionais enquanto respeita as autonomias locais. Além dos painéis sobre gestão estratégica e escuta ética, a iniciativa contemplou a doação de equipamentos tecnológicos para todas as unidades federativas, visando modernizar o atendimento e estreitar a comunicação entre o sistema penal e a sociedade brasileira.</w:t>
-      </w:r>
-    </w:p>
-    <w:p>
-      <w:pPr>
-        <w:pStyle w:val="BodyText"/>
-      </w:pPr>
-      <w:r>
-        <w:t xml:space="preserve">Imagens a inserir:</w:t>
+        <w:t xml:space="preserve">Ordem e destaque sugeridos:</w:t>
       </w:r>
     </w:p>
     <w:p>
@@ -2108,7 +1961,22 @@
         </w:numPr>
       </w:pPr>
       <w:r>
-        <w:t xml:space="preserve">Documentação/Banner_Renospen_1.jpeg</w:t>
+        <w:t xml:space="preserve">usar</w:t>
+      </w:r>
+      <w:r>
+        <w:t xml:space="preserve"> </w:t>
+      </w:r>
+      <w:r>
+        <w:rPr>
+          <w:rStyle w:val="VerbatimChar"/>
+        </w:rPr>
+        <w:t xml:space="preserve">Banner_Renospen_1.jpeg</w:t>
+      </w:r>
+      <w:r>
+        <w:t xml:space="preserve"> </w:t>
+      </w:r>
+      <w:r>
+        <w:t xml:space="preserve">em destaque, na largura principal do bloco;</w:t>
       </w:r>
     </w:p>
     <w:p>
@@ -2117,65 +1985,6 @@
         <w:numPr>
           <w:ilvl w:val="0"/>
           <w:numId w:val="1008"/>
-        </w:numPr>
-      </w:pPr>
-      <w:r>
-        <w:t xml:space="preserve">Documentação/Banner_Renospen_2.jpeg</w:t>
-      </w:r>
-    </w:p>
-    <w:p>
-      <w:pPr>
-        <w:pStyle w:val="Compact"/>
-        <w:numPr>
-          <w:ilvl w:val="0"/>
-          <w:numId w:val="1008"/>
-        </w:numPr>
-      </w:pPr>
-      <w:r>
-        <w:t xml:space="preserve">Documentação/Banner_Renospen_3.jpeg</w:t>
-      </w:r>
-    </w:p>
-    <w:p>
-      <w:pPr>
-        <w:pStyle w:val="FirstParagraph"/>
-      </w:pPr>
-      <w:r>
-        <w:t xml:space="preserve">Ordem e destaque sugeridos:</w:t>
-      </w:r>
-    </w:p>
-    <w:p>
-      <w:pPr>
-        <w:pStyle w:val="Compact"/>
-        <w:numPr>
-          <w:ilvl w:val="0"/>
-          <w:numId w:val="1009"/>
-        </w:numPr>
-      </w:pPr>
-      <w:r>
-        <w:t xml:space="preserve">usar</w:t>
-      </w:r>
-      <w:r>
-        <w:t xml:space="preserve"> </w:t>
-      </w:r>
-      <w:r>
-        <w:rPr>
-          <w:rStyle w:val="VerbatimChar"/>
-        </w:rPr>
-        <w:t xml:space="preserve">Banner_Renospen_1.jpeg</w:t>
-      </w:r>
-      <w:r>
-        <w:t xml:space="preserve"> </w:t>
-      </w:r>
-      <w:r>
-        <w:t xml:space="preserve">em destaque, na largura principal do bloco;</w:t>
-      </w:r>
-    </w:p>
-    <w:p>
-      <w:pPr>
-        <w:pStyle w:val="Compact"/>
-        <w:numPr>
-          <w:ilvl w:val="0"/>
-          <w:numId w:val="1009"/>
         </w:numPr>
       </w:pPr>
       <w:r>
@@ -4288,11 +4097,229 @@
         <w:pStyle w:val="Compact"/>
         <w:numPr>
           <w:ilvl w:val="0"/>
-          <w:numId w:val="1010"/>
+          <w:numId w:val="1009"/>
         </w:numPr>
       </w:pPr>
       <w:r>
         <w:t xml:space="preserve">Clique e acesse a Instrução Normativa nº 75/2026: Subpages/Pena_justa/SEI_35153985_Instrucao_Normativa_75.pdf</w:t>
+      </w:r>
+    </w:p>
+    <w:p>
+      <w:pPr>
+        <w:pStyle w:val="Compact"/>
+        <w:numPr>
+          <w:ilvl w:val="0"/>
+          <w:numId w:val="1009"/>
+        </w:numPr>
+      </w:pPr>
+      <w:r>
+        <w:t xml:space="preserve">Clique e acesse a Portaria nº 549/2026 - Renospen: Subpages/Pena_justa/SEI_35032761_Portaria_549.pdf</w:t>
+      </w:r>
+    </w:p>
+    <w:p>
+      <w:pPr>
+        <w:pStyle w:val="Compact"/>
+        <w:numPr>
+          <w:ilvl w:val="0"/>
+          <w:numId w:val="1009"/>
+        </w:numPr>
+      </w:pPr>
+      <w:r>
+        <w:t xml:space="preserve">Clique e acesse o Plano Nacional Pena Justa: Subpages/Pena_justa/Plano_Nacional_Pena_Justa.pdf</w:t>
+      </w:r>
+    </w:p>
+    <w:bookmarkEnd w:id="28"/>
+    <w:bookmarkStart w:id="29" w:name="subpágina-2---ema---senappen"/>
+    <w:p>
+      <w:pPr>
+        <w:pStyle w:val="Heading2"/>
+      </w:pPr>
+      <w:r>
+        <w:t xml:space="preserve">Subpágina 2 - EMA - SENAPPEN</w:t>
+      </w:r>
+    </w:p>
+    <w:p>
+      <w:pPr>
+        <w:pStyle w:val="FirstParagraph"/>
+      </w:pPr>
+      <w:r>
+        <w:t xml:space="preserve">Título da página:</w:t>
+      </w:r>
+    </w:p>
+    <w:p>
+      <w:pPr>
+        <w:pStyle w:val="BodyText"/>
+      </w:pPr>
+      <w:r>
+        <w:t xml:space="preserve">EMA - SENAPPEN</w:t>
+      </w:r>
+    </w:p>
+    <w:p>
+      <w:pPr>
+        <w:pStyle w:val="BodyText"/>
+      </w:pPr>
+      <w:r>
+        <w:t xml:space="preserve">Imagem de destaque:</w:t>
+      </w:r>
+    </w:p>
+    <w:p>
+      <w:pPr>
+        <w:pStyle w:val="BodyText"/>
+      </w:pPr>
+      <w:r>
+        <w:t xml:space="preserve">Documentação/Botao_EMA.png</w:t>
+      </w:r>
+    </w:p>
+    <w:p>
+      <w:pPr>
+        <w:pStyle w:val="BodyText"/>
+      </w:pPr>
+      <w:r>
+        <w:t xml:space="preserve">Texto alternativo sugerido:</w:t>
+      </w:r>
+    </w:p>
+    <w:p>
+      <w:pPr>
+        <w:pStyle w:val="BodyText"/>
+      </w:pPr>
+      <w:r>
+        <w:t xml:space="preserve">Botão institucional da EMA - SENAPPEN.</w:t>
+      </w:r>
+    </w:p>
+    <w:p>
+      <w:pPr>
+        <w:pStyle w:val="BodyText"/>
+      </w:pPr>
+      <w:r>
+        <w:t xml:space="preserve">Identificador editorial:</w:t>
+      </w:r>
+    </w:p>
+    <w:p>
+      <w:pPr>
+        <w:pStyle w:val="BodyText"/>
+      </w:pPr>
+      <w:r>
+        <w:t xml:space="preserve">Conteúdo Técnico e Projetos Estruturantes</w:t>
+      </w:r>
+    </w:p>
+    <w:p>
+      <w:pPr>
+        <w:pStyle w:val="BodyText"/>
+      </w:pPr>
+      <w:r>
+        <w:t xml:space="preserve">Texto de destaque:</w:t>
+      </w:r>
+    </w:p>
+    <w:p>
+      <w:pPr>
+        <w:pStyle w:val="BodyText"/>
+      </w:pPr>
+      <w:r>
+        <w:t xml:space="preserve">Espaço da Equipe de Monitoramento e Acompanhamento das decisões e deliberações do Sistema Interamericano de Direitos Humanos em face do sistema penal nacional, dedicado a fortalecer o cumprimento das determinações do SIDH em parceria com as Unidades Federativas.</w:t>
+      </w:r>
+    </w:p>
+    <w:p>
+      <w:pPr>
+        <w:pStyle w:val="BodyText"/>
+      </w:pPr>
+      <w:r>
+        <w:t xml:space="preserve">Seção:</w:t>
+      </w:r>
+    </w:p>
+    <w:p>
+      <w:pPr>
+        <w:pStyle w:val="BodyText"/>
+      </w:pPr>
+      <w:r>
+        <w:t xml:space="preserve">Institucional</w:t>
+      </w:r>
+    </w:p>
+    <w:p>
+      <w:pPr>
+        <w:pStyle w:val="BodyText"/>
+      </w:pPr>
+      <w:r>
+        <w:t xml:space="preserve">Imagem complementar opcional:</w:t>
+      </w:r>
+    </w:p>
+    <w:p>
+      <w:pPr>
+        <w:pStyle w:val="BodyText"/>
+      </w:pPr>
+      <w:r>
+        <w:t xml:space="preserve">Documentação/Banner_Ema_Organograma.png</w:t>
+      </w:r>
+    </w:p>
+    <w:p>
+      <w:pPr>
+        <w:pStyle w:val="BodyText"/>
+      </w:pPr>
+      <w:r>
+        <w:t xml:space="preserve">Texto alternativo sugerido:</w:t>
+      </w:r>
+    </w:p>
+    <w:p>
+      <w:pPr>
+        <w:pStyle w:val="BodyText"/>
+      </w:pPr>
+      <w:r>
+        <w:t xml:space="preserve">Organograma da EMA - SENAPPEN.</w:t>
+      </w:r>
+    </w:p>
+    <w:p>
+      <w:pPr>
+        <w:pStyle w:val="BodyText"/>
+      </w:pPr>
+      <w:r>
+        <w:t xml:space="preserve">Texto para colar:</w:t>
+      </w:r>
+    </w:p>
+    <w:p>
+      <w:pPr>
+        <w:pStyle w:val="BodyText"/>
+      </w:pPr>
+      <w:r>
+        <w:t xml:space="preserve">A EMA-SENAPPEN foi instituída, inicialmente, pela Portaria GABSEC/SENAPPEN/MJSP Nº 350, de 13 de junho de 2024, em um esforço de integrar a Secretaria Nacional de Políticas Penais ao processo de cumprimento das decisões do SIDH, dado seu rol de competências, em especial, a previsão de prestar apoio técnico aos entes federativos quanto à implementação dos princípios e das regras da execução penal.</w:t>
+      </w:r>
+    </w:p>
+    <w:p>
+      <w:pPr>
+        <w:pStyle w:val="BodyText"/>
+      </w:pPr>
+      <w:r>
+        <w:t xml:space="preserve">A segunda linha da seção:</w:t>
+      </w:r>
+    </w:p>
+    <w:p>
+      <w:pPr>
+        <w:pStyle w:val="BodyText"/>
+      </w:pPr>
+      <w:r>
+        <w:t xml:space="preserve">A estrutura da EMA foi alterada em 2025, mediante as Portarias GABSEC/SENAPPEN/MJSP Nº 511, de 13 de outubro de 2025, e Portaria de Pessoal GABSEC/SENAPPEN/MJSP Nº 93, de 10 de março de 2026, as quais possuíam por objetivo o aprimoramento da sua composição institucional, conforme o organograma a seguir:</w:t>
+      </w:r>
+    </w:p>
+    <w:p>
+      <w:pPr>
+        <w:pStyle w:val="BodyText"/>
+      </w:pPr>
+      <w:r>
+        <w:t xml:space="preserve">Seção:</w:t>
+      </w:r>
+    </w:p>
+    <w:p>
+      <w:pPr>
+        <w:pStyle w:val="BodyText"/>
+      </w:pPr>
+      <w:r>
+        <w:t xml:space="preserve">Frentes de Atuação</w:t>
+      </w:r>
+    </w:p>
+    <w:p>
+      <w:pPr>
+        <w:pStyle w:val="BodyText"/>
+      </w:pPr>
+      <w:r>
+        <w:t xml:space="preserve">Itens para colar:</w:t>
       </w:r>
     </w:p>
     <w:p>
@@ -4304,7 +4331,7 @@
         </w:numPr>
       </w:pPr>
       <w:r>
-        <w:t xml:space="preserve">Clique e acesse a Portaria nº 549/2026 - Renospen: Subpages/Pena_justa/SEI_35032761_Portaria_549.pdf</w:t>
+        <w:t xml:space="preserve">Monitorar e acompanhar as estratégias adotadas pelo Estado Brasileiro para o cumprimento das decisões do SIDH em relação ao sistema penal.</w:t>
       </w:r>
     </w:p>
     <w:p>
@@ -4316,17 +4343,31 @@
         </w:numPr>
       </w:pPr>
       <w:r>
-        <w:t xml:space="preserve">Clique e acesse o Plano Nacional Pena Justa: Subpages/Pena_justa/Plano_Nacional_Pena_Justa.pdf</w:t>
-      </w:r>
-    </w:p>
-    <w:bookmarkEnd w:id="29"/>
-    <w:bookmarkStart w:id="30" w:name="subpágina-2---ema---senappen"/>
-    <w:p>
-      <w:pPr>
-        <w:pStyle w:val="Heading2"/>
-      </w:pPr>
-      <w:r>
-        <w:t xml:space="preserve">Subpágina 2 - EMA - SENAPPEN</w:t>
+        <w:t xml:space="preserve">Prevenir e evitar possíveis condenações.</w:t>
+      </w:r>
+    </w:p>
+    <w:p>
+      <w:pPr>
+        <w:pStyle w:val="Compact"/>
+        <w:numPr>
+          <w:ilvl w:val="0"/>
+          <w:numId w:val="1010"/>
+        </w:numPr>
+      </w:pPr>
+      <w:r>
+        <w:t xml:space="preserve">Propagar a cultura de Direitos Humanos, fomentando a aplicação dos Tratados Internacionais sobre a matéria de Direito Penal pelos gestores do sistema penal nacional.</w:t>
+      </w:r>
+    </w:p>
+    <w:p>
+      <w:pPr>
+        <w:pStyle w:val="Compact"/>
+        <w:numPr>
+          <w:ilvl w:val="0"/>
+          <w:numId w:val="1010"/>
+        </w:numPr>
+      </w:pPr>
+      <w:r>
+        <w:t xml:space="preserve">Fortalecer o diálogo entre a proteção de direitos e a governança no sistema penal.</w:t>
       </w:r>
     </w:p>
     <w:p>
@@ -4334,79 +4375,15 @@
         <w:pStyle w:val="FirstParagraph"/>
       </w:pPr>
       <w:r>
-        <w:t xml:space="preserve">Título da página:</w:t>
-      </w:r>
-    </w:p>
-    <w:p>
-      <w:pPr>
-        <w:pStyle w:val="BodyText"/>
-      </w:pPr>
-      <w:r>
-        <w:t xml:space="preserve">EMA - SENAPPEN</w:t>
-      </w:r>
-    </w:p>
-    <w:p>
-      <w:pPr>
-        <w:pStyle w:val="BodyText"/>
-      </w:pPr>
-      <w:r>
-        <w:t xml:space="preserve">Imagem de destaque:</w:t>
-      </w:r>
-    </w:p>
-    <w:p>
-      <w:pPr>
-        <w:pStyle w:val="BodyText"/>
-      </w:pPr>
-      <w:r>
-        <w:t xml:space="preserve">Documentação/Botao_EMA.png</w:t>
-      </w:r>
-    </w:p>
-    <w:p>
-      <w:pPr>
-        <w:pStyle w:val="BodyText"/>
-      </w:pPr>
-      <w:r>
-        <w:t xml:space="preserve">Texto alternativo sugerido:</w:t>
-      </w:r>
-    </w:p>
-    <w:p>
-      <w:pPr>
-        <w:pStyle w:val="BodyText"/>
-      </w:pPr>
-      <w:r>
-        <w:t xml:space="preserve">Botão institucional da EMA - SENAPPEN.</w:t>
-      </w:r>
-    </w:p>
-    <w:p>
-      <w:pPr>
-        <w:pStyle w:val="BodyText"/>
-      </w:pPr>
-      <w:r>
-        <w:t xml:space="preserve">Identificador editorial:</w:t>
-      </w:r>
-    </w:p>
-    <w:p>
-      <w:pPr>
-        <w:pStyle w:val="BodyText"/>
-      </w:pPr>
-      <w:r>
-        <w:t xml:space="preserve">Conteúdo Técnico e Projetos Estruturantes</w:t>
-      </w:r>
-    </w:p>
-    <w:p>
-      <w:pPr>
-        <w:pStyle w:val="BodyText"/>
-      </w:pPr>
-      <w:r>
-        <w:t xml:space="preserve">Texto de destaque:</w:t>
-      </w:r>
-    </w:p>
-    <w:p>
-      <w:pPr>
-        <w:pStyle w:val="BodyText"/>
-      </w:pPr>
-      <w:r>
-        <w:t xml:space="preserve">Espaço da Equipe de Monitoramento e Acompanhamento das decisões e deliberações do Sistema Interamericano de Direitos Humanos em face do sistema penal nacional, dedicado a fortalecer o cumprimento das determinações do SIDH em parceria com as Unidades Federativas.</w:t>
+        <w:t xml:space="preserve">Texto complementar da seção:</w:t>
+      </w:r>
+    </w:p>
+    <w:p>
+      <w:pPr>
+        <w:pStyle w:val="BodyText"/>
+      </w:pPr>
+      <w:r>
+        <w:t xml:space="preserve">Cabe citar a aproximação institucional e a construção de diálogo com órgãos-chave desse processo de monitoramento, como o Ministério das Relações Exteriores, o Ministério dos Direitos Humanos e da Cidadania e o Conselho Nacional de Justiça.</w:t>
       </w:r>
     </w:p>
     <w:p>
@@ -4422,39 +4399,7 @@
         <w:pStyle w:val="BodyText"/>
       </w:pPr>
       <w:r>
-        <w:t xml:space="preserve">Institucional</w:t>
-      </w:r>
-    </w:p>
-    <w:p>
-      <w:pPr>
-        <w:pStyle w:val="BodyText"/>
-      </w:pPr>
-      <w:r>
-        <w:t xml:space="preserve">Imagem complementar opcional:</w:t>
-      </w:r>
-    </w:p>
-    <w:p>
-      <w:pPr>
-        <w:pStyle w:val="BodyText"/>
-      </w:pPr>
-      <w:r>
-        <w:t xml:space="preserve">Documentação/Banner_Ema_Organograma.png</w:t>
-      </w:r>
-    </w:p>
-    <w:p>
-      <w:pPr>
-        <w:pStyle w:val="BodyText"/>
-      </w:pPr>
-      <w:r>
-        <w:t xml:space="preserve">Texto alternativo sugerido:</w:t>
-      </w:r>
-    </w:p>
-    <w:p>
-      <w:pPr>
-        <w:pStyle w:val="BodyText"/>
-      </w:pPr>
-      <w:r>
-        <w:t xml:space="preserve">Organograma da EMA - SENAPPEN.</w:t>
+        <w:t xml:space="preserve">Atuação institucional em 2025</w:t>
       </w:r>
     </w:p>
     <w:p>
@@ -4470,7 +4415,7 @@
         <w:pStyle w:val="BodyText"/>
       </w:pPr>
       <w:r>
-        <w:t xml:space="preserve">A EMA-SENAPPEN foi instituída, inicialmente, pela Portaria GABSEC/SENAPPEN/MJSP Nº 350, de 13 de junho de 2024, em um esforço de integrar a Secretaria Nacional de Políticas Penais ao processo de cumprimento das decisões do SIDH, dado seu rol de competências, em especial, a previsão de prestar apoio técnico aos entes federativos quanto à implementação dos princípios e das regras da execução penal.</w:t>
+        <w:t xml:space="preserve">Em 2025, a EMA/Senappen intensificou o acompanhamento do Sistema Interamericano de Direitos Humanos com foco em decisões, deliberações e medidas com repercussão sobre o sistema penal brasileiro. A atuação combinou articulação interinstitucional, monitoramento técnico e apoio à consolidação de respostas coordenadas do Estado.</w:t>
       </w:r>
     </w:p>
     <w:p>
@@ -4486,31 +4431,15 @@
         <w:pStyle w:val="BodyText"/>
       </w:pPr>
       <w:r>
-        <w:t xml:space="preserve">A estrutura da EMA foi alterada em 2025, mediante as Portarias GABSEC/SENAPPEN/MJSP Nº 511, de 13 de outubro de 2025, e Portaria de Pessoal GABSEC/SENAPPEN/MJSP Nº 93, de 10 de março de 2026, as quais possuíam por objetivo o aprimoramento da sua composição institucional, conforme o organograma a seguir:</w:t>
-      </w:r>
-    </w:p>
-    <w:p>
-      <w:pPr>
-        <w:pStyle w:val="BodyText"/>
-      </w:pPr>
-      <w:r>
-        <w:t xml:space="preserve">Seção:</w:t>
-      </w:r>
-    </w:p>
-    <w:p>
-      <w:pPr>
-        <w:pStyle w:val="BodyText"/>
-      </w:pPr>
-      <w:r>
-        <w:t xml:space="preserve">Frentes de Atuação</w:t>
-      </w:r>
-    </w:p>
-    <w:p>
-      <w:pPr>
-        <w:pStyle w:val="BodyText"/>
-      </w:pPr>
-      <w:r>
-        <w:t xml:space="preserve">Itens para colar:</w:t>
+        <w:t xml:space="preserve">Nesse período, a equipe ampliou sua participação em agendas voltadas ao acompanhamento de casos perante a Corte Interamericana de Direitos Humanos e ao fortalecimento de mecanismos permanentes de monitoramento no âmbito da política penal.</w:t>
+      </w:r>
+    </w:p>
+    <w:p>
+      <w:pPr>
+        <w:pStyle w:val="BodyText"/>
+      </w:pPr>
+      <w:r>
+        <w:t xml:space="preserve">Imagens complementares opcionais:</w:t>
       </w:r>
     </w:p>
     <w:p>
@@ -4522,7 +4451,7 @@
         </w:numPr>
       </w:pPr>
       <w:r>
-        <w:t xml:space="preserve">Monitorar e acompanhar as estratégias adotadas pelo Estado Brasileiro para o cumprimento das decisões do SIDH em relação ao sistema penal.</w:t>
+        <w:t xml:space="preserve">Documentação/Banner_Ema.jpg</w:t>
       </w:r>
     </w:p>
     <w:p>
@@ -4534,31 +4463,7 @@
         </w:numPr>
       </w:pPr>
       <w:r>
-        <w:t xml:space="preserve">Prevenir e evitar possíveis condenações.</w:t>
-      </w:r>
-    </w:p>
-    <w:p>
-      <w:pPr>
-        <w:pStyle w:val="Compact"/>
-        <w:numPr>
-          <w:ilvl w:val="0"/>
-          <w:numId w:val="1011"/>
-        </w:numPr>
-      </w:pPr>
-      <w:r>
-        <w:t xml:space="preserve">Propagar a cultura de Direitos Humanos, fomentando a aplicação dos Tratados Internacionais sobre a matéria de Direito Penal pelos gestores do sistema penal nacional.</w:t>
-      </w:r>
-    </w:p>
-    <w:p>
-      <w:pPr>
-        <w:pStyle w:val="Compact"/>
-        <w:numPr>
-          <w:ilvl w:val="0"/>
-          <w:numId w:val="1011"/>
-        </w:numPr>
-      </w:pPr>
-      <w:r>
-        <w:t xml:space="preserve">Fortalecer o diálogo entre a proteção de direitos e a governança no sistema penal.</w:t>
+        <w:t xml:space="preserve">Documentação/Banner_Ema_2.jpg</w:t>
       </w:r>
     </w:p>
     <w:p>
@@ -4566,71 +4471,7 @@
         <w:pStyle w:val="FirstParagraph"/>
       </w:pPr>
       <w:r>
-        <w:t xml:space="preserve">Texto complementar da seção:</w:t>
-      </w:r>
-    </w:p>
-    <w:p>
-      <w:pPr>
-        <w:pStyle w:val="BodyText"/>
-      </w:pPr>
-      <w:r>
-        <w:t xml:space="preserve">Cabe citar a aproximação institucional e a construção de diálogo com órgãos-chave desse processo de monitoramento, como o Ministério das Relações Exteriores, o Ministério dos Direitos Humanos e da Cidadania e o Conselho Nacional de Justiça.</w:t>
-      </w:r>
-    </w:p>
-    <w:p>
-      <w:pPr>
-        <w:pStyle w:val="BodyText"/>
-      </w:pPr>
-      <w:r>
-        <w:t xml:space="preserve">Seção:</w:t>
-      </w:r>
-    </w:p>
-    <w:p>
-      <w:pPr>
-        <w:pStyle w:val="BodyText"/>
-      </w:pPr>
-      <w:r>
-        <w:t xml:space="preserve">Atuação institucional em 2025</w:t>
-      </w:r>
-    </w:p>
-    <w:p>
-      <w:pPr>
-        <w:pStyle w:val="BodyText"/>
-      </w:pPr>
-      <w:r>
-        <w:t xml:space="preserve">Texto para colar:</w:t>
-      </w:r>
-    </w:p>
-    <w:p>
-      <w:pPr>
-        <w:pStyle w:val="BodyText"/>
-      </w:pPr>
-      <w:r>
-        <w:t xml:space="preserve">Em 2025, a EMA/Senappen intensificou o acompanhamento do Sistema Interamericano de Direitos Humanos com foco em decisões, deliberações e medidas com repercussão sobre o sistema penal brasileiro. A atuação combinou articulação interinstitucional, monitoramento técnico e apoio à consolidação de respostas coordenadas do Estado.</w:t>
-      </w:r>
-    </w:p>
-    <w:p>
-      <w:pPr>
-        <w:pStyle w:val="BodyText"/>
-      </w:pPr>
-      <w:r>
-        <w:t xml:space="preserve">A segunda linha da seção:</w:t>
-      </w:r>
-    </w:p>
-    <w:p>
-      <w:pPr>
-        <w:pStyle w:val="BodyText"/>
-      </w:pPr>
-      <w:r>
-        <w:t xml:space="preserve">Nesse período, a equipe ampliou sua participação em agendas voltadas ao acompanhamento de casos perante a Corte Interamericana de Direitos Humanos e ao fortalecimento de mecanismos permanentes de monitoramento no âmbito da política penal.</w:t>
-      </w:r>
-    </w:p>
-    <w:p>
-      <w:pPr>
-        <w:pStyle w:val="BodyText"/>
-      </w:pPr>
-      <w:r>
-        <w:t xml:space="preserve">Imagens complementares opcionais:</w:t>
+        <w:t xml:space="preserve">Textos alternativos sugeridos:</w:t>
       </w:r>
     </w:p>
     <w:p>
@@ -4642,7 +4483,7 @@
         </w:numPr>
       </w:pPr>
       <w:r>
-        <w:t xml:space="preserve">Documentação/Banner_Ema.jpg</w:t>
+        <w:t xml:space="preserve">Participantes reunidos em mesa de trabalho institucional acompanhada pela EMA - SENAPPEN.</w:t>
       </w:r>
     </w:p>
     <w:p>
@@ -4654,7 +4495,7 @@
         </w:numPr>
       </w:pPr>
       <w:r>
-        <w:t xml:space="preserve">Documentação/Banner_Ema_2.jpg</w:t>
+        <w:t xml:space="preserve">Participantes posicionados em registro oficial de agenda institucional acompanhada pela EMA - SENAPPEN.</w:t>
       </w:r>
     </w:p>
     <w:p>
@@ -4662,7 +4503,7 @@
         <w:pStyle w:val="FirstParagraph"/>
       </w:pPr>
       <w:r>
-        <w:t xml:space="preserve">Textos alternativos sugeridos:</w:t>
+        <w:t xml:space="preserve">Legendas sugeridas:</w:t>
       </w:r>
     </w:p>
     <w:p>
@@ -4674,7 +4515,7 @@
         </w:numPr>
       </w:pPr>
       <w:r>
-        <w:t xml:space="preserve">Participantes reunidos em mesa de trabalho institucional acompanhada pela EMA - SENAPPEN.</w:t>
+        <w:t xml:space="preserve">Reunião institucional acompanhada pela EMA - SENAPPEN.</w:t>
       </w:r>
     </w:p>
     <w:p>
@@ -4686,7 +4527,7 @@
         </w:numPr>
       </w:pPr>
       <w:r>
-        <w:t xml:space="preserve">Participantes posicionados em registro oficial de agenda institucional acompanhada pela EMA - SENAPPEN.</w:t>
+        <w:t xml:space="preserve">Registro oficial de agenda institucional da EMA - SENAPPEN.</w:t>
       </w:r>
     </w:p>
     <w:p>
@@ -4694,7 +4535,71 @@
         <w:pStyle w:val="FirstParagraph"/>
       </w:pPr>
       <w:r>
-        <w:t xml:space="preserve">Legendas sugeridas:</w:t>
+        <w:t xml:space="preserve">Seção:</w:t>
+      </w:r>
+    </w:p>
+    <w:p>
+      <w:pPr>
+        <w:pStyle w:val="BodyText"/>
+      </w:pPr>
+      <w:r>
+        <w:t xml:space="preserve">Caso Pedrinhas</w:t>
+      </w:r>
+    </w:p>
+    <w:p>
+      <w:pPr>
+        <w:pStyle w:val="BodyText"/>
+      </w:pPr>
+      <w:r>
+        <w:t xml:space="preserve">Texto para colar:</w:t>
+      </w:r>
+    </w:p>
+    <w:p>
+      <w:pPr>
+        <w:pStyle w:val="BodyText"/>
+      </w:pPr>
+      <w:r>
+        <w:t xml:space="preserve">Em 21 de outubro de 2025, a EMA-SENAPPEN foi convocada a participar, juntamente a outros órgãos representantes do Estado Brasileiro, da audiência privada solicitada pela Corte Interamericana de Direitos Humanos sobre as Medidas Provisórias outorgadas no Caso do Complexo Penitenciário de São Luís, Maranhão (Caso Pedrinhas).</w:t>
+      </w:r>
+    </w:p>
+    <w:p>
+      <w:pPr>
+        <w:pStyle w:val="BodyText"/>
+      </w:pPr>
+      <w:r>
+        <w:t xml:space="preserve">A segunda linha da seção:</w:t>
+      </w:r>
+    </w:p>
+    <w:p>
+      <w:pPr>
+        <w:pStyle w:val="BodyText"/>
+      </w:pPr>
+      <w:r>
+        <w:t xml:space="preserve">Como desdobramento da audiência, a Equipe ficou responsável por coordenar uma mesa de trabalho voltada à elaboração de um plano de cumprimento conjunto, com foco no enfrentamento das fragilidades ainda identificadas no Caso.</w:t>
+      </w:r>
+    </w:p>
+    <w:p>
+      <w:pPr>
+        <w:pStyle w:val="BodyText"/>
+      </w:pPr>
+      <w:r>
+        <w:t xml:space="preserve">Subseção:</w:t>
+      </w:r>
+    </w:p>
+    <w:p>
+      <w:pPr>
+        <w:pStyle w:val="BodyText"/>
+      </w:pPr>
+      <w:r>
+        <w:t xml:space="preserve">Eixos priorizados</w:t>
+      </w:r>
+    </w:p>
+    <w:p>
+      <w:pPr>
+        <w:pStyle w:val="BodyText"/>
+      </w:pPr>
+      <w:r>
+        <w:t xml:space="preserve">Itens para colar:</w:t>
       </w:r>
     </w:p>
     <w:p>
@@ -4706,7 +4611,7 @@
         </w:numPr>
       </w:pPr>
       <w:r>
-        <w:t xml:space="preserve">Reunião institucional acompanhada pela EMA - SENAPPEN.</w:t>
+        <w:t xml:space="preserve">Superlotação e ambiência no sistema prisional.</w:t>
       </w:r>
     </w:p>
     <w:p>
@@ -4718,7 +4623,31 @@
         </w:numPr>
       </w:pPr>
       <w:r>
-        <w:t xml:space="preserve">Registro oficial de agenda institucional da EMA - SENAPPEN.</w:t>
+        <w:t xml:space="preserve">Dignidade e condições de custódia.</w:t>
+      </w:r>
+    </w:p>
+    <w:p>
+      <w:pPr>
+        <w:pStyle w:val="Compact"/>
+        <w:numPr>
+          <w:ilvl w:val="0"/>
+          <w:numId w:val="1014"/>
+        </w:numPr>
+      </w:pPr>
+      <w:r>
+        <w:t xml:space="preserve">Acesso à justiça e prevenção à tortura.</w:t>
+      </w:r>
+    </w:p>
+    <w:p>
+      <w:pPr>
+        <w:pStyle w:val="Compact"/>
+        <w:numPr>
+          <w:ilvl w:val="0"/>
+          <w:numId w:val="1014"/>
+        </w:numPr>
+      </w:pPr>
+      <w:r>
+        <w:t xml:space="preserve">Monitoramento, participação social e coordenação institucional.</w:t>
       </w:r>
     </w:p>
     <w:p>
@@ -4726,6 +4655,54 @@
         <w:pStyle w:val="FirstParagraph"/>
       </w:pPr>
       <w:r>
+        <w:t xml:space="preserve">Subseção:</w:t>
+      </w:r>
+    </w:p>
+    <w:p>
+      <w:pPr>
+        <w:pStyle w:val="BodyText"/>
+      </w:pPr>
+      <w:r>
+        <w:t xml:space="preserve">Desdobramentos e articulação técnica</w:t>
+      </w:r>
+    </w:p>
+    <w:p>
+      <w:pPr>
+        <w:pStyle w:val="BodyText"/>
+      </w:pPr>
+      <w:r>
+        <w:t xml:space="preserve">Texto para colar:</w:t>
+      </w:r>
+    </w:p>
+    <w:p>
+      <w:pPr>
+        <w:pStyle w:val="BodyText"/>
+      </w:pPr>
+      <w:r>
+        <w:t xml:space="preserve">Entre novembro e dezembro de 2025, a EMA/Senappen contribuiu para a formalização da mesa de trabalho, participou de reuniões técnicas dedicadas aos eixos temáticos do caso e apoiou a preparação de visita técnica destinada a consolidar diagnósticos e orientar as próximas medidas.</w:t>
+      </w:r>
+    </w:p>
+    <w:p>
+      <w:pPr>
+        <w:pStyle w:val="BodyText"/>
+      </w:pPr>
+      <w:r>
+        <w:t xml:space="preserve">A segunda linha da subseção:</w:t>
+      </w:r>
+    </w:p>
+    <w:p>
+      <w:pPr>
+        <w:pStyle w:val="BodyText"/>
+      </w:pPr>
+      <w:r>
+        <w:t xml:space="preserve">No mesmo contexto, a equipe atuou de forma articulada com o Plano Pena Justa e acompanhou iniciativas voltadas à criação de instâncias permanentes de monitoramento e à padronização de fluxos para acompanhamento de casos internacionais com incidência sobre o sistema penal brasileiro.</w:t>
+      </w:r>
+    </w:p>
+    <w:p>
+      <w:pPr>
+        <w:pStyle w:val="BodyText"/>
+      </w:pPr>
+      <w:r>
         <w:t xml:space="preserve">Seção:</w:t>
       </w:r>
     </w:p>
@@ -4734,7 +4711,7 @@
         <w:pStyle w:val="BodyText"/>
       </w:pPr>
       <w:r>
-        <w:t xml:space="preserve">Caso Pedrinhas</w:t>
+        <w:t xml:space="preserve">Referências públicas do SIDH</w:t>
       </w:r>
     </w:p>
     <w:p>
@@ -4750,47 +4727,15 @@
         <w:pStyle w:val="BodyText"/>
       </w:pPr>
       <w:r>
-        <w:t xml:space="preserve">Em 21 de outubro de 2025, a EMA-SENAPPEN foi convocada a participar, juntamente a outros órgãos representantes do Estado Brasileiro, da audiência privada solicitada pela Corte Interamericana de Direitos Humanos sobre as Medidas Provisórias outorgadas no Caso do Complexo Penitenciário de São Luís, Maranhão (Caso Pedrinhas).</w:t>
-      </w:r>
-    </w:p>
-    <w:p>
-      <w:pPr>
-        <w:pStyle w:val="BodyText"/>
-      </w:pPr>
-      <w:r>
-        <w:t xml:space="preserve">A segunda linha da seção:</w:t>
-      </w:r>
-    </w:p>
-    <w:p>
-      <w:pPr>
-        <w:pStyle w:val="BodyText"/>
-      </w:pPr>
-      <w:r>
-        <w:t xml:space="preserve">Como desdobramento da audiência, a Equipe ficou responsável por coordenar uma mesa de trabalho voltada à elaboração de um plano de cumprimento conjunto, com foco no enfrentamento das fragilidades ainda identificadas no Caso.</w:t>
-      </w:r>
-    </w:p>
-    <w:p>
-      <w:pPr>
-        <w:pStyle w:val="BodyText"/>
-      </w:pPr>
-      <w:r>
-        <w:t xml:space="preserve">Subseção:</w:t>
-      </w:r>
-    </w:p>
-    <w:p>
-      <w:pPr>
-        <w:pStyle w:val="BodyText"/>
-      </w:pPr>
-      <w:r>
-        <w:t xml:space="preserve">Eixos priorizados</w:t>
-      </w:r>
-    </w:p>
-    <w:p>
-      <w:pPr>
-        <w:pStyle w:val="BodyText"/>
-      </w:pPr>
-      <w:r>
-        <w:t xml:space="preserve">Itens para colar:</w:t>
+        <w:t xml:space="preserve">Para contextualização institucional da pauta, a ONASP pode utilizar como pontos de partida as referências públicas abaixo, produzidas pelos próprios órgãos do sistema interamericano:</w:t>
+      </w:r>
+    </w:p>
+    <w:p>
+      <w:pPr>
+        <w:pStyle w:val="BodyText"/>
+      </w:pPr>
+      <w:r>
+        <w:t xml:space="preserve">Links:</w:t>
       </w:r>
     </w:p>
     <w:p>
@@ -4802,7 +4747,7 @@
         </w:numPr>
       </w:pPr>
       <w:r>
-        <w:t xml:space="preserve">Superlotação e ambiência no sistema prisional.</w:t>
+        <w:t xml:space="preserve">O que é a CIDH?: https://www.oas.org/pt/cidh/mandato/que.asp</w:t>
       </w:r>
     </w:p>
     <w:p>
@@ -4814,7 +4759,7 @@
         </w:numPr>
       </w:pPr>
       <w:r>
-        <w:t xml:space="preserve">Dignidade e condições de custódia.</w:t>
+        <w:t xml:space="preserve">O que é a Corte IDH?: https://www.corteidh.or.cr/que_es_la_corte.cfm?lang=pt</w:t>
       </w:r>
     </w:p>
     <w:p>
@@ -4826,7 +4771,7 @@
         </w:numPr>
       </w:pPr>
       <w:r>
-        <w:t xml:space="preserve">Acesso à justiça e prevenção à tortura.</w:t>
+        <w:t xml:space="preserve">Estatuto da Comissão Interamericana de Direitos Humanos: https://www.oas.org/pt/cidh/mandato/Basicos/estatutoCIDH.asp</w:t>
       </w:r>
     </w:p>
     <w:p>
@@ -4838,7 +4783,7 @@
         </w:numPr>
       </w:pPr>
       <w:r>
-        <w:t xml:space="preserve">Monitoramento, participação social e coordenação institucional.</w:t>
+        <w:t xml:space="preserve">Declaração Americana de Direitos e Deveres do Homem: https://www.oas.org/pt/cidh/mandato/Basicos/declaracion.asp</w:t>
       </w:r>
     </w:p>
     <w:p>
@@ -4846,15 +4791,113 @@
         <w:pStyle w:val="FirstParagraph"/>
       </w:pPr>
       <w:r>
-        <w:t xml:space="preserve">Subseção:</w:t>
-      </w:r>
-    </w:p>
-    <w:p>
-      <w:pPr>
-        <w:pStyle w:val="BodyText"/>
-      </w:pPr>
-      <w:r>
-        <w:t xml:space="preserve">Desdobramentos e articulação técnica</w:t>
+        <w:t xml:space="preserve">Seção:</w:t>
+      </w:r>
+    </w:p>
+    <w:bookmarkEnd w:id="29"/>
+    <w:bookmarkStart w:id="30" w:name="subpágina-3---plano-pena-justa"/>
+    <w:p>
+      <w:pPr>
+        <w:pStyle w:val="Heading2"/>
+      </w:pPr>
+      <w:r>
+        <w:t xml:space="preserve">Subpágina 3 - Plano Pena Justa</w:t>
+      </w:r>
+    </w:p>
+    <w:p>
+      <w:pPr>
+        <w:pStyle w:val="FirstParagraph"/>
+      </w:pPr>
+      <w:r>
+        <w:t xml:space="preserve">Título da página:</w:t>
+      </w:r>
+    </w:p>
+    <w:p>
+      <w:pPr>
+        <w:pStyle w:val="BodyText"/>
+      </w:pPr>
+      <w:r>
+        <w:t xml:space="preserve">Plano Pena Justa</w:t>
+      </w:r>
+    </w:p>
+    <w:p>
+      <w:pPr>
+        <w:pStyle w:val="BodyText"/>
+      </w:pPr>
+      <w:r>
+        <w:t xml:space="preserve">Imagem de destaque:</w:t>
+      </w:r>
+    </w:p>
+    <w:p>
+      <w:pPr>
+        <w:pStyle w:val="BodyText"/>
+      </w:pPr>
+      <w:r>
+        <w:t xml:space="preserve">Documentação/Botao_PenaJusta.png</w:t>
+      </w:r>
+    </w:p>
+    <w:p>
+      <w:pPr>
+        <w:pStyle w:val="BodyText"/>
+      </w:pPr>
+      <w:r>
+        <w:t xml:space="preserve">Texto alternativo sugerido:</w:t>
+      </w:r>
+    </w:p>
+    <w:p>
+      <w:pPr>
+        <w:pStyle w:val="BodyText"/>
+      </w:pPr>
+      <w:r>
+        <w:t xml:space="preserve">Marca do Plano Pena Justa.</w:t>
+      </w:r>
+    </w:p>
+    <w:p>
+      <w:pPr>
+        <w:pStyle w:val="BodyText"/>
+      </w:pPr>
+      <w:r>
+        <w:t xml:space="preserve">Identificador editorial:</w:t>
+      </w:r>
+    </w:p>
+    <w:p>
+      <w:pPr>
+        <w:pStyle w:val="BodyText"/>
+      </w:pPr>
+      <w:r>
+        <w:t xml:space="preserve">Conteúdo Técnico e Projetos Estruturantes</w:t>
+      </w:r>
+    </w:p>
+    <w:p>
+      <w:pPr>
+        <w:pStyle w:val="BodyText"/>
+      </w:pPr>
+      <w:r>
+        <w:t xml:space="preserve">Texto de destaque:</w:t>
+      </w:r>
+    </w:p>
+    <w:p>
+      <w:pPr>
+        <w:pStyle w:val="BodyText"/>
+      </w:pPr>
+      <w:r>
+        <w:t xml:space="preserve">As ações específicas da Ouvidoria Nacional de Serviços Penais frente ao Plano Pena Justa, com informações gerais, documentos públicos e marcos relacionados ao fortalecimento das ouvidorias no sistema penal.</w:t>
+      </w:r>
+    </w:p>
+    <w:p>
+      <w:pPr>
+        <w:pStyle w:val="BodyText"/>
+      </w:pPr>
+      <w:r>
+        <w:t xml:space="preserve">Seção:</w:t>
+      </w:r>
+    </w:p>
+    <w:p>
+      <w:pPr>
+        <w:pStyle w:val="BodyText"/>
+      </w:pPr>
+      <w:r>
+        <w:t xml:space="preserve">O Plano</w:t>
       </w:r>
     </w:p>
     <w:p>
@@ -4870,63 +4913,23 @@
         <w:pStyle w:val="BodyText"/>
       </w:pPr>
       <w:r>
-        <w:t xml:space="preserve">Entre novembro e dezembro de 2025, a EMA/Senappen contribuiu para a formalização da mesa de trabalho, participou de reuniões técnicas dedicadas aos eixos temáticos do caso e apoiou a preparação de visita técnica destinada a consolidar diagnósticos e orientar as próximas medidas.</w:t>
-      </w:r>
-    </w:p>
-    <w:p>
-      <w:pPr>
-        <w:pStyle w:val="BodyText"/>
-      </w:pPr>
-      <w:r>
-        <w:t xml:space="preserve">A segunda linha da subseção:</w:t>
-      </w:r>
-    </w:p>
-    <w:p>
-      <w:pPr>
-        <w:pStyle w:val="BodyText"/>
-      </w:pPr>
-      <w:r>
-        <w:t xml:space="preserve">No mesmo contexto, a equipe atuou de forma articulada com o Plano Pena Justa e acompanhou iniciativas voltadas à criação de instâncias permanentes de monitoramento e à padronização de fluxos para acompanhamento de casos internacionais com incidência sobre o sistema penal brasileiro.</w:t>
-      </w:r>
-    </w:p>
-    <w:p>
-      <w:pPr>
-        <w:pStyle w:val="BodyText"/>
-      </w:pPr>
-      <w:r>
-        <w:t xml:space="preserve">Seção:</w:t>
-      </w:r>
-    </w:p>
-    <w:p>
-      <w:pPr>
-        <w:pStyle w:val="BodyText"/>
-      </w:pPr>
-      <w:r>
-        <w:t xml:space="preserve">Referências públicas do SIDH</w:t>
-      </w:r>
-    </w:p>
-    <w:p>
-      <w:pPr>
-        <w:pStyle w:val="BodyText"/>
-      </w:pPr>
-      <w:r>
-        <w:t xml:space="preserve">Texto para colar:</w:t>
-      </w:r>
-    </w:p>
-    <w:p>
-      <w:pPr>
-        <w:pStyle w:val="BodyText"/>
-      </w:pPr>
-      <w:r>
-        <w:t xml:space="preserve">Para contextualização institucional da pauta, a ONASP pode utilizar como pontos de partida as referências públicas abaixo, produzidas pelos próprios órgãos do sistema interamericano:</w:t>
-      </w:r>
-    </w:p>
-    <w:p>
-      <w:pPr>
-        <w:pStyle w:val="BodyText"/>
-      </w:pPr>
-      <w:r>
-        <w:t xml:space="preserve">Links:</w:t>
+        <w:t xml:space="preserve">O Plano Pena Justa é o Plano Nacional para o Enfrentamento do Estado de Coisas Inconstitucional nas Prisões Brasileiras, no âmbito da ADPF 347. Sua proposta articula ações de qualificação das políticas penais, fortalecimento da segurança pública, valorização dos servidores penais, transparência, participação social e monitoramento das metas pactuadas.</w:t>
+      </w:r>
+    </w:p>
+    <w:p>
+      <w:pPr>
+        <w:pStyle w:val="BodyText"/>
+      </w:pPr>
+      <w:r>
+        <w:t xml:space="preserve">Na perspectiva da Ouvidoria Nacional de Serviços Penais, esta subpágina reúne referências públicas do Plano voltadas ao fortalecimento da participação social, da escuta qualificada e da articulação entre as ouvidorias dos serviços penais nos Estados e no Distrito Federal.</w:t>
+      </w:r>
+    </w:p>
+    <w:p>
+      <w:pPr>
+        <w:pStyle w:val="BodyText"/>
+      </w:pPr>
+      <w:r>
+        <w:t xml:space="preserve">Imagem institucional a inserir logo abaixo do texto introdutório:</w:t>
       </w:r>
     </w:p>
     <w:p>
@@ -4938,7 +4941,16 @@
         </w:numPr>
       </w:pPr>
       <w:r>
-        <w:t xml:space="preserve">O que é a CIDH?: https://www.oas.org/pt/cidh/mandato/que.asp</w:t>
+        <w:t xml:space="preserve">Imagem:</w:t>
+      </w:r>
+      <w:r>
+        <w:t xml:space="preserve"> </w:t>
+      </w:r>
+      <w:r>
+        <w:rPr>
+          <w:rStyle w:val="VerbatimChar"/>
+        </w:rPr>
+        <w:t xml:space="preserve">Documentação/Banner_PenaJusta_f1.jpg</w:t>
       </w:r>
     </w:p>
     <w:p>
@@ -4950,7 +4962,7 @@
         </w:numPr>
       </w:pPr>
       <w:r>
-        <w:t xml:space="preserve">O que é a Corte IDH?: https://www.corteidh.or.cr/que_es_la_corte.cfm?lang=pt</w:t>
+        <w:t xml:space="preserve">Texto de apoio acima da imagem: O registro abaixo documenta agenda institucional relacionada ao Plano Pena Justa e evidencia a participação da Onasp nos espaços de apresentação e articulação vinculados à ADPF 347.</w:t>
       </w:r>
     </w:p>
     <w:p>
@@ -4962,19 +4974,7 @@
         </w:numPr>
       </w:pPr>
       <w:r>
-        <w:t xml:space="preserve">Estatuto da Comissão Interamericana de Direitos Humanos: https://www.oas.org/pt/cidh/mandato/Basicos/estatutoCIDH.asp</w:t>
-      </w:r>
-    </w:p>
-    <w:p>
-      <w:pPr>
-        <w:pStyle w:val="Compact"/>
-        <w:numPr>
-          <w:ilvl w:val="0"/>
-          <w:numId w:val="1016"/>
-        </w:numPr>
-      </w:pPr>
-      <w:r>
-        <w:t xml:space="preserve">Declaração Americana de Direitos e Deveres do Homem: https://www.oas.org/pt/cidh/mandato/Basicos/declaracion.asp</w:t>
+        <w:t xml:space="preserve">Texto de apoio abaixo da imagem: A presença dessa imagem reforça o caráter interinstitucional do Plano e a atuação da Ouvidoria em agendas de coordenação, acompanhamento e diálogo sobre a implementação das medidas pactuadas.</w:t>
       </w:r>
     </w:p>
     <w:p>
@@ -4985,110 +4985,12 @@
         <w:t xml:space="preserve">Seção:</w:t>
       </w:r>
     </w:p>
-    <w:bookmarkEnd w:id="30"/>
-    <w:bookmarkStart w:id="31" w:name="subpágina-3---plano-pena-justa"/>
-    <w:p>
-      <w:pPr>
-        <w:pStyle w:val="Heading2"/>
-      </w:pPr>
-      <w:r>
-        <w:t xml:space="preserve">Subpágina 3 - Plano Pena Justa</w:t>
-      </w:r>
-    </w:p>
-    <w:p>
-      <w:pPr>
-        <w:pStyle w:val="FirstParagraph"/>
-      </w:pPr>
-      <w:r>
-        <w:t xml:space="preserve">Título da página:</w:t>
-      </w:r>
-    </w:p>
-    <w:p>
-      <w:pPr>
-        <w:pStyle w:val="BodyText"/>
-      </w:pPr>
-      <w:r>
-        <w:t xml:space="preserve">Plano Pena Justa</w:t>
-      </w:r>
-    </w:p>
-    <w:p>
-      <w:pPr>
-        <w:pStyle w:val="BodyText"/>
-      </w:pPr>
-      <w:r>
-        <w:t xml:space="preserve">Imagem de destaque:</w:t>
-      </w:r>
-    </w:p>
-    <w:p>
-      <w:pPr>
-        <w:pStyle w:val="BodyText"/>
-      </w:pPr>
-      <w:r>
-        <w:t xml:space="preserve">Documentação/Botao_PenaJusta.png</w:t>
-      </w:r>
-    </w:p>
-    <w:p>
-      <w:pPr>
-        <w:pStyle w:val="BodyText"/>
-      </w:pPr>
-      <w:r>
-        <w:t xml:space="preserve">Texto alternativo sugerido:</w:t>
-      </w:r>
-    </w:p>
-    <w:p>
-      <w:pPr>
-        <w:pStyle w:val="BodyText"/>
-      </w:pPr>
-      <w:r>
-        <w:t xml:space="preserve">Marca do Plano Pena Justa.</w:t>
-      </w:r>
-    </w:p>
-    <w:p>
-      <w:pPr>
-        <w:pStyle w:val="BodyText"/>
-      </w:pPr>
-      <w:r>
-        <w:t xml:space="preserve">Identificador editorial:</w:t>
-      </w:r>
-    </w:p>
-    <w:p>
-      <w:pPr>
-        <w:pStyle w:val="BodyText"/>
-      </w:pPr>
-      <w:r>
-        <w:t xml:space="preserve">Conteúdo Técnico e Projetos Estruturantes</w:t>
-      </w:r>
-    </w:p>
-    <w:p>
-      <w:pPr>
-        <w:pStyle w:val="BodyText"/>
-      </w:pPr>
-      <w:r>
-        <w:t xml:space="preserve">Texto de destaque:</w:t>
-      </w:r>
-    </w:p>
-    <w:p>
-      <w:pPr>
-        <w:pStyle w:val="BodyText"/>
-      </w:pPr>
-      <w:r>
-        <w:t xml:space="preserve">Ambiente dedicado ao Plano Pena Justa, com informações gerais, documentos públicos e marcos relacionados ao fortalecimento das ouvidorias no sistema penal.</w:t>
-      </w:r>
-    </w:p>
-    <w:p>
-      <w:pPr>
-        <w:pStyle w:val="BodyText"/>
-      </w:pPr>
-      <w:r>
-        <w:t xml:space="preserve">Seção:</w:t>
-      </w:r>
-    </w:p>
-    <w:p>
-      <w:pPr>
-        <w:pStyle w:val="BodyText"/>
-      </w:pPr>
-      <w:r>
-        <w:t xml:space="preserve">O Plano</w:t>
+    <w:p>
+      <w:pPr>
+        <w:pStyle w:val="BodyText"/>
+      </w:pPr>
+      <w:r>
+        <w:t xml:space="preserve">Eixos de atuação</w:t>
       </w:r>
     </w:p>
     <w:p>
@@ -5104,23 +5006,7 @@
         <w:pStyle w:val="BodyText"/>
       </w:pPr>
       <w:r>
-        <w:t xml:space="preserve">O Plano Pena Justa é o Plano Nacional para o Enfrentamento do Estado de Coisas Inconstitucional nas Prisões Brasileiras, no âmbito da ADPF 347. Sua proposta articula ações de qualificação das políticas penais, fortalecimento da segurança pública, valorização dos servidores penais, transparência, participação social e monitoramento das metas pactuadas.</w:t>
-      </w:r>
-    </w:p>
-    <w:p>
-      <w:pPr>
-        <w:pStyle w:val="BodyText"/>
-      </w:pPr>
-      <w:r>
-        <w:t xml:space="preserve">Na perspectiva da Ouvidoria Nacional de Serviços Penais, esta subpágina reúne referências públicas do Plano voltadas ao fortalecimento da participação social, da escuta qualificada e da articulação entre as ouvidorias dos serviços penais nos Estados e no Distrito Federal.</w:t>
-      </w:r>
-    </w:p>
-    <w:p>
-      <w:pPr>
-        <w:pStyle w:val="BodyText"/>
-      </w:pPr>
-      <w:r>
-        <w:t xml:space="preserve">Imagem institucional a inserir logo abaixo do texto introdutório:</w:t>
+        <w:t xml:space="preserve">O Plano Nacional organiza sua atuação em quatro eixos estruturantes:</w:t>
       </w:r>
     </w:p>
     <w:p>
@@ -5132,16 +5018,7 @@
         </w:numPr>
       </w:pPr>
       <w:r>
-        <w:t xml:space="preserve">Imagem:</w:t>
-      </w:r>
-      <w:r>
-        <w:t xml:space="preserve"> </w:t>
-      </w:r>
-      <w:r>
-        <w:rPr>
-          <w:rStyle w:val="VerbatimChar"/>
-        </w:rPr>
-        <w:t xml:space="preserve">Documentação/Banner_PenaJusta_f1.jpg</w:t>
+        <w:t xml:space="preserve">Controle da entrada e das vagas do sistema prisional.</w:t>
       </w:r>
     </w:p>
     <w:p>
@@ -5153,7 +5030,7 @@
         </w:numPr>
       </w:pPr>
       <w:r>
-        <w:t xml:space="preserve">Texto de apoio acima da imagem: O registro abaixo documenta agenda institucional relacionada ao Plano Pena Justa e evidencia a participação da Onasp nos espaços de apresentação e articulação vinculados à ADPF 347.</w:t>
+        <w:t xml:space="preserve">Qualidade da ambiência, dos serviços prestados e da estrutura prisional.</w:t>
       </w:r>
     </w:p>
     <w:p>
@@ -5165,7 +5042,19 @@
         </w:numPr>
       </w:pPr>
       <w:r>
-        <w:t xml:space="preserve">Texto de apoio abaixo da imagem: A presença dessa imagem reforça o caráter interinstitucional do Plano e a atuação da Ouvidoria em agendas de coordenação, acompanhamento e diálogo sobre a implementação das medidas pactuadas.</w:t>
+        <w:t xml:space="preserve">Processos de saída da prisão e de reintegração social.</w:t>
+      </w:r>
+    </w:p>
+    <w:p>
+      <w:pPr>
+        <w:pStyle w:val="Compact"/>
+        <w:numPr>
+          <w:ilvl w:val="0"/>
+          <w:numId w:val="1017"/>
+        </w:numPr>
+      </w:pPr>
+      <w:r>
+        <w:t xml:space="preserve">Políticas de não repetição do Estado de Coisas Inconstitucional no sistema prisional.</w:t>
       </w:r>
     </w:p>
     <w:p>
@@ -5173,31 +5062,7 @@
         <w:pStyle w:val="FirstParagraph"/>
       </w:pPr>
       <w:r>
-        <w:t xml:space="preserve">Seção:</w:t>
-      </w:r>
-    </w:p>
-    <w:p>
-      <w:pPr>
-        <w:pStyle w:val="BodyText"/>
-      </w:pPr>
-      <w:r>
-        <w:t xml:space="preserve">Eixos de atuação</w:t>
-      </w:r>
-    </w:p>
-    <w:p>
-      <w:pPr>
-        <w:pStyle w:val="BodyText"/>
-      </w:pPr>
-      <w:r>
-        <w:t xml:space="preserve">Texto para colar:</w:t>
-      </w:r>
-    </w:p>
-    <w:p>
-      <w:pPr>
-        <w:pStyle w:val="BodyText"/>
-      </w:pPr>
-      <w:r>
-        <w:t xml:space="preserve">O Plano Nacional organiza sua atuação em quatro eixos estruturantes:</w:t>
+        <w:t xml:space="preserve">Quadro de apoio a inserir logo abaixo da lista de eixos:</w:t>
       </w:r>
     </w:p>
     <w:p>
@@ -5209,7 +5074,16 @@
         </w:numPr>
       </w:pPr>
       <w:r>
-        <w:t xml:space="preserve">Controle da entrada e das vagas do sistema prisional.</w:t>
+        <w:t xml:space="preserve">Imagem:</w:t>
+      </w:r>
+      <w:r>
+        <w:t xml:space="preserve"> </w:t>
+      </w:r>
+      <w:r>
+        <w:rPr>
+          <w:rStyle w:val="VerbatimChar"/>
+        </w:rPr>
+        <w:t xml:space="preserve">Documentação/Plano_pena_justa.png</w:t>
       </w:r>
     </w:p>
     <w:p>
@@ -5221,7 +5095,7 @@
         </w:numPr>
       </w:pPr>
       <w:r>
-        <w:t xml:space="preserve">Qualidade da ambiência, dos serviços prestados e da estrutura prisional.</w:t>
+        <w:t xml:space="preserve">Texto de apoio acima da imagem: O quadro abaixo sintetiza medidas, metas e atores estratégicos dos eixos 2 e 4 com incidência direta sobre transparência, escuta institucional, canais de denúncia e fortalecimento das ouvidorias no sistema penal.</w:t>
       </w:r>
     </w:p>
     <w:p>
@@ -5233,19 +5107,7 @@
         </w:numPr>
       </w:pPr>
       <w:r>
-        <w:t xml:space="preserve">Processos de saída da prisão e de reintegração social.</w:t>
-      </w:r>
-    </w:p>
-    <w:p>
-      <w:pPr>
-        <w:pStyle w:val="Compact"/>
-        <w:numPr>
-          <w:ilvl w:val="0"/>
-          <w:numId w:val="1018"/>
-        </w:numPr>
-      </w:pPr>
-      <w:r>
-        <w:t xml:space="preserve">Políticas de não repetição do Estado de Coisas Inconstitucional no sistema prisional.</w:t>
+        <w:t xml:space="preserve">Texto de apoio abaixo da imagem: No recorte de interesse da Onasp, o quadro destaca especialmente medidas voltadas à qualificação dos serviços prestados nas prisões, à institucionalização de canais efetivos de denúncia, à criação e estruturação de ouvidorias estaduais e ao fortalecimento de políticas de não repetição.</w:t>
       </w:r>
     </w:p>
     <w:p>
@@ -5253,7 +5115,255 @@
         <w:pStyle w:val="FirstParagraph"/>
       </w:pPr>
       <w:r>
-        <w:t xml:space="preserve">Quadro de apoio a inserir logo abaixo da lista de eixos:</w:t>
+        <w:t xml:space="preserve">Seção:</w:t>
+      </w:r>
+    </w:p>
+    <w:p>
+      <w:pPr>
+        <w:pStyle w:val="BodyText"/>
+      </w:pPr>
+      <w:r>
+        <w:t xml:space="preserve">Governança e acompanhamento</w:t>
+      </w:r>
+    </w:p>
+    <w:p>
+      <w:pPr>
+        <w:pStyle w:val="BodyText"/>
+      </w:pPr>
+      <w:r>
+        <w:t xml:space="preserve">Texto para colar:</w:t>
+      </w:r>
+    </w:p>
+    <w:p>
+      <w:pPr>
+        <w:pStyle w:val="BodyText"/>
+      </w:pPr>
+      <w:r>
+        <w:t xml:space="preserve">No recorte da Ouvidoria Nacional de Serviços Penais, o acompanhamento do Pena Justa prioriza instrumentos que fortaleçam a escuta qualificada, a transparência ativa e a coordenação entre as ouvidorias dos serviços penais.</w:t>
+      </w:r>
+    </w:p>
+    <w:p>
+      <w:pPr>
+        <w:pStyle w:val="BodyText"/>
+      </w:pPr>
+      <w:r>
+        <w:t xml:space="preserve">Esse recorte se materializa por meio de marcos normativos e de cooperação técnica que estruturam parâmetros mínimos de atuação, incentivam integração preferencial ao Fala.BR e consolidam uma rede permanente de intercâmbio entre União, Estados e Distrito Federal.</w:t>
+      </w:r>
+    </w:p>
+    <w:p>
+      <w:pPr>
+        <w:pStyle w:val="BodyText"/>
+      </w:pPr>
+      <w:r>
+        <w:t xml:space="preserve">Seção:</w:t>
+      </w:r>
+    </w:p>
+    <w:p>
+      <w:pPr>
+        <w:pStyle w:val="BodyText"/>
+      </w:pPr>
+      <w:r>
+        <w:t xml:space="preserve">Entregas já formalizadas</w:t>
+      </w:r>
+    </w:p>
+    <w:p>
+      <w:pPr>
+        <w:pStyle w:val="BodyText"/>
+      </w:pPr>
+      <w:r>
+        <w:t xml:space="preserve">Texto para colar:</w:t>
+      </w:r>
+    </w:p>
+    <w:p>
+      <w:pPr>
+        <w:pStyle w:val="BodyText"/>
+      </w:pPr>
+      <w:r>
+        <w:t xml:space="preserve">No campo das ouvidorias e da participação social, o Pena Justa já reúne marcos normativos que podem ser destacados nesta página:</w:t>
+      </w:r>
+    </w:p>
+    <w:p>
+      <w:pPr>
+        <w:pStyle w:val="BodyText"/>
+      </w:pPr>
+      <w:r>
+        <w:t xml:space="preserve">Subtítulo:</w:t>
+      </w:r>
+    </w:p>
+    <w:p>
+      <w:pPr>
+        <w:pStyle w:val="BodyText"/>
+      </w:pPr>
+      <w:r>
+        <w:t xml:space="preserve">Normativo publicado</w:t>
+      </w:r>
+    </w:p>
+    <w:p>
+      <w:pPr>
+        <w:pStyle w:val="BodyText"/>
+      </w:pPr>
+      <w:r>
+        <w:t xml:space="preserve">Título:</w:t>
+      </w:r>
+    </w:p>
+    <w:p>
+      <w:pPr>
+        <w:pStyle w:val="BodyText"/>
+      </w:pPr>
+      <w:r>
+        <w:t xml:space="preserve">Instrução Normativa nº 75/2026</w:t>
+      </w:r>
+    </w:p>
+    <w:p>
+      <w:pPr>
+        <w:pStyle w:val="BodyText"/>
+      </w:pPr>
+      <w:r>
+        <w:t xml:space="preserve">Texto para colar:</w:t>
+      </w:r>
+    </w:p>
+    <w:p>
+      <w:pPr>
+        <w:pStyle w:val="BodyText"/>
+      </w:pPr>
+      <w:r>
+        <w:t xml:space="preserve">Estabelece parâmetros mínimos para a criação e a estruturação de Ouvidorias de Serviços Penais nos Estados e no Distrito Federal, com diretrizes de autonomia, transparência, acessibilidade e integração preferencial ao Fala.BR.</w:t>
+      </w:r>
+    </w:p>
+    <w:p>
+      <w:pPr>
+        <w:pStyle w:val="BodyText"/>
+      </w:pPr>
+      <w:r>
+        <w:t xml:space="preserve">Link:</w:t>
+      </w:r>
+    </w:p>
+    <w:p>
+      <w:pPr>
+        <w:pStyle w:val="BodyText"/>
+      </w:pPr>
+      <w:r>
+        <w:t xml:space="preserve">Acessar a Instrução Normativa (PDF)</w:t>
+      </w:r>
+    </w:p>
+    <w:p>
+      <w:pPr>
+        <w:pStyle w:val="BodyText"/>
+      </w:pPr>
+      <w:r>
+        <w:t xml:space="preserve">Arquivo:</w:t>
+      </w:r>
+    </w:p>
+    <w:p>
+      <w:pPr>
+        <w:pStyle w:val="BodyText"/>
+      </w:pPr>
+      <w:r>
+        <w:t xml:space="preserve">Subpages/Pena_justa/SEI_35153985_Instrucao_Normativa_75.pdf</w:t>
+      </w:r>
+    </w:p>
+    <w:p>
+      <w:pPr>
+        <w:pStyle w:val="BodyText"/>
+      </w:pPr>
+      <w:r>
+        <w:t xml:space="preserve">Subtítulo:</w:t>
+      </w:r>
+    </w:p>
+    <w:p>
+      <w:pPr>
+        <w:pStyle w:val="BodyText"/>
+      </w:pPr>
+      <w:r>
+        <w:t xml:space="preserve">Rede instituída</w:t>
+      </w:r>
+    </w:p>
+    <w:p>
+      <w:pPr>
+        <w:pStyle w:val="BodyText"/>
+      </w:pPr>
+      <w:r>
+        <w:t xml:space="preserve">Título:</w:t>
+      </w:r>
+    </w:p>
+    <w:p>
+      <w:pPr>
+        <w:pStyle w:val="BodyText"/>
+      </w:pPr>
+      <w:r>
+        <w:t xml:space="preserve">Portaria nº 549/2026</w:t>
+      </w:r>
+    </w:p>
+    <w:p>
+      <w:pPr>
+        <w:pStyle w:val="BodyText"/>
+      </w:pPr>
+      <w:r>
+        <w:t xml:space="preserve">Texto para colar:</w:t>
+      </w:r>
+    </w:p>
+    <w:p>
+      <w:pPr>
+        <w:pStyle w:val="BodyText"/>
+      </w:pPr>
+      <w:r>
+        <w:t xml:space="preserve">Institui a Rede Nacional de Ouvidorias de Serviços Penais - Renospen, como instância permanente de cooperação técnica, intercâmbio de informações e fortalecimento institucional das ouvidorias no sistema penal.</w:t>
+      </w:r>
+    </w:p>
+    <w:p>
+      <w:pPr>
+        <w:pStyle w:val="BodyText"/>
+      </w:pPr>
+      <w:r>
+        <w:t xml:space="preserve">Link:</w:t>
+      </w:r>
+    </w:p>
+    <w:p>
+      <w:pPr>
+        <w:pStyle w:val="BodyText"/>
+      </w:pPr>
+      <w:r>
+        <w:t xml:space="preserve">Acessar a Portaria (PDF)</w:t>
+      </w:r>
+    </w:p>
+    <w:p>
+      <w:pPr>
+        <w:pStyle w:val="BodyText"/>
+      </w:pPr>
+      <w:r>
+        <w:t xml:space="preserve">Arquivo:</w:t>
+      </w:r>
+    </w:p>
+    <w:p>
+      <w:pPr>
+        <w:pStyle w:val="BodyText"/>
+      </w:pPr>
+      <w:r>
+        <w:t xml:space="preserve">Subpages/Pena_justa/SEI_35032761_Portaria_549.pdf</w:t>
+      </w:r>
+    </w:p>
+    <w:p>
+      <w:pPr>
+        <w:pStyle w:val="BodyText"/>
+      </w:pPr>
+      <w:r>
+        <w:t xml:space="preserve">Seção:</w:t>
+      </w:r>
+    </w:p>
+    <w:p>
+      <w:pPr>
+        <w:pStyle w:val="BodyText"/>
+      </w:pPr>
+      <w:r>
+        <w:t xml:space="preserve">Documentos públicos de referência</w:t>
+      </w:r>
+    </w:p>
+    <w:p>
+      <w:pPr>
+        <w:pStyle w:val="BodyText"/>
+      </w:pPr>
+      <w:r>
+        <w:t xml:space="preserve">Links:</w:t>
       </w:r>
     </w:p>
     <w:p>
@@ -5265,16 +5375,7 @@
         </w:numPr>
       </w:pPr>
       <w:r>
-        <w:t xml:space="preserve">Imagem:</w:t>
-      </w:r>
-      <w:r>
-        <w:t xml:space="preserve"> </w:t>
-      </w:r>
-      <w:r>
-        <w:rPr>
-          <w:rStyle w:val="VerbatimChar"/>
-        </w:rPr>
-        <w:t xml:space="preserve">Documentação/Plano_pena_justa.png</w:t>
+        <w:t xml:space="preserve">Plano Nacional Pena Justa (PDF): Subpages/Pena_justa/Plano_Nacional_Pena_Justa.pdf</w:t>
       </w:r>
     </w:p>
     <w:p>
@@ -5286,19 +5387,17 @@
         </w:numPr>
       </w:pPr>
       <w:r>
-        <w:t xml:space="preserve">Texto de apoio acima da imagem: O quadro abaixo sintetiza medidas, metas e atores estratégicos dos eixos 2 e 4 com incidência direta sobre transparência, escuta institucional, canais de denúncia e fortalecimento das ouvidorias no sistema penal.</w:t>
-      </w:r>
-    </w:p>
-    <w:p>
-      <w:pPr>
-        <w:pStyle w:val="Compact"/>
-        <w:numPr>
-          <w:ilvl w:val="0"/>
-          <w:numId w:val="1019"/>
-        </w:numPr>
-      </w:pPr>
-      <w:r>
-        <w:t xml:space="preserve">Texto de apoio abaixo da imagem: No recorte de interesse da Onasp, o quadro destaca especialmente medidas voltadas à qualificação dos serviços prestados nas prisões, à institucionalização de canais efetivos de denúncia, à criação e estruturação de ouvidorias estaduais e ao fortalecimento de políticas de não repetição.</w:t>
+        <w:t xml:space="preserve">10 coisas que você precisa saber sobre o Pena Justa (PDF): Subpages/Pena_justa/10_Coisas_que_você_precisa_saber_sobre_o_Pena_Justa.pdf</w:t>
+      </w:r>
+    </w:p>
+    <w:bookmarkEnd w:id="30"/>
+    <w:bookmarkStart w:id="31" w:name="X9010218d04cc9bed3b5085cf6721dd78b5ea4ec"/>
+    <w:p>
+      <w:pPr>
+        <w:pStyle w:val="Heading2"/>
+      </w:pPr>
+      <w:r>
+        <w:t xml:space="preserve">Subpágina 4 - Revista Brasileira de Execução Penal</w:t>
       </w:r>
     </w:p>
     <w:p>
@@ -5306,6 +5405,86 @@
         <w:pStyle w:val="FirstParagraph"/>
       </w:pPr>
       <w:r>
+        <w:t xml:space="preserve">Título da página:</w:t>
+      </w:r>
+    </w:p>
+    <w:p>
+      <w:pPr>
+        <w:pStyle w:val="BodyText"/>
+      </w:pPr>
+      <w:r>
+        <w:t xml:space="preserve">Revista Brasileira de Execução Penal</w:t>
+      </w:r>
+    </w:p>
+    <w:p>
+      <w:pPr>
+        <w:pStyle w:val="BodyText"/>
+      </w:pPr>
+      <w:r>
+        <w:t xml:space="preserve">Imagem de destaque:</w:t>
+      </w:r>
+    </w:p>
+    <w:p>
+      <w:pPr>
+        <w:pStyle w:val="BodyText"/>
+      </w:pPr>
+      <w:r>
+        <w:t xml:space="preserve">Documentação/Botao_RevistaBrasileira.png</w:t>
+      </w:r>
+    </w:p>
+    <w:p>
+      <w:pPr>
+        <w:pStyle w:val="BodyText"/>
+      </w:pPr>
+      <w:r>
+        <w:t xml:space="preserve">Texto alternativo sugerido:</w:t>
+      </w:r>
+    </w:p>
+    <w:p>
+      <w:pPr>
+        <w:pStyle w:val="BodyText"/>
+      </w:pPr>
+      <w:r>
+        <w:t xml:space="preserve">Botão institucional da Revista Brasileira de Execução Penal.</w:t>
+      </w:r>
+    </w:p>
+    <w:p>
+      <w:pPr>
+        <w:pStyle w:val="BodyText"/>
+      </w:pPr>
+      <w:r>
+        <w:t xml:space="preserve">Identificador editorial:</w:t>
+      </w:r>
+    </w:p>
+    <w:p>
+      <w:pPr>
+        <w:pStyle w:val="BodyText"/>
+      </w:pPr>
+      <w:r>
+        <w:t xml:space="preserve">Conteúdo Técnico e Projetos Estruturantes</w:t>
+      </w:r>
+    </w:p>
+    <w:p>
+      <w:pPr>
+        <w:pStyle w:val="BodyText"/>
+      </w:pPr>
+      <w:r>
+        <w:t xml:space="preserve">Texto de destaque:</w:t>
+      </w:r>
+    </w:p>
+    <w:p>
+      <w:pPr>
+        <w:pStyle w:val="BodyText"/>
+      </w:pPr>
+      <w:r>
+        <w:t xml:space="preserve">Dossiê temático voltado ao diálogo entre comunicação social, participação social e os serviços de ouvidorias penais.</w:t>
+      </w:r>
+    </w:p>
+    <w:p>
+      <w:pPr>
+        <w:pStyle w:val="BodyText"/>
+      </w:pPr>
+      <w:r>
         <w:t xml:space="preserve">Seção:</w:t>
       </w:r>
     </w:p>
@@ -5314,7 +5493,7 @@
         <w:pStyle w:val="BodyText"/>
       </w:pPr>
       <w:r>
-        <w:t xml:space="preserve">Governança e acompanhamento</w:t>
+        <w:t xml:space="preserve">A Revista</w:t>
       </w:r>
     </w:p>
     <w:p>
@@ -5330,15 +5509,23 @@
         <w:pStyle w:val="BodyText"/>
       </w:pPr>
       <w:r>
-        <w:t xml:space="preserve">No recorte da Ouvidoria Nacional de Serviços Penais, o acompanhamento do Pena Justa prioriza instrumentos que fortaleçam a escuta qualificada, a transparência ativa e a coordenação entre as ouvidorias dos serviços penais.</w:t>
-      </w:r>
-    </w:p>
-    <w:p>
-      <w:pPr>
-        <w:pStyle w:val="BodyText"/>
-      </w:pPr>
-      <w:r>
-        <w:t xml:space="preserve">Esse recorte se materializa por meio de marcos normativos e de cooperação técnica que estruturam parâmetros mínimos de atuação, incentivam integração preferencial ao Fala.BR e consolidam uma rede permanente de intercâmbio entre União, Estados e Distrito Federal.</w:t>
+        <w:t xml:space="preserve">A Revista Brasileira de Execução Penal é o periódico técnico-científico da Secretaria Nacional de Políticas Penais (Senappen/MJSP) e constitui espaço de circulação de artigos, documentos inéditos, entrevistas, relatos de experiência e boas práticas relacionados à execução penal.</w:t>
+      </w:r>
+    </w:p>
+    <w:p>
+      <w:pPr>
+        <w:pStyle w:val="BodyText"/>
+      </w:pPr>
+      <w:r>
+        <w:t xml:space="preserve">A segunda linha do escopo:</w:t>
+      </w:r>
+    </w:p>
+    <w:p>
+      <w:pPr>
+        <w:pStyle w:val="BodyText"/>
+      </w:pPr>
+      <w:r>
+        <w:t xml:space="preserve">No contexto da Ouvidoria, a publicação contribui para aproximar produção técnica, debate qualificado e controle social, reforçando o papel da Ouvidoria como ponte entre Estado e sociedade.</w:t>
       </w:r>
     </w:p>
     <w:p>
@@ -5354,7 +5541,7 @@
         <w:pStyle w:val="BodyText"/>
       </w:pPr>
       <w:r>
-        <w:t xml:space="preserve">Entregas já formalizadas</w:t>
+        <w:t xml:space="preserve">Sobre a revista</w:t>
       </w:r>
     </w:p>
     <w:p>
@@ -5370,39 +5557,39 @@
         <w:pStyle w:val="BodyText"/>
       </w:pPr>
       <w:r>
-        <w:t xml:space="preserve">No campo das ouvidorias e da participação social, o Pena Justa já reúne marcos normativos que podem ser destacados nesta página:</w:t>
-      </w:r>
-    </w:p>
-    <w:p>
-      <w:pPr>
-        <w:pStyle w:val="BodyText"/>
-      </w:pPr>
-      <w:r>
-        <w:t xml:space="preserve">Subtítulo:</w:t>
-      </w:r>
-    </w:p>
-    <w:p>
-      <w:pPr>
-        <w:pStyle w:val="BodyText"/>
-      </w:pPr>
-      <w:r>
-        <w:t xml:space="preserve">Normativo publicado</w:t>
-      </w:r>
-    </w:p>
-    <w:p>
-      <w:pPr>
-        <w:pStyle w:val="BodyText"/>
-      </w:pPr>
-      <w:r>
-        <w:t xml:space="preserve">Título:</w:t>
-      </w:r>
-    </w:p>
-    <w:p>
-      <w:pPr>
-        <w:pStyle w:val="BodyText"/>
-      </w:pPr>
-      <w:r>
-        <w:t xml:space="preserve">Instrução Normativa nº 75/2026</w:t>
+        <w:t xml:space="preserve">A RBEP publica artigos, documentos inéditos, entrevistas, relatos de experiência e descrição de boas práticas que relacionam a experiência profissional, o conhecimento produzido sobre a matéria e o cumprimento da legislação nacional.</w:t>
+      </w:r>
+    </w:p>
+    <w:p>
+      <w:pPr>
+        <w:pStyle w:val="BodyText"/>
+      </w:pPr>
+      <w:r>
+        <w:t xml:space="preserve">A segunda linha da seção:</w:t>
+      </w:r>
+    </w:p>
+    <w:p>
+      <w:pPr>
+        <w:pStyle w:val="BodyText"/>
+      </w:pPr>
+      <w:r>
+        <w:t xml:space="preserve">Os conteúdos são organizados em dossiês temáticos semestrais, e a revista recebeu qualificação A4 na classificação de periódicos Qualis Capes na avaliação do quadriênio 2021-2024.</w:t>
+      </w:r>
+    </w:p>
+    <w:p>
+      <w:pPr>
+        <w:pStyle w:val="BodyText"/>
+      </w:pPr>
+      <w:r>
+        <w:t xml:space="preserve">Seção:</w:t>
+      </w:r>
+    </w:p>
+    <w:p>
+      <w:pPr>
+        <w:pStyle w:val="BodyText"/>
+      </w:pPr>
+      <w:r>
+        <w:t xml:space="preserve">Acesso oficial à RBEP</w:t>
       </w:r>
     </w:p>
     <w:p>
@@ -5418,135 +5605,7 @@
         <w:pStyle w:val="BodyText"/>
       </w:pPr>
       <w:r>
-        <w:t xml:space="preserve">Estabelece parâmetros mínimos para a criação e a estruturação de Ouvidorias de Serviços Penais nos Estados e no Distrito Federal, com diretrizes de autonomia, transparência, acessibilidade e integração preferencial ao Fala.BR.</w:t>
-      </w:r>
-    </w:p>
-    <w:p>
-      <w:pPr>
-        <w:pStyle w:val="BodyText"/>
-      </w:pPr>
-      <w:r>
-        <w:t xml:space="preserve">Link:</w:t>
-      </w:r>
-    </w:p>
-    <w:p>
-      <w:pPr>
-        <w:pStyle w:val="BodyText"/>
-      </w:pPr>
-      <w:r>
-        <w:t xml:space="preserve">Acessar a Instrução Normativa (PDF)</w:t>
-      </w:r>
-    </w:p>
-    <w:p>
-      <w:pPr>
-        <w:pStyle w:val="BodyText"/>
-      </w:pPr>
-      <w:r>
-        <w:t xml:space="preserve">Arquivo:</w:t>
-      </w:r>
-    </w:p>
-    <w:p>
-      <w:pPr>
-        <w:pStyle w:val="BodyText"/>
-      </w:pPr>
-      <w:r>
-        <w:t xml:space="preserve">Subpages/Pena_justa/SEI_35153985_Instrucao_Normativa_75.pdf</w:t>
-      </w:r>
-    </w:p>
-    <w:p>
-      <w:pPr>
-        <w:pStyle w:val="BodyText"/>
-      </w:pPr>
-      <w:r>
-        <w:t xml:space="preserve">Subtítulo:</w:t>
-      </w:r>
-    </w:p>
-    <w:p>
-      <w:pPr>
-        <w:pStyle w:val="BodyText"/>
-      </w:pPr>
-      <w:r>
-        <w:t xml:space="preserve">Rede instituída</w:t>
-      </w:r>
-    </w:p>
-    <w:p>
-      <w:pPr>
-        <w:pStyle w:val="BodyText"/>
-      </w:pPr>
-      <w:r>
-        <w:t xml:space="preserve">Título:</w:t>
-      </w:r>
-    </w:p>
-    <w:p>
-      <w:pPr>
-        <w:pStyle w:val="BodyText"/>
-      </w:pPr>
-      <w:r>
-        <w:t xml:space="preserve">Portaria nº 549/2026</w:t>
-      </w:r>
-    </w:p>
-    <w:p>
-      <w:pPr>
-        <w:pStyle w:val="BodyText"/>
-      </w:pPr>
-      <w:r>
-        <w:t xml:space="preserve">Texto para colar:</w:t>
-      </w:r>
-    </w:p>
-    <w:p>
-      <w:pPr>
-        <w:pStyle w:val="BodyText"/>
-      </w:pPr>
-      <w:r>
-        <w:t xml:space="preserve">Institui a Rede Nacional de Ouvidorias de Serviços Penais - Renospen, como instância permanente de cooperação técnica, intercâmbio de informações e fortalecimento institucional das ouvidorias no sistema penal.</w:t>
-      </w:r>
-    </w:p>
-    <w:p>
-      <w:pPr>
-        <w:pStyle w:val="BodyText"/>
-      </w:pPr>
-      <w:r>
-        <w:t xml:space="preserve">Link:</w:t>
-      </w:r>
-    </w:p>
-    <w:p>
-      <w:pPr>
-        <w:pStyle w:val="BodyText"/>
-      </w:pPr>
-      <w:r>
-        <w:t xml:space="preserve">Acessar a Portaria (PDF)</w:t>
-      </w:r>
-    </w:p>
-    <w:p>
-      <w:pPr>
-        <w:pStyle w:val="BodyText"/>
-      </w:pPr>
-      <w:r>
-        <w:t xml:space="preserve">Arquivo:</w:t>
-      </w:r>
-    </w:p>
-    <w:p>
-      <w:pPr>
-        <w:pStyle w:val="BodyText"/>
-      </w:pPr>
-      <w:r>
-        <w:t xml:space="preserve">Subpages/Pena_justa/SEI_35032761_Portaria_549.pdf</w:t>
-      </w:r>
-    </w:p>
-    <w:p>
-      <w:pPr>
-        <w:pStyle w:val="BodyText"/>
-      </w:pPr>
-      <w:r>
-        <w:t xml:space="preserve">Seção:</w:t>
-      </w:r>
-    </w:p>
-    <w:p>
-      <w:pPr>
-        <w:pStyle w:val="BodyText"/>
-      </w:pPr>
-      <w:r>
-        <w:t xml:space="preserve">Documentos públicos de referência</w:t>
+        <w:t xml:space="preserve">O portal oficial da revista reúne notícias, edição atual, arquivo de edições e informações para submissão de textos.</w:t>
       </w:r>
     </w:p>
     <w:p>
@@ -5566,7 +5625,7 @@
         </w:numPr>
       </w:pPr>
       <w:r>
-        <w:t xml:space="preserve">Plano Nacional Pena Justa (PDF): Subpages/Pena_justa/Plano_Nacional_Pena_Justa.pdf</w:t>
+        <w:t xml:space="preserve">Portal oficial da Revista Brasileira de Execução Penal: https://rbepsenappen.mj.gov.br/index.php/RBEP/pt_BR</w:t>
       </w:r>
     </w:p>
     <w:p>
@@ -5578,17 +5637,31 @@
         </w:numPr>
       </w:pPr>
       <w:r>
-        <w:t xml:space="preserve">10 coisas que você precisa saber sobre o Pena Justa (PDF): Subpages/Pena_justa/10_Coisas_que_você_precisa_saber_sobre_o_Pena_Justa.pdf</w:t>
-      </w:r>
-    </w:p>
-    <w:bookmarkEnd w:id="31"/>
-    <w:bookmarkStart w:id="32" w:name="X9010218d04cc9bed3b5085cf6721dd78b5ea4ec"/>
-    <w:p>
-      <w:pPr>
-        <w:pStyle w:val="Heading2"/>
-      </w:pPr>
-      <w:r>
-        <w:t xml:space="preserve">Subpágina 4 - Revista Brasileira de Execução Penal</w:t>
+        <w:t xml:space="preserve">Edição atual - edição completa: https://rbepsenappen.mj.gov.br/index.php/RBEP/pt_BR/issue/view/22/58</w:t>
+      </w:r>
+    </w:p>
+    <w:p>
+      <w:pPr>
+        <w:pStyle w:val="Compact"/>
+        <w:numPr>
+          <w:ilvl w:val="0"/>
+          <w:numId w:val="1020"/>
+        </w:numPr>
+      </w:pPr>
+      <w:r>
+        <w:t xml:space="preserve">Ver todas as edições: https://rbepsenappen.mj.gov.br/index.php/RBEP/pt_BR/issue/archive</w:t>
+      </w:r>
+    </w:p>
+    <w:p>
+      <w:pPr>
+        <w:pStyle w:val="Compact"/>
+        <w:numPr>
+          <w:ilvl w:val="0"/>
+          <w:numId w:val="1020"/>
+        </w:numPr>
+      </w:pPr>
+      <w:r>
+        <w:t xml:space="preserve">Enviar submissão: https://rbepsenappen.mj.gov.br/index.php/RBEP/pt_BR/about/submissions</w:t>
       </w:r>
     </w:p>
     <w:p>
@@ -5596,86 +5669,6 @@
         <w:pStyle w:val="FirstParagraph"/>
       </w:pPr>
       <w:r>
-        <w:t xml:space="preserve">Título da página:</w:t>
-      </w:r>
-    </w:p>
-    <w:p>
-      <w:pPr>
-        <w:pStyle w:val="BodyText"/>
-      </w:pPr>
-      <w:r>
-        <w:t xml:space="preserve">Revista Brasileira de Execução Penal</w:t>
-      </w:r>
-    </w:p>
-    <w:p>
-      <w:pPr>
-        <w:pStyle w:val="BodyText"/>
-      </w:pPr>
-      <w:r>
-        <w:t xml:space="preserve">Imagem de destaque:</w:t>
-      </w:r>
-    </w:p>
-    <w:p>
-      <w:pPr>
-        <w:pStyle w:val="BodyText"/>
-      </w:pPr>
-      <w:r>
-        <w:t xml:space="preserve">Documentação/Botao_RevistaBrasileira.png</w:t>
-      </w:r>
-    </w:p>
-    <w:p>
-      <w:pPr>
-        <w:pStyle w:val="BodyText"/>
-      </w:pPr>
-      <w:r>
-        <w:t xml:space="preserve">Texto alternativo sugerido:</w:t>
-      </w:r>
-    </w:p>
-    <w:p>
-      <w:pPr>
-        <w:pStyle w:val="BodyText"/>
-      </w:pPr>
-      <w:r>
-        <w:t xml:space="preserve">Botão institucional da Revista Brasileira de Execução Penal.</w:t>
-      </w:r>
-    </w:p>
-    <w:p>
-      <w:pPr>
-        <w:pStyle w:val="BodyText"/>
-      </w:pPr>
-      <w:r>
-        <w:t xml:space="preserve">Identificador editorial:</w:t>
-      </w:r>
-    </w:p>
-    <w:p>
-      <w:pPr>
-        <w:pStyle w:val="BodyText"/>
-      </w:pPr>
-      <w:r>
-        <w:t xml:space="preserve">Conteúdo Técnico e Projetos Estruturantes</w:t>
-      </w:r>
-    </w:p>
-    <w:p>
-      <w:pPr>
-        <w:pStyle w:val="BodyText"/>
-      </w:pPr>
-      <w:r>
-        <w:t xml:space="preserve">Texto de destaque:</w:t>
-      </w:r>
-    </w:p>
-    <w:p>
-      <w:pPr>
-        <w:pStyle w:val="BodyText"/>
-      </w:pPr>
-      <w:r>
-        <w:t xml:space="preserve">Em articulação com a Espen e a DCOM, esta subpágina reúne referências da Revista Brasileira de Execução Penal.</w:t>
-      </w:r>
-    </w:p>
-    <w:p>
-      <w:pPr>
-        <w:pStyle w:val="BodyText"/>
-      </w:pPr>
-      <w:r>
         <w:t xml:space="preserve">Seção:</w:t>
       </w:r>
     </w:p>
@@ -5684,127 +5677,15 @@
         <w:pStyle w:val="BodyText"/>
       </w:pPr>
       <w:r>
-        <w:t xml:space="preserve">A Revista</w:t>
-      </w:r>
-    </w:p>
-    <w:p>
-      <w:pPr>
-        <w:pStyle w:val="BodyText"/>
-      </w:pPr>
-      <w:r>
-        <w:t xml:space="preserve">Texto para colar:</w:t>
-      </w:r>
-    </w:p>
-    <w:p>
-      <w:pPr>
-        <w:pStyle w:val="BodyText"/>
-      </w:pPr>
-      <w:r>
-        <w:t xml:space="preserve">A Revista Brasileira de Execução Penal é o periódico técnico-científico da Secretaria Nacional de Políticas Penais (Senappen/MJSP) e constitui espaço de circulação de artigos, documentos inéditos, entrevistas, relatos de experiência e boas práticas relacionados à execução penal.</w:t>
-      </w:r>
-    </w:p>
-    <w:p>
-      <w:pPr>
-        <w:pStyle w:val="BodyText"/>
-      </w:pPr>
-      <w:r>
-        <w:t xml:space="preserve">A segunda linha do escopo:</w:t>
-      </w:r>
-    </w:p>
-    <w:p>
-      <w:pPr>
-        <w:pStyle w:val="BodyText"/>
-      </w:pPr>
-      <w:r>
-        <w:t xml:space="preserve">No contexto da Ouvidoria, a publicação contribui para aproximar produção técnica, debate qualificado e controle social, reforçando o papel da Ouvidoria como ponte entre Estado e sociedade.</w:t>
-      </w:r>
-    </w:p>
-    <w:p>
-      <w:pPr>
-        <w:pStyle w:val="BodyText"/>
-      </w:pPr>
-      <w:r>
-        <w:t xml:space="preserve">Seção:</w:t>
-      </w:r>
-    </w:p>
-    <w:p>
-      <w:pPr>
-        <w:pStyle w:val="BodyText"/>
-      </w:pPr>
-      <w:r>
-        <w:t xml:space="preserve">Sobre a revista</w:t>
-      </w:r>
-    </w:p>
-    <w:p>
-      <w:pPr>
-        <w:pStyle w:val="BodyText"/>
-      </w:pPr>
-      <w:r>
-        <w:t xml:space="preserve">Texto para colar:</w:t>
-      </w:r>
-    </w:p>
-    <w:p>
-      <w:pPr>
-        <w:pStyle w:val="BodyText"/>
-      </w:pPr>
-      <w:r>
-        <w:t xml:space="preserve">A RBEP publica artigos, documentos inéditos, entrevistas, relatos de experiência e descrição de boas práticas que relacionam a experiência profissional, o conhecimento produzido sobre a matéria e o cumprimento da legislação nacional.</w:t>
-      </w:r>
-    </w:p>
-    <w:p>
-      <w:pPr>
-        <w:pStyle w:val="BodyText"/>
-      </w:pPr>
-      <w:r>
-        <w:t xml:space="preserve">A segunda linha da seção:</w:t>
-      </w:r>
-    </w:p>
-    <w:p>
-      <w:pPr>
-        <w:pStyle w:val="BodyText"/>
-      </w:pPr>
-      <w:r>
-        <w:t xml:space="preserve">Os conteúdos são organizados em dossiês temáticos semestrais, e a revista recebeu qualificação A4 na classificação de periódicos Qualis Capes na avaliação do quadriênio 2021-2024.</w:t>
-      </w:r>
-    </w:p>
-    <w:p>
-      <w:pPr>
-        <w:pStyle w:val="BodyText"/>
-      </w:pPr>
-      <w:r>
-        <w:t xml:space="preserve">Seção:</w:t>
-      </w:r>
-    </w:p>
-    <w:p>
-      <w:pPr>
-        <w:pStyle w:val="BodyText"/>
-      </w:pPr>
-      <w:r>
-        <w:t xml:space="preserve">Acesso oficial à RBEP</w:t>
-      </w:r>
-    </w:p>
-    <w:p>
-      <w:pPr>
-        <w:pStyle w:val="BodyText"/>
-      </w:pPr>
-      <w:r>
-        <w:t xml:space="preserve">Texto para colar:</w:t>
-      </w:r>
-    </w:p>
-    <w:p>
-      <w:pPr>
-        <w:pStyle w:val="BodyText"/>
-      </w:pPr>
-      <w:r>
-        <w:t xml:space="preserve">O portal oficial da revista reúne notícias, edição atual, arquivo de edições e informações para submissão de textos.</w:t>
-      </w:r>
-    </w:p>
-    <w:p>
-      <w:pPr>
-        <w:pStyle w:val="BodyText"/>
-      </w:pPr>
-      <w:r>
-        <w:t xml:space="preserve">Links:</w:t>
+        <w:t xml:space="preserve">Referências institucionais</w:t>
+      </w:r>
+    </w:p>
+    <w:p>
+      <w:pPr>
+        <w:pStyle w:val="BodyText"/>
+      </w:pPr>
+      <w:r>
+        <w:t xml:space="preserve">Itens para colar:</w:t>
       </w:r>
     </w:p>
     <w:p>
@@ -5816,7 +5697,7 @@
         </w:numPr>
       </w:pPr>
       <w:r>
-        <w:t xml:space="preserve">Portal oficial da Revista Brasileira de Execução Penal: https://rbepsenappen.mj.gov.br/index.php/RBEP/pt_BR</w:t>
+        <w:t xml:space="preserve">Qualis Capes 2021-2024: A4.</w:t>
       </w:r>
     </w:p>
     <w:p>
@@ -5828,7 +5709,7 @@
         </w:numPr>
       </w:pPr>
       <w:r>
-        <w:t xml:space="preserve">Edição atual - edição completa: https://rbepsenappen.mj.gov.br/index.php/RBEP/pt_BR/issue/view/22/58</w:t>
+        <w:t xml:space="preserve">ISSN: 2675-1895.</w:t>
       </w:r>
     </w:p>
     <w:p>
@@ -5840,7 +5721,7 @@
         </w:numPr>
       </w:pPr>
       <w:r>
-        <w:t xml:space="preserve">Ver todas as edições: https://rbepsenappen.mj.gov.br/index.php/RBEP/pt_BR/issue/archive</w:t>
+        <w:t xml:space="preserve">e-ISSN: 2675-1860.</w:t>
       </w:r>
     </w:p>
     <w:p>
@@ -5852,7 +5733,17 @@
         </w:numPr>
       </w:pPr>
       <w:r>
-        <w:t xml:space="preserve">Enviar submissão: https://rbepsenappen.mj.gov.br/index.php/RBEP/pt_BR/about/submissions</w:t>
+        <w:t xml:space="preserve">Contato da revista: rbep@mj.gov.br.</w:t>
+      </w:r>
+    </w:p>
+    <w:bookmarkEnd w:id="31"/>
+    <w:bookmarkStart w:id="32" w:name="subpágina-5---normativos"/>
+    <w:p>
+      <w:pPr>
+        <w:pStyle w:val="Heading2"/>
+      </w:pPr>
+      <w:r>
+        <w:t xml:space="preserve">Subpágina 5 - Normativos</w:t>
       </w:r>
     </w:p>
     <w:p>
@@ -5860,6 +5751,86 @@
         <w:pStyle w:val="FirstParagraph"/>
       </w:pPr>
       <w:r>
+        <w:t xml:space="preserve">Título da página:</w:t>
+      </w:r>
+    </w:p>
+    <w:p>
+      <w:pPr>
+        <w:pStyle w:val="BodyText"/>
+      </w:pPr>
+      <w:r>
+        <w:t xml:space="preserve">Normativos</w:t>
+      </w:r>
+    </w:p>
+    <w:p>
+      <w:pPr>
+        <w:pStyle w:val="BodyText"/>
+      </w:pPr>
+      <w:r>
+        <w:t xml:space="preserve">Imagem de destaque:</w:t>
+      </w:r>
+    </w:p>
+    <w:p>
+      <w:pPr>
+        <w:pStyle w:val="BodyText"/>
+      </w:pPr>
+      <w:r>
+        <w:t xml:space="preserve">Documentação/Botao_Normativos.png</w:t>
+      </w:r>
+    </w:p>
+    <w:p>
+      <w:pPr>
+        <w:pStyle w:val="BodyText"/>
+      </w:pPr>
+      <w:r>
+        <w:t xml:space="preserve">Texto alternativo sugerido:</w:t>
+      </w:r>
+    </w:p>
+    <w:p>
+      <w:pPr>
+        <w:pStyle w:val="BodyText"/>
+      </w:pPr>
+      <w:r>
+        <w:t xml:space="preserve">Botão institucional dos Normativos.</w:t>
+      </w:r>
+    </w:p>
+    <w:p>
+      <w:pPr>
+        <w:pStyle w:val="BodyText"/>
+      </w:pPr>
+      <w:r>
+        <w:t xml:space="preserve">Identificador editorial:</w:t>
+      </w:r>
+    </w:p>
+    <w:p>
+      <w:pPr>
+        <w:pStyle w:val="BodyText"/>
+      </w:pPr>
+      <w:r>
+        <w:t xml:space="preserve">Conteúdo Técnico e Projetos Estruturantes</w:t>
+      </w:r>
+    </w:p>
+    <w:p>
+      <w:pPr>
+        <w:pStyle w:val="BodyText"/>
+      </w:pPr>
+      <w:r>
+        <w:t xml:space="preserve">Texto de destaque:</w:t>
+      </w:r>
+    </w:p>
+    <w:p>
+      <w:pPr>
+        <w:pStyle w:val="BodyText"/>
+      </w:pPr>
+      <w:r>
+        <w:t xml:space="preserve">Esta subpágina reúne os marcos legais basilares que orientam a atuação da Ouvidoria Nacional de Serviços Penais.</w:t>
+      </w:r>
+    </w:p>
+    <w:p>
+      <w:pPr>
+        <w:pStyle w:val="BodyText"/>
+      </w:pPr>
+      <w:r>
         <w:t xml:space="preserve">Seção:</w:t>
       </w:r>
     </w:p>
@@ -5868,15 +5839,149 @@
         <w:pStyle w:val="BodyText"/>
       </w:pPr>
       <w:r>
-        <w:t xml:space="preserve">Referências institucionais</w:t>
-      </w:r>
-    </w:p>
-    <w:p>
-      <w:pPr>
-        <w:pStyle w:val="BodyText"/>
-      </w:pPr>
-      <w:r>
-        <w:t xml:space="preserve">Itens para colar:</w:t>
+        <w:t xml:space="preserve">Base normativa da Ouvidoria</w:t>
+      </w:r>
+    </w:p>
+    <w:p>
+      <w:pPr>
+        <w:pStyle w:val="BodyText"/>
+      </w:pPr>
+      <w:r>
+        <w:t xml:space="preserve">Texto para colar:</w:t>
+      </w:r>
+    </w:p>
+    <w:p>
+      <w:pPr>
+        <w:pStyle w:val="BodyText"/>
+      </w:pPr>
+      <w:r>
+        <w:t xml:space="preserve">O acervo abaixo consolida leis, decretos e portarias de referência para participação social, transparência pública, proteção ao denunciante, acesso à informação e proteção de dados pessoais no âmbito das ouvidorias.</w:t>
+      </w:r>
+    </w:p>
+    <w:p>
+      <w:pPr>
+        <w:pStyle w:val="BodyText"/>
+      </w:pPr>
+      <w:r>
+        <w:t xml:space="preserve">Linha de atualização sugerida:</w:t>
+      </w:r>
+    </w:p>
+    <w:p>
+      <w:pPr>
+        <w:pStyle w:val="BodyText"/>
+      </w:pPr>
+      <w:r>
+        <w:t xml:space="preserve">Publicado em 13/05/2026</w:t>
+      </w:r>
+    </w:p>
+    <w:p>
+      <w:pPr>
+        <w:pStyle w:val="BodyText"/>
+      </w:pPr>
+      <w:r>
+        <w:t xml:space="preserve">Atualizado em 13/05/2026</w:t>
+      </w:r>
+    </w:p>
+    <w:p>
+      <w:pPr>
+        <w:pStyle w:val="BodyText"/>
+      </w:pPr>
+      <w:r>
+        <w:t xml:space="preserve">Padrão visual recomendado para publicação:</w:t>
+      </w:r>
+    </w:p>
+    <w:p>
+      <w:pPr>
+        <w:pStyle w:val="BodyText"/>
+      </w:pPr>
+      <w:r>
+        <w:t xml:space="preserve">Apresentar em tabela editorial com colunas</w:t>
+      </w:r>
+      <w:r>
+        <w:t xml:space="preserve"> </w:t>
+      </w:r>
+      <w:r>
+        <w:rPr>
+          <w:rStyle w:val="VerbatimChar"/>
+        </w:rPr>
+        <w:t xml:space="preserve">Título</w:t>
+      </w:r>
+      <w:r>
+        <w:t xml:space="preserve">,</w:t>
+      </w:r>
+      <w:r>
+        <w:t xml:space="preserve"> </w:t>
+      </w:r>
+      <w:r>
+        <w:rPr>
+          <w:rStyle w:val="VerbatimChar"/>
+        </w:rPr>
+        <w:t xml:space="preserve">Tipo</w:t>
+      </w:r>
+      <w:r>
+        <w:t xml:space="preserve"> </w:t>
+      </w:r>
+      <w:r>
+        <w:t xml:space="preserve">e</w:t>
+      </w:r>
+      <w:r>
+        <w:t xml:space="preserve"> </w:t>
+      </w:r>
+      <w:r>
+        <w:rPr>
+          <w:rStyle w:val="VerbatimChar"/>
+        </w:rPr>
+        <w:t xml:space="preserve">Descrição</w:t>
+      </w:r>
+      <w:r>
+        <w:t xml:space="preserve">, usando o mesmo padrão já consolidado no protótipo local para a subpágina</w:t>
+      </w:r>
+      <w:r>
+        <w:t xml:space="preserve"> </w:t>
+      </w:r>
+      <w:r>
+        <w:rPr>
+          <w:rStyle w:val="VerbatimChar"/>
+        </w:rPr>
+        <w:t xml:space="preserve">Normativos</w:t>
+      </w:r>
+      <w:r>
+        <w:t xml:space="preserve">. Para os seis itens abaixo, o campo</w:t>
+      </w:r>
+      <w:r>
+        <w:t xml:space="preserve"> </w:t>
+      </w:r>
+      <w:r>
+        <w:rPr>
+          <w:rStyle w:val="VerbatimChar"/>
+        </w:rPr>
+        <w:t xml:space="preserve">Tipo</w:t>
+      </w:r>
+      <w:r>
+        <w:t xml:space="preserve"> </w:t>
+      </w:r>
+      <w:r>
+        <w:t xml:space="preserve">pode ser publicado como</w:t>
+      </w:r>
+      <w:r>
+        <w:t xml:space="preserve"> </w:t>
+      </w:r>
+      <w:r>
+        <w:rPr>
+          <w:rStyle w:val="VerbatimChar"/>
+        </w:rPr>
+        <w:t xml:space="preserve">Arquivo</w:t>
+      </w:r>
+      <w:r>
+        <w:t xml:space="preserve">.</w:t>
+      </w:r>
+    </w:p>
+    <w:p>
+      <w:pPr>
+        <w:pStyle w:val="BodyText"/>
+      </w:pPr>
+      <w:r>
+        <w:t xml:space="preserve">Links a publicar:</w:t>
       </w:r>
     </w:p>
     <w:p>
@@ -5888,7 +5993,13 @@
         </w:numPr>
       </w:pPr>
       <w:r>
-        <w:t xml:space="preserve">Qualis Capes 2021-2024: A4.</w:t>
+        <w:t xml:space="preserve">Lei nº 12.527, de 18 de novembro de 2011: Documentação/Normativas Basilares de Ouvidoria/LEI N°12.527.2011.pdf</w:t>
+      </w:r>
+      <w:r>
+        <w:t xml:space="preserve"> </w:t>
+      </w:r>
+      <w:r>
+        <w:t xml:space="preserve">Descrição: Regula o acesso a informações previsto no inciso XXXIII do art. 5º, no inciso II do § 3º do art. 37 e no § 2º do art. 216 da Constituição Federal.</w:t>
       </w:r>
     </w:p>
     <w:p>
@@ -5900,7 +6011,13 @@
         </w:numPr>
       </w:pPr>
       <w:r>
-        <w:t xml:space="preserve">ISSN: 2675-1895.</w:t>
+        <w:t xml:space="preserve">Lei nº 13.460, de 26 de junho de 2017: Documentação/Normativas Basilares de Ouvidoria/LEI N°13.460.2017.pdf</w:t>
+      </w:r>
+      <w:r>
+        <w:t xml:space="preserve"> </w:t>
+      </w:r>
+      <w:r>
+        <w:t xml:space="preserve">Descrição: Dispõe sobre participação, proteção e defesa dos direitos do usuário dos serviços públicos da administração pública.</w:t>
       </w:r>
     </w:p>
     <w:p>
@@ -5912,7 +6029,13 @@
         </w:numPr>
       </w:pPr>
       <w:r>
-        <w:t xml:space="preserve">e-ISSN: 2675-1860.</w:t>
+        <w:t xml:space="preserve">Lei nº 13.709, de 14 de agosto de 2018: Documentação/Normativas Basilares de Ouvidoria/LEI N°13.709.2018.pdf</w:t>
+      </w:r>
+      <w:r>
+        <w:t xml:space="preserve"> </w:t>
+      </w:r>
+      <w:r>
+        <w:t xml:space="preserve">Descrição: Dispõe sobre a proteção de dados pessoais e altera a Lei nº 12.965, de 23 de abril de 2014 (Marco Civil da Internet).</w:t>
       </w:r>
     </w:p>
     <w:p>
@@ -5924,7 +6047,49 @@
         </w:numPr>
       </w:pPr>
       <w:r>
-        <w:t xml:space="preserve">Contato da revista: rbep@mj.gov.br.</w:t>
+        <w:t xml:space="preserve">Decreto nº 9.492, de 5 de setembro de 2018: Documentação/Normativas Basilares de Ouvidoria/Decreto N°9.492.2018.pdf</w:t>
+      </w:r>
+      <w:r>
+        <w:t xml:space="preserve"> </w:t>
+      </w:r>
+      <w:r>
+        <w:t xml:space="preserve">Descrição: Regulamenta a Lei nº 13.460, de 26 de junho de 2017, institui o Sistema de Ouvidoria do Poder Executivo federal e altera o Decreto nº 8.910, de 22 de novembro de 2016.</w:t>
+      </w:r>
+    </w:p>
+    <w:p>
+      <w:pPr>
+        <w:pStyle w:val="Compact"/>
+        <w:numPr>
+          <w:ilvl w:val="0"/>
+          <w:numId w:val="1022"/>
+        </w:numPr>
+      </w:pPr>
+      <w:r>
+        <w:t xml:space="preserve">Decreto nº 10.153, de 3 de dezembro de 2019: Documentação/Normativas Basilares de Ouvidoria/Decreto N°10.153.2019.pdf</w:t>
+      </w:r>
+      <w:r>
+        <w:t xml:space="preserve"> </w:t>
+      </w:r>
+      <w:r>
+        <w:t xml:space="preserve">Descrição: Dispõe sobre as salvaguardas de proteção à identidade dos denunciantes de ilícitos e de irregularidades praticados contra a administração pública federal direta e indireta.</w:t>
+      </w:r>
+    </w:p>
+    <w:p>
+      <w:pPr>
+        <w:pStyle w:val="Compact"/>
+        <w:numPr>
+          <w:ilvl w:val="0"/>
+          <w:numId w:val="1022"/>
+        </w:numPr>
+      </w:pPr>
+      <w:r>
+        <w:t xml:space="preserve">Portaria Normativa CGU nº 116, de 18 de março de 2024: Documentação/Normativas Basilares de Ouvidoria/Portaria Normativa CGU - N°116.2024.pdf</w:t>
+      </w:r>
+      <w:r>
+        <w:t xml:space="preserve"> </w:t>
+      </w:r>
+      <w:r>
+        <w:t xml:space="preserve">Descrição: Estabelece orientações para o exercício das competências das unidades do Sistema de Ouvidoria do Poder Executivo Federal, instituído pelo Decreto nº 9.492, de 5 de setembro de 2018, no âmbito do Poder Executivo federal, e dá outras providências.</w:t>
       </w:r>
     </w:p>
     <w:bookmarkEnd w:id="32"/>
@@ -5942,7 +6107,7 @@
         <w:pStyle w:val="FirstParagraph"/>
       </w:pPr>
       <w:r>
-        <w:t xml:space="preserve">Na prévia local, os textos corridos das cinco páginas HTML foram verificados em 2026-05-13 com alinhamento justificado. No gov.br, esse resultado dependerá das opções disponíveis no editor oficial. Caso o editor permita alinhamento do parágrafo, recomenda-se aplicar alinhamento justificado aos textos corridos e manter títulos, links curtos e botões com o alinhamento padrão do componente.</w:t>
+        <w:t xml:space="preserve">Na prévia local, os textos corridos das seis páginas HTML foram verificados em 2026-05-18 com alinhamento justificado. No gov.br, esse resultado dependerá das opções disponíveis no editor oficial. Caso o editor permita alinhamento do parágrafo, recomenda-se aplicar alinhamento justificado aos textos corridos e manter títulos, links curtos e botões com o alinhamento padrão do componente.</w:t>
       </w:r>
     </w:p>
     <w:bookmarkEnd w:id="33"/>

</xml_diff>

<commit_message>
Document ONASP project closure
</commit_message>
<xml_diff>
--- a/Documentação/estrutura_completa_pagina_onasp_para_dicom.docx
+++ b/Documentação/estrutura_completa_pagina_onasp_para_dicom.docx
@@ -2,7 +2,7 @@
 <file path=word/document.xml><?xml version="1.0" encoding="utf-8"?>
 <w:document xmlns:w="http://schemas.openxmlformats.org/wordprocessingml/2006/main" xmlns:m="http://schemas.openxmlformats.org/officeDocument/2006/math" xmlns:r="http://schemas.openxmlformats.org/officeDocument/2006/relationships" xmlns:o="urn:schemas-microsoft-com:office:office" xmlns:v="urn:schemas-microsoft-com:vml" xmlns:w10="urn:schemas-microsoft-com:office:word" xmlns:a="http://schemas.openxmlformats.org/drawingml/2006/main" xmlns:pic="http://schemas.openxmlformats.org/drawingml/2006/picture" xmlns:wp="http://schemas.openxmlformats.org/drawingml/2006/wordprocessingDrawing">
   <w:body>
-    <w:bookmarkStart w:id="35" w:name="X651419ee04b722d3d77fb0d3ef8f3cab38d582a"/>
+    <w:bookmarkStart w:id="34" w:name="X651419ee04b722d3d77fb0d3ef8f3cab38d582a"/>
     <w:p>
       <w:pPr>
         <w:pStyle w:val="Heading1"/>
@@ -16,24 +16,24 @@
         <w:pStyle w:val="FirstParagraph"/>
       </w:pPr>
       <w:r>
-        <w:t xml:space="preserve">Data de atualização: 2026-05-13</w:t>
-      </w:r>
-    </w:p>
-    <w:p>
-      <w:pPr>
-        <w:pStyle w:val="BodyText"/>
-      </w:pPr>
-      <w:r>
-        <w:t xml:space="preserve">Documento de apoio para a DCOM reproduzir, no ambiente oficial gov.br/SENAPPEN, a estrutura da prévia criada para a página da Ouvidoria Nacional de Serviços Penais e suas subpáginas temáticas.</w:t>
-      </w:r>
-    </w:p>
-    <w:bookmarkStart w:id="9" w:name="orientação-inicial-para-a-dcom"/>
+        <w:t xml:space="preserve">Data de atualização: 2026-05-18</w:t>
+      </w:r>
+    </w:p>
+    <w:p>
+      <w:pPr>
+        <w:pStyle w:val="BodyText"/>
+      </w:pPr>
+      <w:r>
+        <w:t xml:space="preserve">Documento de apoio para subsidiar, no ambiente oficial gov.br/SENAPPEN, a organização da estrutura editorial validada para a página da Ouvidoria Nacional de Serviços Penais e suas subpáginas temáticas.</w:t>
+      </w:r>
+    </w:p>
+    <w:bookmarkStart w:id="9" w:name="referência-inicial-para-a-dcom"/>
     <w:p>
       <w:pPr>
         <w:pStyle w:val="Heading2"/>
       </w:pPr>
       <w:r>
-        <w:t xml:space="preserve">Orientação inicial para a DCOM</w:t>
+        <w:t xml:space="preserve">Referência inicial para a DCOM</w:t>
       </w:r>
     </w:p>
     <w:p>
@@ -41,15 +41,15 @@
         <w:pStyle w:val="FirstParagraph"/>
       </w:pPr>
       <w:r>
-        <w:t xml:space="preserve">A prévia foi construída em HTML5 e CSS3 apenas para validação visual, responsiva e editorial. A publicação final deve ser feita com os componentes nativos do ambiente gov.br, preservando a ordem dos blocos, os textos, as imagens, os links e os embeds indicados neste documento.</w:t>
-      </w:r>
-    </w:p>
-    <w:p>
-      <w:pPr>
-        <w:pStyle w:val="BodyText"/>
-      </w:pPr>
-      <w:r>
-        <w:t xml:space="preserve">Não é recomendável copiar e colar o código inteiro da prévia HTML diretamente no portal oficial, pois o ambiente gov.br normalmente aplica regras próprias de estilo, componentes e sanitização de conteúdo. O conteúdo abaixo foi organizado em blocos simples para facilitar o copiar e colar no editor oficial.</w:t>
+        <w:t xml:space="preserve">A prévia foi construída em HTML5 e CSS3 apenas para validação visual, responsiva e editorial. O material pode ser adaptado aos componentes e fluxos adotados pela equipe responsável pela publicação no ambiente gov.br, preservando, quando couber, a ordem dos blocos, os textos, as imagens, os links e os embeds indicados neste documento.</w:t>
+      </w:r>
+    </w:p>
+    <w:p>
+      <w:pPr>
+        <w:pStyle w:val="BodyText"/>
+      </w:pPr>
+      <w:r>
+        <w:t xml:space="preserve">Como a prévia foi elaborada em HTML apenas para validação visual, o conteúdo abaixo foi organizado em blocos simples para facilitar seu aproveitamento no editor oficial, conforme os recursos disponíveis no portal.</w:t>
       </w:r>
     </w:p>
     <w:bookmarkEnd w:id="9"/>
@@ -142,7 +142,15 @@
         <w:pStyle w:val="BodyText"/>
       </w:pPr>
       <w:r>
-        <w:t xml:space="preserve">A Ouvidoria Nacional de Serviços Penais (Onasp), vinculada à Secretaria Nacional de Políticas Penais (Senappen) e integrante do Sistema de Ouvidorias do Poder Executivo Federal, promove a participação social e a defesa dos direitos dos servidores, das pessoas em cumprimento de pena, dos egressos e de seus familiares. Atua no recebimento, tratamento e encaminhamento de manifestações, por meio do canal Fala.BR (elogios, sugestões, solicitações, reclamações e denúncias), visando o fortalecimento do controle social, a melhoria contínua dos serviços penais e o monitoramento dos estabelecimentos prisionais do país.</w:t>
+        <w:t xml:space="preserve">A Ouvidoria Nacional de Serviços Penais (Onasp), vinculada à Secretaria Nacional de Políticas Penais (Senappen) e integrante do Sistema de Ouvidorias do Poder Executivo Federal, promove a participação social e a defesa dos direitos dos usuários, bem como busca qualificar o atendimento ao cidadão, assegurando escuta ativa, acessível e humanizada a servidores, pessoas privadas de liberdade, em cumprimento de pena, egressos, familiares e demais usuários dos serviços penais.</w:t>
+      </w:r>
+    </w:p>
+    <w:p>
+      <w:pPr>
+        <w:pStyle w:val="BodyText"/>
+      </w:pPr>
+      <w:r>
+        <w:t xml:space="preserve">Atua no recebimento, tratamento e encaminhamento de manifestações, por meio da plataforma Fala.BR (elogios, sugestões, solicitações, comunicações, reclamações e denúncias), visando ao fortalecimento do controle social, à melhoria contínua dos serviços penais e ao monitoramento dos estabelecimentos prisionais do país.</w:t>
       </w:r>
     </w:p>
     <w:p>
@@ -394,7 +402,7 @@
         <w:pStyle w:val="BodyText"/>
       </w:pPr>
       <w:r>
-        <w:t xml:space="preserve">Inserir o QR Code oficial do chatbot na própria seção de canais de atendimento, em bloco compacto com legenda curta, utilizando o arquivo Documentação/QRcode_Whatsapp.png.</w:t>
+        <w:t xml:space="preserve">Pode ser incluído o QR Code oficial do chatbot na própria seção de canais de atendimento, em bloco compacto com legenda curta, utilizando o arquivo Documentação/QRcode_Whatsapp.png.</w:t>
       </w:r>
     </w:p>
     <w:bookmarkEnd w:id="13"/>
@@ -1320,15 +1328,15 @@
         <w:pStyle w:val="BodyText"/>
       </w:pPr>
       <w:r>
-        <w:t xml:space="preserve">Padrão visual recomendado para publicação:</w:t>
-      </w:r>
-    </w:p>
-    <w:p>
-      <w:pPr>
-        <w:pStyle w:val="BodyText"/>
-      </w:pPr>
-      <w:r>
-        <w:t xml:space="preserve">No protótipo, apresentar em seis cards editoriais compactos, em grade 3x2 inspirada na vitrine de notícias da ESPEN: imagem no topo, rubrica curta, título clicável, resumo breve e data. Na publicação gov.br, reproduzir com componente nativo equivalente, sem feed dinâmico e sem ícones de compartilhamento.</w:t>
+        <w:t xml:space="preserve">Referência visual para publicação:</w:t>
+      </w:r>
+    </w:p>
+    <w:p>
+      <w:pPr>
+        <w:pStyle w:val="BodyText"/>
+      </w:pPr>
+      <w:r>
+        <w:t xml:space="preserve">No protótipo, o bloco foi organizado em cards editoriais compactos, com imagem no topo, rubrica curta, título clicável, resumo breve e data. Na publicação no portal, essa lógica pode ser adaptada ao componente disponível, inclusive em arranjo equivalente e sem necessidade de feed dinâmico ou ícones de compartilhamento.</w:t>
       </w:r>
     </w:p>
     <w:p>
@@ -1799,73 +1807,39 @@
         <w:pStyle w:val="BodyText"/>
       </w:pPr>
       <w:r>
-        <w:t xml:space="preserve">Orientação para publicação oficial:</w:t>
-      </w:r>
-    </w:p>
-    <w:p>
-      <w:pPr>
-        <w:pStyle w:val="BodyText"/>
-      </w:pPr>
-      <w:r>
-        <w:t xml:space="preserve">No ambiente gov.br, recomenda-se tratar o mapa interativo apenas como referência visual da prévia. A solução mais segura para publicação é manter um seletor simples por UF, um bloco expansível por estado ou, preferencialmente, o quadro textual de contatos apresentado abaixo, sem depender de JavaScript customizado.</w:t>
-      </w:r>
-    </w:p>
-    <w:p>
-      <w:pPr>
-        <w:pStyle w:val="BodyText"/>
-      </w:pPr>
-      <w:r>
-        <w:t xml:space="preserve">Quando a mesma UF tiver mais de uma referência institucional relevante, como ocorre no Espírito Santo, recomenda-se separar as informações em blocos independentes dentro do quadro lateral ou em linhas distintas no quadro textual, evitando misturar órgãos, responsáveis, telefones e endereços em uma única ficha.</w:t>
-      </w:r>
-    </w:p>
-    <w:p>
-      <w:pPr>
-        <w:pStyle w:val="BodyText"/>
-      </w:pPr>
-      <w:r>
-        <w:t xml:space="preserve">Regra editorial obrigatória:</w:t>
-      </w:r>
-    </w:p>
-    <w:p>
-      <w:pPr>
-        <w:pStyle w:val="BodyText"/>
-      </w:pPr>
-      <w:r>
-        <w:t xml:space="preserve">Detalhes de curadoria usados para consolidar os contatos devem permanecer apenas na documentação interna de trabalho. Não publicar na página expressões como</w:t>
-      </w:r>
-      <w:r>
-        <w:t xml:space="preserve"> </w:t>
-      </w:r>
-      <w:r>
-        <w:t xml:space="preserve">“o diagnóstico registrou”</w:t>
-      </w:r>
-      <w:r>
-        <w:t xml:space="preserve">,</w:t>
-      </w:r>
-      <w:r>
-        <w:t xml:space="preserve"> </w:t>
-      </w:r>
-      <w:r>
-        <w:t xml:space="preserve">“a resposta do diagnóstico informa”</w:t>
-      </w:r>
-      <w:r>
-        <w:t xml:space="preserve">, menções a respostas recebidas, observações internas de validação ou listas nominais de servidores designados.</w:t>
-      </w:r>
-    </w:p>
-    <w:p>
-      <w:pPr>
-        <w:pStyle w:val="BodyText"/>
-      </w:pPr>
-      <w:r>
-        <w:t xml:space="preserve">Base interna de consolidação (não publicar na página):</w:t>
-      </w:r>
-    </w:p>
-    <w:p>
-      <w:pPr>
-        <w:pStyle w:val="BodyText"/>
-      </w:pPr>
-      <w:r>
-        <w:t xml:space="preserve">Diagnóstico de Ouvidorias Estaduais, consolidado pela ONASP a partir das respostas recebidas em 2026.</w:t>
+        <w:t xml:space="preserve">Referência para publicação:</w:t>
+      </w:r>
+    </w:p>
+    <w:p>
+      <w:pPr>
+        <w:pStyle w:val="BodyText"/>
+      </w:pPr>
+      <w:r>
+        <w:t xml:space="preserve">Na publicação oficial, o mapa interativo pode ser tratado apenas como referência visual da prévia. O conteúdo também pode ser apresentado em seletor simples por UF, bloco expansível por estado ou quadro textual de contatos, conforme os recursos editoriais disponíveis no portal.</w:t>
+      </w:r>
+    </w:p>
+    <w:p>
+      <w:pPr>
+        <w:pStyle w:val="BodyText"/>
+      </w:pPr>
+      <w:r>
+        <w:t xml:space="preserve">Quando a mesma UF tiver mais de uma referência institucional relevante, convém separar as informações em blocos independentes dentro do quadro lateral ou em linhas distintas no quadro textual, evitando misturar órgãos, responsáveis, telefones e endereços em uma única ficha.</w:t>
+      </w:r>
+    </w:p>
+    <w:p>
+      <w:pPr>
+        <w:pStyle w:val="BodyText"/>
+      </w:pPr>
+      <w:r>
+        <w:t xml:space="preserve">Observação editorial:</w:t>
+      </w:r>
+    </w:p>
+    <w:p>
+      <w:pPr>
+        <w:pStyle w:val="BodyText"/>
+      </w:pPr>
+      <w:r>
+        <w:t xml:space="preserve">Para a versão pública, convém apresentar apenas as informações de contato já validadas para divulgação, mantendo em registro interno observações de consolidação e referências de trabalho.</w:t>
       </w:r>
     </w:p>
     <w:p>
@@ -5147,7 +5121,7 @@
         <w:pStyle w:val="BodyText"/>
       </w:pPr>
       <w:r>
-        <w:t xml:space="preserve">Esse recorte se materializa por meio de marcos normativos e de cooperação técnica que estruturam parâmetros mínimos de atuação, incentivam integração preferencial ao Fala.BR e consolidam uma rede permanente de intercâmbio entre União, Estados e Distrito Federal.</w:t>
+        <w:t xml:space="preserve">Esse recorte se materializa por meio de marcos normativos e de cooperação técnica voltados ao fortalecimento da articulação entre canais institucionais de manifestação e à consolidação de uma rede permanente de intercâmbio entre União, Estados e Distrito Federal.</w:t>
       </w:r>
     </w:p>
     <w:p>
@@ -5227,7 +5201,7 @@
         <w:pStyle w:val="BodyText"/>
       </w:pPr>
       <w:r>
-        <w:t xml:space="preserve">Estabelece parâmetros mínimos para a criação e a estruturação de Ouvidorias de Serviços Penais nos Estados e no Distrito Federal, com diretrizes de autonomia, transparência, acessibilidade e integração preferencial ao Fala.BR.</w:t>
+        <w:t xml:space="preserve">Estabelece parâmetros mínimos para a criação e a estruturação de Ouvidorias de Serviços Penais nos Estados e no Distrito Federal, com diretrizes de autonomia, transparência, acessibilidade e integração com canais institucionais de manifestação, inclusive o Fala.BR.</w:t>
       </w:r>
     </w:p>
     <w:p>
@@ -5887,15 +5861,15 @@
         <w:pStyle w:val="BodyText"/>
       </w:pPr>
       <w:r>
-        <w:t xml:space="preserve">Padrão visual recomendado para publicação:</w:t>
-      </w:r>
-    </w:p>
-    <w:p>
-      <w:pPr>
-        <w:pStyle w:val="BodyText"/>
-      </w:pPr>
-      <w:r>
-        <w:t xml:space="preserve">Apresentar em tabela editorial com colunas</w:t>
+        <w:t xml:space="preserve">Referência visual para publicação:</w:t>
+      </w:r>
+    </w:p>
+    <w:p>
+      <w:pPr>
+        <w:pStyle w:val="BodyText"/>
+      </w:pPr>
+      <w:r>
+        <w:t xml:space="preserve">A seção pode ser organizada em tabela editorial com colunas</w:t>
       </w:r>
       <w:r>
         <w:t xml:space="preserve"> </w:t>
@@ -5934,19 +5908,7 @@
         <w:t xml:space="preserve">Descrição</w:t>
       </w:r>
       <w:r>
-        <w:t xml:space="preserve">, usando o mesmo padrão já consolidado no protótipo local para a subpágina</w:t>
-      </w:r>
-      <w:r>
-        <w:t xml:space="preserve"> </w:t>
-      </w:r>
-      <w:r>
-        <w:rPr>
-          <w:rStyle w:val="VerbatimChar"/>
-        </w:rPr>
-        <w:t xml:space="preserve">Normativos</w:t>
-      </w:r>
-      <w:r>
-        <w:t xml:space="preserve">. Para os seis itens abaixo, o campo</w:t>
+        <w:t xml:space="preserve">, em arranjo compatível com os recursos editoriais disponíveis. Para os seis itens abaixo, o campo</w:t>
       </w:r>
       <w:r>
         <w:t xml:space="preserve"> </w:t>
@@ -5961,7 +5923,7 @@
         <w:t xml:space="preserve"> </w:t>
       </w:r>
       <w:r>
-        <w:t xml:space="preserve">pode ser publicado como</w:t>
+        <w:t xml:space="preserve">pode usar a indicação</w:t>
       </w:r>
       <w:r>
         <w:t xml:space="preserve"> </w:t>
@@ -6093,13 +6055,13 @@
       </w:r>
     </w:p>
     <w:bookmarkEnd w:id="32"/>
-    <w:bookmarkStart w:id="33" w:name="observações-sobre-formatação"/>
+    <w:bookmarkStart w:id="33" w:name="repositório-de-arquivos"/>
     <w:p>
       <w:pPr>
         <w:pStyle w:val="Heading2"/>
       </w:pPr>
       <w:r>
-        <w:t xml:space="preserve">Observações sobre formatação</w:t>
+        <w:t xml:space="preserve">Repositório de arquivos</w:t>
       </w:r>
     </w:p>
     <w:p>
@@ -6107,45 +6069,27 @@
         <w:pStyle w:val="FirstParagraph"/>
       </w:pPr>
       <w:r>
-        <w:t xml:space="preserve">Na prévia local, os textos corridos das seis páginas HTML foram verificados em 2026-05-18 com alinhamento justificado. No gov.br, esse resultado dependerá das opções disponíveis no editor oficial. Caso o editor permita alinhamento do parágrafo, recomenda-se aplicar alinhamento justificado aos textos corridos e manter títulos, links curtos e botões com o alinhamento padrão do componente.</w:t>
+        <w:t xml:space="preserve">Para facilitar a consulta ao conjunto de materiais de apoio relacionados à estrutura da página e de suas subpáginas, a documentação completa do site foi reunida em um único diretório digital. Esse compartilhamento permite acesso centralizado aos arquivos de referência e evita a necessidade de juntada individualizada de cada documento neste processo.</w:t>
+      </w:r>
+    </w:p>
+    <w:p>
+      <w:pPr>
+        <w:pStyle w:val="BodyText"/>
+      </w:pPr>
+      <w:r>
+        <w:t xml:space="preserve">Acesse o link abaixo para consultar a documentação completa do site:</w:t>
+      </w:r>
+    </w:p>
+    <w:p>
+      <w:pPr>
+        <w:pStyle w:val="BodyText"/>
+      </w:pPr>
+      <w:r>
+        <w:t xml:space="preserve">Link de acesso: https://justicagovbr-my.sharepoint.com/:f:/g/personal/diego_oliveira3_mj_gov_br/IgClmmBvbfHQRaLSnLF9_HvOAapvlRwLVMdUhd0m_sTJmwA?e=NusVt7</w:t>
       </w:r>
     </w:p>
     <w:bookmarkEnd w:id="33"/>
-    <w:bookmarkStart w:id="34" w:name="Xf7fe357b8ad8797f48d42cdb4ec1361a8fa006f"/>
-    <w:p>
-      <w:pPr>
-        <w:pStyle w:val="Heading2"/>
-      </w:pPr>
-      <w:r>
-        <w:t xml:space="preserve">Observações sobre WordPress, Plone e reaproveitamento</w:t>
-      </w:r>
-    </w:p>
-    <w:p>
-      <w:pPr>
-        <w:pStyle w:val="FirstParagraph"/>
-      </w:pPr>
-      <w:r>
-        <w:t xml:space="preserve">As páginas do domínio gov.br normalmente são administradas em ambiente gov.br/Plone, e não em WordPress. A DCOM pode confirmar o ambiente exato de edição utilizado internamente, mas a estrutura pública analisada segue o padrão do gov.br, com componentes próprios de publicação.</w:t>
-      </w:r>
-    </w:p>
-    <w:p>
-      <w:pPr>
-        <w:pStyle w:val="BodyText"/>
-      </w:pPr>
-      <w:r>
-        <w:t xml:space="preserve">Por isso, recomenda-se não tratar a prévia como um pacote WordPress. A DCOM deve aproveitar os textos, imagens, links, embeds e ordem dos blocos, reproduzindo a montagem com os componentes oficiais disponíveis no portal.</w:t>
-      </w:r>
-    </w:p>
-    <w:p>
-      <w:pPr>
-        <w:pStyle w:val="BodyText"/>
-      </w:pPr>
-      <w:r>
-        <w:t xml:space="preserve">Há precedentes úteis dentro do próprio ecossistema da Senappen. A página da ESPEN e a subpágina da RESPEN mostram que o portal oficial já comporta texto institucional, links de destaque para documentos em PDF, listas simples e tabelas extensas por unidade federativa quando houver base oficial validada. Da mesma forma, o portal oficial da RBEP confirma a existência de referências institucionais, acesso à edição atual, arquivo de edições e informações para submissão que podem ser indicadas na subpágina temática da Revista.</w:t>
-      </w:r>
-    </w:p>
     <w:bookmarkEnd w:id="34"/>
-    <w:bookmarkEnd w:id="35"/>
     <w:sectPr>
       <w:footnotePr>
         <w:numRestart w:val="eachSect"/>

</xml_diff>